<commit_message>
Payment Processing Sequence Diagram (#228)
</commit_message>
<xml_diff>
--- a/Sequence Specification Document.docx
+++ b/Sequence Specification Document.docx
@@ -613,14 +613,24 @@
                             <w:r>
                               <w:t xml:space="preserve">Figure </w:t>
                             </w:r>
-                            <w:fldSimple w:instr=" SEQ Figure \* ARABIC ">
-                              <w:r>
-                                <w:rPr>
-                                  <w:noProof/>
-                                </w:rPr>
-                                <w:t>1</w:t>
-                              </w:r>
-                            </w:fldSimple>
+                            <w:r>
+                              <w:fldChar w:fldCharType="begin"/>
+                            </w:r>
+                            <w:r>
+                              <w:instrText xml:space="preserve"> SEQ Figure \* ARABIC </w:instrText>
+                            </w:r>
+                            <w:r>
+                              <w:fldChar w:fldCharType="separate"/>
+                            </w:r>
+                            <w:r>
+                              <w:rPr>
+                                <w:noProof/>
+                              </w:rPr>
+                              <w:t>1</w:t>
+                            </w:r>
+                            <w:r>
+                              <w:fldChar w:fldCharType="end"/>
+                            </w:r>
                             <w:r>
                               <w:t xml:space="preserve"> - </w:t>
                             </w:r>
@@ -661,14 +671,24 @@
                       <w:r>
                         <w:t xml:space="preserve">Figure </w:t>
                       </w:r>
-                      <w:fldSimple w:instr=" SEQ Figure \* ARABIC ">
-                        <w:r>
-                          <w:rPr>
-                            <w:noProof/>
-                          </w:rPr>
-                          <w:t>1</w:t>
-                        </w:r>
-                      </w:fldSimple>
+                      <w:r>
+                        <w:fldChar w:fldCharType="begin"/>
+                      </w:r>
+                      <w:r>
+                        <w:instrText xml:space="preserve"> SEQ Figure \* ARABIC </w:instrText>
+                      </w:r>
+                      <w:r>
+                        <w:fldChar w:fldCharType="separate"/>
+                      </w:r>
+                      <w:r>
+                        <w:rPr>
+                          <w:noProof/>
+                        </w:rPr>
+                        <w:t>1</w:t>
+                      </w:r>
+                      <w:r>
+                        <w:fldChar w:fldCharType="end"/>
+                      </w:r>
                       <w:r>
                         <w:t xml:space="preserve"> - </w:t>
                       </w:r>
@@ -1340,14 +1360,24 @@
                             <w:r>
                               <w:t xml:space="preserve">Figure </w:t>
                             </w:r>
-                            <w:fldSimple w:instr=" SEQ Figure \* ARABIC ">
-                              <w:r>
-                                <w:rPr>
-                                  <w:noProof/>
-                                </w:rPr>
-                                <w:t>2</w:t>
-                              </w:r>
-                            </w:fldSimple>
+                            <w:r>
+                              <w:fldChar w:fldCharType="begin"/>
+                            </w:r>
+                            <w:r>
+                              <w:instrText xml:space="preserve"> SEQ Figure \* ARABIC </w:instrText>
+                            </w:r>
+                            <w:r>
+                              <w:fldChar w:fldCharType="separate"/>
+                            </w:r>
+                            <w:r>
+                              <w:rPr>
+                                <w:noProof/>
+                              </w:rPr>
+                              <w:t>2</w:t>
+                            </w:r>
+                            <w:r>
+                              <w:fldChar w:fldCharType="end"/>
+                            </w:r>
                             <w:r>
                               <w:t xml:space="preserve"> - </w:t>
                             </w:r>
@@ -1384,14 +1414,24 @@
                       <w:r>
                         <w:t xml:space="preserve">Figure </w:t>
                       </w:r>
-                      <w:fldSimple w:instr=" SEQ Figure \* ARABIC ">
-                        <w:r>
-                          <w:rPr>
-                            <w:noProof/>
-                          </w:rPr>
-                          <w:t>2</w:t>
-                        </w:r>
-                      </w:fldSimple>
+                      <w:r>
+                        <w:fldChar w:fldCharType="begin"/>
+                      </w:r>
+                      <w:r>
+                        <w:instrText xml:space="preserve"> SEQ Figure \* ARABIC </w:instrText>
+                      </w:r>
+                      <w:r>
+                        <w:fldChar w:fldCharType="separate"/>
+                      </w:r>
+                      <w:r>
+                        <w:rPr>
+                          <w:noProof/>
+                        </w:rPr>
+                        <w:t>2</w:t>
+                      </w:r>
+                      <w:r>
+                        <w:fldChar w:fldCharType="end"/>
+                      </w:r>
                       <w:r>
                         <w:t xml:space="preserve"> - </w:t>
                       </w:r>
@@ -1954,14 +1994,24 @@
                             <w:r>
                               <w:t xml:space="preserve">Figure </w:t>
                             </w:r>
-                            <w:fldSimple w:instr=" SEQ Figure \* ARABIC ">
-                              <w:r>
-                                <w:rPr>
-                                  <w:noProof/>
-                                </w:rPr>
-                                <w:t>3</w:t>
-                              </w:r>
-                            </w:fldSimple>
+                            <w:r>
+                              <w:fldChar w:fldCharType="begin"/>
+                            </w:r>
+                            <w:r>
+                              <w:instrText xml:space="preserve"> SEQ Figure \* ARABIC </w:instrText>
+                            </w:r>
+                            <w:r>
+                              <w:fldChar w:fldCharType="separate"/>
+                            </w:r>
+                            <w:r>
+                              <w:rPr>
+                                <w:noProof/>
+                              </w:rPr>
+                              <w:t>3</w:t>
+                            </w:r>
+                            <w:r>
+                              <w:fldChar w:fldCharType="end"/>
+                            </w:r>
                             <w:r>
                               <w:t xml:space="preserve"> - </w:t>
                             </w:r>
@@ -1998,14 +2048,24 @@
                       <w:r>
                         <w:t xml:space="preserve">Figure </w:t>
                       </w:r>
-                      <w:fldSimple w:instr=" SEQ Figure \* ARABIC ">
-                        <w:r>
-                          <w:rPr>
-                            <w:noProof/>
-                          </w:rPr>
-                          <w:t>3</w:t>
-                        </w:r>
-                      </w:fldSimple>
+                      <w:r>
+                        <w:fldChar w:fldCharType="begin"/>
+                      </w:r>
+                      <w:r>
+                        <w:instrText xml:space="preserve"> SEQ Figure \* ARABIC </w:instrText>
+                      </w:r>
+                      <w:r>
+                        <w:fldChar w:fldCharType="separate"/>
+                      </w:r>
+                      <w:r>
+                        <w:rPr>
+                          <w:noProof/>
+                        </w:rPr>
+                        <w:t>3</w:t>
+                      </w:r>
+                      <w:r>
+                        <w:fldChar w:fldCharType="end"/>
+                      </w:r>
                       <w:r>
                         <w:t xml:space="preserve"> - </w:t>
                       </w:r>
@@ -2087,7 +2147,577 @@
         <w:br w:type="page"/>
       </w:r>
     </w:p>
-    <w:p/>
+    <w:p>
+      <w:pPr>
+        <w:pStyle w:val="Heading3"/>
+        <w:numPr>
+          <w:ilvl w:val="0"/>
+          <w:numId w:val="74"/>
+        </w:numPr>
+      </w:pPr>
+      <w:r>
+        <w:lastRenderedPageBreak/>
+        <w:t>Payment Processing Sequence Diagram Documentation</w:t>
+      </w:r>
+    </w:p>
+    <w:p>
+      <w:pPr>
+        <w:rPr>
+          <w:b/>
+          <w:bCs/>
+        </w:rPr>
+      </w:pPr>
+      <w:r>
+        <w:rPr>
+          <w:b/>
+          <w:bCs/>
+        </w:rPr>
+        <w:t>Purpose</w:t>
+      </w:r>
+    </w:p>
+    <w:p>
+      <w:r>
+        <w:t xml:space="preserve">The Payment Processing Sequence Diagram illustrates the interactions between the customer, the payment subsystem and external payment services for the payment process in the KriGo platform. This diagram shows the steps needed to securely process a reservation payment, verify the transaction, communicate with the payment gateway, and update reservation records and notify the customer of the transaction. </w:t>
+      </w:r>
+      <w:r>
+        <w:br/>
+        <w:t>The sequence diagram depicts the successful and unsuccessful cases of the payment and also the secure handling of the transactions and data consistency.</w:t>
+      </w:r>
+    </w:p>
+    <w:p>
+      <w:pPr>
+        <w:rPr>
+          <w:b/>
+          <w:bCs/>
+        </w:rPr>
+      </w:pPr>
+      <w:r>
+        <w:rPr>
+          <w:b/>
+          <w:bCs/>
+        </w:rPr>
+        <w:t>Participating Objects</w:t>
+      </w:r>
+    </w:p>
+    <w:p>
+      <w:r>
+        <w:t>The sequence diagram includes the following participants:</w:t>
+      </w:r>
+    </w:p>
+    <w:p>
+      <w:pPr>
+        <w:pStyle w:val="ListParagraph"/>
+        <w:numPr>
+          <w:ilvl w:val="0"/>
+          <w:numId w:val="78"/>
+        </w:numPr>
+        <w:spacing w:after="0" w:line="276" w:lineRule="auto"/>
+      </w:pPr>
+      <w:r>
+        <w:rPr>
+          <w:b/>
+          <w:bCs/>
+        </w:rPr>
+        <w:t>Customer (Actor):</w:t>
+      </w:r>
+      <w:r>
+        <w:t xml:space="preserve"> Initiates the payment for a confirmed reservation.</w:t>
+      </w:r>
+    </w:p>
+    <w:p>
+      <w:pPr>
+        <w:pStyle w:val="ListParagraph"/>
+        <w:numPr>
+          <w:ilvl w:val="0"/>
+          <w:numId w:val="78"/>
+        </w:numPr>
+        <w:spacing w:after="0" w:line="276" w:lineRule="auto"/>
+      </w:pPr>
+      <w:r>
+        <w:rPr>
+          <w:b/>
+          <w:bCs/>
+        </w:rPr>
+        <w:t>PaymentUI (Boundary):</w:t>
+      </w:r>
+      <w:r>
+        <w:t xml:space="preserve"> Provides the payment interface and collects payment information.</w:t>
+      </w:r>
+    </w:p>
+    <w:p>
+      <w:pPr>
+        <w:pStyle w:val="ListParagraph"/>
+        <w:numPr>
+          <w:ilvl w:val="0"/>
+          <w:numId w:val="78"/>
+        </w:numPr>
+        <w:spacing w:after="0" w:line="276" w:lineRule="auto"/>
+      </w:pPr>
+      <w:r>
+        <w:rPr>
+          <w:b/>
+          <w:bCs/>
+        </w:rPr>
+        <w:t>PaymentController (Control):</w:t>
+      </w:r>
+      <w:r>
+        <w:t xml:space="preserve"> Coordinates the payment workflow and manages business logic.</w:t>
+      </w:r>
+    </w:p>
+    <w:p>
+      <w:pPr>
+        <w:pStyle w:val="ListParagraph"/>
+        <w:numPr>
+          <w:ilvl w:val="0"/>
+          <w:numId w:val="78"/>
+        </w:numPr>
+        <w:spacing w:after="0" w:line="276" w:lineRule="auto"/>
+      </w:pPr>
+      <w:r>
+        <w:rPr>
+          <w:b/>
+          <w:bCs/>
+        </w:rPr>
+        <w:t>PaymentService (Control):</w:t>
+      </w:r>
+      <w:r>
+        <w:t xml:space="preserve"> Validates payment details and communicates with the external payment provider.</w:t>
+      </w:r>
+    </w:p>
+    <w:p>
+      <w:pPr>
+        <w:pStyle w:val="ListParagraph"/>
+        <w:numPr>
+          <w:ilvl w:val="0"/>
+          <w:numId w:val="78"/>
+        </w:numPr>
+        <w:spacing w:after="0" w:line="276" w:lineRule="auto"/>
+      </w:pPr>
+      <w:r>
+        <w:rPr>
+          <w:b/>
+          <w:bCs/>
+        </w:rPr>
+        <w:t>PaymentGateway (External System):</w:t>
+      </w:r>
+      <w:r>
+        <w:t xml:space="preserve"> Processes electronic payment transactions and returns the payment result.</w:t>
+      </w:r>
+    </w:p>
+    <w:p>
+      <w:pPr>
+        <w:pStyle w:val="ListParagraph"/>
+        <w:numPr>
+          <w:ilvl w:val="0"/>
+          <w:numId w:val="78"/>
+        </w:numPr>
+        <w:spacing w:after="0" w:line="276" w:lineRule="auto"/>
+      </w:pPr>
+      <w:r>
+        <w:rPr>
+          <w:b/>
+          <w:bCs/>
+        </w:rPr>
+        <w:t>ReservationRepository (Entity):</w:t>
+      </w:r>
+      <w:r>
+        <w:t xml:space="preserve"> Updates the reservation status after payment processing.</w:t>
+      </w:r>
+    </w:p>
+    <w:p>
+      <w:pPr>
+        <w:pStyle w:val="ListParagraph"/>
+        <w:numPr>
+          <w:ilvl w:val="0"/>
+          <w:numId w:val="78"/>
+        </w:numPr>
+        <w:spacing w:after="0" w:line="276" w:lineRule="auto"/>
+      </w:pPr>
+      <w:r>
+        <w:rPr>
+          <w:b/>
+          <w:bCs/>
+        </w:rPr>
+        <w:t>PaymentRepository (Entity):</w:t>
+      </w:r>
+      <w:r>
+        <w:t xml:space="preserve"> Stores payment transaction records.</w:t>
+      </w:r>
+    </w:p>
+    <w:p>
+      <w:pPr>
+        <w:pStyle w:val="ListParagraph"/>
+        <w:numPr>
+          <w:ilvl w:val="0"/>
+          <w:numId w:val="78"/>
+        </w:numPr>
+        <w:spacing w:line="276" w:lineRule="auto"/>
+      </w:pPr>
+      <w:r>
+        <w:rPr>
+          <w:b/>
+          <w:bCs/>
+        </w:rPr>
+        <w:t>Database (Database):</w:t>
+      </w:r>
+      <w:r>
+        <w:t xml:space="preserve"> Persists payment and reservation information.</w:t>
+      </w:r>
+    </w:p>
+    <w:p>
+      <w:pPr>
+        <w:rPr>
+          <w:b/>
+          <w:bCs/>
+        </w:rPr>
+      </w:pPr>
+      <w:r>
+        <w:rPr>
+          <w:b/>
+          <w:bCs/>
+        </w:rPr>
+        <w:t>Payment Processing Workflow</w:t>
+      </w:r>
+    </w:p>
+    <w:p>
+      <w:pPr>
+        <w:spacing w:line="278" w:lineRule="auto"/>
+      </w:pPr>
+      <w:r>
+        <w:t xml:space="preserve">When the customer chooses a confirmed reservation and chooses to pay, the payment process is started. The PaymentUI shows the payment form where the customer can enter the required payment details, including the selected payment method and transaction details. </w:t>
+      </w:r>
+      <w:r>
+        <w:br/>
+        <w:t xml:space="preserve">Once the payment request has been submitted, the PaymentController will use the PaymentService to validate the payment information. When the payment details are valid, the PaymentService submits the transaction request for authorization to the external Payment Gateway. </w:t>
+      </w:r>
+      <w:r>
+        <w:br/>
+        <w:t xml:space="preserve">Once the transaction is done, the PaymentGateway passes the payment result back to the PaymentService. If the payment was </w:t>
+      </w:r>
+      <w:r>
+        <w:t>successful,</w:t>
+      </w:r>
+      <w:r>
+        <w:t xml:space="preserve"> PaymentController saves the transaction using </w:t>
+      </w:r>
+      <w:r>
+        <w:t>PaymentRepository,</w:t>
+      </w:r>
+      <w:r>
+        <w:t xml:space="preserve"> changes the reservation status to Paid using ReservationRepository and displays a payment confirmation message to the </w:t>
+      </w:r>
+      <w:r>
+        <w:t>customer.</w:t>
+      </w:r>
+      <w:r>
+        <w:br w:type="page"/>
+      </w:r>
+    </w:p>
+    <w:p>
+      <w:pPr>
+        <w:rPr>
+          <w:b/>
+          <w:bCs/>
+        </w:rPr>
+      </w:pPr>
+      <w:r>
+        <w:rPr>
+          <w:b/>
+          <w:bCs/>
+        </w:rPr>
+        <w:lastRenderedPageBreak/>
+        <w:t>Payment Validation</w:t>
+      </w:r>
+    </w:p>
+    <w:p>
+      <w:r>
+        <w:t>Before the payment data is handed over to an external payment provider, the system runs through a couple of validation steps to make sure that the data provided is correct and complete. These validations include fields necessary for payment, supported payment methods, consistency of transaction amount, and eligibility for reservation.</w:t>
+      </w:r>
+    </w:p>
+    <w:p>
+      <w:r>
+        <w:t>If any validation rule is not satisfied, the payment process is interrupted and the customer is asked to correct the data provided before resubmitting the payment request.</w:t>
+      </w:r>
+    </w:p>
+    <w:p>
+      <w:pPr>
+        <w:rPr>
+          <w:b/>
+          <w:bCs/>
+        </w:rPr>
+      </w:pPr>
+      <w:r>
+        <w:rPr>
+          <w:b/>
+          <w:bCs/>
+        </w:rPr>
+        <w:t>Successful Payment</w:t>
+      </w:r>
+    </w:p>
+    <w:p>
+      <w:r>
+        <w:t>After receiving the go-ahead from the external PaymentGateway, the system records the payment data in the database and updates the corresponding reservation status. The customer then receives a confirmation message with the payment reference and transaction status.</w:t>
+      </w:r>
+    </w:p>
+    <w:p>
+      <w:r>
+        <w:t>This process allows payment records and reservation information to remain in sync in the system.</w:t>
+      </w:r>
+    </w:p>
+    <w:p>
+      <w:pPr>
+        <w:rPr>
+          <w:b/>
+          <w:bCs/>
+        </w:rPr>
+      </w:pPr>
+      <w:r>
+        <w:rPr>
+          <w:b/>
+          <w:bCs/>
+        </w:rPr>
+        <w:t>Failed Payment</w:t>
+      </w:r>
+    </w:p>
+    <w:p>
+      <w:r>
+        <w:t xml:space="preserve">The sequence diagram also models scenarios where the payment cannot be performed. Possible reasons for transaction failure include insufficient funds, incorrect payment credentials, network communication problems, or rejection by the payment gateway. </w:t>
+      </w:r>
+      <w:r>
+        <w:br/>
+        <w:t>If there’s an error, the PaymentGateway will send an error response back to the PaymentService. The PaymentController notifies the customer that the transaction was unsuccessful and keeps the reservation in the same state as before. The customer can then try to process the payment again using the same or different payment method.</w:t>
+      </w:r>
+    </w:p>
+    <w:p>
+      <w:r>
+        <w:rPr>
+          <w:b/>
+          <w:bCs/>
+        </w:rPr>
+        <w:t>Alternative and Exceptional Flows</w:t>
+      </w:r>
+    </w:p>
+    <w:p>
+      <w:r>
+        <w:t>The Payment Processing Sequence Diagram includes several alternative execution paths to improve system reliability:</w:t>
+      </w:r>
+    </w:p>
+    <w:p>
+      <w:pPr>
+        <w:pStyle w:val="ListParagraph"/>
+        <w:numPr>
+          <w:ilvl w:val="0"/>
+          <w:numId w:val="79"/>
+        </w:numPr>
+      </w:pPr>
+      <w:r>
+        <w:t>Invalid or incomplete payment information.</w:t>
+      </w:r>
+    </w:p>
+    <w:p>
+      <w:pPr>
+        <w:pStyle w:val="ListParagraph"/>
+        <w:numPr>
+          <w:ilvl w:val="0"/>
+          <w:numId w:val="79"/>
+        </w:numPr>
+      </w:pPr>
+      <w:r>
+        <w:t>Payment authorization rejected by the external payment gateway.</w:t>
+      </w:r>
+    </w:p>
+    <w:p>
+      <w:pPr>
+        <w:pStyle w:val="ListParagraph"/>
+        <w:numPr>
+          <w:ilvl w:val="0"/>
+          <w:numId w:val="79"/>
+        </w:numPr>
+      </w:pPr>
+      <w:r>
+        <w:t>Communication failure with the payment provider.</w:t>
+      </w:r>
+    </w:p>
+    <w:p>
+      <w:pPr>
+        <w:pStyle w:val="ListParagraph"/>
+        <w:numPr>
+          <w:ilvl w:val="0"/>
+          <w:numId w:val="79"/>
+        </w:numPr>
+      </w:pPr>
+      <w:r>
+        <w:t>Successful payment resulting in reservation confirmation and transaction recording.</w:t>
+      </w:r>
+    </w:p>
+    <w:p>
+      <w:r>
+        <w:t>These alternative scenarios ensure that the system maintains transactional integrity while providing clear feedback to users throughout the payment process.</w:t>
+      </w:r>
+    </w:p>
+    <w:p>
+      <w:pPr>
+        <w:rPr>
+          <w:b/>
+          <w:bCs/>
+        </w:rPr>
+      </w:pPr>
+      <w:r>
+        <w:rPr>
+          <w:b/>
+          <w:bCs/>
+        </w:rPr>
+        <w:t>Security Considerations</w:t>
+      </w:r>
+    </w:p>
+    <w:p>
+      <w:r>
+        <w:t xml:space="preserve">The payment subsystem has various security features to guarantee the safety of financial transactions and customer data. Payment details are verified before processing. Communication with the external payment gateway is performed over secure channels and only transaction results are stored within the platform. No sensitive payment credentials are stored permanently in the application database. </w:t>
+      </w:r>
+      <w:r>
+        <w:br/>
+        <w:t>These measures help to ensure confidentiality, integrity and reliability in the payment process.</w:t>
+      </w:r>
+    </w:p>
+    <w:p>
+      <w:pPr>
+        <w:spacing w:line="278" w:lineRule="auto"/>
+        <w:rPr>
+          <w:b/>
+          <w:bCs/>
+        </w:rPr>
+      </w:pPr>
+      <w:r>
+        <w:rPr>
+          <w:b/>
+          <w:bCs/>
+        </w:rPr>
+        <w:br w:type="page"/>
+      </w:r>
+    </w:p>
+    <w:p>
+      <w:pPr>
+        <w:keepNext/>
+      </w:pPr>
+      <w:r>
+        <w:rPr>
+          <w:noProof/>
+        </w:rPr>
+        <w:lastRenderedPageBreak/>
+        <w:drawing>
+          <wp:inline distT="0" distB="0" distL="0" distR="0" wp14:anchorId="0B7A468A" wp14:editId="088B2326">
+            <wp:extent cx="5941695" cy="4822825"/>
+            <wp:effectExtent l="0" t="0" r="1905" b="0"/>
+            <wp:docPr id="1193034892" name="Picture 4"/>
+            <wp:cNvGraphicFramePr>
+              <a:graphicFrameLocks xmlns:a="http://schemas.openxmlformats.org/drawingml/2006/main" noChangeAspect="1"/>
+            </wp:cNvGraphicFramePr>
+            <a:graphic xmlns:a="http://schemas.openxmlformats.org/drawingml/2006/main">
+              <a:graphicData uri="http://schemas.openxmlformats.org/drawingml/2006/picture">
+                <pic:pic xmlns:pic="http://schemas.openxmlformats.org/drawingml/2006/picture">
+                  <pic:nvPicPr>
+                    <pic:cNvPr id="0" name="Picture 3"/>
+                    <pic:cNvPicPr>
+                      <a:picLocks noChangeAspect="1" noChangeArrowheads="1"/>
+                    </pic:cNvPicPr>
+                  </pic:nvPicPr>
+                  <pic:blipFill>
+                    <a:blip r:embed="rId11" cstate="print">
+                      <a:extLst>
+                        <a:ext uri="{28A0092B-C50C-407E-A947-70E740481C1C}">
+                          <a14:useLocalDpi xmlns:a14="http://schemas.microsoft.com/office/drawing/2010/main" val="0"/>
+                        </a:ext>
+                      </a:extLst>
+                    </a:blip>
+                    <a:srcRect/>
+                    <a:stretch>
+                      <a:fillRect/>
+                    </a:stretch>
+                  </pic:blipFill>
+                  <pic:spPr bwMode="auto">
+                    <a:xfrm>
+                      <a:off x="0" y="0"/>
+                      <a:ext cx="5941695" cy="4822825"/>
+                    </a:xfrm>
+                    <a:prstGeom prst="rect">
+                      <a:avLst/>
+                    </a:prstGeom>
+                    <a:noFill/>
+                    <a:ln>
+                      <a:noFill/>
+                    </a:ln>
+                  </pic:spPr>
+                </pic:pic>
+              </a:graphicData>
+            </a:graphic>
+          </wp:inline>
+        </w:drawing>
+      </w:r>
+    </w:p>
+    <w:p>
+      <w:pPr>
+        <w:pStyle w:val="Caption"/>
+        <w:rPr>
+          <w:b/>
+          <w:bCs/>
+        </w:rPr>
+      </w:pPr>
+      <w:r>
+        <w:t xml:space="preserve">Figure </w:t>
+      </w:r>
+      <w:r>
+        <w:fldChar w:fldCharType="begin"/>
+      </w:r>
+      <w:r>
+        <w:instrText xml:space="preserve"> SEQ Figure \* ARABIC </w:instrText>
+      </w:r>
+      <w:r>
+        <w:fldChar w:fldCharType="separate"/>
+      </w:r>
+      <w:r>
+        <w:rPr>
+          <w:noProof/>
+        </w:rPr>
+        <w:t>4</w:t>
+      </w:r>
+      <w:r>
+        <w:fldChar w:fldCharType="end"/>
+      </w:r>
+      <w:r>
+        <w:t xml:space="preserve"> - </w:t>
+      </w:r>
+      <w:r>
+        <w:t>Payment Processing Sequence Diagram</w:t>
+      </w:r>
+    </w:p>
+    <w:p>
+      <w:pPr>
+        <w:rPr>
+          <w:b/>
+          <w:bCs/>
+        </w:rPr>
+      </w:pPr>
+    </w:p>
+    <w:p>
+      <w:pPr>
+        <w:rPr>
+          <w:b/>
+          <w:bCs/>
+        </w:rPr>
+      </w:pPr>
+      <w:r>
+        <w:rPr>
+          <w:b/>
+          <w:bCs/>
+        </w:rPr>
+        <w:t>Conclusion</w:t>
+      </w:r>
+    </w:p>
+    <w:p>
+      <w:r>
+        <w:t>The Payment Processing Sequence Diagram details the payment workflow in the KriGo platform in a comprehensive manner. It illustrates the interplay of presentation layer, business logic, data repositories and external payment services and emphasizes on payment validation, transaction authorization, reservation updates and exception handling. This diagram is an important design artifact for understanding the payment sub-system and for validating the functional requirements related to secure online transactions.</w:t>
+      </w:r>
+    </w:p>
     <w:sectPr>
       <w:pgSz w:w="11906" w:h="16838" w:code="9"/>
       <w:pgMar w:top="1411" w:right="850" w:bottom="1411" w:left="1699" w:header="720" w:footer="720" w:gutter="0"/>
@@ -9574,6 +10204,119 @@
     </w:lvl>
   </w:abstractNum>
   <w:abstractNum w:abstractNumId="59" w15:restartNumberingAfterBreak="0">
+    <w:nsid w:val="65314293"/>
+    <w:multiLevelType w:val="hybridMultilevel"/>
+    <w:tmpl w:val="6688DFAC"/>
+    <w:lvl w:ilvl="0" w:tplc="04090005">
+      <w:start w:val="1"/>
+      <w:numFmt w:val="bullet"/>
+      <w:lvlText w:val=""/>
+      <w:lvlJc w:val="left"/>
+      <w:pPr>
+        <w:ind w:left="720" w:hanging="360"/>
+      </w:pPr>
+      <w:rPr>
+        <w:rFonts w:ascii="Wingdings" w:hAnsi="Wingdings" w:hint="default"/>
+      </w:rPr>
+    </w:lvl>
+    <w:lvl w:ilvl="1" w:tplc="04090003" w:tentative="1">
+      <w:start w:val="1"/>
+      <w:numFmt w:val="bullet"/>
+      <w:lvlText w:val="o"/>
+      <w:lvlJc w:val="left"/>
+      <w:pPr>
+        <w:ind w:left="1440" w:hanging="360"/>
+      </w:pPr>
+      <w:rPr>
+        <w:rFonts w:ascii="Courier New" w:hAnsi="Courier New" w:cs="Courier New" w:hint="default"/>
+      </w:rPr>
+    </w:lvl>
+    <w:lvl w:ilvl="2" w:tplc="04090005" w:tentative="1">
+      <w:start w:val="1"/>
+      <w:numFmt w:val="bullet"/>
+      <w:lvlText w:val=""/>
+      <w:lvlJc w:val="left"/>
+      <w:pPr>
+        <w:ind w:left="2160" w:hanging="360"/>
+      </w:pPr>
+      <w:rPr>
+        <w:rFonts w:ascii="Wingdings" w:hAnsi="Wingdings" w:hint="default"/>
+      </w:rPr>
+    </w:lvl>
+    <w:lvl w:ilvl="3" w:tplc="04090001" w:tentative="1">
+      <w:start w:val="1"/>
+      <w:numFmt w:val="bullet"/>
+      <w:lvlText w:val=""/>
+      <w:lvlJc w:val="left"/>
+      <w:pPr>
+        <w:ind w:left="2880" w:hanging="360"/>
+      </w:pPr>
+      <w:rPr>
+        <w:rFonts w:ascii="Symbol" w:hAnsi="Symbol" w:hint="default"/>
+      </w:rPr>
+    </w:lvl>
+    <w:lvl w:ilvl="4" w:tplc="04090003" w:tentative="1">
+      <w:start w:val="1"/>
+      <w:numFmt w:val="bullet"/>
+      <w:lvlText w:val="o"/>
+      <w:lvlJc w:val="left"/>
+      <w:pPr>
+        <w:ind w:left="3600" w:hanging="360"/>
+      </w:pPr>
+      <w:rPr>
+        <w:rFonts w:ascii="Courier New" w:hAnsi="Courier New" w:cs="Courier New" w:hint="default"/>
+      </w:rPr>
+    </w:lvl>
+    <w:lvl w:ilvl="5" w:tplc="04090005" w:tentative="1">
+      <w:start w:val="1"/>
+      <w:numFmt w:val="bullet"/>
+      <w:lvlText w:val=""/>
+      <w:lvlJc w:val="left"/>
+      <w:pPr>
+        <w:ind w:left="4320" w:hanging="360"/>
+      </w:pPr>
+      <w:rPr>
+        <w:rFonts w:ascii="Wingdings" w:hAnsi="Wingdings" w:hint="default"/>
+      </w:rPr>
+    </w:lvl>
+    <w:lvl w:ilvl="6" w:tplc="04090001" w:tentative="1">
+      <w:start w:val="1"/>
+      <w:numFmt w:val="bullet"/>
+      <w:lvlText w:val=""/>
+      <w:lvlJc w:val="left"/>
+      <w:pPr>
+        <w:ind w:left="5040" w:hanging="360"/>
+      </w:pPr>
+      <w:rPr>
+        <w:rFonts w:ascii="Symbol" w:hAnsi="Symbol" w:hint="default"/>
+      </w:rPr>
+    </w:lvl>
+    <w:lvl w:ilvl="7" w:tplc="04090003" w:tentative="1">
+      <w:start w:val="1"/>
+      <w:numFmt w:val="bullet"/>
+      <w:lvlText w:val="o"/>
+      <w:lvlJc w:val="left"/>
+      <w:pPr>
+        <w:ind w:left="5760" w:hanging="360"/>
+      </w:pPr>
+      <w:rPr>
+        <w:rFonts w:ascii="Courier New" w:hAnsi="Courier New" w:cs="Courier New" w:hint="default"/>
+      </w:rPr>
+    </w:lvl>
+    <w:lvl w:ilvl="8" w:tplc="04090005" w:tentative="1">
+      <w:start w:val="1"/>
+      <w:numFmt w:val="bullet"/>
+      <w:lvlText w:val=""/>
+      <w:lvlJc w:val="left"/>
+      <w:pPr>
+        <w:ind w:left="6480" w:hanging="360"/>
+      </w:pPr>
+      <w:rPr>
+        <w:rFonts w:ascii="Wingdings" w:hAnsi="Wingdings" w:hint="default"/>
+      </w:rPr>
+    </w:lvl>
+  </w:abstractNum>
+  <w:abstractNum w:abstractNumId="60" w15:restartNumberingAfterBreak="0">
     <w:nsid w:val="65CE4D0F"/>
     <w:multiLevelType w:val="hybridMultilevel"/>
     <w:tmpl w:val="DB668538"/>
@@ -9686,7 +10429,7 @@
       </w:rPr>
     </w:lvl>
   </w:abstractNum>
-  <w:abstractNum w:abstractNumId="60" w15:restartNumberingAfterBreak="0">
+  <w:abstractNum w:abstractNumId="61" w15:restartNumberingAfterBreak="0">
     <w:nsid w:val="69DE2C87"/>
     <w:multiLevelType w:val="hybridMultilevel"/>
     <w:tmpl w:val="F530F20A"/>
@@ -9799,7 +10542,7 @@
       </w:rPr>
     </w:lvl>
   </w:abstractNum>
-  <w:abstractNum w:abstractNumId="61" w15:restartNumberingAfterBreak="0">
+  <w:abstractNum w:abstractNumId="62" w15:restartNumberingAfterBreak="0">
     <w:nsid w:val="69ED672D"/>
     <w:multiLevelType w:val="multilevel"/>
     <w:tmpl w:val="CC08E300"/>
@@ -9948,7 +10691,7 @@
       </w:rPr>
     </w:lvl>
   </w:abstractNum>
-  <w:abstractNum w:abstractNumId="62" w15:restartNumberingAfterBreak="0">
+  <w:abstractNum w:abstractNumId="63" w15:restartNumberingAfterBreak="0">
     <w:nsid w:val="6A063EFD"/>
     <w:multiLevelType w:val="hybridMultilevel"/>
     <w:tmpl w:val="48703FBA"/>
@@ -10061,7 +10804,7 @@
       </w:rPr>
     </w:lvl>
   </w:abstractNum>
-  <w:abstractNum w:abstractNumId="63" w15:restartNumberingAfterBreak="0">
+  <w:abstractNum w:abstractNumId="64" w15:restartNumberingAfterBreak="0">
     <w:nsid w:val="6A825ABE"/>
     <w:multiLevelType w:val="multilevel"/>
     <w:tmpl w:val="0CD6F30E"/>
@@ -10210,7 +10953,7 @@
       </w:rPr>
     </w:lvl>
   </w:abstractNum>
-  <w:abstractNum w:abstractNumId="64" w15:restartNumberingAfterBreak="0">
+  <w:abstractNum w:abstractNumId="65" w15:restartNumberingAfterBreak="0">
     <w:nsid w:val="6C6D6667"/>
     <w:multiLevelType w:val="hybridMultilevel"/>
     <w:tmpl w:val="A744709C"/>
@@ -10323,7 +11066,7 @@
       </w:rPr>
     </w:lvl>
   </w:abstractNum>
-  <w:abstractNum w:abstractNumId="65" w15:restartNumberingAfterBreak="0">
+  <w:abstractNum w:abstractNumId="66" w15:restartNumberingAfterBreak="0">
     <w:nsid w:val="6CAD7EA5"/>
     <w:multiLevelType w:val="multilevel"/>
     <w:tmpl w:val="C472C5B0"/>
@@ -10472,7 +11215,7 @@
       </w:rPr>
     </w:lvl>
   </w:abstractNum>
-  <w:abstractNum w:abstractNumId="66" w15:restartNumberingAfterBreak="0">
+  <w:abstractNum w:abstractNumId="67" w15:restartNumberingAfterBreak="0">
     <w:nsid w:val="6E43557B"/>
     <w:multiLevelType w:val="multilevel"/>
     <w:tmpl w:val="323C7112"/>
@@ -10621,7 +11364,7 @@
       </w:rPr>
     </w:lvl>
   </w:abstractNum>
-  <w:abstractNum w:abstractNumId="67" w15:restartNumberingAfterBreak="0">
+  <w:abstractNum w:abstractNumId="68" w15:restartNumberingAfterBreak="0">
     <w:nsid w:val="6EA27D0A"/>
     <w:multiLevelType w:val="multilevel"/>
     <w:tmpl w:val="7BF0256C"/>
@@ -10770,7 +11513,7 @@
       </w:rPr>
     </w:lvl>
   </w:abstractNum>
-  <w:abstractNum w:abstractNumId="68" w15:restartNumberingAfterBreak="0">
+  <w:abstractNum w:abstractNumId="69" w15:restartNumberingAfterBreak="0">
     <w:nsid w:val="70874300"/>
     <w:multiLevelType w:val="hybridMultilevel"/>
     <w:tmpl w:val="1B3A0518"/>
@@ -10883,7 +11626,120 @@
       </w:rPr>
     </w:lvl>
   </w:abstractNum>
-  <w:abstractNum w:abstractNumId="69" w15:restartNumberingAfterBreak="0">
+  <w:abstractNum w:abstractNumId="70" w15:restartNumberingAfterBreak="0">
+    <w:nsid w:val="7090251B"/>
+    <w:multiLevelType w:val="hybridMultilevel"/>
+    <w:tmpl w:val="67687EFE"/>
+    <w:lvl w:ilvl="0" w:tplc="04090005">
+      <w:start w:val="1"/>
+      <w:numFmt w:val="bullet"/>
+      <w:lvlText w:val=""/>
+      <w:lvlJc w:val="left"/>
+      <w:pPr>
+        <w:ind w:left="720" w:hanging="360"/>
+      </w:pPr>
+      <w:rPr>
+        <w:rFonts w:ascii="Wingdings" w:hAnsi="Wingdings" w:hint="default"/>
+      </w:rPr>
+    </w:lvl>
+    <w:lvl w:ilvl="1" w:tplc="04090003" w:tentative="1">
+      <w:start w:val="1"/>
+      <w:numFmt w:val="bullet"/>
+      <w:lvlText w:val="o"/>
+      <w:lvlJc w:val="left"/>
+      <w:pPr>
+        <w:ind w:left="1440" w:hanging="360"/>
+      </w:pPr>
+      <w:rPr>
+        <w:rFonts w:ascii="Courier New" w:hAnsi="Courier New" w:cs="Courier New" w:hint="default"/>
+      </w:rPr>
+    </w:lvl>
+    <w:lvl w:ilvl="2" w:tplc="04090005" w:tentative="1">
+      <w:start w:val="1"/>
+      <w:numFmt w:val="bullet"/>
+      <w:lvlText w:val=""/>
+      <w:lvlJc w:val="left"/>
+      <w:pPr>
+        <w:ind w:left="2160" w:hanging="360"/>
+      </w:pPr>
+      <w:rPr>
+        <w:rFonts w:ascii="Wingdings" w:hAnsi="Wingdings" w:hint="default"/>
+      </w:rPr>
+    </w:lvl>
+    <w:lvl w:ilvl="3" w:tplc="04090001" w:tentative="1">
+      <w:start w:val="1"/>
+      <w:numFmt w:val="bullet"/>
+      <w:lvlText w:val=""/>
+      <w:lvlJc w:val="left"/>
+      <w:pPr>
+        <w:ind w:left="2880" w:hanging="360"/>
+      </w:pPr>
+      <w:rPr>
+        <w:rFonts w:ascii="Symbol" w:hAnsi="Symbol" w:hint="default"/>
+      </w:rPr>
+    </w:lvl>
+    <w:lvl w:ilvl="4" w:tplc="04090003" w:tentative="1">
+      <w:start w:val="1"/>
+      <w:numFmt w:val="bullet"/>
+      <w:lvlText w:val="o"/>
+      <w:lvlJc w:val="left"/>
+      <w:pPr>
+        <w:ind w:left="3600" w:hanging="360"/>
+      </w:pPr>
+      <w:rPr>
+        <w:rFonts w:ascii="Courier New" w:hAnsi="Courier New" w:cs="Courier New" w:hint="default"/>
+      </w:rPr>
+    </w:lvl>
+    <w:lvl w:ilvl="5" w:tplc="04090005" w:tentative="1">
+      <w:start w:val="1"/>
+      <w:numFmt w:val="bullet"/>
+      <w:lvlText w:val=""/>
+      <w:lvlJc w:val="left"/>
+      <w:pPr>
+        <w:ind w:left="4320" w:hanging="360"/>
+      </w:pPr>
+      <w:rPr>
+        <w:rFonts w:ascii="Wingdings" w:hAnsi="Wingdings" w:hint="default"/>
+      </w:rPr>
+    </w:lvl>
+    <w:lvl w:ilvl="6" w:tplc="04090001" w:tentative="1">
+      <w:start w:val="1"/>
+      <w:numFmt w:val="bullet"/>
+      <w:lvlText w:val=""/>
+      <w:lvlJc w:val="left"/>
+      <w:pPr>
+        <w:ind w:left="5040" w:hanging="360"/>
+      </w:pPr>
+      <w:rPr>
+        <w:rFonts w:ascii="Symbol" w:hAnsi="Symbol" w:hint="default"/>
+      </w:rPr>
+    </w:lvl>
+    <w:lvl w:ilvl="7" w:tplc="04090003" w:tentative="1">
+      <w:start w:val="1"/>
+      <w:numFmt w:val="bullet"/>
+      <w:lvlText w:val="o"/>
+      <w:lvlJc w:val="left"/>
+      <w:pPr>
+        <w:ind w:left="5760" w:hanging="360"/>
+      </w:pPr>
+      <w:rPr>
+        <w:rFonts w:ascii="Courier New" w:hAnsi="Courier New" w:cs="Courier New" w:hint="default"/>
+      </w:rPr>
+    </w:lvl>
+    <w:lvl w:ilvl="8" w:tplc="04090005" w:tentative="1">
+      <w:start w:val="1"/>
+      <w:numFmt w:val="bullet"/>
+      <w:lvlText w:val=""/>
+      <w:lvlJc w:val="left"/>
+      <w:pPr>
+        <w:ind w:left="6480" w:hanging="360"/>
+      </w:pPr>
+      <w:rPr>
+        <w:rFonts w:ascii="Wingdings" w:hAnsi="Wingdings" w:hint="default"/>
+      </w:rPr>
+    </w:lvl>
+  </w:abstractNum>
+  <w:abstractNum w:abstractNumId="71" w15:restartNumberingAfterBreak="0">
     <w:nsid w:val="75144C65"/>
     <w:multiLevelType w:val="hybridMultilevel"/>
     <w:tmpl w:val="12127FAA"/>
@@ -10996,7 +11852,7 @@
       </w:rPr>
     </w:lvl>
   </w:abstractNum>
-  <w:abstractNum w:abstractNumId="70" w15:restartNumberingAfterBreak="0">
+  <w:abstractNum w:abstractNumId="72" w15:restartNumberingAfterBreak="0">
     <w:nsid w:val="75237F84"/>
     <w:multiLevelType w:val="hybridMultilevel"/>
     <w:tmpl w:val="5F0A6EF2"/>
@@ -11109,7 +11965,7 @@
       </w:rPr>
     </w:lvl>
   </w:abstractNum>
-  <w:abstractNum w:abstractNumId="71" w15:restartNumberingAfterBreak="0">
+  <w:abstractNum w:abstractNumId="73" w15:restartNumberingAfterBreak="0">
     <w:nsid w:val="75FF09B0"/>
     <w:multiLevelType w:val="multilevel"/>
     <w:tmpl w:val="C34A7734"/>
@@ -11258,7 +12114,7 @@
       </w:rPr>
     </w:lvl>
   </w:abstractNum>
-  <w:abstractNum w:abstractNumId="72" w15:restartNumberingAfterBreak="0">
+  <w:abstractNum w:abstractNumId="74" w15:restartNumberingAfterBreak="0">
     <w:nsid w:val="77960362"/>
     <w:multiLevelType w:val="multilevel"/>
     <w:tmpl w:val="FEA0022E"/>
@@ -11407,7 +12263,7 @@
       </w:rPr>
     </w:lvl>
   </w:abstractNum>
-  <w:abstractNum w:abstractNumId="73" w15:restartNumberingAfterBreak="0">
+  <w:abstractNum w:abstractNumId="75" w15:restartNumberingAfterBreak="0">
     <w:nsid w:val="785A644F"/>
     <w:multiLevelType w:val="multilevel"/>
     <w:tmpl w:val="D1DC60FE"/>
@@ -11556,7 +12412,7 @@
       </w:rPr>
     </w:lvl>
   </w:abstractNum>
-  <w:abstractNum w:abstractNumId="74" w15:restartNumberingAfterBreak="0">
+  <w:abstractNum w:abstractNumId="76" w15:restartNumberingAfterBreak="0">
     <w:nsid w:val="7BFA03DF"/>
     <w:multiLevelType w:val="hybridMultilevel"/>
     <w:tmpl w:val="536A979E"/>
@@ -11669,7 +12525,7 @@
       </w:rPr>
     </w:lvl>
   </w:abstractNum>
-  <w:abstractNum w:abstractNumId="75" w15:restartNumberingAfterBreak="0">
+  <w:abstractNum w:abstractNumId="77" w15:restartNumberingAfterBreak="0">
     <w:nsid w:val="7CA524B4"/>
     <w:multiLevelType w:val="hybridMultilevel"/>
     <w:tmpl w:val="957C4F4A"/>
@@ -11782,7 +12638,7 @@
       </w:rPr>
     </w:lvl>
   </w:abstractNum>
-  <w:abstractNum w:abstractNumId="76" w15:restartNumberingAfterBreak="0">
+  <w:abstractNum w:abstractNumId="78" w15:restartNumberingAfterBreak="0">
     <w:nsid w:val="7EBD7710"/>
     <w:multiLevelType w:val="hybridMultilevel"/>
     <w:tmpl w:val="C8C6F7A0"/>
@@ -11908,13 +12764,13 @@
     <w:abstractNumId w:val="49"/>
   </w:num>
   <w:num w:numId="5" w16cid:durableId="1647204897">
-    <w:abstractNumId w:val="75"/>
+    <w:abstractNumId w:val="77"/>
   </w:num>
   <w:num w:numId="6" w16cid:durableId="682589869">
     <w:abstractNumId w:val="14"/>
   </w:num>
   <w:num w:numId="7" w16cid:durableId="679703478">
-    <w:abstractNumId w:val="60"/>
+    <w:abstractNumId w:val="61"/>
   </w:num>
   <w:num w:numId="8" w16cid:durableId="496455128">
     <w:abstractNumId w:val="28"/>
@@ -11926,7 +12782,7 @@
     <w:abstractNumId w:val="39"/>
   </w:num>
   <w:num w:numId="11" w16cid:durableId="1412503779">
-    <w:abstractNumId w:val="62"/>
+    <w:abstractNumId w:val="63"/>
   </w:num>
   <w:num w:numId="12" w16cid:durableId="1107113995">
     <w:abstractNumId w:val="29"/>
@@ -11935,7 +12791,7 @@
     <w:abstractNumId w:val="15"/>
   </w:num>
   <w:num w:numId="14" w16cid:durableId="1529222885">
-    <w:abstractNumId w:val="74"/>
+    <w:abstractNumId w:val="76"/>
   </w:num>
   <w:num w:numId="15" w16cid:durableId="836580755">
     <w:abstractNumId w:val="9"/>
@@ -11944,7 +12800,7 @@
     <w:abstractNumId w:val="52"/>
   </w:num>
   <w:num w:numId="17" w16cid:durableId="1320882603">
-    <w:abstractNumId w:val="68"/>
+    <w:abstractNumId w:val="69"/>
   </w:num>
   <w:num w:numId="18" w16cid:durableId="1139028372">
     <w:abstractNumId w:val="30"/>
@@ -11953,16 +12809,16 @@
     <w:abstractNumId w:val="56"/>
   </w:num>
   <w:num w:numId="20" w16cid:durableId="609623515">
-    <w:abstractNumId w:val="76"/>
+    <w:abstractNumId w:val="78"/>
   </w:num>
   <w:num w:numId="21" w16cid:durableId="165170997">
-    <w:abstractNumId w:val="64"/>
+    <w:abstractNumId w:val="65"/>
   </w:num>
   <w:num w:numId="22" w16cid:durableId="1620525290">
     <w:abstractNumId w:val="19"/>
   </w:num>
   <w:num w:numId="23" w16cid:durableId="400753109">
-    <w:abstractNumId w:val="69"/>
+    <w:abstractNumId w:val="71"/>
   </w:num>
   <w:num w:numId="24" w16cid:durableId="193882219">
     <w:abstractNumId w:val="3"/>
@@ -11980,7 +12836,7 @@
     <w:abstractNumId w:val="10"/>
   </w:num>
   <w:num w:numId="29" w16cid:durableId="2124693280">
-    <w:abstractNumId w:val="59"/>
+    <w:abstractNumId w:val="60"/>
   </w:num>
   <w:num w:numId="30" w16cid:durableId="1367099744">
     <w:abstractNumId w:val="23"/>
@@ -12004,7 +12860,7 @@
     <w:abstractNumId w:val="1"/>
   </w:num>
   <w:num w:numId="37" w16cid:durableId="1849755457">
-    <w:abstractNumId w:val="70"/>
+    <w:abstractNumId w:val="72"/>
   </w:num>
   <w:num w:numId="38" w16cid:durableId="516505904">
     <w:abstractNumId w:val="7"/>
@@ -12034,16 +12890,16 @@
     <w:abstractNumId w:val="18"/>
   </w:num>
   <w:num w:numId="47" w16cid:durableId="68767822">
-    <w:abstractNumId w:val="63"/>
+    <w:abstractNumId w:val="64"/>
   </w:num>
   <w:num w:numId="48" w16cid:durableId="1992058265">
     <w:abstractNumId w:val="4"/>
   </w:num>
   <w:num w:numId="49" w16cid:durableId="788475134">
-    <w:abstractNumId w:val="73"/>
+    <w:abstractNumId w:val="75"/>
   </w:num>
   <w:num w:numId="50" w16cid:durableId="224419455">
-    <w:abstractNumId w:val="67"/>
+    <w:abstractNumId w:val="68"/>
   </w:num>
   <w:num w:numId="51" w16cid:durableId="1699575947">
     <w:abstractNumId w:val="55"/>
@@ -12052,7 +12908,7 @@
     <w:abstractNumId w:val="35"/>
   </w:num>
   <w:num w:numId="53" w16cid:durableId="1188711211">
-    <w:abstractNumId w:val="71"/>
+    <w:abstractNumId w:val="73"/>
   </w:num>
   <w:num w:numId="54" w16cid:durableId="447555614">
     <w:abstractNumId w:val="57"/>
@@ -12061,7 +12917,7 @@
     <w:abstractNumId w:val="34"/>
   </w:num>
   <w:num w:numId="56" w16cid:durableId="693773591">
-    <w:abstractNumId w:val="66"/>
+    <w:abstractNumId w:val="67"/>
   </w:num>
   <w:num w:numId="57" w16cid:durableId="1110473324">
     <w:abstractNumId w:val="24"/>
@@ -12073,7 +12929,7 @@
     <w:abstractNumId w:val="27"/>
   </w:num>
   <w:num w:numId="60" w16cid:durableId="2095394549">
-    <w:abstractNumId w:val="72"/>
+    <w:abstractNumId w:val="74"/>
   </w:num>
   <w:num w:numId="61" w16cid:durableId="1299921011">
     <w:abstractNumId w:val="26"/>
@@ -12091,7 +12947,7 @@
     <w:abstractNumId w:val="45"/>
   </w:num>
   <w:num w:numId="66" w16cid:durableId="484011382">
-    <w:abstractNumId w:val="61"/>
+    <w:abstractNumId w:val="62"/>
   </w:num>
   <w:num w:numId="67" w16cid:durableId="2008289242">
     <w:abstractNumId w:val="6"/>
@@ -12106,7 +12962,7 @@
     <w:abstractNumId w:val="54"/>
   </w:num>
   <w:num w:numId="71" w16cid:durableId="1460032333">
-    <w:abstractNumId w:val="65"/>
+    <w:abstractNumId w:val="66"/>
   </w:num>
   <w:num w:numId="72" w16cid:durableId="592400615">
     <w:abstractNumId w:val="5"/>
@@ -12125,6 +12981,12 @@
   </w:num>
   <w:num w:numId="77" w16cid:durableId="763109604">
     <w:abstractNumId w:val="50"/>
+  </w:num>
+  <w:num w:numId="78" w16cid:durableId="2138137265">
+    <w:abstractNumId w:val="59"/>
+  </w:num>
+  <w:num w:numId="79" w16cid:durableId="343675924">
+    <w:abstractNumId w:val="70"/>
   </w:num>
   <w:numIdMacAtCleanup w:val="45"/>
 </w:numbering>
@@ -12739,7 +13601,6 @@
   <w:style w:type="character" w:default="1" w:styleId="DefaultParagraphFont">
     <w:name w:val="Default Paragraph Font"/>
     <w:uiPriority w:val="1"/>
-    <w:semiHidden/>
     <w:unhideWhenUsed/>
   </w:style>
   <w:style w:type="table" w:default="1" w:styleId="TableNormal">

</xml_diff>

<commit_message>
Fleet Management Sequence Diagram (#230)
</commit_message>
<xml_diff>
--- a/Sequence Specification Document.docx
+++ b/Sequence Specification Document.docx
@@ -2599,15 +2599,185 @@
       <w:pPr>
         <w:keepNext/>
       </w:pPr>
+    </w:p>
+    <w:p>
+      <w:pPr>
+        <w:rPr>
+          <w:b/>
+          <w:bCs/>
+        </w:rPr>
+      </w:pPr>
+      <w:r>
+        <w:rPr>
+          <w:b/>
+          <w:bCs/>
+        </w:rPr>
+        <w:t>Conclusion</w:t>
+      </w:r>
+    </w:p>
+    <w:p>
+      <w:r>
+        <w:t>The Payment Processing Sequence Diagram details the payment workflow in the KriGo platform in a comprehensive manner. It illustrates the interplay of presentation layer, business logic, data repositories and external payment services and emphasizes on payment validation, transaction authorization, reservation updates and exception handling. This diagram is an important design artifact for understanding the payment sub-system and for validating the functional requirements related to secure online transactions.</w:t>
+      </w:r>
+    </w:p>
+    <w:p>
+      <w:pPr>
+        <w:spacing w:line="278" w:lineRule="auto"/>
+      </w:pPr>
       <w:r>
         <w:rPr>
           <w:noProof/>
         </w:rPr>
-        <w:lastRenderedPageBreak/>
+        <mc:AlternateContent>
+          <mc:Choice Requires="wps">
+            <w:drawing>
+              <wp:anchor distT="0" distB="0" distL="114300" distR="114300" simplePos="0" relativeHeight="251671552" behindDoc="0" locked="0" layoutInCell="1" allowOverlap="1" wp14:anchorId="41C2E31C" wp14:editId="56A095A5">
+                <wp:simplePos x="0" y="0"/>
+                <wp:positionH relativeFrom="column">
+                  <wp:posOffset>-50165</wp:posOffset>
+                </wp:positionH>
+                <wp:positionV relativeFrom="paragraph">
+                  <wp:posOffset>5337810</wp:posOffset>
+                </wp:positionV>
+                <wp:extent cx="5941695" cy="635"/>
+                <wp:effectExtent l="0" t="0" r="0" b="0"/>
+                <wp:wrapSquare wrapText="bothSides"/>
+                <wp:docPr id="1716003984" name="Text Box 1"/>
+                <wp:cNvGraphicFramePr/>
+                <a:graphic xmlns:a="http://schemas.openxmlformats.org/drawingml/2006/main">
+                  <a:graphicData uri="http://schemas.microsoft.com/office/word/2010/wordprocessingShape">
+                    <wps:wsp>
+                      <wps:cNvSpPr txBox="1"/>
+                      <wps:spPr>
+                        <a:xfrm>
+                          <a:off x="0" y="0"/>
+                          <a:ext cx="5941695" cy="635"/>
+                        </a:xfrm>
+                        <a:prstGeom prst="rect">
+                          <a:avLst/>
+                        </a:prstGeom>
+                        <a:solidFill>
+                          <a:prstClr val="white"/>
+                        </a:solidFill>
+                        <a:ln>
+                          <a:noFill/>
+                        </a:ln>
+                      </wps:spPr>
+                      <wps:txbx>
+                        <w:txbxContent>
+                          <w:p>
+                            <w:pPr>
+                              <w:pStyle w:val="Caption"/>
+                              <w:rPr>
+                                <w:noProof/>
+                              </w:rPr>
+                            </w:pPr>
+                            <w:r>
+                              <w:t xml:space="preserve">Figure </w:t>
+                            </w:r>
+                            <w:r>
+                              <w:fldChar w:fldCharType="begin"/>
+                            </w:r>
+                            <w:r>
+                              <w:instrText xml:space="preserve"> SEQ Figure \* ARABIC </w:instrText>
+                            </w:r>
+                            <w:r>
+                              <w:fldChar w:fldCharType="separate"/>
+                            </w:r>
+                            <w:r>
+                              <w:rPr>
+                                <w:noProof/>
+                              </w:rPr>
+                              <w:t>4</w:t>
+                            </w:r>
+                            <w:r>
+                              <w:fldChar w:fldCharType="end"/>
+                            </w:r>
+                            <w:r>
+                              <w:t xml:space="preserve"> - </w:t>
+                            </w:r>
+                            <w:r>
+                              <w:t>Payment Processing Sequence Diagram</w:t>
+                            </w:r>
+                          </w:p>
+                        </w:txbxContent>
+                      </wps:txbx>
+                      <wps:bodyPr rot="0" spcFirstLastPara="0" vertOverflow="overflow" horzOverflow="overflow" vert="horz" wrap="square" lIns="0" tIns="0" rIns="0" bIns="0" numCol="1" spcCol="0" rtlCol="0" fromWordArt="0" anchor="t" anchorCtr="0" forceAA="0" compatLnSpc="1">
+                        <a:prstTxWarp prst="textNoShape">
+                          <a:avLst/>
+                        </a:prstTxWarp>
+                        <a:spAutoFit/>
+                      </wps:bodyPr>
+                    </wps:wsp>
+                  </a:graphicData>
+                </a:graphic>
+              </wp:anchor>
+            </w:drawing>
+          </mc:Choice>
+          <mc:Fallback>
+            <w:pict>
+              <v:shape w14:anchorId="41C2E31C" id="_x0000_s1029" type="#_x0000_t202" style="position:absolute;margin-left:-3.95pt;margin-top:420.3pt;width:467.85pt;height:.05pt;z-index:251671552;visibility:visible;mso-wrap-style:square;mso-wrap-distance-left:9pt;mso-wrap-distance-top:0;mso-wrap-distance-right:9pt;mso-wrap-distance-bottom:0;mso-position-horizontal:absolute;mso-position-horizontal-relative:text;mso-position-vertical:absolute;mso-position-vertical-relative:text;v-text-anchor:top" o:gfxdata="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" stroked="f">
+                <v:textbox style="mso-fit-shape-to-text:t" inset="0,0,0,0">
+                  <w:txbxContent>
+                    <w:p>
+                      <w:pPr>
+                        <w:pStyle w:val="Caption"/>
+                        <w:rPr>
+                          <w:noProof/>
+                        </w:rPr>
+                      </w:pPr>
+                      <w:r>
+                        <w:t xml:space="preserve">Figure </w:t>
+                      </w:r>
+                      <w:r>
+                        <w:fldChar w:fldCharType="begin"/>
+                      </w:r>
+                      <w:r>
+                        <w:instrText xml:space="preserve"> SEQ Figure \* ARABIC </w:instrText>
+                      </w:r>
+                      <w:r>
+                        <w:fldChar w:fldCharType="separate"/>
+                      </w:r>
+                      <w:r>
+                        <w:rPr>
+                          <w:noProof/>
+                        </w:rPr>
+                        <w:t>4</w:t>
+                      </w:r>
+                      <w:r>
+                        <w:fldChar w:fldCharType="end"/>
+                      </w:r>
+                      <w:r>
+                        <w:t xml:space="preserve"> - </w:t>
+                      </w:r>
+                      <w:r>
+                        <w:t>Payment Processing Sequence Diagram</w:t>
+                      </w:r>
+                    </w:p>
+                  </w:txbxContent>
+                </v:textbox>
+                <w10:wrap type="square"/>
+              </v:shape>
+            </w:pict>
+          </mc:Fallback>
+        </mc:AlternateContent>
+      </w:r>
+      <w:r>
+        <w:rPr>
+          <w:noProof/>
+        </w:rPr>
         <w:drawing>
-          <wp:inline distT="0" distB="0" distL="0" distR="0" wp14:anchorId="0B7A468A" wp14:editId="088B2326">
+          <wp:anchor distT="0" distB="0" distL="114300" distR="114300" simplePos="0" relativeHeight="251669504" behindDoc="0" locked="0" layoutInCell="1" allowOverlap="1" wp14:anchorId="0B7A468A" wp14:editId="481C158F">
+            <wp:simplePos x="0" y="0"/>
+            <wp:positionH relativeFrom="column">
+              <wp:posOffset>-50165</wp:posOffset>
+            </wp:positionH>
+            <wp:positionV relativeFrom="paragraph">
+              <wp:posOffset>457835</wp:posOffset>
+            </wp:positionV>
             <wp:extent cx="5941695" cy="4822825"/>
             <wp:effectExtent l="0" t="0" r="1905" b="0"/>
+            <wp:wrapSquare wrapText="bothSides"/>
             <wp:docPr id="1193034892" name="Picture 4"/>
             <wp:cNvGraphicFramePr>
               <a:graphicFrameLocks xmlns:a="http://schemas.openxmlformats.org/drawingml/2006/main" noChangeAspect="1"/>
@@ -2650,6 +2820,500 @@
                 </pic:pic>
               </a:graphicData>
             </a:graphic>
+          </wp:anchor>
+        </w:drawing>
+      </w:r>
+      <w:r>
+        <w:br w:type="page"/>
+      </w:r>
+    </w:p>
+    <w:p>
+      <w:pPr>
+        <w:rPr>
+          <w:b/>
+          <w:bCs/>
+        </w:rPr>
+      </w:pPr>
+      <w:r>
+        <w:rPr>
+          <w:b/>
+          <w:bCs/>
+        </w:rPr>
+        <w:lastRenderedPageBreak/>
+        <w:t>Fleet Management Sequence Diagram Documentation</w:t>
+      </w:r>
+    </w:p>
+    <w:p>
+      <w:pPr>
+        <w:rPr>
+          <w:b/>
+          <w:bCs/>
+        </w:rPr>
+      </w:pPr>
+      <w:r>
+        <w:rPr>
+          <w:b/>
+          <w:bCs/>
+        </w:rPr>
+        <w:t>Purpose</w:t>
+      </w:r>
+    </w:p>
+    <w:p>
+      <w:r>
+        <w:t xml:space="preserve">The Fleet Management Sequence Diagram serves the purpose of demonstrating the working of the rental agency as well as the system modules that manage the fleet of vehicles on the KriGo system. This model explains the steps involved in the process of inserting new vehicles, updating vehicle information and deleting them. </w:t>
+      </w:r>
+    </w:p>
+    <w:p>
+      <w:r>
+        <w:t>This sequence diagram also shows the validation of vehicle information, processing of requests for fleet management, vehicle information saving process and ensuring the correctness of fleet data.</w:t>
+      </w:r>
+    </w:p>
+    <w:p>
+      <w:pPr>
+        <w:rPr>
+          <w:b/>
+          <w:bCs/>
+        </w:rPr>
+      </w:pPr>
+      <w:r>
+        <w:rPr>
+          <w:b/>
+          <w:bCs/>
+        </w:rPr>
+        <w:t>Participating Objects</w:t>
+      </w:r>
+    </w:p>
+    <w:p>
+      <w:r>
+        <w:t>The sequence diagram involves the following participants:</w:t>
+      </w:r>
+    </w:p>
+    <w:p>
+      <w:pPr>
+        <w:numPr>
+          <w:ilvl w:val="0"/>
+          <w:numId w:val="80"/>
+        </w:numPr>
+      </w:pPr>
+      <w:r>
+        <w:rPr>
+          <w:b/>
+          <w:bCs/>
+        </w:rPr>
+        <w:t>Rental Agency (Actor):</w:t>
+      </w:r>
+      <w:r>
+        <w:t xml:space="preserve"> Manages the fleet by adding, updating, deleting, and maintaining vehicle information.</w:t>
+      </w:r>
+    </w:p>
+    <w:p>
+      <w:pPr>
+        <w:numPr>
+          <w:ilvl w:val="0"/>
+          <w:numId w:val="80"/>
+        </w:numPr>
+      </w:pPr>
+      <w:r>
+        <w:rPr>
+          <w:b/>
+          <w:bCs/>
+        </w:rPr>
+        <w:t>FleetManagementUI (Boundary):</w:t>
+      </w:r>
+      <w:r>
+        <w:t xml:space="preserve"> Provides the interface through which the rental agency performs fleet management operations.</w:t>
+      </w:r>
+    </w:p>
+    <w:p>
+      <w:pPr>
+        <w:numPr>
+          <w:ilvl w:val="0"/>
+          <w:numId w:val="80"/>
+        </w:numPr>
+      </w:pPr>
+      <w:r>
+        <w:rPr>
+          <w:b/>
+          <w:bCs/>
+        </w:rPr>
+        <w:t>FleetController (Control):</w:t>
+      </w:r>
+      <w:r>
+        <w:t xml:space="preserve"> Coordinates fleet management activities and executes business logic.</w:t>
+      </w:r>
+    </w:p>
+    <w:p>
+      <w:pPr>
+        <w:numPr>
+          <w:ilvl w:val="0"/>
+          <w:numId w:val="80"/>
+        </w:numPr>
+      </w:pPr>
+      <w:r>
+        <w:rPr>
+          <w:b/>
+          <w:bCs/>
+        </w:rPr>
+        <w:t>ValidationService (Control):</w:t>
+      </w:r>
+      <w:r>
+        <w:t xml:space="preserve"> Validates vehicle information before it is processed.</w:t>
+      </w:r>
+    </w:p>
+    <w:p>
+      <w:pPr>
+        <w:numPr>
+          <w:ilvl w:val="0"/>
+          <w:numId w:val="80"/>
+        </w:numPr>
+      </w:pPr>
+      <w:r>
+        <w:rPr>
+          <w:b/>
+          <w:bCs/>
+        </w:rPr>
+        <w:t>VehicleRepository (Entity):</w:t>
+      </w:r>
+      <w:r>
+        <w:t xml:space="preserve"> Handles the storage and retrieval of vehicle records.</w:t>
+      </w:r>
+    </w:p>
+    <w:p>
+      <w:pPr>
+        <w:numPr>
+          <w:ilvl w:val="0"/>
+          <w:numId w:val="80"/>
+        </w:numPr>
+      </w:pPr>
+      <w:r>
+        <w:rPr>
+          <w:b/>
+          <w:bCs/>
+        </w:rPr>
+        <w:t>Database (Database):</w:t>
+      </w:r>
+      <w:r>
+        <w:t xml:space="preserve"> Stores vehicle information and availability status.</w:t>
+      </w:r>
+    </w:p>
+    <w:p>
+      <w:pPr>
+        <w:rPr>
+          <w:b/>
+          <w:bCs/>
+        </w:rPr>
+      </w:pPr>
+      <w:r>
+        <w:rPr>
+          <w:b/>
+          <w:bCs/>
+        </w:rPr>
+        <w:t>Vehicle Registration Process</w:t>
+      </w:r>
+    </w:p>
+    <w:p>
+      <w:r>
+        <w:t>To add a new vehicle to the fleet management process, the rental agency chooses the Add Vehicle option in the FleetManagementUI. A vehicle registration form pops up and the agency fills in with necessary information such as vehicle model, make, registration identification number, rental amount per day, vehicle type, etc.</w:t>
+      </w:r>
+    </w:p>
+    <w:p>
+      <w:r>
+        <w:t>If the entered information is complete and valid, the data is sent to the VehicleRepository component for storage.</w:t>
+      </w:r>
+    </w:p>
+    <w:p>
+      <w:r>
+        <w:t>As soon as the vehicle information is stored successfully, the request is confirmed by the system.</w:t>
+      </w:r>
+    </w:p>
+    <w:p>
+      <w:pPr>
+        <w:rPr>
+          <w:b/>
+          <w:bCs/>
+        </w:rPr>
+      </w:pPr>
+      <w:r>
+        <w:rPr>
+          <w:b/>
+          <w:bCs/>
+        </w:rPr>
+        <w:t>Vehicle Information Update</w:t>
+      </w:r>
+    </w:p>
+    <w:p>
+      <w:pPr>
+        <w:spacing w:line="278" w:lineRule="auto"/>
+      </w:pPr>
+      <w:r>
+        <w:t xml:space="preserve">The sequence diagram depicts the updating of existing vehicle information as well. When a rental agency selects a vehicle for updating, the FleetManagementUI will submit data to the FleetController. </w:t>
+      </w:r>
+    </w:p>
+    <w:p>
+      <w:pPr>
+        <w:spacing w:line="278" w:lineRule="auto"/>
+        <w:rPr>
+          <w:b/>
+          <w:bCs/>
+        </w:rPr>
+      </w:pPr>
+      <w:r>
+        <w:t>The FleetController processes the request and provides instructions to the VehicleRepository to change the vehicle information in the database. The completion of the update will result in confirmation of the process by the system.</w:t>
+      </w:r>
+      <w:r>
+        <w:rPr>
+          <w:b/>
+          <w:bCs/>
+        </w:rPr>
+        <w:br w:type="page"/>
+      </w:r>
+    </w:p>
+    <w:p>
+      <w:pPr>
+        <w:rPr>
+          <w:b/>
+          <w:bCs/>
+        </w:rPr>
+      </w:pPr>
+      <w:r>
+        <w:rPr>
+          <w:b/>
+          <w:bCs/>
+        </w:rPr>
+        <w:lastRenderedPageBreak/>
+        <w:t>Vehicle Deletion Process</w:t>
+      </w:r>
+    </w:p>
+    <w:p>
+      <w:r>
+        <w:t>The Fleet Management Sequence Diagram discusses the deletion of vehicle details from the system. When the rental company sends the request to delete a vehicle, the FleetController informs the VehicleRepository about the request for deletion.</w:t>
+      </w:r>
+    </w:p>
+    <w:p>
+      <w:r>
+        <w:t>The repository deletes the vehicle details and confirms the deletion has been done. The system finally informs the rental company that the vehicle has been deleted from the fleet. This ensures that vehicles not available for rental are not shown to the customers anymore.</w:t>
+      </w:r>
+    </w:p>
+    <w:p>
+      <w:pPr>
+        <w:rPr>
+          <w:b/>
+          <w:bCs/>
+        </w:rPr>
+      </w:pPr>
+      <w:r>
+        <w:rPr>
+          <w:b/>
+          <w:bCs/>
+        </w:rPr>
+        <w:t>Vehicle Availability Management</w:t>
+      </w:r>
+    </w:p>
+    <w:p>
+      <w:r>
+        <w:t>The diagram also demonstrates how rent-a-car companies handle vehicle availability. When the status of a vehicle changes: due to maintenance or returning after the end of a rental period, for example, the rent-a-car company needs to update the vehicle's status in the FleetManagementUI. The system will process the request through the FleetController and ask the VehicleRepository to change the corresponding record in the database. After the update is completed but not before, the system sends confirmation to the rent-a-car company.</w:t>
+      </w:r>
+    </w:p>
+    <w:p>
+      <w:pPr>
+        <w:rPr>
+          <w:b/>
+          <w:bCs/>
+        </w:rPr>
+      </w:pPr>
+      <w:r>
+        <w:rPr>
+          <w:b/>
+          <w:bCs/>
+        </w:rPr>
+        <w:t>Data Validation</w:t>
+      </w:r>
+    </w:p>
+    <w:p>
+      <w:r>
+        <w:t>Prior to the implementation of any fleet management activity, the ValidationService conducts validation of the given vehicle information. There exist various validation procedures including checking for required fields, checking vehicle identification and pricing information, as well as verification of other business rules specified by the system.</w:t>
+      </w:r>
+    </w:p>
+    <w:p>
+      <w:r>
+        <w:t>In case of failure of the validation process the system will notify the rental agency about the validation errors encountered.</w:t>
+      </w:r>
+    </w:p>
+    <w:p>
+      <w:pPr>
+        <w:rPr>
+          <w:b/>
+          <w:bCs/>
+        </w:rPr>
+      </w:pPr>
+      <w:r>
+        <w:rPr>
+          <w:b/>
+          <w:bCs/>
+        </w:rPr>
+        <w:t>Alternative and Exceptional Flows</w:t>
+      </w:r>
+    </w:p>
+    <w:p>
+      <w:r>
+        <w:t>The Fleet Management Sequence Diagram includes several alternative execution paths to ensure reliable system behavior:</w:t>
+      </w:r>
+    </w:p>
+    <w:p>
+      <w:pPr>
+        <w:numPr>
+          <w:ilvl w:val="0"/>
+          <w:numId w:val="82"/>
+        </w:numPr>
+        <w:spacing w:after="0" w:line="276" w:lineRule="auto"/>
+      </w:pPr>
+      <w:r>
+        <w:t>Invalid or incomplete vehicle information.</w:t>
+      </w:r>
+    </w:p>
+    <w:p>
+      <w:pPr>
+        <w:numPr>
+          <w:ilvl w:val="0"/>
+          <w:numId w:val="82"/>
+        </w:numPr>
+        <w:spacing w:after="0" w:line="276" w:lineRule="auto"/>
+      </w:pPr>
+      <w:r>
+        <w:t>Successful vehicle registration.</w:t>
+      </w:r>
+    </w:p>
+    <w:p>
+      <w:pPr>
+        <w:numPr>
+          <w:ilvl w:val="0"/>
+          <w:numId w:val="82"/>
+        </w:numPr>
+        <w:spacing w:after="0" w:line="276" w:lineRule="auto"/>
+      </w:pPr>
+      <w:r>
+        <w:t>Successful vehicle information update.</w:t>
+      </w:r>
+    </w:p>
+    <w:p>
+      <w:pPr>
+        <w:numPr>
+          <w:ilvl w:val="0"/>
+          <w:numId w:val="82"/>
+        </w:numPr>
+        <w:spacing w:after="0" w:line="276" w:lineRule="auto"/>
+      </w:pPr>
+      <w:r>
+        <w:t>Successful vehicle deletion.</w:t>
+      </w:r>
+    </w:p>
+    <w:p>
+      <w:pPr>
+        <w:numPr>
+          <w:ilvl w:val="0"/>
+          <w:numId w:val="82"/>
+        </w:numPr>
+        <w:spacing w:line="276" w:lineRule="auto"/>
+      </w:pPr>
+      <w:r>
+        <w:t>Successful vehicle availability update.</w:t>
+      </w:r>
+    </w:p>
+    <w:p>
+      <w:r>
+        <w:t>These alternative flows guarantee that only valid vehicle information is stored while maintaining consistency within the fleet database.</w:t>
+      </w:r>
+    </w:p>
+    <w:p>
+      <w:pPr>
+        <w:spacing w:line="278" w:lineRule="auto"/>
+        <w:rPr>
+          <w:b/>
+          <w:bCs/>
+        </w:rPr>
+      </w:pPr>
+      <w:r>
+        <w:rPr>
+          <w:b/>
+          <w:bCs/>
+        </w:rPr>
+        <w:br w:type="page"/>
+      </w:r>
+    </w:p>
+    <w:p>
+      <w:pPr>
+        <w:spacing w:line="278" w:lineRule="auto"/>
+        <w:rPr>
+          <w:b/>
+          <w:bCs/>
+        </w:rPr>
+      </w:pPr>
+      <w:r>
+        <w:rPr>
+          <w:b/>
+          <w:bCs/>
+        </w:rPr>
+        <w:lastRenderedPageBreak/>
+        <w:t>Conclusion</w:t>
+      </w:r>
+    </w:p>
+    <w:p>
+      <w:pPr>
+        <w:spacing w:line="278" w:lineRule="auto"/>
+      </w:pPr>
+      <w:r>
+        <w:t>The Fleet Management Sequence Diagram offers a detailed view of the functions involved in the management of vehicles within the KriGo system. It shows the interaction of the presentation layer, business logic layer, validation services layer, and data persistence layer during the process of vehicle registration, vehicle information update, and vehicle information deletion and availability management. This diagram is a vital design artifact to understand how the fleet management subsystem works and how the system can keep track of the vehicles' data.</w:t>
+      </w:r>
+      <w:r>
+        <w:rPr>
+          <w:noProof/>
+        </w:rPr>
+        <w:drawing>
+          <wp:inline distT="0" distB="0" distL="0" distR="0" wp14:anchorId="3CB40F6C" wp14:editId="096BAA0B">
+            <wp:extent cx="5941695" cy="6706235"/>
+            <wp:effectExtent l="0" t="0" r="1905" b="0"/>
+            <wp:docPr id="2106996735" name="Picture 5"/>
+            <wp:cNvGraphicFramePr>
+              <a:graphicFrameLocks xmlns:a="http://schemas.openxmlformats.org/drawingml/2006/main" noChangeAspect="1"/>
+            </wp:cNvGraphicFramePr>
+            <a:graphic xmlns:a="http://schemas.openxmlformats.org/drawingml/2006/main">
+              <a:graphicData uri="http://schemas.openxmlformats.org/drawingml/2006/picture">
+                <pic:pic xmlns:pic="http://schemas.openxmlformats.org/drawingml/2006/picture">
+                  <pic:nvPicPr>
+                    <pic:cNvPr id="0" name="Picture 5"/>
+                    <pic:cNvPicPr>
+                      <a:picLocks noChangeAspect="1" noChangeArrowheads="1"/>
+                    </pic:cNvPicPr>
+                  </pic:nvPicPr>
+                  <pic:blipFill>
+                    <a:blip r:embed="rId12">
+                      <a:extLst>
+                        <a:ext uri="{28A0092B-C50C-407E-A947-70E740481C1C}">
+                          <a14:useLocalDpi xmlns:a14="http://schemas.microsoft.com/office/drawing/2010/main" val="0"/>
+                        </a:ext>
+                      </a:extLst>
+                    </a:blip>
+                    <a:srcRect/>
+                    <a:stretch>
+                      <a:fillRect/>
+                    </a:stretch>
+                  </pic:blipFill>
+                  <pic:spPr bwMode="auto">
+                    <a:xfrm>
+                      <a:off x="0" y="0"/>
+                      <a:ext cx="5941695" cy="6706235"/>
+                    </a:xfrm>
+                    <a:prstGeom prst="rect">
+                      <a:avLst/>
+                    </a:prstGeom>
+                    <a:noFill/>
+                    <a:ln>
+                      <a:noFill/>
+                    </a:ln>
+                  </pic:spPr>
+                </pic:pic>
+              </a:graphicData>
+            </a:graphic>
           </wp:inline>
         </w:drawing>
       </w:r>
@@ -2657,10 +3321,6 @@
     <w:p>
       <w:pPr>
         <w:pStyle w:val="Caption"/>
-        <w:rPr>
-          <w:b/>
-          <w:bCs/>
-        </w:rPr>
       </w:pPr>
       <w:r>
         <w:t xml:space="preserve">Figure </w:t>
@@ -2678,7 +3338,7 @@
         <w:rPr>
           <w:noProof/>
         </w:rPr>
-        <w:t>4</w:t>
+        <w:t>5</w:t>
       </w:r>
       <w:r>
         <w:fldChar w:fldCharType="end"/>
@@ -2687,37 +3347,18 @@
         <w:t xml:space="preserve"> - </w:t>
       </w:r>
       <w:r>
-        <w:t>Payment Processing Sequence Diagram</w:t>
-      </w:r>
-    </w:p>
-    <w:p>
-      <w:pPr>
-        <w:rPr>
-          <w:b/>
-          <w:bCs/>
-        </w:rPr>
-      </w:pPr>
-    </w:p>
-    <w:p>
-      <w:pPr>
-        <w:rPr>
-          <w:b/>
-          <w:bCs/>
-        </w:rPr>
-      </w:pPr>
-      <w:r>
-        <w:rPr>
-          <w:b/>
-          <w:bCs/>
-        </w:rPr>
-        <w:t>Conclusion</w:t>
-      </w:r>
-    </w:p>
-    <w:p>
-      <w:r>
-        <w:t>The Payment Processing Sequence Diagram details the payment workflow in the KriGo platform in a comprehensive manner. It illustrates the interplay of presentation layer, business logic, data repositories and external payment services and emphasizes on payment validation, transaction authorization, reservation updates and exception handling. This diagram is an important design artifact for understanding the payment sub-system and for validating the functional requirements related to secure online transactions.</w:t>
-      </w:r>
-    </w:p>
+        <w:t>Fleet Management Sequence Diagram</w:t>
+      </w:r>
+    </w:p>
+    <w:p>
+      <w:pPr>
+        <w:spacing w:line="278" w:lineRule="auto"/>
+      </w:pPr>
+      <w:r>
+        <w:br w:type="page"/>
+      </w:r>
+    </w:p>
+    <w:p/>
     <w:sectPr>
       <w:pgSz w:w="11906" w:h="16838" w:code="9"/>
       <w:pgMar w:top="1411" w:right="850" w:bottom="1411" w:left="1699" w:header="720" w:footer="720" w:gutter="0"/>
@@ -2781,6 +3422,155 @@
 <file path=word/numbering.xml><?xml version="1.0" encoding="utf-8"?>
 <w:numbering xmlns:wpc="http://schemas.microsoft.com/office/word/2010/wordprocessingCanvas" xmlns:cx="http://schemas.microsoft.com/office/drawing/2014/chartex" xmlns:cx1="http://schemas.microsoft.com/office/drawing/2015/9/8/chartex" xmlns:cx2="http://schemas.microsoft.com/office/drawing/2015/10/21/chartex" xmlns:cx3="http://schemas.microsoft.com/office/drawing/2016/5/9/chartex" xmlns:cx4="http://schemas.microsoft.com/office/drawing/2016/5/10/chartex" xmlns:cx5="http://schemas.microsoft.com/office/drawing/2016/5/11/chartex" xmlns:cx6="http://schemas.microsoft.com/office/drawing/2016/5/12/chartex" xmlns:cx7="http://schemas.microsoft.com/office/drawing/2016/5/13/chartex" xmlns:cx8="http://schemas.microsoft.com/office/drawing/2016/5/14/chartex" xmlns:mc="http://schemas.openxmlformats.org/markup-compatibility/2006" xmlns:aink="http://schemas.microsoft.com/office/drawing/2016/ink" xmlns:am3d="http://schemas.microsoft.com/office/drawing/2017/model3d" xmlns:o="urn:schemas-microsoft-com:office:office" xmlns:oel="http://schemas.microsoft.com/office/2019/extlst" xmlns:r="http://schemas.openxmlformats.org/officeDocument/2006/relationships" xmlns:m="http://schemas.openxmlformats.org/officeDocument/2006/math" xmlns:v="urn:schemas-microsoft-com:vml" xmlns:wp14="http://schemas.microsoft.com/office/word/2010/wordprocessingDrawing" xmlns:wp="http://schemas.openxmlformats.org/drawingml/2006/wordprocessingDrawing" xmlns:w10="urn:schemas-microsoft-com:office:word" xmlns:w="http://schemas.openxmlformats.org/wordprocessingml/2006/main" xmlns:w14="http://schemas.microsoft.com/office/word/2010/wordml" xmlns:w15="http://schemas.microsoft.com/office/word/2012/wordml" xmlns:w16cex="http://schemas.microsoft.com/office/word/2018/wordml/cex" xmlns:w16cid="http://schemas.microsoft.com/office/word/2016/wordml/cid" xmlns:w16="http://schemas.microsoft.com/office/word/2018/wordml" xmlns:w16du="http://schemas.microsoft.com/office/word/2023/wordml/word16du" xmlns:w16sdtdh="http://schemas.microsoft.com/office/word/2020/wordml/sdtdatahash" xmlns:w16sdtfl="http://schemas.microsoft.com/office/word/2024/wordml/sdtformatlock" xmlns:w16se="http://schemas.microsoft.com/office/word/2015/wordml/symex" xmlns:wpg="http://schemas.microsoft.com/office/word/2010/wordprocessingGroup" xmlns:wpi="http://schemas.microsoft.com/office/word/2010/wordprocessingInk" xmlns:wne="http://schemas.microsoft.com/office/word/2006/wordml" xmlns:wps="http://schemas.microsoft.com/office/word/2010/wordprocessingShape" mc:Ignorable="w14 w15 w16se w16cid w16 w16cex w16sdtdh w16sdtfl w16du wp14">
   <w:abstractNum w:abstractNumId="0" w15:restartNumberingAfterBreak="0">
+    <w:nsid w:val="00D760C3"/>
+    <w:multiLevelType w:val="multilevel"/>
+    <w:tmpl w:val="E222BFCE"/>
+    <w:lvl w:ilvl="0">
+      <w:start w:val="1"/>
+      <w:numFmt w:val="bullet"/>
+      <w:lvlText w:val=""/>
+      <w:lvlJc w:val="left"/>
+      <w:pPr>
+        <w:tabs>
+          <w:tab w:val="num" w:pos="720"/>
+        </w:tabs>
+        <w:ind w:left="720" w:hanging="360"/>
+      </w:pPr>
+      <w:rPr>
+        <w:rFonts w:ascii="Symbol" w:hAnsi="Symbol" w:hint="default"/>
+        <w:sz w:val="20"/>
+      </w:rPr>
+    </w:lvl>
+    <w:lvl w:ilvl="1" w:tentative="1">
+      <w:start w:val="1"/>
+      <w:numFmt w:val="bullet"/>
+      <w:lvlText w:val="o"/>
+      <w:lvlJc w:val="left"/>
+      <w:pPr>
+        <w:tabs>
+          <w:tab w:val="num" w:pos="1440"/>
+        </w:tabs>
+        <w:ind w:left="1440" w:hanging="360"/>
+      </w:pPr>
+      <w:rPr>
+        <w:rFonts w:ascii="Courier New" w:hAnsi="Courier New" w:hint="default"/>
+        <w:sz w:val="20"/>
+      </w:rPr>
+    </w:lvl>
+    <w:lvl w:ilvl="2" w:tentative="1">
+      <w:start w:val="1"/>
+      <w:numFmt w:val="bullet"/>
+      <w:lvlText w:val=""/>
+      <w:lvlJc w:val="left"/>
+      <w:pPr>
+        <w:tabs>
+          <w:tab w:val="num" w:pos="2160"/>
+        </w:tabs>
+        <w:ind w:left="2160" w:hanging="360"/>
+      </w:pPr>
+      <w:rPr>
+        <w:rFonts w:ascii="Wingdings" w:hAnsi="Wingdings" w:hint="default"/>
+        <w:sz w:val="20"/>
+      </w:rPr>
+    </w:lvl>
+    <w:lvl w:ilvl="3" w:tentative="1">
+      <w:start w:val="1"/>
+      <w:numFmt w:val="bullet"/>
+      <w:lvlText w:val=""/>
+      <w:lvlJc w:val="left"/>
+      <w:pPr>
+        <w:tabs>
+          <w:tab w:val="num" w:pos="2880"/>
+        </w:tabs>
+        <w:ind w:left="2880" w:hanging="360"/>
+      </w:pPr>
+      <w:rPr>
+        <w:rFonts w:ascii="Wingdings" w:hAnsi="Wingdings" w:hint="default"/>
+        <w:sz w:val="20"/>
+      </w:rPr>
+    </w:lvl>
+    <w:lvl w:ilvl="4" w:tentative="1">
+      <w:start w:val="1"/>
+      <w:numFmt w:val="bullet"/>
+      <w:lvlText w:val=""/>
+      <w:lvlJc w:val="left"/>
+      <w:pPr>
+        <w:tabs>
+          <w:tab w:val="num" w:pos="3600"/>
+        </w:tabs>
+        <w:ind w:left="3600" w:hanging="360"/>
+      </w:pPr>
+      <w:rPr>
+        <w:rFonts w:ascii="Wingdings" w:hAnsi="Wingdings" w:hint="default"/>
+        <w:sz w:val="20"/>
+      </w:rPr>
+    </w:lvl>
+    <w:lvl w:ilvl="5" w:tentative="1">
+      <w:start w:val="1"/>
+      <w:numFmt w:val="bullet"/>
+      <w:lvlText w:val=""/>
+      <w:lvlJc w:val="left"/>
+      <w:pPr>
+        <w:tabs>
+          <w:tab w:val="num" w:pos="4320"/>
+        </w:tabs>
+        <w:ind w:left="4320" w:hanging="360"/>
+      </w:pPr>
+      <w:rPr>
+        <w:rFonts w:ascii="Wingdings" w:hAnsi="Wingdings" w:hint="default"/>
+        <w:sz w:val="20"/>
+      </w:rPr>
+    </w:lvl>
+    <w:lvl w:ilvl="6" w:tentative="1">
+      <w:start w:val="1"/>
+      <w:numFmt w:val="bullet"/>
+      <w:lvlText w:val=""/>
+      <w:lvlJc w:val="left"/>
+      <w:pPr>
+        <w:tabs>
+          <w:tab w:val="num" w:pos="5040"/>
+        </w:tabs>
+        <w:ind w:left="5040" w:hanging="360"/>
+      </w:pPr>
+      <w:rPr>
+        <w:rFonts w:ascii="Wingdings" w:hAnsi="Wingdings" w:hint="default"/>
+        <w:sz w:val="20"/>
+      </w:rPr>
+    </w:lvl>
+    <w:lvl w:ilvl="7" w:tentative="1">
+      <w:start w:val="1"/>
+      <w:numFmt w:val="bullet"/>
+      <w:lvlText w:val=""/>
+      <w:lvlJc w:val="left"/>
+      <w:pPr>
+        <w:tabs>
+          <w:tab w:val="num" w:pos="5760"/>
+        </w:tabs>
+        <w:ind w:left="5760" w:hanging="360"/>
+      </w:pPr>
+      <w:rPr>
+        <w:rFonts w:ascii="Wingdings" w:hAnsi="Wingdings" w:hint="default"/>
+        <w:sz w:val="20"/>
+      </w:rPr>
+    </w:lvl>
+    <w:lvl w:ilvl="8" w:tentative="1">
+      <w:start w:val="1"/>
+      <w:numFmt w:val="bullet"/>
+      <w:lvlText w:val=""/>
+      <w:lvlJc w:val="left"/>
+      <w:pPr>
+        <w:tabs>
+          <w:tab w:val="num" w:pos="6480"/>
+        </w:tabs>
+        <w:ind w:left="6480" w:hanging="360"/>
+      </w:pPr>
+      <w:rPr>
+        <w:rFonts w:ascii="Wingdings" w:hAnsi="Wingdings" w:hint="default"/>
+        <w:sz w:val="20"/>
+      </w:rPr>
+    </w:lvl>
+  </w:abstractNum>
+  <w:abstractNum w:abstractNumId="1" w15:restartNumberingAfterBreak="0">
     <w:nsid w:val="020222C2"/>
     <w:multiLevelType w:val="hybridMultilevel"/>
     <w:tmpl w:val="26FC1C02"/>
@@ -2893,7 +3683,7 @@
       </w:rPr>
     </w:lvl>
   </w:abstractNum>
-  <w:abstractNum w:abstractNumId="1" w15:restartNumberingAfterBreak="0">
+  <w:abstractNum w:abstractNumId="2" w15:restartNumberingAfterBreak="0">
     <w:nsid w:val="027A2D57"/>
     <w:multiLevelType w:val="hybridMultilevel"/>
     <w:tmpl w:val="3148FF7E"/>
@@ -3006,7 +3796,7 @@
       </w:rPr>
     </w:lvl>
   </w:abstractNum>
-  <w:abstractNum w:abstractNumId="2" w15:restartNumberingAfterBreak="0">
+  <w:abstractNum w:abstractNumId="3" w15:restartNumberingAfterBreak="0">
     <w:nsid w:val="038C4B22"/>
     <w:multiLevelType w:val="hybridMultilevel"/>
     <w:tmpl w:val="390E2614"/>
@@ -3119,7 +3909,7 @@
       </w:rPr>
     </w:lvl>
   </w:abstractNum>
-  <w:abstractNum w:abstractNumId="3" w15:restartNumberingAfterBreak="0">
+  <w:abstractNum w:abstractNumId="4" w15:restartNumberingAfterBreak="0">
     <w:nsid w:val="04351CD0"/>
     <w:multiLevelType w:val="hybridMultilevel"/>
     <w:tmpl w:val="4748F3C4"/>
@@ -3232,7 +4022,7 @@
       </w:rPr>
     </w:lvl>
   </w:abstractNum>
-  <w:abstractNum w:abstractNumId="4" w15:restartNumberingAfterBreak="0">
+  <w:abstractNum w:abstractNumId="5" w15:restartNumberingAfterBreak="0">
     <w:nsid w:val="0444578B"/>
     <w:multiLevelType w:val="multilevel"/>
     <w:tmpl w:val="6B840BA4"/>
@@ -3381,7 +4171,7 @@
       </w:rPr>
     </w:lvl>
   </w:abstractNum>
-  <w:abstractNum w:abstractNumId="5" w15:restartNumberingAfterBreak="0">
+  <w:abstractNum w:abstractNumId="6" w15:restartNumberingAfterBreak="0">
     <w:nsid w:val="08D32D08"/>
     <w:multiLevelType w:val="multilevel"/>
     <w:tmpl w:val="A32449CA"/>
@@ -3530,7 +4320,7 @@
       </w:rPr>
     </w:lvl>
   </w:abstractNum>
-  <w:abstractNum w:abstractNumId="6" w15:restartNumberingAfterBreak="0">
+  <w:abstractNum w:abstractNumId="7" w15:restartNumberingAfterBreak="0">
     <w:nsid w:val="0CC17936"/>
     <w:multiLevelType w:val="multilevel"/>
     <w:tmpl w:val="B5E0C4F8"/>
@@ -3679,7 +4469,7 @@
       </w:rPr>
     </w:lvl>
   </w:abstractNum>
-  <w:abstractNum w:abstractNumId="7" w15:restartNumberingAfterBreak="0">
+  <w:abstractNum w:abstractNumId="8" w15:restartNumberingAfterBreak="0">
     <w:nsid w:val="0E2561E7"/>
     <w:multiLevelType w:val="hybridMultilevel"/>
     <w:tmpl w:val="2A6E4870"/>
@@ -3792,7 +4582,7 @@
       </w:rPr>
     </w:lvl>
   </w:abstractNum>
-  <w:abstractNum w:abstractNumId="8" w15:restartNumberingAfterBreak="0">
+  <w:abstractNum w:abstractNumId="9" w15:restartNumberingAfterBreak="0">
     <w:nsid w:val="0E841C27"/>
     <w:multiLevelType w:val="hybridMultilevel"/>
     <w:tmpl w:val="789C7F32"/>
@@ -3905,7 +4695,7 @@
       </w:rPr>
     </w:lvl>
   </w:abstractNum>
-  <w:abstractNum w:abstractNumId="9" w15:restartNumberingAfterBreak="0">
+  <w:abstractNum w:abstractNumId="10" w15:restartNumberingAfterBreak="0">
     <w:nsid w:val="0FAA2602"/>
     <w:multiLevelType w:val="hybridMultilevel"/>
     <w:tmpl w:val="C6C63128"/>
@@ -4018,7 +4808,7 @@
       </w:rPr>
     </w:lvl>
   </w:abstractNum>
-  <w:abstractNum w:abstractNumId="10" w15:restartNumberingAfterBreak="0">
+  <w:abstractNum w:abstractNumId="11" w15:restartNumberingAfterBreak="0">
     <w:nsid w:val="122550ED"/>
     <w:multiLevelType w:val="hybridMultilevel"/>
     <w:tmpl w:val="91ACE480"/>
@@ -4131,7 +4921,7 @@
       </w:rPr>
     </w:lvl>
   </w:abstractNum>
-  <w:abstractNum w:abstractNumId="11" w15:restartNumberingAfterBreak="0">
+  <w:abstractNum w:abstractNumId="12" w15:restartNumberingAfterBreak="0">
     <w:nsid w:val="124C1BAE"/>
     <w:multiLevelType w:val="hybridMultilevel"/>
     <w:tmpl w:val="04988FC0"/>
@@ -4244,7 +5034,7 @@
       </w:rPr>
     </w:lvl>
   </w:abstractNum>
-  <w:abstractNum w:abstractNumId="12" w15:restartNumberingAfterBreak="0">
+  <w:abstractNum w:abstractNumId="13" w15:restartNumberingAfterBreak="0">
     <w:nsid w:val="139F7557"/>
     <w:multiLevelType w:val="multilevel"/>
     <w:tmpl w:val="A984C1D4"/>
@@ -4393,7 +5183,7 @@
       </w:rPr>
     </w:lvl>
   </w:abstractNum>
-  <w:abstractNum w:abstractNumId="13" w15:restartNumberingAfterBreak="0">
+  <w:abstractNum w:abstractNumId="14" w15:restartNumberingAfterBreak="0">
     <w:nsid w:val="16D400B4"/>
     <w:multiLevelType w:val="hybridMultilevel"/>
     <w:tmpl w:val="58E6DFBE"/>
@@ -4506,7 +5296,7 @@
       </w:rPr>
     </w:lvl>
   </w:abstractNum>
-  <w:abstractNum w:abstractNumId="14" w15:restartNumberingAfterBreak="0">
+  <w:abstractNum w:abstractNumId="15" w15:restartNumberingAfterBreak="0">
     <w:nsid w:val="17236012"/>
     <w:multiLevelType w:val="hybridMultilevel"/>
     <w:tmpl w:val="DAFA46C8"/>
@@ -4619,7 +5409,7 @@
       </w:rPr>
     </w:lvl>
   </w:abstractNum>
-  <w:abstractNum w:abstractNumId="15" w15:restartNumberingAfterBreak="0">
+  <w:abstractNum w:abstractNumId="16" w15:restartNumberingAfterBreak="0">
     <w:nsid w:val="172B04C0"/>
     <w:multiLevelType w:val="hybridMultilevel"/>
     <w:tmpl w:val="B6C41D5E"/>
@@ -4732,7 +5522,7 @@
       </w:rPr>
     </w:lvl>
   </w:abstractNum>
-  <w:abstractNum w:abstractNumId="16" w15:restartNumberingAfterBreak="0">
+  <w:abstractNum w:abstractNumId="17" w15:restartNumberingAfterBreak="0">
     <w:nsid w:val="17763D31"/>
     <w:multiLevelType w:val="hybridMultilevel"/>
     <w:tmpl w:val="6CE63304"/>
@@ -4845,7 +5635,7 @@
       </w:rPr>
     </w:lvl>
   </w:abstractNum>
-  <w:abstractNum w:abstractNumId="17" w15:restartNumberingAfterBreak="0">
+  <w:abstractNum w:abstractNumId="18" w15:restartNumberingAfterBreak="0">
     <w:nsid w:val="17B06937"/>
     <w:multiLevelType w:val="hybridMultilevel"/>
     <w:tmpl w:val="71089CF2"/>
@@ -4958,7 +5748,7 @@
       </w:rPr>
     </w:lvl>
   </w:abstractNum>
-  <w:abstractNum w:abstractNumId="18" w15:restartNumberingAfterBreak="0">
+  <w:abstractNum w:abstractNumId="19" w15:restartNumberingAfterBreak="0">
     <w:nsid w:val="195875B0"/>
     <w:multiLevelType w:val="multilevel"/>
     <w:tmpl w:val="615444D4"/>
@@ -5071,7 +5861,7 @@
       </w:pPr>
     </w:lvl>
   </w:abstractNum>
-  <w:abstractNum w:abstractNumId="19" w15:restartNumberingAfterBreak="0">
+  <w:abstractNum w:abstractNumId="20" w15:restartNumberingAfterBreak="0">
     <w:nsid w:val="197C6FD7"/>
     <w:multiLevelType w:val="hybridMultilevel"/>
     <w:tmpl w:val="D97CEAA8"/>
@@ -5184,7 +5974,7 @@
       </w:rPr>
     </w:lvl>
   </w:abstractNum>
-  <w:abstractNum w:abstractNumId="20" w15:restartNumberingAfterBreak="0">
+  <w:abstractNum w:abstractNumId="21" w15:restartNumberingAfterBreak="0">
     <w:nsid w:val="1CC60A94"/>
     <w:multiLevelType w:val="multilevel"/>
     <w:tmpl w:val="EB74741C"/>
@@ -5333,7 +6123,7 @@
       </w:rPr>
     </w:lvl>
   </w:abstractNum>
-  <w:abstractNum w:abstractNumId="21" w15:restartNumberingAfterBreak="0">
+  <w:abstractNum w:abstractNumId="22" w15:restartNumberingAfterBreak="0">
     <w:nsid w:val="1E6658CF"/>
     <w:multiLevelType w:val="multilevel"/>
     <w:tmpl w:val="762ABC5E"/>
@@ -5482,7 +6272,7 @@
       </w:rPr>
     </w:lvl>
   </w:abstractNum>
-  <w:abstractNum w:abstractNumId="22" w15:restartNumberingAfterBreak="0">
+  <w:abstractNum w:abstractNumId="23" w15:restartNumberingAfterBreak="0">
     <w:nsid w:val="215C77FD"/>
     <w:multiLevelType w:val="hybridMultilevel"/>
     <w:tmpl w:val="58F41D10"/>
@@ -5571,7 +6361,7 @@
       </w:pPr>
     </w:lvl>
   </w:abstractNum>
-  <w:abstractNum w:abstractNumId="23" w15:restartNumberingAfterBreak="0">
+  <w:abstractNum w:abstractNumId="24" w15:restartNumberingAfterBreak="0">
     <w:nsid w:val="218D5909"/>
     <w:multiLevelType w:val="hybridMultilevel"/>
     <w:tmpl w:val="CC989EE4"/>
@@ -5684,7 +6474,7 @@
       </w:rPr>
     </w:lvl>
   </w:abstractNum>
-  <w:abstractNum w:abstractNumId="24" w15:restartNumberingAfterBreak="0">
+  <w:abstractNum w:abstractNumId="25" w15:restartNumberingAfterBreak="0">
     <w:nsid w:val="2470127A"/>
     <w:multiLevelType w:val="multilevel"/>
     <w:tmpl w:val="309E9618"/>
@@ -5833,7 +6623,7 @@
       </w:rPr>
     </w:lvl>
   </w:abstractNum>
-  <w:abstractNum w:abstractNumId="25" w15:restartNumberingAfterBreak="0">
+  <w:abstractNum w:abstractNumId="26" w15:restartNumberingAfterBreak="0">
     <w:nsid w:val="24796798"/>
     <w:multiLevelType w:val="hybridMultilevel"/>
     <w:tmpl w:val="6622BEDC"/>
@@ -5922,7 +6712,156 @@
       </w:pPr>
     </w:lvl>
   </w:abstractNum>
-  <w:abstractNum w:abstractNumId="26" w15:restartNumberingAfterBreak="0">
+  <w:abstractNum w:abstractNumId="27" w15:restartNumberingAfterBreak="0">
+    <w:nsid w:val="2E4D738C"/>
+    <w:multiLevelType w:val="multilevel"/>
+    <w:tmpl w:val="1540BBA2"/>
+    <w:lvl w:ilvl="0">
+      <w:start w:val="1"/>
+      <w:numFmt w:val="bullet"/>
+      <w:lvlText w:val=""/>
+      <w:lvlJc w:val="left"/>
+      <w:pPr>
+        <w:tabs>
+          <w:tab w:val="num" w:pos="720"/>
+        </w:tabs>
+        <w:ind w:left="720" w:hanging="360"/>
+      </w:pPr>
+      <w:rPr>
+        <w:rFonts w:ascii="Symbol" w:hAnsi="Symbol" w:hint="default"/>
+        <w:sz w:val="20"/>
+      </w:rPr>
+    </w:lvl>
+    <w:lvl w:ilvl="1" w:tentative="1">
+      <w:start w:val="1"/>
+      <w:numFmt w:val="bullet"/>
+      <w:lvlText w:val="o"/>
+      <w:lvlJc w:val="left"/>
+      <w:pPr>
+        <w:tabs>
+          <w:tab w:val="num" w:pos="1440"/>
+        </w:tabs>
+        <w:ind w:left="1440" w:hanging="360"/>
+      </w:pPr>
+      <w:rPr>
+        <w:rFonts w:ascii="Courier New" w:hAnsi="Courier New" w:hint="default"/>
+        <w:sz w:val="20"/>
+      </w:rPr>
+    </w:lvl>
+    <w:lvl w:ilvl="2" w:tentative="1">
+      <w:start w:val="1"/>
+      <w:numFmt w:val="bullet"/>
+      <w:lvlText w:val=""/>
+      <w:lvlJc w:val="left"/>
+      <w:pPr>
+        <w:tabs>
+          <w:tab w:val="num" w:pos="2160"/>
+        </w:tabs>
+        <w:ind w:left="2160" w:hanging="360"/>
+      </w:pPr>
+      <w:rPr>
+        <w:rFonts w:ascii="Wingdings" w:hAnsi="Wingdings" w:hint="default"/>
+        <w:sz w:val="20"/>
+      </w:rPr>
+    </w:lvl>
+    <w:lvl w:ilvl="3" w:tentative="1">
+      <w:start w:val="1"/>
+      <w:numFmt w:val="bullet"/>
+      <w:lvlText w:val=""/>
+      <w:lvlJc w:val="left"/>
+      <w:pPr>
+        <w:tabs>
+          <w:tab w:val="num" w:pos="2880"/>
+        </w:tabs>
+        <w:ind w:left="2880" w:hanging="360"/>
+      </w:pPr>
+      <w:rPr>
+        <w:rFonts w:ascii="Wingdings" w:hAnsi="Wingdings" w:hint="default"/>
+        <w:sz w:val="20"/>
+      </w:rPr>
+    </w:lvl>
+    <w:lvl w:ilvl="4" w:tentative="1">
+      <w:start w:val="1"/>
+      <w:numFmt w:val="bullet"/>
+      <w:lvlText w:val=""/>
+      <w:lvlJc w:val="left"/>
+      <w:pPr>
+        <w:tabs>
+          <w:tab w:val="num" w:pos="3600"/>
+        </w:tabs>
+        <w:ind w:left="3600" w:hanging="360"/>
+      </w:pPr>
+      <w:rPr>
+        <w:rFonts w:ascii="Wingdings" w:hAnsi="Wingdings" w:hint="default"/>
+        <w:sz w:val="20"/>
+      </w:rPr>
+    </w:lvl>
+    <w:lvl w:ilvl="5" w:tentative="1">
+      <w:start w:val="1"/>
+      <w:numFmt w:val="bullet"/>
+      <w:lvlText w:val=""/>
+      <w:lvlJc w:val="left"/>
+      <w:pPr>
+        <w:tabs>
+          <w:tab w:val="num" w:pos="4320"/>
+        </w:tabs>
+        <w:ind w:left="4320" w:hanging="360"/>
+      </w:pPr>
+      <w:rPr>
+        <w:rFonts w:ascii="Wingdings" w:hAnsi="Wingdings" w:hint="default"/>
+        <w:sz w:val="20"/>
+      </w:rPr>
+    </w:lvl>
+    <w:lvl w:ilvl="6" w:tentative="1">
+      <w:start w:val="1"/>
+      <w:numFmt w:val="bullet"/>
+      <w:lvlText w:val=""/>
+      <w:lvlJc w:val="left"/>
+      <w:pPr>
+        <w:tabs>
+          <w:tab w:val="num" w:pos="5040"/>
+        </w:tabs>
+        <w:ind w:left="5040" w:hanging="360"/>
+      </w:pPr>
+      <w:rPr>
+        <w:rFonts w:ascii="Wingdings" w:hAnsi="Wingdings" w:hint="default"/>
+        <w:sz w:val="20"/>
+      </w:rPr>
+    </w:lvl>
+    <w:lvl w:ilvl="7" w:tentative="1">
+      <w:start w:val="1"/>
+      <w:numFmt w:val="bullet"/>
+      <w:lvlText w:val=""/>
+      <w:lvlJc w:val="left"/>
+      <w:pPr>
+        <w:tabs>
+          <w:tab w:val="num" w:pos="5760"/>
+        </w:tabs>
+        <w:ind w:left="5760" w:hanging="360"/>
+      </w:pPr>
+      <w:rPr>
+        <w:rFonts w:ascii="Wingdings" w:hAnsi="Wingdings" w:hint="default"/>
+        <w:sz w:val="20"/>
+      </w:rPr>
+    </w:lvl>
+    <w:lvl w:ilvl="8" w:tentative="1">
+      <w:start w:val="1"/>
+      <w:numFmt w:val="bullet"/>
+      <w:lvlText w:val=""/>
+      <w:lvlJc w:val="left"/>
+      <w:pPr>
+        <w:tabs>
+          <w:tab w:val="num" w:pos="6480"/>
+        </w:tabs>
+        <w:ind w:left="6480" w:hanging="360"/>
+      </w:pPr>
+      <w:rPr>
+        <w:rFonts w:ascii="Wingdings" w:hAnsi="Wingdings" w:hint="default"/>
+        <w:sz w:val="20"/>
+      </w:rPr>
+    </w:lvl>
+  </w:abstractNum>
+  <w:abstractNum w:abstractNumId="28" w15:restartNumberingAfterBreak="0">
     <w:nsid w:val="2F0041C7"/>
     <w:multiLevelType w:val="multilevel"/>
     <w:tmpl w:val="656414FE"/>
@@ -6071,7 +7010,7 @@
       </w:rPr>
     </w:lvl>
   </w:abstractNum>
-  <w:abstractNum w:abstractNumId="27" w15:restartNumberingAfterBreak="0">
+  <w:abstractNum w:abstractNumId="29" w15:restartNumberingAfterBreak="0">
     <w:nsid w:val="304F01FA"/>
     <w:multiLevelType w:val="multilevel"/>
     <w:tmpl w:val="151C4EC6"/>
@@ -6220,7 +7159,7 @@
       </w:rPr>
     </w:lvl>
   </w:abstractNum>
-  <w:abstractNum w:abstractNumId="28" w15:restartNumberingAfterBreak="0">
+  <w:abstractNum w:abstractNumId="30" w15:restartNumberingAfterBreak="0">
     <w:nsid w:val="30BD025D"/>
     <w:multiLevelType w:val="hybridMultilevel"/>
     <w:tmpl w:val="04381C82"/>
@@ -6309,7 +7248,7 @@
       </w:pPr>
     </w:lvl>
   </w:abstractNum>
-  <w:abstractNum w:abstractNumId="29" w15:restartNumberingAfterBreak="0">
+  <w:abstractNum w:abstractNumId="31" w15:restartNumberingAfterBreak="0">
     <w:nsid w:val="327C0BA6"/>
     <w:multiLevelType w:val="hybridMultilevel"/>
     <w:tmpl w:val="2A9047EE"/>
@@ -6422,7 +7361,7 @@
       </w:rPr>
     </w:lvl>
   </w:abstractNum>
-  <w:abstractNum w:abstractNumId="30" w15:restartNumberingAfterBreak="0">
+  <w:abstractNum w:abstractNumId="32" w15:restartNumberingAfterBreak="0">
     <w:nsid w:val="338D63E8"/>
     <w:multiLevelType w:val="hybridMultilevel"/>
     <w:tmpl w:val="28D0FB50"/>
@@ -6535,7 +7474,7 @@
       </w:rPr>
     </w:lvl>
   </w:abstractNum>
-  <w:abstractNum w:abstractNumId="31" w15:restartNumberingAfterBreak="0">
+  <w:abstractNum w:abstractNumId="33" w15:restartNumberingAfterBreak="0">
     <w:nsid w:val="35413E58"/>
     <w:multiLevelType w:val="hybridMultilevel"/>
     <w:tmpl w:val="03C64164"/>
@@ -6648,7 +7587,7 @@
       </w:rPr>
     </w:lvl>
   </w:abstractNum>
-  <w:abstractNum w:abstractNumId="32" w15:restartNumberingAfterBreak="0">
+  <w:abstractNum w:abstractNumId="34" w15:restartNumberingAfterBreak="0">
     <w:nsid w:val="3623194A"/>
     <w:multiLevelType w:val="multilevel"/>
     <w:tmpl w:val="63F4E6F0"/>
@@ -6797,7 +7736,7 @@
       </w:rPr>
     </w:lvl>
   </w:abstractNum>
-  <w:abstractNum w:abstractNumId="33" w15:restartNumberingAfterBreak="0">
+  <w:abstractNum w:abstractNumId="35" w15:restartNumberingAfterBreak="0">
     <w:nsid w:val="37B424C3"/>
     <w:multiLevelType w:val="hybridMultilevel"/>
     <w:tmpl w:val="18F030D4"/>
@@ -6910,7 +7849,7 @@
       </w:rPr>
     </w:lvl>
   </w:abstractNum>
-  <w:abstractNum w:abstractNumId="34" w15:restartNumberingAfterBreak="0">
+  <w:abstractNum w:abstractNumId="36" w15:restartNumberingAfterBreak="0">
     <w:nsid w:val="3BC10D30"/>
     <w:multiLevelType w:val="multilevel"/>
     <w:tmpl w:val="502AD78C"/>
@@ -7059,7 +7998,7 @@
       </w:rPr>
     </w:lvl>
   </w:abstractNum>
-  <w:abstractNum w:abstractNumId="35" w15:restartNumberingAfterBreak="0">
+  <w:abstractNum w:abstractNumId="37" w15:restartNumberingAfterBreak="0">
     <w:nsid w:val="3CBF280A"/>
     <w:multiLevelType w:val="multilevel"/>
     <w:tmpl w:val="A13E4362"/>
@@ -7208,7 +8147,7 @@
       </w:rPr>
     </w:lvl>
   </w:abstractNum>
-  <w:abstractNum w:abstractNumId="36" w15:restartNumberingAfterBreak="0">
+  <w:abstractNum w:abstractNumId="38" w15:restartNumberingAfterBreak="0">
     <w:nsid w:val="452F60FB"/>
     <w:multiLevelType w:val="hybridMultilevel"/>
     <w:tmpl w:val="892A990A"/>
@@ -7321,7 +8260,7 @@
       </w:rPr>
     </w:lvl>
   </w:abstractNum>
-  <w:abstractNum w:abstractNumId="37" w15:restartNumberingAfterBreak="0">
+  <w:abstractNum w:abstractNumId="39" w15:restartNumberingAfterBreak="0">
     <w:nsid w:val="47E5592F"/>
     <w:multiLevelType w:val="hybridMultilevel"/>
     <w:tmpl w:val="719AB9FA"/>
@@ -7434,7 +8373,7 @@
       </w:rPr>
     </w:lvl>
   </w:abstractNum>
-  <w:abstractNum w:abstractNumId="38" w15:restartNumberingAfterBreak="0">
+  <w:abstractNum w:abstractNumId="40" w15:restartNumberingAfterBreak="0">
     <w:nsid w:val="48C041A9"/>
     <w:multiLevelType w:val="multilevel"/>
     <w:tmpl w:val="59A694BC"/>
@@ -7583,7 +8522,7 @@
       </w:rPr>
     </w:lvl>
   </w:abstractNum>
-  <w:abstractNum w:abstractNumId="39" w15:restartNumberingAfterBreak="0">
+  <w:abstractNum w:abstractNumId="41" w15:restartNumberingAfterBreak="0">
     <w:nsid w:val="4AF73293"/>
     <w:multiLevelType w:val="hybridMultilevel"/>
     <w:tmpl w:val="F2962738"/>
@@ -7696,7 +8635,7 @@
       </w:rPr>
     </w:lvl>
   </w:abstractNum>
-  <w:abstractNum w:abstractNumId="40" w15:restartNumberingAfterBreak="0">
+  <w:abstractNum w:abstractNumId="42" w15:restartNumberingAfterBreak="0">
     <w:nsid w:val="4B375248"/>
     <w:multiLevelType w:val="multilevel"/>
     <w:tmpl w:val="B574C1C6"/>
@@ -7845,7 +8784,7 @@
       </w:rPr>
     </w:lvl>
   </w:abstractNum>
-  <w:abstractNum w:abstractNumId="41" w15:restartNumberingAfterBreak="0">
+  <w:abstractNum w:abstractNumId="43" w15:restartNumberingAfterBreak="0">
     <w:nsid w:val="4BA13766"/>
     <w:multiLevelType w:val="multilevel"/>
     <w:tmpl w:val="63F4E6F0"/>
@@ -7994,7 +8933,7 @@
       </w:rPr>
     </w:lvl>
   </w:abstractNum>
-  <w:abstractNum w:abstractNumId="42" w15:restartNumberingAfterBreak="0">
+  <w:abstractNum w:abstractNumId="44" w15:restartNumberingAfterBreak="0">
     <w:nsid w:val="4BA25441"/>
     <w:multiLevelType w:val="hybridMultilevel"/>
     <w:tmpl w:val="217E2E96"/>
@@ -8107,7 +9046,7 @@
       </w:rPr>
     </w:lvl>
   </w:abstractNum>
-  <w:abstractNum w:abstractNumId="43" w15:restartNumberingAfterBreak="0">
+  <w:abstractNum w:abstractNumId="45" w15:restartNumberingAfterBreak="0">
     <w:nsid w:val="4E276DCB"/>
     <w:multiLevelType w:val="hybridMultilevel"/>
     <w:tmpl w:val="B7C469B4"/>
@@ -8220,7 +9159,7 @@
       </w:rPr>
     </w:lvl>
   </w:abstractNum>
-  <w:abstractNum w:abstractNumId="44" w15:restartNumberingAfterBreak="0">
+  <w:abstractNum w:abstractNumId="46" w15:restartNumberingAfterBreak="0">
     <w:nsid w:val="4F053929"/>
     <w:multiLevelType w:val="hybridMultilevel"/>
     <w:tmpl w:val="2A78C678"/>
@@ -8333,7 +9272,7 @@
       </w:rPr>
     </w:lvl>
   </w:abstractNum>
-  <w:abstractNum w:abstractNumId="45" w15:restartNumberingAfterBreak="0">
+  <w:abstractNum w:abstractNumId="47" w15:restartNumberingAfterBreak="0">
     <w:nsid w:val="51737FE0"/>
     <w:multiLevelType w:val="hybridMultilevel"/>
     <w:tmpl w:val="2B0604E6"/>
@@ -8446,7 +9385,7 @@
       </w:rPr>
     </w:lvl>
   </w:abstractNum>
-  <w:abstractNum w:abstractNumId="46" w15:restartNumberingAfterBreak="0">
+  <w:abstractNum w:abstractNumId="48" w15:restartNumberingAfterBreak="0">
     <w:nsid w:val="51A86EF8"/>
     <w:multiLevelType w:val="multilevel"/>
     <w:tmpl w:val="FF2841D4"/>
@@ -8595,7 +9534,156 @@
       </w:rPr>
     </w:lvl>
   </w:abstractNum>
-  <w:abstractNum w:abstractNumId="47" w15:restartNumberingAfterBreak="0">
+  <w:abstractNum w:abstractNumId="49" w15:restartNumberingAfterBreak="0">
+    <w:nsid w:val="521F2792"/>
+    <w:multiLevelType w:val="multilevel"/>
+    <w:tmpl w:val="9FB45386"/>
+    <w:lvl w:ilvl="0">
+      <w:start w:val="1"/>
+      <w:numFmt w:val="bullet"/>
+      <w:lvlText w:val=""/>
+      <w:lvlJc w:val="left"/>
+      <w:pPr>
+        <w:tabs>
+          <w:tab w:val="num" w:pos="720"/>
+        </w:tabs>
+        <w:ind w:left="720" w:hanging="360"/>
+      </w:pPr>
+      <w:rPr>
+        <w:rFonts w:ascii="Wingdings" w:hAnsi="Wingdings" w:hint="default"/>
+        <w:sz w:val="20"/>
+      </w:rPr>
+    </w:lvl>
+    <w:lvl w:ilvl="1" w:tentative="1">
+      <w:start w:val="1"/>
+      <w:numFmt w:val="bullet"/>
+      <w:lvlText w:val="o"/>
+      <w:lvlJc w:val="left"/>
+      <w:pPr>
+        <w:tabs>
+          <w:tab w:val="num" w:pos="1440"/>
+        </w:tabs>
+        <w:ind w:left="1440" w:hanging="360"/>
+      </w:pPr>
+      <w:rPr>
+        <w:rFonts w:ascii="Courier New" w:hAnsi="Courier New" w:hint="default"/>
+        <w:sz w:val="20"/>
+      </w:rPr>
+    </w:lvl>
+    <w:lvl w:ilvl="2" w:tentative="1">
+      <w:start w:val="1"/>
+      <w:numFmt w:val="bullet"/>
+      <w:lvlText w:val=""/>
+      <w:lvlJc w:val="left"/>
+      <w:pPr>
+        <w:tabs>
+          <w:tab w:val="num" w:pos="2160"/>
+        </w:tabs>
+        <w:ind w:left="2160" w:hanging="360"/>
+      </w:pPr>
+      <w:rPr>
+        <w:rFonts w:ascii="Wingdings" w:hAnsi="Wingdings" w:hint="default"/>
+        <w:sz w:val="20"/>
+      </w:rPr>
+    </w:lvl>
+    <w:lvl w:ilvl="3" w:tentative="1">
+      <w:start w:val="1"/>
+      <w:numFmt w:val="bullet"/>
+      <w:lvlText w:val=""/>
+      <w:lvlJc w:val="left"/>
+      <w:pPr>
+        <w:tabs>
+          <w:tab w:val="num" w:pos="2880"/>
+        </w:tabs>
+        <w:ind w:left="2880" w:hanging="360"/>
+      </w:pPr>
+      <w:rPr>
+        <w:rFonts w:ascii="Wingdings" w:hAnsi="Wingdings" w:hint="default"/>
+        <w:sz w:val="20"/>
+      </w:rPr>
+    </w:lvl>
+    <w:lvl w:ilvl="4" w:tentative="1">
+      <w:start w:val="1"/>
+      <w:numFmt w:val="bullet"/>
+      <w:lvlText w:val=""/>
+      <w:lvlJc w:val="left"/>
+      <w:pPr>
+        <w:tabs>
+          <w:tab w:val="num" w:pos="3600"/>
+        </w:tabs>
+        <w:ind w:left="3600" w:hanging="360"/>
+      </w:pPr>
+      <w:rPr>
+        <w:rFonts w:ascii="Wingdings" w:hAnsi="Wingdings" w:hint="default"/>
+        <w:sz w:val="20"/>
+      </w:rPr>
+    </w:lvl>
+    <w:lvl w:ilvl="5" w:tentative="1">
+      <w:start w:val="1"/>
+      <w:numFmt w:val="bullet"/>
+      <w:lvlText w:val=""/>
+      <w:lvlJc w:val="left"/>
+      <w:pPr>
+        <w:tabs>
+          <w:tab w:val="num" w:pos="4320"/>
+        </w:tabs>
+        <w:ind w:left="4320" w:hanging="360"/>
+      </w:pPr>
+      <w:rPr>
+        <w:rFonts w:ascii="Wingdings" w:hAnsi="Wingdings" w:hint="default"/>
+        <w:sz w:val="20"/>
+      </w:rPr>
+    </w:lvl>
+    <w:lvl w:ilvl="6" w:tentative="1">
+      <w:start w:val="1"/>
+      <w:numFmt w:val="bullet"/>
+      <w:lvlText w:val=""/>
+      <w:lvlJc w:val="left"/>
+      <w:pPr>
+        <w:tabs>
+          <w:tab w:val="num" w:pos="5040"/>
+        </w:tabs>
+        <w:ind w:left="5040" w:hanging="360"/>
+      </w:pPr>
+      <w:rPr>
+        <w:rFonts w:ascii="Wingdings" w:hAnsi="Wingdings" w:hint="default"/>
+        <w:sz w:val="20"/>
+      </w:rPr>
+    </w:lvl>
+    <w:lvl w:ilvl="7" w:tentative="1">
+      <w:start w:val="1"/>
+      <w:numFmt w:val="bullet"/>
+      <w:lvlText w:val=""/>
+      <w:lvlJc w:val="left"/>
+      <w:pPr>
+        <w:tabs>
+          <w:tab w:val="num" w:pos="5760"/>
+        </w:tabs>
+        <w:ind w:left="5760" w:hanging="360"/>
+      </w:pPr>
+      <w:rPr>
+        <w:rFonts w:ascii="Wingdings" w:hAnsi="Wingdings" w:hint="default"/>
+        <w:sz w:val="20"/>
+      </w:rPr>
+    </w:lvl>
+    <w:lvl w:ilvl="8" w:tentative="1">
+      <w:start w:val="1"/>
+      <w:numFmt w:val="bullet"/>
+      <w:lvlText w:val=""/>
+      <w:lvlJc w:val="left"/>
+      <w:pPr>
+        <w:tabs>
+          <w:tab w:val="num" w:pos="6480"/>
+        </w:tabs>
+        <w:ind w:left="6480" w:hanging="360"/>
+      </w:pPr>
+      <w:rPr>
+        <w:rFonts w:ascii="Wingdings" w:hAnsi="Wingdings" w:hint="default"/>
+        <w:sz w:val="20"/>
+      </w:rPr>
+    </w:lvl>
+  </w:abstractNum>
+  <w:abstractNum w:abstractNumId="50" w15:restartNumberingAfterBreak="0">
     <w:nsid w:val="53390911"/>
     <w:multiLevelType w:val="multilevel"/>
     <w:tmpl w:val="1C380F12"/>
@@ -8744,7 +9832,7 @@
       </w:rPr>
     </w:lvl>
   </w:abstractNum>
-  <w:abstractNum w:abstractNumId="48" w15:restartNumberingAfterBreak="0">
+  <w:abstractNum w:abstractNumId="51" w15:restartNumberingAfterBreak="0">
     <w:nsid w:val="53CD23AC"/>
     <w:multiLevelType w:val="multilevel"/>
     <w:tmpl w:val="57BAE8F0"/>
@@ -8893,7 +9981,7 @@
       </w:rPr>
     </w:lvl>
   </w:abstractNum>
-  <w:abstractNum w:abstractNumId="49" w15:restartNumberingAfterBreak="0">
+  <w:abstractNum w:abstractNumId="52" w15:restartNumberingAfterBreak="0">
     <w:nsid w:val="5462791F"/>
     <w:multiLevelType w:val="hybridMultilevel"/>
     <w:tmpl w:val="FDE24C26"/>
@@ -9006,7 +10094,7 @@
       </w:rPr>
     </w:lvl>
   </w:abstractNum>
-  <w:abstractNum w:abstractNumId="50" w15:restartNumberingAfterBreak="0">
+  <w:abstractNum w:abstractNumId="53" w15:restartNumberingAfterBreak="0">
     <w:nsid w:val="547005EB"/>
     <w:multiLevelType w:val="multilevel"/>
     <w:tmpl w:val="F260CC5C"/>
@@ -9155,7 +10243,7 @@
       </w:rPr>
     </w:lvl>
   </w:abstractNum>
-  <w:abstractNum w:abstractNumId="51" w15:restartNumberingAfterBreak="0">
+  <w:abstractNum w:abstractNumId="54" w15:restartNumberingAfterBreak="0">
     <w:nsid w:val="58034221"/>
     <w:multiLevelType w:val="hybridMultilevel"/>
     <w:tmpl w:val="65D0619C"/>
@@ -9268,7 +10356,7 @@
       </w:rPr>
     </w:lvl>
   </w:abstractNum>
-  <w:abstractNum w:abstractNumId="52" w15:restartNumberingAfterBreak="0">
+  <w:abstractNum w:abstractNumId="55" w15:restartNumberingAfterBreak="0">
     <w:nsid w:val="5A460390"/>
     <w:multiLevelType w:val="hybridMultilevel"/>
     <w:tmpl w:val="BD8E939C"/>
@@ -9381,7 +10469,7 @@
       </w:rPr>
     </w:lvl>
   </w:abstractNum>
-  <w:abstractNum w:abstractNumId="53" w15:restartNumberingAfterBreak="0">
+  <w:abstractNum w:abstractNumId="56" w15:restartNumberingAfterBreak="0">
     <w:nsid w:val="5CEE630B"/>
     <w:multiLevelType w:val="hybridMultilevel"/>
     <w:tmpl w:val="DE8E8DBA"/>
@@ -9494,7 +10582,7 @@
       </w:rPr>
     </w:lvl>
   </w:abstractNum>
-  <w:abstractNum w:abstractNumId="54" w15:restartNumberingAfterBreak="0">
+  <w:abstractNum w:abstractNumId="57" w15:restartNumberingAfterBreak="0">
     <w:nsid w:val="62385AA6"/>
     <w:multiLevelType w:val="multilevel"/>
     <w:tmpl w:val="B9EAECD4"/>
@@ -9643,7 +10731,7 @@
       </w:rPr>
     </w:lvl>
   </w:abstractNum>
-  <w:abstractNum w:abstractNumId="55" w15:restartNumberingAfterBreak="0">
+  <w:abstractNum w:abstractNumId="58" w15:restartNumberingAfterBreak="0">
     <w:nsid w:val="625D686D"/>
     <w:multiLevelType w:val="multilevel"/>
     <w:tmpl w:val="BC1C2048"/>
@@ -9792,7 +10880,7 @@
       </w:rPr>
     </w:lvl>
   </w:abstractNum>
-  <w:abstractNum w:abstractNumId="56" w15:restartNumberingAfterBreak="0">
+  <w:abstractNum w:abstractNumId="59" w15:restartNumberingAfterBreak="0">
     <w:nsid w:val="62B46951"/>
     <w:multiLevelType w:val="hybridMultilevel"/>
     <w:tmpl w:val="0FEAFEC6"/>
@@ -9905,7 +10993,7 @@
       </w:rPr>
     </w:lvl>
   </w:abstractNum>
-  <w:abstractNum w:abstractNumId="57" w15:restartNumberingAfterBreak="0">
+  <w:abstractNum w:abstractNumId="60" w15:restartNumberingAfterBreak="0">
     <w:nsid w:val="647819E3"/>
     <w:multiLevelType w:val="multilevel"/>
     <w:tmpl w:val="ABB278BC"/>
@@ -10054,7 +11142,7 @@
       </w:rPr>
     </w:lvl>
   </w:abstractNum>
-  <w:abstractNum w:abstractNumId="58" w15:restartNumberingAfterBreak="0">
+  <w:abstractNum w:abstractNumId="61" w15:restartNumberingAfterBreak="0">
     <w:nsid w:val="64F30198"/>
     <w:multiLevelType w:val="multilevel"/>
     <w:tmpl w:val="63F4E6F0"/>
@@ -10203,7 +11291,7 @@
       </w:rPr>
     </w:lvl>
   </w:abstractNum>
-  <w:abstractNum w:abstractNumId="59" w15:restartNumberingAfterBreak="0">
+  <w:abstractNum w:abstractNumId="62" w15:restartNumberingAfterBreak="0">
     <w:nsid w:val="65314293"/>
     <w:multiLevelType w:val="hybridMultilevel"/>
     <w:tmpl w:val="6688DFAC"/>
@@ -10316,7 +11404,7 @@
       </w:rPr>
     </w:lvl>
   </w:abstractNum>
-  <w:abstractNum w:abstractNumId="60" w15:restartNumberingAfterBreak="0">
+  <w:abstractNum w:abstractNumId="63" w15:restartNumberingAfterBreak="0">
     <w:nsid w:val="65CE4D0F"/>
     <w:multiLevelType w:val="hybridMultilevel"/>
     <w:tmpl w:val="DB668538"/>
@@ -10429,7 +11517,7 @@
       </w:rPr>
     </w:lvl>
   </w:abstractNum>
-  <w:abstractNum w:abstractNumId="61" w15:restartNumberingAfterBreak="0">
+  <w:abstractNum w:abstractNumId="64" w15:restartNumberingAfterBreak="0">
     <w:nsid w:val="69DE2C87"/>
     <w:multiLevelType w:val="hybridMultilevel"/>
     <w:tmpl w:val="F530F20A"/>
@@ -10542,7 +11630,7 @@
       </w:rPr>
     </w:lvl>
   </w:abstractNum>
-  <w:abstractNum w:abstractNumId="62" w15:restartNumberingAfterBreak="0">
+  <w:abstractNum w:abstractNumId="65" w15:restartNumberingAfterBreak="0">
     <w:nsid w:val="69ED672D"/>
     <w:multiLevelType w:val="multilevel"/>
     <w:tmpl w:val="CC08E300"/>
@@ -10691,7 +11779,7 @@
       </w:rPr>
     </w:lvl>
   </w:abstractNum>
-  <w:abstractNum w:abstractNumId="63" w15:restartNumberingAfterBreak="0">
+  <w:abstractNum w:abstractNumId="66" w15:restartNumberingAfterBreak="0">
     <w:nsid w:val="6A063EFD"/>
     <w:multiLevelType w:val="hybridMultilevel"/>
     <w:tmpl w:val="48703FBA"/>
@@ -10804,7 +11892,7 @@
       </w:rPr>
     </w:lvl>
   </w:abstractNum>
-  <w:abstractNum w:abstractNumId="64" w15:restartNumberingAfterBreak="0">
+  <w:abstractNum w:abstractNumId="67" w15:restartNumberingAfterBreak="0">
     <w:nsid w:val="6A825ABE"/>
     <w:multiLevelType w:val="multilevel"/>
     <w:tmpl w:val="0CD6F30E"/>
@@ -10953,7 +12041,7 @@
       </w:rPr>
     </w:lvl>
   </w:abstractNum>
-  <w:abstractNum w:abstractNumId="65" w15:restartNumberingAfterBreak="0">
+  <w:abstractNum w:abstractNumId="68" w15:restartNumberingAfterBreak="0">
     <w:nsid w:val="6C6D6667"/>
     <w:multiLevelType w:val="hybridMultilevel"/>
     <w:tmpl w:val="A744709C"/>
@@ -11066,7 +12154,7 @@
       </w:rPr>
     </w:lvl>
   </w:abstractNum>
-  <w:abstractNum w:abstractNumId="66" w15:restartNumberingAfterBreak="0">
+  <w:abstractNum w:abstractNumId="69" w15:restartNumberingAfterBreak="0">
     <w:nsid w:val="6CAD7EA5"/>
     <w:multiLevelType w:val="multilevel"/>
     <w:tmpl w:val="C472C5B0"/>
@@ -11215,7 +12303,7 @@
       </w:rPr>
     </w:lvl>
   </w:abstractNum>
-  <w:abstractNum w:abstractNumId="67" w15:restartNumberingAfterBreak="0">
+  <w:abstractNum w:abstractNumId="70" w15:restartNumberingAfterBreak="0">
     <w:nsid w:val="6E43557B"/>
     <w:multiLevelType w:val="multilevel"/>
     <w:tmpl w:val="323C7112"/>
@@ -11364,7 +12452,7 @@
       </w:rPr>
     </w:lvl>
   </w:abstractNum>
-  <w:abstractNum w:abstractNumId="68" w15:restartNumberingAfterBreak="0">
+  <w:abstractNum w:abstractNumId="71" w15:restartNumberingAfterBreak="0">
     <w:nsid w:val="6EA27D0A"/>
     <w:multiLevelType w:val="multilevel"/>
     <w:tmpl w:val="7BF0256C"/>
@@ -11513,7 +12601,7 @@
       </w:rPr>
     </w:lvl>
   </w:abstractNum>
-  <w:abstractNum w:abstractNumId="69" w15:restartNumberingAfterBreak="0">
+  <w:abstractNum w:abstractNumId="72" w15:restartNumberingAfterBreak="0">
     <w:nsid w:val="70874300"/>
     <w:multiLevelType w:val="hybridMultilevel"/>
     <w:tmpl w:val="1B3A0518"/>
@@ -11626,7 +12714,7 @@
       </w:rPr>
     </w:lvl>
   </w:abstractNum>
-  <w:abstractNum w:abstractNumId="70" w15:restartNumberingAfterBreak="0">
+  <w:abstractNum w:abstractNumId="73" w15:restartNumberingAfterBreak="0">
     <w:nsid w:val="7090251B"/>
     <w:multiLevelType w:val="hybridMultilevel"/>
     <w:tmpl w:val="67687EFE"/>
@@ -11739,7 +12827,7 @@
       </w:rPr>
     </w:lvl>
   </w:abstractNum>
-  <w:abstractNum w:abstractNumId="71" w15:restartNumberingAfterBreak="0">
+  <w:abstractNum w:abstractNumId="74" w15:restartNumberingAfterBreak="0">
     <w:nsid w:val="75144C65"/>
     <w:multiLevelType w:val="hybridMultilevel"/>
     <w:tmpl w:val="12127FAA"/>
@@ -11852,7 +12940,7 @@
       </w:rPr>
     </w:lvl>
   </w:abstractNum>
-  <w:abstractNum w:abstractNumId="72" w15:restartNumberingAfterBreak="0">
+  <w:abstractNum w:abstractNumId="75" w15:restartNumberingAfterBreak="0">
     <w:nsid w:val="75237F84"/>
     <w:multiLevelType w:val="hybridMultilevel"/>
     <w:tmpl w:val="5F0A6EF2"/>
@@ -11965,7 +13053,7 @@
       </w:rPr>
     </w:lvl>
   </w:abstractNum>
-  <w:abstractNum w:abstractNumId="73" w15:restartNumberingAfterBreak="0">
+  <w:abstractNum w:abstractNumId="76" w15:restartNumberingAfterBreak="0">
     <w:nsid w:val="75FF09B0"/>
     <w:multiLevelType w:val="multilevel"/>
     <w:tmpl w:val="C34A7734"/>
@@ -12114,7 +13202,7 @@
       </w:rPr>
     </w:lvl>
   </w:abstractNum>
-  <w:abstractNum w:abstractNumId="74" w15:restartNumberingAfterBreak="0">
+  <w:abstractNum w:abstractNumId="77" w15:restartNumberingAfterBreak="0">
     <w:nsid w:val="77960362"/>
     <w:multiLevelType w:val="multilevel"/>
     <w:tmpl w:val="FEA0022E"/>
@@ -12263,7 +13351,7 @@
       </w:rPr>
     </w:lvl>
   </w:abstractNum>
-  <w:abstractNum w:abstractNumId="75" w15:restartNumberingAfterBreak="0">
+  <w:abstractNum w:abstractNumId="78" w15:restartNumberingAfterBreak="0">
     <w:nsid w:val="785A644F"/>
     <w:multiLevelType w:val="multilevel"/>
     <w:tmpl w:val="D1DC60FE"/>
@@ -12412,7 +13500,7 @@
       </w:rPr>
     </w:lvl>
   </w:abstractNum>
-  <w:abstractNum w:abstractNumId="76" w15:restartNumberingAfterBreak="0">
+  <w:abstractNum w:abstractNumId="79" w15:restartNumberingAfterBreak="0">
     <w:nsid w:val="7BFA03DF"/>
     <w:multiLevelType w:val="hybridMultilevel"/>
     <w:tmpl w:val="536A979E"/>
@@ -12525,7 +13613,7 @@
       </w:rPr>
     </w:lvl>
   </w:abstractNum>
-  <w:abstractNum w:abstractNumId="77" w15:restartNumberingAfterBreak="0">
+  <w:abstractNum w:abstractNumId="80" w15:restartNumberingAfterBreak="0">
     <w:nsid w:val="7CA524B4"/>
     <w:multiLevelType w:val="hybridMultilevel"/>
     <w:tmpl w:val="957C4F4A"/>
@@ -12638,7 +13726,7 @@
       </w:rPr>
     </w:lvl>
   </w:abstractNum>
-  <w:abstractNum w:abstractNumId="78" w15:restartNumberingAfterBreak="0">
+  <w:abstractNum w:abstractNumId="81" w15:restartNumberingAfterBreak="0">
     <w:nsid w:val="7EBD7710"/>
     <w:multiLevelType w:val="hybridMultilevel"/>
     <w:tmpl w:val="C8C6F7A0"/>
@@ -12752,241 +13840,250 @@
     </w:lvl>
   </w:abstractNum>
   <w:num w:numId="1" w16cid:durableId="425157302">
+    <w:abstractNumId w:val="34"/>
+  </w:num>
+  <w:num w:numId="2" w16cid:durableId="967664612">
+    <w:abstractNumId w:val="61"/>
+  </w:num>
+  <w:num w:numId="3" w16cid:durableId="361631616">
+    <w:abstractNumId w:val="43"/>
+  </w:num>
+  <w:num w:numId="4" w16cid:durableId="1409575397">
+    <w:abstractNumId w:val="52"/>
+  </w:num>
+  <w:num w:numId="5" w16cid:durableId="1647204897">
+    <w:abstractNumId w:val="80"/>
+  </w:num>
+  <w:num w:numId="6" w16cid:durableId="682589869">
+    <w:abstractNumId w:val="15"/>
+  </w:num>
+  <w:num w:numId="7" w16cid:durableId="679703478">
+    <w:abstractNumId w:val="64"/>
+  </w:num>
+  <w:num w:numId="8" w16cid:durableId="496455128">
+    <w:abstractNumId w:val="30"/>
+  </w:num>
+  <w:num w:numId="9" w16cid:durableId="1184633094">
+    <w:abstractNumId w:val="38"/>
+  </w:num>
+  <w:num w:numId="10" w16cid:durableId="71507387">
+    <w:abstractNumId w:val="41"/>
+  </w:num>
+  <w:num w:numId="11" w16cid:durableId="1412503779">
+    <w:abstractNumId w:val="66"/>
+  </w:num>
+  <w:num w:numId="12" w16cid:durableId="1107113995">
+    <w:abstractNumId w:val="31"/>
+  </w:num>
+  <w:num w:numId="13" w16cid:durableId="2011055922">
+    <w:abstractNumId w:val="16"/>
+  </w:num>
+  <w:num w:numId="14" w16cid:durableId="1529222885">
+    <w:abstractNumId w:val="79"/>
+  </w:num>
+  <w:num w:numId="15" w16cid:durableId="836580755">
+    <w:abstractNumId w:val="10"/>
+  </w:num>
+  <w:num w:numId="16" w16cid:durableId="1344674502">
+    <w:abstractNumId w:val="55"/>
+  </w:num>
+  <w:num w:numId="17" w16cid:durableId="1320882603">
+    <w:abstractNumId w:val="72"/>
+  </w:num>
+  <w:num w:numId="18" w16cid:durableId="1139028372">
     <w:abstractNumId w:val="32"/>
   </w:num>
-  <w:num w:numId="2" w16cid:durableId="967664612">
+  <w:num w:numId="19" w16cid:durableId="1525635473">
+    <w:abstractNumId w:val="59"/>
+  </w:num>
+  <w:num w:numId="20" w16cid:durableId="609623515">
+    <w:abstractNumId w:val="81"/>
+  </w:num>
+  <w:num w:numId="21" w16cid:durableId="165170997">
+    <w:abstractNumId w:val="68"/>
+  </w:num>
+  <w:num w:numId="22" w16cid:durableId="1620525290">
+    <w:abstractNumId w:val="20"/>
+  </w:num>
+  <w:num w:numId="23" w16cid:durableId="400753109">
+    <w:abstractNumId w:val="74"/>
+  </w:num>
+  <w:num w:numId="24" w16cid:durableId="193882219">
+    <w:abstractNumId w:val="4"/>
+  </w:num>
+  <w:num w:numId="25" w16cid:durableId="311981628">
+    <w:abstractNumId w:val="35"/>
+  </w:num>
+  <w:num w:numId="26" w16cid:durableId="2009166045">
+    <w:abstractNumId w:val="9"/>
+  </w:num>
+  <w:num w:numId="27" w16cid:durableId="2135174697">
+    <w:abstractNumId w:val="14"/>
+  </w:num>
+  <w:num w:numId="28" w16cid:durableId="353504740">
+    <w:abstractNumId w:val="11"/>
+  </w:num>
+  <w:num w:numId="29" w16cid:durableId="2124693280">
+    <w:abstractNumId w:val="63"/>
+  </w:num>
+  <w:num w:numId="30" w16cid:durableId="1367099744">
+    <w:abstractNumId w:val="24"/>
+  </w:num>
+  <w:num w:numId="31" w16cid:durableId="2011105642">
+    <w:abstractNumId w:val="56"/>
+  </w:num>
+  <w:num w:numId="32" w16cid:durableId="831995364">
+    <w:abstractNumId w:val="18"/>
+  </w:num>
+  <w:num w:numId="33" w16cid:durableId="851073403">
+    <w:abstractNumId w:val="3"/>
+  </w:num>
+  <w:num w:numId="34" w16cid:durableId="1183666391">
+    <w:abstractNumId w:val="17"/>
+  </w:num>
+  <w:num w:numId="35" w16cid:durableId="697268929">
+    <w:abstractNumId w:val="1"/>
+  </w:num>
+  <w:num w:numId="36" w16cid:durableId="1971284395">
+    <w:abstractNumId w:val="2"/>
+  </w:num>
+  <w:num w:numId="37" w16cid:durableId="1849755457">
+    <w:abstractNumId w:val="75"/>
+  </w:num>
+  <w:num w:numId="38" w16cid:durableId="516505904">
+    <w:abstractNumId w:val="8"/>
+  </w:num>
+  <w:num w:numId="39" w16cid:durableId="906300072">
+    <w:abstractNumId w:val="12"/>
+  </w:num>
+  <w:num w:numId="40" w16cid:durableId="905338697">
+    <w:abstractNumId w:val="45"/>
+  </w:num>
+  <w:num w:numId="41" w16cid:durableId="501896635">
+    <w:abstractNumId w:val="33"/>
+  </w:num>
+  <w:num w:numId="42" w16cid:durableId="1953435156">
+    <w:abstractNumId w:val="46"/>
+  </w:num>
+  <w:num w:numId="43" w16cid:durableId="1060447452">
+    <w:abstractNumId w:val="54"/>
+  </w:num>
+  <w:num w:numId="44" w16cid:durableId="1772503672">
+    <w:abstractNumId w:val="39"/>
+  </w:num>
+  <w:num w:numId="45" w16cid:durableId="1650330222">
+    <w:abstractNumId w:val="44"/>
+  </w:num>
+  <w:num w:numId="46" w16cid:durableId="2102337934">
+    <w:abstractNumId w:val="19"/>
+  </w:num>
+  <w:num w:numId="47" w16cid:durableId="68767822">
+    <w:abstractNumId w:val="67"/>
+  </w:num>
+  <w:num w:numId="48" w16cid:durableId="1992058265">
+    <w:abstractNumId w:val="5"/>
+  </w:num>
+  <w:num w:numId="49" w16cid:durableId="788475134">
+    <w:abstractNumId w:val="78"/>
+  </w:num>
+  <w:num w:numId="50" w16cid:durableId="224419455">
+    <w:abstractNumId w:val="71"/>
+  </w:num>
+  <w:num w:numId="51" w16cid:durableId="1699575947">
     <w:abstractNumId w:val="58"/>
   </w:num>
-  <w:num w:numId="3" w16cid:durableId="361631616">
-    <w:abstractNumId w:val="41"/>
+  <w:num w:numId="52" w16cid:durableId="1048916239">
+    <w:abstractNumId w:val="37"/>
   </w:num>
-  <w:num w:numId="4" w16cid:durableId="1409575397">
-    <w:abstractNumId w:val="49"/>
+  <w:num w:numId="53" w16cid:durableId="1188711211">
+    <w:abstractNumId w:val="76"/>
   </w:num>
-  <w:num w:numId="5" w16cid:durableId="1647204897">
+  <w:num w:numId="54" w16cid:durableId="447555614">
+    <w:abstractNumId w:val="60"/>
+  </w:num>
+  <w:num w:numId="55" w16cid:durableId="1679307268">
+    <w:abstractNumId w:val="36"/>
+  </w:num>
+  <w:num w:numId="56" w16cid:durableId="693773591">
+    <w:abstractNumId w:val="70"/>
+  </w:num>
+  <w:num w:numId="57" w16cid:durableId="1110473324">
+    <w:abstractNumId w:val="25"/>
+  </w:num>
+  <w:num w:numId="58" w16cid:durableId="842937968">
+    <w:abstractNumId w:val="42"/>
+  </w:num>
+  <w:num w:numId="59" w16cid:durableId="821121315">
+    <w:abstractNumId w:val="29"/>
+  </w:num>
+  <w:num w:numId="60" w16cid:durableId="2095394549">
     <w:abstractNumId w:val="77"/>
   </w:num>
-  <w:num w:numId="6" w16cid:durableId="682589869">
-    <w:abstractNumId w:val="14"/>
-  </w:num>
-  <w:num w:numId="7" w16cid:durableId="679703478">
-    <w:abstractNumId w:val="61"/>
-  </w:num>
-  <w:num w:numId="8" w16cid:durableId="496455128">
+  <w:num w:numId="61" w16cid:durableId="1299921011">
     <w:abstractNumId w:val="28"/>
   </w:num>
-  <w:num w:numId="9" w16cid:durableId="1184633094">
-    <w:abstractNumId w:val="36"/>
+  <w:num w:numId="62" w16cid:durableId="1927420240">
+    <w:abstractNumId w:val="48"/>
   </w:num>
-  <w:num w:numId="10" w16cid:durableId="71507387">
-    <w:abstractNumId w:val="39"/>
+  <w:num w:numId="63" w16cid:durableId="41290043">
+    <w:abstractNumId w:val="51"/>
   </w:num>
-  <w:num w:numId="11" w16cid:durableId="1412503779">
-    <w:abstractNumId w:val="63"/>
+  <w:num w:numId="64" w16cid:durableId="999846909">
+    <w:abstractNumId w:val="40"/>
   </w:num>
-  <w:num w:numId="12" w16cid:durableId="1107113995">
-    <w:abstractNumId w:val="29"/>
+  <w:num w:numId="65" w16cid:durableId="1250969563">
+    <w:abstractNumId w:val="47"/>
   </w:num>
-  <w:num w:numId="13" w16cid:durableId="2011055922">
-    <w:abstractNumId w:val="15"/>
+  <w:num w:numId="66" w16cid:durableId="484011382">
+    <w:abstractNumId w:val="65"/>
   </w:num>
-  <w:num w:numId="14" w16cid:durableId="1529222885">
-    <w:abstractNumId w:val="76"/>
+  <w:num w:numId="67" w16cid:durableId="2008289242">
+    <w:abstractNumId w:val="7"/>
   </w:num>
-  <w:num w:numId="15" w16cid:durableId="836580755">
-    <w:abstractNumId w:val="9"/>
+  <w:num w:numId="68" w16cid:durableId="1041637222">
+    <w:abstractNumId w:val="13"/>
   </w:num>
-  <w:num w:numId="16" w16cid:durableId="1344674502">
-    <w:abstractNumId w:val="52"/>
+  <w:num w:numId="69" w16cid:durableId="1296839887">
+    <w:abstractNumId w:val="50"/>
   </w:num>
-  <w:num w:numId="17" w16cid:durableId="1320882603">
+  <w:num w:numId="70" w16cid:durableId="336662050">
+    <w:abstractNumId w:val="57"/>
+  </w:num>
+  <w:num w:numId="71" w16cid:durableId="1460032333">
     <w:abstractNumId w:val="69"/>
   </w:num>
-  <w:num w:numId="18" w16cid:durableId="1139028372">
-    <w:abstractNumId w:val="30"/>
+  <w:num w:numId="72" w16cid:durableId="592400615">
+    <w:abstractNumId w:val="6"/>
   </w:num>
-  <w:num w:numId="19" w16cid:durableId="1525635473">
-    <w:abstractNumId w:val="56"/>
-  </w:num>
-  <w:num w:numId="20" w16cid:durableId="609623515">
-    <w:abstractNumId w:val="78"/>
-  </w:num>
-  <w:num w:numId="21" w16cid:durableId="165170997">
-    <w:abstractNumId w:val="65"/>
-  </w:num>
-  <w:num w:numId="22" w16cid:durableId="1620525290">
-    <w:abstractNumId w:val="19"/>
-  </w:num>
-  <w:num w:numId="23" w16cid:durableId="400753109">
-    <w:abstractNumId w:val="71"/>
-  </w:num>
-  <w:num w:numId="24" w16cid:durableId="193882219">
-    <w:abstractNumId w:val="3"/>
-  </w:num>
-  <w:num w:numId="25" w16cid:durableId="311981628">
-    <w:abstractNumId w:val="33"/>
-  </w:num>
-  <w:num w:numId="26" w16cid:durableId="2009166045">
-    <w:abstractNumId w:val="8"/>
-  </w:num>
-  <w:num w:numId="27" w16cid:durableId="2135174697">
-    <w:abstractNumId w:val="13"/>
-  </w:num>
-  <w:num w:numId="28" w16cid:durableId="353504740">
-    <w:abstractNumId w:val="10"/>
-  </w:num>
-  <w:num w:numId="29" w16cid:durableId="2124693280">
-    <w:abstractNumId w:val="60"/>
-  </w:num>
-  <w:num w:numId="30" w16cid:durableId="1367099744">
+  <w:num w:numId="73" w16cid:durableId="1879049234">
     <w:abstractNumId w:val="23"/>
   </w:num>
-  <w:num w:numId="31" w16cid:durableId="2011105642">
+  <w:num w:numId="74" w16cid:durableId="1747679558">
+    <w:abstractNumId w:val="26"/>
+  </w:num>
+  <w:num w:numId="75" w16cid:durableId="55278029">
+    <w:abstractNumId w:val="21"/>
+  </w:num>
+  <w:num w:numId="76" w16cid:durableId="1032193382">
+    <w:abstractNumId w:val="22"/>
+  </w:num>
+  <w:num w:numId="77" w16cid:durableId="763109604">
     <w:abstractNumId w:val="53"/>
   </w:num>
-  <w:num w:numId="32" w16cid:durableId="831995364">
-    <w:abstractNumId w:val="17"/>
+  <w:num w:numId="78" w16cid:durableId="2138137265">
+    <w:abstractNumId w:val="62"/>
   </w:num>
-  <w:num w:numId="33" w16cid:durableId="851073403">
-    <w:abstractNumId w:val="2"/>
+  <w:num w:numId="79" w16cid:durableId="343675924">
+    <w:abstractNumId w:val="73"/>
   </w:num>
-  <w:num w:numId="34" w16cid:durableId="1183666391">
-    <w:abstractNumId w:val="16"/>
+  <w:num w:numId="80" w16cid:durableId="1823277442">
+    <w:abstractNumId w:val="27"/>
   </w:num>
-  <w:num w:numId="35" w16cid:durableId="697268929">
+  <w:num w:numId="81" w16cid:durableId="1686900155">
     <w:abstractNumId w:val="0"/>
   </w:num>
-  <w:num w:numId="36" w16cid:durableId="1971284395">
-    <w:abstractNumId w:val="1"/>
-  </w:num>
-  <w:num w:numId="37" w16cid:durableId="1849755457">
-    <w:abstractNumId w:val="72"/>
-  </w:num>
-  <w:num w:numId="38" w16cid:durableId="516505904">
-    <w:abstractNumId w:val="7"/>
-  </w:num>
-  <w:num w:numId="39" w16cid:durableId="906300072">
-    <w:abstractNumId w:val="11"/>
-  </w:num>
-  <w:num w:numId="40" w16cid:durableId="905338697">
-    <w:abstractNumId w:val="43"/>
-  </w:num>
-  <w:num w:numId="41" w16cid:durableId="501896635">
-    <w:abstractNumId w:val="31"/>
-  </w:num>
-  <w:num w:numId="42" w16cid:durableId="1953435156">
-    <w:abstractNumId w:val="44"/>
-  </w:num>
-  <w:num w:numId="43" w16cid:durableId="1060447452">
-    <w:abstractNumId w:val="51"/>
-  </w:num>
-  <w:num w:numId="44" w16cid:durableId="1772503672">
-    <w:abstractNumId w:val="37"/>
-  </w:num>
-  <w:num w:numId="45" w16cid:durableId="1650330222">
-    <w:abstractNumId w:val="42"/>
-  </w:num>
-  <w:num w:numId="46" w16cid:durableId="2102337934">
-    <w:abstractNumId w:val="18"/>
-  </w:num>
-  <w:num w:numId="47" w16cid:durableId="68767822">
-    <w:abstractNumId w:val="64"/>
-  </w:num>
-  <w:num w:numId="48" w16cid:durableId="1992058265">
-    <w:abstractNumId w:val="4"/>
-  </w:num>
-  <w:num w:numId="49" w16cid:durableId="788475134">
-    <w:abstractNumId w:val="75"/>
-  </w:num>
-  <w:num w:numId="50" w16cid:durableId="224419455">
-    <w:abstractNumId w:val="68"/>
-  </w:num>
-  <w:num w:numId="51" w16cid:durableId="1699575947">
-    <w:abstractNumId w:val="55"/>
-  </w:num>
-  <w:num w:numId="52" w16cid:durableId="1048916239">
-    <w:abstractNumId w:val="35"/>
-  </w:num>
-  <w:num w:numId="53" w16cid:durableId="1188711211">
-    <w:abstractNumId w:val="73"/>
-  </w:num>
-  <w:num w:numId="54" w16cid:durableId="447555614">
-    <w:abstractNumId w:val="57"/>
-  </w:num>
-  <w:num w:numId="55" w16cid:durableId="1679307268">
-    <w:abstractNumId w:val="34"/>
-  </w:num>
-  <w:num w:numId="56" w16cid:durableId="693773591">
-    <w:abstractNumId w:val="67"/>
-  </w:num>
-  <w:num w:numId="57" w16cid:durableId="1110473324">
-    <w:abstractNumId w:val="24"/>
-  </w:num>
-  <w:num w:numId="58" w16cid:durableId="842937968">
-    <w:abstractNumId w:val="40"/>
-  </w:num>
-  <w:num w:numId="59" w16cid:durableId="821121315">
-    <w:abstractNumId w:val="27"/>
-  </w:num>
-  <w:num w:numId="60" w16cid:durableId="2095394549">
-    <w:abstractNumId w:val="74"/>
-  </w:num>
-  <w:num w:numId="61" w16cid:durableId="1299921011">
-    <w:abstractNumId w:val="26"/>
-  </w:num>
-  <w:num w:numId="62" w16cid:durableId="1927420240">
-    <w:abstractNumId w:val="46"/>
-  </w:num>
-  <w:num w:numId="63" w16cid:durableId="41290043">
-    <w:abstractNumId w:val="48"/>
-  </w:num>
-  <w:num w:numId="64" w16cid:durableId="999846909">
-    <w:abstractNumId w:val="38"/>
-  </w:num>
-  <w:num w:numId="65" w16cid:durableId="1250969563">
-    <w:abstractNumId w:val="45"/>
-  </w:num>
-  <w:num w:numId="66" w16cid:durableId="484011382">
-    <w:abstractNumId w:val="62"/>
-  </w:num>
-  <w:num w:numId="67" w16cid:durableId="2008289242">
-    <w:abstractNumId w:val="6"/>
-  </w:num>
-  <w:num w:numId="68" w16cid:durableId="1041637222">
-    <w:abstractNumId w:val="12"/>
-  </w:num>
-  <w:num w:numId="69" w16cid:durableId="1296839887">
-    <w:abstractNumId w:val="47"/>
-  </w:num>
-  <w:num w:numId="70" w16cid:durableId="336662050">
-    <w:abstractNumId w:val="54"/>
-  </w:num>
-  <w:num w:numId="71" w16cid:durableId="1460032333">
-    <w:abstractNumId w:val="66"/>
-  </w:num>
-  <w:num w:numId="72" w16cid:durableId="592400615">
-    <w:abstractNumId w:val="5"/>
-  </w:num>
-  <w:num w:numId="73" w16cid:durableId="1879049234">
-    <w:abstractNumId w:val="22"/>
-  </w:num>
-  <w:num w:numId="74" w16cid:durableId="1747679558">
-    <w:abstractNumId w:val="25"/>
-  </w:num>
-  <w:num w:numId="75" w16cid:durableId="55278029">
-    <w:abstractNumId w:val="20"/>
-  </w:num>
-  <w:num w:numId="76" w16cid:durableId="1032193382">
-    <w:abstractNumId w:val="21"/>
-  </w:num>
-  <w:num w:numId="77" w16cid:durableId="763109604">
-    <w:abstractNumId w:val="50"/>
-  </w:num>
-  <w:num w:numId="78" w16cid:durableId="2138137265">
-    <w:abstractNumId w:val="59"/>
-  </w:num>
-  <w:num w:numId="79" w16cid:durableId="343675924">
-    <w:abstractNumId w:val="70"/>
+  <w:num w:numId="82" w16cid:durableId="1113326280">
+    <w:abstractNumId w:val="49"/>
   </w:num>
   <w:numIdMacAtCleanup w:val="45"/>
 </w:numbering>

</xml_diff>

<commit_message>
Branch & Employee Management Sequence Diagram (#233)
</commit_message>
<xml_diff>
--- a/Sequence Specification Document.docx
+++ b/Sequence Specification Document.docx
@@ -3262,16 +3262,21 @@
         <w:spacing w:line="278" w:lineRule="auto"/>
       </w:pPr>
       <w:r>
-        <w:t>The Fleet Management Sequence Diagram offers a detailed view of the functions involved in the management of vehicles within the KriGo system. It shows the interaction of the presentation layer, business logic layer, validation services layer, and data persistence layer during the process of vehicle registration, vehicle information update, and vehicle information deletion and availability management. This diagram is a vital design artifact to understand how the fleet management subsystem works and how the system can keep track of the vehicles' data.</w:t>
-      </w:r>
-      <w:r>
         <w:rPr>
           <w:noProof/>
         </w:rPr>
         <w:drawing>
-          <wp:inline distT="0" distB="0" distL="0" distR="0" wp14:anchorId="3CB40F6C" wp14:editId="096BAA0B">
+          <wp:anchor distT="0" distB="0" distL="114300" distR="114300" simplePos="0" relativeHeight="251672576" behindDoc="0" locked="0" layoutInCell="1" allowOverlap="1" wp14:anchorId="3CB40F6C" wp14:editId="1252D3D2">
+            <wp:simplePos x="0" y="0"/>
+            <wp:positionH relativeFrom="column">
+              <wp:posOffset>41275</wp:posOffset>
+            </wp:positionH>
+            <wp:positionV relativeFrom="paragraph">
+              <wp:posOffset>1329055</wp:posOffset>
+            </wp:positionV>
             <wp:extent cx="5941695" cy="6706235"/>
             <wp:effectExtent l="0" t="0" r="1905" b="0"/>
+            <wp:wrapSquare wrapText="bothSides"/>
             <wp:docPr id="2106996735" name="Picture 5"/>
             <wp:cNvGraphicFramePr>
               <a:graphicFrameLocks xmlns:a="http://schemas.openxmlformats.org/drawingml/2006/main" noChangeAspect="1"/>
@@ -3314,9 +3319,12 @@
                 </pic:pic>
               </a:graphicData>
             </a:graphic>
-          </wp:inline>
+          </wp:anchor>
         </w:drawing>
       </w:r>
+      <w:r>
+        <w:t>The Fleet Management Sequence Diagram offers a detailed view of the functions involved in the management of vehicles within the KriGo system. It shows the interaction of the presentation layer, business logic layer, validation services layer, and data persistence layer during the process of vehicle registration, vehicle information update, and vehicle information deletion and availability management. This diagram is a vital design artifact to understand how the fleet management subsystem works and how the system can keep track of the vehicles' data.</w:t>
+      </w:r>
     </w:p>
     <w:p>
       <w:pPr>
@@ -3358,7 +3366,701 @@
         <w:br w:type="page"/>
       </w:r>
     </w:p>
-    <w:p/>
+    <w:p>
+      <w:pPr>
+        <w:rPr>
+          <w:b/>
+          <w:bCs/>
+        </w:rPr>
+      </w:pPr>
+      <w:r>
+        <w:rPr>
+          <w:b/>
+          <w:bCs/>
+        </w:rPr>
+        <w:lastRenderedPageBreak/>
+        <w:t>Branch &amp; Employee Management Sequence Diagram Documentation</w:t>
+      </w:r>
+    </w:p>
+    <w:p>
+      <w:pPr>
+        <w:rPr>
+          <w:b/>
+          <w:bCs/>
+        </w:rPr>
+      </w:pPr>
+      <w:r>
+        <w:rPr>
+          <w:b/>
+          <w:bCs/>
+        </w:rPr>
+        <w:t>Purpose</w:t>
+      </w:r>
+    </w:p>
+    <w:p>
+      <w:r>
+        <w:t xml:space="preserve">The Branch &amp; Employee Management Sequence Diagram depicts the interactions between the system administrator and the system components that manage branches and employees on the KriGo platform. This diagram shows the flow of operations to create new branches, register employees, update branch and employee information, and delete employee information. </w:t>
+      </w:r>
+      <w:r>
+        <w:br/>
+        <w:t>The sequence diagram illustrates the process that the system uses to authenticate administrative data, manage requests, save organizational data, and preserve the integrity of branch and employee data.</w:t>
+      </w:r>
+    </w:p>
+    <w:p>
+      <w:r>
+        <w:rPr>
+          <w:b/>
+          <w:bCs/>
+        </w:rPr>
+        <w:t>Participating Objects</w:t>
+      </w:r>
+    </w:p>
+    <w:p>
+      <w:r>
+        <w:t>The sequence diagram includes the following participants:</w:t>
+      </w:r>
+    </w:p>
+    <w:p>
+      <w:pPr>
+        <w:pStyle w:val="ListParagraph"/>
+        <w:numPr>
+          <w:ilvl w:val="0"/>
+          <w:numId w:val="86"/>
+        </w:numPr>
+        <w:spacing w:after="0" w:line="276" w:lineRule="auto"/>
+      </w:pPr>
+      <w:r>
+        <w:rPr>
+          <w:b/>
+          <w:bCs/>
+        </w:rPr>
+        <w:t>System Administrator (Actor):</w:t>
+      </w:r>
+      <w:r>
+        <w:t xml:space="preserve"> Responsible for managing branch and employee information.</w:t>
+      </w:r>
+    </w:p>
+    <w:p>
+      <w:pPr>
+        <w:pStyle w:val="ListParagraph"/>
+        <w:numPr>
+          <w:ilvl w:val="0"/>
+          <w:numId w:val="86"/>
+        </w:numPr>
+        <w:spacing w:after="0" w:line="276" w:lineRule="auto"/>
+      </w:pPr>
+      <w:r>
+        <w:rPr>
+          <w:b/>
+          <w:bCs/>
+        </w:rPr>
+        <w:t>ManagementUI (Boundary):</w:t>
+      </w:r>
+      <w:r>
+        <w:t xml:space="preserve"> Provides the interface for performing branch and employee management operations.</w:t>
+      </w:r>
+    </w:p>
+    <w:p>
+      <w:pPr>
+        <w:pStyle w:val="ListParagraph"/>
+        <w:numPr>
+          <w:ilvl w:val="0"/>
+          <w:numId w:val="86"/>
+        </w:numPr>
+        <w:spacing w:after="0" w:line="276" w:lineRule="auto"/>
+      </w:pPr>
+      <w:r>
+        <w:rPr>
+          <w:b/>
+          <w:bCs/>
+        </w:rPr>
+        <w:t>ManagementController (Control):</w:t>
+      </w:r>
+      <w:r>
+        <w:t xml:space="preserve"> Coordinates administrative workflows and applies business rules.</w:t>
+      </w:r>
+    </w:p>
+    <w:p>
+      <w:pPr>
+        <w:pStyle w:val="ListParagraph"/>
+        <w:numPr>
+          <w:ilvl w:val="0"/>
+          <w:numId w:val="86"/>
+        </w:numPr>
+        <w:spacing w:after="0" w:line="276" w:lineRule="auto"/>
+      </w:pPr>
+      <w:r>
+        <w:rPr>
+          <w:b/>
+          <w:bCs/>
+        </w:rPr>
+        <w:t>ValidationService (Control):</w:t>
+      </w:r>
+      <w:r>
+        <w:t xml:space="preserve"> Validates the information entered before processing any operation.</w:t>
+      </w:r>
+    </w:p>
+    <w:p>
+      <w:pPr>
+        <w:pStyle w:val="ListParagraph"/>
+        <w:numPr>
+          <w:ilvl w:val="0"/>
+          <w:numId w:val="86"/>
+        </w:numPr>
+        <w:spacing w:after="0" w:line="276" w:lineRule="auto"/>
+      </w:pPr>
+      <w:r>
+        <w:rPr>
+          <w:b/>
+          <w:bCs/>
+        </w:rPr>
+        <w:t>BranchRepository (Entity):</w:t>
+      </w:r>
+      <w:r>
+        <w:t xml:space="preserve"> Handles the storage and retrieval of branch information.</w:t>
+      </w:r>
+    </w:p>
+    <w:p>
+      <w:pPr>
+        <w:pStyle w:val="ListParagraph"/>
+        <w:numPr>
+          <w:ilvl w:val="0"/>
+          <w:numId w:val="86"/>
+        </w:numPr>
+        <w:spacing w:after="0" w:line="276" w:lineRule="auto"/>
+      </w:pPr>
+      <w:r>
+        <w:rPr>
+          <w:b/>
+          <w:bCs/>
+        </w:rPr>
+        <w:t>EmployeeRepository (Entity):</w:t>
+      </w:r>
+      <w:r>
+        <w:t xml:space="preserve"> Manages employee records within the system.</w:t>
+      </w:r>
+    </w:p>
+    <w:p>
+      <w:pPr>
+        <w:pStyle w:val="ListParagraph"/>
+        <w:numPr>
+          <w:ilvl w:val="0"/>
+          <w:numId w:val="86"/>
+        </w:numPr>
+        <w:spacing w:line="276" w:lineRule="auto"/>
+      </w:pPr>
+      <w:r>
+        <w:rPr>
+          <w:b/>
+          <w:bCs/>
+        </w:rPr>
+        <w:t>Database (Database):</w:t>
+      </w:r>
+      <w:r>
+        <w:t xml:space="preserve"> Stores branch and employee data.</w:t>
+      </w:r>
+    </w:p>
+    <w:p>
+      <w:pPr>
+        <w:rPr>
+          <w:b/>
+          <w:bCs/>
+        </w:rPr>
+      </w:pPr>
+      <w:r>
+        <w:rPr>
+          <w:b/>
+          <w:bCs/>
+        </w:rPr>
+        <w:t>Branch Registration Process</w:t>
+      </w:r>
+    </w:p>
+    <w:p>
+      <w:r>
+        <w:t xml:space="preserve">A new branch is created when the system administrator selects the option of creating a new branch. ManagementUI shows a form for branch registration. Administrator fills the required fields like branch name, address, contact details and other relevant information. </w:t>
+      </w:r>
+      <w:r>
+        <w:br/>
+        <w:t xml:space="preserve">Upon submission of the form the ManagementController invokes the ValidationService to check if the data entered is complete and correct. </w:t>
+      </w:r>
+    </w:p>
+    <w:p>
+      <w:r>
+        <w:t xml:space="preserve">If the validation is OK, the controller forwards the request to the BranchRepository that saves the new branch information to the database. </w:t>
+      </w:r>
+      <w:r>
+        <w:br/>
+        <w:t>The system confirms that the branch has been created and displays a message to the administrator confirming that the operation was successful.</w:t>
+      </w:r>
+    </w:p>
+    <w:p>
+      <w:pPr>
+        <w:rPr>
+          <w:b/>
+          <w:bCs/>
+        </w:rPr>
+      </w:pPr>
+      <w:r>
+        <w:rPr>
+          <w:b/>
+          <w:bCs/>
+        </w:rPr>
+        <w:t>Employee Registration Process</w:t>
+      </w:r>
+    </w:p>
+    <w:p>
+      <w:r>
+        <w:t>Also,</w:t>
+      </w:r>
+      <w:r>
+        <w:t xml:space="preserve"> the sequence diagram shows the process of adding a new employee. The operation is started by the system administrator through the ManagementUI by entering the employee’s information including personal details, branch assigned, role and contact information. </w:t>
+      </w:r>
+      <w:r>
+        <w:br/>
+        <w:t xml:space="preserve">The ManagementController processes the request and delegates the persistence operation to the EmployeeRepository which persists the employee record to the database. When the employee information is saved successfully, the system informs the administrator that the registration process has been completed. </w:t>
+      </w:r>
+    </w:p>
+    <w:p>
+      <w:r>
+        <w:t>With this feature, administrators can easily manage employees that work for different rental branches.</w:t>
+      </w:r>
+    </w:p>
+    <w:p>
+      <w:pPr>
+        <w:rPr>
+          <w:b/>
+          <w:bCs/>
+        </w:rPr>
+      </w:pPr>
+      <w:r>
+        <w:rPr>
+          <w:b/>
+          <w:bCs/>
+        </w:rPr>
+        <w:lastRenderedPageBreak/>
+        <w:t>Branch and Employee Information Update</w:t>
+      </w:r>
+    </w:p>
+    <w:p>
+      <w:r>
+        <w:t xml:space="preserve">The sequence diagram illustrates how the existing branch and employee data is updated. When administrator changes branch/employee record, this changed information is sent to ManagementController. </w:t>
+      </w:r>
+    </w:p>
+    <w:p>
+      <w:r>
+        <w:t xml:space="preserve">The controller then calls either the BranchRepository or the EmployeeRepository depending on which type of record is being updated, to update the relevant information in the database. </w:t>
+      </w:r>
+    </w:p>
+    <w:p>
+      <w:r>
+        <w:t xml:space="preserve">If the update operation is successful, the changes are confirmed and a suitable notification is displayed. </w:t>
+      </w:r>
+      <w:r>
+        <w:br/>
+        <w:t>This feature enables administrators to keep information about the organization and personnel accurate.</w:t>
+      </w:r>
+    </w:p>
+    <w:p>
+      <w:pPr>
+        <w:rPr>
+          <w:b/>
+          <w:bCs/>
+        </w:rPr>
+      </w:pPr>
+      <w:r>
+        <w:rPr>
+          <w:b/>
+          <w:bCs/>
+        </w:rPr>
+        <w:t>Employee Removal Process</w:t>
+      </w:r>
+    </w:p>
+    <w:p>
+      <w:r>
+        <w:t xml:space="preserve">The sequence diagram also includes deleting employee records. The ManagementController receives the deletion request for an employee from the administrator and forwards it to the EmployeeRepository. </w:t>
+      </w:r>
+    </w:p>
+    <w:p>
+      <w:r>
+        <w:t xml:space="preserve">The repository removes the employee record from the database and sends back a confirmation that the operation has been successfully done. Then the system notifies the administrator that the employee has been deleted. </w:t>
+      </w:r>
+    </w:p>
+    <w:p>
+      <w:r>
+        <w:t>This helps ensure employee records are up to date and accurately reflect the composition of the organization’s workforce.</w:t>
+      </w:r>
+    </w:p>
+    <w:p>
+      <w:pPr>
+        <w:rPr>
+          <w:b/>
+          <w:bCs/>
+        </w:rPr>
+      </w:pPr>
+      <w:r>
+        <w:rPr>
+          <w:b/>
+          <w:bCs/>
+        </w:rPr>
+        <w:t>Data Validation</w:t>
+      </w:r>
+    </w:p>
+    <w:p>
+      <w:r>
+        <w:t xml:space="preserve">The information submitted is checked by ValidationService prior to conducting operations concerning branch or employee management to assure that it is compliant with the business rules established in the system. </w:t>
+      </w:r>
+    </w:p>
+    <w:p>
+      <w:r>
+        <w:t>Validation is the process which includes verification of required fields, verification of data format, as well as verification of completeness and consistency of the data.</w:t>
+      </w:r>
+    </w:p>
+    <w:p>
+      <w:r>
+        <w:t>If validation fails, the operation is terminated, validation errors are displayed by the system, and the administrator is notified to correct the errors before making a new request.</w:t>
+      </w:r>
+    </w:p>
+    <w:p>
+      <w:pPr>
+        <w:rPr>
+          <w:b/>
+          <w:bCs/>
+        </w:rPr>
+      </w:pPr>
+      <w:r>
+        <w:rPr>
+          <w:b/>
+          <w:bCs/>
+        </w:rPr>
+        <w:t>Alternative and Exceptional Flows</w:t>
+      </w:r>
+    </w:p>
+    <w:p>
+      <w:r>
+        <w:t>The Branch &amp; Employee Management Sequence Diagram incorporates several alternative scenarios to ensure reliable system behavior:</w:t>
+      </w:r>
+    </w:p>
+    <w:p>
+      <w:pPr>
+        <w:numPr>
+          <w:ilvl w:val="0"/>
+          <w:numId w:val="85"/>
+        </w:numPr>
+        <w:spacing w:after="0" w:line="276" w:lineRule="auto"/>
+      </w:pPr>
+      <w:r>
+        <w:t>Invalid or incomplete branch information.</w:t>
+      </w:r>
+    </w:p>
+    <w:p>
+      <w:pPr>
+        <w:numPr>
+          <w:ilvl w:val="0"/>
+          <w:numId w:val="85"/>
+        </w:numPr>
+        <w:spacing w:after="0" w:line="276" w:lineRule="auto"/>
+      </w:pPr>
+      <w:r>
+        <w:t>Invalid or incomplete employee information.</w:t>
+      </w:r>
+    </w:p>
+    <w:p>
+      <w:pPr>
+        <w:numPr>
+          <w:ilvl w:val="0"/>
+          <w:numId w:val="85"/>
+        </w:numPr>
+        <w:spacing w:after="0" w:line="276" w:lineRule="auto"/>
+      </w:pPr>
+      <w:r>
+        <w:t>Successful branch registration.</w:t>
+      </w:r>
+    </w:p>
+    <w:p>
+      <w:pPr>
+        <w:numPr>
+          <w:ilvl w:val="0"/>
+          <w:numId w:val="85"/>
+        </w:numPr>
+        <w:spacing w:after="0" w:line="276" w:lineRule="auto"/>
+      </w:pPr>
+      <w:r>
+        <w:t>Successful employee registration.</w:t>
+      </w:r>
+    </w:p>
+    <w:p>
+      <w:pPr>
+        <w:numPr>
+          <w:ilvl w:val="0"/>
+          <w:numId w:val="85"/>
+        </w:numPr>
+        <w:spacing w:after="0" w:line="276" w:lineRule="auto"/>
+      </w:pPr>
+      <w:r>
+        <w:t>Successful update of branch or employee information.</w:t>
+      </w:r>
+    </w:p>
+    <w:p>
+      <w:pPr>
+        <w:numPr>
+          <w:ilvl w:val="0"/>
+          <w:numId w:val="85"/>
+        </w:numPr>
+        <w:spacing w:line="276" w:lineRule="auto"/>
+      </w:pPr>
+      <w:r>
+        <w:t>Successful removal of an employee record.</w:t>
+      </w:r>
+    </w:p>
+    <w:p>
+      <w:r>
+        <w:t>These alternative flows ensure that only valid administrative data is stored while maintaining the consistency and integrity of organizational information.</w:t>
+      </w:r>
+    </w:p>
+    <w:p>
+      <w:pPr>
+        <w:spacing w:line="278" w:lineRule="auto"/>
+        <w:rPr>
+          <w:b/>
+          <w:bCs/>
+        </w:rPr>
+      </w:pPr>
+      <w:r>
+        <w:rPr>
+          <w:b/>
+          <w:bCs/>
+        </w:rPr>
+        <w:br w:type="page"/>
+      </w:r>
+    </w:p>
+    <w:p>
+      <w:pPr>
+        <w:rPr>
+          <w:b/>
+          <w:bCs/>
+        </w:rPr>
+      </w:pPr>
+      <w:r>
+        <w:rPr>
+          <w:b/>
+          <w:bCs/>
+        </w:rPr>
+        <w:lastRenderedPageBreak/>
+        <w:t>Conclusion</w:t>
+      </w:r>
+    </w:p>
+    <w:p>
+      <w:r>
+        <w:rPr>
+          <w:noProof/>
+        </w:rPr>
+        <mc:AlternateContent>
+          <mc:Choice Requires="wps">
+            <w:drawing>
+              <wp:anchor distT="0" distB="0" distL="114300" distR="114300" simplePos="0" relativeHeight="251675648" behindDoc="0" locked="0" layoutInCell="1" allowOverlap="1" wp14:anchorId="4E4C9A13" wp14:editId="31403824">
+                <wp:simplePos x="0" y="0"/>
+                <wp:positionH relativeFrom="column">
+                  <wp:posOffset>-2540</wp:posOffset>
+                </wp:positionH>
+                <wp:positionV relativeFrom="paragraph">
+                  <wp:posOffset>8347075</wp:posOffset>
+                </wp:positionV>
+                <wp:extent cx="5941695" cy="635"/>
+                <wp:effectExtent l="0" t="0" r="0" b="0"/>
+                <wp:wrapSquare wrapText="bothSides"/>
+                <wp:docPr id="741278585" name="Text Box 1"/>
+                <wp:cNvGraphicFramePr/>
+                <a:graphic xmlns:a="http://schemas.openxmlformats.org/drawingml/2006/main">
+                  <a:graphicData uri="http://schemas.microsoft.com/office/word/2010/wordprocessingShape">
+                    <wps:wsp>
+                      <wps:cNvSpPr txBox="1"/>
+                      <wps:spPr>
+                        <a:xfrm>
+                          <a:off x="0" y="0"/>
+                          <a:ext cx="5941695" cy="635"/>
+                        </a:xfrm>
+                        <a:prstGeom prst="rect">
+                          <a:avLst/>
+                        </a:prstGeom>
+                        <a:solidFill>
+                          <a:prstClr val="white"/>
+                        </a:solidFill>
+                        <a:ln>
+                          <a:noFill/>
+                        </a:ln>
+                      </wps:spPr>
+                      <wps:txbx>
+                        <w:txbxContent>
+                          <w:p>
+                            <w:pPr>
+                              <w:pStyle w:val="Caption"/>
+                              <w:rPr>
+                                <w:noProof/>
+                              </w:rPr>
+                            </w:pPr>
+                            <w:r>
+                              <w:t xml:space="preserve">Figure </w:t>
+                            </w:r>
+                            <w:r>
+                              <w:fldChar w:fldCharType="begin"/>
+                            </w:r>
+                            <w:r>
+                              <w:instrText xml:space="preserve"> SEQ Figure \* ARABIC </w:instrText>
+                            </w:r>
+                            <w:r>
+                              <w:fldChar w:fldCharType="separate"/>
+                            </w:r>
+                            <w:r>
+                              <w:rPr>
+                                <w:noProof/>
+                              </w:rPr>
+                              <w:t>6</w:t>
+                            </w:r>
+                            <w:r>
+                              <w:fldChar w:fldCharType="end"/>
+                            </w:r>
+                            <w:r>
+                              <w:t xml:space="preserve"> - </w:t>
+                            </w:r>
+                            <w:r>
+                              <w:t>Branch &amp; Employee Management Sequence Diagram</w:t>
+                            </w:r>
+                          </w:p>
+                        </w:txbxContent>
+                      </wps:txbx>
+                      <wps:bodyPr rot="0" spcFirstLastPara="0" vertOverflow="overflow" horzOverflow="overflow" vert="horz" wrap="square" lIns="0" tIns="0" rIns="0" bIns="0" numCol="1" spcCol="0" rtlCol="0" fromWordArt="0" anchor="t" anchorCtr="0" forceAA="0" compatLnSpc="1">
+                        <a:prstTxWarp prst="textNoShape">
+                          <a:avLst/>
+                        </a:prstTxWarp>
+                        <a:spAutoFit/>
+                      </wps:bodyPr>
+                    </wps:wsp>
+                  </a:graphicData>
+                </a:graphic>
+              </wp:anchor>
+            </w:drawing>
+          </mc:Choice>
+          <mc:Fallback>
+            <w:pict>
+              <v:shape w14:anchorId="4E4C9A13" id="_x0000_s1030" type="#_x0000_t202" style="position:absolute;margin-left:-.2pt;margin-top:657.25pt;width:467.85pt;height:.05pt;z-index:251675648;visibility:visible;mso-wrap-style:square;mso-wrap-distance-left:9pt;mso-wrap-distance-top:0;mso-wrap-distance-right:9pt;mso-wrap-distance-bottom:0;mso-position-horizontal:absolute;mso-position-horizontal-relative:text;mso-position-vertical:absolute;mso-position-vertical-relative:text;v-text-anchor:top" o:gfxdata="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" stroked="f">
+                <v:textbox style="mso-fit-shape-to-text:t" inset="0,0,0,0">
+                  <w:txbxContent>
+                    <w:p>
+                      <w:pPr>
+                        <w:pStyle w:val="Caption"/>
+                        <w:rPr>
+                          <w:noProof/>
+                        </w:rPr>
+                      </w:pPr>
+                      <w:r>
+                        <w:t xml:space="preserve">Figure </w:t>
+                      </w:r>
+                      <w:r>
+                        <w:fldChar w:fldCharType="begin"/>
+                      </w:r>
+                      <w:r>
+                        <w:instrText xml:space="preserve"> SEQ Figure \* ARABIC </w:instrText>
+                      </w:r>
+                      <w:r>
+                        <w:fldChar w:fldCharType="separate"/>
+                      </w:r>
+                      <w:r>
+                        <w:rPr>
+                          <w:noProof/>
+                        </w:rPr>
+                        <w:t>6</w:t>
+                      </w:r>
+                      <w:r>
+                        <w:fldChar w:fldCharType="end"/>
+                      </w:r>
+                      <w:r>
+                        <w:t xml:space="preserve"> - </w:t>
+                      </w:r>
+                      <w:r>
+                        <w:t>Branch &amp; Employee Management Sequence Diagram</w:t>
+                      </w:r>
+                    </w:p>
+                  </w:txbxContent>
+                </v:textbox>
+                <w10:wrap type="square"/>
+              </v:shape>
+            </w:pict>
+          </mc:Fallback>
+        </mc:AlternateContent>
+      </w:r>
+      <w:r>
+        <w:rPr>
+          <w:noProof/>
+        </w:rPr>
+        <w:drawing>
+          <wp:anchor distT="0" distB="0" distL="114300" distR="114300" simplePos="0" relativeHeight="251673600" behindDoc="0" locked="0" layoutInCell="1" allowOverlap="1" wp14:anchorId="5F7C95EB" wp14:editId="252ECC74">
+            <wp:simplePos x="0" y="0"/>
+            <wp:positionH relativeFrom="column">
+              <wp:posOffset>-2540</wp:posOffset>
+            </wp:positionH>
+            <wp:positionV relativeFrom="paragraph">
+              <wp:posOffset>1217930</wp:posOffset>
+            </wp:positionV>
+            <wp:extent cx="5941695" cy="7146925"/>
+            <wp:effectExtent l="0" t="0" r="1905" b="0"/>
+            <wp:wrapSquare wrapText="bothSides"/>
+            <wp:docPr id="1096978299" name="Picture 6"/>
+            <wp:cNvGraphicFramePr>
+              <a:graphicFrameLocks xmlns:a="http://schemas.openxmlformats.org/drawingml/2006/main" noChangeAspect="1"/>
+            </wp:cNvGraphicFramePr>
+            <a:graphic xmlns:a="http://schemas.openxmlformats.org/drawingml/2006/main">
+              <a:graphicData uri="http://schemas.openxmlformats.org/drawingml/2006/picture">
+                <pic:pic xmlns:pic="http://schemas.openxmlformats.org/drawingml/2006/picture">
+                  <pic:nvPicPr>
+                    <pic:cNvPr id="0" name="Picture 7"/>
+                    <pic:cNvPicPr>
+                      <a:picLocks noChangeAspect="1" noChangeArrowheads="1"/>
+                    </pic:cNvPicPr>
+                  </pic:nvPicPr>
+                  <pic:blipFill>
+                    <a:blip r:embed="rId13">
+                      <a:extLst>
+                        <a:ext uri="{28A0092B-C50C-407E-A947-70E740481C1C}">
+                          <a14:useLocalDpi xmlns:a14="http://schemas.microsoft.com/office/drawing/2010/main" val="0"/>
+                        </a:ext>
+                      </a:extLst>
+                    </a:blip>
+                    <a:srcRect/>
+                    <a:stretch>
+                      <a:fillRect/>
+                    </a:stretch>
+                  </pic:blipFill>
+                  <pic:spPr bwMode="auto">
+                    <a:xfrm>
+                      <a:off x="0" y="0"/>
+                      <a:ext cx="5941695" cy="7146925"/>
+                    </a:xfrm>
+                    <a:prstGeom prst="rect">
+                      <a:avLst/>
+                    </a:prstGeom>
+                    <a:noFill/>
+                    <a:ln>
+                      <a:noFill/>
+                    </a:ln>
+                  </pic:spPr>
+                </pic:pic>
+              </a:graphicData>
+            </a:graphic>
+          </wp:anchor>
+        </w:drawing>
+      </w:r>
+      <w:r>
+        <w:t>The process of branch and employee management is depicted in the Branch &amp; Employee Management Sequence Diagram. The diagram shows the interaction among the presentation layer, business logic layer, validation services, and data persistence layer in the context of conducting various branch and employee activities, such as registration, management, update of information, and dismissal of personnel. This serves as a remarkable documentation for the purpose of grasping the concept of the administrative subsystem of the platform.</w:t>
+      </w:r>
+    </w:p>
+    <w:p>
+      <w:pPr>
+        <w:spacing w:line="278" w:lineRule="auto"/>
+      </w:pPr>
+      <w:r>
+        <w:br w:type="page"/>
+      </w:r>
+    </w:p>
     <w:sectPr>
       <w:pgSz w:w="11906" w:h="16838" w:code="9"/>
       <w:pgMar w:top="1411" w:right="850" w:bottom="1411" w:left="1699" w:header="720" w:footer="720" w:gutter="0"/>
@@ -7588,6 +8290,155 @@
     </w:lvl>
   </w:abstractNum>
   <w:abstractNum w:abstractNumId="34" w15:restartNumberingAfterBreak="0">
+    <w:nsid w:val="35C86AF0"/>
+    <w:multiLevelType w:val="multilevel"/>
+    <w:tmpl w:val="8202FCD6"/>
+    <w:lvl w:ilvl="0">
+      <w:start w:val="1"/>
+      <w:numFmt w:val="bullet"/>
+      <w:lvlText w:val=""/>
+      <w:lvlJc w:val="left"/>
+      <w:pPr>
+        <w:tabs>
+          <w:tab w:val="num" w:pos="720"/>
+        </w:tabs>
+        <w:ind w:left="720" w:hanging="360"/>
+      </w:pPr>
+      <w:rPr>
+        <w:rFonts w:ascii="Symbol" w:hAnsi="Symbol" w:hint="default"/>
+        <w:sz w:val="20"/>
+      </w:rPr>
+    </w:lvl>
+    <w:lvl w:ilvl="1" w:tentative="1">
+      <w:start w:val="1"/>
+      <w:numFmt w:val="bullet"/>
+      <w:lvlText w:val="o"/>
+      <w:lvlJc w:val="left"/>
+      <w:pPr>
+        <w:tabs>
+          <w:tab w:val="num" w:pos="1440"/>
+        </w:tabs>
+        <w:ind w:left="1440" w:hanging="360"/>
+      </w:pPr>
+      <w:rPr>
+        <w:rFonts w:ascii="Courier New" w:hAnsi="Courier New" w:hint="default"/>
+        <w:sz w:val="20"/>
+      </w:rPr>
+    </w:lvl>
+    <w:lvl w:ilvl="2" w:tentative="1">
+      <w:start w:val="1"/>
+      <w:numFmt w:val="bullet"/>
+      <w:lvlText w:val=""/>
+      <w:lvlJc w:val="left"/>
+      <w:pPr>
+        <w:tabs>
+          <w:tab w:val="num" w:pos="2160"/>
+        </w:tabs>
+        <w:ind w:left="2160" w:hanging="360"/>
+      </w:pPr>
+      <w:rPr>
+        <w:rFonts w:ascii="Wingdings" w:hAnsi="Wingdings" w:hint="default"/>
+        <w:sz w:val="20"/>
+      </w:rPr>
+    </w:lvl>
+    <w:lvl w:ilvl="3" w:tentative="1">
+      <w:start w:val="1"/>
+      <w:numFmt w:val="bullet"/>
+      <w:lvlText w:val=""/>
+      <w:lvlJc w:val="left"/>
+      <w:pPr>
+        <w:tabs>
+          <w:tab w:val="num" w:pos="2880"/>
+        </w:tabs>
+        <w:ind w:left="2880" w:hanging="360"/>
+      </w:pPr>
+      <w:rPr>
+        <w:rFonts w:ascii="Wingdings" w:hAnsi="Wingdings" w:hint="default"/>
+        <w:sz w:val="20"/>
+      </w:rPr>
+    </w:lvl>
+    <w:lvl w:ilvl="4" w:tentative="1">
+      <w:start w:val="1"/>
+      <w:numFmt w:val="bullet"/>
+      <w:lvlText w:val=""/>
+      <w:lvlJc w:val="left"/>
+      <w:pPr>
+        <w:tabs>
+          <w:tab w:val="num" w:pos="3600"/>
+        </w:tabs>
+        <w:ind w:left="3600" w:hanging="360"/>
+      </w:pPr>
+      <w:rPr>
+        <w:rFonts w:ascii="Wingdings" w:hAnsi="Wingdings" w:hint="default"/>
+        <w:sz w:val="20"/>
+      </w:rPr>
+    </w:lvl>
+    <w:lvl w:ilvl="5" w:tentative="1">
+      <w:start w:val="1"/>
+      <w:numFmt w:val="bullet"/>
+      <w:lvlText w:val=""/>
+      <w:lvlJc w:val="left"/>
+      <w:pPr>
+        <w:tabs>
+          <w:tab w:val="num" w:pos="4320"/>
+        </w:tabs>
+        <w:ind w:left="4320" w:hanging="360"/>
+      </w:pPr>
+      <w:rPr>
+        <w:rFonts w:ascii="Wingdings" w:hAnsi="Wingdings" w:hint="default"/>
+        <w:sz w:val="20"/>
+      </w:rPr>
+    </w:lvl>
+    <w:lvl w:ilvl="6" w:tentative="1">
+      <w:start w:val="1"/>
+      <w:numFmt w:val="bullet"/>
+      <w:lvlText w:val=""/>
+      <w:lvlJc w:val="left"/>
+      <w:pPr>
+        <w:tabs>
+          <w:tab w:val="num" w:pos="5040"/>
+        </w:tabs>
+        <w:ind w:left="5040" w:hanging="360"/>
+      </w:pPr>
+      <w:rPr>
+        <w:rFonts w:ascii="Wingdings" w:hAnsi="Wingdings" w:hint="default"/>
+        <w:sz w:val="20"/>
+      </w:rPr>
+    </w:lvl>
+    <w:lvl w:ilvl="7" w:tentative="1">
+      <w:start w:val="1"/>
+      <w:numFmt w:val="bullet"/>
+      <w:lvlText w:val=""/>
+      <w:lvlJc w:val="left"/>
+      <w:pPr>
+        <w:tabs>
+          <w:tab w:val="num" w:pos="5760"/>
+        </w:tabs>
+        <w:ind w:left="5760" w:hanging="360"/>
+      </w:pPr>
+      <w:rPr>
+        <w:rFonts w:ascii="Wingdings" w:hAnsi="Wingdings" w:hint="default"/>
+        <w:sz w:val="20"/>
+      </w:rPr>
+    </w:lvl>
+    <w:lvl w:ilvl="8" w:tentative="1">
+      <w:start w:val="1"/>
+      <w:numFmt w:val="bullet"/>
+      <w:lvlText w:val=""/>
+      <w:lvlJc w:val="left"/>
+      <w:pPr>
+        <w:tabs>
+          <w:tab w:val="num" w:pos="6480"/>
+        </w:tabs>
+        <w:ind w:left="6480" w:hanging="360"/>
+      </w:pPr>
+      <w:rPr>
+        <w:rFonts w:ascii="Wingdings" w:hAnsi="Wingdings" w:hint="default"/>
+        <w:sz w:val="20"/>
+      </w:rPr>
+    </w:lvl>
+  </w:abstractNum>
+  <w:abstractNum w:abstractNumId="35" w15:restartNumberingAfterBreak="0">
     <w:nsid w:val="3623194A"/>
     <w:multiLevelType w:val="multilevel"/>
     <w:tmpl w:val="63F4E6F0"/>
@@ -7736,7 +8587,7 @@
       </w:rPr>
     </w:lvl>
   </w:abstractNum>
-  <w:abstractNum w:abstractNumId="35" w15:restartNumberingAfterBreak="0">
+  <w:abstractNum w:abstractNumId="36" w15:restartNumberingAfterBreak="0">
     <w:nsid w:val="37B424C3"/>
     <w:multiLevelType w:val="hybridMultilevel"/>
     <w:tmpl w:val="18F030D4"/>
@@ -7849,7 +8700,7 @@
       </w:rPr>
     </w:lvl>
   </w:abstractNum>
-  <w:abstractNum w:abstractNumId="36" w15:restartNumberingAfterBreak="0">
+  <w:abstractNum w:abstractNumId="37" w15:restartNumberingAfterBreak="0">
     <w:nsid w:val="3BC10D30"/>
     <w:multiLevelType w:val="multilevel"/>
     <w:tmpl w:val="502AD78C"/>
@@ -7998,7 +8849,7 @@
       </w:rPr>
     </w:lvl>
   </w:abstractNum>
-  <w:abstractNum w:abstractNumId="37" w15:restartNumberingAfterBreak="0">
+  <w:abstractNum w:abstractNumId="38" w15:restartNumberingAfterBreak="0">
     <w:nsid w:val="3CBF280A"/>
     <w:multiLevelType w:val="multilevel"/>
     <w:tmpl w:val="A13E4362"/>
@@ -8147,7 +8998,7 @@
       </w:rPr>
     </w:lvl>
   </w:abstractNum>
-  <w:abstractNum w:abstractNumId="38" w15:restartNumberingAfterBreak="0">
+  <w:abstractNum w:abstractNumId="39" w15:restartNumberingAfterBreak="0">
     <w:nsid w:val="452F60FB"/>
     <w:multiLevelType w:val="hybridMultilevel"/>
     <w:tmpl w:val="892A990A"/>
@@ -8260,7 +9111,156 @@
       </w:rPr>
     </w:lvl>
   </w:abstractNum>
-  <w:abstractNum w:abstractNumId="39" w15:restartNumberingAfterBreak="0">
+  <w:abstractNum w:abstractNumId="40" w15:restartNumberingAfterBreak="0">
+    <w:nsid w:val="47BF2170"/>
+    <w:multiLevelType w:val="multilevel"/>
+    <w:tmpl w:val="D9681266"/>
+    <w:lvl w:ilvl="0">
+      <w:start w:val="1"/>
+      <w:numFmt w:val="bullet"/>
+      <w:lvlText w:val=""/>
+      <w:lvlJc w:val="left"/>
+      <w:pPr>
+        <w:tabs>
+          <w:tab w:val="num" w:pos="720"/>
+        </w:tabs>
+        <w:ind w:left="720" w:hanging="360"/>
+      </w:pPr>
+      <w:rPr>
+        <w:rFonts w:ascii="Wingdings" w:hAnsi="Wingdings" w:hint="default"/>
+        <w:sz w:val="20"/>
+      </w:rPr>
+    </w:lvl>
+    <w:lvl w:ilvl="1" w:tentative="1">
+      <w:start w:val="1"/>
+      <w:numFmt w:val="bullet"/>
+      <w:lvlText w:val="o"/>
+      <w:lvlJc w:val="left"/>
+      <w:pPr>
+        <w:tabs>
+          <w:tab w:val="num" w:pos="1440"/>
+        </w:tabs>
+        <w:ind w:left="1440" w:hanging="360"/>
+      </w:pPr>
+      <w:rPr>
+        <w:rFonts w:ascii="Courier New" w:hAnsi="Courier New" w:hint="default"/>
+        <w:sz w:val="20"/>
+      </w:rPr>
+    </w:lvl>
+    <w:lvl w:ilvl="2" w:tentative="1">
+      <w:start w:val="1"/>
+      <w:numFmt w:val="bullet"/>
+      <w:lvlText w:val=""/>
+      <w:lvlJc w:val="left"/>
+      <w:pPr>
+        <w:tabs>
+          <w:tab w:val="num" w:pos="2160"/>
+        </w:tabs>
+        <w:ind w:left="2160" w:hanging="360"/>
+      </w:pPr>
+      <w:rPr>
+        <w:rFonts w:ascii="Wingdings" w:hAnsi="Wingdings" w:hint="default"/>
+        <w:sz w:val="20"/>
+      </w:rPr>
+    </w:lvl>
+    <w:lvl w:ilvl="3" w:tentative="1">
+      <w:start w:val="1"/>
+      <w:numFmt w:val="bullet"/>
+      <w:lvlText w:val=""/>
+      <w:lvlJc w:val="left"/>
+      <w:pPr>
+        <w:tabs>
+          <w:tab w:val="num" w:pos="2880"/>
+        </w:tabs>
+        <w:ind w:left="2880" w:hanging="360"/>
+      </w:pPr>
+      <w:rPr>
+        <w:rFonts w:ascii="Wingdings" w:hAnsi="Wingdings" w:hint="default"/>
+        <w:sz w:val="20"/>
+      </w:rPr>
+    </w:lvl>
+    <w:lvl w:ilvl="4" w:tentative="1">
+      <w:start w:val="1"/>
+      <w:numFmt w:val="bullet"/>
+      <w:lvlText w:val=""/>
+      <w:lvlJc w:val="left"/>
+      <w:pPr>
+        <w:tabs>
+          <w:tab w:val="num" w:pos="3600"/>
+        </w:tabs>
+        <w:ind w:left="3600" w:hanging="360"/>
+      </w:pPr>
+      <w:rPr>
+        <w:rFonts w:ascii="Wingdings" w:hAnsi="Wingdings" w:hint="default"/>
+        <w:sz w:val="20"/>
+      </w:rPr>
+    </w:lvl>
+    <w:lvl w:ilvl="5" w:tentative="1">
+      <w:start w:val="1"/>
+      <w:numFmt w:val="bullet"/>
+      <w:lvlText w:val=""/>
+      <w:lvlJc w:val="left"/>
+      <w:pPr>
+        <w:tabs>
+          <w:tab w:val="num" w:pos="4320"/>
+        </w:tabs>
+        <w:ind w:left="4320" w:hanging="360"/>
+      </w:pPr>
+      <w:rPr>
+        <w:rFonts w:ascii="Wingdings" w:hAnsi="Wingdings" w:hint="default"/>
+        <w:sz w:val="20"/>
+      </w:rPr>
+    </w:lvl>
+    <w:lvl w:ilvl="6" w:tentative="1">
+      <w:start w:val="1"/>
+      <w:numFmt w:val="bullet"/>
+      <w:lvlText w:val=""/>
+      <w:lvlJc w:val="left"/>
+      <w:pPr>
+        <w:tabs>
+          <w:tab w:val="num" w:pos="5040"/>
+        </w:tabs>
+        <w:ind w:left="5040" w:hanging="360"/>
+      </w:pPr>
+      <w:rPr>
+        <w:rFonts w:ascii="Wingdings" w:hAnsi="Wingdings" w:hint="default"/>
+        <w:sz w:val="20"/>
+      </w:rPr>
+    </w:lvl>
+    <w:lvl w:ilvl="7" w:tentative="1">
+      <w:start w:val="1"/>
+      <w:numFmt w:val="bullet"/>
+      <w:lvlText w:val=""/>
+      <w:lvlJc w:val="left"/>
+      <w:pPr>
+        <w:tabs>
+          <w:tab w:val="num" w:pos="5760"/>
+        </w:tabs>
+        <w:ind w:left="5760" w:hanging="360"/>
+      </w:pPr>
+      <w:rPr>
+        <w:rFonts w:ascii="Wingdings" w:hAnsi="Wingdings" w:hint="default"/>
+        <w:sz w:val="20"/>
+      </w:rPr>
+    </w:lvl>
+    <w:lvl w:ilvl="8" w:tentative="1">
+      <w:start w:val="1"/>
+      <w:numFmt w:val="bullet"/>
+      <w:lvlText w:val=""/>
+      <w:lvlJc w:val="left"/>
+      <w:pPr>
+        <w:tabs>
+          <w:tab w:val="num" w:pos="6480"/>
+        </w:tabs>
+        <w:ind w:left="6480" w:hanging="360"/>
+      </w:pPr>
+      <w:rPr>
+        <w:rFonts w:ascii="Wingdings" w:hAnsi="Wingdings" w:hint="default"/>
+        <w:sz w:val="20"/>
+      </w:rPr>
+    </w:lvl>
+  </w:abstractNum>
+  <w:abstractNum w:abstractNumId="41" w15:restartNumberingAfterBreak="0">
     <w:nsid w:val="47E5592F"/>
     <w:multiLevelType w:val="hybridMultilevel"/>
     <w:tmpl w:val="719AB9FA"/>
@@ -8373,7 +9373,7 @@
       </w:rPr>
     </w:lvl>
   </w:abstractNum>
-  <w:abstractNum w:abstractNumId="40" w15:restartNumberingAfterBreak="0">
+  <w:abstractNum w:abstractNumId="42" w15:restartNumberingAfterBreak="0">
     <w:nsid w:val="48C041A9"/>
     <w:multiLevelType w:val="multilevel"/>
     <w:tmpl w:val="59A694BC"/>
@@ -8522,7 +9522,7 @@
       </w:rPr>
     </w:lvl>
   </w:abstractNum>
-  <w:abstractNum w:abstractNumId="41" w15:restartNumberingAfterBreak="0">
+  <w:abstractNum w:abstractNumId="43" w15:restartNumberingAfterBreak="0">
     <w:nsid w:val="4AF73293"/>
     <w:multiLevelType w:val="hybridMultilevel"/>
     <w:tmpl w:val="F2962738"/>
@@ -8635,7 +9635,7 @@
       </w:rPr>
     </w:lvl>
   </w:abstractNum>
-  <w:abstractNum w:abstractNumId="42" w15:restartNumberingAfterBreak="0">
+  <w:abstractNum w:abstractNumId="44" w15:restartNumberingAfterBreak="0">
     <w:nsid w:val="4B375248"/>
     <w:multiLevelType w:val="multilevel"/>
     <w:tmpl w:val="B574C1C6"/>
@@ -8784,7 +9784,7 @@
       </w:rPr>
     </w:lvl>
   </w:abstractNum>
-  <w:abstractNum w:abstractNumId="43" w15:restartNumberingAfterBreak="0">
+  <w:abstractNum w:abstractNumId="45" w15:restartNumberingAfterBreak="0">
     <w:nsid w:val="4BA13766"/>
     <w:multiLevelType w:val="multilevel"/>
     <w:tmpl w:val="63F4E6F0"/>
@@ -8933,7 +9933,7 @@
       </w:rPr>
     </w:lvl>
   </w:abstractNum>
-  <w:abstractNum w:abstractNumId="44" w15:restartNumberingAfterBreak="0">
+  <w:abstractNum w:abstractNumId="46" w15:restartNumberingAfterBreak="0">
     <w:nsid w:val="4BA25441"/>
     <w:multiLevelType w:val="hybridMultilevel"/>
     <w:tmpl w:val="217E2E96"/>
@@ -9046,7 +10046,7 @@
       </w:rPr>
     </w:lvl>
   </w:abstractNum>
-  <w:abstractNum w:abstractNumId="45" w15:restartNumberingAfterBreak="0">
+  <w:abstractNum w:abstractNumId="47" w15:restartNumberingAfterBreak="0">
     <w:nsid w:val="4E276DCB"/>
     <w:multiLevelType w:val="hybridMultilevel"/>
     <w:tmpl w:val="B7C469B4"/>
@@ -9159,7 +10159,7 @@
       </w:rPr>
     </w:lvl>
   </w:abstractNum>
-  <w:abstractNum w:abstractNumId="46" w15:restartNumberingAfterBreak="0">
+  <w:abstractNum w:abstractNumId="48" w15:restartNumberingAfterBreak="0">
     <w:nsid w:val="4F053929"/>
     <w:multiLevelType w:val="hybridMultilevel"/>
     <w:tmpl w:val="2A78C678"/>
@@ -9272,7 +10272,7 @@
       </w:rPr>
     </w:lvl>
   </w:abstractNum>
-  <w:abstractNum w:abstractNumId="47" w15:restartNumberingAfterBreak="0">
+  <w:abstractNum w:abstractNumId="49" w15:restartNumberingAfterBreak="0">
     <w:nsid w:val="51737FE0"/>
     <w:multiLevelType w:val="hybridMultilevel"/>
     <w:tmpl w:val="2B0604E6"/>
@@ -9385,7 +10385,7 @@
       </w:rPr>
     </w:lvl>
   </w:abstractNum>
-  <w:abstractNum w:abstractNumId="48" w15:restartNumberingAfterBreak="0">
+  <w:abstractNum w:abstractNumId="50" w15:restartNumberingAfterBreak="0">
     <w:nsid w:val="51A86EF8"/>
     <w:multiLevelType w:val="multilevel"/>
     <w:tmpl w:val="FF2841D4"/>
@@ -9534,7 +10534,7 @@
       </w:rPr>
     </w:lvl>
   </w:abstractNum>
-  <w:abstractNum w:abstractNumId="49" w15:restartNumberingAfterBreak="0">
+  <w:abstractNum w:abstractNumId="51" w15:restartNumberingAfterBreak="0">
     <w:nsid w:val="521F2792"/>
     <w:multiLevelType w:val="multilevel"/>
     <w:tmpl w:val="9FB45386"/>
@@ -9683,7 +10683,7 @@
       </w:rPr>
     </w:lvl>
   </w:abstractNum>
-  <w:abstractNum w:abstractNumId="50" w15:restartNumberingAfterBreak="0">
+  <w:abstractNum w:abstractNumId="52" w15:restartNumberingAfterBreak="0">
     <w:nsid w:val="53390911"/>
     <w:multiLevelType w:val="multilevel"/>
     <w:tmpl w:val="1C380F12"/>
@@ -9832,7 +10832,7 @@
       </w:rPr>
     </w:lvl>
   </w:abstractNum>
-  <w:abstractNum w:abstractNumId="51" w15:restartNumberingAfterBreak="0">
+  <w:abstractNum w:abstractNumId="53" w15:restartNumberingAfterBreak="0">
     <w:nsid w:val="53CD23AC"/>
     <w:multiLevelType w:val="multilevel"/>
     <w:tmpl w:val="57BAE8F0"/>
@@ -9981,7 +10981,7 @@
       </w:rPr>
     </w:lvl>
   </w:abstractNum>
-  <w:abstractNum w:abstractNumId="52" w15:restartNumberingAfterBreak="0">
+  <w:abstractNum w:abstractNumId="54" w15:restartNumberingAfterBreak="0">
     <w:nsid w:val="5462791F"/>
     <w:multiLevelType w:val="hybridMultilevel"/>
     <w:tmpl w:val="FDE24C26"/>
@@ -10094,7 +11094,7 @@
       </w:rPr>
     </w:lvl>
   </w:abstractNum>
-  <w:abstractNum w:abstractNumId="53" w15:restartNumberingAfterBreak="0">
+  <w:abstractNum w:abstractNumId="55" w15:restartNumberingAfterBreak="0">
     <w:nsid w:val="547005EB"/>
     <w:multiLevelType w:val="multilevel"/>
     <w:tmpl w:val="F260CC5C"/>
@@ -10243,7 +11243,7 @@
       </w:rPr>
     </w:lvl>
   </w:abstractNum>
-  <w:abstractNum w:abstractNumId="54" w15:restartNumberingAfterBreak="0">
+  <w:abstractNum w:abstractNumId="56" w15:restartNumberingAfterBreak="0">
     <w:nsid w:val="58034221"/>
     <w:multiLevelType w:val="hybridMultilevel"/>
     <w:tmpl w:val="65D0619C"/>
@@ -10356,7 +11356,7 @@
       </w:rPr>
     </w:lvl>
   </w:abstractNum>
-  <w:abstractNum w:abstractNumId="55" w15:restartNumberingAfterBreak="0">
+  <w:abstractNum w:abstractNumId="57" w15:restartNumberingAfterBreak="0">
     <w:nsid w:val="5A460390"/>
     <w:multiLevelType w:val="hybridMultilevel"/>
     <w:tmpl w:val="BD8E939C"/>
@@ -10469,7 +11469,7 @@
       </w:rPr>
     </w:lvl>
   </w:abstractNum>
-  <w:abstractNum w:abstractNumId="56" w15:restartNumberingAfterBreak="0">
+  <w:abstractNum w:abstractNumId="58" w15:restartNumberingAfterBreak="0">
     <w:nsid w:val="5CEE630B"/>
     <w:multiLevelType w:val="hybridMultilevel"/>
     <w:tmpl w:val="DE8E8DBA"/>
@@ -10582,7 +11582,7 @@
       </w:rPr>
     </w:lvl>
   </w:abstractNum>
-  <w:abstractNum w:abstractNumId="57" w15:restartNumberingAfterBreak="0">
+  <w:abstractNum w:abstractNumId="59" w15:restartNumberingAfterBreak="0">
     <w:nsid w:val="62385AA6"/>
     <w:multiLevelType w:val="multilevel"/>
     <w:tmpl w:val="B9EAECD4"/>
@@ -10731,7 +11731,7 @@
       </w:rPr>
     </w:lvl>
   </w:abstractNum>
-  <w:abstractNum w:abstractNumId="58" w15:restartNumberingAfterBreak="0">
+  <w:abstractNum w:abstractNumId="60" w15:restartNumberingAfterBreak="0">
     <w:nsid w:val="625D686D"/>
     <w:multiLevelType w:val="multilevel"/>
     <w:tmpl w:val="BC1C2048"/>
@@ -10880,7 +11880,7 @@
       </w:rPr>
     </w:lvl>
   </w:abstractNum>
-  <w:abstractNum w:abstractNumId="59" w15:restartNumberingAfterBreak="0">
+  <w:abstractNum w:abstractNumId="61" w15:restartNumberingAfterBreak="0">
     <w:nsid w:val="62B46951"/>
     <w:multiLevelType w:val="hybridMultilevel"/>
     <w:tmpl w:val="0FEAFEC6"/>
@@ -10993,7 +11993,7 @@
       </w:rPr>
     </w:lvl>
   </w:abstractNum>
-  <w:abstractNum w:abstractNumId="60" w15:restartNumberingAfterBreak="0">
+  <w:abstractNum w:abstractNumId="62" w15:restartNumberingAfterBreak="0">
     <w:nsid w:val="647819E3"/>
     <w:multiLevelType w:val="multilevel"/>
     <w:tmpl w:val="ABB278BC"/>
@@ -11142,7 +12142,7 @@
       </w:rPr>
     </w:lvl>
   </w:abstractNum>
-  <w:abstractNum w:abstractNumId="61" w15:restartNumberingAfterBreak="0">
+  <w:abstractNum w:abstractNumId="63" w15:restartNumberingAfterBreak="0">
     <w:nsid w:val="64F30198"/>
     <w:multiLevelType w:val="multilevel"/>
     <w:tmpl w:val="63F4E6F0"/>
@@ -11291,7 +12291,7 @@
       </w:rPr>
     </w:lvl>
   </w:abstractNum>
-  <w:abstractNum w:abstractNumId="62" w15:restartNumberingAfterBreak="0">
+  <w:abstractNum w:abstractNumId="64" w15:restartNumberingAfterBreak="0">
     <w:nsid w:val="65314293"/>
     <w:multiLevelType w:val="hybridMultilevel"/>
     <w:tmpl w:val="6688DFAC"/>
@@ -11404,7 +12404,7 @@
       </w:rPr>
     </w:lvl>
   </w:abstractNum>
-  <w:abstractNum w:abstractNumId="63" w15:restartNumberingAfterBreak="0">
+  <w:abstractNum w:abstractNumId="65" w15:restartNumberingAfterBreak="0">
     <w:nsid w:val="65CE4D0F"/>
     <w:multiLevelType w:val="hybridMultilevel"/>
     <w:tmpl w:val="DB668538"/>
@@ -11517,7 +12517,156 @@
       </w:rPr>
     </w:lvl>
   </w:abstractNum>
-  <w:abstractNum w:abstractNumId="64" w15:restartNumberingAfterBreak="0">
+  <w:abstractNum w:abstractNumId="66" w15:restartNumberingAfterBreak="0">
+    <w:nsid w:val="661C7D73"/>
+    <w:multiLevelType w:val="multilevel"/>
+    <w:tmpl w:val="D9681266"/>
+    <w:lvl w:ilvl="0">
+      <w:start w:val="1"/>
+      <w:numFmt w:val="bullet"/>
+      <w:lvlText w:val=""/>
+      <w:lvlJc w:val="left"/>
+      <w:pPr>
+        <w:tabs>
+          <w:tab w:val="num" w:pos="720"/>
+        </w:tabs>
+        <w:ind w:left="720" w:hanging="360"/>
+      </w:pPr>
+      <w:rPr>
+        <w:rFonts w:ascii="Wingdings" w:hAnsi="Wingdings" w:hint="default"/>
+        <w:sz w:val="20"/>
+      </w:rPr>
+    </w:lvl>
+    <w:lvl w:ilvl="1" w:tentative="1">
+      <w:start w:val="1"/>
+      <w:numFmt w:val="bullet"/>
+      <w:lvlText w:val="o"/>
+      <w:lvlJc w:val="left"/>
+      <w:pPr>
+        <w:tabs>
+          <w:tab w:val="num" w:pos="1440"/>
+        </w:tabs>
+        <w:ind w:left="1440" w:hanging="360"/>
+      </w:pPr>
+      <w:rPr>
+        <w:rFonts w:ascii="Courier New" w:hAnsi="Courier New" w:hint="default"/>
+        <w:sz w:val="20"/>
+      </w:rPr>
+    </w:lvl>
+    <w:lvl w:ilvl="2" w:tentative="1">
+      <w:start w:val="1"/>
+      <w:numFmt w:val="bullet"/>
+      <w:lvlText w:val=""/>
+      <w:lvlJc w:val="left"/>
+      <w:pPr>
+        <w:tabs>
+          <w:tab w:val="num" w:pos="2160"/>
+        </w:tabs>
+        <w:ind w:left="2160" w:hanging="360"/>
+      </w:pPr>
+      <w:rPr>
+        <w:rFonts w:ascii="Wingdings" w:hAnsi="Wingdings" w:hint="default"/>
+        <w:sz w:val="20"/>
+      </w:rPr>
+    </w:lvl>
+    <w:lvl w:ilvl="3" w:tentative="1">
+      <w:start w:val="1"/>
+      <w:numFmt w:val="bullet"/>
+      <w:lvlText w:val=""/>
+      <w:lvlJc w:val="left"/>
+      <w:pPr>
+        <w:tabs>
+          <w:tab w:val="num" w:pos="2880"/>
+        </w:tabs>
+        <w:ind w:left="2880" w:hanging="360"/>
+      </w:pPr>
+      <w:rPr>
+        <w:rFonts w:ascii="Wingdings" w:hAnsi="Wingdings" w:hint="default"/>
+        <w:sz w:val="20"/>
+      </w:rPr>
+    </w:lvl>
+    <w:lvl w:ilvl="4" w:tentative="1">
+      <w:start w:val="1"/>
+      <w:numFmt w:val="bullet"/>
+      <w:lvlText w:val=""/>
+      <w:lvlJc w:val="left"/>
+      <w:pPr>
+        <w:tabs>
+          <w:tab w:val="num" w:pos="3600"/>
+        </w:tabs>
+        <w:ind w:left="3600" w:hanging="360"/>
+      </w:pPr>
+      <w:rPr>
+        <w:rFonts w:ascii="Wingdings" w:hAnsi="Wingdings" w:hint="default"/>
+        <w:sz w:val="20"/>
+      </w:rPr>
+    </w:lvl>
+    <w:lvl w:ilvl="5" w:tentative="1">
+      <w:start w:val="1"/>
+      <w:numFmt w:val="bullet"/>
+      <w:lvlText w:val=""/>
+      <w:lvlJc w:val="left"/>
+      <w:pPr>
+        <w:tabs>
+          <w:tab w:val="num" w:pos="4320"/>
+        </w:tabs>
+        <w:ind w:left="4320" w:hanging="360"/>
+      </w:pPr>
+      <w:rPr>
+        <w:rFonts w:ascii="Wingdings" w:hAnsi="Wingdings" w:hint="default"/>
+        <w:sz w:val="20"/>
+      </w:rPr>
+    </w:lvl>
+    <w:lvl w:ilvl="6" w:tentative="1">
+      <w:start w:val="1"/>
+      <w:numFmt w:val="bullet"/>
+      <w:lvlText w:val=""/>
+      <w:lvlJc w:val="left"/>
+      <w:pPr>
+        <w:tabs>
+          <w:tab w:val="num" w:pos="5040"/>
+        </w:tabs>
+        <w:ind w:left="5040" w:hanging="360"/>
+      </w:pPr>
+      <w:rPr>
+        <w:rFonts w:ascii="Wingdings" w:hAnsi="Wingdings" w:hint="default"/>
+        <w:sz w:val="20"/>
+      </w:rPr>
+    </w:lvl>
+    <w:lvl w:ilvl="7" w:tentative="1">
+      <w:start w:val="1"/>
+      <w:numFmt w:val="bullet"/>
+      <w:lvlText w:val=""/>
+      <w:lvlJc w:val="left"/>
+      <w:pPr>
+        <w:tabs>
+          <w:tab w:val="num" w:pos="5760"/>
+        </w:tabs>
+        <w:ind w:left="5760" w:hanging="360"/>
+      </w:pPr>
+      <w:rPr>
+        <w:rFonts w:ascii="Wingdings" w:hAnsi="Wingdings" w:hint="default"/>
+        <w:sz w:val="20"/>
+      </w:rPr>
+    </w:lvl>
+    <w:lvl w:ilvl="8" w:tentative="1">
+      <w:start w:val="1"/>
+      <w:numFmt w:val="bullet"/>
+      <w:lvlText w:val=""/>
+      <w:lvlJc w:val="left"/>
+      <w:pPr>
+        <w:tabs>
+          <w:tab w:val="num" w:pos="6480"/>
+        </w:tabs>
+        <w:ind w:left="6480" w:hanging="360"/>
+      </w:pPr>
+      <w:rPr>
+        <w:rFonts w:ascii="Wingdings" w:hAnsi="Wingdings" w:hint="default"/>
+        <w:sz w:val="20"/>
+      </w:rPr>
+    </w:lvl>
+  </w:abstractNum>
+  <w:abstractNum w:abstractNumId="67" w15:restartNumberingAfterBreak="0">
     <w:nsid w:val="69DE2C87"/>
     <w:multiLevelType w:val="hybridMultilevel"/>
     <w:tmpl w:val="F530F20A"/>
@@ -11630,7 +12779,7 @@
       </w:rPr>
     </w:lvl>
   </w:abstractNum>
-  <w:abstractNum w:abstractNumId="65" w15:restartNumberingAfterBreak="0">
+  <w:abstractNum w:abstractNumId="68" w15:restartNumberingAfterBreak="0">
     <w:nsid w:val="69ED672D"/>
     <w:multiLevelType w:val="multilevel"/>
     <w:tmpl w:val="CC08E300"/>
@@ -11779,7 +12928,7 @@
       </w:rPr>
     </w:lvl>
   </w:abstractNum>
-  <w:abstractNum w:abstractNumId="66" w15:restartNumberingAfterBreak="0">
+  <w:abstractNum w:abstractNumId="69" w15:restartNumberingAfterBreak="0">
     <w:nsid w:val="6A063EFD"/>
     <w:multiLevelType w:val="hybridMultilevel"/>
     <w:tmpl w:val="48703FBA"/>
@@ -11892,7 +13041,7 @@
       </w:rPr>
     </w:lvl>
   </w:abstractNum>
-  <w:abstractNum w:abstractNumId="67" w15:restartNumberingAfterBreak="0">
+  <w:abstractNum w:abstractNumId="70" w15:restartNumberingAfterBreak="0">
     <w:nsid w:val="6A825ABE"/>
     <w:multiLevelType w:val="multilevel"/>
     <w:tmpl w:val="0CD6F30E"/>
@@ -12041,7 +13190,156 @@
       </w:rPr>
     </w:lvl>
   </w:abstractNum>
-  <w:abstractNum w:abstractNumId="68" w15:restartNumberingAfterBreak="0">
+  <w:abstractNum w:abstractNumId="71" w15:restartNumberingAfterBreak="0">
+    <w:nsid w:val="6B1D7832"/>
+    <w:multiLevelType w:val="multilevel"/>
+    <w:tmpl w:val="DD4646B2"/>
+    <w:lvl w:ilvl="0">
+      <w:start w:val="1"/>
+      <w:numFmt w:val="bullet"/>
+      <w:lvlText w:val=""/>
+      <w:lvlJc w:val="left"/>
+      <w:pPr>
+        <w:tabs>
+          <w:tab w:val="num" w:pos="720"/>
+        </w:tabs>
+        <w:ind w:left="720" w:hanging="360"/>
+      </w:pPr>
+      <w:rPr>
+        <w:rFonts w:ascii="Symbol" w:hAnsi="Symbol" w:hint="default"/>
+        <w:sz w:val="20"/>
+      </w:rPr>
+    </w:lvl>
+    <w:lvl w:ilvl="1" w:tentative="1">
+      <w:start w:val="1"/>
+      <w:numFmt w:val="bullet"/>
+      <w:lvlText w:val="o"/>
+      <w:lvlJc w:val="left"/>
+      <w:pPr>
+        <w:tabs>
+          <w:tab w:val="num" w:pos="1440"/>
+        </w:tabs>
+        <w:ind w:left="1440" w:hanging="360"/>
+      </w:pPr>
+      <w:rPr>
+        <w:rFonts w:ascii="Courier New" w:hAnsi="Courier New" w:hint="default"/>
+        <w:sz w:val="20"/>
+      </w:rPr>
+    </w:lvl>
+    <w:lvl w:ilvl="2" w:tentative="1">
+      <w:start w:val="1"/>
+      <w:numFmt w:val="bullet"/>
+      <w:lvlText w:val=""/>
+      <w:lvlJc w:val="left"/>
+      <w:pPr>
+        <w:tabs>
+          <w:tab w:val="num" w:pos="2160"/>
+        </w:tabs>
+        <w:ind w:left="2160" w:hanging="360"/>
+      </w:pPr>
+      <w:rPr>
+        <w:rFonts w:ascii="Wingdings" w:hAnsi="Wingdings" w:hint="default"/>
+        <w:sz w:val="20"/>
+      </w:rPr>
+    </w:lvl>
+    <w:lvl w:ilvl="3" w:tentative="1">
+      <w:start w:val="1"/>
+      <w:numFmt w:val="bullet"/>
+      <w:lvlText w:val=""/>
+      <w:lvlJc w:val="left"/>
+      <w:pPr>
+        <w:tabs>
+          <w:tab w:val="num" w:pos="2880"/>
+        </w:tabs>
+        <w:ind w:left="2880" w:hanging="360"/>
+      </w:pPr>
+      <w:rPr>
+        <w:rFonts w:ascii="Wingdings" w:hAnsi="Wingdings" w:hint="default"/>
+        <w:sz w:val="20"/>
+      </w:rPr>
+    </w:lvl>
+    <w:lvl w:ilvl="4" w:tentative="1">
+      <w:start w:val="1"/>
+      <w:numFmt w:val="bullet"/>
+      <w:lvlText w:val=""/>
+      <w:lvlJc w:val="left"/>
+      <w:pPr>
+        <w:tabs>
+          <w:tab w:val="num" w:pos="3600"/>
+        </w:tabs>
+        <w:ind w:left="3600" w:hanging="360"/>
+      </w:pPr>
+      <w:rPr>
+        <w:rFonts w:ascii="Wingdings" w:hAnsi="Wingdings" w:hint="default"/>
+        <w:sz w:val="20"/>
+      </w:rPr>
+    </w:lvl>
+    <w:lvl w:ilvl="5" w:tentative="1">
+      <w:start w:val="1"/>
+      <w:numFmt w:val="bullet"/>
+      <w:lvlText w:val=""/>
+      <w:lvlJc w:val="left"/>
+      <w:pPr>
+        <w:tabs>
+          <w:tab w:val="num" w:pos="4320"/>
+        </w:tabs>
+        <w:ind w:left="4320" w:hanging="360"/>
+      </w:pPr>
+      <w:rPr>
+        <w:rFonts w:ascii="Wingdings" w:hAnsi="Wingdings" w:hint="default"/>
+        <w:sz w:val="20"/>
+      </w:rPr>
+    </w:lvl>
+    <w:lvl w:ilvl="6" w:tentative="1">
+      <w:start w:val="1"/>
+      <w:numFmt w:val="bullet"/>
+      <w:lvlText w:val=""/>
+      <w:lvlJc w:val="left"/>
+      <w:pPr>
+        <w:tabs>
+          <w:tab w:val="num" w:pos="5040"/>
+        </w:tabs>
+        <w:ind w:left="5040" w:hanging="360"/>
+      </w:pPr>
+      <w:rPr>
+        <w:rFonts w:ascii="Wingdings" w:hAnsi="Wingdings" w:hint="default"/>
+        <w:sz w:val="20"/>
+      </w:rPr>
+    </w:lvl>
+    <w:lvl w:ilvl="7" w:tentative="1">
+      <w:start w:val="1"/>
+      <w:numFmt w:val="bullet"/>
+      <w:lvlText w:val=""/>
+      <w:lvlJc w:val="left"/>
+      <w:pPr>
+        <w:tabs>
+          <w:tab w:val="num" w:pos="5760"/>
+        </w:tabs>
+        <w:ind w:left="5760" w:hanging="360"/>
+      </w:pPr>
+      <w:rPr>
+        <w:rFonts w:ascii="Wingdings" w:hAnsi="Wingdings" w:hint="default"/>
+        <w:sz w:val="20"/>
+      </w:rPr>
+    </w:lvl>
+    <w:lvl w:ilvl="8" w:tentative="1">
+      <w:start w:val="1"/>
+      <w:numFmt w:val="bullet"/>
+      <w:lvlText w:val=""/>
+      <w:lvlJc w:val="left"/>
+      <w:pPr>
+        <w:tabs>
+          <w:tab w:val="num" w:pos="6480"/>
+        </w:tabs>
+        <w:ind w:left="6480" w:hanging="360"/>
+      </w:pPr>
+      <w:rPr>
+        <w:rFonts w:ascii="Wingdings" w:hAnsi="Wingdings" w:hint="default"/>
+        <w:sz w:val="20"/>
+      </w:rPr>
+    </w:lvl>
+  </w:abstractNum>
+  <w:abstractNum w:abstractNumId="72" w15:restartNumberingAfterBreak="0">
     <w:nsid w:val="6C6D6667"/>
     <w:multiLevelType w:val="hybridMultilevel"/>
     <w:tmpl w:val="A744709C"/>
@@ -12154,7 +13452,7 @@
       </w:rPr>
     </w:lvl>
   </w:abstractNum>
-  <w:abstractNum w:abstractNumId="69" w15:restartNumberingAfterBreak="0">
+  <w:abstractNum w:abstractNumId="73" w15:restartNumberingAfterBreak="0">
     <w:nsid w:val="6CAD7EA5"/>
     <w:multiLevelType w:val="multilevel"/>
     <w:tmpl w:val="C472C5B0"/>
@@ -12303,7 +13601,7 @@
       </w:rPr>
     </w:lvl>
   </w:abstractNum>
-  <w:abstractNum w:abstractNumId="70" w15:restartNumberingAfterBreak="0">
+  <w:abstractNum w:abstractNumId="74" w15:restartNumberingAfterBreak="0">
     <w:nsid w:val="6E43557B"/>
     <w:multiLevelType w:val="multilevel"/>
     <w:tmpl w:val="323C7112"/>
@@ -12452,7 +13750,7 @@
       </w:rPr>
     </w:lvl>
   </w:abstractNum>
-  <w:abstractNum w:abstractNumId="71" w15:restartNumberingAfterBreak="0">
+  <w:abstractNum w:abstractNumId="75" w15:restartNumberingAfterBreak="0">
     <w:nsid w:val="6EA27D0A"/>
     <w:multiLevelType w:val="multilevel"/>
     <w:tmpl w:val="7BF0256C"/>
@@ -12601,7 +13899,7 @@
       </w:rPr>
     </w:lvl>
   </w:abstractNum>
-  <w:abstractNum w:abstractNumId="72" w15:restartNumberingAfterBreak="0">
+  <w:abstractNum w:abstractNumId="76" w15:restartNumberingAfterBreak="0">
     <w:nsid w:val="70874300"/>
     <w:multiLevelType w:val="hybridMultilevel"/>
     <w:tmpl w:val="1B3A0518"/>
@@ -12714,7 +14012,7 @@
       </w:rPr>
     </w:lvl>
   </w:abstractNum>
-  <w:abstractNum w:abstractNumId="73" w15:restartNumberingAfterBreak="0">
+  <w:abstractNum w:abstractNumId="77" w15:restartNumberingAfterBreak="0">
     <w:nsid w:val="7090251B"/>
     <w:multiLevelType w:val="hybridMultilevel"/>
     <w:tmpl w:val="67687EFE"/>
@@ -12827,7 +14125,7 @@
       </w:rPr>
     </w:lvl>
   </w:abstractNum>
-  <w:abstractNum w:abstractNumId="74" w15:restartNumberingAfterBreak="0">
+  <w:abstractNum w:abstractNumId="78" w15:restartNumberingAfterBreak="0">
     <w:nsid w:val="75144C65"/>
     <w:multiLevelType w:val="hybridMultilevel"/>
     <w:tmpl w:val="12127FAA"/>
@@ -12940,7 +14238,7 @@
       </w:rPr>
     </w:lvl>
   </w:abstractNum>
-  <w:abstractNum w:abstractNumId="75" w15:restartNumberingAfterBreak="0">
+  <w:abstractNum w:abstractNumId="79" w15:restartNumberingAfterBreak="0">
     <w:nsid w:val="75237F84"/>
     <w:multiLevelType w:val="hybridMultilevel"/>
     <w:tmpl w:val="5F0A6EF2"/>
@@ -13053,7 +14351,7 @@
       </w:rPr>
     </w:lvl>
   </w:abstractNum>
-  <w:abstractNum w:abstractNumId="76" w15:restartNumberingAfterBreak="0">
+  <w:abstractNum w:abstractNumId="80" w15:restartNumberingAfterBreak="0">
     <w:nsid w:val="75FF09B0"/>
     <w:multiLevelType w:val="multilevel"/>
     <w:tmpl w:val="C34A7734"/>
@@ -13202,7 +14500,7 @@
       </w:rPr>
     </w:lvl>
   </w:abstractNum>
-  <w:abstractNum w:abstractNumId="77" w15:restartNumberingAfterBreak="0">
+  <w:abstractNum w:abstractNumId="81" w15:restartNumberingAfterBreak="0">
     <w:nsid w:val="77960362"/>
     <w:multiLevelType w:val="multilevel"/>
     <w:tmpl w:val="FEA0022E"/>
@@ -13351,7 +14649,7 @@
       </w:rPr>
     </w:lvl>
   </w:abstractNum>
-  <w:abstractNum w:abstractNumId="78" w15:restartNumberingAfterBreak="0">
+  <w:abstractNum w:abstractNumId="82" w15:restartNumberingAfterBreak="0">
     <w:nsid w:val="785A644F"/>
     <w:multiLevelType w:val="multilevel"/>
     <w:tmpl w:val="D1DC60FE"/>
@@ -13500,7 +14798,7 @@
       </w:rPr>
     </w:lvl>
   </w:abstractNum>
-  <w:abstractNum w:abstractNumId="79" w15:restartNumberingAfterBreak="0">
+  <w:abstractNum w:abstractNumId="83" w15:restartNumberingAfterBreak="0">
     <w:nsid w:val="7BFA03DF"/>
     <w:multiLevelType w:val="hybridMultilevel"/>
     <w:tmpl w:val="536A979E"/>
@@ -13613,7 +14911,7 @@
       </w:rPr>
     </w:lvl>
   </w:abstractNum>
-  <w:abstractNum w:abstractNumId="80" w15:restartNumberingAfterBreak="0">
+  <w:abstractNum w:abstractNumId="84" w15:restartNumberingAfterBreak="0">
     <w:nsid w:val="7CA524B4"/>
     <w:multiLevelType w:val="hybridMultilevel"/>
     <w:tmpl w:val="957C4F4A"/>
@@ -13726,7 +15024,7 @@
       </w:rPr>
     </w:lvl>
   </w:abstractNum>
-  <w:abstractNum w:abstractNumId="81" w15:restartNumberingAfterBreak="0">
+  <w:abstractNum w:abstractNumId="85" w15:restartNumberingAfterBreak="0">
     <w:nsid w:val="7EBD7710"/>
     <w:multiLevelType w:val="hybridMultilevel"/>
     <w:tmpl w:val="C8C6F7A0"/>
@@ -13840,37 +15138,37 @@
     </w:lvl>
   </w:abstractNum>
   <w:num w:numId="1" w16cid:durableId="425157302">
-    <w:abstractNumId w:val="34"/>
+    <w:abstractNumId w:val="35"/>
   </w:num>
   <w:num w:numId="2" w16cid:durableId="967664612">
-    <w:abstractNumId w:val="61"/>
+    <w:abstractNumId w:val="63"/>
   </w:num>
   <w:num w:numId="3" w16cid:durableId="361631616">
-    <w:abstractNumId w:val="43"/>
+    <w:abstractNumId w:val="45"/>
   </w:num>
   <w:num w:numId="4" w16cid:durableId="1409575397">
-    <w:abstractNumId w:val="52"/>
+    <w:abstractNumId w:val="54"/>
   </w:num>
   <w:num w:numId="5" w16cid:durableId="1647204897">
-    <w:abstractNumId w:val="80"/>
+    <w:abstractNumId w:val="84"/>
   </w:num>
   <w:num w:numId="6" w16cid:durableId="682589869">
     <w:abstractNumId w:val="15"/>
   </w:num>
   <w:num w:numId="7" w16cid:durableId="679703478">
-    <w:abstractNumId w:val="64"/>
+    <w:abstractNumId w:val="67"/>
   </w:num>
   <w:num w:numId="8" w16cid:durableId="496455128">
     <w:abstractNumId w:val="30"/>
   </w:num>
   <w:num w:numId="9" w16cid:durableId="1184633094">
-    <w:abstractNumId w:val="38"/>
+    <w:abstractNumId w:val="39"/>
   </w:num>
   <w:num w:numId="10" w16cid:durableId="71507387">
-    <w:abstractNumId w:val="41"/>
+    <w:abstractNumId w:val="43"/>
   </w:num>
   <w:num w:numId="11" w16cid:durableId="1412503779">
-    <w:abstractNumId w:val="66"/>
+    <w:abstractNumId w:val="69"/>
   </w:num>
   <w:num w:numId="12" w16cid:durableId="1107113995">
     <w:abstractNumId w:val="31"/>
@@ -13879,40 +15177,40 @@
     <w:abstractNumId w:val="16"/>
   </w:num>
   <w:num w:numId="14" w16cid:durableId="1529222885">
-    <w:abstractNumId w:val="79"/>
+    <w:abstractNumId w:val="83"/>
   </w:num>
   <w:num w:numId="15" w16cid:durableId="836580755">
     <w:abstractNumId w:val="10"/>
   </w:num>
   <w:num w:numId="16" w16cid:durableId="1344674502">
-    <w:abstractNumId w:val="55"/>
+    <w:abstractNumId w:val="57"/>
   </w:num>
   <w:num w:numId="17" w16cid:durableId="1320882603">
-    <w:abstractNumId w:val="72"/>
+    <w:abstractNumId w:val="76"/>
   </w:num>
   <w:num w:numId="18" w16cid:durableId="1139028372">
     <w:abstractNumId w:val="32"/>
   </w:num>
   <w:num w:numId="19" w16cid:durableId="1525635473">
-    <w:abstractNumId w:val="59"/>
+    <w:abstractNumId w:val="61"/>
   </w:num>
   <w:num w:numId="20" w16cid:durableId="609623515">
-    <w:abstractNumId w:val="81"/>
+    <w:abstractNumId w:val="85"/>
   </w:num>
   <w:num w:numId="21" w16cid:durableId="165170997">
-    <w:abstractNumId w:val="68"/>
+    <w:abstractNumId w:val="72"/>
   </w:num>
   <w:num w:numId="22" w16cid:durableId="1620525290">
     <w:abstractNumId w:val="20"/>
   </w:num>
   <w:num w:numId="23" w16cid:durableId="400753109">
-    <w:abstractNumId w:val="74"/>
+    <w:abstractNumId w:val="78"/>
   </w:num>
   <w:num w:numId="24" w16cid:durableId="193882219">
     <w:abstractNumId w:val="4"/>
   </w:num>
   <w:num w:numId="25" w16cid:durableId="311981628">
-    <w:abstractNumId w:val="35"/>
+    <w:abstractNumId w:val="36"/>
   </w:num>
   <w:num w:numId="26" w16cid:durableId="2009166045">
     <w:abstractNumId w:val="9"/>
@@ -13924,13 +15222,13 @@
     <w:abstractNumId w:val="11"/>
   </w:num>
   <w:num w:numId="29" w16cid:durableId="2124693280">
-    <w:abstractNumId w:val="63"/>
+    <w:abstractNumId w:val="65"/>
   </w:num>
   <w:num w:numId="30" w16cid:durableId="1367099744">
     <w:abstractNumId w:val="24"/>
   </w:num>
   <w:num w:numId="31" w16cid:durableId="2011105642">
-    <w:abstractNumId w:val="56"/>
+    <w:abstractNumId w:val="58"/>
   </w:num>
   <w:num w:numId="32" w16cid:durableId="831995364">
     <w:abstractNumId w:val="18"/>
@@ -13948,7 +15246,7 @@
     <w:abstractNumId w:val="2"/>
   </w:num>
   <w:num w:numId="37" w16cid:durableId="1849755457">
-    <w:abstractNumId w:val="75"/>
+    <w:abstractNumId w:val="79"/>
   </w:num>
   <w:num w:numId="38" w16cid:durableId="516505904">
     <w:abstractNumId w:val="8"/>
@@ -13957,85 +15255,85 @@
     <w:abstractNumId w:val="12"/>
   </w:num>
   <w:num w:numId="40" w16cid:durableId="905338697">
-    <w:abstractNumId w:val="45"/>
+    <w:abstractNumId w:val="47"/>
   </w:num>
   <w:num w:numId="41" w16cid:durableId="501896635">
     <w:abstractNumId w:val="33"/>
   </w:num>
   <w:num w:numId="42" w16cid:durableId="1953435156">
-    <w:abstractNumId w:val="46"/>
+    <w:abstractNumId w:val="48"/>
   </w:num>
   <w:num w:numId="43" w16cid:durableId="1060447452">
-    <w:abstractNumId w:val="54"/>
+    <w:abstractNumId w:val="56"/>
   </w:num>
   <w:num w:numId="44" w16cid:durableId="1772503672">
-    <w:abstractNumId w:val="39"/>
+    <w:abstractNumId w:val="41"/>
   </w:num>
   <w:num w:numId="45" w16cid:durableId="1650330222">
-    <w:abstractNumId w:val="44"/>
+    <w:abstractNumId w:val="46"/>
   </w:num>
   <w:num w:numId="46" w16cid:durableId="2102337934">
     <w:abstractNumId w:val="19"/>
   </w:num>
   <w:num w:numId="47" w16cid:durableId="68767822">
-    <w:abstractNumId w:val="67"/>
+    <w:abstractNumId w:val="70"/>
   </w:num>
   <w:num w:numId="48" w16cid:durableId="1992058265">
     <w:abstractNumId w:val="5"/>
   </w:num>
   <w:num w:numId="49" w16cid:durableId="788475134">
-    <w:abstractNumId w:val="78"/>
+    <w:abstractNumId w:val="82"/>
   </w:num>
   <w:num w:numId="50" w16cid:durableId="224419455">
-    <w:abstractNumId w:val="71"/>
+    <w:abstractNumId w:val="75"/>
   </w:num>
   <w:num w:numId="51" w16cid:durableId="1699575947">
-    <w:abstractNumId w:val="58"/>
+    <w:abstractNumId w:val="60"/>
   </w:num>
   <w:num w:numId="52" w16cid:durableId="1048916239">
+    <w:abstractNumId w:val="38"/>
+  </w:num>
+  <w:num w:numId="53" w16cid:durableId="1188711211">
+    <w:abstractNumId w:val="80"/>
+  </w:num>
+  <w:num w:numId="54" w16cid:durableId="447555614">
+    <w:abstractNumId w:val="62"/>
+  </w:num>
+  <w:num w:numId="55" w16cid:durableId="1679307268">
     <w:abstractNumId w:val="37"/>
   </w:num>
-  <w:num w:numId="53" w16cid:durableId="1188711211">
-    <w:abstractNumId w:val="76"/>
-  </w:num>
-  <w:num w:numId="54" w16cid:durableId="447555614">
-    <w:abstractNumId w:val="60"/>
-  </w:num>
-  <w:num w:numId="55" w16cid:durableId="1679307268">
-    <w:abstractNumId w:val="36"/>
-  </w:num>
   <w:num w:numId="56" w16cid:durableId="693773591">
-    <w:abstractNumId w:val="70"/>
+    <w:abstractNumId w:val="74"/>
   </w:num>
   <w:num w:numId="57" w16cid:durableId="1110473324">
     <w:abstractNumId w:val="25"/>
   </w:num>
   <w:num w:numId="58" w16cid:durableId="842937968">
-    <w:abstractNumId w:val="42"/>
+    <w:abstractNumId w:val="44"/>
   </w:num>
   <w:num w:numId="59" w16cid:durableId="821121315">
     <w:abstractNumId w:val="29"/>
   </w:num>
   <w:num w:numId="60" w16cid:durableId="2095394549">
-    <w:abstractNumId w:val="77"/>
+    <w:abstractNumId w:val="81"/>
   </w:num>
   <w:num w:numId="61" w16cid:durableId="1299921011">
     <w:abstractNumId w:val="28"/>
   </w:num>
   <w:num w:numId="62" w16cid:durableId="1927420240">
-    <w:abstractNumId w:val="48"/>
+    <w:abstractNumId w:val="50"/>
   </w:num>
   <w:num w:numId="63" w16cid:durableId="41290043">
-    <w:abstractNumId w:val="51"/>
+    <w:abstractNumId w:val="53"/>
   </w:num>
   <w:num w:numId="64" w16cid:durableId="999846909">
-    <w:abstractNumId w:val="40"/>
+    <w:abstractNumId w:val="42"/>
   </w:num>
   <w:num w:numId="65" w16cid:durableId="1250969563">
-    <w:abstractNumId w:val="47"/>
+    <w:abstractNumId w:val="49"/>
   </w:num>
   <w:num w:numId="66" w16cid:durableId="484011382">
-    <w:abstractNumId w:val="65"/>
+    <w:abstractNumId w:val="68"/>
   </w:num>
   <w:num w:numId="67" w16cid:durableId="2008289242">
     <w:abstractNumId w:val="7"/>
@@ -14044,13 +15342,13 @@
     <w:abstractNumId w:val="13"/>
   </w:num>
   <w:num w:numId="69" w16cid:durableId="1296839887">
-    <w:abstractNumId w:val="50"/>
+    <w:abstractNumId w:val="52"/>
   </w:num>
   <w:num w:numId="70" w16cid:durableId="336662050">
-    <w:abstractNumId w:val="57"/>
+    <w:abstractNumId w:val="59"/>
   </w:num>
   <w:num w:numId="71" w16cid:durableId="1460032333">
-    <w:abstractNumId w:val="69"/>
+    <w:abstractNumId w:val="73"/>
   </w:num>
   <w:num w:numId="72" w16cid:durableId="592400615">
     <w:abstractNumId w:val="6"/>
@@ -14068,13 +15366,13 @@
     <w:abstractNumId w:val="22"/>
   </w:num>
   <w:num w:numId="77" w16cid:durableId="763109604">
-    <w:abstractNumId w:val="53"/>
+    <w:abstractNumId w:val="55"/>
   </w:num>
   <w:num w:numId="78" w16cid:durableId="2138137265">
-    <w:abstractNumId w:val="62"/>
+    <w:abstractNumId w:val="64"/>
   </w:num>
   <w:num w:numId="79" w16cid:durableId="343675924">
-    <w:abstractNumId w:val="73"/>
+    <w:abstractNumId w:val="77"/>
   </w:num>
   <w:num w:numId="80" w16cid:durableId="1823277442">
     <w:abstractNumId w:val="27"/>
@@ -14083,7 +15381,19 @@
     <w:abstractNumId w:val="0"/>
   </w:num>
   <w:num w:numId="82" w16cid:durableId="1113326280">
-    <w:abstractNumId w:val="49"/>
+    <w:abstractNumId w:val="51"/>
+  </w:num>
+  <w:num w:numId="83" w16cid:durableId="1253051103">
+    <w:abstractNumId w:val="71"/>
+  </w:num>
+  <w:num w:numId="84" w16cid:durableId="444888444">
+    <w:abstractNumId w:val="34"/>
+  </w:num>
+  <w:num w:numId="85" w16cid:durableId="64299649">
+    <w:abstractNumId w:val="66"/>
+  </w:num>
+  <w:num w:numId="86" w16cid:durableId="868182992">
+    <w:abstractNumId w:val="40"/>
   </w:num>
   <w:numIdMacAtCleanup w:val="45"/>
 </w:numbering>

</xml_diff>

<commit_message>
Agency Verification Sequence Diagram (#235)
</commit_message>
<xml_diff>
--- a/Sequence Specification Document.docx
+++ b/Sequence Specification Document.docx
@@ -4055,11 +4055,635 @@
     </w:p>
     <w:p>
       <w:pPr>
+        <w:pStyle w:val="Heading3"/>
+        <w:numPr>
+          <w:ilvl w:val="0"/>
+          <w:numId w:val="74"/>
+        </w:numPr>
+        <w:rPr>
+          <w:rFonts w:eastAsiaTheme="minorHAnsi"/>
+        </w:rPr>
+      </w:pPr>
+      <w:r>
+        <w:br w:type="page"/>
+      </w:r>
+      <w:r>
+        <w:rPr>
+          <w:rFonts w:eastAsiaTheme="minorHAnsi"/>
+        </w:rPr>
+        <w:lastRenderedPageBreak/>
+        <w:t>Agency Verification Sequence Diagram Documentation</w:t>
+      </w:r>
+    </w:p>
+    <w:p>
+      <w:pPr>
         <w:spacing w:line="278" w:lineRule="auto"/>
+        <w:rPr>
+          <w:b/>
+          <w:bCs/>
+        </w:rPr>
+      </w:pPr>
+      <w:r>
+        <w:rPr>
+          <w:b/>
+          <w:bCs/>
+        </w:rPr>
+        <w:t>Purpose</w:t>
+      </w:r>
+    </w:p>
+    <w:p>
+      <w:pPr>
+        <w:spacing w:line="278" w:lineRule="auto"/>
+      </w:pPr>
+      <w:r>
+        <w:t>The Agency Verification Sequence Diagram shows the flow of actions among rental agencies, administrators, and system parts during the agency validation stage of the KriGo platform. This stage serves to allow only legitimate rental agencies to provide car rentals through the KriGo system.</w:t>
+      </w:r>
+    </w:p>
+    <w:p>
+      <w:pPr>
+        <w:spacing w:line="278" w:lineRule="auto"/>
+      </w:pPr>
+      <w:r>
+        <w:t>The sequence diagram represents the steps of submitting documents for verification, verifying the data provided in an application, review activities performed by the administrators, decision making, and the notification of the verification results.</w:t>
+      </w:r>
+    </w:p>
+    <w:p>
+      <w:pPr>
+        <w:spacing w:line="278" w:lineRule="auto"/>
+        <w:rPr>
+          <w:b/>
+          <w:bCs/>
+        </w:rPr>
+      </w:pPr>
+      <w:r>
+        <w:rPr>
+          <w:b/>
+          <w:bCs/>
+        </w:rPr>
+        <w:t>Participating Objects</w:t>
+      </w:r>
+    </w:p>
+    <w:p>
+      <w:pPr>
+        <w:spacing w:line="278" w:lineRule="auto"/>
+      </w:pPr>
+      <w:r>
+        <w:t>The sequence diagram includes the following participants:</w:t>
+      </w:r>
+    </w:p>
+    <w:p>
+      <w:pPr>
+        <w:numPr>
+          <w:ilvl w:val="0"/>
+          <w:numId w:val="89"/>
+        </w:numPr>
+        <w:spacing w:after="0" w:line="276" w:lineRule="auto"/>
+      </w:pPr>
+      <w:r>
+        <w:rPr>
+          <w:b/>
+          <w:bCs/>
+        </w:rPr>
+        <w:t>Rental Agency (Actor):</w:t>
+      </w:r>
+      <w:r>
+        <w:t xml:space="preserve"> Submits verification documents and receives the verification decision.</w:t>
+      </w:r>
+    </w:p>
+    <w:p>
+      <w:pPr>
+        <w:numPr>
+          <w:ilvl w:val="0"/>
+          <w:numId w:val="89"/>
+        </w:numPr>
+        <w:spacing w:after="0" w:line="276" w:lineRule="auto"/>
+      </w:pPr>
+      <w:r>
+        <w:rPr>
+          <w:b/>
+          <w:bCs/>
+        </w:rPr>
+        <w:t>Administrator (Actor):</w:t>
+      </w:r>
+      <w:r>
+        <w:t xml:space="preserve"> Reviews agency applications and approves or rejects verification requests.</w:t>
+      </w:r>
+    </w:p>
+    <w:p>
+      <w:pPr>
+        <w:numPr>
+          <w:ilvl w:val="0"/>
+          <w:numId w:val="89"/>
+        </w:numPr>
+        <w:spacing w:after="0" w:line="276" w:lineRule="auto"/>
+      </w:pPr>
+      <w:r>
+        <w:rPr>
+          <w:b/>
+          <w:bCs/>
+        </w:rPr>
+        <w:t>VerificationUI (Boundary):</w:t>
+      </w:r>
+      <w:r>
+        <w:t xml:space="preserve"> Provides the interface for submitting and reviewing verification requests.</w:t>
+      </w:r>
+    </w:p>
+    <w:p>
+      <w:pPr>
+        <w:numPr>
+          <w:ilvl w:val="0"/>
+          <w:numId w:val="89"/>
+        </w:numPr>
+        <w:spacing w:after="0" w:line="276" w:lineRule="auto"/>
+      </w:pPr>
+      <w:r>
+        <w:rPr>
+          <w:b/>
+          <w:bCs/>
+        </w:rPr>
+        <w:t>VerificationController (Control):</w:t>
+      </w:r>
+      <w:r>
+        <w:t xml:space="preserve"> Coordinates the verification workflow and business logic.</w:t>
+      </w:r>
+    </w:p>
+    <w:p>
+      <w:pPr>
+        <w:numPr>
+          <w:ilvl w:val="0"/>
+          <w:numId w:val="89"/>
+        </w:numPr>
+        <w:spacing w:after="0" w:line="276" w:lineRule="auto"/>
+      </w:pPr>
+      <w:r>
+        <w:rPr>
+          <w:b/>
+          <w:bCs/>
+        </w:rPr>
+        <w:t>ValidationService (Control):</w:t>
+      </w:r>
+      <w:r>
+        <w:t xml:space="preserve"> Validates submitted agency information and supporting documents.</w:t>
+      </w:r>
+    </w:p>
+    <w:p>
+      <w:pPr>
+        <w:numPr>
+          <w:ilvl w:val="0"/>
+          <w:numId w:val="89"/>
+        </w:numPr>
+        <w:spacing w:after="0" w:line="276" w:lineRule="auto"/>
+      </w:pPr>
+      <w:r>
+        <w:rPr>
+          <w:b/>
+          <w:bCs/>
+        </w:rPr>
+        <w:t>AgencyRepository (Entity):</w:t>
+      </w:r>
+      <w:r>
+        <w:t xml:space="preserve"> Stores and retrieves agency verification data.</w:t>
+      </w:r>
+    </w:p>
+    <w:p>
+      <w:pPr>
+        <w:numPr>
+          <w:ilvl w:val="0"/>
+          <w:numId w:val="89"/>
+        </w:numPr>
+        <w:spacing w:after="0" w:line="276" w:lineRule="auto"/>
+      </w:pPr>
+      <w:r>
+        <w:rPr>
+          <w:b/>
+          <w:bCs/>
+        </w:rPr>
+        <w:t>NotificationService (Control):</w:t>
+      </w:r>
+      <w:r>
+        <w:t xml:space="preserve"> Sends approval or rejection notifications to agencies.</w:t>
+      </w:r>
+    </w:p>
+    <w:p>
+      <w:pPr>
+        <w:numPr>
+          <w:ilvl w:val="0"/>
+          <w:numId w:val="89"/>
+        </w:numPr>
+        <w:spacing w:line="276" w:lineRule="auto"/>
+      </w:pPr>
+      <w:r>
+        <w:rPr>
+          <w:b/>
+          <w:bCs/>
+        </w:rPr>
+        <w:t>Database (Database):</w:t>
+      </w:r>
+      <w:r>
+        <w:t xml:space="preserve"> Stores agency applications and verification status.</w:t>
+      </w:r>
+    </w:p>
+    <w:p>
+      <w:pPr>
+        <w:spacing w:line="278" w:lineRule="auto"/>
+        <w:rPr>
+          <w:b/>
+          <w:bCs/>
+        </w:rPr>
+      </w:pPr>
+      <w:r>
+        <w:rPr>
+          <w:b/>
+          <w:bCs/>
+        </w:rPr>
+        <w:t>Agency Verification Process</w:t>
+      </w:r>
+    </w:p>
+    <w:p>
+      <w:pPr>
+        <w:spacing w:line="278" w:lineRule="auto"/>
+      </w:pPr>
+      <w:r>
+        <w:t>When a rental agency submits its registration and supporting documents, the verification process starts. The VerificationController uses the ValidationService to check whether enough information and documents have been provided.</w:t>
+      </w:r>
+    </w:p>
+    <w:p>
+      <w:pPr>
+        <w:spacing w:line="278" w:lineRule="auto"/>
+      </w:pPr>
+      <w:r>
+        <w:t>The database is updated via the AgencyRepository with the valid application. The system notifies that its verification request has been submitted successfully and waits for the review of the administration.</w:t>
+      </w:r>
+    </w:p>
+    <w:p>
+      <w:pPr>
+        <w:spacing w:line="278" w:lineRule="auto"/>
+      </w:pPr>
+      <w:r>
+        <w:t>Next, the system administrator takes the application from the queue, checks the received information and documents, and makes final decision about the agency's approval.</w:t>
+      </w:r>
+    </w:p>
+    <w:p>
+      <w:pPr>
+        <w:spacing w:line="278" w:lineRule="auto"/>
+      </w:pPr>
+      <w:r>
+        <w:t>If the decision is positive, the verification status of the agency is changed by the VerificationController. The NotificationService is prompted to notify the agency of its successful verification. In case of denial of the application, the system registers this fact and sends a message that explains that the verification request was refused.</w:t>
+      </w:r>
+    </w:p>
+    <w:p>
+      <w:pPr>
+        <w:spacing w:line="278" w:lineRule="auto"/>
       </w:pPr>
       <w:r>
         <w:br w:type="page"/>
       </w:r>
+    </w:p>
+    <w:p>
+      <w:pPr>
+        <w:spacing w:line="278" w:lineRule="auto"/>
+        <w:rPr>
+          <w:b/>
+          <w:bCs/>
+        </w:rPr>
+      </w:pPr>
+      <w:r>
+        <w:rPr>
+          <w:b/>
+          <w:bCs/>
+        </w:rPr>
+        <w:lastRenderedPageBreak/>
+        <w:t>Document Validation</w:t>
+      </w:r>
+    </w:p>
+    <w:p>
+      <w:pPr>
+        <w:spacing w:line="278" w:lineRule="auto"/>
+      </w:pPr>
+      <w:r>
+        <w:t>Prior to the submission of an application for administrative review, the ValidationService assesses the adequacy of the information provided and all documents provided in support of the application package. This includes the processes of checking required fields and ensuring that all documentation has been produced.</w:t>
+      </w:r>
+    </w:p>
+    <w:p>
+      <w:pPr>
+        <w:spacing w:line="278" w:lineRule="auto"/>
+      </w:pPr>
+      <w:r>
+        <w:t>In the case of validation failure, the relevant errors are communicated to the system allowing the agency to rectify the application.</w:t>
+      </w:r>
+    </w:p>
+    <w:p>
+      <w:pPr>
+        <w:spacing w:line="278" w:lineRule="auto"/>
+        <w:rPr>
+          <w:b/>
+          <w:bCs/>
+        </w:rPr>
+      </w:pPr>
+      <w:r>
+        <w:rPr>
+          <w:b/>
+          <w:bCs/>
+        </w:rPr>
+        <w:t>Alternative and Exceptional Flows</w:t>
+      </w:r>
+    </w:p>
+    <w:p>
+      <w:pPr>
+        <w:spacing w:line="278" w:lineRule="auto"/>
+      </w:pPr>
+      <w:r>
+        <w:t>The Agency Verification Sequence Diagram includes several alternative execution paths:</w:t>
+      </w:r>
+    </w:p>
+    <w:p>
+      <w:pPr>
+        <w:numPr>
+          <w:ilvl w:val="0"/>
+          <w:numId w:val="90"/>
+        </w:numPr>
+        <w:spacing w:after="0" w:line="276" w:lineRule="auto"/>
+      </w:pPr>
+      <w:r>
+        <w:t>Invalid or incomplete verification documents.</w:t>
+      </w:r>
+    </w:p>
+    <w:p>
+      <w:pPr>
+        <w:numPr>
+          <w:ilvl w:val="0"/>
+          <w:numId w:val="90"/>
+        </w:numPr>
+        <w:spacing w:after="0" w:line="276" w:lineRule="auto"/>
+      </w:pPr>
+      <w:r>
+        <w:t>Successful agency verification and approval.</w:t>
+      </w:r>
+    </w:p>
+    <w:p>
+      <w:pPr>
+        <w:numPr>
+          <w:ilvl w:val="0"/>
+          <w:numId w:val="90"/>
+        </w:numPr>
+        <w:spacing w:line="276" w:lineRule="auto"/>
+      </w:pPr>
+      <w:r>
+        <w:t>Agency verification rejection following administrative review.</w:t>
+      </w:r>
+    </w:p>
+    <w:p>
+      <w:pPr>
+        <w:spacing w:line="278" w:lineRule="auto"/>
+      </w:pPr>
+      <w:r>
+        <w:t>These alternative scenarios ensure that only valid applications are processed while maintaining the integrity of the agency verification process.</w:t>
+      </w:r>
+    </w:p>
+    <w:p>
+      <w:pPr>
+        <w:spacing w:line="278" w:lineRule="auto"/>
+        <w:rPr>
+          <w:b/>
+          <w:bCs/>
+        </w:rPr>
+      </w:pPr>
+      <w:r>
+        <w:rPr>
+          <w:b/>
+          <w:bCs/>
+        </w:rPr>
+        <w:br w:type="page"/>
+      </w:r>
+    </w:p>
+    <w:p>
+      <w:pPr>
+        <w:spacing w:line="278" w:lineRule="auto"/>
+        <w:rPr>
+          <w:b/>
+          <w:bCs/>
+        </w:rPr>
+      </w:pPr>
+      <w:r>
+        <w:rPr>
+          <w:b/>
+          <w:bCs/>
+        </w:rPr>
+        <w:lastRenderedPageBreak/>
+        <w:t>Conclusion</w:t>
+      </w:r>
+    </w:p>
+    <w:p>
+      <w:pPr>
+        <w:spacing w:line="278" w:lineRule="auto"/>
+      </w:pPr>
+      <w:r>
+        <w:rPr>
+          <w:noProof/>
+        </w:rPr>
+        <mc:AlternateContent>
+          <mc:Choice Requires="wps">
+            <w:drawing>
+              <wp:anchor distT="0" distB="0" distL="114300" distR="114300" simplePos="0" relativeHeight="251678720" behindDoc="0" locked="0" layoutInCell="1" allowOverlap="1" wp14:anchorId="69E437B7" wp14:editId="3F4CF148">
+                <wp:simplePos x="0" y="0"/>
+                <wp:positionH relativeFrom="column">
+                  <wp:posOffset>-2540</wp:posOffset>
+                </wp:positionH>
+                <wp:positionV relativeFrom="paragraph">
+                  <wp:posOffset>6992620</wp:posOffset>
+                </wp:positionV>
+                <wp:extent cx="5941695" cy="635"/>
+                <wp:effectExtent l="0" t="0" r="0" b="0"/>
+                <wp:wrapSquare wrapText="bothSides"/>
+                <wp:docPr id="1383153437" name="Text Box 1"/>
+                <wp:cNvGraphicFramePr/>
+                <a:graphic xmlns:a="http://schemas.openxmlformats.org/drawingml/2006/main">
+                  <a:graphicData uri="http://schemas.microsoft.com/office/word/2010/wordprocessingShape">
+                    <wps:wsp>
+                      <wps:cNvSpPr txBox="1"/>
+                      <wps:spPr>
+                        <a:xfrm>
+                          <a:off x="0" y="0"/>
+                          <a:ext cx="5941695" cy="635"/>
+                        </a:xfrm>
+                        <a:prstGeom prst="rect">
+                          <a:avLst/>
+                        </a:prstGeom>
+                        <a:solidFill>
+                          <a:prstClr val="white"/>
+                        </a:solidFill>
+                        <a:ln>
+                          <a:noFill/>
+                        </a:ln>
+                      </wps:spPr>
+                      <wps:txbx>
+                        <w:txbxContent>
+                          <w:p>
+                            <w:pPr>
+                              <w:pStyle w:val="Caption"/>
+                              <w:rPr>
+                                <w:noProof/>
+                              </w:rPr>
+                            </w:pPr>
+                            <w:r>
+                              <w:t xml:space="preserve">Figure </w:t>
+                            </w:r>
+                            <w:r>
+                              <w:fldChar w:fldCharType="begin"/>
+                            </w:r>
+                            <w:r>
+                              <w:instrText xml:space="preserve"> SEQ Figure \* ARABIC </w:instrText>
+                            </w:r>
+                            <w:r>
+                              <w:fldChar w:fldCharType="separate"/>
+                            </w:r>
+                            <w:r>
+                              <w:rPr>
+                                <w:noProof/>
+                              </w:rPr>
+                              <w:t>7</w:t>
+                            </w:r>
+                            <w:r>
+                              <w:fldChar w:fldCharType="end"/>
+                            </w:r>
+                            <w:r>
+                              <w:t xml:space="preserve"> - </w:t>
+                            </w:r>
+                            <w:r>
+                              <w:t>Agency Verification Sequence Diagram</w:t>
+                            </w:r>
+                          </w:p>
+                        </w:txbxContent>
+                      </wps:txbx>
+                      <wps:bodyPr rot="0" spcFirstLastPara="0" vertOverflow="overflow" horzOverflow="overflow" vert="horz" wrap="square" lIns="0" tIns="0" rIns="0" bIns="0" numCol="1" spcCol="0" rtlCol="0" fromWordArt="0" anchor="t" anchorCtr="0" forceAA="0" compatLnSpc="1">
+                        <a:prstTxWarp prst="textNoShape">
+                          <a:avLst/>
+                        </a:prstTxWarp>
+                        <a:spAutoFit/>
+                      </wps:bodyPr>
+                    </wps:wsp>
+                  </a:graphicData>
+                </a:graphic>
+              </wp:anchor>
+            </w:drawing>
+          </mc:Choice>
+          <mc:Fallback>
+            <w:pict>
+              <v:shape w14:anchorId="69E437B7" id="_x0000_s1031" type="#_x0000_t202" style="position:absolute;margin-left:-.2pt;margin-top:550.6pt;width:467.85pt;height:.05pt;z-index:251678720;visibility:visible;mso-wrap-style:square;mso-wrap-distance-left:9pt;mso-wrap-distance-top:0;mso-wrap-distance-right:9pt;mso-wrap-distance-bottom:0;mso-position-horizontal:absolute;mso-position-horizontal-relative:text;mso-position-vertical:absolute;mso-position-vertical-relative:text;v-text-anchor:top" o:gfxdata="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" stroked="f">
+                <v:textbox style="mso-fit-shape-to-text:t" inset="0,0,0,0">
+                  <w:txbxContent>
+                    <w:p>
+                      <w:pPr>
+                        <w:pStyle w:val="Caption"/>
+                        <w:rPr>
+                          <w:noProof/>
+                        </w:rPr>
+                      </w:pPr>
+                      <w:r>
+                        <w:t xml:space="preserve">Figure </w:t>
+                      </w:r>
+                      <w:r>
+                        <w:fldChar w:fldCharType="begin"/>
+                      </w:r>
+                      <w:r>
+                        <w:instrText xml:space="preserve"> SEQ Figure \* ARABIC </w:instrText>
+                      </w:r>
+                      <w:r>
+                        <w:fldChar w:fldCharType="separate"/>
+                      </w:r>
+                      <w:r>
+                        <w:rPr>
+                          <w:noProof/>
+                        </w:rPr>
+                        <w:t>7</w:t>
+                      </w:r>
+                      <w:r>
+                        <w:fldChar w:fldCharType="end"/>
+                      </w:r>
+                      <w:r>
+                        <w:t xml:space="preserve"> - </w:t>
+                      </w:r>
+                      <w:r>
+                        <w:t>Agency Verification Sequence Diagram</w:t>
+                      </w:r>
+                    </w:p>
+                  </w:txbxContent>
+                </v:textbox>
+                <w10:wrap type="square"/>
+              </v:shape>
+            </w:pict>
+          </mc:Fallback>
+        </mc:AlternateContent>
+      </w:r>
+      <w:r>
+        <w:rPr>
+          <w:noProof/>
+        </w:rPr>
+        <w:drawing>
+          <wp:anchor distT="0" distB="0" distL="114300" distR="114300" simplePos="0" relativeHeight="251676672" behindDoc="0" locked="0" layoutInCell="1" allowOverlap="1" wp14:anchorId="6D625AC7" wp14:editId="12B39506">
+            <wp:simplePos x="0" y="0"/>
+            <wp:positionH relativeFrom="column">
+              <wp:posOffset>-2540</wp:posOffset>
+            </wp:positionH>
+            <wp:positionV relativeFrom="paragraph">
+              <wp:posOffset>1237615</wp:posOffset>
+            </wp:positionV>
+            <wp:extent cx="5941695" cy="5697855"/>
+            <wp:effectExtent l="0" t="0" r="1905" b="0"/>
+            <wp:wrapSquare wrapText="bothSides"/>
+            <wp:docPr id="1501973708" name="Picture 7"/>
+            <wp:cNvGraphicFramePr>
+              <a:graphicFrameLocks xmlns:a="http://schemas.openxmlformats.org/drawingml/2006/main" noChangeAspect="1"/>
+            </wp:cNvGraphicFramePr>
+            <a:graphic xmlns:a="http://schemas.openxmlformats.org/drawingml/2006/main">
+              <a:graphicData uri="http://schemas.openxmlformats.org/drawingml/2006/picture">
+                <pic:pic xmlns:pic="http://schemas.openxmlformats.org/drawingml/2006/picture">
+                  <pic:nvPicPr>
+                    <pic:cNvPr id="0" name="Picture 9"/>
+                    <pic:cNvPicPr>
+                      <a:picLocks noChangeAspect="1" noChangeArrowheads="1"/>
+                    </pic:cNvPicPr>
+                  </pic:nvPicPr>
+                  <pic:blipFill>
+                    <a:blip r:embed="rId14" cstate="print">
+                      <a:extLst>
+                        <a:ext uri="{28A0092B-C50C-407E-A947-70E740481C1C}">
+                          <a14:useLocalDpi xmlns:a14="http://schemas.microsoft.com/office/drawing/2010/main" val="0"/>
+                        </a:ext>
+                      </a:extLst>
+                    </a:blip>
+                    <a:srcRect/>
+                    <a:stretch>
+                      <a:fillRect/>
+                    </a:stretch>
+                  </pic:blipFill>
+                  <pic:spPr bwMode="auto">
+                    <a:xfrm>
+                      <a:off x="0" y="0"/>
+                      <a:ext cx="5941695" cy="5697855"/>
+                    </a:xfrm>
+                    <a:prstGeom prst="rect">
+                      <a:avLst/>
+                    </a:prstGeom>
+                    <a:noFill/>
+                    <a:ln>
+                      <a:noFill/>
+                    </a:ln>
+                  </pic:spPr>
+                </pic:pic>
+              </a:graphicData>
+            </a:graphic>
+          </wp:anchor>
+        </w:drawing>
+      </w:r>
+      <w:r>
+        <w:t>The Agency Verification Sequence Diagram encompasses a detailed view of the process of agency verification in KriGo. Timely indication of the role of each layer of the system architecture that assists in the process of agency verification on KriGo. The sequence diagram indicates the stages involved in certain interactions that take place between the presentation layer, business logic layer, validation services, and the notification service.</w:t>
+      </w:r>
+    </w:p>
+    <w:p>
+      <w:pPr>
+        <w:spacing w:line="278" w:lineRule="auto"/>
+      </w:pPr>
     </w:p>
     <w:sectPr>
       <w:pgSz w:w="11906" w:h="16838" w:code="9"/>
@@ -5172,6 +5796,155 @@
     </w:lvl>
   </w:abstractNum>
   <w:abstractNum w:abstractNumId="8" w15:restartNumberingAfterBreak="0">
+    <w:nsid w:val="0E1040E2"/>
+    <w:multiLevelType w:val="multilevel"/>
+    <w:tmpl w:val="607CCC88"/>
+    <w:lvl w:ilvl="0">
+      <w:start w:val="1"/>
+      <w:numFmt w:val="bullet"/>
+      <w:lvlText w:val=""/>
+      <w:lvlJc w:val="left"/>
+      <w:pPr>
+        <w:tabs>
+          <w:tab w:val="num" w:pos="720"/>
+        </w:tabs>
+        <w:ind w:left="720" w:hanging="360"/>
+      </w:pPr>
+      <w:rPr>
+        <w:rFonts w:ascii="Wingdings" w:hAnsi="Wingdings" w:hint="default"/>
+        <w:sz w:val="20"/>
+      </w:rPr>
+    </w:lvl>
+    <w:lvl w:ilvl="1" w:tentative="1">
+      <w:start w:val="1"/>
+      <w:numFmt w:val="bullet"/>
+      <w:lvlText w:val="o"/>
+      <w:lvlJc w:val="left"/>
+      <w:pPr>
+        <w:tabs>
+          <w:tab w:val="num" w:pos="1440"/>
+        </w:tabs>
+        <w:ind w:left="1440" w:hanging="360"/>
+      </w:pPr>
+      <w:rPr>
+        <w:rFonts w:ascii="Courier New" w:hAnsi="Courier New" w:hint="default"/>
+        <w:sz w:val="20"/>
+      </w:rPr>
+    </w:lvl>
+    <w:lvl w:ilvl="2" w:tentative="1">
+      <w:start w:val="1"/>
+      <w:numFmt w:val="bullet"/>
+      <w:lvlText w:val=""/>
+      <w:lvlJc w:val="left"/>
+      <w:pPr>
+        <w:tabs>
+          <w:tab w:val="num" w:pos="2160"/>
+        </w:tabs>
+        <w:ind w:left="2160" w:hanging="360"/>
+      </w:pPr>
+      <w:rPr>
+        <w:rFonts w:ascii="Wingdings" w:hAnsi="Wingdings" w:hint="default"/>
+        <w:sz w:val="20"/>
+      </w:rPr>
+    </w:lvl>
+    <w:lvl w:ilvl="3" w:tentative="1">
+      <w:start w:val="1"/>
+      <w:numFmt w:val="bullet"/>
+      <w:lvlText w:val=""/>
+      <w:lvlJc w:val="left"/>
+      <w:pPr>
+        <w:tabs>
+          <w:tab w:val="num" w:pos="2880"/>
+        </w:tabs>
+        <w:ind w:left="2880" w:hanging="360"/>
+      </w:pPr>
+      <w:rPr>
+        <w:rFonts w:ascii="Wingdings" w:hAnsi="Wingdings" w:hint="default"/>
+        <w:sz w:val="20"/>
+      </w:rPr>
+    </w:lvl>
+    <w:lvl w:ilvl="4" w:tentative="1">
+      <w:start w:val="1"/>
+      <w:numFmt w:val="bullet"/>
+      <w:lvlText w:val=""/>
+      <w:lvlJc w:val="left"/>
+      <w:pPr>
+        <w:tabs>
+          <w:tab w:val="num" w:pos="3600"/>
+        </w:tabs>
+        <w:ind w:left="3600" w:hanging="360"/>
+      </w:pPr>
+      <w:rPr>
+        <w:rFonts w:ascii="Wingdings" w:hAnsi="Wingdings" w:hint="default"/>
+        <w:sz w:val="20"/>
+      </w:rPr>
+    </w:lvl>
+    <w:lvl w:ilvl="5" w:tentative="1">
+      <w:start w:val="1"/>
+      <w:numFmt w:val="bullet"/>
+      <w:lvlText w:val=""/>
+      <w:lvlJc w:val="left"/>
+      <w:pPr>
+        <w:tabs>
+          <w:tab w:val="num" w:pos="4320"/>
+        </w:tabs>
+        <w:ind w:left="4320" w:hanging="360"/>
+      </w:pPr>
+      <w:rPr>
+        <w:rFonts w:ascii="Wingdings" w:hAnsi="Wingdings" w:hint="default"/>
+        <w:sz w:val="20"/>
+      </w:rPr>
+    </w:lvl>
+    <w:lvl w:ilvl="6" w:tentative="1">
+      <w:start w:val="1"/>
+      <w:numFmt w:val="bullet"/>
+      <w:lvlText w:val=""/>
+      <w:lvlJc w:val="left"/>
+      <w:pPr>
+        <w:tabs>
+          <w:tab w:val="num" w:pos="5040"/>
+        </w:tabs>
+        <w:ind w:left="5040" w:hanging="360"/>
+      </w:pPr>
+      <w:rPr>
+        <w:rFonts w:ascii="Wingdings" w:hAnsi="Wingdings" w:hint="default"/>
+        <w:sz w:val="20"/>
+      </w:rPr>
+    </w:lvl>
+    <w:lvl w:ilvl="7" w:tentative="1">
+      <w:start w:val="1"/>
+      <w:numFmt w:val="bullet"/>
+      <w:lvlText w:val=""/>
+      <w:lvlJc w:val="left"/>
+      <w:pPr>
+        <w:tabs>
+          <w:tab w:val="num" w:pos="5760"/>
+        </w:tabs>
+        <w:ind w:left="5760" w:hanging="360"/>
+      </w:pPr>
+      <w:rPr>
+        <w:rFonts w:ascii="Wingdings" w:hAnsi="Wingdings" w:hint="default"/>
+        <w:sz w:val="20"/>
+      </w:rPr>
+    </w:lvl>
+    <w:lvl w:ilvl="8" w:tentative="1">
+      <w:start w:val="1"/>
+      <w:numFmt w:val="bullet"/>
+      <w:lvlText w:val=""/>
+      <w:lvlJc w:val="left"/>
+      <w:pPr>
+        <w:tabs>
+          <w:tab w:val="num" w:pos="6480"/>
+        </w:tabs>
+        <w:ind w:left="6480" w:hanging="360"/>
+      </w:pPr>
+      <w:rPr>
+        <w:rFonts w:ascii="Wingdings" w:hAnsi="Wingdings" w:hint="default"/>
+        <w:sz w:val="20"/>
+      </w:rPr>
+    </w:lvl>
+  </w:abstractNum>
+  <w:abstractNum w:abstractNumId="9" w15:restartNumberingAfterBreak="0">
     <w:nsid w:val="0E2561E7"/>
     <w:multiLevelType w:val="hybridMultilevel"/>
     <w:tmpl w:val="2A6E4870"/>
@@ -5284,7 +6057,7 @@
       </w:rPr>
     </w:lvl>
   </w:abstractNum>
-  <w:abstractNum w:abstractNumId="9" w15:restartNumberingAfterBreak="0">
+  <w:abstractNum w:abstractNumId="10" w15:restartNumberingAfterBreak="0">
     <w:nsid w:val="0E841C27"/>
     <w:multiLevelType w:val="hybridMultilevel"/>
     <w:tmpl w:val="789C7F32"/>
@@ -5397,7 +6170,7 @@
       </w:rPr>
     </w:lvl>
   </w:abstractNum>
-  <w:abstractNum w:abstractNumId="10" w15:restartNumberingAfterBreak="0">
+  <w:abstractNum w:abstractNumId="11" w15:restartNumberingAfterBreak="0">
     <w:nsid w:val="0FAA2602"/>
     <w:multiLevelType w:val="hybridMultilevel"/>
     <w:tmpl w:val="C6C63128"/>
@@ -5510,7 +6283,7 @@
       </w:rPr>
     </w:lvl>
   </w:abstractNum>
-  <w:abstractNum w:abstractNumId="11" w15:restartNumberingAfterBreak="0">
+  <w:abstractNum w:abstractNumId="12" w15:restartNumberingAfterBreak="0">
     <w:nsid w:val="122550ED"/>
     <w:multiLevelType w:val="hybridMultilevel"/>
     <w:tmpl w:val="91ACE480"/>
@@ -5623,7 +6396,7 @@
       </w:rPr>
     </w:lvl>
   </w:abstractNum>
-  <w:abstractNum w:abstractNumId="12" w15:restartNumberingAfterBreak="0">
+  <w:abstractNum w:abstractNumId="13" w15:restartNumberingAfterBreak="0">
     <w:nsid w:val="124C1BAE"/>
     <w:multiLevelType w:val="hybridMultilevel"/>
     <w:tmpl w:val="04988FC0"/>
@@ -5736,7 +6509,7 @@
       </w:rPr>
     </w:lvl>
   </w:abstractNum>
-  <w:abstractNum w:abstractNumId="13" w15:restartNumberingAfterBreak="0">
+  <w:abstractNum w:abstractNumId="14" w15:restartNumberingAfterBreak="0">
     <w:nsid w:val="139F7557"/>
     <w:multiLevelType w:val="multilevel"/>
     <w:tmpl w:val="A984C1D4"/>
@@ -5885,7 +6658,7 @@
       </w:rPr>
     </w:lvl>
   </w:abstractNum>
-  <w:abstractNum w:abstractNumId="14" w15:restartNumberingAfterBreak="0">
+  <w:abstractNum w:abstractNumId="15" w15:restartNumberingAfterBreak="0">
     <w:nsid w:val="16D400B4"/>
     <w:multiLevelType w:val="hybridMultilevel"/>
     <w:tmpl w:val="58E6DFBE"/>
@@ -5998,7 +6771,7 @@
       </w:rPr>
     </w:lvl>
   </w:abstractNum>
-  <w:abstractNum w:abstractNumId="15" w15:restartNumberingAfterBreak="0">
+  <w:abstractNum w:abstractNumId="16" w15:restartNumberingAfterBreak="0">
     <w:nsid w:val="17236012"/>
     <w:multiLevelType w:val="hybridMultilevel"/>
     <w:tmpl w:val="DAFA46C8"/>
@@ -6111,7 +6884,7 @@
       </w:rPr>
     </w:lvl>
   </w:abstractNum>
-  <w:abstractNum w:abstractNumId="16" w15:restartNumberingAfterBreak="0">
+  <w:abstractNum w:abstractNumId="17" w15:restartNumberingAfterBreak="0">
     <w:nsid w:val="172B04C0"/>
     <w:multiLevelType w:val="hybridMultilevel"/>
     <w:tmpl w:val="B6C41D5E"/>
@@ -6224,7 +6997,156 @@
       </w:rPr>
     </w:lvl>
   </w:abstractNum>
-  <w:abstractNum w:abstractNumId="17" w15:restartNumberingAfterBreak="0">
+  <w:abstractNum w:abstractNumId="18" w15:restartNumberingAfterBreak="0">
+    <w:nsid w:val="17485CCB"/>
+    <w:multiLevelType w:val="multilevel"/>
+    <w:tmpl w:val="397E1AE0"/>
+    <w:lvl w:ilvl="0">
+      <w:start w:val="1"/>
+      <w:numFmt w:val="bullet"/>
+      <w:lvlText w:val=""/>
+      <w:lvlJc w:val="left"/>
+      <w:pPr>
+        <w:tabs>
+          <w:tab w:val="num" w:pos="720"/>
+        </w:tabs>
+        <w:ind w:left="720" w:hanging="360"/>
+      </w:pPr>
+      <w:rPr>
+        <w:rFonts w:ascii="Symbol" w:hAnsi="Symbol" w:hint="default"/>
+        <w:sz w:val="20"/>
+      </w:rPr>
+    </w:lvl>
+    <w:lvl w:ilvl="1" w:tentative="1">
+      <w:start w:val="1"/>
+      <w:numFmt w:val="bullet"/>
+      <w:lvlText w:val="o"/>
+      <w:lvlJc w:val="left"/>
+      <w:pPr>
+        <w:tabs>
+          <w:tab w:val="num" w:pos="1440"/>
+        </w:tabs>
+        <w:ind w:left="1440" w:hanging="360"/>
+      </w:pPr>
+      <w:rPr>
+        <w:rFonts w:ascii="Courier New" w:hAnsi="Courier New" w:hint="default"/>
+        <w:sz w:val="20"/>
+      </w:rPr>
+    </w:lvl>
+    <w:lvl w:ilvl="2" w:tentative="1">
+      <w:start w:val="1"/>
+      <w:numFmt w:val="bullet"/>
+      <w:lvlText w:val=""/>
+      <w:lvlJc w:val="left"/>
+      <w:pPr>
+        <w:tabs>
+          <w:tab w:val="num" w:pos="2160"/>
+        </w:tabs>
+        <w:ind w:left="2160" w:hanging="360"/>
+      </w:pPr>
+      <w:rPr>
+        <w:rFonts w:ascii="Wingdings" w:hAnsi="Wingdings" w:hint="default"/>
+        <w:sz w:val="20"/>
+      </w:rPr>
+    </w:lvl>
+    <w:lvl w:ilvl="3" w:tentative="1">
+      <w:start w:val="1"/>
+      <w:numFmt w:val="bullet"/>
+      <w:lvlText w:val=""/>
+      <w:lvlJc w:val="left"/>
+      <w:pPr>
+        <w:tabs>
+          <w:tab w:val="num" w:pos="2880"/>
+        </w:tabs>
+        <w:ind w:left="2880" w:hanging="360"/>
+      </w:pPr>
+      <w:rPr>
+        <w:rFonts w:ascii="Wingdings" w:hAnsi="Wingdings" w:hint="default"/>
+        <w:sz w:val="20"/>
+      </w:rPr>
+    </w:lvl>
+    <w:lvl w:ilvl="4" w:tentative="1">
+      <w:start w:val="1"/>
+      <w:numFmt w:val="bullet"/>
+      <w:lvlText w:val=""/>
+      <w:lvlJc w:val="left"/>
+      <w:pPr>
+        <w:tabs>
+          <w:tab w:val="num" w:pos="3600"/>
+        </w:tabs>
+        <w:ind w:left="3600" w:hanging="360"/>
+      </w:pPr>
+      <w:rPr>
+        <w:rFonts w:ascii="Wingdings" w:hAnsi="Wingdings" w:hint="default"/>
+        <w:sz w:val="20"/>
+      </w:rPr>
+    </w:lvl>
+    <w:lvl w:ilvl="5" w:tentative="1">
+      <w:start w:val="1"/>
+      <w:numFmt w:val="bullet"/>
+      <w:lvlText w:val=""/>
+      <w:lvlJc w:val="left"/>
+      <w:pPr>
+        <w:tabs>
+          <w:tab w:val="num" w:pos="4320"/>
+        </w:tabs>
+        <w:ind w:left="4320" w:hanging="360"/>
+      </w:pPr>
+      <w:rPr>
+        <w:rFonts w:ascii="Wingdings" w:hAnsi="Wingdings" w:hint="default"/>
+        <w:sz w:val="20"/>
+      </w:rPr>
+    </w:lvl>
+    <w:lvl w:ilvl="6" w:tentative="1">
+      <w:start w:val="1"/>
+      <w:numFmt w:val="bullet"/>
+      <w:lvlText w:val=""/>
+      <w:lvlJc w:val="left"/>
+      <w:pPr>
+        <w:tabs>
+          <w:tab w:val="num" w:pos="5040"/>
+        </w:tabs>
+        <w:ind w:left="5040" w:hanging="360"/>
+      </w:pPr>
+      <w:rPr>
+        <w:rFonts w:ascii="Wingdings" w:hAnsi="Wingdings" w:hint="default"/>
+        <w:sz w:val="20"/>
+      </w:rPr>
+    </w:lvl>
+    <w:lvl w:ilvl="7" w:tentative="1">
+      <w:start w:val="1"/>
+      <w:numFmt w:val="bullet"/>
+      <w:lvlText w:val=""/>
+      <w:lvlJc w:val="left"/>
+      <w:pPr>
+        <w:tabs>
+          <w:tab w:val="num" w:pos="5760"/>
+        </w:tabs>
+        <w:ind w:left="5760" w:hanging="360"/>
+      </w:pPr>
+      <w:rPr>
+        <w:rFonts w:ascii="Wingdings" w:hAnsi="Wingdings" w:hint="default"/>
+        <w:sz w:val="20"/>
+      </w:rPr>
+    </w:lvl>
+    <w:lvl w:ilvl="8" w:tentative="1">
+      <w:start w:val="1"/>
+      <w:numFmt w:val="bullet"/>
+      <w:lvlText w:val=""/>
+      <w:lvlJc w:val="left"/>
+      <w:pPr>
+        <w:tabs>
+          <w:tab w:val="num" w:pos="6480"/>
+        </w:tabs>
+        <w:ind w:left="6480" w:hanging="360"/>
+      </w:pPr>
+      <w:rPr>
+        <w:rFonts w:ascii="Wingdings" w:hAnsi="Wingdings" w:hint="default"/>
+        <w:sz w:val="20"/>
+      </w:rPr>
+    </w:lvl>
+  </w:abstractNum>
+  <w:abstractNum w:abstractNumId="19" w15:restartNumberingAfterBreak="0">
     <w:nsid w:val="17763D31"/>
     <w:multiLevelType w:val="hybridMultilevel"/>
     <w:tmpl w:val="6CE63304"/>
@@ -6337,7 +7259,7 @@
       </w:rPr>
     </w:lvl>
   </w:abstractNum>
-  <w:abstractNum w:abstractNumId="18" w15:restartNumberingAfterBreak="0">
+  <w:abstractNum w:abstractNumId="20" w15:restartNumberingAfterBreak="0">
     <w:nsid w:val="17B06937"/>
     <w:multiLevelType w:val="hybridMultilevel"/>
     <w:tmpl w:val="71089CF2"/>
@@ -6450,7 +7372,7 @@
       </w:rPr>
     </w:lvl>
   </w:abstractNum>
-  <w:abstractNum w:abstractNumId="19" w15:restartNumberingAfterBreak="0">
+  <w:abstractNum w:abstractNumId="21" w15:restartNumberingAfterBreak="0">
     <w:nsid w:val="195875B0"/>
     <w:multiLevelType w:val="multilevel"/>
     <w:tmpl w:val="615444D4"/>
@@ -6563,7 +7485,7 @@
       </w:pPr>
     </w:lvl>
   </w:abstractNum>
-  <w:abstractNum w:abstractNumId="20" w15:restartNumberingAfterBreak="0">
+  <w:abstractNum w:abstractNumId="22" w15:restartNumberingAfterBreak="0">
     <w:nsid w:val="197C6FD7"/>
     <w:multiLevelType w:val="hybridMultilevel"/>
     <w:tmpl w:val="D97CEAA8"/>
@@ -6676,7 +7598,7 @@
       </w:rPr>
     </w:lvl>
   </w:abstractNum>
-  <w:abstractNum w:abstractNumId="21" w15:restartNumberingAfterBreak="0">
+  <w:abstractNum w:abstractNumId="23" w15:restartNumberingAfterBreak="0">
     <w:nsid w:val="1CC60A94"/>
     <w:multiLevelType w:val="multilevel"/>
     <w:tmpl w:val="EB74741C"/>
@@ -6825,7 +7747,7 @@
       </w:rPr>
     </w:lvl>
   </w:abstractNum>
-  <w:abstractNum w:abstractNumId="22" w15:restartNumberingAfterBreak="0">
+  <w:abstractNum w:abstractNumId="24" w15:restartNumberingAfterBreak="0">
     <w:nsid w:val="1E6658CF"/>
     <w:multiLevelType w:val="multilevel"/>
     <w:tmpl w:val="762ABC5E"/>
@@ -6974,7 +7896,7 @@
       </w:rPr>
     </w:lvl>
   </w:abstractNum>
-  <w:abstractNum w:abstractNumId="23" w15:restartNumberingAfterBreak="0">
+  <w:abstractNum w:abstractNumId="25" w15:restartNumberingAfterBreak="0">
     <w:nsid w:val="215C77FD"/>
     <w:multiLevelType w:val="hybridMultilevel"/>
     <w:tmpl w:val="58F41D10"/>
@@ -7063,7 +7985,7 @@
       </w:pPr>
     </w:lvl>
   </w:abstractNum>
-  <w:abstractNum w:abstractNumId="24" w15:restartNumberingAfterBreak="0">
+  <w:abstractNum w:abstractNumId="26" w15:restartNumberingAfterBreak="0">
     <w:nsid w:val="218D5909"/>
     <w:multiLevelType w:val="hybridMultilevel"/>
     <w:tmpl w:val="CC989EE4"/>
@@ -7176,7 +8098,156 @@
       </w:rPr>
     </w:lvl>
   </w:abstractNum>
-  <w:abstractNum w:abstractNumId="25" w15:restartNumberingAfterBreak="0">
+  <w:abstractNum w:abstractNumId="27" w15:restartNumberingAfterBreak="0">
+    <w:nsid w:val="23E010BA"/>
+    <w:multiLevelType w:val="multilevel"/>
+    <w:tmpl w:val="4A16907E"/>
+    <w:lvl w:ilvl="0">
+      <w:start w:val="1"/>
+      <w:numFmt w:val="bullet"/>
+      <w:lvlText w:val=""/>
+      <w:lvlJc w:val="left"/>
+      <w:pPr>
+        <w:tabs>
+          <w:tab w:val="num" w:pos="720"/>
+        </w:tabs>
+        <w:ind w:left="720" w:hanging="360"/>
+      </w:pPr>
+      <w:rPr>
+        <w:rFonts w:ascii="Wingdings" w:hAnsi="Wingdings" w:hint="default"/>
+        <w:sz w:val="20"/>
+      </w:rPr>
+    </w:lvl>
+    <w:lvl w:ilvl="1" w:tentative="1">
+      <w:start w:val="1"/>
+      <w:numFmt w:val="bullet"/>
+      <w:lvlText w:val="o"/>
+      <w:lvlJc w:val="left"/>
+      <w:pPr>
+        <w:tabs>
+          <w:tab w:val="num" w:pos="1440"/>
+        </w:tabs>
+        <w:ind w:left="1440" w:hanging="360"/>
+      </w:pPr>
+      <w:rPr>
+        <w:rFonts w:ascii="Courier New" w:hAnsi="Courier New" w:hint="default"/>
+        <w:sz w:val="20"/>
+      </w:rPr>
+    </w:lvl>
+    <w:lvl w:ilvl="2" w:tentative="1">
+      <w:start w:val="1"/>
+      <w:numFmt w:val="bullet"/>
+      <w:lvlText w:val=""/>
+      <w:lvlJc w:val="left"/>
+      <w:pPr>
+        <w:tabs>
+          <w:tab w:val="num" w:pos="2160"/>
+        </w:tabs>
+        <w:ind w:left="2160" w:hanging="360"/>
+      </w:pPr>
+      <w:rPr>
+        <w:rFonts w:ascii="Wingdings" w:hAnsi="Wingdings" w:hint="default"/>
+        <w:sz w:val="20"/>
+      </w:rPr>
+    </w:lvl>
+    <w:lvl w:ilvl="3" w:tentative="1">
+      <w:start w:val="1"/>
+      <w:numFmt w:val="bullet"/>
+      <w:lvlText w:val=""/>
+      <w:lvlJc w:val="left"/>
+      <w:pPr>
+        <w:tabs>
+          <w:tab w:val="num" w:pos="2880"/>
+        </w:tabs>
+        <w:ind w:left="2880" w:hanging="360"/>
+      </w:pPr>
+      <w:rPr>
+        <w:rFonts w:ascii="Wingdings" w:hAnsi="Wingdings" w:hint="default"/>
+        <w:sz w:val="20"/>
+      </w:rPr>
+    </w:lvl>
+    <w:lvl w:ilvl="4" w:tentative="1">
+      <w:start w:val="1"/>
+      <w:numFmt w:val="bullet"/>
+      <w:lvlText w:val=""/>
+      <w:lvlJc w:val="left"/>
+      <w:pPr>
+        <w:tabs>
+          <w:tab w:val="num" w:pos="3600"/>
+        </w:tabs>
+        <w:ind w:left="3600" w:hanging="360"/>
+      </w:pPr>
+      <w:rPr>
+        <w:rFonts w:ascii="Wingdings" w:hAnsi="Wingdings" w:hint="default"/>
+        <w:sz w:val="20"/>
+      </w:rPr>
+    </w:lvl>
+    <w:lvl w:ilvl="5" w:tentative="1">
+      <w:start w:val="1"/>
+      <w:numFmt w:val="bullet"/>
+      <w:lvlText w:val=""/>
+      <w:lvlJc w:val="left"/>
+      <w:pPr>
+        <w:tabs>
+          <w:tab w:val="num" w:pos="4320"/>
+        </w:tabs>
+        <w:ind w:left="4320" w:hanging="360"/>
+      </w:pPr>
+      <w:rPr>
+        <w:rFonts w:ascii="Wingdings" w:hAnsi="Wingdings" w:hint="default"/>
+        <w:sz w:val="20"/>
+      </w:rPr>
+    </w:lvl>
+    <w:lvl w:ilvl="6" w:tentative="1">
+      <w:start w:val="1"/>
+      <w:numFmt w:val="bullet"/>
+      <w:lvlText w:val=""/>
+      <w:lvlJc w:val="left"/>
+      <w:pPr>
+        <w:tabs>
+          <w:tab w:val="num" w:pos="5040"/>
+        </w:tabs>
+        <w:ind w:left="5040" w:hanging="360"/>
+      </w:pPr>
+      <w:rPr>
+        <w:rFonts w:ascii="Wingdings" w:hAnsi="Wingdings" w:hint="default"/>
+        <w:sz w:val="20"/>
+      </w:rPr>
+    </w:lvl>
+    <w:lvl w:ilvl="7" w:tentative="1">
+      <w:start w:val="1"/>
+      <w:numFmt w:val="bullet"/>
+      <w:lvlText w:val=""/>
+      <w:lvlJc w:val="left"/>
+      <w:pPr>
+        <w:tabs>
+          <w:tab w:val="num" w:pos="5760"/>
+        </w:tabs>
+        <w:ind w:left="5760" w:hanging="360"/>
+      </w:pPr>
+      <w:rPr>
+        <w:rFonts w:ascii="Wingdings" w:hAnsi="Wingdings" w:hint="default"/>
+        <w:sz w:val="20"/>
+      </w:rPr>
+    </w:lvl>
+    <w:lvl w:ilvl="8" w:tentative="1">
+      <w:start w:val="1"/>
+      <w:numFmt w:val="bullet"/>
+      <w:lvlText w:val=""/>
+      <w:lvlJc w:val="left"/>
+      <w:pPr>
+        <w:tabs>
+          <w:tab w:val="num" w:pos="6480"/>
+        </w:tabs>
+        <w:ind w:left="6480" w:hanging="360"/>
+      </w:pPr>
+      <w:rPr>
+        <w:rFonts w:ascii="Wingdings" w:hAnsi="Wingdings" w:hint="default"/>
+        <w:sz w:val="20"/>
+      </w:rPr>
+    </w:lvl>
+  </w:abstractNum>
+  <w:abstractNum w:abstractNumId="28" w15:restartNumberingAfterBreak="0">
     <w:nsid w:val="2470127A"/>
     <w:multiLevelType w:val="multilevel"/>
     <w:tmpl w:val="309E9618"/>
@@ -7325,7 +8396,7 @@
       </w:rPr>
     </w:lvl>
   </w:abstractNum>
-  <w:abstractNum w:abstractNumId="26" w15:restartNumberingAfterBreak="0">
+  <w:abstractNum w:abstractNumId="29" w15:restartNumberingAfterBreak="0">
     <w:nsid w:val="24796798"/>
     <w:multiLevelType w:val="hybridMultilevel"/>
     <w:tmpl w:val="6622BEDC"/>
@@ -7414,7 +8485,7 @@
       </w:pPr>
     </w:lvl>
   </w:abstractNum>
-  <w:abstractNum w:abstractNumId="27" w15:restartNumberingAfterBreak="0">
+  <w:abstractNum w:abstractNumId="30" w15:restartNumberingAfterBreak="0">
     <w:nsid w:val="2E4D738C"/>
     <w:multiLevelType w:val="multilevel"/>
     <w:tmpl w:val="1540BBA2"/>
@@ -7563,7 +8634,7 @@
       </w:rPr>
     </w:lvl>
   </w:abstractNum>
-  <w:abstractNum w:abstractNumId="28" w15:restartNumberingAfterBreak="0">
+  <w:abstractNum w:abstractNumId="31" w15:restartNumberingAfterBreak="0">
     <w:nsid w:val="2F0041C7"/>
     <w:multiLevelType w:val="multilevel"/>
     <w:tmpl w:val="656414FE"/>
@@ -7712,7 +8783,7 @@
       </w:rPr>
     </w:lvl>
   </w:abstractNum>
-  <w:abstractNum w:abstractNumId="29" w15:restartNumberingAfterBreak="0">
+  <w:abstractNum w:abstractNumId="32" w15:restartNumberingAfterBreak="0">
     <w:nsid w:val="304F01FA"/>
     <w:multiLevelType w:val="multilevel"/>
     <w:tmpl w:val="151C4EC6"/>
@@ -7861,7 +8932,7 @@
       </w:rPr>
     </w:lvl>
   </w:abstractNum>
-  <w:abstractNum w:abstractNumId="30" w15:restartNumberingAfterBreak="0">
+  <w:abstractNum w:abstractNumId="33" w15:restartNumberingAfterBreak="0">
     <w:nsid w:val="30BD025D"/>
     <w:multiLevelType w:val="hybridMultilevel"/>
     <w:tmpl w:val="04381C82"/>
@@ -7950,7 +9021,7 @@
       </w:pPr>
     </w:lvl>
   </w:abstractNum>
-  <w:abstractNum w:abstractNumId="31" w15:restartNumberingAfterBreak="0">
+  <w:abstractNum w:abstractNumId="34" w15:restartNumberingAfterBreak="0">
     <w:nsid w:val="327C0BA6"/>
     <w:multiLevelType w:val="hybridMultilevel"/>
     <w:tmpl w:val="2A9047EE"/>
@@ -8063,7 +9134,7 @@
       </w:rPr>
     </w:lvl>
   </w:abstractNum>
-  <w:abstractNum w:abstractNumId="32" w15:restartNumberingAfterBreak="0">
+  <w:abstractNum w:abstractNumId="35" w15:restartNumberingAfterBreak="0">
     <w:nsid w:val="338D63E8"/>
     <w:multiLevelType w:val="hybridMultilevel"/>
     <w:tmpl w:val="28D0FB50"/>
@@ -8176,7 +9247,7 @@
       </w:rPr>
     </w:lvl>
   </w:abstractNum>
-  <w:abstractNum w:abstractNumId="33" w15:restartNumberingAfterBreak="0">
+  <w:abstractNum w:abstractNumId="36" w15:restartNumberingAfterBreak="0">
     <w:nsid w:val="35413E58"/>
     <w:multiLevelType w:val="hybridMultilevel"/>
     <w:tmpl w:val="03C64164"/>
@@ -8289,7 +9360,7 @@
       </w:rPr>
     </w:lvl>
   </w:abstractNum>
-  <w:abstractNum w:abstractNumId="34" w15:restartNumberingAfterBreak="0">
+  <w:abstractNum w:abstractNumId="37" w15:restartNumberingAfterBreak="0">
     <w:nsid w:val="35C86AF0"/>
     <w:multiLevelType w:val="multilevel"/>
     <w:tmpl w:val="8202FCD6"/>
@@ -8438,7 +9509,7 @@
       </w:rPr>
     </w:lvl>
   </w:abstractNum>
-  <w:abstractNum w:abstractNumId="35" w15:restartNumberingAfterBreak="0">
+  <w:abstractNum w:abstractNumId="38" w15:restartNumberingAfterBreak="0">
     <w:nsid w:val="3623194A"/>
     <w:multiLevelType w:val="multilevel"/>
     <w:tmpl w:val="63F4E6F0"/>
@@ -8587,7 +9658,7 @@
       </w:rPr>
     </w:lvl>
   </w:abstractNum>
-  <w:abstractNum w:abstractNumId="36" w15:restartNumberingAfterBreak="0">
+  <w:abstractNum w:abstractNumId="39" w15:restartNumberingAfterBreak="0">
     <w:nsid w:val="37B424C3"/>
     <w:multiLevelType w:val="hybridMultilevel"/>
     <w:tmpl w:val="18F030D4"/>
@@ -8700,7 +9771,7 @@
       </w:rPr>
     </w:lvl>
   </w:abstractNum>
-  <w:abstractNum w:abstractNumId="37" w15:restartNumberingAfterBreak="0">
+  <w:abstractNum w:abstractNumId="40" w15:restartNumberingAfterBreak="0">
     <w:nsid w:val="3BC10D30"/>
     <w:multiLevelType w:val="multilevel"/>
     <w:tmpl w:val="502AD78C"/>
@@ -8849,7 +9920,7 @@
       </w:rPr>
     </w:lvl>
   </w:abstractNum>
-  <w:abstractNum w:abstractNumId="38" w15:restartNumberingAfterBreak="0">
+  <w:abstractNum w:abstractNumId="41" w15:restartNumberingAfterBreak="0">
     <w:nsid w:val="3CBF280A"/>
     <w:multiLevelType w:val="multilevel"/>
     <w:tmpl w:val="A13E4362"/>
@@ -8998,7 +10069,7 @@
       </w:rPr>
     </w:lvl>
   </w:abstractNum>
-  <w:abstractNum w:abstractNumId="39" w15:restartNumberingAfterBreak="0">
+  <w:abstractNum w:abstractNumId="42" w15:restartNumberingAfterBreak="0">
     <w:nsid w:val="452F60FB"/>
     <w:multiLevelType w:val="hybridMultilevel"/>
     <w:tmpl w:val="892A990A"/>
@@ -9111,7 +10182,7 @@
       </w:rPr>
     </w:lvl>
   </w:abstractNum>
-  <w:abstractNum w:abstractNumId="40" w15:restartNumberingAfterBreak="0">
+  <w:abstractNum w:abstractNumId="43" w15:restartNumberingAfterBreak="0">
     <w:nsid w:val="47BF2170"/>
     <w:multiLevelType w:val="multilevel"/>
     <w:tmpl w:val="D9681266"/>
@@ -9260,7 +10331,7 @@
       </w:rPr>
     </w:lvl>
   </w:abstractNum>
-  <w:abstractNum w:abstractNumId="41" w15:restartNumberingAfterBreak="0">
+  <w:abstractNum w:abstractNumId="44" w15:restartNumberingAfterBreak="0">
     <w:nsid w:val="47E5592F"/>
     <w:multiLevelType w:val="hybridMultilevel"/>
     <w:tmpl w:val="719AB9FA"/>
@@ -9373,7 +10444,7 @@
       </w:rPr>
     </w:lvl>
   </w:abstractNum>
-  <w:abstractNum w:abstractNumId="42" w15:restartNumberingAfterBreak="0">
+  <w:abstractNum w:abstractNumId="45" w15:restartNumberingAfterBreak="0">
     <w:nsid w:val="48C041A9"/>
     <w:multiLevelType w:val="multilevel"/>
     <w:tmpl w:val="59A694BC"/>
@@ -9522,7 +10593,7 @@
       </w:rPr>
     </w:lvl>
   </w:abstractNum>
-  <w:abstractNum w:abstractNumId="43" w15:restartNumberingAfterBreak="0">
+  <w:abstractNum w:abstractNumId="46" w15:restartNumberingAfterBreak="0">
     <w:nsid w:val="4AF73293"/>
     <w:multiLevelType w:val="hybridMultilevel"/>
     <w:tmpl w:val="F2962738"/>
@@ -9635,7 +10706,7 @@
       </w:rPr>
     </w:lvl>
   </w:abstractNum>
-  <w:abstractNum w:abstractNumId="44" w15:restartNumberingAfterBreak="0">
+  <w:abstractNum w:abstractNumId="47" w15:restartNumberingAfterBreak="0">
     <w:nsid w:val="4B375248"/>
     <w:multiLevelType w:val="multilevel"/>
     <w:tmpl w:val="B574C1C6"/>
@@ -9784,7 +10855,7 @@
       </w:rPr>
     </w:lvl>
   </w:abstractNum>
-  <w:abstractNum w:abstractNumId="45" w15:restartNumberingAfterBreak="0">
+  <w:abstractNum w:abstractNumId="48" w15:restartNumberingAfterBreak="0">
     <w:nsid w:val="4BA13766"/>
     <w:multiLevelType w:val="multilevel"/>
     <w:tmpl w:val="63F4E6F0"/>
@@ -9933,7 +11004,7 @@
       </w:rPr>
     </w:lvl>
   </w:abstractNum>
-  <w:abstractNum w:abstractNumId="46" w15:restartNumberingAfterBreak="0">
+  <w:abstractNum w:abstractNumId="49" w15:restartNumberingAfterBreak="0">
     <w:nsid w:val="4BA25441"/>
     <w:multiLevelType w:val="hybridMultilevel"/>
     <w:tmpl w:val="217E2E96"/>
@@ -10046,7 +11117,7 @@
       </w:rPr>
     </w:lvl>
   </w:abstractNum>
-  <w:abstractNum w:abstractNumId="47" w15:restartNumberingAfterBreak="0">
+  <w:abstractNum w:abstractNumId="50" w15:restartNumberingAfterBreak="0">
     <w:nsid w:val="4E276DCB"/>
     <w:multiLevelType w:val="hybridMultilevel"/>
     <w:tmpl w:val="B7C469B4"/>
@@ -10159,7 +11230,7 @@
       </w:rPr>
     </w:lvl>
   </w:abstractNum>
-  <w:abstractNum w:abstractNumId="48" w15:restartNumberingAfterBreak="0">
+  <w:abstractNum w:abstractNumId="51" w15:restartNumberingAfterBreak="0">
     <w:nsid w:val="4F053929"/>
     <w:multiLevelType w:val="hybridMultilevel"/>
     <w:tmpl w:val="2A78C678"/>
@@ -10272,7 +11343,7 @@
       </w:rPr>
     </w:lvl>
   </w:abstractNum>
-  <w:abstractNum w:abstractNumId="49" w15:restartNumberingAfterBreak="0">
+  <w:abstractNum w:abstractNumId="52" w15:restartNumberingAfterBreak="0">
     <w:nsid w:val="51737FE0"/>
     <w:multiLevelType w:val="hybridMultilevel"/>
     <w:tmpl w:val="2B0604E6"/>
@@ -10385,7 +11456,7 @@
       </w:rPr>
     </w:lvl>
   </w:abstractNum>
-  <w:abstractNum w:abstractNumId="50" w15:restartNumberingAfterBreak="0">
+  <w:abstractNum w:abstractNumId="53" w15:restartNumberingAfterBreak="0">
     <w:nsid w:val="51A86EF8"/>
     <w:multiLevelType w:val="multilevel"/>
     <w:tmpl w:val="FF2841D4"/>
@@ -10534,7 +11605,7 @@
       </w:rPr>
     </w:lvl>
   </w:abstractNum>
-  <w:abstractNum w:abstractNumId="51" w15:restartNumberingAfterBreak="0">
+  <w:abstractNum w:abstractNumId="54" w15:restartNumberingAfterBreak="0">
     <w:nsid w:val="521F2792"/>
     <w:multiLevelType w:val="multilevel"/>
     <w:tmpl w:val="9FB45386"/>
@@ -10683,7 +11754,7 @@
       </w:rPr>
     </w:lvl>
   </w:abstractNum>
-  <w:abstractNum w:abstractNumId="52" w15:restartNumberingAfterBreak="0">
+  <w:abstractNum w:abstractNumId="55" w15:restartNumberingAfterBreak="0">
     <w:nsid w:val="53390911"/>
     <w:multiLevelType w:val="multilevel"/>
     <w:tmpl w:val="1C380F12"/>
@@ -10832,7 +11903,7 @@
       </w:rPr>
     </w:lvl>
   </w:abstractNum>
-  <w:abstractNum w:abstractNumId="53" w15:restartNumberingAfterBreak="0">
+  <w:abstractNum w:abstractNumId="56" w15:restartNumberingAfterBreak="0">
     <w:nsid w:val="53CD23AC"/>
     <w:multiLevelType w:val="multilevel"/>
     <w:tmpl w:val="57BAE8F0"/>
@@ -10981,7 +12052,7 @@
       </w:rPr>
     </w:lvl>
   </w:abstractNum>
-  <w:abstractNum w:abstractNumId="54" w15:restartNumberingAfterBreak="0">
+  <w:abstractNum w:abstractNumId="57" w15:restartNumberingAfterBreak="0">
     <w:nsid w:val="5462791F"/>
     <w:multiLevelType w:val="hybridMultilevel"/>
     <w:tmpl w:val="FDE24C26"/>
@@ -11094,7 +12165,7 @@
       </w:rPr>
     </w:lvl>
   </w:abstractNum>
-  <w:abstractNum w:abstractNumId="55" w15:restartNumberingAfterBreak="0">
+  <w:abstractNum w:abstractNumId="58" w15:restartNumberingAfterBreak="0">
     <w:nsid w:val="547005EB"/>
     <w:multiLevelType w:val="multilevel"/>
     <w:tmpl w:val="F260CC5C"/>
@@ -11243,7 +12314,7 @@
       </w:rPr>
     </w:lvl>
   </w:abstractNum>
-  <w:abstractNum w:abstractNumId="56" w15:restartNumberingAfterBreak="0">
+  <w:abstractNum w:abstractNumId="59" w15:restartNumberingAfterBreak="0">
     <w:nsid w:val="58034221"/>
     <w:multiLevelType w:val="hybridMultilevel"/>
     <w:tmpl w:val="65D0619C"/>
@@ -11356,7 +12427,7 @@
       </w:rPr>
     </w:lvl>
   </w:abstractNum>
-  <w:abstractNum w:abstractNumId="57" w15:restartNumberingAfterBreak="0">
+  <w:abstractNum w:abstractNumId="60" w15:restartNumberingAfterBreak="0">
     <w:nsid w:val="5A460390"/>
     <w:multiLevelType w:val="hybridMultilevel"/>
     <w:tmpl w:val="BD8E939C"/>
@@ -11469,7 +12540,7 @@
       </w:rPr>
     </w:lvl>
   </w:abstractNum>
-  <w:abstractNum w:abstractNumId="58" w15:restartNumberingAfterBreak="0">
+  <w:abstractNum w:abstractNumId="61" w15:restartNumberingAfterBreak="0">
     <w:nsid w:val="5CEE630B"/>
     <w:multiLevelType w:val="hybridMultilevel"/>
     <w:tmpl w:val="DE8E8DBA"/>
@@ -11582,7 +12653,7 @@
       </w:rPr>
     </w:lvl>
   </w:abstractNum>
-  <w:abstractNum w:abstractNumId="59" w15:restartNumberingAfterBreak="0">
+  <w:abstractNum w:abstractNumId="62" w15:restartNumberingAfterBreak="0">
     <w:nsid w:val="62385AA6"/>
     <w:multiLevelType w:val="multilevel"/>
     <w:tmpl w:val="B9EAECD4"/>
@@ -11731,7 +12802,7 @@
       </w:rPr>
     </w:lvl>
   </w:abstractNum>
-  <w:abstractNum w:abstractNumId="60" w15:restartNumberingAfterBreak="0">
+  <w:abstractNum w:abstractNumId="63" w15:restartNumberingAfterBreak="0">
     <w:nsid w:val="625D686D"/>
     <w:multiLevelType w:val="multilevel"/>
     <w:tmpl w:val="BC1C2048"/>
@@ -11880,7 +12951,7 @@
       </w:rPr>
     </w:lvl>
   </w:abstractNum>
-  <w:abstractNum w:abstractNumId="61" w15:restartNumberingAfterBreak="0">
+  <w:abstractNum w:abstractNumId="64" w15:restartNumberingAfterBreak="0">
     <w:nsid w:val="62B46951"/>
     <w:multiLevelType w:val="hybridMultilevel"/>
     <w:tmpl w:val="0FEAFEC6"/>
@@ -11993,7 +13064,7 @@
       </w:rPr>
     </w:lvl>
   </w:abstractNum>
-  <w:abstractNum w:abstractNumId="62" w15:restartNumberingAfterBreak="0">
+  <w:abstractNum w:abstractNumId="65" w15:restartNumberingAfterBreak="0">
     <w:nsid w:val="647819E3"/>
     <w:multiLevelType w:val="multilevel"/>
     <w:tmpl w:val="ABB278BC"/>
@@ -12142,7 +13213,7 @@
       </w:rPr>
     </w:lvl>
   </w:abstractNum>
-  <w:abstractNum w:abstractNumId="63" w15:restartNumberingAfterBreak="0">
+  <w:abstractNum w:abstractNumId="66" w15:restartNumberingAfterBreak="0">
     <w:nsid w:val="64F30198"/>
     <w:multiLevelType w:val="multilevel"/>
     <w:tmpl w:val="63F4E6F0"/>
@@ -12291,7 +13362,7 @@
       </w:rPr>
     </w:lvl>
   </w:abstractNum>
-  <w:abstractNum w:abstractNumId="64" w15:restartNumberingAfterBreak="0">
+  <w:abstractNum w:abstractNumId="67" w15:restartNumberingAfterBreak="0">
     <w:nsid w:val="65314293"/>
     <w:multiLevelType w:val="hybridMultilevel"/>
     <w:tmpl w:val="6688DFAC"/>
@@ -12404,7 +13475,7 @@
       </w:rPr>
     </w:lvl>
   </w:abstractNum>
-  <w:abstractNum w:abstractNumId="65" w15:restartNumberingAfterBreak="0">
+  <w:abstractNum w:abstractNumId="68" w15:restartNumberingAfterBreak="0">
     <w:nsid w:val="65CE4D0F"/>
     <w:multiLevelType w:val="hybridMultilevel"/>
     <w:tmpl w:val="DB668538"/>
@@ -12517,7 +13588,7 @@
       </w:rPr>
     </w:lvl>
   </w:abstractNum>
-  <w:abstractNum w:abstractNumId="66" w15:restartNumberingAfterBreak="0">
+  <w:abstractNum w:abstractNumId="69" w15:restartNumberingAfterBreak="0">
     <w:nsid w:val="661C7D73"/>
     <w:multiLevelType w:val="multilevel"/>
     <w:tmpl w:val="D9681266"/>
@@ -12666,7 +13737,156 @@
       </w:rPr>
     </w:lvl>
   </w:abstractNum>
-  <w:abstractNum w:abstractNumId="67" w15:restartNumberingAfterBreak="0">
+  <w:abstractNum w:abstractNumId="70" w15:restartNumberingAfterBreak="0">
+    <w:nsid w:val="68B94344"/>
+    <w:multiLevelType w:val="multilevel"/>
+    <w:tmpl w:val="9BA812D8"/>
+    <w:lvl w:ilvl="0">
+      <w:start w:val="1"/>
+      <w:numFmt w:val="bullet"/>
+      <w:lvlText w:val=""/>
+      <w:lvlJc w:val="left"/>
+      <w:pPr>
+        <w:tabs>
+          <w:tab w:val="num" w:pos="720"/>
+        </w:tabs>
+        <w:ind w:left="720" w:hanging="360"/>
+      </w:pPr>
+      <w:rPr>
+        <w:rFonts w:ascii="Symbol" w:hAnsi="Symbol" w:hint="default"/>
+        <w:sz w:val="20"/>
+      </w:rPr>
+    </w:lvl>
+    <w:lvl w:ilvl="1" w:tentative="1">
+      <w:start w:val="1"/>
+      <w:numFmt w:val="bullet"/>
+      <w:lvlText w:val="o"/>
+      <w:lvlJc w:val="left"/>
+      <w:pPr>
+        <w:tabs>
+          <w:tab w:val="num" w:pos="1440"/>
+        </w:tabs>
+        <w:ind w:left="1440" w:hanging="360"/>
+      </w:pPr>
+      <w:rPr>
+        <w:rFonts w:ascii="Courier New" w:hAnsi="Courier New" w:hint="default"/>
+        <w:sz w:val="20"/>
+      </w:rPr>
+    </w:lvl>
+    <w:lvl w:ilvl="2" w:tentative="1">
+      <w:start w:val="1"/>
+      <w:numFmt w:val="bullet"/>
+      <w:lvlText w:val=""/>
+      <w:lvlJc w:val="left"/>
+      <w:pPr>
+        <w:tabs>
+          <w:tab w:val="num" w:pos="2160"/>
+        </w:tabs>
+        <w:ind w:left="2160" w:hanging="360"/>
+      </w:pPr>
+      <w:rPr>
+        <w:rFonts w:ascii="Wingdings" w:hAnsi="Wingdings" w:hint="default"/>
+        <w:sz w:val="20"/>
+      </w:rPr>
+    </w:lvl>
+    <w:lvl w:ilvl="3" w:tentative="1">
+      <w:start w:val="1"/>
+      <w:numFmt w:val="bullet"/>
+      <w:lvlText w:val=""/>
+      <w:lvlJc w:val="left"/>
+      <w:pPr>
+        <w:tabs>
+          <w:tab w:val="num" w:pos="2880"/>
+        </w:tabs>
+        <w:ind w:left="2880" w:hanging="360"/>
+      </w:pPr>
+      <w:rPr>
+        <w:rFonts w:ascii="Wingdings" w:hAnsi="Wingdings" w:hint="default"/>
+        <w:sz w:val="20"/>
+      </w:rPr>
+    </w:lvl>
+    <w:lvl w:ilvl="4" w:tentative="1">
+      <w:start w:val="1"/>
+      <w:numFmt w:val="bullet"/>
+      <w:lvlText w:val=""/>
+      <w:lvlJc w:val="left"/>
+      <w:pPr>
+        <w:tabs>
+          <w:tab w:val="num" w:pos="3600"/>
+        </w:tabs>
+        <w:ind w:left="3600" w:hanging="360"/>
+      </w:pPr>
+      <w:rPr>
+        <w:rFonts w:ascii="Wingdings" w:hAnsi="Wingdings" w:hint="default"/>
+        <w:sz w:val="20"/>
+      </w:rPr>
+    </w:lvl>
+    <w:lvl w:ilvl="5" w:tentative="1">
+      <w:start w:val="1"/>
+      <w:numFmt w:val="bullet"/>
+      <w:lvlText w:val=""/>
+      <w:lvlJc w:val="left"/>
+      <w:pPr>
+        <w:tabs>
+          <w:tab w:val="num" w:pos="4320"/>
+        </w:tabs>
+        <w:ind w:left="4320" w:hanging="360"/>
+      </w:pPr>
+      <w:rPr>
+        <w:rFonts w:ascii="Wingdings" w:hAnsi="Wingdings" w:hint="default"/>
+        <w:sz w:val="20"/>
+      </w:rPr>
+    </w:lvl>
+    <w:lvl w:ilvl="6" w:tentative="1">
+      <w:start w:val="1"/>
+      <w:numFmt w:val="bullet"/>
+      <w:lvlText w:val=""/>
+      <w:lvlJc w:val="left"/>
+      <w:pPr>
+        <w:tabs>
+          <w:tab w:val="num" w:pos="5040"/>
+        </w:tabs>
+        <w:ind w:left="5040" w:hanging="360"/>
+      </w:pPr>
+      <w:rPr>
+        <w:rFonts w:ascii="Wingdings" w:hAnsi="Wingdings" w:hint="default"/>
+        <w:sz w:val="20"/>
+      </w:rPr>
+    </w:lvl>
+    <w:lvl w:ilvl="7" w:tentative="1">
+      <w:start w:val="1"/>
+      <w:numFmt w:val="bullet"/>
+      <w:lvlText w:val=""/>
+      <w:lvlJc w:val="left"/>
+      <w:pPr>
+        <w:tabs>
+          <w:tab w:val="num" w:pos="5760"/>
+        </w:tabs>
+        <w:ind w:left="5760" w:hanging="360"/>
+      </w:pPr>
+      <w:rPr>
+        <w:rFonts w:ascii="Wingdings" w:hAnsi="Wingdings" w:hint="default"/>
+        <w:sz w:val="20"/>
+      </w:rPr>
+    </w:lvl>
+    <w:lvl w:ilvl="8" w:tentative="1">
+      <w:start w:val="1"/>
+      <w:numFmt w:val="bullet"/>
+      <w:lvlText w:val=""/>
+      <w:lvlJc w:val="left"/>
+      <w:pPr>
+        <w:tabs>
+          <w:tab w:val="num" w:pos="6480"/>
+        </w:tabs>
+        <w:ind w:left="6480" w:hanging="360"/>
+      </w:pPr>
+      <w:rPr>
+        <w:rFonts w:ascii="Wingdings" w:hAnsi="Wingdings" w:hint="default"/>
+        <w:sz w:val="20"/>
+      </w:rPr>
+    </w:lvl>
+  </w:abstractNum>
+  <w:abstractNum w:abstractNumId="71" w15:restartNumberingAfterBreak="0">
     <w:nsid w:val="69DE2C87"/>
     <w:multiLevelType w:val="hybridMultilevel"/>
     <w:tmpl w:val="F530F20A"/>
@@ -12779,7 +13999,7 @@
       </w:rPr>
     </w:lvl>
   </w:abstractNum>
-  <w:abstractNum w:abstractNumId="68" w15:restartNumberingAfterBreak="0">
+  <w:abstractNum w:abstractNumId="72" w15:restartNumberingAfterBreak="0">
     <w:nsid w:val="69ED672D"/>
     <w:multiLevelType w:val="multilevel"/>
     <w:tmpl w:val="CC08E300"/>
@@ -12928,7 +14148,7 @@
       </w:rPr>
     </w:lvl>
   </w:abstractNum>
-  <w:abstractNum w:abstractNumId="69" w15:restartNumberingAfterBreak="0">
+  <w:abstractNum w:abstractNumId="73" w15:restartNumberingAfterBreak="0">
     <w:nsid w:val="6A063EFD"/>
     <w:multiLevelType w:val="hybridMultilevel"/>
     <w:tmpl w:val="48703FBA"/>
@@ -13041,7 +14261,7 @@
       </w:rPr>
     </w:lvl>
   </w:abstractNum>
-  <w:abstractNum w:abstractNumId="70" w15:restartNumberingAfterBreak="0">
+  <w:abstractNum w:abstractNumId="74" w15:restartNumberingAfterBreak="0">
     <w:nsid w:val="6A825ABE"/>
     <w:multiLevelType w:val="multilevel"/>
     <w:tmpl w:val="0CD6F30E"/>
@@ -13190,7 +14410,7 @@
       </w:rPr>
     </w:lvl>
   </w:abstractNum>
-  <w:abstractNum w:abstractNumId="71" w15:restartNumberingAfterBreak="0">
+  <w:abstractNum w:abstractNumId="75" w15:restartNumberingAfterBreak="0">
     <w:nsid w:val="6B1D7832"/>
     <w:multiLevelType w:val="multilevel"/>
     <w:tmpl w:val="DD4646B2"/>
@@ -13339,7 +14559,7 @@
       </w:rPr>
     </w:lvl>
   </w:abstractNum>
-  <w:abstractNum w:abstractNumId="72" w15:restartNumberingAfterBreak="0">
+  <w:abstractNum w:abstractNumId="76" w15:restartNumberingAfterBreak="0">
     <w:nsid w:val="6C6D6667"/>
     <w:multiLevelType w:val="hybridMultilevel"/>
     <w:tmpl w:val="A744709C"/>
@@ -13452,7 +14672,7 @@
       </w:rPr>
     </w:lvl>
   </w:abstractNum>
-  <w:abstractNum w:abstractNumId="73" w15:restartNumberingAfterBreak="0">
+  <w:abstractNum w:abstractNumId="77" w15:restartNumberingAfterBreak="0">
     <w:nsid w:val="6CAD7EA5"/>
     <w:multiLevelType w:val="multilevel"/>
     <w:tmpl w:val="C472C5B0"/>
@@ -13601,7 +14821,7 @@
       </w:rPr>
     </w:lvl>
   </w:abstractNum>
-  <w:abstractNum w:abstractNumId="74" w15:restartNumberingAfterBreak="0">
+  <w:abstractNum w:abstractNumId="78" w15:restartNumberingAfterBreak="0">
     <w:nsid w:val="6E43557B"/>
     <w:multiLevelType w:val="multilevel"/>
     <w:tmpl w:val="323C7112"/>
@@ -13750,7 +14970,7 @@
       </w:rPr>
     </w:lvl>
   </w:abstractNum>
-  <w:abstractNum w:abstractNumId="75" w15:restartNumberingAfterBreak="0">
+  <w:abstractNum w:abstractNumId="79" w15:restartNumberingAfterBreak="0">
     <w:nsid w:val="6EA27D0A"/>
     <w:multiLevelType w:val="multilevel"/>
     <w:tmpl w:val="7BF0256C"/>
@@ -13899,7 +15119,7 @@
       </w:rPr>
     </w:lvl>
   </w:abstractNum>
-  <w:abstractNum w:abstractNumId="76" w15:restartNumberingAfterBreak="0">
+  <w:abstractNum w:abstractNumId="80" w15:restartNumberingAfterBreak="0">
     <w:nsid w:val="70874300"/>
     <w:multiLevelType w:val="hybridMultilevel"/>
     <w:tmpl w:val="1B3A0518"/>
@@ -14012,7 +15232,7 @@
       </w:rPr>
     </w:lvl>
   </w:abstractNum>
-  <w:abstractNum w:abstractNumId="77" w15:restartNumberingAfterBreak="0">
+  <w:abstractNum w:abstractNumId="81" w15:restartNumberingAfterBreak="0">
     <w:nsid w:val="7090251B"/>
     <w:multiLevelType w:val="hybridMultilevel"/>
     <w:tmpl w:val="67687EFE"/>
@@ -14125,7 +15345,7 @@
       </w:rPr>
     </w:lvl>
   </w:abstractNum>
-  <w:abstractNum w:abstractNumId="78" w15:restartNumberingAfterBreak="0">
+  <w:abstractNum w:abstractNumId="82" w15:restartNumberingAfterBreak="0">
     <w:nsid w:val="75144C65"/>
     <w:multiLevelType w:val="hybridMultilevel"/>
     <w:tmpl w:val="12127FAA"/>
@@ -14238,7 +15458,7 @@
       </w:rPr>
     </w:lvl>
   </w:abstractNum>
-  <w:abstractNum w:abstractNumId="79" w15:restartNumberingAfterBreak="0">
+  <w:abstractNum w:abstractNumId="83" w15:restartNumberingAfterBreak="0">
     <w:nsid w:val="75237F84"/>
     <w:multiLevelType w:val="hybridMultilevel"/>
     <w:tmpl w:val="5F0A6EF2"/>
@@ -14351,7 +15571,7 @@
       </w:rPr>
     </w:lvl>
   </w:abstractNum>
-  <w:abstractNum w:abstractNumId="80" w15:restartNumberingAfterBreak="0">
+  <w:abstractNum w:abstractNumId="84" w15:restartNumberingAfterBreak="0">
     <w:nsid w:val="75FF09B0"/>
     <w:multiLevelType w:val="multilevel"/>
     <w:tmpl w:val="C34A7734"/>
@@ -14500,7 +15720,7 @@
       </w:rPr>
     </w:lvl>
   </w:abstractNum>
-  <w:abstractNum w:abstractNumId="81" w15:restartNumberingAfterBreak="0">
+  <w:abstractNum w:abstractNumId="85" w15:restartNumberingAfterBreak="0">
     <w:nsid w:val="77960362"/>
     <w:multiLevelType w:val="multilevel"/>
     <w:tmpl w:val="FEA0022E"/>
@@ -14649,7 +15869,7 @@
       </w:rPr>
     </w:lvl>
   </w:abstractNum>
-  <w:abstractNum w:abstractNumId="82" w15:restartNumberingAfterBreak="0">
+  <w:abstractNum w:abstractNumId="86" w15:restartNumberingAfterBreak="0">
     <w:nsid w:val="785A644F"/>
     <w:multiLevelType w:val="multilevel"/>
     <w:tmpl w:val="D1DC60FE"/>
@@ -14798,7 +16018,7 @@
       </w:rPr>
     </w:lvl>
   </w:abstractNum>
-  <w:abstractNum w:abstractNumId="83" w15:restartNumberingAfterBreak="0">
+  <w:abstractNum w:abstractNumId="87" w15:restartNumberingAfterBreak="0">
     <w:nsid w:val="7BFA03DF"/>
     <w:multiLevelType w:val="hybridMultilevel"/>
     <w:tmpl w:val="536A979E"/>
@@ -14911,7 +16131,7 @@
       </w:rPr>
     </w:lvl>
   </w:abstractNum>
-  <w:abstractNum w:abstractNumId="84" w15:restartNumberingAfterBreak="0">
+  <w:abstractNum w:abstractNumId="88" w15:restartNumberingAfterBreak="0">
     <w:nsid w:val="7CA524B4"/>
     <w:multiLevelType w:val="hybridMultilevel"/>
     <w:tmpl w:val="957C4F4A"/>
@@ -15024,7 +16244,7 @@
       </w:rPr>
     </w:lvl>
   </w:abstractNum>
-  <w:abstractNum w:abstractNumId="85" w15:restartNumberingAfterBreak="0">
+  <w:abstractNum w:abstractNumId="89" w15:restartNumberingAfterBreak="0">
     <w:nsid w:val="7EBD7710"/>
     <w:multiLevelType w:val="hybridMultilevel"/>
     <w:tmpl w:val="C8C6F7A0"/>
@@ -15138,106 +16358,106 @@
     </w:lvl>
   </w:abstractNum>
   <w:num w:numId="1" w16cid:durableId="425157302">
+    <w:abstractNumId w:val="38"/>
+  </w:num>
+  <w:num w:numId="2" w16cid:durableId="967664612">
+    <w:abstractNumId w:val="66"/>
+  </w:num>
+  <w:num w:numId="3" w16cid:durableId="361631616">
+    <w:abstractNumId w:val="48"/>
+  </w:num>
+  <w:num w:numId="4" w16cid:durableId="1409575397">
+    <w:abstractNumId w:val="57"/>
+  </w:num>
+  <w:num w:numId="5" w16cid:durableId="1647204897">
+    <w:abstractNumId w:val="88"/>
+  </w:num>
+  <w:num w:numId="6" w16cid:durableId="682589869">
+    <w:abstractNumId w:val="16"/>
+  </w:num>
+  <w:num w:numId="7" w16cid:durableId="679703478">
+    <w:abstractNumId w:val="71"/>
+  </w:num>
+  <w:num w:numId="8" w16cid:durableId="496455128">
+    <w:abstractNumId w:val="33"/>
+  </w:num>
+  <w:num w:numId="9" w16cid:durableId="1184633094">
+    <w:abstractNumId w:val="42"/>
+  </w:num>
+  <w:num w:numId="10" w16cid:durableId="71507387">
+    <w:abstractNumId w:val="46"/>
+  </w:num>
+  <w:num w:numId="11" w16cid:durableId="1412503779">
+    <w:abstractNumId w:val="73"/>
+  </w:num>
+  <w:num w:numId="12" w16cid:durableId="1107113995">
+    <w:abstractNumId w:val="34"/>
+  </w:num>
+  <w:num w:numId="13" w16cid:durableId="2011055922">
+    <w:abstractNumId w:val="17"/>
+  </w:num>
+  <w:num w:numId="14" w16cid:durableId="1529222885">
+    <w:abstractNumId w:val="87"/>
+  </w:num>
+  <w:num w:numId="15" w16cid:durableId="836580755">
+    <w:abstractNumId w:val="11"/>
+  </w:num>
+  <w:num w:numId="16" w16cid:durableId="1344674502">
+    <w:abstractNumId w:val="60"/>
+  </w:num>
+  <w:num w:numId="17" w16cid:durableId="1320882603">
+    <w:abstractNumId w:val="80"/>
+  </w:num>
+  <w:num w:numId="18" w16cid:durableId="1139028372">
     <w:abstractNumId w:val="35"/>
   </w:num>
-  <w:num w:numId="2" w16cid:durableId="967664612">
-    <w:abstractNumId w:val="63"/>
+  <w:num w:numId="19" w16cid:durableId="1525635473">
+    <w:abstractNumId w:val="64"/>
   </w:num>
-  <w:num w:numId="3" w16cid:durableId="361631616">
-    <w:abstractNumId w:val="45"/>
+  <w:num w:numId="20" w16cid:durableId="609623515">
+    <w:abstractNumId w:val="89"/>
   </w:num>
-  <w:num w:numId="4" w16cid:durableId="1409575397">
-    <w:abstractNumId w:val="54"/>
-  </w:num>
-  <w:num w:numId="5" w16cid:durableId="1647204897">
-    <w:abstractNumId w:val="84"/>
-  </w:num>
-  <w:num w:numId="6" w16cid:durableId="682589869">
-    <w:abstractNumId w:val="15"/>
-  </w:num>
-  <w:num w:numId="7" w16cid:durableId="679703478">
-    <w:abstractNumId w:val="67"/>
-  </w:num>
-  <w:num w:numId="8" w16cid:durableId="496455128">
-    <w:abstractNumId w:val="30"/>
-  </w:num>
-  <w:num w:numId="9" w16cid:durableId="1184633094">
-    <w:abstractNumId w:val="39"/>
-  </w:num>
-  <w:num w:numId="10" w16cid:durableId="71507387">
-    <w:abstractNumId w:val="43"/>
-  </w:num>
-  <w:num w:numId="11" w16cid:durableId="1412503779">
-    <w:abstractNumId w:val="69"/>
-  </w:num>
-  <w:num w:numId="12" w16cid:durableId="1107113995">
-    <w:abstractNumId w:val="31"/>
-  </w:num>
-  <w:num w:numId="13" w16cid:durableId="2011055922">
-    <w:abstractNumId w:val="16"/>
-  </w:num>
-  <w:num w:numId="14" w16cid:durableId="1529222885">
-    <w:abstractNumId w:val="83"/>
-  </w:num>
-  <w:num w:numId="15" w16cid:durableId="836580755">
-    <w:abstractNumId w:val="10"/>
-  </w:num>
-  <w:num w:numId="16" w16cid:durableId="1344674502">
-    <w:abstractNumId w:val="57"/>
-  </w:num>
-  <w:num w:numId="17" w16cid:durableId="1320882603">
+  <w:num w:numId="21" w16cid:durableId="165170997">
     <w:abstractNumId w:val="76"/>
   </w:num>
-  <w:num w:numId="18" w16cid:durableId="1139028372">
-    <w:abstractNumId w:val="32"/>
-  </w:num>
-  <w:num w:numId="19" w16cid:durableId="1525635473">
-    <w:abstractNumId w:val="61"/>
-  </w:num>
-  <w:num w:numId="20" w16cid:durableId="609623515">
-    <w:abstractNumId w:val="85"/>
-  </w:num>
-  <w:num w:numId="21" w16cid:durableId="165170997">
-    <w:abstractNumId w:val="72"/>
-  </w:num>
   <w:num w:numId="22" w16cid:durableId="1620525290">
-    <w:abstractNumId w:val="20"/>
+    <w:abstractNumId w:val="22"/>
   </w:num>
   <w:num w:numId="23" w16cid:durableId="400753109">
-    <w:abstractNumId w:val="78"/>
+    <w:abstractNumId w:val="82"/>
   </w:num>
   <w:num w:numId="24" w16cid:durableId="193882219">
     <w:abstractNumId w:val="4"/>
   </w:num>
   <w:num w:numId="25" w16cid:durableId="311981628">
-    <w:abstractNumId w:val="36"/>
+    <w:abstractNumId w:val="39"/>
   </w:num>
   <w:num w:numId="26" w16cid:durableId="2009166045">
-    <w:abstractNumId w:val="9"/>
+    <w:abstractNumId w:val="10"/>
   </w:num>
   <w:num w:numId="27" w16cid:durableId="2135174697">
-    <w:abstractNumId w:val="14"/>
+    <w:abstractNumId w:val="15"/>
   </w:num>
   <w:num w:numId="28" w16cid:durableId="353504740">
-    <w:abstractNumId w:val="11"/>
+    <w:abstractNumId w:val="12"/>
   </w:num>
   <w:num w:numId="29" w16cid:durableId="2124693280">
-    <w:abstractNumId w:val="65"/>
+    <w:abstractNumId w:val="68"/>
   </w:num>
   <w:num w:numId="30" w16cid:durableId="1367099744">
-    <w:abstractNumId w:val="24"/>
+    <w:abstractNumId w:val="26"/>
   </w:num>
   <w:num w:numId="31" w16cid:durableId="2011105642">
-    <w:abstractNumId w:val="58"/>
+    <w:abstractNumId w:val="61"/>
   </w:num>
   <w:num w:numId="32" w16cid:durableId="831995364">
-    <w:abstractNumId w:val="18"/>
+    <w:abstractNumId w:val="20"/>
   </w:num>
   <w:num w:numId="33" w16cid:durableId="851073403">
     <w:abstractNumId w:val="3"/>
   </w:num>
   <w:num w:numId="34" w16cid:durableId="1183666391">
-    <w:abstractNumId w:val="17"/>
+    <w:abstractNumId w:val="19"/>
   </w:num>
   <w:num w:numId="35" w16cid:durableId="697268929">
     <w:abstractNumId w:val="1"/>
@@ -15246,154 +16466,166 @@
     <w:abstractNumId w:val="2"/>
   </w:num>
   <w:num w:numId="37" w16cid:durableId="1849755457">
-    <w:abstractNumId w:val="79"/>
+    <w:abstractNumId w:val="83"/>
   </w:num>
   <w:num w:numId="38" w16cid:durableId="516505904">
-    <w:abstractNumId w:val="8"/>
+    <w:abstractNumId w:val="9"/>
   </w:num>
   <w:num w:numId="39" w16cid:durableId="906300072">
-    <w:abstractNumId w:val="12"/>
+    <w:abstractNumId w:val="13"/>
   </w:num>
   <w:num w:numId="40" w16cid:durableId="905338697">
-    <w:abstractNumId w:val="47"/>
+    <w:abstractNumId w:val="50"/>
   </w:num>
   <w:num w:numId="41" w16cid:durableId="501896635">
-    <w:abstractNumId w:val="33"/>
+    <w:abstractNumId w:val="36"/>
   </w:num>
   <w:num w:numId="42" w16cid:durableId="1953435156">
-    <w:abstractNumId w:val="48"/>
+    <w:abstractNumId w:val="51"/>
   </w:num>
   <w:num w:numId="43" w16cid:durableId="1060447452">
-    <w:abstractNumId w:val="56"/>
+    <w:abstractNumId w:val="59"/>
   </w:num>
   <w:num w:numId="44" w16cid:durableId="1772503672">
-    <w:abstractNumId w:val="41"/>
+    <w:abstractNumId w:val="44"/>
   </w:num>
   <w:num w:numId="45" w16cid:durableId="1650330222">
-    <w:abstractNumId w:val="46"/>
+    <w:abstractNumId w:val="49"/>
   </w:num>
   <w:num w:numId="46" w16cid:durableId="2102337934">
-    <w:abstractNumId w:val="19"/>
+    <w:abstractNumId w:val="21"/>
   </w:num>
   <w:num w:numId="47" w16cid:durableId="68767822">
-    <w:abstractNumId w:val="70"/>
+    <w:abstractNumId w:val="74"/>
   </w:num>
   <w:num w:numId="48" w16cid:durableId="1992058265">
     <w:abstractNumId w:val="5"/>
   </w:num>
   <w:num w:numId="49" w16cid:durableId="788475134">
-    <w:abstractNumId w:val="82"/>
+    <w:abstractNumId w:val="86"/>
   </w:num>
   <w:num w:numId="50" w16cid:durableId="224419455">
-    <w:abstractNumId w:val="75"/>
+    <w:abstractNumId w:val="79"/>
   </w:num>
   <w:num w:numId="51" w16cid:durableId="1699575947">
-    <w:abstractNumId w:val="60"/>
+    <w:abstractNumId w:val="63"/>
   </w:num>
   <w:num w:numId="52" w16cid:durableId="1048916239">
-    <w:abstractNumId w:val="38"/>
+    <w:abstractNumId w:val="41"/>
   </w:num>
   <w:num w:numId="53" w16cid:durableId="1188711211">
-    <w:abstractNumId w:val="80"/>
+    <w:abstractNumId w:val="84"/>
   </w:num>
   <w:num w:numId="54" w16cid:durableId="447555614">
-    <w:abstractNumId w:val="62"/>
+    <w:abstractNumId w:val="65"/>
   </w:num>
   <w:num w:numId="55" w16cid:durableId="1679307268">
-    <w:abstractNumId w:val="37"/>
+    <w:abstractNumId w:val="40"/>
   </w:num>
   <w:num w:numId="56" w16cid:durableId="693773591">
-    <w:abstractNumId w:val="74"/>
+    <w:abstractNumId w:val="78"/>
   </w:num>
   <w:num w:numId="57" w16cid:durableId="1110473324">
-    <w:abstractNumId w:val="25"/>
+    <w:abstractNumId w:val="28"/>
   </w:num>
   <w:num w:numId="58" w16cid:durableId="842937968">
-    <w:abstractNumId w:val="44"/>
+    <w:abstractNumId w:val="47"/>
   </w:num>
   <w:num w:numId="59" w16cid:durableId="821121315">
-    <w:abstractNumId w:val="29"/>
+    <w:abstractNumId w:val="32"/>
   </w:num>
   <w:num w:numId="60" w16cid:durableId="2095394549">
-    <w:abstractNumId w:val="81"/>
+    <w:abstractNumId w:val="85"/>
   </w:num>
   <w:num w:numId="61" w16cid:durableId="1299921011">
-    <w:abstractNumId w:val="28"/>
+    <w:abstractNumId w:val="31"/>
   </w:num>
   <w:num w:numId="62" w16cid:durableId="1927420240">
-    <w:abstractNumId w:val="50"/>
+    <w:abstractNumId w:val="53"/>
   </w:num>
   <w:num w:numId="63" w16cid:durableId="41290043">
-    <w:abstractNumId w:val="53"/>
+    <w:abstractNumId w:val="56"/>
   </w:num>
   <w:num w:numId="64" w16cid:durableId="999846909">
-    <w:abstractNumId w:val="42"/>
+    <w:abstractNumId w:val="45"/>
   </w:num>
   <w:num w:numId="65" w16cid:durableId="1250969563">
-    <w:abstractNumId w:val="49"/>
+    <w:abstractNumId w:val="52"/>
   </w:num>
   <w:num w:numId="66" w16cid:durableId="484011382">
-    <w:abstractNumId w:val="68"/>
+    <w:abstractNumId w:val="72"/>
   </w:num>
   <w:num w:numId="67" w16cid:durableId="2008289242">
     <w:abstractNumId w:val="7"/>
   </w:num>
   <w:num w:numId="68" w16cid:durableId="1041637222">
-    <w:abstractNumId w:val="13"/>
+    <w:abstractNumId w:val="14"/>
   </w:num>
   <w:num w:numId="69" w16cid:durableId="1296839887">
-    <w:abstractNumId w:val="52"/>
+    <w:abstractNumId w:val="55"/>
   </w:num>
   <w:num w:numId="70" w16cid:durableId="336662050">
-    <w:abstractNumId w:val="59"/>
+    <w:abstractNumId w:val="62"/>
   </w:num>
   <w:num w:numId="71" w16cid:durableId="1460032333">
-    <w:abstractNumId w:val="73"/>
+    <w:abstractNumId w:val="77"/>
   </w:num>
   <w:num w:numId="72" w16cid:durableId="592400615">
     <w:abstractNumId w:val="6"/>
   </w:num>
   <w:num w:numId="73" w16cid:durableId="1879049234">
+    <w:abstractNumId w:val="25"/>
+  </w:num>
+  <w:num w:numId="74" w16cid:durableId="1747679558">
+    <w:abstractNumId w:val="29"/>
+  </w:num>
+  <w:num w:numId="75" w16cid:durableId="55278029">
     <w:abstractNumId w:val="23"/>
   </w:num>
-  <w:num w:numId="74" w16cid:durableId="1747679558">
-    <w:abstractNumId w:val="26"/>
-  </w:num>
-  <w:num w:numId="75" w16cid:durableId="55278029">
-    <w:abstractNumId w:val="21"/>
-  </w:num>
   <w:num w:numId="76" w16cid:durableId="1032193382">
-    <w:abstractNumId w:val="22"/>
+    <w:abstractNumId w:val="24"/>
   </w:num>
   <w:num w:numId="77" w16cid:durableId="763109604">
-    <w:abstractNumId w:val="55"/>
+    <w:abstractNumId w:val="58"/>
   </w:num>
   <w:num w:numId="78" w16cid:durableId="2138137265">
-    <w:abstractNumId w:val="64"/>
+    <w:abstractNumId w:val="67"/>
   </w:num>
   <w:num w:numId="79" w16cid:durableId="343675924">
-    <w:abstractNumId w:val="77"/>
+    <w:abstractNumId w:val="81"/>
   </w:num>
   <w:num w:numId="80" w16cid:durableId="1823277442">
-    <w:abstractNumId w:val="27"/>
+    <w:abstractNumId w:val="30"/>
   </w:num>
   <w:num w:numId="81" w16cid:durableId="1686900155">
     <w:abstractNumId w:val="0"/>
   </w:num>
   <w:num w:numId="82" w16cid:durableId="1113326280">
-    <w:abstractNumId w:val="51"/>
+    <w:abstractNumId w:val="54"/>
   </w:num>
   <w:num w:numId="83" w16cid:durableId="1253051103">
-    <w:abstractNumId w:val="71"/>
+    <w:abstractNumId w:val="75"/>
   </w:num>
   <w:num w:numId="84" w16cid:durableId="444888444">
-    <w:abstractNumId w:val="34"/>
+    <w:abstractNumId w:val="37"/>
   </w:num>
   <w:num w:numId="85" w16cid:durableId="64299649">
-    <w:abstractNumId w:val="66"/>
+    <w:abstractNumId w:val="69"/>
   </w:num>
   <w:num w:numId="86" w16cid:durableId="868182992">
-    <w:abstractNumId w:val="40"/>
+    <w:abstractNumId w:val="43"/>
+  </w:num>
+  <w:num w:numId="87" w16cid:durableId="896863331">
+    <w:abstractNumId w:val="18"/>
+  </w:num>
+  <w:num w:numId="88" w16cid:durableId="505442826">
+    <w:abstractNumId w:val="70"/>
+  </w:num>
+  <w:num w:numId="89" w16cid:durableId="1858763908">
+    <w:abstractNumId w:val="27"/>
+  </w:num>
+  <w:num w:numId="90" w16cid:durableId="1896088176">
+    <w:abstractNumId w:val="8"/>
   </w:num>
   <w:numIdMacAtCleanup w:val="45"/>
 </w:numbering>

</xml_diff>

<commit_message>
Dispute Resolution Sequence Diagram (#237)
</commit_message>
<xml_diff>
--- a/Sequence Specification Document.docx
+++ b/Sequence Specification Document.docx
@@ -2157,7 +2157,7 @@
       </w:pPr>
       <w:r>
         <w:lastRenderedPageBreak/>
-        <w:t>Payment Processing Sequence Diagram Documentation</w:t>
+        <w:t xml:space="preserve">Payment Processing Sequence </w:t>
       </w:r>
     </w:p>
     <w:p>
@@ -2829,18 +2829,15 @@
     </w:p>
     <w:p>
       <w:pPr>
-        <w:rPr>
-          <w:b/>
-          <w:bCs/>
-        </w:rPr>
-      </w:pPr>
-      <w:r>
-        <w:rPr>
-          <w:b/>
-          <w:bCs/>
-        </w:rPr>
+        <w:pStyle w:val="Heading3"/>
+        <w:numPr>
+          <w:ilvl w:val="0"/>
+          <w:numId w:val="74"/>
+        </w:numPr>
+      </w:pPr>
+      <w:r>
         <w:lastRenderedPageBreak/>
-        <w:t>Fleet Management Sequence Diagram Documentation</w:t>
+        <w:t xml:space="preserve">Fleet Management Sequence </w:t>
       </w:r>
     </w:p>
     <w:p>
@@ -3368,18 +3365,15 @@
     </w:p>
     <w:p>
       <w:pPr>
-        <w:rPr>
-          <w:b/>
-          <w:bCs/>
-        </w:rPr>
-      </w:pPr>
-      <w:r>
-        <w:rPr>
-          <w:b/>
-          <w:bCs/>
-        </w:rPr>
+        <w:pStyle w:val="Heading3"/>
+        <w:numPr>
+          <w:ilvl w:val="0"/>
+          <w:numId w:val="74"/>
+        </w:numPr>
+      </w:pPr>
+      <w:r>
         <w:lastRenderedPageBreak/>
-        <w:t>Branch &amp; Employee Management Sequence Diagram Documentation</w:t>
+        <w:t xml:space="preserve">Branch &amp; Employee Management Sequence </w:t>
       </w:r>
     </w:p>
     <w:p>
@@ -4072,7 +4066,7 @@
           <w:rFonts w:eastAsiaTheme="minorHAnsi"/>
         </w:rPr>
         <w:lastRenderedPageBreak/>
-        <w:t>Agency Verification Sequence Diagram Documentation</w:t>
+        <w:t xml:space="preserve">Agency Verification Sequence </w:t>
       </w:r>
     </w:p>
     <w:p>
@@ -4684,6 +4678,607 @@
       <w:pPr>
         <w:spacing w:line="278" w:lineRule="auto"/>
       </w:pPr>
+      <w:r>
+        <w:br w:type="page"/>
+      </w:r>
+    </w:p>
+    <w:p>
+      <w:pPr>
+        <w:pStyle w:val="Heading3"/>
+        <w:numPr>
+          <w:ilvl w:val="0"/>
+          <w:numId w:val="74"/>
+        </w:numPr>
+      </w:pPr>
+      <w:r>
+        <w:lastRenderedPageBreak/>
+        <w:t xml:space="preserve">Dispute Resolution Sequence </w:t>
+      </w:r>
+    </w:p>
+    <w:p>
+      <w:pPr>
+        <w:spacing w:line="278" w:lineRule="auto"/>
+        <w:rPr>
+          <w:b/>
+          <w:bCs/>
+        </w:rPr>
+      </w:pPr>
+      <w:r>
+        <w:rPr>
+          <w:b/>
+          <w:bCs/>
+        </w:rPr>
+        <w:t>Purpose</w:t>
+      </w:r>
+    </w:p>
+    <w:p>
+      <w:pPr>
+        <w:spacing w:line="278" w:lineRule="auto"/>
+      </w:pPr>
+      <w:r>
+        <w:t>The diagram of dispute resolution displays how interactions are made between users, administrators, and various components of the system throughout the entire process of dispute management in the KriGo platform. It describes the process of submitting disputes, verifying information provided, processing disputes, assessing administrative actions taken, and notifying the parties involved about the decisions made.</w:t>
+      </w:r>
+    </w:p>
+    <w:p>
+      <w:pPr>
+        <w:spacing w:line="278" w:lineRule="auto"/>
+      </w:pPr>
+      <w:r>
+        <w:t>The diagram allows for data to be processed in a transparent, systematic, and consistent way.</w:t>
+      </w:r>
+    </w:p>
+    <w:p>
+      <w:pPr>
+        <w:spacing w:line="278" w:lineRule="auto"/>
+        <w:rPr>
+          <w:b/>
+          <w:bCs/>
+        </w:rPr>
+      </w:pPr>
+      <w:r>
+        <w:rPr>
+          <w:b/>
+          <w:bCs/>
+        </w:rPr>
+        <w:t>Participating Objects</w:t>
+      </w:r>
+    </w:p>
+    <w:p>
+      <w:pPr>
+        <w:spacing w:line="278" w:lineRule="auto"/>
+      </w:pPr>
+      <w:r>
+        <w:t>The sequence diagram includes the following participants:</w:t>
+      </w:r>
+    </w:p>
+    <w:p>
+      <w:pPr>
+        <w:numPr>
+          <w:ilvl w:val="0"/>
+          <w:numId w:val="91"/>
+        </w:numPr>
+        <w:spacing w:line="278" w:lineRule="auto"/>
+      </w:pPr>
+      <w:r>
+        <w:rPr>
+          <w:b/>
+          <w:bCs/>
+        </w:rPr>
+        <w:t>Customer / Rental Agency (Actor):</w:t>
+      </w:r>
+      <w:r>
+        <w:t xml:space="preserve"> Initiates a dispute regarding a reservation, payment, vehicle condition, or another rental-related issue.</w:t>
+      </w:r>
+    </w:p>
+    <w:p>
+      <w:pPr>
+        <w:numPr>
+          <w:ilvl w:val="0"/>
+          <w:numId w:val="91"/>
+        </w:numPr>
+        <w:spacing w:line="278" w:lineRule="auto"/>
+      </w:pPr>
+      <w:r>
+        <w:rPr>
+          <w:b/>
+          <w:bCs/>
+        </w:rPr>
+        <w:t>Administrator (Actor):</w:t>
+      </w:r>
+      <w:r>
+        <w:t xml:space="preserve"> Reviews submitted disputes, investigates the case, and determines the final resolution.</w:t>
+      </w:r>
+    </w:p>
+    <w:p>
+      <w:pPr>
+        <w:numPr>
+          <w:ilvl w:val="0"/>
+          <w:numId w:val="91"/>
+        </w:numPr>
+        <w:spacing w:line="278" w:lineRule="auto"/>
+      </w:pPr>
+      <w:proofErr w:type="spellStart"/>
+      <w:r>
+        <w:rPr>
+          <w:b/>
+          <w:bCs/>
+        </w:rPr>
+        <w:t>DisputeUI</w:t>
+      </w:r>
+      <w:proofErr w:type="spellEnd"/>
+      <w:r>
+        <w:rPr>
+          <w:b/>
+          <w:bCs/>
+        </w:rPr>
+        <w:t xml:space="preserve"> (Boundary):</w:t>
+      </w:r>
+      <w:r>
+        <w:t xml:space="preserve"> Provides the interface for submitting, reviewing, and managing disputes.</w:t>
+      </w:r>
+    </w:p>
+    <w:p>
+      <w:pPr>
+        <w:numPr>
+          <w:ilvl w:val="0"/>
+          <w:numId w:val="91"/>
+        </w:numPr>
+        <w:spacing w:line="278" w:lineRule="auto"/>
+      </w:pPr>
+      <w:r>
+        <w:rPr>
+          <w:b/>
+          <w:bCs/>
+        </w:rPr>
+        <w:t>DisputeController (Control):</w:t>
+      </w:r>
+      <w:r>
+        <w:t xml:space="preserve"> Coordinates the dispute resolution workflow and applies business rules.</w:t>
+      </w:r>
+    </w:p>
+    <w:p>
+      <w:pPr>
+        <w:numPr>
+          <w:ilvl w:val="0"/>
+          <w:numId w:val="91"/>
+        </w:numPr>
+        <w:spacing w:line="278" w:lineRule="auto"/>
+      </w:pPr>
+      <w:r>
+        <w:rPr>
+          <w:b/>
+          <w:bCs/>
+        </w:rPr>
+        <w:t>ValidationService (Control):</w:t>
+      </w:r>
+      <w:r>
+        <w:t xml:space="preserve"> Validates the dispute information before it is processed.</w:t>
+      </w:r>
+    </w:p>
+    <w:p>
+      <w:pPr>
+        <w:numPr>
+          <w:ilvl w:val="0"/>
+          <w:numId w:val="91"/>
+        </w:numPr>
+        <w:spacing w:line="278" w:lineRule="auto"/>
+      </w:pPr>
+      <w:r>
+        <w:rPr>
+          <w:b/>
+          <w:bCs/>
+        </w:rPr>
+        <w:t>DisputeRepository (Entity):</w:t>
+      </w:r>
+      <w:r>
+        <w:t xml:space="preserve"> Stores and retrieves dispute records.</w:t>
+      </w:r>
+    </w:p>
+    <w:p>
+      <w:pPr>
+        <w:numPr>
+          <w:ilvl w:val="0"/>
+          <w:numId w:val="91"/>
+        </w:numPr>
+        <w:spacing w:line="278" w:lineRule="auto"/>
+      </w:pPr>
+      <w:r>
+        <w:rPr>
+          <w:b/>
+          <w:bCs/>
+        </w:rPr>
+        <w:t>NotificationService (Control):</w:t>
+      </w:r>
+      <w:r>
+        <w:t xml:space="preserve"> Sends notifications regarding the dispute status and final decision.</w:t>
+      </w:r>
+    </w:p>
+    <w:p>
+      <w:pPr>
+        <w:numPr>
+          <w:ilvl w:val="0"/>
+          <w:numId w:val="91"/>
+        </w:numPr>
+        <w:spacing w:line="278" w:lineRule="auto"/>
+      </w:pPr>
+      <w:r>
+        <w:rPr>
+          <w:b/>
+          <w:bCs/>
+        </w:rPr>
+        <w:t>Database (Database):</w:t>
+      </w:r>
+      <w:r>
+        <w:t xml:space="preserve"> Stores dispute information and resolution records.</w:t>
+      </w:r>
+    </w:p>
+    <w:p>
+      <w:pPr>
+        <w:spacing w:line="278" w:lineRule="auto"/>
+        <w:rPr>
+          <w:b/>
+          <w:bCs/>
+        </w:rPr>
+      </w:pPr>
+      <w:r>
+        <w:rPr>
+          <w:b/>
+          <w:bCs/>
+        </w:rPr>
+        <w:t>Dispute Submission Process</w:t>
+      </w:r>
+    </w:p>
+    <w:p>
+      <w:pPr>
+        <w:spacing w:line="278" w:lineRule="auto"/>
+      </w:pPr>
+      <w:r>
+        <w:t xml:space="preserve">The procedure for dispute resolution starts with a customer or rental company lodging the dispute via the Dispute User Interface (UI). This submitted information generally contains reservation ID, description of the issue that needs resolution, and other related proof. </w:t>
+      </w:r>
+    </w:p>
+    <w:p>
+      <w:pPr>
+        <w:spacing w:line="278" w:lineRule="auto"/>
+        <w:rPr>
+          <w:b/>
+          <w:bCs/>
+        </w:rPr>
+      </w:pPr>
+      <w:r>
+        <w:t>The Dispute Controller requests services of the ValidationService, which ascertains the completeness of the submitted data. After confirming that the data received is complete, the Dispute Controller utilizes services of the Dispute Repository and sends the data for its storage in the database.</w:t>
+      </w:r>
+      <w:r>
+        <w:rPr>
+          <w:b/>
+          <w:bCs/>
+        </w:rPr>
+        <w:br w:type="page"/>
+      </w:r>
+    </w:p>
+    <w:p>
+      <w:pPr>
+        <w:spacing w:line="278" w:lineRule="auto"/>
+        <w:rPr>
+          <w:b/>
+          <w:bCs/>
+        </w:rPr>
+      </w:pPr>
+      <w:r>
+        <w:rPr>
+          <w:b/>
+          <w:bCs/>
+        </w:rPr>
+        <w:lastRenderedPageBreak/>
+        <w:t>Dispute Investigation</w:t>
+      </w:r>
+    </w:p>
+    <w:p>
+      <w:pPr>
+        <w:spacing w:line="278" w:lineRule="auto"/>
+      </w:pPr>
+      <w:r>
+        <w:t>Subsequent to submission, the administrator checks the list of disputes awaiting resolution and chooses a particular dispute for investigation. The DisputeController accesses the data related to the dispute from the DisputeRepository, which gets the necessary information from the database.</w:t>
+      </w:r>
+    </w:p>
+    <w:p>
+      <w:pPr>
+        <w:spacing w:line="278" w:lineRule="auto"/>
+      </w:pPr>
+      <w:r>
+        <w:t>The administrator goes through the complaint and verifies the evidence in order to arrive at the correct decision, adhering to the rules of the platform and considering the available evidence.</w:t>
+      </w:r>
+    </w:p>
+    <w:p>
+      <w:pPr>
+        <w:spacing w:line="278" w:lineRule="auto"/>
+        <w:rPr>
+          <w:b/>
+          <w:bCs/>
+        </w:rPr>
+      </w:pPr>
+      <w:r>
+        <w:rPr>
+          <w:b/>
+          <w:bCs/>
+        </w:rPr>
+        <w:t>Dispute Resolution</w:t>
+      </w:r>
+    </w:p>
+    <w:p>
+      <w:pPr>
+        <w:spacing w:line="278" w:lineRule="auto"/>
+      </w:pPr>
+      <w:r>
+        <w:t>When a dispute is found valid by the administrator, an entry is made in the database indicating that the dispute has been resolved. The NotificationService proceeds to inform both the customer and the company about the resolution.</w:t>
+      </w:r>
+    </w:p>
+    <w:p>
+      <w:pPr>
+        <w:spacing w:line="278" w:lineRule="auto"/>
+      </w:pPr>
+      <w:r>
+        <w:t>In case the dispute is not valid; the administrator rejects the claim, and updates the status. The system registers the status update in addition to notifying both parties about the rejection.</w:t>
+      </w:r>
+    </w:p>
+    <w:p>
+      <w:pPr>
+        <w:spacing w:line="278" w:lineRule="auto"/>
+        <w:rPr>
+          <w:b/>
+          <w:bCs/>
+        </w:rPr>
+      </w:pPr>
+      <w:r>
+        <w:rPr>
+          <w:b/>
+          <w:bCs/>
+        </w:rPr>
+        <w:t>Data Validation</w:t>
+      </w:r>
+    </w:p>
+    <w:p>
+      <w:pPr>
+        <w:spacing w:line="278" w:lineRule="auto"/>
+      </w:pPr>
+      <w:r>
+        <w:t xml:space="preserve">Prior to the acceptance of a dispute, the ValidationService carries out a verification process of the supplied details for completeness and accuracy. </w:t>
+      </w:r>
+    </w:p>
+    <w:p>
+      <w:pPr>
+        <w:spacing w:line="278" w:lineRule="auto"/>
+      </w:pPr>
+      <w:r>
+        <w:t>Validation involves the checking of obligatory fields, verifying that the relevant transaction or reservation exists, and checking that there is adequate information available to deal with the dispute.</w:t>
+      </w:r>
+    </w:p>
+    <w:p>
+      <w:pPr>
+        <w:spacing w:line="278" w:lineRule="auto"/>
+        <w:rPr>
+          <w:b/>
+          <w:bCs/>
+        </w:rPr>
+      </w:pPr>
+      <w:r>
+        <w:rPr>
+          <w:b/>
+          <w:bCs/>
+        </w:rPr>
+        <w:t>Alternative and Exceptional Flows</w:t>
+      </w:r>
+    </w:p>
+    <w:p>
+      <w:pPr>
+        <w:spacing w:line="278" w:lineRule="auto"/>
+      </w:pPr>
+      <w:r>
+        <w:t>The Dispute Resolution Sequence Diagram incorporates several alternative scenarios:</w:t>
+      </w:r>
+    </w:p>
+    <w:p>
+      <w:pPr>
+        <w:numPr>
+          <w:ilvl w:val="0"/>
+          <w:numId w:val="93"/>
+        </w:numPr>
+        <w:spacing w:after="0" w:line="276" w:lineRule="auto"/>
+      </w:pPr>
+      <w:r>
+        <w:t>Invalid or incomplete dispute information.</w:t>
+      </w:r>
+    </w:p>
+    <w:p>
+      <w:pPr>
+        <w:numPr>
+          <w:ilvl w:val="0"/>
+          <w:numId w:val="93"/>
+        </w:numPr>
+        <w:spacing w:after="0" w:line="276" w:lineRule="auto"/>
+      </w:pPr>
+      <w:r>
+        <w:t>Successful dispute submission.</w:t>
+      </w:r>
+    </w:p>
+    <w:p>
+      <w:pPr>
+        <w:numPr>
+          <w:ilvl w:val="0"/>
+          <w:numId w:val="93"/>
+        </w:numPr>
+        <w:spacing w:after="0" w:line="276" w:lineRule="auto"/>
+      </w:pPr>
+      <w:r>
+        <w:t>Administrative approval and dispute resolution.</w:t>
+      </w:r>
+    </w:p>
+    <w:p>
+      <w:pPr>
+        <w:numPr>
+          <w:ilvl w:val="0"/>
+          <w:numId w:val="93"/>
+        </w:numPr>
+        <w:spacing w:line="276" w:lineRule="auto"/>
+      </w:pPr>
+      <w:r>
+        <w:t>Administrative rejection of the dispute.</w:t>
+      </w:r>
+    </w:p>
+    <w:p>
+      <w:pPr>
+        <w:spacing w:line="278" w:lineRule="auto"/>
+      </w:pPr>
+      <w:r>
+        <w:t>These alternative flows ensure that disputes are processed consistently while maintaining the integrity of dispute records and providing clear communication to all parties.</w:t>
+      </w:r>
+    </w:p>
+    <w:p>
+      <w:pPr>
+        <w:spacing w:line="278" w:lineRule="auto"/>
+        <w:rPr>
+          <w:b/>
+          <w:bCs/>
+        </w:rPr>
+      </w:pPr>
+      <w:r>
+        <w:rPr>
+          <w:b/>
+          <w:bCs/>
+        </w:rPr>
+        <w:br w:type="page"/>
+      </w:r>
+    </w:p>
+    <w:p>
+      <w:pPr>
+        <w:spacing w:line="278" w:lineRule="auto"/>
+        <w:rPr>
+          <w:b/>
+          <w:bCs/>
+        </w:rPr>
+      </w:pPr>
+      <w:r>
+        <w:rPr>
+          <w:b/>
+          <w:bCs/>
+        </w:rPr>
+        <w:lastRenderedPageBreak/>
+        <w:t>Conclusion</w:t>
+      </w:r>
+    </w:p>
+    <w:p>
+      <w:pPr>
+        <w:spacing w:line="278" w:lineRule="auto"/>
+      </w:pPr>
+      <w:r>
+        <w:t>The Dispute Resolution Sequence Diagram offers a detailed overview of the dispute management workflow throughout the KriGo system. This diagram reflects the interactions amongst the presentation layer, business logic layer, validation services, data storage layer and notification services that provide assistance with respect to submitting disputes, investigating disputed cases, resolving conflicts, and rejecting disputes.</w:t>
+      </w:r>
+    </w:p>
+    <w:p>
+      <w:pPr>
+        <w:keepNext/>
+        <w:spacing w:line="278" w:lineRule="auto"/>
+      </w:pPr>
+      <w:r>
+        <w:rPr>
+          <w:noProof/>
+        </w:rPr>
+        <w:drawing>
+          <wp:inline distT="0" distB="0" distL="0" distR="0" wp14:anchorId="25CA3634" wp14:editId="3DF1ED68">
+            <wp:extent cx="5934075" cy="7010400"/>
+            <wp:effectExtent l="0" t="0" r="9525" b="0"/>
+            <wp:docPr id="1765002343" name="Picture 8"/>
+            <wp:cNvGraphicFramePr>
+              <a:graphicFrameLocks xmlns:a="http://schemas.openxmlformats.org/drawingml/2006/main" noChangeAspect="1"/>
+            </wp:cNvGraphicFramePr>
+            <a:graphic xmlns:a="http://schemas.openxmlformats.org/drawingml/2006/main">
+              <a:graphicData uri="http://schemas.openxmlformats.org/drawingml/2006/picture">
+                <pic:pic xmlns:pic="http://schemas.openxmlformats.org/drawingml/2006/picture">
+                  <pic:nvPicPr>
+                    <pic:cNvPr id="0" name="Picture 11"/>
+                    <pic:cNvPicPr>
+                      <a:picLocks noChangeAspect="1" noChangeArrowheads="1"/>
+                    </pic:cNvPicPr>
+                  </pic:nvPicPr>
+                  <pic:blipFill>
+                    <a:blip r:embed="rId15" cstate="print">
+                      <a:extLst>
+                        <a:ext uri="{28A0092B-C50C-407E-A947-70E740481C1C}">
+                          <a14:useLocalDpi xmlns:a14="http://schemas.microsoft.com/office/drawing/2010/main" val="0"/>
+                        </a:ext>
+                      </a:extLst>
+                    </a:blip>
+                    <a:srcRect/>
+                    <a:stretch>
+                      <a:fillRect/>
+                    </a:stretch>
+                  </pic:blipFill>
+                  <pic:spPr bwMode="auto">
+                    <a:xfrm>
+                      <a:off x="0" y="0"/>
+                      <a:ext cx="5934075" cy="7010400"/>
+                    </a:xfrm>
+                    <a:prstGeom prst="rect">
+                      <a:avLst/>
+                    </a:prstGeom>
+                    <a:noFill/>
+                    <a:ln>
+                      <a:noFill/>
+                    </a:ln>
+                  </pic:spPr>
+                </pic:pic>
+              </a:graphicData>
+            </a:graphic>
+          </wp:inline>
+        </w:drawing>
+      </w:r>
+    </w:p>
+    <w:p>
+      <w:pPr>
+        <w:pStyle w:val="Caption"/>
+      </w:pPr>
+      <w:r>
+        <w:t xml:space="preserve">Figure </w:t>
+      </w:r>
+      <w:r>
+        <w:fldChar w:fldCharType="begin"/>
+      </w:r>
+      <w:r>
+        <w:instrText xml:space="preserve"> SEQ Figure \* ARABIC </w:instrText>
+      </w:r>
+      <w:r>
+        <w:fldChar w:fldCharType="separate"/>
+      </w:r>
+      <w:r>
+        <w:rPr>
+          <w:noProof/>
+        </w:rPr>
+        <w:t>8</w:t>
+      </w:r>
+      <w:r>
+        <w:fldChar w:fldCharType="end"/>
+      </w:r>
+      <w:r>
+        <w:t xml:space="preserve"> - Dispute Resolution Sequence Diagram</w:t>
+      </w:r>
+    </w:p>
+    <w:p>
+      <w:pPr>
+        <w:spacing w:line="278" w:lineRule="auto"/>
+      </w:pPr>
+      <w:r>
+        <w:lastRenderedPageBreak/>
+        <w:br w:type="page"/>
+      </w:r>
+    </w:p>
+    <w:p>
+      <w:pPr>
+        <w:spacing w:line="278" w:lineRule="auto"/>
+      </w:pPr>
+    </w:p>
+    <w:p>
+      <w:pPr>
+        <w:spacing w:line="278" w:lineRule="auto"/>
+      </w:pPr>
     </w:p>
     <w:sectPr>
       <w:pgSz w:w="11906" w:h="16838" w:code="9"/>
@@ -5498,6 +6093,155 @@
     </w:lvl>
   </w:abstractNum>
   <w:abstractNum w:abstractNumId="6" w15:restartNumberingAfterBreak="0">
+    <w:nsid w:val="08BB19BF"/>
+    <w:multiLevelType w:val="multilevel"/>
+    <w:tmpl w:val="C5807BB2"/>
+    <w:lvl w:ilvl="0">
+      <w:start w:val="1"/>
+      <w:numFmt w:val="bullet"/>
+      <w:lvlText w:val=""/>
+      <w:lvlJc w:val="left"/>
+      <w:pPr>
+        <w:tabs>
+          <w:tab w:val="num" w:pos="720"/>
+        </w:tabs>
+        <w:ind w:left="720" w:hanging="360"/>
+      </w:pPr>
+      <w:rPr>
+        <w:rFonts w:ascii="Symbol" w:hAnsi="Symbol" w:hint="default"/>
+        <w:sz w:val="20"/>
+      </w:rPr>
+    </w:lvl>
+    <w:lvl w:ilvl="1" w:tentative="1">
+      <w:start w:val="1"/>
+      <w:numFmt w:val="bullet"/>
+      <w:lvlText w:val="o"/>
+      <w:lvlJc w:val="left"/>
+      <w:pPr>
+        <w:tabs>
+          <w:tab w:val="num" w:pos="1440"/>
+        </w:tabs>
+        <w:ind w:left="1440" w:hanging="360"/>
+      </w:pPr>
+      <w:rPr>
+        <w:rFonts w:ascii="Courier New" w:hAnsi="Courier New" w:hint="default"/>
+        <w:sz w:val="20"/>
+      </w:rPr>
+    </w:lvl>
+    <w:lvl w:ilvl="2" w:tentative="1">
+      <w:start w:val="1"/>
+      <w:numFmt w:val="bullet"/>
+      <w:lvlText w:val=""/>
+      <w:lvlJc w:val="left"/>
+      <w:pPr>
+        <w:tabs>
+          <w:tab w:val="num" w:pos="2160"/>
+        </w:tabs>
+        <w:ind w:left="2160" w:hanging="360"/>
+      </w:pPr>
+      <w:rPr>
+        <w:rFonts w:ascii="Wingdings" w:hAnsi="Wingdings" w:hint="default"/>
+        <w:sz w:val="20"/>
+      </w:rPr>
+    </w:lvl>
+    <w:lvl w:ilvl="3" w:tentative="1">
+      <w:start w:val="1"/>
+      <w:numFmt w:val="bullet"/>
+      <w:lvlText w:val=""/>
+      <w:lvlJc w:val="left"/>
+      <w:pPr>
+        <w:tabs>
+          <w:tab w:val="num" w:pos="2880"/>
+        </w:tabs>
+        <w:ind w:left="2880" w:hanging="360"/>
+      </w:pPr>
+      <w:rPr>
+        <w:rFonts w:ascii="Wingdings" w:hAnsi="Wingdings" w:hint="default"/>
+        <w:sz w:val="20"/>
+      </w:rPr>
+    </w:lvl>
+    <w:lvl w:ilvl="4" w:tentative="1">
+      <w:start w:val="1"/>
+      <w:numFmt w:val="bullet"/>
+      <w:lvlText w:val=""/>
+      <w:lvlJc w:val="left"/>
+      <w:pPr>
+        <w:tabs>
+          <w:tab w:val="num" w:pos="3600"/>
+        </w:tabs>
+        <w:ind w:left="3600" w:hanging="360"/>
+      </w:pPr>
+      <w:rPr>
+        <w:rFonts w:ascii="Wingdings" w:hAnsi="Wingdings" w:hint="default"/>
+        <w:sz w:val="20"/>
+      </w:rPr>
+    </w:lvl>
+    <w:lvl w:ilvl="5" w:tentative="1">
+      <w:start w:val="1"/>
+      <w:numFmt w:val="bullet"/>
+      <w:lvlText w:val=""/>
+      <w:lvlJc w:val="left"/>
+      <w:pPr>
+        <w:tabs>
+          <w:tab w:val="num" w:pos="4320"/>
+        </w:tabs>
+        <w:ind w:left="4320" w:hanging="360"/>
+      </w:pPr>
+      <w:rPr>
+        <w:rFonts w:ascii="Wingdings" w:hAnsi="Wingdings" w:hint="default"/>
+        <w:sz w:val="20"/>
+      </w:rPr>
+    </w:lvl>
+    <w:lvl w:ilvl="6" w:tentative="1">
+      <w:start w:val="1"/>
+      <w:numFmt w:val="bullet"/>
+      <w:lvlText w:val=""/>
+      <w:lvlJc w:val="left"/>
+      <w:pPr>
+        <w:tabs>
+          <w:tab w:val="num" w:pos="5040"/>
+        </w:tabs>
+        <w:ind w:left="5040" w:hanging="360"/>
+      </w:pPr>
+      <w:rPr>
+        <w:rFonts w:ascii="Wingdings" w:hAnsi="Wingdings" w:hint="default"/>
+        <w:sz w:val="20"/>
+      </w:rPr>
+    </w:lvl>
+    <w:lvl w:ilvl="7" w:tentative="1">
+      <w:start w:val="1"/>
+      <w:numFmt w:val="bullet"/>
+      <w:lvlText w:val=""/>
+      <w:lvlJc w:val="left"/>
+      <w:pPr>
+        <w:tabs>
+          <w:tab w:val="num" w:pos="5760"/>
+        </w:tabs>
+        <w:ind w:left="5760" w:hanging="360"/>
+      </w:pPr>
+      <w:rPr>
+        <w:rFonts w:ascii="Wingdings" w:hAnsi="Wingdings" w:hint="default"/>
+        <w:sz w:val="20"/>
+      </w:rPr>
+    </w:lvl>
+    <w:lvl w:ilvl="8" w:tentative="1">
+      <w:start w:val="1"/>
+      <w:numFmt w:val="bullet"/>
+      <w:lvlText w:val=""/>
+      <w:lvlJc w:val="left"/>
+      <w:pPr>
+        <w:tabs>
+          <w:tab w:val="num" w:pos="6480"/>
+        </w:tabs>
+        <w:ind w:left="6480" w:hanging="360"/>
+      </w:pPr>
+      <w:rPr>
+        <w:rFonts w:ascii="Wingdings" w:hAnsi="Wingdings" w:hint="default"/>
+        <w:sz w:val="20"/>
+      </w:rPr>
+    </w:lvl>
+  </w:abstractNum>
+  <w:abstractNum w:abstractNumId="7" w15:restartNumberingAfterBreak="0">
     <w:nsid w:val="08D32D08"/>
     <w:multiLevelType w:val="multilevel"/>
     <w:tmpl w:val="A32449CA"/>
@@ -5646,7 +6390,7 @@
       </w:rPr>
     </w:lvl>
   </w:abstractNum>
-  <w:abstractNum w:abstractNumId="7" w15:restartNumberingAfterBreak="0">
+  <w:abstractNum w:abstractNumId="8" w15:restartNumberingAfterBreak="0">
     <w:nsid w:val="0CC17936"/>
     <w:multiLevelType w:val="multilevel"/>
     <w:tmpl w:val="B5E0C4F8"/>
@@ -5795,7 +6539,7 @@
       </w:rPr>
     </w:lvl>
   </w:abstractNum>
-  <w:abstractNum w:abstractNumId="8" w15:restartNumberingAfterBreak="0">
+  <w:abstractNum w:abstractNumId="9" w15:restartNumberingAfterBreak="0">
     <w:nsid w:val="0E1040E2"/>
     <w:multiLevelType w:val="multilevel"/>
     <w:tmpl w:val="607CCC88"/>
@@ -5944,7 +6688,7 @@
       </w:rPr>
     </w:lvl>
   </w:abstractNum>
-  <w:abstractNum w:abstractNumId="9" w15:restartNumberingAfterBreak="0">
+  <w:abstractNum w:abstractNumId="10" w15:restartNumberingAfterBreak="0">
     <w:nsid w:val="0E2561E7"/>
     <w:multiLevelType w:val="hybridMultilevel"/>
     <w:tmpl w:val="2A6E4870"/>
@@ -6057,7 +6801,7 @@
       </w:rPr>
     </w:lvl>
   </w:abstractNum>
-  <w:abstractNum w:abstractNumId="10" w15:restartNumberingAfterBreak="0">
+  <w:abstractNum w:abstractNumId="11" w15:restartNumberingAfterBreak="0">
     <w:nsid w:val="0E841C27"/>
     <w:multiLevelType w:val="hybridMultilevel"/>
     <w:tmpl w:val="789C7F32"/>
@@ -6170,7 +6914,7 @@
       </w:rPr>
     </w:lvl>
   </w:abstractNum>
-  <w:abstractNum w:abstractNumId="11" w15:restartNumberingAfterBreak="0">
+  <w:abstractNum w:abstractNumId="12" w15:restartNumberingAfterBreak="0">
     <w:nsid w:val="0FAA2602"/>
     <w:multiLevelType w:val="hybridMultilevel"/>
     <w:tmpl w:val="C6C63128"/>
@@ -6283,7 +7027,7 @@
       </w:rPr>
     </w:lvl>
   </w:abstractNum>
-  <w:abstractNum w:abstractNumId="12" w15:restartNumberingAfterBreak="0">
+  <w:abstractNum w:abstractNumId="13" w15:restartNumberingAfterBreak="0">
     <w:nsid w:val="122550ED"/>
     <w:multiLevelType w:val="hybridMultilevel"/>
     <w:tmpl w:val="91ACE480"/>
@@ -6396,7 +7140,7 @@
       </w:rPr>
     </w:lvl>
   </w:abstractNum>
-  <w:abstractNum w:abstractNumId="13" w15:restartNumberingAfterBreak="0">
+  <w:abstractNum w:abstractNumId="14" w15:restartNumberingAfterBreak="0">
     <w:nsid w:val="124C1BAE"/>
     <w:multiLevelType w:val="hybridMultilevel"/>
     <w:tmpl w:val="04988FC0"/>
@@ -6509,7 +7253,7 @@
       </w:rPr>
     </w:lvl>
   </w:abstractNum>
-  <w:abstractNum w:abstractNumId="14" w15:restartNumberingAfterBreak="0">
+  <w:abstractNum w:abstractNumId="15" w15:restartNumberingAfterBreak="0">
     <w:nsid w:val="139F7557"/>
     <w:multiLevelType w:val="multilevel"/>
     <w:tmpl w:val="A984C1D4"/>
@@ -6658,7 +7402,7 @@
       </w:rPr>
     </w:lvl>
   </w:abstractNum>
-  <w:abstractNum w:abstractNumId="15" w15:restartNumberingAfterBreak="0">
+  <w:abstractNum w:abstractNumId="16" w15:restartNumberingAfterBreak="0">
     <w:nsid w:val="16D400B4"/>
     <w:multiLevelType w:val="hybridMultilevel"/>
     <w:tmpl w:val="58E6DFBE"/>
@@ -6771,7 +7515,7 @@
       </w:rPr>
     </w:lvl>
   </w:abstractNum>
-  <w:abstractNum w:abstractNumId="16" w15:restartNumberingAfterBreak="0">
+  <w:abstractNum w:abstractNumId="17" w15:restartNumberingAfterBreak="0">
     <w:nsid w:val="17236012"/>
     <w:multiLevelType w:val="hybridMultilevel"/>
     <w:tmpl w:val="DAFA46C8"/>
@@ -6884,7 +7628,7 @@
       </w:rPr>
     </w:lvl>
   </w:abstractNum>
-  <w:abstractNum w:abstractNumId="17" w15:restartNumberingAfterBreak="0">
+  <w:abstractNum w:abstractNumId="18" w15:restartNumberingAfterBreak="0">
     <w:nsid w:val="172B04C0"/>
     <w:multiLevelType w:val="hybridMultilevel"/>
     <w:tmpl w:val="B6C41D5E"/>
@@ -6997,7 +7741,7 @@
       </w:rPr>
     </w:lvl>
   </w:abstractNum>
-  <w:abstractNum w:abstractNumId="18" w15:restartNumberingAfterBreak="0">
+  <w:abstractNum w:abstractNumId="19" w15:restartNumberingAfterBreak="0">
     <w:nsid w:val="17485CCB"/>
     <w:multiLevelType w:val="multilevel"/>
     <w:tmpl w:val="397E1AE0"/>
@@ -7146,7 +7890,7 @@
       </w:rPr>
     </w:lvl>
   </w:abstractNum>
-  <w:abstractNum w:abstractNumId="19" w15:restartNumberingAfterBreak="0">
+  <w:abstractNum w:abstractNumId="20" w15:restartNumberingAfterBreak="0">
     <w:nsid w:val="17763D31"/>
     <w:multiLevelType w:val="hybridMultilevel"/>
     <w:tmpl w:val="6CE63304"/>
@@ -7259,7 +8003,7 @@
       </w:rPr>
     </w:lvl>
   </w:abstractNum>
-  <w:abstractNum w:abstractNumId="20" w15:restartNumberingAfterBreak="0">
+  <w:abstractNum w:abstractNumId="21" w15:restartNumberingAfterBreak="0">
     <w:nsid w:val="17B06937"/>
     <w:multiLevelType w:val="hybridMultilevel"/>
     <w:tmpl w:val="71089CF2"/>
@@ -7372,7 +8116,7 @@
       </w:rPr>
     </w:lvl>
   </w:abstractNum>
-  <w:abstractNum w:abstractNumId="21" w15:restartNumberingAfterBreak="0">
+  <w:abstractNum w:abstractNumId="22" w15:restartNumberingAfterBreak="0">
     <w:nsid w:val="195875B0"/>
     <w:multiLevelType w:val="multilevel"/>
     <w:tmpl w:val="615444D4"/>
@@ -7485,7 +8229,7 @@
       </w:pPr>
     </w:lvl>
   </w:abstractNum>
-  <w:abstractNum w:abstractNumId="22" w15:restartNumberingAfterBreak="0">
+  <w:abstractNum w:abstractNumId="23" w15:restartNumberingAfterBreak="0">
     <w:nsid w:val="197C6FD7"/>
     <w:multiLevelType w:val="hybridMultilevel"/>
     <w:tmpl w:val="D97CEAA8"/>
@@ -7598,7 +8342,7 @@
       </w:rPr>
     </w:lvl>
   </w:abstractNum>
-  <w:abstractNum w:abstractNumId="23" w15:restartNumberingAfterBreak="0">
+  <w:abstractNum w:abstractNumId="24" w15:restartNumberingAfterBreak="0">
     <w:nsid w:val="1CC60A94"/>
     <w:multiLevelType w:val="multilevel"/>
     <w:tmpl w:val="EB74741C"/>
@@ -7747,7 +8491,7 @@
       </w:rPr>
     </w:lvl>
   </w:abstractNum>
-  <w:abstractNum w:abstractNumId="24" w15:restartNumberingAfterBreak="0">
+  <w:abstractNum w:abstractNumId="25" w15:restartNumberingAfterBreak="0">
     <w:nsid w:val="1E6658CF"/>
     <w:multiLevelType w:val="multilevel"/>
     <w:tmpl w:val="762ABC5E"/>
@@ -7896,7 +8640,7 @@
       </w:rPr>
     </w:lvl>
   </w:abstractNum>
-  <w:abstractNum w:abstractNumId="25" w15:restartNumberingAfterBreak="0">
+  <w:abstractNum w:abstractNumId="26" w15:restartNumberingAfterBreak="0">
     <w:nsid w:val="215C77FD"/>
     <w:multiLevelType w:val="hybridMultilevel"/>
     <w:tmpl w:val="58F41D10"/>
@@ -7985,7 +8729,7 @@
       </w:pPr>
     </w:lvl>
   </w:abstractNum>
-  <w:abstractNum w:abstractNumId="26" w15:restartNumberingAfterBreak="0">
+  <w:abstractNum w:abstractNumId="27" w15:restartNumberingAfterBreak="0">
     <w:nsid w:val="218D5909"/>
     <w:multiLevelType w:val="hybridMultilevel"/>
     <w:tmpl w:val="CC989EE4"/>
@@ -8098,7 +8842,7 @@
       </w:rPr>
     </w:lvl>
   </w:abstractNum>
-  <w:abstractNum w:abstractNumId="27" w15:restartNumberingAfterBreak="0">
+  <w:abstractNum w:abstractNumId="28" w15:restartNumberingAfterBreak="0">
     <w:nsid w:val="23E010BA"/>
     <w:multiLevelType w:val="multilevel"/>
     <w:tmpl w:val="4A16907E"/>
@@ -8247,7 +8991,7 @@
       </w:rPr>
     </w:lvl>
   </w:abstractNum>
-  <w:abstractNum w:abstractNumId="28" w15:restartNumberingAfterBreak="0">
+  <w:abstractNum w:abstractNumId="29" w15:restartNumberingAfterBreak="0">
     <w:nsid w:val="2470127A"/>
     <w:multiLevelType w:val="multilevel"/>
     <w:tmpl w:val="309E9618"/>
@@ -8396,7 +9140,7 @@
       </w:rPr>
     </w:lvl>
   </w:abstractNum>
-  <w:abstractNum w:abstractNumId="29" w15:restartNumberingAfterBreak="0">
+  <w:abstractNum w:abstractNumId="30" w15:restartNumberingAfterBreak="0">
     <w:nsid w:val="24796798"/>
     <w:multiLevelType w:val="hybridMultilevel"/>
     <w:tmpl w:val="6622BEDC"/>
@@ -8485,7 +9229,7 @@
       </w:pPr>
     </w:lvl>
   </w:abstractNum>
-  <w:abstractNum w:abstractNumId="30" w15:restartNumberingAfterBreak="0">
+  <w:abstractNum w:abstractNumId="31" w15:restartNumberingAfterBreak="0">
     <w:nsid w:val="2E4D738C"/>
     <w:multiLevelType w:val="multilevel"/>
     <w:tmpl w:val="1540BBA2"/>
@@ -8634,7 +9378,7 @@
       </w:rPr>
     </w:lvl>
   </w:abstractNum>
-  <w:abstractNum w:abstractNumId="31" w15:restartNumberingAfterBreak="0">
+  <w:abstractNum w:abstractNumId="32" w15:restartNumberingAfterBreak="0">
     <w:nsid w:val="2F0041C7"/>
     <w:multiLevelType w:val="multilevel"/>
     <w:tmpl w:val="656414FE"/>
@@ -8783,7 +9527,7 @@
       </w:rPr>
     </w:lvl>
   </w:abstractNum>
-  <w:abstractNum w:abstractNumId="32" w15:restartNumberingAfterBreak="0">
+  <w:abstractNum w:abstractNumId="33" w15:restartNumberingAfterBreak="0">
     <w:nsid w:val="304F01FA"/>
     <w:multiLevelType w:val="multilevel"/>
     <w:tmpl w:val="151C4EC6"/>
@@ -8932,7 +9676,7 @@
       </w:rPr>
     </w:lvl>
   </w:abstractNum>
-  <w:abstractNum w:abstractNumId="33" w15:restartNumberingAfterBreak="0">
+  <w:abstractNum w:abstractNumId="34" w15:restartNumberingAfterBreak="0">
     <w:nsid w:val="30BD025D"/>
     <w:multiLevelType w:val="hybridMultilevel"/>
     <w:tmpl w:val="04381C82"/>
@@ -9021,7 +9765,7 @@
       </w:pPr>
     </w:lvl>
   </w:abstractNum>
-  <w:abstractNum w:abstractNumId="34" w15:restartNumberingAfterBreak="0">
+  <w:abstractNum w:abstractNumId="35" w15:restartNumberingAfterBreak="0">
     <w:nsid w:val="327C0BA6"/>
     <w:multiLevelType w:val="hybridMultilevel"/>
     <w:tmpl w:val="2A9047EE"/>
@@ -9134,7 +9878,7 @@
       </w:rPr>
     </w:lvl>
   </w:abstractNum>
-  <w:abstractNum w:abstractNumId="35" w15:restartNumberingAfterBreak="0">
+  <w:abstractNum w:abstractNumId="36" w15:restartNumberingAfterBreak="0">
     <w:nsid w:val="338D63E8"/>
     <w:multiLevelType w:val="hybridMultilevel"/>
     <w:tmpl w:val="28D0FB50"/>
@@ -9247,7 +9991,7 @@
       </w:rPr>
     </w:lvl>
   </w:abstractNum>
-  <w:abstractNum w:abstractNumId="36" w15:restartNumberingAfterBreak="0">
+  <w:abstractNum w:abstractNumId="37" w15:restartNumberingAfterBreak="0">
     <w:nsid w:val="35413E58"/>
     <w:multiLevelType w:val="hybridMultilevel"/>
     <w:tmpl w:val="03C64164"/>
@@ -9360,7 +10104,7 @@
       </w:rPr>
     </w:lvl>
   </w:abstractNum>
-  <w:abstractNum w:abstractNumId="37" w15:restartNumberingAfterBreak="0">
+  <w:abstractNum w:abstractNumId="38" w15:restartNumberingAfterBreak="0">
     <w:nsid w:val="35C86AF0"/>
     <w:multiLevelType w:val="multilevel"/>
     <w:tmpl w:val="8202FCD6"/>
@@ -9509,7 +10253,7 @@
       </w:rPr>
     </w:lvl>
   </w:abstractNum>
-  <w:abstractNum w:abstractNumId="38" w15:restartNumberingAfterBreak="0">
+  <w:abstractNum w:abstractNumId="39" w15:restartNumberingAfterBreak="0">
     <w:nsid w:val="3623194A"/>
     <w:multiLevelType w:val="multilevel"/>
     <w:tmpl w:val="63F4E6F0"/>
@@ -9658,7 +10402,7 @@
       </w:rPr>
     </w:lvl>
   </w:abstractNum>
-  <w:abstractNum w:abstractNumId="39" w15:restartNumberingAfterBreak="0">
+  <w:abstractNum w:abstractNumId="40" w15:restartNumberingAfterBreak="0">
     <w:nsid w:val="37B424C3"/>
     <w:multiLevelType w:val="hybridMultilevel"/>
     <w:tmpl w:val="18F030D4"/>
@@ -9771,7 +10515,7 @@
       </w:rPr>
     </w:lvl>
   </w:abstractNum>
-  <w:abstractNum w:abstractNumId="40" w15:restartNumberingAfterBreak="0">
+  <w:abstractNum w:abstractNumId="41" w15:restartNumberingAfterBreak="0">
     <w:nsid w:val="3BC10D30"/>
     <w:multiLevelType w:val="multilevel"/>
     <w:tmpl w:val="502AD78C"/>
@@ -9920,7 +10664,7 @@
       </w:rPr>
     </w:lvl>
   </w:abstractNum>
-  <w:abstractNum w:abstractNumId="41" w15:restartNumberingAfterBreak="0">
+  <w:abstractNum w:abstractNumId="42" w15:restartNumberingAfterBreak="0">
     <w:nsid w:val="3CBF280A"/>
     <w:multiLevelType w:val="multilevel"/>
     <w:tmpl w:val="A13E4362"/>
@@ -10069,7 +10813,7 @@
       </w:rPr>
     </w:lvl>
   </w:abstractNum>
-  <w:abstractNum w:abstractNumId="42" w15:restartNumberingAfterBreak="0">
+  <w:abstractNum w:abstractNumId="43" w15:restartNumberingAfterBreak="0">
     <w:nsid w:val="452F60FB"/>
     <w:multiLevelType w:val="hybridMultilevel"/>
     <w:tmpl w:val="892A990A"/>
@@ -10182,7 +10926,7 @@
       </w:rPr>
     </w:lvl>
   </w:abstractNum>
-  <w:abstractNum w:abstractNumId="43" w15:restartNumberingAfterBreak="0">
+  <w:abstractNum w:abstractNumId="44" w15:restartNumberingAfterBreak="0">
     <w:nsid w:val="47BF2170"/>
     <w:multiLevelType w:val="multilevel"/>
     <w:tmpl w:val="D9681266"/>
@@ -10331,7 +11075,7 @@
       </w:rPr>
     </w:lvl>
   </w:abstractNum>
-  <w:abstractNum w:abstractNumId="44" w15:restartNumberingAfterBreak="0">
+  <w:abstractNum w:abstractNumId="45" w15:restartNumberingAfterBreak="0">
     <w:nsid w:val="47E5592F"/>
     <w:multiLevelType w:val="hybridMultilevel"/>
     <w:tmpl w:val="719AB9FA"/>
@@ -10444,7 +11188,7 @@
       </w:rPr>
     </w:lvl>
   </w:abstractNum>
-  <w:abstractNum w:abstractNumId="45" w15:restartNumberingAfterBreak="0">
+  <w:abstractNum w:abstractNumId="46" w15:restartNumberingAfterBreak="0">
     <w:nsid w:val="48C041A9"/>
     <w:multiLevelType w:val="multilevel"/>
     <w:tmpl w:val="59A694BC"/>
@@ -10593,7 +11337,7 @@
       </w:rPr>
     </w:lvl>
   </w:abstractNum>
-  <w:abstractNum w:abstractNumId="46" w15:restartNumberingAfterBreak="0">
+  <w:abstractNum w:abstractNumId="47" w15:restartNumberingAfterBreak="0">
     <w:nsid w:val="4AF73293"/>
     <w:multiLevelType w:val="hybridMultilevel"/>
     <w:tmpl w:val="F2962738"/>
@@ -10706,7 +11450,7 @@
       </w:rPr>
     </w:lvl>
   </w:abstractNum>
-  <w:abstractNum w:abstractNumId="47" w15:restartNumberingAfterBreak="0">
+  <w:abstractNum w:abstractNumId="48" w15:restartNumberingAfterBreak="0">
     <w:nsid w:val="4B375248"/>
     <w:multiLevelType w:val="multilevel"/>
     <w:tmpl w:val="B574C1C6"/>
@@ -10855,7 +11599,7 @@
       </w:rPr>
     </w:lvl>
   </w:abstractNum>
-  <w:abstractNum w:abstractNumId="48" w15:restartNumberingAfterBreak="0">
+  <w:abstractNum w:abstractNumId="49" w15:restartNumberingAfterBreak="0">
     <w:nsid w:val="4BA13766"/>
     <w:multiLevelType w:val="multilevel"/>
     <w:tmpl w:val="63F4E6F0"/>
@@ -11004,7 +11748,7 @@
       </w:rPr>
     </w:lvl>
   </w:abstractNum>
-  <w:abstractNum w:abstractNumId="49" w15:restartNumberingAfterBreak="0">
+  <w:abstractNum w:abstractNumId="50" w15:restartNumberingAfterBreak="0">
     <w:nsid w:val="4BA25441"/>
     <w:multiLevelType w:val="hybridMultilevel"/>
     <w:tmpl w:val="217E2E96"/>
@@ -11117,7 +11861,7 @@
       </w:rPr>
     </w:lvl>
   </w:abstractNum>
-  <w:abstractNum w:abstractNumId="50" w15:restartNumberingAfterBreak="0">
+  <w:abstractNum w:abstractNumId="51" w15:restartNumberingAfterBreak="0">
     <w:nsid w:val="4E276DCB"/>
     <w:multiLevelType w:val="hybridMultilevel"/>
     <w:tmpl w:val="B7C469B4"/>
@@ -11230,7 +11974,7 @@
       </w:rPr>
     </w:lvl>
   </w:abstractNum>
-  <w:abstractNum w:abstractNumId="51" w15:restartNumberingAfterBreak="0">
+  <w:abstractNum w:abstractNumId="52" w15:restartNumberingAfterBreak="0">
     <w:nsid w:val="4F053929"/>
     <w:multiLevelType w:val="hybridMultilevel"/>
     <w:tmpl w:val="2A78C678"/>
@@ -11343,7 +12087,7 @@
       </w:rPr>
     </w:lvl>
   </w:abstractNum>
-  <w:abstractNum w:abstractNumId="52" w15:restartNumberingAfterBreak="0">
+  <w:abstractNum w:abstractNumId="53" w15:restartNumberingAfterBreak="0">
     <w:nsid w:val="51737FE0"/>
     <w:multiLevelType w:val="hybridMultilevel"/>
     <w:tmpl w:val="2B0604E6"/>
@@ -11456,7 +12200,7 @@
       </w:rPr>
     </w:lvl>
   </w:abstractNum>
-  <w:abstractNum w:abstractNumId="53" w15:restartNumberingAfterBreak="0">
+  <w:abstractNum w:abstractNumId="54" w15:restartNumberingAfterBreak="0">
     <w:nsid w:val="51A86EF8"/>
     <w:multiLevelType w:val="multilevel"/>
     <w:tmpl w:val="FF2841D4"/>
@@ -11605,7 +12349,156 @@
       </w:rPr>
     </w:lvl>
   </w:abstractNum>
-  <w:abstractNum w:abstractNumId="54" w15:restartNumberingAfterBreak="0">
+  <w:abstractNum w:abstractNumId="55" w15:restartNumberingAfterBreak="0">
+    <w:nsid w:val="521378FF"/>
+    <w:multiLevelType w:val="multilevel"/>
+    <w:tmpl w:val="7B002268"/>
+    <w:lvl w:ilvl="0">
+      <w:start w:val="1"/>
+      <w:numFmt w:val="bullet"/>
+      <w:lvlText w:val=""/>
+      <w:lvlJc w:val="left"/>
+      <w:pPr>
+        <w:tabs>
+          <w:tab w:val="num" w:pos="720"/>
+        </w:tabs>
+        <w:ind w:left="720" w:hanging="360"/>
+      </w:pPr>
+      <w:rPr>
+        <w:rFonts w:ascii="Wingdings" w:hAnsi="Wingdings" w:hint="default"/>
+        <w:sz w:val="20"/>
+      </w:rPr>
+    </w:lvl>
+    <w:lvl w:ilvl="1" w:tentative="1">
+      <w:start w:val="1"/>
+      <w:numFmt w:val="bullet"/>
+      <w:lvlText w:val="o"/>
+      <w:lvlJc w:val="left"/>
+      <w:pPr>
+        <w:tabs>
+          <w:tab w:val="num" w:pos="1440"/>
+        </w:tabs>
+        <w:ind w:left="1440" w:hanging="360"/>
+      </w:pPr>
+      <w:rPr>
+        <w:rFonts w:ascii="Courier New" w:hAnsi="Courier New" w:hint="default"/>
+        <w:sz w:val="20"/>
+      </w:rPr>
+    </w:lvl>
+    <w:lvl w:ilvl="2" w:tentative="1">
+      <w:start w:val="1"/>
+      <w:numFmt w:val="bullet"/>
+      <w:lvlText w:val=""/>
+      <w:lvlJc w:val="left"/>
+      <w:pPr>
+        <w:tabs>
+          <w:tab w:val="num" w:pos="2160"/>
+        </w:tabs>
+        <w:ind w:left="2160" w:hanging="360"/>
+      </w:pPr>
+      <w:rPr>
+        <w:rFonts w:ascii="Wingdings" w:hAnsi="Wingdings" w:hint="default"/>
+        <w:sz w:val="20"/>
+      </w:rPr>
+    </w:lvl>
+    <w:lvl w:ilvl="3" w:tentative="1">
+      <w:start w:val="1"/>
+      <w:numFmt w:val="bullet"/>
+      <w:lvlText w:val=""/>
+      <w:lvlJc w:val="left"/>
+      <w:pPr>
+        <w:tabs>
+          <w:tab w:val="num" w:pos="2880"/>
+        </w:tabs>
+        <w:ind w:left="2880" w:hanging="360"/>
+      </w:pPr>
+      <w:rPr>
+        <w:rFonts w:ascii="Wingdings" w:hAnsi="Wingdings" w:hint="default"/>
+        <w:sz w:val="20"/>
+      </w:rPr>
+    </w:lvl>
+    <w:lvl w:ilvl="4" w:tentative="1">
+      <w:start w:val="1"/>
+      <w:numFmt w:val="bullet"/>
+      <w:lvlText w:val=""/>
+      <w:lvlJc w:val="left"/>
+      <w:pPr>
+        <w:tabs>
+          <w:tab w:val="num" w:pos="3600"/>
+        </w:tabs>
+        <w:ind w:left="3600" w:hanging="360"/>
+      </w:pPr>
+      <w:rPr>
+        <w:rFonts w:ascii="Wingdings" w:hAnsi="Wingdings" w:hint="default"/>
+        <w:sz w:val="20"/>
+      </w:rPr>
+    </w:lvl>
+    <w:lvl w:ilvl="5" w:tentative="1">
+      <w:start w:val="1"/>
+      <w:numFmt w:val="bullet"/>
+      <w:lvlText w:val=""/>
+      <w:lvlJc w:val="left"/>
+      <w:pPr>
+        <w:tabs>
+          <w:tab w:val="num" w:pos="4320"/>
+        </w:tabs>
+        <w:ind w:left="4320" w:hanging="360"/>
+      </w:pPr>
+      <w:rPr>
+        <w:rFonts w:ascii="Wingdings" w:hAnsi="Wingdings" w:hint="default"/>
+        <w:sz w:val="20"/>
+      </w:rPr>
+    </w:lvl>
+    <w:lvl w:ilvl="6" w:tentative="1">
+      <w:start w:val="1"/>
+      <w:numFmt w:val="bullet"/>
+      <w:lvlText w:val=""/>
+      <w:lvlJc w:val="left"/>
+      <w:pPr>
+        <w:tabs>
+          <w:tab w:val="num" w:pos="5040"/>
+        </w:tabs>
+        <w:ind w:left="5040" w:hanging="360"/>
+      </w:pPr>
+      <w:rPr>
+        <w:rFonts w:ascii="Wingdings" w:hAnsi="Wingdings" w:hint="default"/>
+        <w:sz w:val="20"/>
+      </w:rPr>
+    </w:lvl>
+    <w:lvl w:ilvl="7" w:tentative="1">
+      <w:start w:val="1"/>
+      <w:numFmt w:val="bullet"/>
+      <w:lvlText w:val=""/>
+      <w:lvlJc w:val="left"/>
+      <w:pPr>
+        <w:tabs>
+          <w:tab w:val="num" w:pos="5760"/>
+        </w:tabs>
+        <w:ind w:left="5760" w:hanging="360"/>
+      </w:pPr>
+      <w:rPr>
+        <w:rFonts w:ascii="Wingdings" w:hAnsi="Wingdings" w:hint="default"/>
+        <w:sz w:val="20"/>
+      </w:rPr>
+    </w:lvl>
+    <w:lvl w:ilvl="8" w:tentative="1">
+      <w:start w:val="1"/>
+      <w:numFmt w:val="bullet"/>
+      <w:lvlText w:val=""/>
+      <w:lvlJc w:val="left"/>
+      <w:pPr>
+        <w:tabs>
+          <w:tab w:val="num" w:pos="6480"/>
+        </w:tabs>
+        <w:ind w:left="6480" w:hanging="360"/>
+      </w:pPr>
+      <w:rPr>
+        <w:rFonts w:ascii="Wingdings" w:hAnsi="Wingdings" w:hint="default"/>
+        <w:sz w:val="20"/>
+      </w:rPr>
+    </w:lvl>
+  </w:abstractNum>
+  <w:abstractNum w:abstractNumId="56" w15:restartNumberingAfterBreak="0">
     <w:nsid w:val="521F2792"/>
     <w:multiLevelType w:val="multilevel"/>
     <w:tmpl w:val="9FB45386"/>
@@ -11754,7 +12647,7 @@
       </w:rPr>
     </w:lvl>
   </w:abstractNum>
-  <w:abstractNum w:abstractNumId="55" w15:restartNumberingAfterBreak="0">
+  <w:abstractNum w:abstractNumId="57" w15:restartNumberingAfterBreak="0">
     <w:nsid w:val="53390911"/>
     <w:multiLevelType w:val="multilevel"/>
     <w:tmpl w:val="1C380F12"/>
@@ -11903,7 +12796,7 @@
       </w:rPr>
     </w:lvl>
   </w:abstractNum>
-  <w:abstractNum w:abstractNumId="56" w15:restartNumberingAfterBreak="0">
+  <w:abstractNum w:abstractNumId="58" w15:restartNumberingAfterBreak="0">
     <w:nsid w:val="53CD23AC"/>
     <w:multiLevelType w:val="multilevel"/>
     <w:tmpl w:val="57BAE8F0"/>
@@ -12052,7 +12945,7 @@
       </w:rPr>
     </w:lvl>
   </w:abstractNum>
-  <w:abstractNum w:abstractNumId="57" w15:restartNumberingAfterBreak="0">
+  <w:abstractNum w:abstractNumId="59" w15:restartNumberingAfterBreak="0">
     <w:nsid w:val="5462791F"/>
     <w:multiLevelType w:val="hybridMultilevel"/>
     <w:tmpl w:val="FDE24C26"/>
@@ -12165,7 +13058,7 @@
       </w:rPr>
     </w:lvl>
   </w:abstractNum>
-  <w:abstractNum w:abstractNumId="58" w15:restartNumberingAfterBreak="0">
+  <w:abstractNum w:abstractNumId="60" w15:restartNumberingAfterBreak="0">
     <w:nsid w:val="547005EB"/>
     <w:multiLevelType w:val="multilevel"/>
     <w:tmpl w:val="F260CC5C"/>
@@ -12314,7 +13207,7 @@
       </w:rPr>
     </w:lvl>
   </w:abstractNum>
-  <w:abstractNum w:abstractNumId="59" w15:restartNumberingAfterBreak="0">
+  <w:abstractNum w:abstractNumId="61" w15:restartNumberingAfterBreak="0">
     <w:nsid w:val="58034221"/>
     <w:multiLevelType w:val="hybridMultilevel"/>
     <w:tmpl w:val="65D0619C"/>
@@ -12427,7 +13320,7 @@
       </w:rPr>
     </w:lvl>
   </w:abstractNum>
-  <w:abstractNum w:abstractNumId="60" w15:restartNumberingAfterBreak="0">
+  <w:abstractNum w:abstractNumId="62" w15:restartNumberingAfterBreak="0">
     <w:nsid w:val="5A460390"/>
     <w:multiLevelType w:val="hybridMultilevel"/>
     <w:tmpl w:val="BD8E939C"/>
@@ -12540,7 +13433,7 @@
       </w:rPr>
     </w:lvl>
   </w:abstractNum>
-  <w:abstractNum w:abstractNumId="61" w15:restartNumberingAfterBreak="0">
+  <w:abstractNum w:abstractNumId="63" w15:restartNumberingAfterBreak="0">
     <w:nsid w:val="5CEE630B"/>
     <w:multiLevelType w:val="hybridMultilevel"/>
     <w:tmpl w:val="DE8E8DBA"/>
@@ -12653,7 +13546,156 @@
       </w:rPr>
     </w:lvl>
   </w:abstractNum>
-  <w:abstractNum w:abstractNumId="62" w15:restartNumberingAfterBreak="0">
+  <w:abstractNum w:abstractNumId="64" w15:restartNumberingAfterBreak="0">
+    <w:nsid w:val="5D5A183C"/>
+    <w:multiLevelType w:val="multilevel"/>
+    <w:tmpl w:val="C804C34A"/>
+    <w:lvl w:ilvl="0">
+      <w:start w:val="1"/>
+      <w:numFmt w:val="bullet"/>
+      <w:lvlText w:val=""/>
+      <w:lvlJc w:val="left"/>
+      <w:pPr>
+        <w:tabs>
+          <w:tab w:val="num" w:pos="720"/>
+        </w:tabs>
+        <w:ind w:left="720" w:hanging="360"/>
+      </w:pPr>
+      <w:rPr>
+        <w:rFonts w:ascii="Symbol" w:hAnsi="Symbol" w:hint="default"/>
+        <w:sz w:val="20"/>
+      </w:rPr>
+    </w:lvl>
+    <w:lvl w:ilvl="1" w:tentative="1">
+      <w:start w:val="1"/>
+      <w:numFmt w:val="bullet"/>
+      <w:lvlText w:val="o"/>
+      <w:lvlJc w:val="left"/>
+      <w:pPr>
+        <w:tabs>
+          <w:tab w:val="num" w:pos="1440"/>
+        </w:tabs>
+        <w:ind w:left="1440" w:hanging="360"/>
+      </w:pPr>
+      <w:rPr>
+        <w:rFonts w:ascii="Courier New" w:hAnsi="Courier New" w:hint="default"/>
+        <w:sz w:val="20"/>
+      </w:rPr>
+    </w:lvl>
+    <w:lvl w:ilvl="2" w:tentative="1">
+      <w:start w:val="1"/>
+      <w:numFmt w:val="bullet"/>
+      <w:lvlText w:val=""/>
+      <w:lvlJc w:val="left"/>
+      <w:pPr>
+        <w:tabs>
+          <w:tab w:val="num" w:pos="2160"/>
+        </w:tabs>
+        <w:ind w:left="2160" w:hanging="360"/>
+      </w:pPr>
+      <w:rPr>
+        <w:rFonts w:ascii="Wingdings" w:hAnsi="Wingdings" w:hint="default"/>
+        <w:sz w:val="20"/>
+      </w:rPr>
+    </w:lvl>
+    <w:lvl w:ilvl="3" w:tentative="1">
+      <w:start w:val="1"/>
+      <w:numFmt w:val="bullet"/>
+      <w:lvlText w:val=""/>
+      <w:lvlJc w:val="left"/>
+      <w:pPr>
+        <w:tabs>
+          <w:tab w:val="num" w:pos="2880"/>
+        </w:tabs>
+        <w:ind w:left="2880" w:hanging="360"/>
+      </w:pPr>
+      <w:rPr>
+        <w:rFonts w:ascii="Wingdings" w:hAnsi="Wingdings" w:hint="default"/>
+        <w:sz w:val="20"/>
+      </w:rPr>
+    </w:lvl>
+    <w:lvl w:ilvl="4" w:tentative="1">
+      <w:start w:val="1"/>
+      <w:numFmt w:val="bullet"/>
+      <w:lvlText w:val=""/>
+      <w:lvlJc w:val="left"/>
+      <w:pPr>
+        <w:tabs>
+          <w:tab w:val="num" w:pos="3600"/>
+        </w:tabs>
+        <w:ind w:left="3600" w:hanging="360"/>
+      </w:pPr>
+      <w:rPr>
+        <w:rFonts w:ascii="Wingdings" w:hAnsi="Wingdings" w:hint="default"/>
+        <w:sz w:val="20"/>
+      </w:rPr>
+    </w:lvl>
+    <w:lvl w:ilvl="5" w:tentative="1">
+      <w:start w:val="1"/>
+      <w:numFmt w:val="bullet"/>
+      <w:lvlText w:val=""/>
+      <w:lvlJc w:val="left"/>
+      <w:pPr>
+        <w:tabs>
+          <w:tab w:val="num" w:pos="4320"/>
+        </w:tabs>
+        <w:ind w:left="4320" w:hanging="360"/>
+      </w:pPr>
+      <w:rPr>
+        <w:rFonts w:ascii="Wingdings" w:hAnsi="Wingdings" w:hint="default"/>
+        <w:sz w:val="20"/>
+      </w:rPr>
+    </w:lvl>
+    <w:lvl w:ilvl="6" w:tentative="1">
+      <w:start w:val="1"/>
+      <w:numFmt w:val="bullet"/>
+      <w:lvlText w:val=""/>
+      <w:lvlJc w:val="left"/>
+      <w:pPr>
+        <w:tabs>
+          <w:tab w:val="num" w:pos="5040"/>
+        </w:tabs>
+        <w:ind w:left="5040" w:hanging="360"/>
+      </w:pPr>
+      <w:rPr>
+        <w:rFonts w:ascii="Wingdings" w:hAnsi="Wingdings" w:hint="default"/>
+        <w:sz w:val="20"/>
+      </w:rPr>
+    </w:lvl>
+    <w:lvl w:ilvl="7" w:tentative="1">
+      <w:start w:val="1"/>
+      <w:numFmt w:val="bullet"/>
+      <w:lvlText w:val=""/>
+      <w:lvlJc w:val="left"/>
+      <w:pPr>
+        <w:tabs>
+          <w:tab w:val="num" w:pos="5760"/>
+        </w:tabs>
+        <w:ind w:left="5760" w:hanging="360"/>
+      </w:pPr>
+      <w:rPr>
+        <w:rFonts w:ascii="Wingdings" w:hAnsi="Wingdings" w:hint="default"/>
+        <w:sz w:val="20"/>
+      </w:rPr>
+    </w:lvl>
+    <w:lvl w:ilvl="8" w:tentative="1">
+      <w:start w:val="1"/>
+      <w:numFmt w:val="bullet"/>
+      <w:lvlText w:val=""/>
+      <w:lvlJc w:val="left"/>
+      <w:pPr>
+        <w:tabs>
+          <w:tab w:val="num" w:pos="6480"/>
+        </w:tabs>
+        <w:ind w:left="6480" w:hanging="360"/>
+      </w:pPr>
+      <w:rPr>
+        <w:rFonts w:ascii="Wingdings" w:hAnsi="Wingdings" w:hint="default"/>
+        <w:sz w:val="20"/>
+      </w:rPr>
+    </w:lvl>
+  </w:abstractNum>
+  <w:abstractNum w:abstractNumId="65" w15:restartNumberingAfterBreak="0">
     <w:nsid w:val="62385AA6"/>
     <w:multiLevelType w:val="multilevel"/>
     <w:tmpl w:val="B9EAECD4"/>
@@ -12802,7 +13844,7 @@
       </w:rPr>
     </w:lvl>
   </w:abstractNum>
-  <w:abstractNum w:abstractNumId="63" w15:restartNumberingAfterBreak="0">
+  <w:abstractNum w:abstractNumId="66" w15:restartNumberingAfterBreak="0">
     <w:nsid w:val="625D686D"/>
     <w:multiLevelType w:val="multilevel"/>
     <w:tmpl w:val="BC1C2048"/>
@@ -12951,7 +13993,7 @@
       </w:rPr>
     </w:lvl>
   </w:abstractNum>
-  <w:abstractNum w:abstractNumId="64" w15:restartNumberingAfterBreak="0">
+  <w:abstractNum w:abstractNumId="67" w15:restartNumberingAfterBreak="0">
     <w:nsid w:val="62B46951"/>
     <w:multiLevelType w:val="hybridMultilevel"/>
     <w:tmpl w:val="0FEAFEC6"/>
@@ -13064,7 +14106,7 @@
       </w:rPr>
     </w:lvl>
   </w:abstractNum>
-  <w:abstractNum w:abstractNumId="65" w15:restartNumberingAfterBreak="0">
+  <w:abstractNum w:abstractNumId="68" w15:restartNumberingAfterBreak="0">
     <w:nsid w:val="647819E3"/>
     <w:multiLevelType w:val="multilevel"/>
     <w:tmpl w:val="ABB278BC"/>
@@ -13213,7 +14255,7 @@
       </w:rPr>
     </w:lvl>
   </w:abstractNum>
-  <w:abstractNum w:abstractNumId="66" w15:restartNumberingAfterBreak="0">
+  <w:abstractNum w:abstractNumId="69" w15:restartNumberingAfterBreak="0">
     <w:nsid w:val="64F30198"/>
     <w:multiLevelType w:val="multilevel"/>
     <w:tmpl w:val="63F4E6F0"/>
@@ -13362,7 +14404,7 @@
       </w:rPr>
     </w:lvl>
   </w:abstractNum>
-  <w:abstractNum w:abstractNumId="67" w15:restartNumberingAfterBreak="0">
+  <w:abstractNum w:abstractNumId="70" w15:restartNumberingAfterBreak="0">
     <w:nsid w:val="65314293"/>
     <w:multiLevelType w:val="hybridMultilevel"/>
     <w:tmpl w:val="6688DFAC"/>
@@ -13475,7 +14517,7 @@
       </w:rPr>
     </w:lvl>
   </w:abstractNum>
-  <w:abstractNum w:abstractNumId="68" w15:restartNumberingAfterBreak="0">
+  <w:abstractNum w:abstractNumId="71" w15:restartNumberingAfterBreak="0">
     <w:nsid w:val="65CE4D0F"/>
     <w:multiLevelType w:val="hybridMultilevel"/>
     <w:tmpl w:val="DB668538"/>
@@ -13588,7 +14630,7 @@
       </w:rPr>
     </w:lvl>
   </w:abstractNum>
-  <w:abstractNum w:abstractNumId="69" w15:restartNumberingAfterBreak="0">
+  <w:abstractNum w:abstractNumId="72" w15:restartNumberingAfterBreak="0">
     <w:nsid w:val="661C7D73"/>
     <w:multiLevelType w:val="multilevel"/>
     <w:tmpl w:val="D9681266"/>
@@ -13737,7 +14779,7 @@
       </w:rPr>
     </w:lvl>
   </w:abstractNum>
-  <w:abstractNum w:abstractNumId="70" w15:restartNumberingAfterBreak="0">
+  <w:abstractNum w:abstractNumId="73" w15:restartNumberingAfterBreak="0">
     <w:nsid w:val="68B94344"/>
     <w:multiLevelType w:val="multilevel"/>
     <w:tmpl w:val="9BA812D8"/>
@@ -13886,7 +14928,7 @@
       </w:rPr>
     </w:lvl>
   </w:abstractNum>
-  <w:abstractNum w:abstractNumId="71" w15:restartNumberingAfterBreak="0">
+  <w:abstractNum w:abstractNumId="74" w15:restartNumberingAfterBreak="0">
     <w:nsid w:val="69DE2C87"/>
     <w:multiLevelType w:val="hybridMultilevel"/>
     <w:tmpl w:val="F530F20A"/>
@@ -13999,7 +15041,7 @@
       </w:rPr>
     </w:lvl>
   </w:abstractNum>
-  <w:abstractNum w:abstractNumId="72" w15:restartNumberingAfterBreak="0">
+  <w:abstractNum w:abstractNumId="75" w15:restartNumberingAfterBreak="0">
     <w:nsid w:val="69ED672D"/>
     <w:multiLevelType w:val="multilevel"/>
     <w:tmpl w:val="CC08E300"/>
@@ -14148,7 +15190,7 @@
       </w:rPr>
     </w:lvl>
   </w:abstractNum>
-  <w:abstractNum w:abstractNumId="73" w15:restartNumberingAfterBreak="0">
+  <w:abstractNum w:abstractNumId="76" w15:restartNumberingAfterBreak="0">
     <w:nsid w:val="6A063EFD"/>
     <w:multiLevelType w:val="hybridMultilevel"/>
     <w:tmpl w:val="48703FBA"/>
@@ -14261,7 +15303,7 @@
       </w:rPr>
     </w:lvl>
   </w:abstractNum>
-  <w:abstractNum w:abstractNumId="74" w15:restartNumberingAfterBreak="0">
+  <w:abstractNum w:abstractNumId="77" w15:restartNumberingAfterBreak="0">
     <w:nsid w:val="6A825ABE"/>
     <w:multiLevelType w:val="multilevel"/>
     <w:tmpl w:val="0CD6F30E"/>
@@ -14410,7 +15452,7 @@
       </w:rPr>
     </w:lvl>
   </w:abstractNum>
-  <w:abstractNum w:abstractNumId="75" w15:restartNumberingAfterBreak="0">
+  <w:abstractNum w:abstractNumId="78" w15:restartNumberingAfterBreak="0">
     <w:nsid w:val="6B1D7832"/>
     <w:multiLevelType w:val="multilevel"/>
     <w:tmpl w:val="DD4646B2"/>
@@ -14559,7 +15601,7 @@
       </w:rPr>
     </w:lvl>
   </w:abstractNum>
-  <w:abstractNum w:abstractNumId="76" w15:restartNumberingAfterBreak="0">
+  <w:abstractNum w:abstractNumId="79" w15:restartNumberingAfterBreak="0">
     <w:nsid w:val="6C6D6667"/>
     <w:multiLevelType w:val="hybridMultilevel"/>
     <w:tmpl w:val="A744709C"/>
@@ -14672,7 +15714,7 @@
       </w:rPr>
     </w:lvl>
   </w:abstractNum>
-  <w:abstractNum w:abstractNumId="77" w15:restartNumberingAfterBreak="0">
+  <w:abstractNum w:abstractNumId="80" w15:restartNumberingAfterBreak="0">
     <w:nsid w:val="6CAD7EA5"/>
     <w:multiLevelType w:val="multilevel"/>
     <w:tmpl w:val="C472C5B0"/>
@@ -14821,7 +15863,7 @@
       </w:rPr>
     </w:lvl>
   </w:abstractNum>
-  <w:abstractNum w:abstractNumId="78" w15:restartNumberingAfterBreak="0">
+  <w:abstractNum w:abstractNumId="81" w15:restartNumberingAfterBreak="0">
     <w:nsid w:val="6E43557B"/>
     <w:multiLevelType w:val="multilevel"/>
     <w:tmpl w:val="323C7112"/>
@@ -14970,7 +16012,7 @@
       </w:rPr>
     </w:lvl>
   </w:abstractNum>
-  <w:abstractNum w:abstractNumId="79" w15:restartNumberingAfterBreak="0">
+  <w:abstractNum w:abstractNumId="82" w15:restartNumberingAfterBreak="0">
     <w:nsid w:val="6EA27D0A"/>
     <w:multiLevelType w:val="multilevel"/>
     <w:tmpl w:val="7BF0256C"/>
@@ -15119,7 +16161,7 @@
       </w:rPr>
     </w:lvl>
   </w:abstractNum>
-  <w:abstractNum w:abstractNumId="80" w15:restartNumberingAfterBreak="0">
+  <w:abstractNum w:abstractNumId="83" w15:restartNumberingAfterBreak="0">
     <w:nsid w:val="70874300"/>
     <w:multiLevelType w:val="hybridMultilevel"/>
     <w:tmpl w:val="1B3A0518"/>
@@ -15232,7 +16274,7 @@
       </w:rPr>
     </w:lvl>
   </w:abstractNum>
-  <w:abstractNum w:abstractNumId="81" w15:restartNumberingAfterBreak="0">
+  <w:abstractNum w:abstractNumId="84" w15:restartNumberingAfterBreak="0">
     <w:nsid w:val="7090251B"/>
     <w:multiLevelType w:val="hybridMultilevel"/>
     <w:tmpl w:val="67687EFE"/>
@@ -15345,7 +16387,7 @@
       </w:rPr>
     </w:lvl>
   </w:abstractNum>
-  <w:abstractNum w:abstractNumId="82" w15:restartNumberingAfterBreak="0">
+  <w:abstractNum w:abstractNumId="85" w15:restartNumberingAfterBreak="0">
     <w:nsid w:val="75144C65"/>
     <w:multiLevelType w:val="hybridMultilevel"/>
     <w:tmpl w:val="12127FAA"/>
@@ -15458,7 +16500,7 @@
       </w:rPr>
     </w:lvl>
   </w:abstractNum>
-  <w:abstractNum w:abstractNumId="83" w15:restartNumberingAfterBreak="0">
+  <w:abstractNum w:abstractNumId="86" w15:restartNumberingAfterBreak="0">
     <w:nsid w:val="75237F84"/>
     <w:multiLevelType w:val="hybridMultilevel"/>
     <w:tmpl w:val="5F0A6EF2"/>
@@ -15571,7 +16613,7 @@
       </w:rPr>
     </w:lvl>
   </w:abstractNum>
-  <w:abstractNum w:abstractNumId="84" w15:restartNumberingAfterBreak="0">
+  <w:abstractNum w:abstractNumId="87" w15:restartNumberingAfterBreak="0">
     <w:nsid w:val="75FF09B0"/>
     <w:multiLevelType w:val="multilevel"/>
     <w:tmpl w:val="C34A7734"/>
@@ -15720,7 +16762,7 @@
       </w:rPr>
     </w:lvl>
   </w:abstractNum>
-  <w:abstractNum w:abstractNumId="85" w15:restartNumberingAfterBreak="0">
+  <w:abstractNum w:abstractNumId="88" w15:restartNumberingAfterBreak="0">
     <w:nsid w:val="77960362"/>
     <w:multiLevelType w:val="multilevel"/>
     <w:tmpl w:val="FEA0022E"/>
@@ -15869,7 +16911,7 @@
       </w:rPr>
     </w:lvl>
   </w:abstractNum>
-  <w:abstractNum w:abstractNumId="86" w15:restartNumberingAfterBreak="0">
+  <w:abstractNum w:abstractNumId="89" w15:restartNumberingAfterBreak="0">
     <w:nsid w:val="785A644F"/>
     <w:multiLevelType w:val="multilevel"/>
     <w:tmpl w:val="D1DC60FE"/>
@@ -16018,7 +17060,7 @@
       </w:rPr>
     </w:lvl>
   </w:abstractNum>
-  <w:abstractNum w:abstractNumId="87" w15:restartNumberingAfterBreak="0">
+  <w:abstractNum w:abstractNumId="90" w15:restartNumberingAfterBreak="0">
     <w:nsid w:val="7BFA03DF"/>
     <w:multiLevelType w:val="hybridMultilevel"/>
     <w:tmpl w:val="536A979E"/>
@@ -16131,7 +17173,7 @@
       </w:rPr>
     </w:lvl>
   </w:abstractNum>
-  <w:abstractNum w:abstractNumId="88" w15:restartNumberingAfterBreak="0">
+  <w:abstractNum w:abstractNumId="91" w15:restartNumberingAfterBreak="0">
     <w:nsid w:val="7CA524B4"/>
     <w:multiLevelType w:val="hybridMultilevel"/>
     <w:tmpl w:val="957C4F4A"/>
@@ -16244,7 +17286,7 @@
       </w:rPr>
     </w:lvl>
   </w:abstractNum>
-  <w:abstractNum w:abstractNumId="89" w15:restartNumberingAfterBreak="0">
+  <w:abstractNum w:abstractNumId="92" w15:restartNumberingAfterBreak="0">
     <w:nsid w:val="7EBD7710"/>
     <w:multiLevelType w:val="hybridMultilevel"/>
     <w:tmpl w:val="C8C6F7A0"/>
@@ -16358,106 +17400,106 @@
     </w:lvl>
   </w:abstractNum>
   <w:num w:numId="1" w16cid:durableId="425157302">
-    <w:abstractNumId w:val="38"/>
+    <w:abstractNumId w:val="39"/>
   </w:num>
   <w:num w:numId="2" w16cid:durableId="967664612">
-    <w:abstractNumId w:val="66"/>
+    <w:abstractNumId w:val="69"/>
   </w:num>
   <w:num w:numId="3" w16cid:durableId="361631616">
-    <w:abstractNumId w:val="48"/>
+    <w:abstractNumId w:val="49"/>
   </w:num>
   <w:num w:numId="4" w16cid:durableId="1409575397">
-    <w:abstractNumId w:val="57"/>
+    <w:abstractNumId w:val="59"/>
   </w:num>
   <w:num w:numId="5" w16cid:durableId="1647204897">
-    <w:abstractNumId w:val="88"/>
+    <w:abstractNumId w:val="91"/>
   </w:num>
   <w:num w:numId="6" w16cid:durableId="682589869">
-    <w:abstractNumId w:val="16"/>
+    <w:abstractNumId w:val="17"/>
   </w:num>
   <w:num w:numId="7" w16cid:durableId="679703478">
-    <w:abstractNumId w:val="71"/>
+    <w:abstractNumId w:val="74"/>
   </w:num>
   <w:num w:numId="8" w16cid:durableId="496455128">
-    <w:abstractNumId w:val="33"/>
+    <w:abstractNumId w:val="34"/>
   </w:num>
   <w:num w:numId="9" w16cid:durableId="1184633094">
-    <w:abstractNumId w:val="42"/>
+    <w:abstractNumId w:val="43"/>
   </w:num>
   <w:num w:numId="10" w16cid:durableId="71507387">
-    <w:abstractNumId w:val="46"/>
+    <w:abstractNumId w:val="47"/>
   </w:num>
   <w:num w:numId="11" w16cid:durableId="1412503779">
-    <w:abstractNumId w:val="73"/>
+    <w:abstractNumId w:val="76"/>
   </w:num>
   <w:num w:numId="12" w16cid:durableId="1107113995">
-    <w:abstractNumId w:val="34"/>
+    <w:abstractNumId w:val="35"/>
   </w:num>
   <w:num w:numId="13" w16cid:durableId="2011055922">
-    <w:abstractNumId w:val="17"/>
+    <w:abstractNumId w:val="18"/>
   </w:num>
   <w:num w:numId="14" w16cid:durableId="1529222885">
-    <w:abstractNumId w:val="87"/>
+    <w:abstractNumId w:val="90"/>
   </w:num>
   <w:num w:numId="15" w16cid:durableId="836580755">
-    <w:abstractNumId w:val="11"/>
+    <w:abstractNumId w:val="12"/>
   </w:num>
   <w:num w:numId="16" w16cid:durableId="1344674502">
-    <w:abstractNumId w:val="60"/>
+    <w:abstractNumId w:val="62"/>
   </w:num>
   <w:num w:numId="17" w16cid:durableId="1320882603">
-    <w:abstractNumId w:val="80"/>
+    <w:abstractNumId w:val="83"/>
   </w:num>
   <w:num w:numId="18" w16cid:durableId="1139028372">
-    <w:abstractNumId w:val="35"/>
+    <w:abstractNumId w:val="36"/>
   </w:num>
   <w:num w:numId="19" w16cid:durableId="1525635473">
-    <w:abstractNumId w:val="64"/>
+    <w:abstractNumId w:val="67"/>
   </w:num>
   <w:num w:numId="20" w16cid:durableId="609623515">
-    <w:abstractNumId w:val="89"/>
+    <w:abstractNumId w:val="92"/>
   </w:num>
   <w:num w:numId="21" w16cid:durableId="165170997">
-    <w:abstractNumId w:val="76"/>
+    <w:abstractNumId w:val="79"/>
   </w:num>
   <w:num w:numId="22" w16cid:durableId="1620525290">
-    <w:abstractNumId w:val="22"/>
+    <w:abstractNumId w:val="23"/>
   </w:num>
   <w:num w:numId="23" w16cid:durableId="400753109">
-    <w:abstractNumId w:val="82"/>
+    <w:abstractNumId w:val="85"/>
   </w:num>
   <w:num w:numId="24" w16cid:durableId="193882219">
     <w:abstractNumId w:val="4"/>
   </w:num>
   <w:num w:numId="25" w16cid:durableId="311981628">
-    <w:abstractNumId w:val="39"/>
+    <w:abstractNumId w:val="40"/>
   </w:num>
   <w:num w:numId="26" w16cid:durableId="2009166045">
-    <w:abstractNumId w:val="10"/>
+    <w:abstractNumId w:val="11"/>
   </w:num>
   <w:num w:numId="27" w16cid:durableId="2135174697">
-    <w:abstractNumId w:val="15"/>
+    <w:abstractNumId w:val="16"/>
   </w:num>
   <w:num w:numId="28" w16cid:durableId="353504740">
-    <w:abstractNumId w:val="12"/>
+    <w:abstractNumId w:val="13"/>
   </w:num>
   <w:num w:numId="29" w16cid:durableId="2124693280">
-    <w:abstractNumId w:val="68"/>
+    <w:abstractNumId w:val="71"/>
   </w:num>
   <w:num w:numId="30" w16cid:durableId="1367099744">
-    <w:abstractNumId w:val="26"/>
+    <w:abstractNumId w:val="27"/>
   </w:num>
   <w:num w:numId="31" w16cid:durableId="2011105642">
-    <w:abstractNumId w:val="61"/>
+    <w:abstractNumId w:val="63"/>
   </w:num>
   <w:num w:numId="32" w16cid:durableId="831995364">
-    <w:abstractNumId w:val="20"/>
+    <w:abstractNumId w:val="21"/>
   </w:num>
   <w:num w:numId="33" w16cid:durableId="851073403">
     <w:abstractNumId w:val="3"/>
   </w:num>
   <w:num w:numId="34" w16cid:durableId="1183666391">
-    <w:abstractNumId w:val="19"/>
+    <w:abstractNumId w:val="20"/>
   </w:num>
   <w:num w:numId="35" w16cid:durableId="697268929">
     <w:abstractNumId w:val="1"/>
@@ -16466,166 +17508,175 @@
     <w:abstractNumId w:val="2"/>
   </w:num>
   <w:num w:numId="37" w16cid:durableId="1849755457">
-    <w:abstractNumId w:val="83"/>
+    <w:abstractNumId w:val="86"/>
   </w:num>
   <w:num w:numId="38" w16cid:durableId="516505904">
-    <w:abstractNumId w:val="9"/>
+    <w:abstractNumId w:val="10"/>
   </w:num>
   <w:num w:numId="39" w16cid:durableId="906300072">
-    <w:abstractNumId w:val="13"/>
+    <w:abstractNumId w:val="14"/>
   </w:num>
   <w:num w:numId="40" w16cid:durableId="905338697">
+    <w:abstractNumId w:val="51"/>
+  </w:num>
+  <w:num w:numId="41" w16cid:durableId="501896635">
+    <w:abstractNumId w:val="37"/>
+  </w:num>
+  <w:num w:numId="42" w16cid:durableId="1953435156">
+    <w:abstractNumId w:val="52"/>
+  </w:num>
+  <w:num w:numId="43" w16cid:durableId="1060447452">
+    <w:abstractNumId w:val="61"/>
+  </w:num>
+  <w:num w:numId="44" w16cid:durableId="1772503672">
+    <w:abstractNumId w:val="45"/>
+  </w:num>
+  <w:num w:numId="45" w16cid:durableId="1650330222">
     <w:abstractNumId w:val="50"/>
   </w:num>
-  <w:num w:numId="41" w16cid:durableId="501896635">
-    <w:abstractNumId w:val="36"/>
-  </w:num>
-  <w:num w:numId="42" w16cid:durableId="1953435156">
-    <w:abstractNumId w:val="51"/>
-  </w:num>
-  <w:num w:numId="43" w16cid:durableId="1060447452">
-    <w:abstractNumId w:val="59"/>
-  </w:num>
-  <w:num w:numId="44" w16cid:durableId="1772503672">
-    <w:abstractNumId w:val="44"/>
-  </w:num>
-  <w:num w:numId="45" w16cid:durableId="1650330222">
-    <w:abstractNumId w:val="49"/>
-  </w:num>
   <w:num w:numId="46" w16cid:durableId="2102337934">
-    <w:abstractNumId w:val="21"/>
+    <w:abstractNumId w:val="22"/>
   </w:num>
   <w:num w:numId="47" w16cid:durableId="68767822">
-    <w:abstractNumId w:val="74"/>
+    <w:abstractNumId w:val="77"/>
   </w:num>
   <w:num w:numId="48" w16cid:durableId="1992058265">
     <w:abstractNumId w:val="5"/>
   </w:num>
   <w:num w:numId="49" w16cid:durableId="788475134">
-    <w:abstractNumId w:val="86"/>
+    <w:abstractNumId w:val="89"/>
   </w:num>
   <w:num w:numId="50" w16cid:durableId="224419455">
-    <w:abstractNumId w:val="79"/>
+    <w:abstractNumId w:val="82"/>
   </w:num>
   <w:num w:numId="51" w16cid:durableId="1699575947">
-    <w:abstractNumId w:val="63"/>
+    <w:abstractNumId w:val="66"/>
   </w:num>
   <w:num w:numId="52" w16cid:durableId="1048916239">
+    <w:abstractNumId w:val="42"/>
+  </w:num>
+  <w:num w:numId="53" w16cid:durableId="1188711211">
+    <w:abstractNumId w:val="87"/>
+  </w:num>
+  <w:num w:numId="54" w16cid:durableId="447555614">
+    <w:abstractNumId w:val="68"/>
+  </w:num>
+  <w:num w:numId="55" w16cid:durableId="1679307268">
     <w:abstractNumId w:val="41"/>
   </w:num>
-  <w:num w:numId="53" w16cid:durableId="1188711211">
+  <w:num w:numId="56" w16cid:durableId="693773591">
+    <w:abstractNumId w:val="81"/>
+  </w:num>
+  <w:num w:numId="57" w16cid:durableId="1110473324">
+    <w:abstractNumId w:val="29"/>
+  </w:num>
+  <w:num w:numId="58" w16cid:durableId="842937968">
+    <w:abstractNumId w:val="48"/>
+  </w:num>
+  <w:num w:numId="59" w16cid:durableId="821121315">
+    <w:abstractNumId w:val="33"/>
+  </w:num>
+  <w:num w:numId="60" w16cid:durableId="2095394549">
+    <w:abstractNumId w:val="88"/>
+  </w:num>
+  <w:num w:numId="61" w16cid:durableId="1299921011">
+    <w:abstractNumId w:val="32"/>
+  </w:num>
+  <w:num w:numId="62" w16cid:durableId="1927420240">
+    <w:abstractNumId w:val="54"/>
+  </w:num>
+  <w:num w:numId="63" w16cid:durableId="41290043">
+    <w:abstractNumId w:val="58"/>
+  </w:num>
+  <w:num w:numId="64" w16cid:durableId="999846909">
+    <w:abstractNumId w:val="46"/>
+  </w:num>
+  <w:num w:numId="65" w16cid:durableId="1250969563">
+    <w:abstractNumId w:val="53"/>
+  </w:num>
+  <w:num w:numId="66" w16cid:durableId="484011382">
+    <w:abstractNumId w:val="75"/>
+  </w:num>
+  <w:num w:numId="67" w16cid:durableId="2008289242">
+    <w:abstractNumId w:val="8"/>
+  </w:num>
+  <w:num w:numId="68" w16cid:durableId="1041637222">
+    <w:abstractNumId w:val="15"/>
+  </w:num>
+  <w:num w:numId="69" w16cid:durableId="1296839887">
+    <w:abstractNumId w:val="57"/>
+  </w:num>
+  <w:num w:numId="70" w16cid:durableId="336662050">
+    <w:abstractNumId w:val="65"/>
+  </w:num>
+  <w:num w:numId="71" w16cid:durableId="1460032333">
+    <w:abstractNumId w:val="80"/>
+  </w:num>
+  <w:num w:numId="72" w16cid:durableId="592400615">
+    <w:abstractNumId w:val="7"/>
+  </w:num>
+  <w:num w:numId="73" w16cid:durableId="1879049234">
+    <w:abstractNumId w:val="26"/>
+  </w:num>
+  <w:num w:numId="74" w16cid:durableId="1747679558">
+    <w:abstractNumId w:val="30"/>
+  </w:num>
+  <w:num w:numId="75" w16cid:durableId="55278029">
+    <w:abstractNumId w:val="24"/>
+  </w:num>
+  <w:num w:numId="76" w16cid:durableId="1032193382">
+    <w:abstractNumId w:val="25"/>
+  </w:num>
+  <w:num w:numId="77" w16cid:durableId="763109604">
+    <w:abstractNumId w:val="60"/>
+  </w:num>
+  <w:num w:numId="78" w16cid:durableId="2138137265">
+    <w:abstractNumId w:val="70"/>
+  </w:num>
+  <w:num w:numId="79" w16cid:durableId="343675924">
     <w:abstractNumId w:val="84"/>
   </w:num>
-  <w:num w:numId="54" w16cid:durableId="447555614">
-    <w:abstractNumId w:val="65"/>
-  </w:num>
-  <w:num w:numId="55" w16cid:durableId="1679307268">
-    <w:abstractNumId w:val="40"/>
-  </w:num>
-  <w:num w:numId="56" w16cid:durableId="693773591">
-    <w:abstractNumId w:val="78"/>
-  </w:num>
-  <w:num w:numId="57" w16cid:durableId="1110473324">
-    <w:abstractNumId w:val="28"/>
-  </w:num>
-  <w:num w:numId="58" w16cid:durableId="842937968">
-    <w:abstractNumId w:val="47"/>
-  </w:num>
-  <w:num w:numId="59" w16cid:durableId="821121315">
-    <w:abstractNumId w:val="32"/>
-  </w:num>
-  <w:num w:numId="60" w16cid:durableId="2095394549">
-    <w:abstractNumId w:val="85"/>
-  </w:num>
-  <w:num w:numId="61" w16cid:durableId="1299921011">
+  <w:num w:numId="80" w16cid:durableId="1823277442">
     <w:abstractNumId w:val="31"/>
-  </w:num>
-  <w:num w:numId="62" w16cid:durableId="1927420240">
-    <w:abstractNumId w:val="53"/>
-  </w:num>
-  <w:num w:numId="63" w16cid:durableId="41290043">
-    <w:abstractNumId w:val="56"/>
-  </w:num>
-  <w:num w:numId="64" w16cid:durableId="999846909">
-    <w:abstractNumId w:val="45"/>
-  </w:num>
-  <w:num w:numId="65" w16cid:durableId="1250969563">
-    <w:abstractNumId w:val="52"/>
-  </w:num>
-  <w:num w:numId="66" w16cid:durableId="484011382">
-    <w:abstractNumId w:val="72"/>
-  </w:num>
-  <w:num w:numId="67" w16cid:durableId="2008289242">
-    <w:abstractNumId w:val="7"/>
-  </w:num>
-  <w:num w:numId="68" w16cid:durableId="1041637222">
-    <w:abstractNumId w:val="14"/>
-  </w:num>
-  <w:num w:numId="69" w16cid:durableId="1296839887">
-    <w:abstractNumId w:val="55"/>
-  </w:num>
-  <w:num w:numId="70" w16cid:durableId="336662050">
-    <w:abstractNumId w:val="62"/>
-  </w:num>
-  <w:num w:numId="71" w16cid:durableId="1460032333">
-    <w:abstractNumId w:val="77"/>
-  </w:num>
-  <w:num w:numId="72" w16cid:durableId="592400615">
-    <w:abstractNumId w:val="6"/>
-  </w:num>
-  <w:num w:numId="73" w16cid:durableId="1879049234">
-    <w:abstractNumId w:val="25"/>
-  </w:num>
-  <w:num w:numId="74" w16cid:durableId="1747679558">
-    <w:abstractNumId w:val="29"/>
-  </w:num>
-  <w:num w:numId="75" w16cid:durableId="55278029">
-    <w:abstractNumId w:val="23"/>
-  </w:num>
-  <w:num w:numId="76" w16cid:durableId="1032193382">
-    <w:abstractNumId w:val="24"/>
-  </w:num>
-  <w:num w:numId="77" w16cid:durableId="763109604">
-    <w:abstractNumId w:val="58"/>
-  </w:num>
-  <w:num w:numId="78" w16cid:durableId="2138137265">
-    <w:abstractNumId w:val="67"/>
-  </w:num>
-  <w:num w:numId="79" w16cid:durableId="343675924">
-    <w:abstractNumId w:val="81"/>
-  </w:num>
-  <w:num w:numId="80" w16cid:durableId="1823277442">
-    <w:abstractNumId w:val="30"/>
   </w:num>
   <w:num w:numId="81" w16cid:durableId="1686900155">
     <w:abstractNumId w:val="0"/>
   </w:num>
   <w:num w:numId="82" w16cid:durableId="1113326280">
-    <w:abstractNumId w:val="54"/>
+    <w:abstractNumId w:val="56"/>
   </w:num>
   <w:num w:numId="83" w16cid:durableId="1253051103">
-    <w:abstractNumId w:val="75"/>
+    <w:abstractNumId w:val="78"/>
   </w:num>
   <w:num w:numId="84" w16cid:durableId="444888444">
-    <w:abstractNumId w:val="37"/>
+    <w:abstractNumId w:val="38"/>
   </w:num>
   <w:num w:numId="85" w16cid:durableId="64299649">
-    <w:abstractNumId w:val="69"/>
+    <w:abstractNumId w:val="72"/>
   </w:num>
   <w:num w:numId="86" w16cid:durableId="868182992">
-    <w:abstractNumId w:val="43"/>
+    <w:abstractNumId w:val="44"/>
   </w:num>
   <w:num w:numId="87" w16cid:durableId="896863331">
-    <w:abstractNumId w:val="18"/>
+    <w:abstractNumId w:val="19"/>
   </w:num>
   <w:num w:numId="88" w16cid:durableId="505442826">
-    <w:abstractNumId w:val="70"/>
+    <w:abstractNumId w:val="73"/>
   </w:num>
   <w:num w:numId="89" w16cid:durableId="1858763908">
-    <w:abstractNumId w:val="27"/>
+    <w:abstractNumId w:val="28"/>
   </w:num>
   <w:num w:numId="90" w16cid:durableId="1896088176">
-    <w:abstractNumId w:val="8"/>
+    <w:abstractNumId w:val="9"/>
+  </w:num>
+  <w:num w:numId="91" w16cid:durableId="1284576603">
+    <w:abstractNumId w:val="64"/>
+  </w:num>
+  <w:num w:numId="92" w16cid:durableId="1963075542">
+    <w:abstractNumId w:val="6"/>
+  </w:num>
+  <w:num w:numId="93" w16cid:durableId="787627596">
+    <w:abstractNumId w:val="55"/>
   </w:num>
   <w:numIdMacAtCleanup w:val="45"/>
 </w:numbering>

</xml_diff>

<commit_message>
Recommendation Generation Sequence Diagram (#240)
</commit_message>
<xml_diff>
--- a/Sequence Specification Document.docx
+++ b/Sequence Specification Document.docx
@@ -5263,10 +5263,638 @@
     </w:p>
     <w:p>
       <w:pPr>
+        <w:pStyle w:val="Heading3"/>
+        <w:numPr>
+          <w:ilvl w:val="0"/>
+          <w:numId w:val="74"/>
+        </w:numPr>
+      </w:pPr>
+      <w:r>
+        <w:lastRenderedPageBreak/>
+        <w:t>Recommendation Generation (AI) Sequence</w:t>
+      </w:r>
+    </w:p>
+    <w:p>
+      <w:pPr>
         <w:spacing w:line="278" w:lineRule="auto"/>
-      </w:pPr>
-      <w:r>
+        <w:rPr>
+          <w:b/>
+          <w:bCs/>
+        </w:rPr>
+      </w:pPr>
+      <w:r>
+        <w:rPr>
+          <w:b/>
+          <w:bCs/>
+        </w:rPr>
+        <w:t>Purpose</w:t>
+      </w:r>
+    </w:p>
+    <w:p>
+      <w:pPr>
+        <w:spacing w:line="278" w:lineRule="auto"/>
+      </w:pPr>
+      <w:r>
+        <w:t>Recommendation Generation (AI) Sequence Diagram shows how the interactions between the client, recommendation sub-system and data repositories take place while generating personalized recommendations of the vehicles in the KriGo platform. The idea behind this process is to help clients find the best suitable vehicles as per their preferences and activities, and availability through an AI-driven recommendation engine.</w:t>
+      </w:r>
+    </w:p>
+    <w:p>
+      <w:pPr>
+        <w:spacing w:line="278" w:lineRule="auto"/>
+      </w:pPr>
+      <w:r>
+        <w:t>The sequence diagram represents the process of extracting the client’s details, gathering data about the available vehicles, recommendation engine execution and generating personal recommendations.</w:t>
+      </w:r>
+    </w:p>
+    <w:p>
+      <w:pPr>
+        <w:spacing w:line="278" w:lineRule="auto"/>
+        <w:rPr>
+          <w:b/>
+          <w:bCs/>
+        </w:rPr>
+      </w:pPr>
+      <w:r>
+        <w:rPr>
+          <w:b/>
+          <w:bCs/>
+        </w:rPr>
+        <w:t>Participating Objects</w:t>
+      </w:r>
+    </w:p>
+    <w:p>
+      <w:pPr>
+        <w:spacing w:line="278" w:lineRule="auto"/>
+      </w:pPr>
+      <w:r>
+        <w:t>The sequence diagram includes the following participants:</w:t>
+      </w:r>
+    </w:p>
+    <w:p>
+      <w:pPr>
+        <w:numPr>
+          <w:ilvl w:val="0"/>
+          <w:numId w:val="97"/>
+        </w:numPr>
+        <w:spacing w:after="0" w:line="276" w:lineRule="auto"/>
+      </w:pPr>
+      <w:r>
+        <w:rPr>
+          <w:b/>
+          <w:bCs/>
+        </w:rPr>
+        <w:t>Customer (Actor):</w:t>
+      </w:r>
+      <w:r>
+        <w:t xml:space="preserve"> Requests personalized vehicle recommendations.</w:t>
+      </w:r>
+    </w:p>
+    <w:p>
+      <w:pPr>
+        <w:numPr>
+          <w:ilvl w:val="0"/>
+          <w:numId w:val="97"/>
+        </w:numPr>
+        <w:spacing w:after="0" w:line="276" w:lineRule="auto"/>
+      </w:pPr>
+      <w:r>
+        <w:rPr>
+          <w:b/>
+          <w:bCs/>
+        </w:rPr>
+        <w:t>RecommendationUI (Boundary):</w:t>
+      </w:r>
+      <w:r>
+        <w:t xml:space="preserve"> Provides the interface for requesting and displaying recommendations.</w:t>
+      </w:r>
+    </w:p>
+    <w:p>
+      <w:pPr>
+        <w:numPr>
+          <w:ilvl w:val="0"/>
+          <w:numId w:val="97"/>
+        </w:numPr>
+        <w:spacing w:after="0" w:line="276" w:lineRule="auto"/>
+      </w:pPr>
+      <w:r>
+        <w:rPr>
+          <w:b/>
+          <w:bCs/>
+        </w:rPr>
+        <w:t>RecommendationController (Control):</w:t>
+      </w:r>
+      <w:r>
+        <w:t xml:space="preserve"> Coordinates the recommendation workflow and business logic.</w:t>
+      </w:r>
+    </w:p>
+    <w:p>
+      <w:pPr>
+        <w:numPr>
+          <w:ilvl w:val="0"/>
+          <w:numId w:val="97"/>
+        </w:numPr>
+        <w:spacing w:after="0" w:line="276" w:lineRule="auto"/>
+      </w:pPr>
+      <w:r>
+        <w:rPr>
+          <w:b/>
+          <w:bCs/>
+        </w:rPr>
+        <w:t>RecommendationService (AI Engine) (Control):</w:t>
+      </w:r>
+      <w:r>
+        <w:t xml:space="preserve"> Executes the recommendation algorithm to generate personalized suggestions.</w:t>
+      </w:r>
+    </w:p>
+    <w:p>
+      <w:pPr>
+        <w:numPr>
+          <w:ilvl w:val="0"/>
+          <w:numId w:val="97"/>
+        </w:numPr>
+        <w:spacing w:after="0" w:line="276" w:lineRule="auto"/>
+      </w:pPr>
+      <w:r>
+        <w:rPr>
+          <w:b/>
+          <w:bCs/>
+        </w:rPr>
+        <w:t>CustomerRepository (Entity):</w:t>
+      </w:r>
+      <w:r>
+        <w:t xml:space="preserve"> Retrieves customer profile information and reservation history.</w:t>
+      </w:r>
+    </w:p>
+    <w:p>
+      <w:pPr>
+        <w:numPr>
+          <w:ilvl w:val="0"/>
+          <w:numId w:val="97"/>
+        </w:numPr>
+        <w:spacing w:after="0" w:line="276" w:lineRule="auto"/>
+      </w:pPr>
+      <w:r>
+        <w:rPr>
+          <w:b/>
+          <w:bCs/>
+        </w:rPr>
+        <w:t>VehicleRepository (Entity):</w:t>
+      </w:r>
+      <w:r>
+        <w:t xml:space="preserve"> Retrieves information about available vehicles.</w:t>
+      </w:r>
+    </w:p>
+    <w:p>
+      <w:pPr>
+        <w:numPr>
+          <w:ilvl w:val="0"/>
+          <w:numId w:val="97"/>
+        </w:numPr>
+        <w:spacing w:line="276" w:lineRule="auto"/>
+      </w:pPr>
+      <w:r>
+        <w:rPr>
+          <w:b/>
+          <w:bCs/>
+        </w:rPr>
+        <w:t>Database (Database):</w:t>
+      </w:r>
+      <w:r>
+        <w:t xml:space="preserve"> Stores customer profiles, reservation history, and vehicle information.</w:t>
+      </w:r>
+    </w:p>
+    <w:p>
+      <w:pPr>
+        <w:spacing w:line="278" w:lineRule="auto"/>
+        <w:rPr>
+          <w:b/>
+          <w:bCs/>
+        </w:rPr>
+      </w:pPr>
+      <w:r>
+        <w:rPr>
+          <w:b/>
+          <w:bCs/>
+        </w:rPr>
+        <w:t>Recommendation Generation Process</w:t>
+      </w:r>
+    </w:p>
+    <w:p>
+      <w:pPr>
+        <w:spacing w:line="278" w:lineRule="auto"/>
+      </w:pPr>
+      <w:r>
+        <w:t>The recommendation process is triggered once the customer asks for recommendations about suitable cars by using the RecommendationUI. RecommendationController fetches customer profile details, preferences, and past reservations from the CustomerRepository.</w:t>
+      </w:r>
+    </w:p>
+    <w:p>
+      <w:pPr>
+        <w:spacing w:line="278" w:lineRule="auto"/>
+      </w:pPr>
+      <w:r>
+        <w:t>RecommendationController now fetches the list of available vehicles from VehicleRepository. Details about customers and vehicles are sent to RecommendationService (AI Engine) for processing the details and producing a list of recommendations based on user preferences, past reservations, search behavior, features of vehicle, and availability.</w:t>
+      </w:r>
+    </w:p>
+    <w:p>
+      <w:pPr>
+        <w:spacing w:line="278" w:lineRule="auto"/>
+      </w:pPr>
+      <w:r>
+        <w:t>Recommendations produced by the AI engine are provided back to the</w:t>
+      </w:r>
+      <w:r>
+        <w:t xml:space="preserve"> </w:t>
+      </w:r>
+      <w:r>
+        <w:t>RecommendationController and finally sent to the RecommendationUI</w:t>
+      </w:r>
+      <w:r>
+        <w:t>.</w:t>
+      </w:r>
+    </w:p>
+    <w:p>
+      <w:pPr>
+        <w:spacing w:line="278" w:lineRule="auto"/>
+        <w:rPr>
+          <w:b/>
+          <w:bCs/>
+        </w:rPr>
+      </w:pPr>
+      <w:r>
+        <w:rPr>
+          <w:b/>
+          <w:bCs/>
+        </w:rPr>
+        <w:br w:type="page"/>
+      </w:r>
+    </w:p>
+    <w:p>
+      <w:pPr>
+        <w:spacing w:line="278" w:lineRule="auto"/>
+        <w:rPr>
+          <w:b/>
+          <w:bCs/>
+        </w:rPr>
+      </w:pPr>
+      <w:r>
+        <w:rPr>
+          <w:b/>
+          <w:bCs/>
+        </w:rPr>
         <w:lastRenderedPageBreak/>
+        <w:t>Personalized Recommendation Logic</w:t>
+      </w:r>
+    </w:p>
+    <w:p>
+      <w:pPr>
+        <w:spacing w:line="278" w:lineRule="auto"/>
+      </w:pPr>
+      <w:r>
+        <w:t>The AI recommendation engine evaluates multiple factors to improve recommendation quality, including:</w:t>
+      </w:r>
+    </w:p>
+    <w:p>
+      <w:pPr>
+        <w:pStyle w:val="ListParagraph"/>
+        <w:numPr>
+          <w:ilvl w:val="0"/>
+          <w:numId w:val="98"/>
+        </w:numPr>
+        <w:spacing w:after="0" w:line="276" w:lineRule="auto"/>
+      </w:pPr>
+      <w:r>
+        <w:t>Customer preferences and profile information.</w:t>
+      </w:r>
+    </w:p>
+    <w:p>
+      <w:pPr>
+        <w:pStyle w:val="ListParagraph"/>
+        <w:numPr>
+          <w:ilvl w:val="0"/>
+          <w:numId w:val="98"/>
+        </w:numPr>
+        <w:spacing w:after="0" w:line="276" w:lineRule="auto"/>
+      </w:pPr>
+      <w:r>
+        <w:t>Previous reservation and search history.</w:t>
+      </w:r>
+    </w:p>
+    <w:p>
+      <w:pPr>
+        <w:pStyle w:val="ListParagraph"/>
+        <w:numPr>
+          <w:ilvl w:val="0"/>
+          <w:numId w:val="98"/>
+        </w:numPr>
+        <w:spacing w:after="0" w:line="276" w:lineRule="auto"/>
+      </w:pPr>
+      <w:r>
+        <w:t>Vehicle category and specifications.</w:t>
+      </w:r>
+    </w:p>
+    <w:p>
+      <w:pPr>
+        <w:pStyle w:val="ListParagraph"/>
+        <w:numPr>
+          <w:ilvl w:val="0"/>
+          <w:numId w:val="98"/>
+        </w:numPr>
+        <w:spacing w:after="0" w:line="276" w:lineRule="auto"/>
+      </w:pPr>
+      <w:r>
+        <w:t>Rental price range.</w:t>
+      </w:r>
+    </w:p>
+    <w:p>
+      <w:pPr>
+        <w:pStyle w:val="ListParagraph"/>
+        <w:numPr>
+          <w:ilvl w:val="0"/>
+          <w:numId w:val="98"/>
+        </w:numPr>
+        <w:spacing w:after="0" w:line="276" w:lineRule="auto"/>
+      </w:pPr>
+      <w:r>
+        <w:t>Vehicle availability.</w:t>
+      </w:r>
+    </w:p>
+    <w:p>
+      <w:pPr>
+        <w:pStyle w:val="ListParagraph"/>
+        <w:numPr>
+          <w:ilvl w:val="0"/>
+          <w:numId w:val="98"/>
+        </w:numPr>
+        <w:spacing w:line="276" w:lineRule="auto"/>
+      </w:pPr>
+      <w:r>
+        <w:t>Similar user behavior and recommendation patterns.</w:t>
+      </w:r>
+    </w:p>
+    <w:p>
+      <w:pPr>
+        <w:spacing w:line="278" w:lineRule="auto"/>
+      </w:pPr>
+      <w:r>
+        <w:t>By combining these factors, the recommendation engine provides suggestions that are more relevant to each individual customer.</w:t>
+      </w:r>
+    </w:p>
+    <w:p>
+      <w:pPr>
+        <w:spacing w:line="278" w:lineRule="auto"/>
+        <w:rPr>
+          <w:b/>
+          <w:bCs/>
+        </w:rPr>
+      </w:pPr>
+      <w:r>
+        <w:rPr>
+          <w:b/>
+          <w:bCs/>
+        </w:rPr>
+        <w:t>Recommendations for New Customers</w:t>
+      </w:r>
+    </w:p>
+    <w:p>
+      <w:pPr>
+        <w:spacing w:line="278" w:lineRule="auto"/>
+      </w:pPr>
+      <w:r>
+        <w:t>There is an alternative sequence for the case in which there is little or no prior history of interaction for the clients in the sequence diagram. In cases where there is no history to work on, such that the RecommendationService cannot provide personalized suggestions based on the history, it will provide a list of popular or well-rated cars.</w:t>
+      </w:r>
+    </w:p>
+    <w:p>
+      <w:pPr>
+        <w:spacing w:line="278" w:lineRule="auto"/>
+        <w:rPr>
+          <w:b/>
+          <w:bCs/>
+        </w:rPr>
+      </w:pPr>
+      <w:r>
+        <w:rPr>
+          <w:b/>
+          <w:bCs/>
+        </w:rPr>
+        <w:t>No Matching Recommendations</w:t>
+      </w:r>
+    </w:p>
+    <w:p>
+      <w:pPr>
+        <w:spacing w:line="278" w:lineRule="auto"/>
+      </w:pPr>
+      <w:r>
+        <w:t>The diagram also includes examples where the recommendation engine cannot find cars that match the customer’s requirements or constraints. In such cases, the RecommendationService returns an empty data set and suggests the customer change his search parameters or add some other car types to his requirements.</w:t>
+      </w:r>
+    </w:p>
+    <w:p>
+      <w:pPr>
+        <w:spacing w:line="278" w:lineRule="auto"/>
+        <w:rPr>
+          <w:b/>
+          <w:bCs/>
+        </w:rPr>
+      </w:pPr>
+      <w:r>
+        <w:rPr>
+          <w:b/>
+          <w:bCs/>
+        </w:rPr>
+        <w:t>Alternative and Exceptional Flows</w:t>
+      </w:r>
+    </w:p>
+    <w:p>
+      <w:pPr>
+        <w:spacing w:line="278" w:lineRule="auto"/>
+      </w:pPr>
+      <w:r>
+        <w:t>The Recommendation Generation Sequence Diagram incorporates several alternative scenarios:</w:t>
+      </w:r>
+    </w:p>
+    <w:p>
+      <w:pPr>
+        <w:pStyle w:val="ListParagraph"/>
+        <w:numPr>
+          <w:ilvl w:val="0"/>
+          <w:numId w:val="99"/>
+        </w:numPr>
+        <w:spacing w:line="278" w:lineRule="auto"/>
+      </w:pPr>
+      <w:r>
+        <w:t>Successful generation of personalized recommendations.</w:t>
+      </w:r>
+    </w:p>
+    <w:p>
+      <w:pPr>
+        <w:pStyle w:val="ListParagraph"/>
+        <w:numPr>
+          <w:ilvl w:val="0"/>
+          <w:numId w:val="99"/>
+        </w:numPr>
+        <w:spacing w:line="278" w:lineRule="auto"/>
+      </w:pPr>
+      <w:r>
+        <w:t>Recommendations for new customers based on popular vehicles.</w:t>
+      </w:r>
+    </w:p>
+    <w:p>
+      <w:pPr>
+        <w:pStyle w:val="ListParagraph"/>
+        <w:numPr>
+          <w:ilvl w:val="0"/>
+          <w:numId w:val="99"/>
+        </w:numPr>
+        <w:spacing w:line="278" w:lineRule="auto"/>
+      </w:pPr>
+      <w:r>
+        <w:t>No matching recommendations due to unavailable or incompatible vehicles.</w:t>
+      </w:r>
+    </w:p>
+    <w:p>
+      <w:pPr>
+        <w:spacing w:line="278" w:lineRule="auto"/>
+      </w:pPr>
+      <w:r>
+        <w:t>These alternative flows ensure that customers receive useful guidance regardless of their interaction history or current vehicle availability.</w:t>
+      </w:r>
+    </w:p>
+    <w:p>
+      <w:pPr>
+        <w:spacing w:line="278" w:lineRule="auto"/>
+        <w:rPr>
+          <w:b/>
+          <w:bCs/>
+        </w:rPr>
+      </w:pPr>
+      <w:r>
+        <w:rPr>
+          <w:b/>
+          <w:bCs/>
+        </w:rPr>
+        <w:br w:type="page"/>
+      </w:r>
+    </w:p>
+    <w:p>
+      <w:pPr>
+        <w:spacing w:line="278" w:lineRule="auto"/>
+        <w:rPr>
+          <w:b/>
+          <w:bCs/>
+        </w:rPr>
+      </w:pPr>
+      <w:r>
+        <w:rPr>
+          <w:b/>
+          <w:bCs/>
+        </w:rPr>
+        <w:lastRenderedPageBreak/>
+        <w:t>Conclusion</w:t>
+      </w:r>
+    </w:p>
+    <w:p>
+      <w:pPr>
+        <w:spacing w:line="278" w:lineRule="auto"/>
+      </w:pPr>
+      <w:r>
+        <w:t>The Recommendation Generation (AI) Sequence Diagram is a detailed visual representation of the interactions associated with generating intelligent recommendations from vehicles through the KriGo platform. It shows how customer information, available vehicles, and intelligent recommendation engines work together to create the recommendations. This sequence diagram serves as an important design document that helps explain the recommendation subsystem of the platform.</w:t>
+      </w:r>
+    </w:p>
+    <w:p>
+      <w:pPr>
+        <w:keepNext/>
+        <w:spacing w:line="278" w:lineRule="auto"/>
+      </w:pPr>
+      <w:r>
+        <w:rPr>
+          <w:noProof/>
+        </w:rPr>
+        <w:drawing>
+          <wp:inline distT="0" distB="0" distL="0" distR="0" wp14:anchorId="32437357" wp14:editId="60AC9A09">
+            <wp:extent cx="5934075" cy="3562350"/>
+            <wp:effectExtent l="0" t="0" r="9525" b="0"/>
+            <wp:docPr id="44826833" name="Picture 9"/>
+            <wp:cNvGraphicFramePr>
+              <a:graphicFrameLocks xmlns:a="http://schemas.openxmlformats.org/drawingml/2006/main" noChangeAspect="1"/>
+            </wp:cNvGraphicFramePr>
+            <a:graphic xmlns:a="http://schemas.openxmlformats.org/drawingml/2006/main">
+              <a:graphicData uri="http://schemas.openxmlformats.org/drawingml/2006/picture">
+                <pic:pic xmlns:pic="http://schemas.openxmlformats.org/drawingml/2006/picture">
+                  <pic:nvPicPr>
+                    <pic:cNvPr id="0" name="Picture 12"/>
+                    <pic:cNvPicPr>
+                      <a:picLocks noChangeAspect="1" noChangeArrowheads="1"/>
+                    </pic:cNvPicPr>
+                  </pic:nvPicPr>
+                  <pic:blipFill>
+                    <a:blip r:embed="rId16" cstate="print">
+                      <a:extLst>
+                        <a:ext uri="{28A0092B-C50C-407E-A947-70E740481C1C}">
+                          <a14:useLocalDpi xmlns:a14="http://schemas.microsoft.com/office/drawing/2010/main" val="0"/>
+                        </a:ext>
+                      </a:extLst>
+                    </a:blip>
+                    <a:srcRect/>
+                    <a:stretch>
+                      <a:fillRect/>
+                    </a:stretch>
+                  </pic:blipFill>
+                  <pic:spPr bwMode="auto">
+                    <a:xfrm>
+                      <a:off x="0" y="0"/>
+                      <a:ext cx="5934075" cy="3562350"/>
+                    </a:xfrm>
+                    <a:prstGeom prst="rect">
+                      <a:avLst/>
+                    </a:prstGeom>
+                    <a:noFill/>
+                    <a:ln>
+                      <a:noFill/>
+                    </a:ln>
+                  </pic:spPr>
+                </pic:pic>
+              </a:graphicData>
+            </a:graphic>
+          </wp:inline>
+        </w:drawing>
+      </w:r>
+    </w:p>
+    <w:p>
+      <w:pPr>
+        <w:pStyle w:val="Caption"/>
+      </w:pPr>
+      <w:r>
+        <w:t xml:space="preserve">Figure </w:t>
+      </w:r>
+      <w:r>
+        <w:fldChar w:fldCharType="begin"/>
+      </w:r>
+      <w:r>
+        <w:instrText xml:space="preserve"> SEQ Figure \* ARABIC </w:instrText>
+      </w:r>
+      <w:r>
+        <w:fldChar w:fldCharType="separate"/>
+      </w:r>
+      <w:r>
+        <w:rPr>
+          <w:noProof/>
+        </w:rPr>
+        <w:t>9</w:t>
+      </w:r>
+      <w:r>
+        <w:fldChar w:fldCharType="end"/>
+      </w:r>
+      <w:r>
+        <w:t xml:space="preserve"> - </w:t>
+      </w:r>
+      <w:r>
+        <w:t>Recommendation Generation Sequence Diagram</w:t>
+      </w:r>
+    </w:p>
+    <w:p>
+      <w:pPr>
+        <w:spacing w:line="278" w:lineRule="auto"/>
+      </w:pPr>
+      <w:r>
         <w:br w:type="page"/>
       </w:r>
     </w:p>
@@ -6391,6 +7019,155 @@
     </w:lvl>
   </w:abstractNum>
   <w:abstractNum w:abstractNumId="8" w15:restartNumberingAfterBreak="0">
+    <w:nsid w:val="0AE82489"/>
+    <w:multiLevelType w:val="multilevel"/>
+    <w:tmpl w:val="B82C10D4"/>
+    <w:lvl w:ilvl="0">
+      <w:start w:val="1"/>
+      <w:numFmt w:val="bullet"/>
+      <w:lvlText w:val=""/>
+      <w:lvlJc w:val="left"/>
+      <w:pPr>
+        <w:tabs>
+          <w:tab w:val="num" w:pos="720"/>
+        </w:tabs>
+        <w:ind w:left="720" w:hanging="360"/>
+      </w:pPr>
+      <w:rPr>
+        <w:rFonts w:ascii="Symbol" w:hAnsi="Symbol" w:hint="default"/>
+        <w:sz w:val="20"/>
+      </w:rPr>
+    </w:lvl>
+    <w:lvl w:ilvl="1" w:tentative="1">
+      <w:start w:val="1"/>
+      <w:numFmt w:val="bullet"/>
+      <w:lvlText w:val="o"/>
+      <w:lvlJc w:val="left"/>
+      <w:pPr>
+        <w:tabs>
+          <w:tab w:val="num" w:pos="1440"/>
+        </w:tabs>
+        <w:ind w:left="1440" w:hanging="360"/>
+      </w:pPr>
+      <w:rPr>
+        <w:rFonts w:ascii="Courier New" w:hAnsi="Courier New" w:hint="default"/>
+        <w:sz w:val="20"/>
+      </w:rPr>
+    </w:lvl>
+    <w:lvl w:ilvl="2" w:tentative="1">
+      <w:start w:val="1"/>
+      <w:numFmt w:val="bullet"/>
+      <w:lvlText w:val=""/>
+      <w:lvlJc w:val="left"/>
+      <w:pPr>
+        <w:tabs>
+          <w:tab w:val="num" w:pos="2160"/>
+        </w:tabs>
+        <w:ind w:left="2160" w:hanging="360"/>
+      </w:pPr>
+      <w:rPr>
+        <w:rFonts w:ascii="Wingdings" w:hAnsi="Wingdings" w:hint="default"/>
+        <w:sz w:val="20"/>
+      </w:rPr>
+    </w:lvl>
+    <w:lvl w:ilvl="3" w:tentative="1">
+      <w:start w:val="1"/>
+      <w:numFmt w:val="bullet"/>
+      <w:lvlText w:val=""/>
+      <w:lvlJc w:val="left"/>
+      <w:pPr>
+        <w:tabs>
+          <w:tab w:val="num" w:pos="2880"/>
+        </w:tabs>
+        <w:ind w:left="2880" w:hanging="360"/>
+      </w:pPr>
+      <w:rPr>
+        <w:rFonts w:ascii="Wingdings" w:hAnsi="Wingdings" w:hint="default"/>
+        <w:sz w:val="20"/>
+      </w:rPr>
+    </w:lvl>
+    <w:lvl w:ilvl="4" w:tentative="1">
+      <w:start w:val="1"/>
+      <w:numFmt w:val="bullet"/>
+      <w:lvlText w:val=""/>
+      <w:lvlJc w:val="left"/>
+      <w:pPr>
+        <w:tabs>
+          <w:tab w:val="num" w:pos="3600"/>
+        </w:tabs>
+        <w:ind w:left="3600" w:hanging="360"/>
+      </w:pPr>
+      <w:rPr>
+        <w:rFonts w:ascii="Wingdings" w:hAnsi="Wingdings" w:hint="default"/>
+        <w:sz w:val="20"/>
+      </w:rPr>
+    </w:lvl>
+    <w:lvl w:ilvl="5" w:tentative="1">
+      <w:start w:val="1"/>
+      <w:numFmt w:val="bullet"/>
+      <w:lvlText w:val=""/>
+      <w:lvlJc w:val="left"/>
+      <w:pPr>
+        <w:tabs>
+          <w:tab w:val="num" w:pos="4320"/>
+        </w:tabs>
+        <w:ind w:left="4320" w:hanging="360"/>
+      </w:pPr>
+      <w:rPr>
+        <w:rFonts w:ascii="Wingdings" w:hAnsi="Wingdings" w:hint="default"/>
+        <w:sz w:val="20"/>
+      </w:rPr>
+    </w:lvl>
+    <w:lvl w:ilvl="6" w:tentative="1">
+      <w:start w:val="1"/>
+      <w:numFmt w:val="bullet"/>
+      <w:lvlText w:val=""/>
+      <w:lvlJc w:val="left"/>
+      <w:pPr>
+        <w:tabs>
+          <w:tab w:val="num" w:pos="5040"/>
+        </w:tabs>
+        <w:ind w:left="5040" w:hanging="360"/>
+      </w:pPr>
+      <w:rPr>
+        <w:rFonts w:ascii="Wingdings" w:hAnsi="Wingdings" w:hint="default"/>
+        <w:sz w:val="20"/>
+      </w:rPr>
+    </w:lvl>
+    <w:lvl w:ilvl="7" w:tentative="1">
+      <w:start w:val="1"/>
+      <w:numFmt w:val="bullet"/>
+      <w:lvlText w:val=""/>
+      <w:lvlJc w:val="left"/>
+      <w:pPr>
+        <w:tabs>
+          <w:tab w:val="num" w:pos="5760"/>
+        </w:tabs>
+        <w:ind w:left="5760" w:hanging="360"/>
+      </w:pPr>
+      <w:rPr>
+        <w:rFonts w:ascii="Wingdings" w:hAnsi="Wingdings" w:hint="default"/>
+        <w:sz w:val="20"/>
+      </w:rPr>
+    </w:lvl>
+    <w:lvl w:ilvl="8" w:tentative="1">
+      <w:start w:val="1"/>
+      <w:numFmt w:val="bullet"/>
+      <w:lvlText w:val=""/>
+      <w:lvlJc w:val="left"/>
+      <w:pPr>
+        <w:tabs>
+          <w:tab w:val="num" w:pos="6480"/>
+        </w:tabs>
+        <w:ind w:left="6480" w:hanging="360"/>
+      </w:pPr>
+      <w:rPr>
+        <w:rFonts w:ascii="Wingdings" w:hAnsi="Wingdings" w:hint="default"/>
+        <w:sz w:val="20"/>
+      </w:rPr>
+    </w:lvl>
+  </w:abstractNum>
+  <w:abstractNum w:abstractNumId="9" w15:restartNumberingAfterBreak="0">
     <w:nsid w:val="0CC17936"/>
     <w:multiLevelType w:val="multilevel"/>
     <w:tmpl w:val="B5E0C4F8"/>
@@ -6539,7 +7316,7 @@
       </w:rPr>
     </w:lvl>
   </w:abstractNum>
-  <w:abstractNum w:abstractNumId="9" w15:restartNumberingAfterBreak="0">
+  <w:abstractNum w:abstractNumId="10" w15:restartNumberingAfterBreak="0">
     <w:nsid w:val="0E1040E2"/>
     <w:multiLevelType w:val="multilevel"/>
     <w:tmpl w:val="607CCC88"/>
@@ -6688,7 +7465,7 @@
       </w:rPr>
     </w:lvl>
   </w:abstractNum>
-  <w:abstractNum w:abstractNumId="10" w15:restartNumberingAfterBreak="0">
+  <w:abstractNum w:abstractNumId="11" w15:restartNumberingAfterBreak="0">
     <w:nsid w:val="0E2561E7"/>
     <w:multiLevelType w:val="hybridMultilevel"/>
     <w:tmpl w:val="2A6E4870"/>
@@ -6801,7 +7578,7 @@
       </w:rPr>
     </w:lvl>
   </w:abstractNum>
-  <w:abstractNum w:abstractNumId="11" w15:restartNumberingAfterBreak="0">
+  <w:abstractNum w:abstractNumId="12" w15:restartNumberingAfterBreak="0">
     <w:nsid w:val="0E841C27"/>
     <w:multiLevelType w:val="hybridMultilevel"/>
     <w:tmpl w:val="789C7F32"/>
@@ -6914,7 +7691,7 @@
       </w:rPr>
     </w:lvl>
   </w:abstractNum>
-  <w:abstractNum w:abstractNumId="12" w15:restartNumberingAfterBreak="0">
+  <w:abstractNum w:abstractNumId="13" w15:restartNumberingAfterBreak="0">
     <w:nsid w:val="0FAA2602"/>
     <w:multiLevelType w:val="hybridMultilevel"/>
     <w:tmpl w:val="C6C63128"/>
@@ -7027,7 +7804,7 @@
       </w:rPr>
     </w:lvl>
   </w:abstractNum>
-  <w:abstractNum w:abstractNumId="13" w15:restartNumberingAfterBreak="0">
+  <w:abstractNum w:abstractNumId="14" w15:restartNumberingAfterBreak="0">
     <w:nsid w:val="122550ED"/>
     <w:multiLevelType w:val="hybridMultilevel"/>
     <w:tmpl w:val="91ACE480"/>
@@ -7140,7 +7917,7 @@
       </w:rPr>
     </w:lvl>
   </w:abstractNum>
-  <w:abstractNum w:abstractNumId="14" w15:restartNumberingAfterBreak="0">
+  <w:abstractNum w:abstractNumId="15" w15:restartNumberingAfterBreak="0">
     <w:nsid w:val="124C1BAE"/>
     <w:multiLevelType w:val="hybridMultilevel"/>
     <w:tmpl w:val="04988FC0"/>
@@ -7253,7 +8030,7 @@
       </w:rPr>
     </w:lvl>
   </w:abstractNum>
-  <w:abstractNum w:abstractNumId="15" w15:restartNumberingAfterBreak="0">
+  <w:abstractNum w:abstractNumId="16" w15:restartNumberingAfterBreak="0">
     <w:nsid w:val="139F7557"/>
     <w:multiLevelType w:val="multilevel"/>
     <w:tmpl w:val="A984C1D4"/>
@@ -7402,7 +8179,7 @@
       </w:rPr>
     </w:lvl>
   </w:abstractNum>
-  <w:abstractNum w:abstractNumId="16" w15:restartNumberingAfterBreak="0">
+  <w:abstractNum w:abstractNumId="17" w15:restartNumberingAfterBreak="0">
     <w:nsid w:val="16D400B4"/>
     <w:multiLevelType w:val="hybridMultilevel"/>
     <w:tmpl w:val="58E6DFBE"/>
@@ -7515,7 +8292,7 @@
       </w:rPr>
     </w:lvl>
   </w:abstractNum>
-  <w:abstractNum w:abstractNumId="17" w15:restartNumberingAfterBreak="0">
+  <w:abstractNum w:abstractNumId="18" w15:restartNumberingAfterBreak="0">
     <w:nsid w:val="17236012"/>
     <w:multiLevelType w:val="hybridMultilevel"/>
     <w:tmpl w:val="DAFA46C8"/>
@@ -7628,7 +8405,7 @@
       </w:rPr>
     </w:lvl>
   </w:abstractNum>
-  <w:abstractNum w:abstractNumId="18" w15:restartNumberingAfterBreak="0">
+  <w:abstractNum w:abstractNumId="19" w15:restartNumberingAfterBreak="0">
     <w:nsid w:val="172B04C0"/>
     <w:multiLevelType w:val="hybridMultilevel"/>
     <w:tmpl w:val="B6C41D5E"/>
@@ -7741,7 +8518,7 @@
       </w:rPr>
     </w:lvl>
   </w:abstractNum>
-  <w:abstractNum w:abstractNumId="19" w15:restartNumberingAfterBreak="0">
+  <w:abstractNum w:abstractNumId="20" w15:restartNumberingAfterBreak="0">
     <w:nsid w:val="17485CCB"/>
     <w:multiLevelType w:val="multilevel"/>
     <w:tmpl w:val="397E1AE0"/>
@@ -7890,7 +8667,7 @@
       </w:rPr>
     </w:lvl>
   </w:abstractNum>
-  <w:abstractNum w:abstractNumId="20" w15:restartNumberingAfterBreak="0">
+  <w:abstractNum w:abstractNumId="21" w15:restartNumberingAfterBreak="0">
     <w:nsid w:val="17763D31"/>
     <w:multiLevelType w:val="hybridMultilevel"/>
     <w:tmpl w:val="6CE63304"/>
@@ -8003,7 +8780,7 @@
       </w:rPr>
     </w:lvl>
   </w:abstractNum>
-  <w:abstractNum w:abstractNumId="21" w15:restartNumberingAfterBreak="0">
+  <w:abstractNum w:abstractNumId="22" w15:restartNumberingAfterBreak="0">
     <w:nsid w:val="17B06937"/>
     <w:multiLevelType w:val="hybridMultilevel"/>
     <w:tmpl w:val="71089CF2"/>
@@ -8116,7 +8893,7 @@
       </w:rPr>
     </w:lvl>
   </w:abstractNum>
-  <w:abstractNum w:abstractNumId="22" w15:restartNumberingAfterBreak="0">
+  <w:abstractNum w:abstractNumId="23" w15:restartNumberingAfterBreak="0">
     <w:nsid w:val="195875B0"/>
     <w:multiLevelType w:val="multilevel"/>
     <w:tmpl w:val="615444D4"/>
@@ -8229,7 +9006,7 @@
       </w:pPr>
     </w:lvl>
   </w:abstractNum>
-  <w:abstractNum w:abstractNumId="23" w15:restartNumberingAfterBreak="0">
+  <w:abstractNum w:abstractNumId="24" w15:restartNumberingAfterBreak="0">
     <w:nsid w:val="197C6FD7"/>
     <w:multiLevelType w:val="hybridMultilevel"/>
     <w:tmpl w:val="D97CEAA8"/>
@@ -8342,7 +9119,7 @@
       </w:rPr>
     </w:lvl>
   </w:abstractNum>
-  <w:abstractNum w:abstractNumId="24" w15:restartNumberingAfterBreak="0">
+  <w:abstractNum w:abstractNumId="25" w15:restartNumberingAfterBreak="0">
     <w:nsid w:val="1CC60A94"/>
     <w:multiLevelType w:val="multilevel"/>
     <w:tmpl w:val="EB74741C"/>
@@ -8491,7 +9268,7 @@
       </w:rPr>
     </w:lvl>
   </w:abstractNum>
-  <w:abstractNum w:abstractNumId="25" w15:restartNumberingAfterBreak="0">
+  <w:abstractNum w:abstractNumId="26" w15:restartNumberingAfterBreak="0">
     <w:nsid w:val="1E6658CF"/>
     <w:multiLevelType w:val="multilevel"/>
     <w:tmpl w:val="762ABC5E"/>
@@ -8640,7 +9417,156 @@
       </w:rPr>
     </w:lvl>
   </w:abstractNum>
-  <w:abstractNum w:abstractNumId="26" w15:restartNumberingAfterBreak="0">
+  <w:abstractNum w:abstractNumId="27" w15:restartNumberingAfterBreak="0">
+    <w:nsid w:val="1FA532B0"/>
+    <w:multiLevelType w:val="multilevel"/>
+    <w:tmpl w:val="8718294C"/>
+    <w:lvl w:ilvl="0">
+      <w:start w:val="1"/>
+      <w:numFmt w:val="bullet"/>
+      <w:lvlText w:val=""/>
+      <w:lvlJc w:val="left"/>
+      <w:pPr>
+        <w:tabs>
+          <w:tab w:val="num" w:pos="720"/>
+        </w:tabs>
+        <w:ind w:left="720" w:hanging="360"/>
+      </w:pPr>
+      <w:rPr>
+        <w:rFonts w:ascii="Symbol" w:hAnsi="Symbol" w:hint="default"/>
+        <w:sz w:val="20"/>
+      </w:rPr>
+    </w:lvl>
+    <w:lvl w:ilvl="1" w:tentative="1">
+      <w:start w:val="1"/>
+      <w:numFmt w:val="bullet"/>
+      <w:lvlText w:val="o"/>
+      <w:lvlJc w:val="left"/>
+      <w:pPr>
+        <w:tabs>
+          <w:tab w:val="num" w:pos="1440"/>
+        </w:tabs>
+        <w:ind w:left="1440" w:hanging="360"/>
+      </w:pPr>
+      <w:rPr>
+        <w:rFonts w:ascii="Courier New" w:hAnsi="Courier New" w:hint="default"/>
+        <w:sz w:val="20"/>
+      </w:rPr>
+    </w:lvl>
+    <w:lvl w:ilvl="2" w:tentative="1">
+      <w:start w:val="1"/>
+      <w:numFmt w:val="bullet"/>
+      <w:lvlText w:val=""/>
+      <w:lvlJc w:val="left"/>
+      <w:pPr>
+        <w:tabs>
+          <w:tab w:val="num" w:pos="2160"/>
+        </w:tabs>
+        <w:ind w:left="2160" w:hanging="360"/>
+      </w:pPr>
+      <w:rPr>
+        <w:rFonts w:ascii="Wingdings" w:hAnsi="Wingdings" w:hint="default"/>
+        <w:sz w:val="20"/>
+      </w:rPr>
+    </w:lvl>
+    <w:lvl w:ilvl="3" w:tentative="1">
+      <w:start w:val="1"/>
+      <w:numFmt w:val="bullet"/>
+      <w:lvlText w:val=""/>
+      <w:lvlJc w:val="left"/>
+      <w:pPr>
+        <w:tabs>
+          <w:tab w:val="num" w:pos="2880"/>
+        </w:tabs>
+        <w:ind w:left="2880" w:hanging="360"/>
+      </w:pPr>
+      <w:rPr>
+        <w:rFonts w:ascii="Wingdings" w:hAnsi="Wingdings" w:hint="default"/>
+        <w:sz w:val="20"/>
+      </w:rPr>
+    </w:lvl>
+    <w:lvl w:ilvl="4" w:tentative="1">
+      <w:start w:val="1"/>
+      <w:numFmt w:val="bullet"/>
+      <w:lvlText w:val=""/>
+      <w:lvlJc w:val="left"/>
+      <w:pPr>
+        <w:tabs>
+          <w:tab w:val="num" w:pos="3600"/>
+        </w:tabs>
+        <w:ind w:left="3600" w:hanging="360"/>
+      </w:pPr>
+      <w:rPr>
+        <w:rFonts w:ascii="Wingdings" w:hAnsi="Wingdings" w:hint="default"/>
+        <w:sz w:val="20"/>
+      </w:rPr>
+    </w:lvl>
+    <w:lvl w:ilvl="5" w:tentative="1">
+      <w:start w:val="1"/>
+      <w:numFmt w:val="bullet"/>
+      <w:lvlText w:val=""/>
+      <w:lvlJc w:val="left"/>
+      <w:pPr>
+        <w:tabs>
+          <w:tab w:val="num" w:pos="4320"/>
+        </w:tabs>
+        <w:ind w:left="4320" w:hanging="360"/>
+      </w:pPr>
+      <w:rPr>
+        <w:rFonts w:ascii="Wingdings" w:hAnsi="Wingdings" w:hint="default"/>
+        <w:sz w:val="20"/>
+      </w:rPr>
+    </w:lvl>
+    <w:lvl w:ilvl="6" w:tentative="1">
+      <w:start w:val="1"/>
+      <w:numFmt w:val="bullet"/>
+      <w:lvlText w:val=""/>
+      <w:lvlJc w:val="left"/>
+      <w:pPr>
+        <w:tabs>
+          <w:tab w:val="num" w:pos="5040"/>
+        </w:tabs>
+        <w:ind w:left="5040" w:hanging="360"/>
+      </w:pPr>
+      <w:rPr>
+        <w:rFonts w:ascii="Wingdings" w:hAnsi="Wingdings" w:hint="default"/>
+        <w:sz w:val="20"/>
+      </w:rPr>
+    </w:lvl>
+    <w:lvl w:ilvl="7" w:tentative="1">
+      <w:start w:val="1"/>
+      <w:numFmt w:val="bullet"/>
+      <w:lvlText w:val=""/>
+      <w:lvlJc w:val="left"/>
+      <w:pPr>
+        <w:tabs>
+          <w:tab w:val="num" w:pos="5760"/>
+        </w:tabs>
+        <w:ind w:left="5760" w:hanging="360"/>
+      </w:pPr>
+      <w:rPr>
+        <w:rFonts w:ascii="Wingdings" w:hAnsi="Wingdings" w:hint="default"/>
+        <w:sz w:val="20"/>
+      </w:rPr>
+    </w:lvl>
+    <w:lvl w:ilvl="8" w:tentative="1">
+      <w:start w:val="1"/>
+      <w:numFmt w:val="bullet"/>
+      <w:lvlText w:val=""/>
+      <w:lvlJc w:val="left"/>
+      <w:pPr>
+        <w:tabs>
+          <w:tab w:val="num" w:pos="6480"/>
+        </w:tabs>
+        <w:ind w:left="6480" w:hanging="360"/>
+      </w:pPr>
+      <w:rPr>
+        <w:rFonts w:ascii="Wingdings" w:hAnsi="Wingdings" w:hint="default"/>
+        <w:sz w:val="20"/>
+      </w:rPr>
+    </w:lvl>
+  </w:abstractNum>
+  <w:abstractNum w:abstractNumId="28" w15:restartNumberingAfterBreak="0">
     <w:nsid w:val="215C77FD"/>
     <w:multiLevelType w:val="hybridMultilevel"/>
     <w:tmpl w:val="58F41D10"/>
@@ -8729,7 +9655,7 @@
       </w:pPr>
     </w:lvl>
   </w:abstractNum>
-  <w:abstractNum w:abstractNumId="27" w15:restartNumberingAfterBreak="0">
+  <w:abstractNum w:abstractNumId="29" w15:restartNumberingAfterBreak="0">
     <w:nsid w:val="218D5909"/>
     <w:multiLevelType w:val="hybridMultilevel"/>
     <w:tmpl w:val="CC989EE4"/>
@@ -8842,7 +9768,7 @@
       </w:rPr>
     </w:lvl>
   </w:abstractNum>
-  <w:abstractNum w:abstractNumId="28" w15:restartNumberingAfterBreak="0">
+  <w:abstractNum w:abstractNumId="30" w15:restartNumberingAfterBreak="0">
     <w:nsid w:val="23E010BA"/>
     <w:multiLevelType w:val="multilevel"/>
     <w:tmpl w:val="4A16907E"/>
@@ -8991,7 +9917,7 @@
       </w:rPr>
     </w:lvl>
   </w:abstractNum>
-  <w:abstractNum w:abstractNumId="29" w15:restartNumberingAfterBreak="0">
+  <w:abstractNum w:abstractNumId="31" w15:restartNumberingAfterBreak="0">
     <w:nsid w:val="2470127A"/>
     <w:multiLevelType w:val="multilevel"/>
     <w:tmpl w:val="309E9618"/>
@@ -9140,7 +10066,7 @@
       </w:rPr>
     </w:lvl>
   </w:abstractNum>
-  <w:abstractNum w:abstractNumId="30" w15:restartNumberingAfterBreak="0">
+  <w:abstractNum w:abstractNumId="32" w15:restartNumberingAfterBreak="0">
     <w:nsid w:val="24796798"/>
     <w:multiLevelType w:val="hybridMultilevel"/>
     <w:tmpl w:val="6622BEDC"/>
@@ -9229,7 +10155,156 @@
       </w:pPr>
     </w:lvl>
   </w:abstractNum>
-  <w:abstractNum w:abstractNumId="31" w15:restartNumberingAfterBreak="0">
+  <w:abstractNum w:abstractNumId="33" w15:restartNumberingAfterBreak="0">
+    <w:nsid w:val="253B76EC"/>
+    <w:multiLevelType w:val="multilevel"/>
+    <w:tmpl w:val="2AA67CDA"/>
+    <w:lvl w:ilvl="0">
+      <w:start w:val="1"/>
+      <w:numFmt w:val="bullet"/>
+      <w:lvlText w:val=""/>
+      <w:lvlJc w:val="left"/>
+      <w:pPr>
+        <w:tabs>
+          <w:tab w:val="num" w:pos="720"/>
+        </w:tabs>
+        <w:ind w:left="720" w:hanging="360"/>
+      </w:pPr>
+      <w:rPr>
+        <w:rFonts w:ascii="Wingdings" w:hAnsi="Wingdings" w:hint="default"/>
+        <w:sz w:val="20"/>
+      </w:rPr>
+    </w:lvl>
+    <w:lvl w:ilvl="1" w:tentative="1">
+      <w:start w:val="1"/>
+      <w:numFmt w:val="bullet"/>
+      <w:lvlText w:val="o"/>
+      <w:lvlJc w:val="left"/>
+      <w:pPr>
+        <w:tabs>
+          <w:tab w:val="num" w:pos="1440"/>
+        </w:tabs>
+        <w:ind w:left="1440" w:hanging="360"/>
+      </w:pPr>
+      <w:rPr>
+        <w:rFonts w:ascii="Courier New" w:hAnsi="Courier New" w:hint="default"/>
+        <w:sz w:val="20"/>
+      </w:rPr>
+    </w:lvl>
+    <w:lvl w:ilvl="2" w:tentative="1">
+      <w:start w:val="1"/>
+      <w:numFmt w:val="bullet"/>
+      <w:lvlText w:val=""/>
+      <w:lvlJc w:val="left"/>
+      <w:pPr>
+        <w:tabs>
+          <w:tab w:val="num" w:pos="2160"/>
+        </w:tabs>
+        <w:ind w:left="2160" w:hanging="360"/>
+      </w:pPr>
+      <w:rPr>
+        <w:rFonts w:ascii="Wingdings" w:hAnsi="Wingdings" w:hint="default"/>
+        <w:sz w:val="20"/>
+      </w:rPr>
+    </w:lvl>
+    <w:lvl w:ilvl="3" w:tentative="1">
+      <w:start w:val="1"/>
+      <w:numFmt w:val="bullet"/>
+      <w:lvlText w:val=""/>
+      <w:lvlJc w:val="left"/>
+      <w:pPr>
+        <w:tabs>
+          <w:tab w:val="num" w:pos="2880"/>
+        </w:tabs>
+        <w:ind w:left="2880" w:hanging="360"/>
+      </w:pPr>
+      <w:rPr>
+        <w:rFonts w:ascii="Wingdings" w:hAnsi="Wingdings" w:hint="default"/>
+        <w:sz w:val="20"/>
+      </w:rPr>
+    </w:lvl>
+    <w:lvl w:ilvl="4" w:tentative="1">
+      <w:start w:val="1"/>
+      <w:numFmt w:val="bullet"/>
+      <w:lvlText w:val=""/>
+      <w:lvlJc w:val="left"/>
+      <w:pPr>
+        <w:tabs>
+          <w:tab w:val="num" w:pos="3600"/>
+        </w:tabs>
+        <w:ind w:left="3600" w:hanging="360"/>
+      </w:pPr>
+      <w:rPr>
+        <w:rFonts w:ascii="Wingdings" w:hAnsi="Wingdings" w:hint="default"/>
+        <w:sz w:val="20"/>
+      </w:rPr>
+    </w:lvl>
+    <w:lvl w:ilvl="5" w:tentative="1">
+      <w:start w:val="1"/>
+      <w:numFmt w:val="bullet"/>
+      <w:lvlText w:val=""/>
+      <w:lvlJc w:val="left"/>
+      <w:pPr>
+        <w:tabs>
+          <w:tab w:val="num" w:pos="4320"/>
+        </w:tabs>
+        <w:ind w:left="4320" w:hanging="360"/>
+      </w:pPr>
+      <w:rPr>
+        <w:rFonts w:ascii="Wingdings" w:hAnsi="Wingdings" w:hint="default"/>
+        <w:sz w:val="20"/>
+      </w:rPr>
+    </w:lvl>
+    <w:lvl w:ilvl="6" w:tentative="1">
+      <w:start w:val="1"/>
+      <w:numFmt w:val="bullet"/>
+      <w:lvlText w:val=""/>
+      <w:lvlJc w:val="left"/>
+      <w:pPr>
+        <w:tabs>
+          <w:tab w:val="num" w:pos="5040"/>
+        </w:tabs>
+        <w:ind w:left="5040" w:hanging="360"/>
+      </w:pPr>
+      <w:rPr>
+        <w:rFonts w:ascii="Wingdings" w:hAnsi="Wingdings" w:hint="default"/>
+        <w:sz w:val="20"/>
+      </w:rPr>
+    </w:lvl>
+    <w:lvl w:ilvl="7" w:tentative="1">
+      <w:start w:val="1"/>
+      <w:numFmt w:val="bullet"/>
+      <w:lvlText w:val=""/>
+      <w:lvlJc w:val="left"/>
+      <w:pPr>
+        <w:tabs>
+          <w:tab w:val="num" w:pos="5760"/>
+        </w:tabs>
+        <w:ind w:left="5760" w:hanging="360"/>
+      </w:pPr>
+      <w:rPr>
+        <w:rFonts w:ascii="Wingdings" w:hAnsi="Wingdings" w:hint="default"/>
+        <w:sz w:val="20"/>
+      </w:rPr>
+    </w:lvl>
+    <w:lvl w:ilvl="8" w:tentative="1">
+      <w:start w:val="1"/>
+      <w:numFmt w:val="bullet"/>
+      <w:lvlText w:val=""/>
+      <w:lvlJc w:val="left"/>
+      <w:pPr>
+        <w:tabs>
+          <w:tab w:val="num" w:pos="6480"/>
+        </w:tabs>
+        <w:ind w:left="6480" w:hanging="360"/>
+      </w:pPr>
+      <w:rPr>
+        <w:rFonts w:ascii="Wingdings" w:hAnsi="Wingdings" w:hint="default"/>
+        <w:sz w:val="20"/>
+      </w:rPr>
+    </w:lvl>
+  </w:abstractNum>
+  <w:abstractNum w:abstractNumId="34" w15:restartNumberingAfterBreak="0">
     <w:nsid w:val="2E4D738C"/>
     <w:multiLevelType w:val="multilevel"/>
     <w:tmpl w:val="1540BBA2"/>
@@ -9378,7 +10453,7 @@
       </w:rPr>
     </w:lvl>
   </w:abstractNum>
-  <w:abstractNum w:abstractNumId="32" w15:restartNumberingAfterBreak="0">
+  <w:abstractNum w:abstractNumId="35" w15:restartNumberingAfterBreak="0">
     <w:nsid w:val="2F0041C7"/>
     <w:multiLevelType w:val="multilevel"/>
     <w:tmpl w:val="656414FE"/>
@@ -9527,7 +10602,7 @@
       </w:rPr>
     </w:lvl>
   </w:abstractNum>
-  <w:abstractNum w:abstractNumId="33" w15:restartNumberingAfterBreak="0">
+  <w:abstractNum w:abstractNumId="36" w15:restartNumberingAfterBreak="0">
     <w:nsid w:val="304F01FA"/>
     <w:multiLevelType w:val="multilevel"/>
     <w:tmpl w:val="151C4EC6"/>
@@ -9676,7 +10751,7 @@
       </w:rPr>
     </w:lvl>
   </w:abstractNum>
-  <w:abstractNum w:abstractNumId="34" w15:restartNumberingAfterBreak="0">
+  <w:abstractNum w:abstractNumId="37" w15:restartNumberingAfterBreak="0">
     <w:nsid w:val="30BD025D"/>
     <w:multiLevelType w:val="hybridMultilevel"/>
     <w:tmpl w:val="04381C82"/>
@@ -9765,7 +10840,7 @@
       </w:pPr>
     </w:lvl>
   </w:abstractNum>
-  <w:abstractNum w:abstractNumId="35" w15:restartNumberingAfterBreak="0">
+  <w:abstractNum w:abstractNumId="38" w15:restartNumberingAfterBreak="0">
     <w:nsid w:val="327C0BA6"/>
     <w:multiLevelType w:val="hybridMultilevel"/>
     <w:tmpl w:val="2A9047EE"/>
@@ -9878,7 +10953,7 @@
       </w:rPr>
     </w:lvl>
   </w:abstractNum>
-  <w:abstractNum w:abstractNumId="36" w15:restartNumberingAfterBreak="0">
+  <w:abstractNum w:abstractNumId="39" w15:restartNumberingAfterBreak="0">
     <w:nsid w:val="338D63E8"/>
     <w:multiLevelType w:val="hybridMultilevel"/>
     <w:tmpl w:val="28D0FB50"/>
@@ -9991,7 +11066,7 @@
       </w:rPr>
     </w:lvl>
   </w:abstractNum>
-  <w:abstractNum w:abstractNumId="37" w15:restartNumberingAfterBreak="0">
+  <w:abstractNum w:abstractNumId="40" w15:restartNumberingAfterBreak="0">
     <w:nsid w:val="35413E58"/>
     <w:multiLevelType w:val="hybridMultilevel"/>
     <w:tmpl w:val="03C64164"/>
@@ -10104,7 +11179,7 @@
       </w:rPr>
     </w:lvl>
   </w:abstractNum>
-  <w:abstractNum w:abstractNumId="38" w15:restartNumberingAfterBreak="0">
+  <w:abstractNum w:abstractNumId="41" w15:restartNumberingAfterBreak="0">
     <w:nsid w:val="35C86AF0"/>
     <w:multiLevelType w:val="multilevel"/>
     <w:tmpl w:val="8202FCD6"/>
@@ -10253,7 +11328,7 @@
       </w:rPr>
     </w:lvl>
   </w:abstractNum>
-  <w:abstractNum w:abstractNumId="39" w15:restartNumberingAfterBreak="0">
+  <w:abstractNum w:abstractNumId="42" w15:restartNumberingAfterBreak="0">
     <w:nsid w:val="3623194A"/>
     <w:multiLevelType w:val="multilevel"/>
     <w:tmpl w:val="63F4E6F0"/>
@@ -10402,7 +11477,7 @@
       </w:rPr>
     </w:lvl>
   </w:abstractNum>
-  <w:abstractNum w:abstractNumId="40" w15:restartNumberingAfterBreak="0">
+  <w:abstractNum w:abstractNumId="43" w15:restartNumberingAfterBreak="0">
     <w:nsid w:val="37B424C3"/>
     <w:multiLevelType w:val="hybridMultilevel"/>
     <w:tmpl w:val="18F030D4"/>
@@ -10515,7 +11590,7 @@
       </w:rPr>
     </w:lvl>
   </w:abstractNum>
-  <w:abstractNum w:abstractNumId="41" w15:restartNumberingAfterBreak="0">
+  <w:abstractNum w:abstractNumId="44" w15:restartNumberingAfterBreak="0">
     <w:nsid w:val="3BC10D30"/>
     <w:multiLevelType w:val="multilevel"/>
     <w:tmpl w:val="502AD78C"/>
@@ -10664,7 +11739,7 @@
       </w:rPr>
     </w:lvl>
   </w:abstractNum>
-  <w:abstractNum w:abstractNumId="42" w15:restartNumberingAfterBreak="0">
+  <w:abstractNum w:abstractNumId="45" w15:restartNumberingAfterBreak="0">
     <w:nsid w:val="3CBF280A"/>
     <w:multiLevelType w:val="multilevel"/>
     <w:tmpl w:val="A13E4362"/>
@@ -10813,7 +11888,7 @@
       </w:rPr>
     </w:lvl>
   </w:abstractNum>
-  <w:abstractNum w:abstractNumId="43" w15:restartNumberingAfterBreak="0">
+  <w:abstractNum w:abstractNumId="46" w15:restartNumberingAfterBreak="0">
     <w:nsid w:val="452F60FB"/>
     <w:multiLevelType w:val="hybridMultilevel"/>
     <w:tmpl w:val="892A990A"/>
@@ -10926,7 +12001,7 @@
       </w:rPr>
     </w:lvl>
   </w:abstractNum>
-  <w:abstractNum w:abstractNumId="44" w15:restartNumberingAfterBreak="0">
+  <w:abstractNum w:abstractNumId="47" w15:restartNumberingAfterBreak="0">
     <w:nsid w:val="47BF2170"/>
     <w:multiLevelType w:val="multilevel"/>
     <w:tmpl w:val="D9681266"/>
@@ -11075,7 +12150,7 @@
       </w:rPr>
     </w:lvl>
   </w:abstractNum>
-  <w:abstractNum w:abstractNumId="45" w15:restartNumberingAfterBreak="0">
+  <w:abstractNum w:abstractNumId="48" w15:restartNumberingAfterBreak="0">
     <w:nsid w:val="47E5592F"/>
     <w:multiLevelType w:val="hybridMultilevel"/>
     <w:tmpl w:val="719AB9FA"/>
@@ -11188,7 +12263,7 @@
       </w:rPr>
     </w:lvl>
   </w:abstractNum>
-  <w:abstractNum w:abstractNumId="46" w15:restartNumberingAfterBreak="0">
+  <w:abstractNum w:abstractNumId="49" w15:restartNumberingAfterBreak="0">
     <w:nsid w:val="48C041A9"/>
     <w:multiLevelType w:val="multilevel"/>
     <w:tmpl w:val="59A694BC"/>
@@ -11337,7 +12412,7 @@
       </w:rPr>
     </w:lvl>
   </w:abstractNum>
-  <w:abstractNum w:abstractNumId="47" w15:restartNumberingAfterBreak="0">
+  <w:abstractNum w:abstractNumId="50" w15:restartNumberingAfterBreak="0">
     <w:nsid w:val="4AF73293"/>
     <w:multiLevelType w:val="hybridMultilevel"/>
     <w:tmpl w:val="F2962738"/>
@@ -11450,7 +12525,7 @@
       </w:rPr>
     </w:lvl>
   </w:abstractNum>
-  <w:abstractNum w:abstractNumId="48" w15:restartNumberingAfterBreak="0">
+  <w:abstractNum w:abstractNumId="51" w15:restartNumberingAfterBreak="0">
     <w:nsid w:val="4B375248"/>
     <w:multiLevelType w:val="multilevel"/>
     <w:tmpl w:val="B574C1C6"/>
@@ -11599,7 +12674,7 @@
       </w:rPr>
     </w:lvl>
   </w:abstractNum>
-  <w:abstractNum w:abstractNumId="49" w15:restartNumberingAfterBreak="0">
+  <w:abstractNum w:abstractNumId="52" w15:restartNumberingAfterBreak="0">
     <w:nsid w:val="4BA13766"/>
     <w:multiLevelType w:val="multilevel"/>
     <w:tmpl w:val="63F4E6F0"/>
@@ -11748,7 +12823,7 @@
       </w:rPr>
     </w:lvl>
   </w:abstractNum>
-  <w:abstractNum w:abstractNumId="50" w15:restartNumberingAfterBreak="0">
+  <w:abstractNum w:abstractNumId="53" w15:restartNumberingAfterBreak="0">
     <w:nsid w:val="4BA25441"/>
     <w:multiLevelType w:val="hybridMultilevel"/>
     <w:tmpl w:val="217E2E96"/>
@@ -11861,7 +12936,7 @@
       </w:rPr>
     </w:lvl>
   </w:abstractNum>
-  <w:abstractNum w:abstractNumId="51" w15:restartNumberingAfterBreak="0">
+  <w:abstractNum w:abstractNumId="54" w15:restartNumberingAfterBreak="0">
     <w:nsid w:val="4E276DCB"/>
     <w:multiLevelType w:val="hybridMultilevel"/>
     <w:tmpl w:val="B7C469B4"/>
@@ -11974,7 +13049,7 @@
       </w:rPr>
     </w:lvl>
   </w:abstractNum>
-  <w:abstractNum w:abstractNumId="52" w15:restartNumberingAfterBreak="0">
+  <w:abstractNum w:abstractNumId="55" w15:restartNumberingAfterBreak="0">
     <w:nsid w:val="4F053929"/>
     <w:multiLevelType w:val="hybridMultilevel"/>
     <w:tmpl w:val="2A78C678"/>
@@ -12087,7 +13162,156 @@
       </w:rPr>
     </w:lvl>
   </w:abstractNum>
-  <w:abstractNum w:abstractNumId="53" w15:restartNumberingAfterBreak="0">
+  <w:abstractNum w:abstractNumId="56" w15:restartNumberingAfterBreak="0">
+    <w:nsid w:val="4FFB237E"/>
+    <w:multiLevelType w:val="multilevel"/>
+    <w:tmpl w:val="2AA67CDA"/>
+    <w:lvl w:ilvl="0">
+      <w:start w:val="1"/>
+      <w:numFmt w:val="bullet"/>
+      <w:lvlText w:val=""/>
+      <w:lvlJc w:val="left"/>
+      <w:pPr>
+        <w:tabs>
+          <w:tab w:val="num" w:pos="720"/>
+        </w:tabs>
+        <w:ind w:left="720" w:hanging="360"/>
+      </w:pPr>
+      <w:rPr>
+        <w:rFonts w:ascii="Wingdings" w:hAnsi="Wingdings" w:hint="default"/>
+        <w:sz w:val="20"/>
+      </w:rPr>
+    </w:lvl>
+    <w:lvl w:ilvl="1" w:tentative="1">
+      <w:start w:val="1"/>
+      <w:numFmt w:val="bullet"/>
+      <w:lvlText w:val="o"/>
+      <w:lvlJc w:val="left"/>
+      <w:pPr>
+        <w:tabs>
+          <w:tab w:val="num" w:pos="1440"/>
+        </w:tabs>
+        <w:ind w:left="1440" w:hanging="360"/>
+      </w:pPr>
+      <w:rPr>
+        <w:rFonts w:ascii="Courier New" w:hAnsi="Courier New" w:hint="default"/>
+        <w:sz w:val="20"/>
+      </w:rPr>
+    </w:lvl>
+    <w:lvl w:ilvl="2" w:tentative="1">
+      <w:start w:val="1"/>
+      <w:numFmt w:val="bullet"/>
+      <w:lvlText w:val=""/>
+      <w:lvlJc w:val="left"/>
+      <w:pPr>
+        <w:tabs>
+          <w:tab w:val="num" w:pos="2160"/>
+        </w:tabs>
+        <w:ind w:left="2160" w:hanging="360"/>
+      </w:pPr>
+      <w:rPr>
+        <w:rFonts w:ascii="Wingdings" w:hAnsi="Wingdings" w:hint="default"/>
+        <w:sz w:val="20"/>
+      </w:rPr>
+    </w:lvl>
+    <w:lvl w:ilvl="3" w:tentative="1">
+      <w:start w:val="1"/>
+      <w:numFmt w:val="bullet"/>
+      <w:lvlText w:val=""/>
+      <w:lvlJc w:val="left"/>
+      <w:pPr>
+        <w:tabs>
+          <w:tab w:val="num" w:pos="2880"/>
+        </w:tabs>
+        <w:ind w:left="2880" w:hanging="360"/>
+      </w:pPr>
+      <w:rPr>
+        <w:rFonts w:ascii="Wingdings" w:hAnsi="Wingdings" w:hint="default"/>
+        <w:sz w:val="20"/>
+      </w:rPr>
+    </w:lvl>
+    <w:lvl w:ilvl="4" w:tentative="1">
+      <w:start w:val="1"/>
+      <w:numFmt w:val="bullet"/>
+      <w:lvlText w:val=""/>
+      <w:lvlJc w:val="left"/>
+      <w:pPr>
+        <w:tabs>
+          <w:tab w:val="num" w:pos="3600"/>
+        </w:tabs>
+        <w:ind w:left="3600" w:hanging="360"/>
+      </w:pPr>
+      <w:rPr>
+        <w:rFonts w:ascii="Wingdings" w:hAnsi="Wingdings" w:hint="default"/>
+        <w:sz w:val="20"/>
+      </w:rPr>
+    </w:lvl>
+    <w:lvl w:ilvl="5" w:tentative="1">
+      <w:start w:val="1"/>
+      <w:numFmt w:val="bullet"/>
+      <w:lvlText w:val=""/>
+      <w:lvlJc w:val="left"/>
+      <w:pPr>
+        <w:tabs>
+          <w:tab w:val="num" w:pos="4320"/>
+        </w:tabs>
+        <w:ind w:left="4320" w:hanging="360"/>
+      </w:pPr>
+      <w:rPr>
+        <w:rFonts w:ascii="Wingdings" w:hAnsi="Wingdings" w:hint="default"/>
+        <w:sz w:val="20"/>
+      </w:rPr>
+    </w:lvl>
+    <w:lvl w:ilvl="6" w:tentative="1">
+      <w:start w:val="1"/>
+      <w:numFmt w:val="bullet"/>
+      <w:lvlText w:val=""/>
+      <w:lvlJc w:val="left"/>
+      <w:pPr>
+        <w:tabs>
+          <w:tab w:val="num" w:pos="5040"/>
+        </w:tabs>
+        <w:ind w:left="5040" w:hanging="360"/>
+      </w:pPr>
+      <w:rPr>
+        <w:rFonts w:ascii="Wingdings" w:hAnsi="Wingdings" w:hint="default"/>
+        <w:sz w:val="20"/>
+      </w:rPr>
+    </w:lvl>
+    <w:lvl w:ilvl="7" w:tentative="1">
+      <w:start w:val="1"/>
+      <w:numFmt w:val="bullet"/>
+      <w:lvlText w:val=""/>
+      <w:lvlJc w:val="left"/>
+      <w:pPr>
+        <w:tabs>
+          <w:tab w:val="num" w:pos="5760"/>
+        </w:tabs>
+        <w:ind w:left="5760" w:hanging="360"/>
+      </w:pPr>
+      <w:rPr>
+        <w:rFonts w:ascii="Wingdings" w:hAnsi="Wingdings" w:hint="default"/>
+        <w:sz w:val="20"/>
+      </w:rPr>
+    </w:lvl>
+    <w:lvl w:ilvl="8" w:tentative="1">
+      <w:start w:val="1"/>
+      <w:numFmt w:val="bullet"/>
+      <w:lvlText w:val=""/>
+      <w:lvlJc w:val="left"/>
+      <w:pPr>
+        <w:tabs>
+          <w:tab w:val="num" w:pos="6480"/>
+        </w:tabs>
+        <w:ind w:left="6480" w:hanging="360"/>
+      </w:pPr>
+      <w:rPr>
+        <w:rFonts w:ascii="Wingdings" w:hAnsi="Wingdings" w:hint="default"/>
+        <w:sz w:val="20"/>
+      </w:rPr>
+    </w:lvl>
+  </w:abstractNum>
+  <w:abstractNum w:abstractNumId="57" w15:restartNumberingAfterBreak="0">
     <w:nsid w:val="51737FE0"/>
     <w:multiLevelType w:val="hybridMultilevel"/>
     <w:tmpl w:val="2B0604E6"/>
@@ -12200,7 +13424,7 @@
       </w:rPr>
     </w:lvl>
   </w:abstractNum>
-  <w:abstractNum w:abstractNumId="54" w15:restartNumberingAfterBreak="0">
+  <w:abstractNum w:abstractNumId="58" w15:restartNumberingAfterBreak="0">
     <w:nsid w:val="51A86EF8"/>
     <w:multiLevelType w:val="multilevel"/>
     <w:tmpl w:val="FF2841D4"/>
@@ -12349,7 +13573,7 @@
       </w:rPr>
     </w:lvl>
   </w:abstractNum>
-  <w:abstractNum w:abstractNumId="55" w15:restartNumberingAfterBreak="0">
+  <w:abstractNum w:abstractNumId="59" w15:restartNumberingAfterBreak="0">
     <w:nsid w:val="521378FF"/>
     <w:multiLevelType w:val="multilevel"/>
     <w:tmpl w:val="7B002268"/>
@@ -12498,7 +13722,7 @@
       </w:rPr>
     </w:lvl>
   </w:abstractNum>
-  <w:abstractNum w:abstractNumId="56" w15:restartNumberingAfterBreak="0">
+  <w:abstractNum w:abstractNumId="60" w15:restartNumberingAfterBreak="0">
     <w:nsid w:val="521F2792"/>
     <w:multiLevelType w:val="multilevel"/>
     <w:tmpl w:val="9FB45386"/>
@@ -12647,7 +13871,7 @@
       </w:rPr>
     </w:lvl>
   </w:abstractNum>
-  <w:abstractNum w:abstractNumId="57" w15:restartNumberingAfterBreak="0">
+  <w:abstractNum w:abstractNumId="61" w15:restartNumberingAfterBreak="0">
     <w:nsid w:val="53390911"/>
     <w:multiLevelType w:val="multilevel"/>
     <w:tmpl w:val="1C380F12"/>
@@ -12796,7 +14020,7 @@
       </w:rPr>
     </w:lvl>
   </w:abstractNum>
-  <w:abstractNum w:abstractNumId="58" w15:restartNumberingAfterBreak="0">
+  <w:abstractNum w:abstractNumId="62" w15:restartNumberingAfterBreak="0">
     <w:nsid w:val="53CD23AC"/>
     <w:multiLevelType w:val="multilevel"/>
     <w:tmpl w:val="57BAE8F0"/>
@@ -12945,7 +14169,7 @@
       </w:rPr>
     </w:lvl>
   </w:abstractNum>
-  <w:abstractNum w:abstractNumId="59" w15:restartNumberingAfterBreak="0">
+  <w:abstractNum w:abstractNumId="63" w15:restartNumberingAfterBreak="0">
     <w:nsid w:val="5462791F"/>
     <w:multiLevelType w:val="hybridMultilevel"/>
     <w:tmpl w:val="FDE24C26"/>
@@ -13058,7 +14282,7 @@
       </w:rPr>
     </w:lvl>
   </w:abstractNum>
-  <w:abstractNum w:abstractNumId="60" w15:restartNumberingAfterBreak="0">
+  <w:abstractNum w:abstractNumId="64" w15:restartNumberingAfterBreak="0">
     <w:nsid w:val="547005EB"/>
     <w:multiLevelType w:val="multilevel"/>
     <w:tmpl w:val="F260CC5C"/>
@@ -13207,7 +14431,7 @@
       </w:rPr>
     </w:lvl>
   </w:abstractNum>
-  <w:abstractNum w:abstractNumId="61" w15:restartNumberingAfterBreak="0">
+  <w:abstractNum w:abstractNumId="65" w15:restartNumberingAfterBreak="0">
     <w:nsid w:val="58034221"/>
     <w:multiLevelType w:val="hybridMultilevel"/>
     <w:tmpl w:val="65D0619C"/>
@@ -13320,7 +14544,7 @@
       </w:rPr>
     </w:lvl>
   </w:abstractNum>
-  <w:abstractNum w:abstractNumId="62" w15:restartNumberingAfterBreak="0">
+  <w:abstractNum w:abstractNumId="66" w15:restartNumberingAfterBreak="0">
     <w:nsid w:val="5A460390"/>
     <w:multiLevelType w:val="hybridMultilevel"/>
     <w:tmpl w:val="BD8E939C"/>
@@ -13433,7 +14657,7 @@
       </w:rPr>
     </w:lvl>
   </w:abstractNum>
-  <w:abstractNum w:abstractNumId="63" w15:restartNumberingAfterBreak="0">
+  <w:abstractNum w:abstractNumId="67" w15:restartNumberingAfterBreak="0">
     <w:nsid w:val="5CEE630B"/>
     <w:multiLevelType w:val="hybridMultilevel"/>
     <w:tmpl w:val="DE8E8DBA"/>
@@ -13546,7 +14770,7 @@
       </w:rPr>
     </w:lvl>
   </w:abstractNum>
-  <w:abstractNum w:abstractNumId="64" w15:restartNumberingAfterBreak="0">
+  <w:abstractNum w:abstractNumId="68" w15:restartNumberingAfterBreak="0">
     <w:nsid w:val="5D5A183C"/>
     <w:multiLevelType w:val="multilevel"/>
     <w:tmpl w:val="C804C34A"/>
@@ -13695,7 +14919,156 @@
       </w:rPr>
     </w:lvl>
   </w:abstractNum>
-  <w:abstractNum w:abstractNumId="65" w15:restartNumberingAfterBreak="0">
+  <w:abstractNum w:abstractNumId="69" w15:restartNumberingAfterBreak="0">
+    <w:nsid w:val="5E9C452C"/>
+    <w:multiLevelType w:val="multilevel"/>
+    <w:tmpl w:val="B8727936"/>
+    <w:lvl w:ilvl="0">
+      <w:start w:val="1"/>
+      <w:numFmt w:val="bullet"/>
+      <w:lvlText w:val=""/>
+      <w:lvlJc w:val="left"/>
+      <w:pPr>
+        <w:tabs>
+          <w:tab w:val="num" w:pos="720"/>
+        </w:tabs>
+        <w:ind w:left="720" w:hanging="360"/>
+      </w:pPr>
+      <w:rPr>
+        <w:rFonts w:ascii="Symbol" w:hAnsi="Symbol" w:hint="default"/>
+        <w:sz w:val="20"/>
+      </w:rPr>
+    </w:lvl>
+    <w:lvl w:ilvl="1" w:tentative="1">
+      <w:start w:val="1"/>
+      <w:numFmt w:val="bullet"/>
+      <w:lvlText w:val="o"/>
+      <w:lvlJc w:val="left"/>
+      <w:pPr>
+        <w:tabs>
+          <w:tab w:val="num" w:pos="1440"/>
+        </w:tabs>
+        <w:ind w:left="1440" w:hanging="360"/>
+      </w:pPr>
+      <w:rPr>
+        <w:rFonts w:ascii="Courier New" w:hAnsi="Courier New" w:hint="default"/>
+        <w:sz w:val="20"/>
+      </w:rPr>
+    </w:lvl>
+    <w:lvl w:ilvl="2" w:tentative="1">
+      <w:start w:val="1"/>
+      <w:numFmt w:val="bullet"/>
+      <w:lvlText w:val=""/>
+      <w:lvlJc w:val="left"/>
+      <w:pPr>
+        <w:tabs>
+          <w:tab w:val="num" w:pos="2160"/>
+        </w:tabs>
+        <w:ind w:left="2160" w:hanging="360"/>
+      </w:pPr>
+      <w:rPr>
+        <w:rFonts w:ascii="Wingdings" w:hAnsi="Wingdings" w:hint="default"/>
+        <w:sz w:val="20"/>
+      </w:rPr>
+    </w:lvl>
+    <w:lvl w:ilvl="3" w:tentative="1">
+      <w:start w:val="1"/>
+      <w:numFmt w:val="bullet"/>
+      <w:lvlText w:val=""/>
+      <w:lvlJc w:val="left"/>
+      <w:pPr>
+        <w:tabs>
+          <w:tab w:val="num" w:pos="2880"/>
+        </w:tabs>
+        <w:ind w:left="2880" w:hanging="360"/>
+      </w:pPr>
+      <w:rPr>
+        <w:rFonts w:ascii="Wingdings" w:hAnsi="Wingdings" w:hint="default"/>
+        <w:sz w:val="20"/>
+      </w:rPr>
+    </w:lvl>
+    <w:lvl w:ilvl="4" w:tentative="1">
+      <w:start w:val="1"/>
+      <w:numFmt w:val="bullet"/>
+      <w:lvlText w:val=""/>
+      <w:lvlJc w:val="left"/>
+      <w:pPr>
+        <w:tabs>
+          <w:tab w:val="num" w:pos="3600"/>
+        </w:tabs>
+        <w:ind w:left="3600" w:hanging="360"/>
+      </w:pPr>
+      <w:rPr>
+        <w:rFonts w:ascii="Wingdings" w:hAnsi="Wingdings" w:hint="default"/>
+        <w:sz w:val="20"/>
+      </w:rPr>
+    </w:lvl>
+    <w:lvl w:ilvl="5" w:tentative="1">
+      <w:start w:val="1"/>
+      <w:numFmt w:val="bullet"/>
+      <w:lvlText w:val=""/>
+      <w:lvlJc w:val="left"/>
+      <w:pPr>
+        <w:tabs>
+          <w:tab w:val="num" w:pos="4320"/>
+        </w:tabs>
+        <w:ind w:left="4320" w:hanging="360"/>
+      </w:pPr>
+      <w:rPr>
+        <w:rFonts w:ascii="Wingdings" w:hAnsi="Wingdings" w:hint="default"/>
+        <w:sz w:val="20"/>
+      </w:rPr>
+    </w:lvl>
+    <w:lvl w:ilvl="6" w:tentative="1">
+      <w:start w:val="1"/>
+      <w:numFmt w:val="bullet"/>
+      <w:lvlText w:val=""/>
+      <w:lvlJc w:val="left"/>
+      <w:pPr>
+        <w:tabs>
+          <w:tab w:val="num" w:pos="5040"/>
+        </w:tabs>
+        <w:ind w:left="5040" w:hanging="360"/>
+      </w:pPr>
+      <w:rPr>
+        <w:rFonts w:ascii="Wingdings" w:hAnsi="Wingdings" w:hint="default"/>
+        <w:sz w:val="20"/>
+      </w:rPr>
+    </w:lvl>
+    <w:lvl w:ilvl="7" w:tentative="1">
+      <w:start w:val="1"/>
+      <w:numFmt w:val="bullet"/>
+      <w:lvlText w:val=""/>
+      <w:lvlJc w:val="left"/>
+      <w:pPr>
+        <w:tabs>
+          <w:tab w:val="num" w:pos="5760"/>
+        </w:tabs>
+        <w:ind w:left="5760" w:hanging="360"/>
+      </w:pPr>
+      <w:rPr>
+        <w:rFonts w:ascii="Wingdings" w:hAnsi="Wingdings" w:hint="default"/>
+        <w:sz w:val="20"/>
+      </w:rPr>
+    </w:lvl>
+    <w:lvl w:ilvl="8" w:tentative="1">
+      <w:start w:val="1"/>
+      <w:numFmt w:val="bullet"/>
+      <w:lvlText w:val=""/>
+      <w:lvlJc w:val="left"/>
+      <w:pPr>
+        <w:tabs>
+          <w:tab w:val="num" w:pos="6480"/>
+        </w:tabs>
+        <w:ind w:left="6480" w:hanging="360"/>
+      </w:pPr>
+      <w:rPr>
+        <w:rFonts w:ascii="Wingdings" w:hAnsi="Wingdings" w:hint="default"/>
+        <w:sz w:val="20"/>
+      </w:rPr>
+    </w:lvl>
+  </w:abstractNum>
+  <w:abstractNum w:abstractNumId="70" w15:restartNumberingAfterBreak="0">
     <w:nsid w:val="62385AA6"/>
     <w:multiLevelType w:val="multilevel"/>
     <w:tmpl w:val="B9EAECD4"/>
@@ -13844,7 +15217,7 @@
       </w:rPr>
     </w:lvl>
   </w:abstractNum>
-  <w:abstractNum w:abstractNumId="66" w15:restartNumberingAfterBreak="0">
+  <w:abstractNum w:abstractNumId="71" w15:restartNumberingAfterBreak="0">
     <w:nsid w:val="625D686D"/>
     <w:multiLevelType w:val="multilevel"/>
     <w:tmpl w:val="BC1C2048"/>
@@ -13993,7 +15366,7 @@
       </w:rPr>
     </w:lvl>
   </w:abstractNum>
-  <w:abstractNum w:abstractNumId="67" w15:restartNumberingAfterBreak="0">
+  <w:abstractNum w:abstractNumId="72" w15:restartNumberingAfterBreak="0">
     <w:nsid w:val="62B46951"/>
     <w:multiLevelType w:val="hybridMultilevel"/>
     <w:tmpl w:val="0FEAFEC6"/>
@@ -14106,7 +15479,7 @@
       </w:rPr>
     </w:lvl>
   </w:abstractNum>
-  <w:abstractNum w:abstractNumId="68" w15:restartNumberingAfterBreak="0">
+  <w:abstractNum w:abstractNumId="73" w15:restartNumberingAfterBreak="0">
     <w:nsid w:val="647819E3"/>
     <w:multiLevelType w:val="multilevel"/>
     <w:tmpl w:val="ABB278BC"/>
@@ -14255,7 +15628,7 @@
       </w:rPr>
     </w:lvl>
   </w:abstractNum>
-  <w:abstractNum w:abstractNumId="69" w15:restartNumberingAfterBreak="0">
+  <w:abstractNum w:abstractNumId="74" w15:restartNumberingAfterBreak="0">
     <w:nsid w:val="64F30198"/>
     <w:multiLevelType w:val="multilevel"/>
     <w:tmpl w:val="63F4E6F0"/>
@@ -14404,7 +15777,7 @@
       </w:rPr>
     </w:lvl>
   </w:abstractNum>
-  <w:abstractNum w:abstractNumId="70" w15:restartNumberingAfterBreak="0">
+  <w:abstractNum w:abstractNumId="75" w15:restartNumberingAfterBreak="0">
     <w:nsid w:val="65314293"/>
     <w:multiLevelType w:val="hybridMultilevel"/>
     <w:tmpl w:val="6688DFAC"/>
@@ -14517,7 +15890,7 @@
       </w:rPr>
     </w:lvl>
   </w:abstractNum>
-  <w:abstractNum w:abstractNumId="71" w15:restartNumberingAfterBreak="0">
+  <w:abstractNum w:abstractNumId="76" w15:restartNumberingAfterBreak="0">
     <w:nsid w:val="65CE4D0F"/>
     <w:multiLevelType w:val="hybridMultilevel"/>
     <w:tmpl w:val="DB668538"/>
@@ -14630,7 +16003,7 @@
       </w:rPr>
     </w:lvl>
   </w:abstractNum>
-  <w:abstractNum w:abstractNumId="72" w15:restartNumberingAfterBreak="0">
+  <w:abstractNum w:abstractNumId="77" w15:restartNumberingAfterBreak="0">
     <w:nsid w:val="661C7D73"/>
     <w:multiLevelType w:val="multilevel"/>
     <w:tmpl w:val="D9681266"/>
@@ -14779,7 +16152,7 @@
       </w:rPr>
     </w:lvl>
   </w:abstractNum>
-  <w:abstractNum w:abstractNumId="73" w15:restartNumberingAfterBreak="0">
+  <w:abstractNum w:abstractNumId="78" w15:restartNumberingAfterBreak="0">
     <w:nsid w:val="68B94344"/>
     <w:multiLevelType w:val="multilevel"/>
     <w:tmpl w:val="9BA812D8"/>
@@ -14928,7 +16301,7 @@
       </w:rPr>
     </w:lvl>
   </w:abstractNum>
-  <w:abstractNum w:abstractNumId="74" w15:restartNumberingAfterBreak="0">
+  <w:abstractNum w:abstractNumId="79" w15:restartNumberingAfterBreak="0">
     <w:nsid w:val="69DE2C87"/>
     <w:multiLevelType w:val="hybridMultilevel"/>
     <w:tmpl w:val="F530F20A"/>
@@ -15041,7 +16414,7 @@
       </w:rPr>
     </w:lvl>
   </w:abstractNum>
-  <w:abstractNum w:abstractNumId="75" w15:restartNumberingAfterBreak="0">
+  <w:abstractNum w:abstractNumId="80" w15:restartNumberingAfterBreak="0">
     <w:nsid w:val="69ED672D"/>
     <w:multiLevelType w:val="multilevel"/>
     <w:tmpl w:val="CC08E300"/>
@@ -15190,7 +16563,7 @@
       </w:rPr>
     </w:lvl>
   </w:abstractNum>
-  <w:abstractNum w:abstractNumId="76" w15:restartNumberingAfterBreak="0">
+  <w:abstractNum w:abstractNumId="81" w15:restartNumberingAfterBreak="0">
     <w:nsid w:val="6A063EFD"/>
     <w:multiLevelType w:val="hybridMultilevel"/>
     <w:tmpl w:val="48703FBA"/>
@@ -15303,7 +16676,7 @@
       </w:rPr>
     </w:lvl>
   </w:abstractNum>
-  <w:abstractNum w:abstractNumId="77" w15:restartNumberingAfterBreak="0">
+  <w:abstractNum w:abstractNumId="82" w15:restartNumberingAfterBreak="0">
     <w:nsid w:val="6A825ABE"/>
     <w:multiLevelType w:val="multilevel"/>
     <w:tmpl w:val="0CD6F30E"/>
@@ -15452,7 +16825,7 @@
       </w:rPr>
     </w:lvl>
   </w:abstractNum>
-  <w:abstractNum w:abstractNumId="78" w15:restartNumberingAfterBreak="0">
+  <w:abstractNum w:abstractNumId="83" w15:restartNumberingAfterBreak="0">
     <w:nsid w:val="6B1D7832"/>
     <w:multiLevelType w:val="multilevel"/>
     <w:tmpl w:val="DD4646B2"/>
@@ -15601,7 +16974,7 @@
       </w:rPr>
     </w:lvl>
   </w:abstractNum>
-  <w:abstractNum w:abstractNumId="79" w15:restartNumberingAfterBreak="0">
+  <w:abstractNum w:abstractNumId="84" w15:restartNumberingAfterBreak="0">
     <w:nsid w:val="6C6D6667"/>
     <w:multiLevelType w:val="hybridMultilevel"/>
     <w:tmpl w:val="A744709C"/>
@@ -15714,7 +17087,7 @@
       </w:rPr>
     </w:lvl>
   </w:abstractNum>
-  <w:abstractNum w:abstractNumId="80" w15:restartNumberingAfterBreak="0">
+  <w:abstractNum w:abstractNumId="85" w15:restartNumberingAfterBreak="0">
     <w:nsid w:val="6CAD7EA5"/>
     <w:multiLevelType w:val="multilevel"/>
     <w:tmpl w:val="C472C5B0"/>
@@ -15863,7 +17236,7 @@
       </w:rPr>
     </w:lvl>
   </w:abstractNum>
-  <w:abstractNum w:abstractNumId="81" w15:restartNumberingAfterBreak="0">
+  <w:abstractNum w:abstractNumId="86" w15:restartNumberingAfterBreak="0">
     <w:nsid w:val="6E43557B"/>
     <w:multiLevelType w:val="multilevel"/>
     <w:tmpl w:val="323C7112"/>
@@ -16012,7 +17385,7 @@
       </w:rPr>
     </w:lvl>
   </w:abstractNum>
-  <w:abstractNum w:abstractNumId="82" w15:restartNumberingAfterBreak="0">
+  <w:abstractNum w:abstractNumId="87" w15:restartNumberingAfterBreak="0">
     <w:nsid w:val="6EA27D0A"/>
     <w:multiLevelType w:val="multilevel"/>
     <w:tmpl w:val="7BF0256C"/>
@@ -16161,7 +17534,156 @@
       </w:rPr>
     </w:lvl>
   </w:abstractNum>
-  <w:abstractNum w:abstractNumId="83" w15:restartNumberingAfterBreak="0">
+  <w:abstractNum w:abstractNumId="88" w15:restartNumberingAfterBreak="0">
+    <w:nsid w:val="6EF86273"/>
+    <w:multiLevelType w:val="multilevel"/>
+    <w:tmpl w:val="2AA67CDA"/>
+    <w:lvl w:ilvl="0">
+      <w:start w:val="1"/>
+      <w:numFmt w:val="bullet"/>
+      <w:lvlText w:val=""/>
+      <w:lvlJc w:val="left"/>
+      <w:pPr>
+        <w:tabs>
+          <w:tab w:val="num" w:pos="720"/>
+        </w:tabs>
+        <w:ind w:left="720" w:hanging="360"/>
+      </w:pPr>
+      <w:rPr>
+        <w:rFonts w:ascii="Wingdings" w:hAnsi="Wingdings" w:hint="default"/>
+        <w:sz w:val="20"/>
+      </w:rPr>
+    </w:lvl>
+    <w:lvl w:ilvl="1" w:tentative="1">
+      <w:start w:val="1"/>
+      <w:numFmt w:val="bullet"/>
+      <w:lvlText w:val="o"/>
+      <w:lvlJc w:val="left"/>
+      <w:pPr>
+        <w:tabs>
+          <w:tab w:val="num" w:pos="1440"/>
+        </w:tabs>
+        <w:ind w:left="1440" w:hanging="360"/>
+      </w:pPr>
+      <w:rPr>
+        <w:rFonts w:ascii="Courier New" w:hAnsi="Courier New" w:hint="default"/>
+        <w:sz w:val="20"/>
+      </w:rPr>
+    </w:lvl>
+    <w:lvl w:ilvl="2" w:tentative="1">
+      <w:start w:val="1"/>
+      <w:numFmt w:val="bullet"/>
+      <w:lvlText w:val=""/>
+      <w:lvlJc w:val="left"/>
+      <w:pPr>
+        <w:tabs>
+          <w:tab w:val="num" w:pos="2160"/>
+        </w:tabs>
+        <w:ind w:left="2160" w:hanging="360"/>
+      </w:pPr>
+      <w:rPr>
+        <w:rFonts w:ascii="Wingdings" w:hAnsi="Wingdings" w:hint="default"/>
+        <w:sz w:val="20"/>
+      </w:rPr>
+    </w:lvl>
+    <w:lvl w:ilvl="3" w:tentative="1">
+      <w:start w:val="1"/>
+      <w:numFmt w:val="bullet"/>
+      <w:lvlText w:val=""/>
+      <w:lvlJc w:val="left"/>
+      <w:pPr>
+        <w:tabs>
+          <w:tab w:val="num" w:pos="2880"/>
+        </w:tabs>
+        <w:ind w:left="2880" w:hanging="360"/>
+      </w:pPr>
+      <w:rPr>
+        <w:rFonts w:ascii="Wingdings" w:hAnsi="Wingdings" w:hint="default"/>
+        <w:sz w:val="20"/>
+      </w:rPr>
+    </w:lvl>
+    <w:lvl w:ilvl="4" w:tentative="1">
+      <w:start w:val="1"/>
+      <w:numFmt w:val="bullet"/>
+      <w:lvlText w:val=""/>
+      <w:lvlJc w:val="left"/>
+      <w:pPr>
+        <w:tabs>
+          <w:tab w:val="num" w:pos="3600"/>
+        </w:tabs>
+        <w:ind w:left="3600" w:hanging="360"/>
+      </w:pPr>
+      <w:rPr>
+        <w:rFonts w:ascii="Wingdings" w:hAnsi="Wingdings" w:hint="default"/>
+        <w:sz w:val="20"/>
+      </w:rPr>
+    </w:lvl>
+    <w:lvl w:ilvl="5" w:tentative="1">
+      <w:start w:val="1"/>
+      <w:numFmt w:val="bullet"/>
+      <w:lvlText w:val=""/>
+      <w:lvlJc w:val="left"/>
+      <w:pPr>
+        <w:tabs>
+          <w:tab w:val="num" w:pos="4320"/>
+        </w:tabs>
+        <w:ind w:left="4320" w:hanging="360"/>
+      </w:pPr>
+      <w:rPr>
+        <w:rFonts w:ascii="Wingdings" w:hAnsi="Wingdings" w:hint="default"/>
+        <w:sz w:val="20"/>
+      </w:rPr>
+    </w:lvl>
+    <w:lvl w:ilvl="6" w:tentative="1">
+      <w:start w:val="1"/>
+      <w:numFmt w:val="bullet"/>
+      <w:lvlText w:val=""/>
+      <w:lvlJc w:val="left"/>
+      <w:pPr>
+        <w:tabs>
+          <w:tab w:val="num" w:pos="5040"/>
+        </w:tabs>
+        <w:ind w:left="5040" w:hanging="360"/>
+      </w:pPr>
+      <w:rPr>
+        <w:rFonts w:ascii="Wingdings" w:hAnsi="Wingdings" w:hint="default"/>
+        <w:sz w:val="20"/>
+      </w:rPr>
+    </w:lvl>
+    <w:lvl w:ilvl="7" w:tentative="1">
+      <w:start w:val="1"/>
+      <w:numFmt w:val="bullet"/>
+      <w:lvlText w:val=""/>
+      <w:lvlJc w:val="left"/>
+      <w:pPr>
+        <w:tabs>
+          <w:tab w:val="num" w:pos="5760"/>
+        </w:tabs>
+        <w:ind w:left="5760" w:hanging="360"/>
+      </w:pPr>
+      <w:rPr>
+        <w:rFonts w:ascii="Wingdings" w:hAnsi="Wingdings" w:hint="default"/>
+        <w:sz w:val="20"/>
+      </w:rPr>
+    </w:lvl>
+    <w:lvl w:ilvl="8" w:tentative="1">
+      <w:start w:val="1"/>
+      <w:numFmt w:val="bullet"/>
+      <w:lvlText w:val=""/>
+      <w:lvlJc w:val="left"/>
+      <w:pPr>
+        <w:tabs>
+          <w:tab w:val="num" w:pos="6480"/>
+        </w:tabs>
+        <w:ind w:left="6480" w:hanging="360"/>
+      </w:pPr>
+      <w:rPr>
+        <w:rFonts w:ascii="Wingdings" w:hAnsi="Wingdings" w:hint="default"/>
+        <w:sz w:val="20"/>
+      </w:rPr>
+    </w:lvl>
+  </w:abstractNum>
+  <w:abstractNum w:abstractNumId="89" w15:restartNumberingAfterBreak="0">
     <w:nsid w:val="70874300"/>
     <w:multiLevelType w:val="hybridMultilevel"/>
     <w:tmpl w:val="1B3A0518"/>
@@ -16274,7 +17796,7 @@
       </w:rPr>
     </w:lvl>
   </w:abstractNum>
-  <w:abstractNum w:abstractNumId="84" w15:restartNumberingAfterBreak="0">
+  <w:abstractNum w:abstractNumId="90" w15:restartNumberingAfterBreak="0">
     <w:nsid w:val="7090251B"/>
     <w:multiLevelType w:val="hybridMultilevel"/>
     <w:tmpl w:val="67687EFE"/>
@@ -16387,7 +17909,7 @@
       </w:rPr>
     </w:lvl>
   </w:abstractNum>
-  <w:abstractNum w:abstractNumId="85" w15:restartNumberingAfterBreak="0">
+  <w:abstractNum w:abstractNumId="91" w15:restartNumberingAfterBreak="0">
     <w:nsid w:val="75144C65"/>
     <w:multiLevelType w:val="hybridMultilevel"/>
     <w:tmpl w:val="12127FAA"/>
@@ -16500,7 +18022,7 @@
       </w:rPr>
     </w:lvl>
   </w:abstractNum>
-  <w:abstractNum w:abstractNumId="86" w15:restartNumberingAfterBreak="0">
+  <w:abstractNum w:abstractNumId="92" w15:restartNumberingAfterBreak="0">
     <w:nsid w:val="75237F84"/>
     <w:multiLevelType w:val="hybridMultilevel"/>
     <w:tmpl w:val="5F0A6EF2"/>
@@ -16613,7 +18135,7 @@
       </w:rPr>
     </w:lvl>
   </w:abstractNum>
-  <w:abstractNum w:abstractNumId="87" w15:restartNumberingAfterBreak="0">
+  <w:abstractNum w:abstractNumId="93" w15:restartNumberingAfterBreak="0">
     <w:nsid w:val="75FF09B0"/>
     <w:multiLevelType w:val="multilevel"/>
     <w:tmpl w:val="C34A7734"/>
@@ -16762,7 +18284,7 @@
       </w:rPr>
     </w:lvl>
   </w:abstractNum>
-  <w:abstractNum w:abstractNumId="88" w15:restartNumberingAfterBreak="0">
+  <w:abstractNum w:abstractNumId="94" w15:restartNumberingAfterBreak="0">
     <w:nsid w:val="77960362"/>
     <w:multiLevelType w:val="multilevel"/>
     <w:tmpl w:val="FEA0022E"/>
@@ -16911,7 +18433,7 @@
       </w:rPr>
     </w:lvl>
   </w:abstractNum>
-  <w:abstractNum w:abstractNumId="89" w15:restartNumberingAfterBreak="0">
+  <w:abstractNum w:abstractNumId="95" w15:restartNumberingAfterBreak="0">
     <w:nsid w:val="785A644F"/>
     <w:multiLevelType w:val="multilevel"/>
     <w:tmpl w:val="D1DC60FE"/>
@@ -17060,7 +18582,7 @@
       </w:rPr>
     </w:lvl>
   </w:abstractNum>
-  <w:abstractNum w:abstractNumId="90" w15:restartNumberingAfterBreak="0">
+  <w:abstractNum w:abstractNumId="96" w15:restartNumberingAfterBreak="0">
     <w:nsid w:val="7BFA03DF"/>
     <w:multiLevelType w:val="hybridMultilevel"/>
     <w:tmpl w:val="536A979E"/>
@@ -17173,7 +18695,7 @@
       </w:rPr>
     </w:lvl>
   </w:abstractNum>
-  <w:abstractNum w:abstractNumId="91" w15:restartNumberingAfterBreak="0">
+  <w:abstractNum w:abstractNumId="97" w15:restartNumberingAfterBreak="0">
     <w:nsid w:val="7CA524B4"/>
     <w:multiLevelType w:val="hybridMultilevel"/>
     <w:tmpl w:val="957C4F4A"/>
@@ -17286,7 +18808,7 @@
       </w:rPr>
     </w:lvl>
   </w:abstractNum>
-  <w:abstractNum w:abstractNumId="92" w15:restartNumberingAfterBreak="0">
+  <w:abstractNum w:abstractNumId="98" w15:restartNumberingAfterBreak="0">
     <w:nsid w:val="7EBD7710"/>
     <w:multiLevelType w:val="hybridMultilevel"/>
     <w:tmpl w:val="C8C6F7A0"/>
@@ -17400,106 +18922,106 @@
     </w:lvl>
   </w:abstractNum>
   <w:num w:numId="1" w16cid:durableId="425157302">
+    <w:abstractNumId w:val="42"/>
+  </w:num>
+  <w:num w:numId="2" w16cid:durableId="967664612">
+    <w:abstractNumId w:val="74"/>
+  </w:num>
+  <w:num w:numId="3" w16cid:durableId="361631616">
+    <w:abstractNumId w:val="52"/>
+  </w:num>
+  <w:num w:numId="4" w16cid:durableId="1409575397">
+    <w:abstractNumId w:val="63"/>
+  </w:num>
+  <w:num w:numId="5" w16cid:durableId="1647204897">
+    <w:abstractNumId w:val="97"/>
+  </w:num>
+  <w:num w:numId="6" w16cid:durableId="682589869">
+    <w:abstractNumId w:val="18"/>
+  </w:num>
+  <w:num w:numId="7" w16cid:durableId="679703478">
+    <w:abstractNumId w:val="79"/>
+  </w:num>
+  <w:num w:numId="8" w16cid:durableId="496455128">
+    <w:abstractNumId w:val="37"/>
+  </w:num>
+  <w:num w:numId="9" w16cid:durableId="1184633094">
+    <w:abstractNumId w:val="46"/>
+  </w:num>
+  <w:num w:numId="10" w16cid:durableId="71507387">
+    <w:abstractNumId w:val="50"/>
+  </w:num>
+  <w:num w:numId="11" w16cid:durableId="1412503779">
+    <w:abstractNumId w:val="81"/>
+  </w:num>
+  <w:num w:numId="12" w16cid:durableId="1107113995">
+    <w:abstractNumId w:val="38"/>
+  </w:num>
+  <w:num w:numId="13" w16cid:durableId="2011055922">
+    <w:abstractNumId w:val="19"/>
+  </w:num>
+  <w:num w:numId="14" w16cid:durableId="1529222885">
+    <w:abstractNumId w:val="96"/>
+  </w:num>
+  <w:num w:numId="15" w16cid:durableId="836580755">
+    <w:abstractNumId w:val="13"/>
+  </w:num>
+  <w:num w:numId="16" w16cid:durableId="1344674502">
+    <w:abstractNumId w:val="66"/>
+  </w:num>
+  <w:num w:numId="17" w16cid:durableId="1320882603">
+    <w:abstractNumId w:val="89"/>
+  </w:num>
+  <w:num w:numId="18" w16cid:durableId="1139028372">
     <w:abstractNumId w:val="39"/>
   </w:num>
-  <w:num w:numId="2" w16cid:durableId="967664612">
-    <w:abstractNumId w:val="69"/>
-  </w:num>
-  <w:num w:numId="3" w16cid:durableId="361631616">
-    <w:abstractNumId w:val="49"/>
-  </w:num>
-  <w:num w:numId="4" w16cid:durableId="1409575397">
-    <w:abstractNumId w:val="59"/>
-  </w:num>
-  <w:num w:numId="5" w16cid:durableId="1647204897">
-    <w:abstractNumId w:val="91"/>
-  </w:num>
-  <w:num w:numId="6" w16cid:durableId="682589869">
-    <w:abstractNumId w:val="17"/>
-  </w:num>
-  <w:num w:numId="7" w16cid:durableId="679703478">
-    <w:abstractNumId w:val="74"/>
-  </w:num>
-  <w:num w:numId="8" w16cid:durableId="496455128">
-    <w:abstractNumId w:val="34"/>
-  </w:num>
-  <w:num w:numId="9" w16cid:durableId="1184633094">
-    <w:abstractNumId w:val="43"/>
-  </w:num>
-  <w:num w:numId="10" w16cid:durableId="71507387">
-    <w:abstractNumId w:val="47"/>
-  </w:num>
-  <w:num w:numId="11" w16cid:durableId="1412503779">
-    <w:abstractNumId w:val="76"/>
-  </w:num>
-  <w:num w:numId="12" w16cid:durableId="1107113995">
-    <w:abstractNumId w:val="35"/>
-  </w:num>
-  <w:num w:numId="13" w16cid:durableId="2011055922">
-    <w:abstractNumId w:val="18"/>
-  </w:num>
-  <w:num w:numId="14" w16cid:durableId="1529222885">
-    <w:abstractNumId w:val="90"/>
-  </w:num>
-  <w:num w:numId="15" w16cid:durableId="836580755">
-    <w:abstractNumId w:val="12"/>
-  </w:num>
-  <w:num w:numId="16" w16cid:durableId="1344674502">
-    <w:abstractNumId w:val="62"/>
-  </w:num>
-  <w:num w:numId="17" w16cid:durableId="1320882603">
-    <w:abstractNumId w:val="83"/>
-  </w:num>
-  <w:num w:numId="18" w16cid:durableId="1139028372">
-    <w:abstractNumId w:val="36"/>
-  </w:num>
   <w:num w:numId="19" w16cid:durableId="1525635473">
-    <w:abstractNumId w:val="67"/>
+    <w:abstractNumId w:val="72"/>
   </w:num>
   <w:num w:numId="20" w16cid:durableId="609623515">
-    <w:abstractNumId w:val="92"/>
+    <w:abstractNumId w:val="98"/>
   </w:num>
   <w:num w:numId="21" w16cid:durableId="165170997">
-    <w:abstractNumId w:val="79"/>
+    <w:abstractNumId w:val="84"/>
   </w:num>
   <w:num w:numId="22" w16cid:durableId="1620525290">
-    <w:abstractNumId w:val="23"/>
+    <w:abstractNumId w:val="24"/>
   </w:num>
   <w:num w:numId="23" w16cid:durableId="400753109">
-    <w:abstractNumId w:val="85"/>
+    <w:abstractNumId w:val="91"/>
   </w:num>
   <w:num w:numId="24" w16cid:durableId="193882219">
     <w:abstractNumId w:val="4"/>
   </w:num>
   <w:num w:numId="25" w16cid:durableId="311981628">
-    <w:abstractNumId w:val="40"/>
+    <w:abstractNumId w:val="43"/>
   </w:num>
   <w:num w:numId="26" w16cid:durableId="2009166045">
-    <w:abstractNumId w:val="11"/>
+    <w:abstractNumId w:val="12"/>
   </w:num>
   <w:num w:numId="27" w16cid:durableId="2135174697">
-    <w:abstractNumId w:val="16"/>
+    <w:abstractNumId w:val="17"/>
   </w:num>
   <w:num w:numId="28" w16cid:durableId="353504740">
-    <w:abstractNumId w:val="13"/>
+    <w:abstractNumId w:val="14"/>
   </w:num>
   <w:num w:numId="29" w16cid:durableId="2124693280">
-    <w:abstractNumId w:val="71"/>
+    <w:abstractNumId w:val="76"/>
   </w:num>
   <w:num w:numId="30" w16cid:durableId="1367099744">
-    <w:abstractNumId w:val="27"/>
+    <w:abstractNumId w:val="29"/>
   </w:num>
   <w:num w:numId="31" w16cid:durableId="2011105642">
-    <w:abstractNumId w:val="63"/>
+    <w:abstractNumId w:val="67"/>
   </w:num>
   <w:num w:numId="32" w16cid:durableId="831995364">
-    <w:abstractNumId w:val="21"/>
+    <w:abstractNumId w:val="22"/>
   </w:num>
   <w:num w:numId="33" w16cid:durableId="851073403">
     <w:abstractNumId w:val="3"/>
   </w:num>
   <w:num w:numId="34" w16cid:durableId="1183666391">
-    <w:abstractNumId w:val="20"/>
+    <w:abstractNumId w:val="21"/>
   </w:num>
   <w:num w:numId="35" w16cid:durableId="697268929">
     <w:abstractNumId w:val="1"/>
@@ -17508,175 +19030,193 @@
     <w:abstractNumId w:val="2"/>
   </w:num>
   <w:num w:numId="37" w16cid:durableId="1849755457">
-    <w:abstractNumId w:val="86"/>
+    <w:abstractNumId w:val="92"/>
   </w:num>
   <w:num w:numId="38" w16cid:durableId="516505904">
-    <w:abstractNumId w:val="10"/>
+    <w:abstractNumId w:val="11"/>
   </w:num>
   <w:num w:numId="39" w16cid:durableId="906300072">
-    <w:abstractNumId w:val="14"/>
+    <w:abstractNumId w:val="15"/>
   </w:num>
   <w:num w:numId="40" w16cid:durableId="905338697">
-    <w:abstractNumId w:val="51"/>
+    <w:abstractNumId w:val="54"/>
   </w:num>
   <w:num w:numId="41" w16cid:durableId="501896635">
-    <w:abstractNumId w:val="37"/>
+    <w:abstractNumId w:val="40"/>
   </w:num>
   <w:num w:numId="42" w16cid:durableId="1953435156">
-    <w:abstractNumId w:val="52"/>
+    <w:abstractNumId w:val="55"/>
   </w:num>
   <w:num w:numId="43" w16cid:durableId="1060447452">
-    <w:abstractNumId w:val="61"/>
+    <w:abstractNumId w:val="65"/>
   </w:num>
   <w:num w:numId="44" w16cid:durableId="1772503672">
-    <w:abstractNumId w:val="45"/>
+    <w:abstractNumId w:val="48"/>
   </w:num>
   <w:num w:numId="45" w16cid:durableId="1650330222">
-    <w:abstractNumId w:val="50"/>
+    <w:abstractNumId w:val="53"/>
   </w:num>
   <w:num w:numId="46" w16cid:durableId="2102337934">
-    <w:abstractNumId w:val="22"/>
+    <w:abstractNumId w:val="23"/>
   </w:num>
   <w:num w:numId="47" w16cid:durableId="68767822">
-    <w:abstractNumId w:val="77"/>
+    <w:abstractNumId w:val="82"/>
   </w:num>
   <w:num w:numId="48" w16cid:durableId="1992058265">
     <w:abstractNumId w:val="5"/>
   </w:num>
   <w:num w:numId="49" w16cid:durableId="788475134">
-    <w:abstractNumId w:val="89"/>
+    <w:abstractNumId w:val="95"/>
   </w:num>
   <w:num w:numId="50" w16cid:durableId="224419455">
-    <w:abstractNumId w:val="82"/>
+    <w:abstractNumId w:val="87"/>
   </w:num>
   <w:num w:numId="51" w16cid:durableId="1699575947">
-    <w:abstractNumId w:val="66"/>
+    <w:abstractNumId w:val="71"/>
   </w:num>
   <w:num w:numId="52" w16cid:durableId="1048916239">
-    <w:abstractNumId w:val="42"/>
+    <w:abstractNumId w:val="45"/>
   </w:num>
   <w:num w:numId="53" w16cid:durableId="1188711211">
-    <w:abstractNumId w:val="87"/>
+    <w:abstractNumId w:val="93"/>
   </w:num>
   <w:num w:numId="54" w16cid:durableId="447555614">
-    <w:abstractNumId w:val="68"/>
+    <w:abstractNumId w:val="73"/>
   </w:num>
   <w:num w:numId="55" w16cid:durableId="1679307268">
-    <w:abstractNumId w:val="41"/>
+    <w:abstractNumId w:val="44"/>
   </w:num>
   <w:num w:numId="56" w16cid:durableId="693773591">
-    <w:abstractNumId w:val="81"/>
+    <w:abstractNumId w:val="86"/>
   </w:num>
   <w:num w:numId="57" w16cid:durableId="1110473324">
-    <w:abstractNumId w:val="29"/>
+    <w:abstractNumId w:val="31"/>
   </w:num>
   <w:num w:numId="58" w16cid:durableId="842937968">
-    <w:abstractNumId w:val="48"/>
+    <w:abstractNumId w:val="51"/>
   </w:num>
   <w:num w:numId="59" w16cid:durableId="821121315">
-    <w:abstractNumId w:val="33"/>
+    <w:abstractNumId w:val="36"/>
   </w:num>
   <w:num w:numId="60" w16cid:durableId="2095394549">
-    <w:abstractNumId w:val="88"/>
+    <w:abstractNumId w:val="94"/>
   </w:num>
   <w:num w:numId="61" w16cid:durableId="1299921011">
-    <w:abstractNumId w:val="32"/>
+    <w:abstractNumId w:val="35"/>
   </w:num>
   <w:num w:numId="62" w16cid:durableId="1927420240">
-    <w:abstractNumId w:val="54"/>
+    <w:abstractNumId w:val="58"/>
   </w:num>
   <w:num w:numId="63" w16cid:durableId="41290043">
-    <w:abstractNumId w:val="58"/>
+    <w:abstractNumId w:val="62"/>
   </w:num>
   <w:num w:numId="64" w16cid:durableId="999846909">
-    <w:abstractNumId w:val="46"/>
+    <w:abstractNumId w:val="49"/>
   </w:num>
   <w:num w:numId="65" w16cid:durableId="1250969563">
-    <w:abstractNumId w:val="53"/>
+    <w:abstractNumId w:val="57"/>
   </w:num>
   <w:num w:numId="66" w16cid:durableId="484011382">
-    <w:abstractNumId w:val="75"/>
+    <w:abstractNumId w:val="80"/>
   </w:num>
   <w:num w:numId="67" w16cid:durableId="2008289242">
-    <w:abstractNumId w:val="8"/>
+    <w:abstractNumId w:val="9"/>
   </w:num>
   <w:num w:numId="68" w16cid:durableId="1041637222">
-    <w:abstractNumId w:val="15"/>
+    <w:abstractNumId w:val="16"/>
   </w:num>
   <w:num w:numId="69" w16cid:durableId="1296839887">
-    <w:abstractNumId w:val="57"/>
+    <w:abstractNumId w:val="61"/>
   </w:num>
   <w:num w:numId="70" w16cid:durableId="336662050">
-    <w:abstractNumId w:val="65"/>
+    <w:abstractNumId w:val="70"/>
   </w:num>
   <w:num w:numId="71" w16cid:durableId="1460032333">
-    <w:abstractNumId w:val="80"/>
+    <w:abstractNumId w:val="85"/>
   </w:num>
   <w:num w:numId="72" w16cid:durableId="592400615">
     <w:abstractNumId w:val="7"/>
   </w:num>
   <w:num w:numId="73" w16cid:durableId="1879049234">
+    <w:abstractNumId w:val="28"/>
+  </w:num>
+  <w:num w:numId="74" w16cid:durableId="1747679558">
+    <w:abstractNumId w:val="32"/>
+  </w:num>
+  <w:num w:numId="75" w16cid:durableId="55278029">
+    <w:abstractNumId w:val="25"/>
+  </w:num>
+  <w:num w:numId="76" w16cid:durableId="1032193382">
     <w:abstractNumId w:val="26"/>
   </w:num>
-  <w:num w:numId="74" w16cid:durableId="1747679558">
-    <w:abstractNumId w:val="30"/>
-  </w:num>
-  <w:num w:numId="75" w16cid:durableId="55278029">
-    <w:abstractNumId w:val="24"/>
-  </w:num>
-  <w:num w:numId="76" w16cid:durableId="1032193382">
-    <w:abstractNumId w:val="25"/>
-  </w:num>
   <w:num w:numId="77" w16cid:durableId="763109604">
-    <w:abstractNumId w:val="60"/>
+    <w:abstractNumId w:val="64"/>
   </w:num>
   <w:num w:numId="78" w16cid:durableId="2138137265">
-    <w:abstractNumId w:val="70"/>
+    <w:abstractNumId w:val="75"/>
   </w:num>
   <w:num w:numId="79" w16cid:durableId="343675924">
-    <w:abstractNumId w:val="84"/>
+    <w:abstractNumId w:val="90"/>
   </w:num>
   <w:num w:numId="80" w16cid:durableId="1823277442">
-    <w:abstractNumId w:val="31"/>
+    <w:abstractNumId w:val="34"/>
   </w:num>
   <w:num w:numId="81" w16cid:durableId="1686900155">
     <w:abstractNumId w:val="0"/>
   </w:num>
   <w:num w:numId="82" w16cid:durableId="1113326280">
-    <w:abstractNumId w:val="56"/>
+    <w:abstractNumId w:val="60"/>
   </w:num>
   <w:num w:numId="83" w16cid:durableId="1253051103">
+    <w:abstractNumId w:val="83"/>
+  </w:num>
+  <w:num w:numId="84" w16cid:durableId="444888444">
+    <w:abstractNumId w:val="41"/>
+  </w:num>
+  <w:num w:numId="85" w16cid:durableId="64299649">
+    <w:abstractNumId w:val="77"/>
+  </w:num>
+  <w:num w:numId="86" w16cid:durableId="868182992">
+    <w:abstractNumId w:val="47"/>
+  </w:num>
+  <w:num w:numId="87" w16cid:durableId="896863331">
+    <w:abstractNumId w:val="20"/>
+  </w:num>
+  <w:num w:numId="88" w16cid:durableId="505442826">
     <w:abstractNumId w:val="78"/>
   </w:num>
-  <w:num w:numId="84" w16cid:durableId="444888444">
-    <w:abstractNumId w:val="38"/>
-  </w:num>
-  <w:num w:numId="85" w16cid:durableId="64299649">
-    <w:abstractNumId w:val="72"/>
-  </w:num>
-  <w:num w:numId="86" w16cid:durableId="868182992">
-    <w:abstractNumId w:val="44"/>
-  </w:num>
-  <w:num w:numId="87" w16cid:durableId="896863331">
-    <w:abstractNumId w:val="19"/>
-  </w:num>
-  <w:num w:numId="88" w16cid:durableId="505442826">
-    <w:abstractNumId w:val="73"/>
-  </w:num>
   <w:num w:numId="89" w16cid:durableId="1858763908">
-    <w:abstractNumId w:val="28"/>
+    <w:abstractNumId w:val="30"/>
   </w:num>
   <w:num w:numId="90" w16cid:durableId="1896088176">
-    <w:abstractNumId w:val="9"/>
+    <w:abstractNumId w:val="10"/>
   </w:num>
   <w:num w:numId="91" w16cid:durableId="1284576603">
-    <w:abstractNumId w:val="64"/>
+    <w:abstractNumId w:val="68"/>
   </w:num>
   <w:num w:numId="92" w16cid:durableId="1963075542">
     <w:abstractNumId w:val="6"/>
   </w:num>
   <w:num w:numId="93" w16cid:durableId="787627596">
-    <w:abstractNumId w:val="55"/>
+    <w:abstractNumId w:val="59"/>
+  </w:num>
+  <w:num w:numId="94" w16cid:durableId="2003925799">
+    <w:abstractNumId w:val="8"/>
+  </w:num>
+  <w:num w:numId="95" w16cid:durableId="1169102579">
+    <w:abstractNumId w:val="69"/>
+  </w:num>
+  <w:num w:numId="96" w16cid:durableId="1216501564">
+    <w:abstractNumId w:val="27"/>
+  </w:num>
+  <w:num w:numId="97" w16cid:durableId="261768216">
+    <w:abstractNumId w:val="88"/>
+  </w:num>
+  <w:num w:numId="98" w16cid:durableId="2141918721">
+    <w:abstractNumId w:val="56"/>
+  </w:num>
+  <w:num w:numId="99" w16cid:durableId="905841544">
+    <w:abstractNumId w:val="33"/>
   </w:num>
   <w:numIdMacAtCleanup w:val="45"/>
 </w:numbering>

</xml_diff>

<commit_message>
AI Assistant Interaction Sequence Diagram (#241)
</commit_message>
<xml_diff>
--- a/Sequence Specification Document.docx
+++ b/Sequence Specification Document.docx
@@ -5900,13 +5900,681 @@
     </w:p>
     <w:p>
       <w:pPr>
+        <w:pStyle w:val="Heading3"/>
+        <w:numPr>
+          <w:ilvl w:val="0"/>
+          <w:numId w:val="74"/>
+        </w:numPr>
+      </w:pPr>
+      <w:r>
+        <w:lastRenderedPageBreak/>
+        <w:t>AI Assistant Interaction Sequence</w:t>
+      </w:r>
+    </w:p>
+    <w:p>
+      <w:pPr>
         <w:spacing w:line="278" w:lineRule="auto"/>
-      </w:pPr>
+        <w:rPr>
+          <w:b/>
+          <w:bCs/>
+        </w:rPr>
+      </w:pPr>
+      <w:r>
+        <w:rPr>
+          <w:b/>
+          <w:bCs/>
+        </w:rPr>
+        <w:t>Purpose</w:t>
+      </w:r>
     </w:p>
     <w:p>
       <w:pPr>
         <w:spacing w:line="278" w:lineRule="auto"/>
       </w:pPr>
+      <w:r>
+        <w:t>The AI Assistant Interaction Sequence Diagram shows the interaction pattern between the customer and the AI assistant present in the KriGo platform. The AI assistant helps out by answering queries and providing relevant details regarding reservations and vehicles. The interaction between the UI, AI processing, knowledge service, and data storage is shown through the sequence diagram</w:t>
+      </w:r>
+      <w:r>
+        <w:t>.</w:t>
+      </w:r>
+    </w:p>
+    <w:p>
+      <w:pPr>
+        <w:spacing w:line="278" w:lineRule="auto"/>
+        <w:rPr>
+          <w:b/>
+          <w:bCs/>
+        </w:rPr>
+      </w:pPr>
+      <w:r>
+        <w:rPr>
+          <w:b/>
+          <w:bCs/>
+        </w:rPr>
+        <w:t>Participating Objects</w:t>
+      </w:r>
+    </w:p>
+    <w:p>
+      <w:pPr>
+        <w:spacing w:line="278" w:lineRule="auto"/>
+      </w:pPr>
+      <w:r>
+        <w:t>The sequence diagram includes the following participants:</w:t>
+      </w:r>
+    </w:p>
+    <w:p>
+      <w:pPr>
+        <w:pStyle w:val="ListParagraph"/>
+        <w:numPr>
+          <w:ilvl w:val="0"/>
+          <w:numId w:val="102"/>
+        </w:numPr>
+        <w:spacing w:line="278" w:lineRule="auto"/>
+      </w:pPr>
+      <w:r>
+        <w:rPr>
+          <w:b/>
+          <w:bCs/>
+        </w:rPr>
+        <w:t>Customer (Actor):</w:t>
+      </w:r>
+      <w:r>
+        <w:t xml:space="preserve"> Initiates conversations with the AI assistant by asking questions or requesting assistance.</w:t>
+      </w:r>
+    </w:p>
+    <w:p>
+      <w:pPr>
+        <w:pStyle w:val="ListParagraph"/>
+        <w:numPr>
+          <w:ilvl w:val="0"/>
+          <w:numId w:val="102"/>
+        </w:numPr>
+        <w:spacing w:line="278" w:lineRule="auto"/>
+      </w:pPr>
+      <w:r>
+        <w:rPr>
+          <w:b/>
+          <w:bCs/>
+        </w:rPr>
+        <w:t>AIChatUI (Boundary):</w:t>
+      </w:r>
+      <w:r>
+        <w:t xml:space="preserve"> Provides the conversational interface through which users interact with the AI assistant.</w:t>
+      </w:r>
+    </w:p>
+    <w:p>
+      <w:pPr>
+        <w:pStyle w:val="ListParagraph"/>
+        <w:numPr>
+          <w:ilvl w:val="0"/>
+          <w:numId w:val="102"/>
+        </w:numPr>
+        <w:spacing w:line="278" w:lineRule="auto"/>
+      </w:pPr>
+      <w:r>
+        <w:rPr>
+          <w:b/>
+          <w:bCs/>
+        </w:rPr>
+        <w:t>AIController (Control):</w:t>
+      </w:r>
+      <w:r>
+        <w:t xml:space="preserve"> Manages communication between the user interface and the AI assistant service.</w:t>
+      </w:r>
+    </w:p>
+    <w:p>
+      <w:pPr>
+        <w:pStyle w:val="ListParagraph"/>
+        <w:numPr>
+          <w:ilvl w:val="0"/>
+          <w:numId w:val="102"/>
+        </w:numPr>
+        <w:spacing w:line="278" w:lineRule="auto"/>
+      </w:pPr>
+      <w:r>
+        <w:rPr>
+          <w:b/>
+          <w:bCs/>
+        </w:rPr>
+        <w:t>AIAssistantService (LLM) (Control):</w:t>
+      </w:r>
+      <w:r>
+        <w:t xml:space="preserve"> Processes user prompts, retrieves relevant information, and generates natural language responses.</w:t>
+      </w:r>
+    </w:p>
+    <w:p>
+      <w:pPr>
+        <w:pStyle w:val="ListParagraph"/>
+        <w:numPr>
+          <w:ilvl w:val="0"/>
+          <w:numId w:val="102"/>
+        </w:numPr>
+        <w:spacing w:line="278" w:lineRule="auto"/>
+      </w:pPr>
+      <w:r>
+        <w:rPr>
+          <w:b/>
+          <w:bCs/>
+        </w:rPr>
+        <w:t>KnowledgeService (Control):</w:t>
+      </w:r>
+      <w:r>
+        <w:t xml:space="preserve"> Supplies platform documentation, policies, and other contextual information required to answer general inquiries.</w:t>
+      </w:r>
+    </w:p>
+    <w:p>
+      <w:pPr>
+        <w:pStyle w:val="ListParagraph"/>
+        <w:numPr>
+          <w:ilvl w:val="0"/>
+          <w:numId w:val="102"/>
+        </w:numPr>
+        <w:spacing w:line="278" w:lineRule="auto"/>
+      </w:pPr>
+      <w:r>
+        <w:rPr>
+          <w:b/>
+          <w:bCs/>
+        </w:rPr>
+        <w:t>ReservationRepository (Entity):</w:t>
+      </w:r>
+      <w:r>
+        <w:t xml:space="preserve"> Retrieves reservation information when users request reservation-related assistance.</w:t>
+      </w:r>
+    </w:p>
+    <w:p>
+      <w:pPr>
+        <w:pStyle w:val="ListParagraph"/>
+        <w:numPr>
+          <w:ilvl w:val="0"/>
+          <w:numId w:val="102"/>
+        </w:numPr>
+        <w:spacing w:line="278" w:lineRule="auto"/>
+      </w:pPr>
+      <w:r>
+        <w:rPr>
+          <w:b/>
+          <w:bCs/>
+        </w:rPr>
+        <w:t>VehicleRepository (Entity):</w:t>
+      </w:r>
+      <w:r>
+        <w:t xml:space="preserve"> Retrieves vehicle information for availability and specification inquiries.</w:t>
+      </w:r>
+    </w:p>
+    <w:p>
+      <w:pPr>
+        <w:pStyle w:val="ListParagraph"/>
+        <w:numPr>
+          <w:ilvl w:val="0"/>
+          <w:numId w:val="102"/>
+        </w:numPr>
+        <w:spacing w:line="278" w:lineRule="auto"/>
+      </w:pPr>
+      <w:r>
+        <w:rPr>
+          <w:b/>
+          <w:bCs/>
+        </w:rPr>
+        <w:t>Database (Database):</w:t>
+      </w:r>
+      <w:r>
+        <w:t xml:space="preserve"> Stores reservation, vehicle, and platform-related data.</w:t>
+      </w:r>
+    </w:p>
+    <w:p>
+      <w:pPr>
+        <w:spacing w:line="278" w:lineRule="auto"/>
+        <w:rPr>
+          <w:b/>
+          <w:bCs/>
+        </w:rPr>
+      </w:pPr>
+      <w:r>
+        <w:rPr>
+          <w:b/>
+          <w:bCs/>
+        </w:rPr>
+        <w:t>AI Assistant Interaction Process</w:t>
+      </w:r>
+    </w:p>
+    <w:p>
+      <w:pPr>
+        <w:spacing w:line="278" w:lineRule="auto"/>
+      </w:pPr>
+      <w:r>
+        <w:t>The process begins when the user sends a question to the system through the AIChatUI. The request is then forwarded by the AIController to the AIAssistantService for analysis of the request to find out the type of information that is required. For any general questions about the platform, the AI bot obtains context from the KnowledgeService before sending a reply</w:t>
+      </w:r>
+      <w:r>
+        <w:t>.</w:t>
+      </w:r>
+    </w:p>
+    <w:p>
+      <w:pPr>
+        <w:spacing w:line="278" w:lineRule="auto"/>
+        <w:rPr>
+          <w:b/>
+          <w:bCs/>
+        </w:rPr>
+      </w:pPr>
+      <w:r>
+        <w:rPr>
+          <w:b/>
+          <w:bCs/>
+        </w:rPr>
+        <w:t>Reservation Inquiry</w:t>
+      </w:r>
+    </w:p>
+    <w:p>
+      <w:pPr>
+        <w:spacing w:line="278" w:lineRule="auto"/>
+      </w:pPr>
+      <w:r>
+        <w:t xml:space="preserve">If the user question involves an already made reservation, the AI assistant requests the relevant information regarding the reservation from the ReservationRepository. This repository then fetches the required information from the database and provides it to the AI assistant so that a customized response can be created </w:t>
+      </w:r>
+      <w:r>
+        <w:t>accordingly.</w:t>
+      </w:r>
+    </w:p>
+    <w:p>
+      <w:pPr>
+        <w:spacing w:line="278" w:lineRule="auto"/>
+        <w:rPr>
+          <w:b/>
+          <w:bCs/>
+        </w:rPr>
+      </w:pPr>
+      <w:r>
+        <w:rPr>
+          <w:b/>
+          <w:bCs/>
+        </w:rPr>
+        <w:br w:type="page"/>
+      </w:r>
+    </w:p>
+    <w:p>
+      <w:pPr>
+        <w:spacing w:line="278" w:lineRule="auto"/>
+        <w:rPr>
+          <w:b/>
+          <w:bCs/>
+        </w:rPr>
+      </w:pPr>
+      <w:r>
+        <w:rPr>
+          <w:b/>
+          <w:bCs/>
+        </w:rPr>
+        <w:lastRenderedPageBreak/>
+        <w:t>Vehicle Inquiry</w:t>
+      </w:r>
+    </w:p>
+    <w:p>
+      <w:pPr>
+        <w:spacing w:line="278" w:lineRule="auto"/>
+      </w:pPr>
+      <w:r>
+        <w:t>In case the customer is looking for details about any of the available cars, vehicle details, or renting, then the AI assistant fetches that particular information from the VehicleRepository. The repository accesses the database for the required vehicle information</w:t>
+      </w:r>
+      <w:r>
+        <w:t>.</w:t>
+      </w:r>
+    </w:p>
+    <w:p>
+      <w:pPr>
+        <w:spacing w:line="278" w:lineRule="auto"/>
+        <w:rPr>
+          <w:b/>
+          <w:bCs/>
+        </w:rPr>
+      </w:pPr>
+      <w:r>
+        <w:rPr>
+          <w:b/>
+          <w:bCs/>
+        </w:rPr>
+        <w:t>Handling Unknown Requests</w:t>
+      </w:r>
+    </w:p>
+    <w:p>
+      <w:pPr>
+        <w:spacing w:line="278" w:lineRule="auto"/>
+      </w:pPr>
+      <w:r>
+        <w:t>The sequence diagram has also incorporated the concept of an alternate situation where the AI assistant cannot come up with a conclusive answer to the request from the user. In such cases, the AI assistant informs the AI controller about the fact that there is a need for additional help. The system then suggests contacting customer care or any other suitable facility</w:t>
+      </w:r>
+      <w:r>
+        <w:t>.</w:t>
+      </w:r>
+    </w:p>
+    <w:p>
+      <w:pPr>
+        <w:spacing w:line="278" w:lineRule="auto"/>
+        <w:rPr>
+          <w:b/>
+          <w:bCs/>
+        </w:rPr>
+      </w:pPr>
+      <w:r>
+        <w:rPr>
+          <w:b/>
+          <w:bCs/>
+        </w:rPr>
+        <w:t>Alternative and Exceptional Flows</w:t>
+      </w:r>
+    </w:p>
+    <w:p>
+      <w:pPr>
+        <w:spacing w:line="278" w:lineRule="auto"/>
+      </w:pPr>
+      <w:r>
+        <w:t>The AI Assistant Interaction Sequence Diagram includes several alternative scenarios:</w:t>
+      </w:r>
+    </w:p>
+    <w:p>
+      <w:pPr>
+        <w:pStyle w:val="ListParagraph"/>
+        <w:numPr>
+          <w:ilvl w:val="0"/>
+          <w:numId w:val="103"/>
+        </w:numPr>
+        <w:spacing w:line="278" w:lineRule="auto"/>
+      </w:pPr>
+      <w:r>
+        <w:t>General platform inquiries answered using platform knowledge.</w:t>
+      </w:r>
+    </w:p>
+    <w:p>
+      <w:pPr>
+        <w:pStyle w:val="ListParagraph"/>
+        <w:numPr>
+          <w:ilvl w:val="0"/>
+          <w:numId w:val="103"/>
+        </w:numPr>
+        <w:spacing w:line="278" w:lineRule="auto"/>
+      </w:pPr>
+      <w:r>
+        <w:t>Reservation-related inquiries requiring reservation data retrieval.</w:t>
+      </w:r>
+    </w:p>
+    <w:p>
+      <w:pPr>
+        <w:pStyle w:val="ListParagraph"/>
+        <w:numPr>
+          <w:ilvl w:val="0"/>
+          <w:numId w:val="103"/>
+        </w:numPr>
+        <w:spacing w:line="278" w:lineRule="auto"/>
+      </w:pPr>
+      <w:r>
+        <w:t>Vehicle-related inquiries requiring vehicle information retrieval.</w:t>
+      </w:r>
+    </w:p>
+    <w:p>
+      <w:pPr>
+        <w:pStyle w:val="ListParagraph"/>
+        <w:numPr>
+          <w:ilvl w:val="0"/>
+          <w:numId w:val="103"/>
+        </w:numPr>
+        <w:spacing w:line="278" w:lineRule="auto"/>
+      </w:pPr>
+      <w:r>
+        <w:t>Unknown or unsupported requests that are redirected to customer support.</w:t>
+      </w:r>
+    </w:p>
+    <w:p>
+      <w:pPr>
+        <w:spacing w:line="278" w:lineRule="auto"/>
+      </w:pPr>
+      <w:r>
+        <w:t>These alternative flows enable the AI assistant to provide flexible, context-aware support while ensuring reliable handling of requests beyond its capabilities.</w:t>
+      </w:r>
+    </w:p>
+    <w:p>
+      <w:pPr>
+        <w:spacing w:line="278" w:lineRule="auto"/>
+        <w:rPr>
+          <w:b/>
+          <w:bCs/>
+        </w:rPr>
+      </w:pPr>
+      <w:r>
+        <w:rPr>
+          <w:b/>
+          <w:bCs/>
+        </w:rPr>
+        <w:br w:type="page"/>
+      </w:r>
+    </w:p>
+    <w:p>
+      <w:pPr>
+        <w:spacing w:line="278" w:lineRule="auto"/>
+        <w:rPr>
+          <w:b/>
+          <w:bCs/>
+        </w:rPr>
+      </w:pPr>
+      <w:r>
+        <w:rPr>
+          <w:b/>
+          <w:bCs/>
+        </w:rPr>
+        <w:lastRenderedPageBreak/>
+        <w:t>Conclusion</w:t>
+      </w:r>
+    </w:p>
+    <w:p>
+      <w:pPr>
+        <w:spacing w:line="278" w:lineRule="auto"/>
+      </w:pPr>
+      <w:r>
+        <w:t>The AI Assistant Interaction Sequence Diagram gives an all-encompassing view of how the conversational support mechanism works on the KriGo platform. It shows how the different parts work together in order to provide intelligent and personal assistance. This diagram plays a vital role as a design artifact in explaining how the AI assistant subsystem works.</w:t>
+      </w:r>
+    </w:p>
+    <w:p>
+      <w:pPr>
+        <w:spacing w:line="278" w:lineRule="auto"/>
+      </w:pPr>
+      <w:r>
+        <w:rPr>
+          <w:noProof/>
+        </w:rPr>
+        <mc:AlternateContent>
+          <mc:Choice Requires="wps">
+            <w:drawing>
+              <wp:anchor distT="0" distB="0" distL="114300" distR="114300" simplePos="0" relativeHeight="251681792" behindDoc="0" locked="0" layoutInCell="1" allowOverlap="1" wp14:anchorId="5139269B" wp14:editId="722714C6">
+                <wp:simplePos x="0" y="0"/>
+                <wp:positionH relativeFrom="column">
+                  <wp:posOffset>-2540</wp:posOffset>
+                </wp:positionH>
+                <wp:positionV relativeFrom="paragraph">
+                  <wp:posOffset>4070985</wp:posOffset>
+                </wp:positionV>
+                <wp:extent cx="5941695" cy="635"/>
+                <wp:effectExtent l="0" t="0" r="0" b="0"/>
+                <wp:wrapSquare wrapText="bothSides"/>
+                <wp:docPr id="1706647449" name="Text Box 1"/>
+                <wp:cNvGraphicFramePr/>
+                <a:graphic xmlns:a="http://schemas.openxmlformats.org/drawingml/2006/main">
+                  <a:graphicData uri="http://schemas.microsoft.com/office/word/2010/wordprocessingShape">
+                    <wps:wsp>
+                      <wps:cNvSpPr txBox="1"/>
+                      <wps:spPr>
+                        <a:xfrm>
+                          <a:off x="0" y="0"/>
+                          <a:ext cx="5941695" cy="635"/>
+                        </a:xfrm>
+                        <a:prstGeom prst="rect">
+                          <a:avLst/>
+                        </a:prstGeom>
+                        <a:solidFill>
+                          <a:prstClr val="white"/>
+                        </a:solidFill>
+                        <a:ln>
+                          <a:noFill/>
+                        </a:ln>
+                      </wps:spPr>
+                      <wps:txbx>
+                        <w:txbxContent>
+                          <w:p>
+                            <w:pPr>
+                              <w:pStyle w:val="Caption"/>
+                              <w:rPr>
+                                <w:noProof/>
+                              </w:rPr>
+                            </w:pPr>
+                            <w:r>
+                              <w:t xml:space="preserve">Figure </w:t>
+                            </w:r>
+                            <w:r>
+                              <w:fldChar w:fldCharType="begin"/>
+                            </w:r>
+                            <w:r>
+                              <w:instrText xml:space="preserve"> SEQ Figure \* ARABIC </w:instrText>
+                            </w:r>
+                            <w:r>
+                              <w:fldChar w:fldCharType="separate"/>
+                            </w:r>
+                            <w:r>
+                              <w:rPr>
+                                <w:noProof/>
+                              </w:rPr>
+                              <w:t>10</w:t>
+                            </w:r>
+                            <w:r>
+                              <w:fldChar w:fldCharType="end"/>
+                            </w:r>
+                            <w:r>
+                              <w:t xml:space="preserve"> - </w:t>
+                            </w:r>
+                            <w:r>
+                              <w:t>AI Assistant Interaction Sequence Diagram</w:t>
+                            </w:r>
+                          </w:p>
+                        </w:txbxContent>
+                      </wps:txbx>
+                      <wps:bodyPr rot="0" spcFirstLastPara="0" vertOverflow="overflow" horzOverflow="overflow" vert="horz" wrap="square" lIns="0" tIns="0" rIns="0" bIns="0" numCol="1" spcCol="0" rtlCol="0" fromWordArt="0" anchor="t" anchorCtr="0" forceAA="0" compatLnSpc="1">
+                        <a:prstTxWarp prst="textNoShape">
+                          <a:avLst/>
+                        </a:prstTxWarp>
+                        <a:spAutoFit/>
+                      </wps:bodyPr>
+                    </wps:wsp>
+                  </a:graphicData>
+                </a:graphic>
+              </wp:anchor>
+            </w:drawing>
+          </mc:Choice>
+          <mc:Fallback>
+            <w:pict>
+              <v:shape w14:anchorId="5139269B" id="_x0000_s1032" type="#_x0000_t202" style="position:absolute;margin-left:-.2pt;margin-top:320.55pt;width:467.85pt;height:.05pt;z-index:251681792;visibility:visible;mso-wrap-style:square;mso-wrap-distance-left:9pt;mso-wrap-distance-top:0;mso-wrap-distance-right:9pt;mso-wrap-distance-bottom:0;mso-position-horizontal:absolute;mso-position-horizontal-relative:text;mso-position-vertical:absolute;mso-position-vertical-relative:text;v-text-anchor:top" o:gfxdata="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" stroked="f">
+                <v:textbox style="mso-fit-shape-to-text:t" inset="0,0,0,0">
+                  <w:txbxContent>
+                    <w:p>
+                      <w:pPr>
+                        <w:pStyle w:val="Caption"/>
+                        <w:rPr>
+                          <w:noProof/>
+                        </w:rPr>
+                      </w:pPr>
+                      <w:r>
+                        <w:t xml:space="preserve">Figure </w:t>
+                      </w:r>
+                      <w:r>
+                        <w:fldChar w:fldCharType="begin"/>
+                      </w:r>
+                      <w:r>
+                        <w:instrText xml:space="preserve"> SEQ Figure \* ARABIC </w:instrText>
+                      </w:r>
+                      <w:r>
+                        <w:fldChar w:fldCharType="separate"/>
+                      </w:r>
+                      <w:r>
+                        <w:rPr>
+                          <w:noProof/>
+                        </w:rPr>
+                        <w:t>10</w:t>
+                      </w:r>
+                      <w:r>
+                        <w:fldChar w:fldCharType="end"/>
+                      </w:r>
+                      <w:r>
+                        <w:t xml:space="preserve"> - </w:t>
+                      </w:r>
+                      <w:r>
+                        <w:t>AI Assistant Interaction Sequence Diagram</w:t>
+                      </w:r>
+                    </w:p>
+                  </w:txbxContent>
+                </v:textbox>
+                <w10:wrap type="square"/>
+              </v:shape>
+            </w:pict>
+          </mc:Fallback>
+        </mc:AlternateContent>
+      </w:r>
+      <w:r>
+        <w:rPr>
+          <w:noProof/>
+        </w:rPr>
+        <w:drawing>
+          <wp:anchor distT="0" distB="0" distL="114300" distR="114300" simplePos="0" relativeHeight="251679744" behindDoc="0" locked="0" layoutInCell="1" allowOverlap="1" wp14:anchorId="69DFB286" wp14:editId="2C7E11C7">
+            <wp:simplePos x="0" y="0"/>
+            <wp:positionH relativeFrom="column">
+              <wp:posOffset>-2540</wp:posOffset>
+            </wp:positionH>
+            <wp:positionV relativeFrom="paragraph">
+              <wp:posOffset>219710</wp:posOffset>
+            </wp:positionV>
+            <wp:extent cx="5941695" cy="3794125"/>
+            <wp:effectExtent l="0" t="0" r="1905" b="0"/>
+            <wp:wrapSquare wrapText="bothSides"/>
+            <wp:docPr id="1413499570" name="Picture 10"/>
+            <wp:cNvGraphicFramePr>
+              <a:graphicFrameLocks xmlns:a="http://schemas.openxmlformats.org/drawingml/2006/main" noChangeAspect="1"/>
+            </wp:cNvGraphicFramePr>
+            <a:graphic xmlns:a="http://schemas.openxmlformats.org/drawingml/2006/main">
+              <a:graphicData uri="http://schemas.openxmlformats.org/drawingml/2006/picture">
+                <pic:pic xmlns:pic="http://schemas.openxmlformats.org/drawingml/2006/picture">
+                  <pic:nvPicPr>
+                    <pic:cNvPr id="0" name="Picture 13"/>
+                    <pic:cNvPicPr>
+                      <a:picLocks noChangeAspect="1" noChangeArrowheads="1"/>
+                    </pic:cNvPicPr>
+                  </pic:nvPicPr>
+                  <pic:blipFill>
+                    <a:blip r:embed="rId17" cstate="print">
+                      <a:extLst>
+                        <a:ext uri="{28A0092B-C50C-407E-A947-70E740481C1C}">
+                          <a14:useLocalDpi xmlns:a14="http://schemas.microsoft.com/office/drawing/2010/main" val="0"/>
+                        </a:ext>
+                      </a:extLst>
+                    </a:blip>
+                    <a:srcRect/>
+                    <a:stretch>
+                      <a:fillRect/>
+                    </a:stretch>
+                  </pic:blipFill>
+                  <pic:spPr bwMode="auto">
+                    <a:xfrm>
+                      <a:off x="0" y="0"/>
+                      <a:ext cx="5941695" cy="3794125"/>
+                    </a:xfrm>
+                    <a:prstGeom prst="rect">
+                      <a:avLst/>
+                    </a:prstGeom>
+                    <a:noFill/>
+                    <a:ln>
+                      <a:noFill/>
+                    </a:ln>
+                  </pic:spPr>
+                </pic:pic>
+              </a:graphicData>
+            </a:graphic>
+          </wp:anchor>
+        </w:drawing>
+      </w:r>
     </w:p>
     <w:sectPr>
       <w:pgSz w:w="11906" w:h="16838" w:code="9"/>
@@ -8894,6 +9562,155 @@
     </w:lvl>
   </w:abstractNum>
   <w:abstractNum w:abstractNumId="23" w15:restartNumberingAfterBreak="0">
+    <w:nsid w:val="190F0390"/>
+    <w:multiLevelType w:val="multilevel"/>
+    <w:tmpl w:val="CBE4A4A4"/>
+    <w:lvl w:ilvl="0">
+      <w:start w:val="1"/>
+      <w:numFmt w:val="bullet"/>
+      <w:lvlText w:val=""/>
+      <w:lvlJc w:val="left"/>
+      <w:pPr>
+        <w:tabs>
+          <w:tab w:val="num" w:pos="720"/>
+        </w:tabs>
+        <w:ind w:left="720" w:hanging="360"/>
+      </w:pPr>
+      <w:rPr>
+        <w:rFonts w:ascii="Symbol" w:hAnsi="Symbol" w:hint="default"/>
+        <w:sz w:val="20"/>
+      </w:rPr>
+    </w:lvl>
+    <w:lvl w:ilvl="1" w:tentative="1">
+      <w:start w:val="1"/>
+      <w:numFmt w:val="bullet"/>
+      <w:lvlText w:val="o"/>
+      <w:lvlJc w:val="left"/>
+      <w:pPr>
+        <w:tabs>
+          <w:tab w:val="num" w:pos="1440"/>
+        </w:tabs>
+        <w:ind w:left="1440" w:hanging="360"/>
+      </w:pPr>
+      <w:rPr>
+        <w:rFonts w:ascii="Courier New" w:hAnsi="Courier New" w:hint="default"/>
+        <w:sz w:val="20"/>
+      </w:rPr>
+    </w:lvl>
+    <w:lvl w:ilvl="2" w:tentative="1">
+      <w:start w:val="1"/>
+      <w:numFmt w:val="bullet"/>
+      <w:lvlText w:val=""/>
+      <w:lvlJc w:val="left"/>
+      <w:pPr>
+        <w:tabs>
+          <w:tab w:val="num" w:pos="2160"/>
+        </w:tabs>
+        <w:ind w:left="2160" w:hanging="360"/>
+      </w:pPr>
+      <w:rPr>
+        <w:rFonts w:ascii="Wingdings" w:hAnsi="Wingdings" w:hint="default"/>
+        <w:sz w:val="20"/>
+      </w:rPr>
+    </w:lvl>
+    <w:lvl w:ilvl="3" w:tentative="1">
+      <w:start w:val="1"/>
+      <w:numFmt w:val="bullet"/>
+      <w:lvlText w:val=""/>
+      <w:lvlJc w:val="left"/>
+      <w:pPr>
+        <w:tabs>
+          <w:tab w:val="num" w:pos="2880"/>
+        </w:tabs>
+        <w:ind w:left="2880" w:hanging="360"/>
+      </w:pPr>
+      <w:rPr>
+        <w:rFonts w:ascii="Wingdings" w:hAnsi="Wingdings" w:hint="default"/>
+        <w:sz w:val="20"/>
+      </w:rPr>
+    </w:lvl>
+    <w:lvl w:ilvl="4" w:tentative="1">
+      <w:start w:val="1"/>
+      <w:numFmt w:val="bullet"/>
+      <w:lvlText w:val=""/>
+      <w:lvlJc w:val="left"/>
+      <w:pPr>
+        <w:tabs>
+          <w:tab w:val="num" w:pos="3600"/>
+        </w:tabs>
+        <w:ind w:left="3600" w:hanging="360"/>
+      </w:pPr>
+      <w:rPr>
+        <w:rFonts w:ascii="Wingdings" w:hAnsi="Wingdings" w:hint="default"/>
+        <w:sz w:val="20"/>
+      </w:rPr>
+    </w:lvl>
+    <w:lvl w:ilvl="5" w:tentative="1">
+      <w:start w:val="1"/>
+      <w:numFmt w:val="bullet"/>
+      <w:lvlText w:val=""/>
+      <w:lvlJc w:val="left"/>
+      <w:pPr>
+        <w:tabs>
+          <w:tab w:val="num" w:pos="4320"/>
+        </w:tabs>
+        <w:ind w:left="4320" w:hanging="360"/>
+      </w:pPr>
+      <w:rPr>
+        <w:rFonts w:ascii="Wingdings" w:hAnsi="Wingdings" w:hint="default"/>
+        <w:sz w:val="20"/>
+      </w:rPr>
+    </w:lvl>
+    <w:lvl w:ilvl="6" w:tentative="1">
+      <w:start w:val="1"/>
+      <w:numFmt w:val="bullet"/>
+      <w:lvlText w:val=""/>
+      <w:lvlJc w:val="left"/>
+      <w:pPr>
+        <w:tabs>
+          <w:tab w:val="num" w:pos="5040"/>
+        </w:tabs>
+        <w:ind w:left="5040" w:hanging="360"/>
+      </w:pPr>
+      <w:rPr>
+        <w:rFonts w:ascii="Wingdings" w:hAnsi="Wingdings" w:hint="default"/>
+        <w:sz w:val="20"/>
+      </w:rPr>
+    </w:lvl>
+    <w:lvl w:ilvl="7" w:tentative="1">
+      <w:start w:val="1"/>
+      <w:numFmt w:val="bullet"/>
+      <w:lvlText w:val=""/>
+      <w:lvlJc w:val="left"/>
+      <w:pPr>
+        <w:tabs>
+          <w:tab w:val="num" w:pos="5760"/>
+        </w:tabs>
+        <w:ind w:left="5760" w:hanging="360"/>
+      </w:pPr>
+      <w:rPr>
+        <w:rFonts w:ascii="Wingdings" w:hAnsi="Wingdings" w:hint="default"/>
+        <w:sz w:val="20"/>
+      </w:rPr>
+    </w:lvl>
+    <w:lvl w:ilvl="8" w:tentative="1">
+      <w:start w:val="1"/>
+      <w:numFmt w:val="bullet"/>
+      <w:lvlText w:val=""/>
+      <w:lvlJc w:val="left"/>
+      <w:pPr>
+        <w:tabs>
+          <w:tab w:val="num" w:pos="6480"/>
+        </w:tabs>
+        <w:ind w:left="6480" w:hanging="360"/>
+      </w:pPr>
+      <w:rPr>
+        <w:rFonts w:ascii="Wingdings" w:hAnsi="Wingdings" w:hint="default"/>
+        <w:sz w:val="20"/>
+      </w:rPr>
+    </w:lvl>
+  </w:abstractNum>
+  <w:abstractNum w:abstractNumId="24" w15:restartNumberingAfterBreak="0">
     <w:nsid w:val="195875B0"/>
     <w:multiLevelType w:val="multilevel"/>
     <w:tmpl w:val="615444D4"/>
@@ -9006,7 +9823,7 @@
       </w:pPr>
     </w:lvl>
   </w:abstractNum>
-  <w:abstractNum w:abstractNumId="24" w15:restartNumberingAfterBreak="0">
+  <w:abstractNum w:abstractNumId="25" w15:restartNumberingAfterBreak="0">
     <w:nsid w:val="197C6FD7"/>
     <w:multiLevelType w:val="hybridMultilevel"/>
     <w:tmpl w:val="D97CEAA8"/>
@@ -9119,7 +9936,7 @@
       </w:rPr>
     </w:lvl>
   </w:abstractNum>
-  <w:abstractNum w:abstractNumId="25" w15:restartNumberingAfterBreak="0">
+  <w:abstractNum w:abstractNumId="26" w15:restartNumberingAfterBreak="0">
     <w:nsid w:val="1CC60A94"/>
     <w:multiLevelType w:val="multilevel"/>
     <w:tmpl w:val="EB74741C"/>
@@ -9268,7 +10085,7 @@
       </w:rPr>
     </w:lvl>
   </w:abstractNum>
-  <w:abstractNum w:abstractNumId="26" w15:restartNumberingAfterBreak="0">
+  <w:abstractNum w:abstractNumId="27" w15:restartNumberingAfterBreak="0">
     <w:nsid w:val="1E6658CF"/>
     <w:multiLevelType w:val="multilevel"/>
     <w:tmpl w:val="762ABC5E"/>
@@ -9417,7 +10234,7 @@
       </w:rPr>
     </w:lvl>
   </w:abstractNum>
-  <w:abstractNum w:abstractNumId="27" w15:restartNumberingAfterBreak="0">
+  <w:abstractNum w:abstractNumId="28" w15:restartNumberingAfterBreak="0">
     <w:nsid w:val="1FA532B0"/>
     <w:multiLevelType w:val="multilevel"/>
     <w:tmpl w:val="8718294C"/>
@@ -9566,7 +10383,7 @@
       </w:rPr>
     </w:lvl>
   </w:abstractNum>
-  <w:abstractNum w:abstractNumId="28" w15:restartNumberingAfterBreak="0">
+  <w:abstractNum w:abstractNumId="29" w15:restartNumberingAfterBreak="0">
     <w:nsid w:val="215C77FD"/>
     <w:multiLevelType w:val="hybridMultilevel"/>
     <w:tmpl w:val="58F41D10"/>
@@ -9655,7 +10472,7 @@
       </w:pPr>
     </w:lvl>
   </w:abstractNum>
-  <w:abstractNum w:abstractNumId="29" w15:restartNumberingAfterBreak="0">
+  <w:abstractNum w:abstractNumId="30" w15:restartNumberingAfterBreak="0">
     <w:nsid w:val="218D5909"/>
     <w:multiLevelType w:val="hybridMultilevel"/>
     <w:tmpl w:val="CC989EE4"/>
@@ -9768,7 +10585,7 @@
       </w:rPr>
     </w:lvl>
   </w:abstractNum>
-  <w:abstractNum w:abstractNumId="30" w15:restartNumberingAfterBreak="0">
+  <w:abstractNum w:abstractNumId="31" w15:restartNumberingAfterBreak="0">
     <w:nsid w:val="23E010BA"/>
     <w:multiLevelType w:val="multilevel"/>
     <w:tmpl w:val="4A16907E"/>
@@ -9917,7 +10734,7 @@
       </w:rPr>
     </w:lvl>
   </w:abstractNum>
-  <w:abstractNum w:abstractNumId="31" w15:restartNumberingAfterBreak="0">
+  <w:abstractNum w:abstractNumId="32" w15:restartNumberingAfterBreak="0">
     <w:nsid w:val="2470127A"/>
     <w:multiLevelType w:val="multilevel"/>
     <w:tmpl w:val="309E9618"/>
@@ -10066,7 +10883,7 @@
       </w:rPr>
     </w:lvl>
   </w:abstractNum>
-  <w:abstractNum w:abstractNumId="32" w15:restartNumberingAfterBreak="0">
+  <w:abstractNum w:abstractNumId="33" w15:restartNumberingAfterBreak="0">
     <w:nsid w:val="24796798"/>
     <w:multiLevelType w:val="hybridMultilevel"/>
     <w:tmpl w:val="6622BEDC"/>
@@ -10155,7 +10972,7 @@
       </w:pPr>
     </w:lvl>
   </w:abstractNum>
-  <w:abstractNum w:abstractNumId="33" w15:restartNumberingAfterBreak="0">
+  <w:abstractNum w:abstractNumId="34" w15:restartNumberingAfterBreak="0">
     <w:nsid w:val="253B76EC"/>
     <w:multiLevelType w:val="multilevel"/>
     <w:tmpl w:val="2AA67CDA"/>
@@ -10304,7 +11121,7 @@
       </w:rPr>
     </w:lvl>
   </w:abstractNum>
-  <w:abstractNum w:abstractNumId="34" w15:restartNumberingAfterBreak="0">
+  <w:abstractNum w:abstractNumId="35" w15:restartNumberingAfterBreak="0">
     <w:nsid w:val="2E4D738C"/>
     <w:multiLevelType w:val="multilevel"/>
     <w:tmpl w:val="1540BBA2"/>
@@ -10453,7 +11270,7 @@
       </w:rPr>
     </w:lvl>
   </w:abstractNum>
-  <w:abstractNum w:abstractNumId="35" w15:restartNumberingAfterBreak="0">
+  <w:abstractNum w:abstractNumId="36" w15:restartNumberingAfterBreak="0">
     <w:nsid w:val="2F0041C7"/>
     <w:multiLevelType w:val="multilevel"/>
     <w:tmpl w:val="656414FE"/>
@@ -10602,7 +11419,7 @@
       </w:rPr>
     </w:lvl>
   </w:abstractNum>
-  <w:abstractNum w:abstractNumId="36" w15:restartNumberingAfterBreak="0">
+  <w:abstractNum w:abstractNumId="37" w15:restartNumberingAfterBreak="0">
     <w:nsid w:val="304F01FA"/>
     <w:multiLevelType w:val="multilevel"/>
     <w:tmpl w:val="151C4EC6"/>
@@ -10751,7 +11568,7 @@
       </w:rPr>
     </w:lvl>
   </w:abstractNum>
-  <w:abstractNum w:abstractNumId="37" w15:restartNumberingAfterBreak="0">
+  <w:abstractNum w:abstractNumId="38" w15:restartNumberingAfterBreak="0">
     <w:nsid w:val="30BD025D"/>
     <w:multiLevelType w:val="hybridMultilevel"/>
     <w:tmpl w:val="04381C82"/>
@@ -10840,7 +11657,7 @@
       </w:pPr>
     </w:lvl>
   </w:abstractNum>
-  <w:abstractNum w:abstractNumId="38" w15:restartNumberingAfterBreak="0">
+  <w:abstractNum w:abstractNumId="39" w15:restartNumberingAfterBreak="0">
     <w:nsid w:val="327C0BA6"/>
     <w:multiLevelType w:val="hybridMultilevel"/>
     <w:tmpl w:val="2A9047EE"/>
@@ -10953,7 +11770,7 @@
       </w:rPr>
     </w:lvl>
   </w:abstractNum>
-  <w:abstractNum w:abstractNumId="39" w15:restartNumberingAfterBreak="0">
+  <w:abstractNum w:abstractNumId="40" w15:restartNumberingAfterBreak="0">
     <w:nsid w:val="338D63E8"/>
     <w:multiLevelType w:val="hybridMultilevel"/>
     <w:tmpl w:val="28D0FB50"/>
@@ -11066,7 +11883,7 @@
       </w:rPr>
     </w:lvl>
   </w:abstractNum>
-  <w:abstractNum w:abstractNumId="40" w15:restartNumberingAfterBreak="0">
+  <w:abstractNum w:abstractNumId="41" w15:restartNumberingAfterBreak="0">
     <w:nsid w:val="35413E58"/>
     <w:multiLevelType w:val="hybridMultilevel"/>
     <w:tmpl w:val="03C64164"/>
@@ -11179,7 +11996,7 @@
       </w:rPr>
     </w:lvl>
   </w:abstractNum>
-  <w:abstractNum w:abstractNumId="41" w15:restartNumberingAfterBreak="0">
+  <w:abstractNum w:abstractNumId="42" w15:restartNumberingAfterBreak="0">
     <w:nsid w:val="35C86AF0"/>
     <w:multiLevelType w:val="multilevel"/>
     <w:tmpl w:val="8202FCD6"/>
@@ -11328,7 +12145,7 @@
       </w:rPr>
     </w:lvl>
   </w:abstractNum>
-  <w:abstractNum w:abstractNumId="42" w15:restartNumberingAfterBreak="0">
+  <w:abstractNum w:abstractNumId="43" w15:restartNumberingAfterBreak="0">
     <w:nsid w:val="3623194A"/>
     <w:multiLevelType w:val="multilevel"/>
     <w:tmpl w:val="63F4E6F0"/>
@@ -11477,7 +12294,7 @@
       </w:rPr>
     </w:lvl>
   </w:abstractNum>
-  <w:abstractNum w:abstractNumId="43" w15:restartNumberingAfterBreak="0">
+  <w:abstractNum w:abstractNumId="44" w15:restartNumberingAfterBreak="0">
     <w:nsid w:val="37B424C3"/>
     <w:multiLevelType w:val="hybridMultilevel"/>
     <w:tmpl w:val="18F030D4"/>
@@ -11590,7 +12407,7 @@
       </w:rPr>
     </w:lvl>
   </w:abstractNum>
-  <w:abstractNum w:abstractNumId="44" w15:restartNumberingAfterBreak="0">
+  <w:abstractNum w:abstractNumId="45" w15:restartNumberingAfterBreak="0">
     <w:nsid w:val="3BC10D30"/>
     <w:multiLevelType w:val="multilevel"/>
     <w:tmpl w:val="502AD78C"/>
@@ -11739,7 +12556,156 @@
       </w:rPr>
     </w:lvl>
   </w:abstractNum>
-  <w:abstractNum w:abstractNumId="45" w15:restartNumberingAfterBreak="0">
+  <w:abstractNum w:abstractNumId="46" w15:restartNumberingAfterBreak="0">
+    <w:nsid w:val="3C596808"/>
+    <w:multiLevelType w:val="multilevel"/>
+    <w:tmpl w:val="2AA67CDA"/>
+    <w:lvl w:ilvl="0">
+      <w:start w:val="1"/>
+      <w:numFmt w:val="bullet"/>
+      <w:lvlText w:val=""/>
+      <w:lvlJc w:val="left"/>
+      <w:pPr>
+        <w:tabs>
+          <w:tab w:val="num" w:pos="720"/>
+        </w:tabs>
+        <w:ind w:left="720" w:hanging="360"/>
+      </w:pPr>
+      <w:rPr>
+        <w:rFonts w:ascii="Wingdings" w:hAnsi="Wingdings" w:hint="default"/>
+        <w:sz w:val="20"/>
+      </w:rPr>
+    </w:lvl>
+    <w:lvl w:ilvl="1" w:tentative="1">
+      <w:start w:val="1"/>
+      <w:numFmt w:val="bullet"/>
+      <w:lvlText w:val="o"/>
+      <w:lvlJc w:val="left"/>
+      <w:pPr>
+        <w:tabs>
+          <w:tab w:val="num" w:pos="1440"/>
+        </w:tabs>
+        <w:ind w:left="1440" w:hanging="360"/>
+      </w:pPr>
+      <w:rPr>
+        <w:rFonts w:ascii="Courier New" w:hAnsi="Courier New" w:hint="default"/>
+        <w:sz w:val="20"/>
+      </w:rPr>
+    </w:lvl>
+    <w:lvl w:ilvl="2" w:tentative="1">
+      <w:start w:val="1"/>
+      <w:numFmt w:val="bullet"/>
+      <w:lvlText w:val=""/>
+      <w:lvlJc w:val="left"/>
+      <w:pPr>
+        <w:tabs>
+          <w:tab w:val="num" w:pos="2160"/>
+        </w:tabs>
+        <w:ind w:left="2160" w:hanging="360"/>
+      </w:pPr>
+      <w:rPr>
+        <w:rFonts w:ascii="Wingdings" w:hAnsi="Wingdings" w:hint="default"/>
+        <w:sz w:val="20"/>
+      </w:rPr>
+    </w:lvl>
+    <w:lvl w:ilvl="3" w:tentative="1">
+      <w:start w:val="1"/>
+      <w:numFmt w:val="bullet"/>
+      <w:lvlText w:val=""/>
+      <w:lvlJc w:val="left"/>
+      <w:pPr>
+        <w:tabs>
+          <w:tab w:val="num" w:pos="2880"/>
+        </w:tabs>
+        <w:ind w:left="2880" w:hanging="360"/>
+      </w:pPr>
+      <w:rPr>
+        <w:rFonts w:ascii="Wingdings" w:hAnsi="Wingdings" w:hint="default"/>
+        <w:sz w:val="20"/>
+      </w:rPr>
+    </w:lvl>
+    <w:lvl w:ilvl="4" w:tentative="1">
+      <w:start w:val="1"/>
+      <w:numFmt w:val="bullet"/>
+      <w:lvlText w:val=""/>
+      <w:lvlJc w:val="left"/>
+      <w:pPr>
+        <w:tabs>
+          <w:tab w:val="num" w:pos="3600"/>
+        </w:tabs>
+        <w:ind w:left="3600" w:hanging="360"/>
+      </w:pPr>
+      <w:rPr>
+        <w:rFonts w:ascii="Wingdings" w:hAnsi="Wingdings" w:hint="default"/>
+        <w:sz w:val="20"/>
+      </w:rPr>
+    </w:lvl>
+    <w:lvl w:ilvl="5" w:tentative="1">
+      <w:start w:val="1"/>
+      <w:numFmt w:val="bullet"/>
+      <w:lvlText w:val=""/>
+      <w:lvlJc w:val="left"/>
+      <w:pPr>
+        <w:tabs>
+          <w:tab w:val="num" w:pos="4320"/>
+        </w:tabs>
+        <w:ind w:left="4320" w:hanging="360"/>
+      </w:pPr>
+      <w:rPr>
+        <w:rFonts w:ascii="Wingdings" w:hAnsi="Wingdings" w:hint="default"/>
+        <w:sz w:val="20"/>
+      </w:rPr>
+    </w:lvl>
+    <w:lvl w:ilvl="6" w:tentative="1">
+      <w:start w:val="1"/>
+      <w:numFmt w:val="bullet"/>
+      <w:lvlText w:val=""/>
+      <w:lvlJc w:val="left"/>
+      <w:pPr>
+        <w:tabs>
+          <w:tab w:val="num" w:pos="5040"/>
+        </w:tabs>
+        <w:ind w:left="5040" w:hanging="360"/>
+      </w:pPr>
+      <w:rPr>
+        <w:rFonts w:ascii="Wingdings" w:hAnsi="Wingdings" w:hint="default"/>
+        <w:sz w:val="20"/>
+      </w:rPr>
+    </w:lvl>
+    <w:lvl w:ilvl="7" w:tentative="1">
+      <w:start w:val="1"/>
+      <w:numFmt w:val="bullet"/>
+      <w:lvlText w:val=""/>
+      <w:lvlJc w:val="left"/>
+      <w:pPr>
+        <w:tabs>
+          <w:tab w:val="num" w:pos="5760"/>
+        </w:tabs>
+        <w:ind w:left="5760" w:hanging="360"/>
+      </w:pPr>
+      <w:rPr>
+        <w:rFonts w:ascii="Wingdings" w:hAnsi="Wingdings" w:hint="default"/>
+        <w:sz w:val="20"/>
+      </w:rPr>
+    </w:lvl>
+    <w:lvl w:ilvl="8" w:tentative="1">
+      <w:start w:val="1"/>
+      <w:numFmt w:val="bullet"/>
+      <w:lvlText w:val=""/>
+      <w:lvlJc w:val="left"/>
+      <w:pPr>
+        <w:tabs>
+          <w:tab w:val="num" w:pos="6480"/>
+        </w:tabs>
+        <w:ind w:left="6480" w:hanging="360"/>
+      </w:pPr>
+      <w:rPr>
+        <w:rFonts w:ascii="Wingdings" w:hAnsi="Wingdings" w:hint="default"/>
+        <w:sz w:val="20"/>
+      </w:rPr>
+    </w:lvl>
+  </w:abstractNum>
+  <w:abstractNum w:abstractNumId="47" w15:restartNumberingAfterBreak="0">
     <w:nsid w:val="3CBF280A"/>
     <w:multiLevelType w:val="multilevel"/>
     <w:tmpl w:val="A13E4362"/>
@@ -11888,7 +12854,156 @@
       </w:rPr>
     </w:lvl>
   </w:abstractNum>
-  <w:abstractNum w:abstractNumId="46" w15:restartNumberingAfterBreak="0">
+  <w:abstractNum w:abstractNumId="48" w15:restartNumberingAfterBreak="0">
+    <w:nsid w:val="3CC7541B"/>
+    <w:multiLevelType w:val="multilevel"/>
+    <w:tmpl w:val="2AA67CDA"/>
+    <w:lvl w:ilvl="0">
+      <w:start w:val="1"/>
+      <w:numFmt w:val="bullet"/>
+      <w:lvlText w:val=""/>
+      <w:lvlJc w:val="left"/>
+      <w:pPr>
+        <w:tabs>
+          <w:tab w:val="num" w:pos="720"/>
+        </w:tabs>
+        <w:ind w:left="720" w:hanging="360"/>
+      </w:pPr>
+      <w:rPr>
+        <w:rFonts w:ascii="Wingdings" w:hAnsi="Wingdings" w:hint="default"/>
+        <w:sz w:val="20"/>
+      </w:rPr>
+    </w:lvl>
+    <w:lvl w:ilvl="1" w:tentative="1">
+      <w:start w:val="1"/>
+      <w:numFmt w:val="bullet"/>
+      <w:lvlText w:val="o"/>
+      <w:lvlJc w:val="left"/>
+      <w:pPr>
+        <w:tabs>
+          <w:tab w:val="num" w:pos="1440"/>
+        </w:tabs>
+        <w:ind w:left="1440" w:hanging="360"/>
+      </w:pPr>
+      <w:rPr>
+        <w:rFonts w:ascii="Courier New" w:hAnsi="Courier New" w:hint="default"/>
+        <w:sz w:val="20"/>
+      </w:rPr>
+    </w:lvl>
+    <w:lvl w:ilvl="2" w:tentative="1">
+      <w:start w:val="1"/>
+      <w:numFmt w:val="bullet"/>
+      <w:lvlText w:val=""/>
+      <w:lvlJc w:val="left"/>
+      <w:pPr>
+        <w:tabs>
+          <w:tab w:val="num" w:pos="2160"/>
+        </w:tabs>
+        <w:ind w:left="2160" w:hanging="360"/>
+      </w:pPr>
+      <w:rPr>
+        <w:rFonts w:ascii="Wingdings" w:hAnsi="Wingdings" w:hint="default"/>
+        <w:sz w:val="20"/>
+      </w:rPr>
+    </w:lvl>
+    <w:lvl w:ilvl="3" w:tentative="1">
+      <w:start w:val="1"/>
+      <w:numFmt w:val="bullet"/>
+      <w:lvlText w:val=""/>
+      <w:lvlJc w:val="left"/>
+      <w:pPr>
+        <w:tabs>
+          <w:tab w:val="num" w:pos="2880"/>
+        </w:tabs>
+        <w:ind w:left="2880" w:hanging="360"/>
+      </w:pPr>
+      <w:rPr>
+        <w:rFonts w:ascii="Wingdings" w:hAnsi="Wingdings" w:hint="default"/>
+        <w:sz w:val="20"/>
+      </w:rPr>
+    </w:lvl>
+    <w:lvl w:ilvl="4" w:tentative="1">
+      <w:start w:val="1"/>
+      <w:numFmt w:val="bullet"/>
+      <w:lvlText w:val=""/>
+      <w:lvlJc w:val="left"/>
+      <w:pPr>
+        <w:tabs>
+          <w:tab w:val="num" w:pos="3600"/>
+        </w:tabs>
+        <w:ind w:left="3600" w:hanging="360"/>
+      </w:pPr>
+      <w:rPr>
+        <w:rFonts w:ascii="Wingdings" w:hAnsi="Wingdings" w:hint="default"/>
+        <w:sz w:val="20"/>
+      </w:rPr>
+    </w:lvl>
+    <w:lvl w:ilvl="5" w:tentative="1">
+      <w:start w:val="1"/>
+      <w:numFmt w:val="bullet"/>
+      <w:lvlText w:val=""/>
+      <w:lvlJc w:val="left"/>
+      <w:pPr>
+        <w:tabs>
+          <w:tab w:val="num" w:pos="4320"/>
+        </w:tabs>
+        <w:ind w:left="4320" w:hanging="360"/>
+      </w:pPr>
+      <w:rPr>
+        <w:rFonts w:ascii="Wingdings" w:hAnsi="Wingdings" w:hint="default"/>
+        <w:sz w:val="20"/>
+      </w:rPr>
+    </w:lvl>
+    <w:lvl w:ilvl="6" w:tentative="1">
+      <w:start w:val="1"/>
+      <w:numFmt w:val="bullet"/>
+      <w:lvlText w:val=""/>
+      <w:lvlJc w:val="left"/>
+      <w:pPr>
+        <w:tabs>
+          <w:tab w:val="num" w:pos="5040"/>
+        </w:tabs>
+        <w:ind w:left="5040" w:hanging="360"/>
+      </w:pPr>
+      <w:rPr>
+        <w:rFonts w:ascii="Wingdings" w:hAnsi="Wingdings" w:hint="default"/>
+        <w:sz w:val="20"/>
+      </w:rPr>
+    </w:lvl>
+    <w:lvl w:ilvl="7" w:tentative="1">
+      <w:start w:val="1"/>
+      <w:numFmt w:val="bullet"/>
+      <w:lvlText w:val=""/>
+      <w:lvlJc w:val="left"/>
+      <w:pPr>
+        <w:tabs>
+          <w:tab w:val="num" w:pos="5760"/>
+        </w:tabs>
+        <w:ind w:left="5760" w:hanging="360"/>
+      </w:pPr>
+      <w:rPr>
+        <w:rFonts w:ascii="Wingdings" w:hAnsi="Wingdings" w:hint="default"/>
+        <w:sz w:val="20"/>
+      </w:rPr>
+    </w:lvl>
+    <w:lvl w:ilvl="8" w:tentative="1">
+      <w:start w:val="1"/>
+      <w:numFmt w:val="bullet"/>
+      <w:lvlText w:val=""/>
+      <w:lvlJc w:val="left"/>
+      <w:pPr>
+        <w:tabs>
+          <w:tab w:val="num" w:pos="6480"/>
+        </w:tabs>
+        <w:ind w:left="6480" w:hanging="360"/>
+      </w:pPr>
+      <w:rPr>
+        <w:rFonts w:ascii="Wingdings" w:hAnsi="Wingdings" w:hint="default"/>
+        <w:sz w:val="20"/>
+      </w:rPr>
+    </w:lvl>
+  </w:abstractNum>
+  <w:abstractNum w:abstractNumId="49" w15:restartNumberingAfterBreak="0">
     <w:nsid w:val="452F60FB"/>
     <w:multiLevelType w:val="hybridMultilevel"/>
     <w:tmpl w:val="892A990A"/>
@@ -12001,7 +13116,7 @@
       </w:rPr>
     </w:lvl>
   </w:abstractNum>
-  <w:abstractNum w:abstractNumId="47" w15:restartNumberingAfterBreak="0">
+  <w:abstractNum w:abstractNumId="50" w15:restartNumberingAfterBreak="0">
     <w:nsid w:val="47BF2170"/>
     <w:multiLevelType w:val="multilevel"/>
     <w:tmpl w:val="D9681266"/>
@@ -12150,7 +13265,7 @@
       </w:rPr>
     </w:lvl>
   </w:abstractNum>
-  <w:abstractNum w:abstractNumId="48" w15:restartNumberingAfterBreak="0">
+  <w:abstractNum w:abstractNumId="51" w15:restartNumberingAfterBreak="0">
     <w:nsid w:val="47E5592F"/>
     <w:multiLevelType w:val="hybridMultilevel"/>
     <w:tmpl w:val="719AB9FA"/>
@@ -12263,7 +13378,7 @@
       </w:rPr>
     </w:lvl>
   </w:abstractNum>
-  <w:abstractNum w:abstractNumId="49" w15:restartNumberingAfterBreak="0">
+  <w:abstractNum w:abstractNumId="52" w15:restartNumberingAfterBreak="0">
     <w:nsid w:val="48C041A9"/>
     <w:multiLevelType w:val="multilevel"/>
     <w:tmpl w:val="59A694BC"/>
@@ -12412,7 +13527,7 @@
       </w:rPr>
     </w:lvl>
   </w:abstractNum>
-  <w:abstractNum w:abstractNumId="50" w15:restartNumberingAfterBreak="0">
+  <w:abstractNum w:abstractNumId="53" w15:restartNumberingAfterBreak="0">
     <w:nsid w:val="4AF73293"/>
     <w:multiLevelType w:val="hybridMultilevel"/>
     <w:tmpl w:val="F2962738"/>
@@ -12525,7 +13640,7 @@
       </w:rPr>
     </w:lvl>
   </w:abstractNum>
-  <w:abstractNum w:abstractNumId="51" w15:restartNumberingAfterBreak="0">
+  <w:abstractNum w:abstractNumId="54" w15:restartNumberingAfterBreak="0">
     <w:nsid w:val="4B375248"/>
     <w:multiLevelType w:val="multilevel"/>
     <w:tmpl w:val="B574C1C6"/>
@@ -12674,7 +13789,7 @@
       </w:rPr>
     </w:lvl>
   </w:abstractNum>
-  <w:abstractNum w:abstractNumId="52" w15:restartNumberingAfterBreak="0">
+  <w:abstractNum w:abstractNumId="55" w15:restartNumberingAfterBreak="0">
     <w:nsid w:val="4BA13766"/>
     <w:multiLevelType w:val="multilevel"/>
     <w:tmpl w:val="63F4E6F0"/>
@@ -12823,7 +13938,7 @@
       </w:rPr>
     </w:lvl>
   </w:abstractNum>
-  <w:abstractNum w:abstractNumId="53" w15:restartNumberingAfterBreak="0">
+  <w:abstractNum w:abstractNumId="56" w15:restartNumberingAfterBreak="0">
     <w:nsid w:val="4BA25441"/>
     <w:multiLevelType w:val="hybridMultilevel"/>
     <w:tmpl w:val="217E2E96"/>
@@ -12936,7 +14051,7 @@
       </w:rPr>
     </w:lvl>
   </w:abstractNum>
-  <w:abstractNum w:abstractNumId="54" w15:restartNumberingAfterBreak="0">
+  <w:abstractNum w:abstractNumId="57" w15:restartNumberingAfterBreak="0">
     <w:nsid w:val="4E276DCB"/>
     <w:multiLevelType w:val="hybridMultilevel"/>
     <w:tmpl w:val="B7C469B4"/>
@@ -13049,7 +14164,7 @@
       </w:rPr>
     </w:lvl>
   </w:abstractNum>
-  <w:abstractNum w:abstractNumId="55" w15:restartNumberingAfterBreak="0">
+  <w:abstractNum w:abstractNumId="58" w15:restartNumberingAfterBreak="0">
     <w:nsid w:val="4F053929"/>
     <w:multiLevelType w:val="hybridMultilevel"/>
     <w:tmpl w:val="2A78C678"/>
@@ -13162,7 +14277,7 @@
       </w:rPr>
     </w:lvl>
   </w:abstractNum>
-  <w:abstractNum w:abstractNumId="56" w15:restartNumberingAfterBreak="0">
+  <w:abstractNum w:abstractNumId="59" w15:restartNumberingAfterBreak="0">
     <w:nsid w:val="4FFB237E"/>
     <w:multiLevelType w:val="multilevel"/>
     <w:tmpl w:val="2AA67CDA"/>
@@ -13311,7 +14426,7 @@
       </w:rPr>
     </w:lvl>
   </w:abstractNum>
-  <w:abstractNum w:abstractNumId="57" w15:restartNumberingAfterBreak="0">
+  <w:abstractNum w:abstractNumId="60" w15:restartNumberingAfterBreak="0">
     <w:nsid w:val="51737FE0"/>
     <w:multiLevelType w:val="hybridMultilevel"/>
     <w:tmpl w:val="2B0604E6"/>
@@ -13424,7 +14539,7 @@
       </w:rPr>
     </w:lvl>
   </w:abstractNum>
-  <w:abstractNum w:abstractNumId="58" w15:restartNumberingAfterBreak="0">
+  <w:abstractNum w:abstractNumId="61" w15:restartNumberingAfterBreak="0">
     <w:nsid w:val="51A86EF8"/>
     <w:multiLevelType w:val="multilevel"/>
     <w:tmpl w:val="FF2841D4"/>
@@ -13573,7 +14688,7 @@
       </w:rPr>
     </w:lvl>
   </w:abstractNum>
-  <w:abstractNum w:abstractNumId="59" w15:restartNumberingAfterBreak="0">
+  <w:abstractNum w:abstractNumId="62" w15:restartNumberingAfterBreak="0">
     <w:nsid w:val="521378FF"/>
     <w:multiLevelType w:val="multilevel"/>
     <w:tmpl w:val="7B002268"/>
@@ -13722,7 +14837,7 @@
       </w:rPr>
     </w:lvl>
   </w:abstractNum>
-  <w:abstractNum w:abstractNumId="60" w15:restartNumberingAfterBreak="0">
+  <w:abstractNum w:abstractNumId="63" w15:restartNumberingAfterBreak="0">
     <w:nsid w:val="521F2792"/>
     <w:multiLevelType w:val="multilevel"/>
     <w:tmpl w:val="9FB45386"/>
@@ -13871,7 +14986,7 @@
       </w:rPr>
     </w:lvl>
   </w:abstractNum>
-  <w:abstractNum w:abstractNumId="61" w15:restartNumberingAfterBreak="0">
+  <w:abstractNum w:abstractNumId="64" w15:restartNumberingAfterBreak="0">
     <w:nsid w:val="53390911"/>
     <w:multiLevelType w:val="multilevel"/>
     <w:tmpl w:val="1C380F12"/>
@@ -14020,7 +15135,7 @@
       </w:rPr>
     </w:lvl>
   </w:abstractNum>
-  <w:abstractNum w:abstractNumId="62" w15:restartNumberingAfterBreak="0">
+  <w:abstractNum w:abstractNumId="65" w15:restartNumberingAfterBreak="0">
     <w:nsid w:val="53CD23AC"/>
     <w:multiLevelType w:val="multilevel"/>
     <w:tmpl w:val="57BAE8F0"/>
@@ -14169,7 +15284,7 @@
       </w:rPr>
     </w:lvl>
   </w:abstractNum>
-  <w:abstractNum w:abstractNumId="63" w15:restartNumberingAfterBreak="0">
+  <w:abstractNum w:abstractNumId="66" w15:restartNumberingAfterBreak="0">
     <w:nsid w:val="5462791F"/>
     <w:multiLevelType w:val="hybridMultilevel"/>
     <w:tmpl w:val="FDE24C26"/>
@@ -14282,7 +15397,7 @@
       </w:rPr>
     </w:lvl>
   </w:abstractNum>
-  <w:abstractNum w:abstractNumId="64" w15:restartNumberingAfterBreak="0">
+  <w:abstractNum w:abstractNumId="67" w15:restartNumberingAfterBreak="0">
     <w:nsid w:val="547005EB"/>
     <w:multiLevelType w:val="multilevel"/>
     <w:tmpl w:val="F260CC5C"/>
@@ -14431,7 +15546,7 @@
       </w:rPr>
     </w:lvl>
   </w:abstractNum>
-  <w:abstractNum w:abstractNumId="65" w15:restartNumberingAfterBreak="0">
+  <w:abstractNum w:abstractNumId="68" w15:restartNumberingAfterBreak="0">
     <w:nsid w:val="58034221"/>
     <w:multiLevelType w:val="hybridMultilevel"/>
     <w:tmpl w:val="65D0619C"/>
@@ -14544,7 +15659,7 @@
       </w:rPr>
     </w:lvl>
   </w:abstractNum>
-  <w:abstractNum w:abstractNumId="66" w15:restartNumberingAfterBreak="0">
+  <w:abstractNum w:abstractNumId="69" w15:restartNumberingAfterBreak="0">
     <w:nsid w:val="5A460390"/>
     <w:multiLevelType w:val="hybridMultilevel"/>
     <w:tmpl w:val="BD8E939C"/>
@@ -14657,7 +15772,7 @@
       </w:rPr>
     </w:lvl>
   </w:abstractNum>
-  <w:abstractNum w:abstractNumId="67" w15:restartNumberingAfterBreak="0">
+  <w:abstractNum w:abstractNumId="70" w15:restartNumberingAfterBreak="0">
     <w:nsid w:val="5CEE630B"/>
     <w:multiLevelType w:val="hybridMultilevel"/>
     <w:tmpl w:val="DE8E8DBA"/>
@@ -14770,7 +15885,7 @@
       </w:rPr>
     </w:lvl>
   </w:abstractNum>
-  <w:abstractNum w:abstractNumId="68" w15:restartNumberingAfterBreak="0">
+  <w:abstractNum w:abstractNumId="71" w15:restartNumberingAfterBreak="0">
     <w:nsid w:val="5D5A183C"/>
     <w:multiLevelType w:val="multilevel"/>
     <w:tmpl w:val="C804C34A"/>
@@ -14919,7 +16034,156 @@
       </w:rPr>
     </w:lvl>
   </w:abstractNum>
-  <w:abstractNum w:abstractNumId="69" w15:restartNumberingAfterBreak="0">
+  <w:abstractNum w:abstractNumId="72" w15:restartNumberingAfterBreak="0">
+    <w:nsid w:val="5DF95194"/>
+    <w:multiLevelType w:val="multilevel"/>
+    <w:tmpl w:val="CC127E54"/>
+    <w:lvl w:ilvl="0">
+      <w:start w:val="1"/>
+      <w:numFmt w:val="bullet"/>
+      <w:lvlText w:val=""/>
+      <w:lvlJc w:val="left"/>
+      <w:pPr>
+        <w:tabs>
+          <w:tab w:val="num" w:pos="720"/>
+        </w:tabs>
+        <w:ind w:left="720" w:hanging="360"/>
+      </w:pPr>
+      <w:rPr>
+        <w:rFonts w:ascii="Symbol" w:hAnsi="Symbol" w:hint="default"/>
+        <w:sz w:val="20"/>
+      </w:rPr>
+    </w:lvl>
+    <w:lvl w:ilvl="1" w:tentative="1">
+      <w:start w:val="1"/>
+      <w:numFmt w:val="bullet"/>
+      <w:lvlText w:val="o"/>
+      <w:lvlJc w:val="left"/>
+      <w:pPr>
+        <w:tabs>
+          <w:tab w:val="num" w:pos="1440"/>
+        </w:tabs>
+        <w:ind w:left="1440" w:hanging="360"/>
+      </w:pPr>
+      <w:rPr>
+        <w:rFonts w:ascii="Courier New" w:hAnsi="Courier New" w:hint="default"/>
+        <w:sz w:val="20"/>
+      </w:rPr>
+    </w:lvl>
+    <w:lvl w:ilvl="2" w:tentative="1">
+      <w:start w:val="1"/>
+      <w:numFmt w:val="bullet"/>
+      <w:lvlText w:val=""/>
+      <w:lvlJc w:val="left"/>
+      <w:pPr>
+        <w:tabs>
+          <w:tab w:val="num" w:pos="2160"/>
+        </w:tabs>
+        <w:ind w:left="2160" w:hanging="360"/>
+      </w:pPr>
+      <w:rPr>
+        <w:rFonts w:ascii="Wingdings" w:hAnsi="Wingdings" w:hint="default"/>
+        <w:sz w:val="20"/>
+      </w:rPr>
+    </w:lvl>
+    <w:lvl w:ilvl="3" w:tentative="1">
+      <w:start w:val="1"/>
+      <w:numFmt w:val="bullet"/>
+      <w:lvlText w:val=""/>
+      <w:lvlJc w:val="left"/>
+      <w:pPr>
+        <w:tabs>
+          <w:tab w:val="num" w:pos="2880"/>
+        </w:tabs>
+        <w:ind w:left="2880" w:hanging="360"/>
+      </w:pPr>
+      <w:rPr>
+        <w:rFonts w:ascii="Wingdings" w:hAnsi="Wingdings" w:hint="default"/>
+        <w:sz w:val="20"/>
+      </w:rPr>
+    </w:lvl>
+    <w:lvl w:ilvl="4" w:tentative="1">
+      <w:start w:val="1"/>
+      <w:numFmt w:val="bullet"/>
+      <w:lvlText w:val=""/>
+      <w:lvlJc w:val="left"/>
+      <w:pPr>
+        <w:tabs>
+          <w:tab w:val="num" w:pos="3600"/>
+        </w:tabs>
+        <w:ind w:left="3600" w:hanging="360"/>
+      </w:pPr>
+      <w:rPr>
+        <w:rFonts w:ascii="Wingdings" w:hAnsi="Wingdings" w:hint="default"/>
+        <w:sz w:val="20"/>
+      </w:rPr>
+    </w:lvl>
+    <w:lvl w:ilvl="5" w:tentative="1">
+      <w:start w:val="1"/>
+      <w:numFmt w:val="bullet"/>
+      <w:lvlText w:val=""/>
+      <w:lvlJc w:val="left"/>
+      <w:pPr>
+        <w:tabs>
+          <w:tab w:val="num" w:pos="4320"/>
+        </w:tabs>
+        <w:ind w:left="4320" w:hanging="360"/>
+      </w:pPr>
+      <w:rPr>
+        <w:rFonts w:ascii="Wingdings" w:hAnsi="Wingdings" w:hint="default"/>
+        <w:sz w:val="20"/>
+      </w:rPr>
+    </w:lvl>
+    <w:lvl w:ilvl="6" w:tentative="1">
+      <w:start w:val="1"/>
+      <w:numFmt w:val="bullet"/>
+      <w:lvlText w:val=""/>
+      <w:lvlJc w:val="left"/>
+      <w:pPr>
+        <w:tabs>
+          <w:tab w:val="num" w:pos="5040"/>
+        </w:tabs>
+        <w:ind w:left="5040" w:hanging="360"/>
+      </w:pPr>
+      <w:rPr>
+        <w:rFonts w:ascii="Wingdings" w:hAnsi="Wingdings" w:hint="default"/>
+        <w:sz w:val="20"/>
+      </w:rPr>
+    </w:lvl>
+    <w:lvl w:ilvl="7" w:tentative="1">
+      <w:start w:val="1"/>
+      <w:numFmt w:val="bullet"/>
+      <w:lvlText w:val=""/>
+      <w:lvlJc w:val="left"/>
+      <w:pPr>
+        <w:tabs>
+          <w:tab w:val="num" w:pos="5760"/>
+        </w:tabs>
+        <w:ind w:left="5760" w:hanging="360"/>
+      </w:pPr>
+      <w:rPr>
+        <w:rFonts w:ascii="Wingdings" w:hAnsi="Wingdings" w:hint="default"/>
+        <w:sz w:val="20"/>
+      </w:rPr>
+    </w:lvl>
+    <w:lvl w:ilvl="8" w:tentative="1">
+      <w:start w:val="1"/>
+      <w:numFmt w:val="bullet"/>
+      <w:lvlText w:val=""/>
+      <w:lvlJc w:val="left"/>
+      <w:pPr>
+        <w:tabs>
+          <w:tab w:val="num" w:pos="6480"/>
+        </w:tabs>
+        <w:ind w:left="6480" w:hanging="360"/>
+      </w:pPr>
+      <w:rPr>
+        <w:rFonts w:ascii="Wingdings" w:hAnsi="Wingdings" w:hint="default"/>
+        <w:sz w:val="20"/>
+      </w:rPr>
+    </w:lvl>
+  </w:abstractNum>
+  <w:abstractNum w:abstractNumId="73" w15:restartNumberingAfterBreak="0">
     <w:nsid w:val="5E9C452C"/>
     <w:multiLevelType w:val="multilevel"/>
     <w:tmpl w:val="B8727936"/>
@@ -15068,7 +16332,7 @@
       </w:rPr>
     </w:lvl>
   </w:abstractNum>
-  <w:abstractNum w:abstractNumId="70" w15:restartNumberingAfterBreak="0">
+  <w:abstractNum w:abstractNumId="74" w15:restartNumberingAfterBreak="0">
     <w:nsid w:val="62385AA6"/>
     <w:multiLevelType w:val="multilevel"/>
     <w:tmpl w:val="B9EAECD4"/>
@@ -15217,7 +16481,7 @@
       </w:rPr>
     </w:lvl>
   </w:abstractNum>
-  <w:abstractNum w:abstractNumId="71" w15:restartNumberingAfterBreak="0">
+  <w:abstractNum w:abstractNumId="75" w15:restartNumberingAfterBreak="0">
     <w:nsid w:val="625D686D"/>
     <w:multiLevelType w:val="multilevel"/>
     <w:tmpl w:val="BC1C2048"/>
@@ -15366,7 +16630,7 @@
       </w:rPr>
     </w:lvl>
   </w:abstractNum>
-  <w:abstractNum w:abstractNumId="72" w15:restartNumberingAfterBreak="0">
+  <w:abstractNum w:abstractNumId="76" w15:restartNumberingAfterBreak="0">
     <w:nsid w:val="62B46951"/>
     <w:multiLevelType w:val="hybridMultilevel"/>
     <w:tmpl w:val="0FEAFEC6"/>
@@ -15479,7 +16743,7 @@
       </w:rPr>
     </w:lvl>
   </w:abstractNum>
-  <w:abstractNum w:abstractNumId="73" w15:restartNumberingAfterBreak="0">
+  <w:abstractNum w:abstractNumId="77" w15:restartNumberingAfterBreak="0">
     <w:nsid w:val="647819E3"/>
     <w:multiLevelType w:val="multilevel"/>
     <w:tmpl w:val="ABB278BC"/>
@@ -15628,7 +16892,7 @@
       </w:rPr>
     </w:lvl>
   </w:abstractNum>
-  <w:abstractNum w:abstractNumId="74" w15:restartNumberingAfterBreak="0">
+  <w:abstractNum w:abstractNumId="78" w15:restartNumberingAfterBreak="0">
     <w:nsid w:val="64F30198"/>
     <w:multiLevelType w:val="multilevel"/>
     <w:tmpl w:val="63F4E6F0"/>
@@ -15777,7 +17041,7 @@
       </w:rPr>
     </w:lvl>
   </w:abstractNum>
-  <w:abstractNum w:abstractNumId="75" w15:restartNumberingAfterBreak="0">
+  <w:abstractNum w:abstractNumId="79" w15:restartNumberingAfterBreak="0">
     <w:nsid w:val="65314293"/>
     <w:multiLevelType w:val="hybridMultilevel"/>
     <w:tmpl w:val="6688DFAC"/>
@@ -15890,7 +17154,7 @@
       </w:rPr>
     </w:lvl>
   </w:abstractNum>
-  <w:abstractNum w:abstractNumId="76" w15:restartNumberingAfterBreak="0">
+  <w:abstractNum w:abstractNumId="80" w15:restartNumberingAfterBreak="0">
     <w:nsid w:val="65CE4D0F"/>
     <w:multiLevelType w:val="hybridMultilevel"/>
     <w:tmpl w:val="DB668538"/>
@@ -16003,7 +17267,7 @@
       </w:rPr>
     </w:lvl>
   </w:abstractNum>
-  <w:abstractNum w:abstractNumId="77" w15:restartNumberingAfterBreak="0">
+  <w:abstractNum w:abstractNumId="81" w15:restartNumberingAfterBreak="0">
     <w:nsid w:val="661C7D73"/>
     <w:multiLevelType w:val="multilevel"/>
     <w:tmpl w:val="D9681266"/>
@@ -16152,7 +17416,7 @@
       </w:rPr>
     </w:lvl>
   </w:abstractNum>
-  <w:abstractNum w:abstractNumId="78" w15:restartNumberingAfterBreak="0">
+  <w:abstractNum w:abstractNumId="82" w15:restartNumberingAfterBreak="0">
     <w:nsid w:val="68B94344"/>
     <w:multiLevelType w:val="multilevel"/>
     <w:tmpl w:val="9BA812D8"/>
@@ -16301,7 +17565,7 @@
       </w:rPr>
     </w:lvl>
   </w:abstractNum>
-  <w:abstractNum w:abstractNumId="79" w15:restartNumberingAfterBreak="0">
+  <w:abstractNum w:abstractNumId="83" w15:restartNumberingAfterBreak="0">
     <w:nsid w:val="69DE2C87"/>
     <w:multiLevelType w:val="hybridMultilevel"/>
     <w:tmpl w:val="F530F20A"/>
@@ -16414,7 +17678,7 @@
       </w:rPr>
     </w:lvl>
   </w:abstractNum>
-  <w:abstractNum w:abstractNumId="80" w15:restartNumberingAfterBreak="0">
+  <w:abstractNum w:abstractNumId="84" w15:restartNumberingAfterBreak="0">
     <w:nsid w:val="69ED672D"/>
     <w:multiLevelType w:val="multilevel"/>
     <w:tmpl w:val="CC08E300"/>
@@ -16563,7 +17827,7 @@
       </w:rPr>
     </w:lvl>
   </w:abstractNum>
-  <w:abstractNum w:abstractNumId="81" w15:restartNumberingAfterBreak="0">
+  <w:abstractNum w:abstractNumId="85" w15:restartNumberingAfterBreak="0">
     <w:nsid w:val="6A063EFD"/>
     <w:multiLevelType w:val="hybridMultilevel"/>
     <w:tmpl w:val="48703FBA"/>
@@ -16676,7 +17940,7 @@
       </w:rPr>
     </w:lvl>
   </w:abstractNum>
-  <w:abstractNum w:abstractNumId="82" w15:restartNumberingAfterBreak="0">
+  <w:abstractNum w:abstractNumId="86" w15:restartNumberingAfterBreak="0">
     <w:nsid w:val="6A825ABE"/>
     <w:multiLevelType w:val="multilevel"/>
     <w:tmpl w:val="0CD6F30E"/>
@@ -16825,7 +18089,7 @@
       </w:rPr>
     </w:lvl>
   </w:abstractNum>
-  <w:abstractNum w:abstractNumId="83" w15:restartNumberingAfterBreak="0">
+  <w:abstractNum w:abstractNumId="87" w15:restartNumberingAfterBreak="0">
     <w:nsid w:val="6B1D7832"/>
     <w:multiLevelType w:val="multilevel"/>
     <w:tmpl w:val="DD4646B2"/>
@@ -16974,7 +18238,7 @@
       </w:rPr>
     </w:lvl>
   </w:abstractNum>
-  <w:abstractNum w:abstractNumId="84" w15:restartNumberingAfterBreak="0">
+  <w:abstractNum w:abstractNumId="88" w15:restartNumberingAfterBreak="0">
     <w:nsid w:val="6C6D6667"/>
     <w:multiLevelType w:val="hybridMultilevel"/>
     <w:tmpl w:val="A744709C"/>
@@ -17087,7 +18351,7 @@
       </w:rPr>
     </w:lvl>
   </w:abstractNum>
-  <w:abstractNum w:abstractNumId="85" w15:restartNumberingAfterBreak="0">
+  <w:abstractNum w:abstractNumId="89" w15:restartNumberingAfterBreak="0">
     <w:nsid w:val="6CAD7EA5"/>
     <w:multiLevelType w:val="multilevel"/>
     <w:tmpl w:val="C472C5B0"/>
@@ -17236,7 +18500,7 @@
       </w:rPr>
     </w:lvl>
   </w:abstractNum>
-  <w:abstractNum w:abstractNumId="86" w15:restartNumberingAfterBreak="0">
+  <w:abstractNum w:abstractNumId="90" w15:restartNumberingAfterBreak="0">
     <w:nsid w:val="6E43557B"/>
     <w:multiLevelType w:val="multilevel"/>
     <w:tmpl w:val="323C7112"/>
@@ -17385,7 +18649,7 @@
       </w:rPr>
     </w:lvl>
   </w:abstractNum>
-  <w:abstractNum w:abstractNumId="87" w15:restartNumberingAfterBreak="0">
+  <w:abstractNum w:abstractNumId="91" w15:restartNumberingAfterBreak="0">
     <w:nsid w:val="6EA27D0A"/>
     <w:multiLevelType w:val="multilevel"/>
     <w:tmpl w:val="7BF0256C"/>
@@ -17534,7 +18798,7 @@
       </w:rPr>
     </w:lvl>
   </w:abstractNum>
-  <w:abstractNum w:abstractNumId="88" w15:restartNumberingAfterBreak="0">
+  <w:abstractNum w:abstractNumId="92" w15:restartNumberingAfterBreak="0">
     <w:nsid w:val="6EF86273"/>
     <w:multiLevelType w:val="multilevel"/>
     <w:tmpl w:val="2AA67CDA"/>
@@ -17683,7 +18947,7 @@
       </w:rPr>
     </w:lvl>
   </w:abstractNum>
-  <w:abstractNum w:abstractNumId="89" w15:restartNumberingAfterBreak="0">
+  <w:abstractNum w:abstractNumId="93" w15:restartNumberingAfterBreak="0">
     <w:nsid w:val="70874300"/>
     <w:multiLevelType w:val="hybridMultilevel"/>
     <w:tmpl w:val="1B3A0518"/>
@@ -17796,7 +19060,7 @@
       </w:rPr>
     </w:lvl>
   </w:abstractNum>
-  <w:abstractNum w:abstractNumId="90" w15:restartNumberingAfterBreak="0">
+  <w:abstractNum w:abstractNumId="94" w15:restartNumberingAfterBreak="0">
     <w:nsid w:val="7090251B"/>
     <w:multiLevelType w:val="hybridMultilevel"/>
     <w:tmpl w:val="67687EFE"/>
@@ -17909,7 +19173,7 @@
       </w:rPr>
     </w:lvl>
   </w:abstractNum>
-  <w:abstractNum w:abstractNumId="91" w15:restartNumberingAfterBreak="0">
+  <w:abstractNum w:abstractNumId="95" w15:restartNumberingAfterBreak="0">
     <w:nsid w:val="75144C65"/>
     <w:multiLevelType w:val="hybridMultilevel"/>
     <w:tmpl w:val="12127FAA"/>
@@ -18022,7 +19286,7 @@
       </w:rPr>
     </w:lvl>
   </w:abstractNum>
-  <w:abstractNum w:abstractNumId="92" w15:restartNumberingAfterBreak="0">
+  <w:abstractNum w:abstractNumId="96" w15:restartNumberingAfterBreak="0">
     <w:nsid w:val="75237F84"/>
     <w:multiLevelType w:val="hybridMultilevel"/>
     <w:tmpl w:val="5F0A6EF2"/>
@@ -18135,7 +19399,7 @@
       </w:rPr>
     </w:lvl>
   </w:abstractNum>
-  <w:abstractNum w:abstractNumId="93" w15:restartNumberingAfterBreak="0">
+  <w:abstractNum w:abstractNumId="97" w15:restartNumberingAfterBreak="0">
     <w:nsid w:val="75FF09B0"/>
     <w:multiLevelType w:val="multilevel"/>
     <w:tmpl w:val="C34A7734"/>
@@ -18284,7 +19548,7 @@
       </w:rPr>
     </w:lvl>
   </w:abstractNum>
-  <w:abstractNum w:abstractNumId="94" w15:restartNumberingAfterBreak="0">
+  <w:abstractNum w:abstractNumId="98" w15:restartNumberingAfterBreak="0">
     <w:nsid w:val="77960362"/>
     <w:multiLevelType w:val="multilevel"/>
     <w:tmpl w:val="FEA0022E"/>
@@ -18433,7 +19697,7 @@
       </w:rPr>
     </w:lvl>
   </w:abstractNum>
-  <w:abstractNum w:abstractNumId="95" w15:restartNumberingAfterBreak="0">
+  <w:abstractNum w:abstractNumId="99" w15:restartNumberingAfterBreak="0">
     <w:nsid w:val="785A644F"/>
     <w:multiLevelType w:val="multilevel"/>
     <w:tmpl w:val="D1DC60FE"/>
@@ -18582,7 +19846,7 @@
       </w:rPr>
     </w:lvl>
   </w:abstractNum>
-  <w:abstractNum w:abstractNumId="96" w15:restartNumberingAfterBreak="0">
+  <w:abstractNum w:abstractNumId="100" w15:restartNumberingAfterBreak="0">
     <w:nsid w:val="7BFA03DF"/>
     <w:multiLevelType w:val="hybridMultilevel"/>
     <w:tmpl w:val="536A979E"/>
@@ -18695,7 +19959,7 @@
       </w:rPr>
     </w:lvl>
   </w:abstractNum>
-  <w:abstractNum w:abstractNumId="97" w15:restartNumberingAfterBreak="0">
+  <w:abstractNum w:abstractNumId="101" w15:restartNumberingAfterBreak="0">
     <w:nsid w:val="7CA524B4"/>
     <w:multiLevelType w:val="hybridMultilevel"/>
     <w:tmpl w:val="957C4F4A"/>
@@ -18808,7 +20072,7 @@
       </w:rPr>
     </w:lvl>
   </w:abstractNum>
-  <w:abstractNum w:abstractNumId="98" w15:restartNumberingAfterBreak="0">
+  <w:abstractNum w:abstractNumId="102" w15:restartNumberingAfterBreak="0">
     <w:nsid w:val="7EBD7710"/>
     <w:multiLevelType w:val="hybridMultilevel"/>
     <w:tmpl w:val="C8C6F7A0"/>
@@ -18922,79 +20186,79 @@
     </w:lvl>
   </w:abstractNum>
   <w:num w:numId="1" w16cid:durableId="425157302">
-    <w:abstractNumId w:val="42"/>
+    <w:abstractNumId w:val="43"/>
   </w:num>
   <w:num w:numId="2" w16cid:durableId="967664612">
-    <w:abstractNumId w:val="74"/>
+    <w:abstractNumId w:val="78"/>
   </w:num>
   <w:num w:numId="3" w16cid:durableId="361631616">
-    <w:abstractNumId w:val="52"/>
+    <w:abstractNumId w:val="55"/>
   </w:num>
   <w:num w:numId="4" w16cid:durableId="1409575397">
-    <w:abstractNumId w:val="63"/>
+    <w:abstractNumId w:val="66"/>
   </w:num>
   <w:num w:numId="5" w16cid:durableId="1647204897">
-    <w:abstractNumId w:val="97"/>
+    <w:abstractNumId w:val="101"/>
   </w:num>
   <w:num w:numId="6" w16cid:durableId="682589869">
     <w:abstractNumId w:val="18"/>
   </w:num>
   <w:num w:numId="7" w16cid:durableId="679703478">
-    <w:abstractNumId w:val="79"/>
+    <w:abstractNumId w:val="83"/>
   </w:num>
   <w:num w:numId="8" w16cid:durableId="496455128">
-    <w:abstractNumId w:val="37"/>
+    <w:abstractNumId w:val="38"/>
   </w:num>
   <w:num w:numId="9" w16cid:durableId="1184633094">
-    <w:abstractNumId w:val="46"/>
+    <w:abstractNumId w:val="49"/>
   </w:num>
   <w:num w:numId="10" w16cid:durableId="71507387">
-    <w:abstractNumId w:val="50"/>
+    <w:abstractNumId w:val="53"/>
   </w:num>
   <w:num w:numId="11" w16cid:durableId="1412503779">
-    <w:abstractNumId w:val="81"/>
+    <w:abstractNumId w:val="85"/>
   </w:num>
   <w:num w:numId="12" w16cid:durableId="1107113995">
-    <w:abstractNumId w:val="38"/>
+    <w:abstractNumId w:val="39"/>
   </w:num>
   <w:num w:numId="13" w16cid:durableId="2011055922">
     <w:abstractNumId w:val="19"/>
   </w:num>
   <w:num w:numId="14" w16cid:durableId="1529222885">
-    <w:abstractNumId w:val="96"/>
+    <w:abstractNumId w:val="100"/>
   </w:num>
   <w:num w:numId="15" w16cid:durableId="836580755">
     <w:abstractNumId w:val="13"/>
   </w:num>
   <w:num w:numId="16" w16cid:durableId="1344674502">
-    <w:abstractNumId w:val="66"/>
+    <w:abstractNumId w:val="69"/>
   </w:num>
   <w:num w:numId="17" w16cid:durableId="1320882603">
-    <w:abstractNumId w:val="89"/>
+    <w:abstractNumId w:val="93"/>
   </w:num>
   <w:num w:numId="18" w16cid:durableId="1139028372">
-    <w:abstractNumId w:val="39"/>
+    <w:abstractNumId w:val="40"/>
   </w:num>
   <w:num w:numId="19" w16cid:durableId="1525635473">
-    <w:abstractNumId w:val="72"/>
+    <w:abstractNumId w:val="76"/>
   </w:num>
   <w:num w:numId="20" w16cid:durableId="609623515">
-    <w:abstractNumId w:val="98"/>
+    <w:abstractNumId w:val="102"/>
   </w:num>
   <w:num w:numId="21" w16cid:durableId="165170997">
-    <w:abstractNumId w:val="84"/>
+    <w:abstractNumId w:val="88"/>
   </w:num>
   <w:num w:numId="22" w16cid:durableId="1620525290">
-    <w:abstractNumId w:val="24"/>
+    <w:abstractNumId w:val="25"/>
   </w:num>
   <w:num w:numId="23" w16cid:durableId="400753109">
-    <w:abstractNumId w:val="91"/>
+    <w:abstractNumId w:val="95"/>
   </w:num>
   <w:num w:numId="24" w16cid:durableId="193882219">
     <w:abstractNumId w:val="4"/>
   </w:num>
   <w:num w:numId="25" w16cid:durableId="311981628">
-    <w:abstractNumId w:val="43"/>
+    <w:abstractNumId w:val="44"/>
   </w:num>
   <w:num w:numId="26" w16cid:durableId="2009166045">
     <w:abstractNumId w:val="12"/>
@@ -19006,13 +20270,13 @@
     <w:abstractNumId w:val="14"/>
   </w:num>
   <w:num w:numId="29" w16cid:durableId="2124693280">
-    <w:abstractNumId w:val="76"/>
+    <w:abstractNumId w:val="80"/>
   </w:num>
   <w:num w:numId="30" w16cid:durableId="1367099744">
-    <w:abstractNumId w:val="29"/>
+    <w:abstractNumId w:val="30"/>
   </w:num>
   <w:num w:numId="31" w16cid:durableId="2011105642">
-    <w:abstractNumId w:val="67"/>
+    <w:abstractNumId w:val="70"/>
   </w:num>
   <w:num w:numId="32" w16cid:durableId="831995364">
     <w:abstractNumId w:val="22"/>
@@ -19030,7 +20294,7 @@
     <w:abstractNumId w:val="2"/>
   </w:num>
   <w:num w:numId="37" w16cid:durableId="1849755457">
-    <w:abstractNumId w:val="92"/>
+    <w:abstractNumId w:val="96"/>
   </w:num>
   <w:num w:numId="38" w16cid:durableId="516505904">
     <w:abstractNumId w:val="11"/>
@@ -19039,85 +20303,85 @@
     <w:abstractNumId w:val="15"/>
   </w:num>
   <w:num w:numId="40" w16cid:durableId="905338697">
-    <w:abstractNumId w:val="54"/>
+    <w:abstractNumId w:val="57"/>
   </w:num>
   <w:num w:numId="41" w16cid:durableId="501896635">
-    <w:abstractNumId w:val="40"/>
+    <w:abstractNumId w:val="41"/>
   </w:num>
   <w:num w:numId="42" w16cid:durableId="1953435156">
-    <w:abstractNumId w:val="55"/>
+    <w:abstractNumId w:val="58"/>
   </w:num>
   <w:num w:numId="43" w16cid:durableId="1060447452">
-    <w:abstractNumId w:val="65"/>
+    <w:abstractNumId w:val="68"/>
   </w:num>
   <w:num w:numId="44" w16cid:durableId="1772503672">
-    <w:abstractNumId w:val="48"/>
+    <w:abstractNumId w:val="51"/>
   </w:num>
   <w:num w:numId="45" w16cid:durableId="1650330222">
-    <w:abstractNumId w:val="53"/>
+    <w:abstractNumId w:val="56"/>
   </w:num>
   <w:num w:numId="46" w16cid:durableId="2102337934">
-    <w:abstractNumId w:val="23"/>
+    <w:abstractNumId w:val="24"/>
   </w:num>
   <w:num w:numId="47" w16cid:durableId="68767822">
-    <w:abstractNumId w:val="82"/>
+    <w:abstractNumId w:val="86"/>
   </w:num>
   <w:num w:numId="48" w16cid:durableId="1992058265">
     <w:abstractNumId w:val="5"/>
   </w:num>
   <w:num w:numId="49" w16cid:durableId="788475134">
-    <w:abstractNumId w:val="95"/>
+    <w:abstractNumId w:val="99"/>
   </w:num>
   <w:num w:numId="50" w16cid:durableId="224419455">
-    <w:abstractNumId w:val="87"/>
+    <w:abstractNumId w:val="91"/>
   </w:num>
   <w:num w:numId="51" w16cid:durableId="1699575947">
-    <w:abstractNumId w:val="71"/>
+    <w:abstractNumId w:val="75"/>
   </w:num>
   <w:num w:numId="52" w16cid:durableId="1048916239">
+    <w:abstractNumId w:val="47"/>
+  </w:num>
+  <w:num w:numId="53" w16cid:durableId="1188711211">
+    <w:abstractNumId w:val="97"/>
+  </w:num>
+  <w:num w:numId="54" w16cid:durableId="447555614">
+    <w:abstractNumId w:val="77"/>
+  </w:num>
+  <w:num w:numId="55" w16cid:durableId="1679307268">
     <w:abstractNumId w:val="45"/>
   </w:num>
-  <w:num w:numId="53" w16cid:durableId="1188711211">
-    <w:abstractNumId w:val="93"/>
-  </w:num>
-  <w:num w:numId="54" w16cid:durableId="447555614">
-    <w:abstractNumId w:val="73"/>
-  </w:num>
-  <w:num w:numId="55" w16cid:durableId="1679307268">
-    <w:abstractNumId w:val="44"/>
-  </w:num>
   <w:num w:numId="56" w16cid:durableId="693773591">
-    <w:abstractNumId w:val="86"/>
+    <w:abstractNumId w:val="90"/>
   </w:num>
   <w:num w:numId="57" w16cid:durableId="1110473324">
-    <w:abstractNumId w:val="31"/>
+    <w:abstractNumId w:val="32"/>
   </w:num>
   <w:num w:numId="58" w16cid:durableId="842937968">
-    <w:abstractNumId w:val="51"/>
+    <w:abstractNumId w:val="54"/>
   </w:num>
   <w:num w:numId="59" w16cid:durableId="821121315">
+    <w:abstractNumId w:val="37"/>
+  </w:num>
+  <w:num w:numId="60" w16cid:durableId="2095394549">
+    <w:abstractNumId w:val="98"/>
+  </w:num>
+  <w:num w:numId="61" w16cid:durableId="1299921011">
     <w:abstractNumId w:val="36"/>
   </w:num>
-  <w:num w:numId="60" w16cid:durableId="2095394549">
-    <w:abstractNumId w:val="94"/>
-  </w:num>
-  <w:num w:numId="61" w16cid:durableId="1299921011">
-    <w:abstractNumId w:val="35"/>
-  </w:num>
   <w:num w:numId="62" w16cid:durableId="1927420240">
-    <w:abstractNumId w:val="58"/>
+    <w:abstractNumId w:val="61"/>
   </w:num>
   <w:num w:numId="63" w16cid:durableId="41290043">
-    <w:abstractNumId w:val="62"/>
+    <w:abstractNumId w:val="65"/>
   </w:num>
   <w:num w:numId="64" w16cid:durableId="999846909">
-    <w:abstractNumId w:val="49"/>
+    <w:abstractNumId w:val="52"/>
   </w:num>
   <w:num w:numId="65" w16cid:durableId="1250969563">
-    <w:abstractNumId w:val="57"/>
+    <w:abstractNumId w:val="60"/>
   </w:num>
   <w:num w:numId="66" w16cid:durableId="484011382">
-    <w:abstractNumId w:val="80"/>
+    <w:abstractNumId w:val="84"/>
   </w:num>
   <w:num w:numId="67" w16cid:durableId="2008289242">
     <w:abstractNumId w:val="9"/>
@@ -19126,97 +20390,109 @@
     <w:abstractNumId w:val="16"/>
   </w:num>
   <w:num w:numId="69" w16cid:durableId="1296839887">
-    <w:abstractNumId w:val="61"/>
+    <w:abstractNumId w:val="64"/>
   </w:num>
   <w:num w:numId="70" w16cid:durableId="336662050">
-    <w:abstractNumId w:val="70"/>
+    <w:abstractNumId w:val="74"/>
   </w:num>
   <w:num w:numId="71" w16cid:durableId="1460032333">
-    <w:abstractNumId w:val="85"/>
+    <w:abstractNumId w:val="89"/>
   </w:num>
   <w:num w:numId="72" w16cid:durableId="592400615">
     <w:abstractNumId w:val="7"/>
   </w:num>
   <w:num w:numId="73" w16cid:durableId="1879049234">
-    <w:abstractNumId w:val="28"/>
+    <w:abstractNumId w:val="29"/>
   </w:num>
   <w:num w:numId="74" w16cid:durableId="1747679558">
-    <w:abstractNumId w:val="32"/>
+    <w:abstractNumId w:val="33"/>
   </w:num>
   <w:num w:numId="75" w16cid:durableId="55278029">
-    <w:abstractNumId w:val="25"/>
+    <w:abstractNumId w:val="26"/>
   </w:num>
   <w:num w:numId="76" w16cid:durableId="1032193382">
-    <w:abstractNumId w:val="26"/>
+    <w:abstractNumId w:val="27"/>
   </w:num>
   <w:num w:numId="77" w16cid:durableId="763109604">
-    <w:abstractNumId w:val="64"/>
+    <w:abstractNumId w:val="67"/>
   </w:num>
   <w:num w:numId="78" w16cid:durableId="2138137265">
-    <w:abstractNumId w:val="75"/>
+    <w:abstractNumId w:val="79"/>
   </w:num>
   <w:num w:numId="79" w16cid:durableId="343675924">
-    <w:abstractNumId w:val="90"/>
+    <w:abstractNumId w:val="94"/>
   </w:num>
   <w:num w:numId="80" w16cid:durableId="1823277442">
-    <w:abstractNumId w:val="34"/>
+    <w:abstractNumId w:val="35"/>
   </w:num>
   <w:num w:numId="81" w16cid:durableId="1686900155">
     <w:abstractNumId w:val="0"/>
   </w:num>
   <w:num w:numId="82" w16cid:durableId="1113326280">
-    <w:abstractNumId w:val="60"/>
+    <w:abstractNumId w:val="63"/>
   </w:num>
   <w:num w:numId="83" w16cid:durableId="1253051103">
-    <w:abstractNumId w:val="83"/>
+    <w:abstractNumId w:val="87"/>
   </w:num>
   <w:num w:numId="84" w16cid:durableId="444888444">
-    <w:abstractNumId w:val="41"/>
+    <w:abstractNumId w:val="42"/>
   </w:num>
   <w:num w:numId="85" w16cid:durableId="64299649">
-    <w:abstractNumId w:val="77"/>
+    <w:abstractNumId w:val="81"/>
   </w:num>
   <w:num w:numId="86" w16cid:durableId="868182992">
-    <w:abstractNumId w:val="47"/>
+    <w:abstractNumId w:val="50"/>
   </w:num>
   <w:num w:numId="87" w16cid:durableId="896863331">
     <w:abstractNumId w:val="20"/>
   </w:num>
   <w:num w:numId="88" w16cid:durableId="505442826">
-    <w:abstractNumId w:val="78"/>
+    <w:abstractNumId w:val="82"/>
   </w:num>
   <w:num w:numId="89" w16cid:durableId="1858763908">
-    <w:abstractNumId w:val="30"/>
+    <w:abstractNumId w:val="31"/>
   </w:num>
   <w:num w:numId="90" w16cid:durableId="1896088176">
     <w:abstractNumId w:val="10"/>
   </w:num>
   <w:num w:numId="91" w16cid:durableId="1284576603">
-    <w:abstractNumId w:val="68"/>
+    <w:abstractNumId w:val="71"/>
   </w:num>
   <w:num w:numId="92" w16cid:durableId="1963075542">
     <w:abstractNumId w:val="6"/>
   </w:num>
   <w:num w:numId="93" w16cid:durableId="787627596">
-    <w:abstractNumId w:val="59"/>
+    <w:abstractNumId w:val="62"/>
   </w:num>
   <w:num w:numId="94" w16cid:durableId="2003925799">
     <w:abstractNumId w:val="8"/>
   </w:num>
   <w:num w:numId="95" w16cid:durableId="1169102579">
-    <w:abstractNumId w:val="69"/>
+    <w:abstractNumId w:val="73"/>
   </w:num>
   <w:num w:numId="96" w16cid:durableId="1216501564">
-    <w:abstractNumId w:val="27"/>
+    <w:abstractNumId w:val="28"/>
   </w:num>
   <w:num w:numId="97" w16cid:durableId="261768216">
-    <w:abstractNumId w:val="88"/>
+    <w:abstractNumId w:val="92"/>
   </w:num>
   <w:num w:numId="98" w16cid:durableId="2141918721">
-    <w:abstractNumId w:val="56"/>
+    <w:abstractNumId w:val="59"/>
   </w:num>
   <w:num w:numId="99" w16cid:durableId="905841544">
-    <w:abstractNumId w:val="33"/>
+    <w:abstractNumId w:val="34"/>
+  </w:num>
+  <w:num w:numId="100" w16cid:durableId="1753887223">
+    <w:abstractNumId w:val="72"/>
+  </w:num>
+  <w:num w:numId="101" w16cid:durableId="1320184766">
+    <w:abstractNumId w:val="23"/>
+  </w:num>
+  <w:num w:numId="102" w16cid:durableId="465127606">
+    <w:abstractNumId w:val="48"/>
+  </w:num>
+  <w:num w:numId="103" w16cid:durableId="1640451435">
+    <w:abstractNumId w:val="46"/>
   </w:num>
   <w:numIdMacAtCleanup w:val="45"/>
 </w:numbering>

</xml_diff>

<commit_message>
Analytics Insight Generation Sequence Diagram (#242)
</commit_message>
<xml_diff>
--- a/Sequence Specification Document.docx
+++ b/Sequence Specification Document.docx
@@ -6576,6 +6576,728 @@
         </w:drawing>
       </w:r>
     </w:p>
+    <w:p>
+      <w:pPr>
+        <w:tabs>
+          <w:tab w:val="left" w:pos="7455"/>
+        </w:tabs>
+      </w:pPr>
+      <w:r>
+        <w:tab/>
+      </w:r>
+    </w:p>
+    <w:p>
+      <w:pPr>
+        <w:spacing w:line="278" w:lineRule="auto"/>
+      </w:pPr>
+      <w:r>
+        <w:br w:type="page"/>
+      </w:r>
+    </w:p>
+    <w:p>
+      <w:pPr>
+        <w:pStyle w:val="Heading3"/>
+        <w:numPr>
+          <w:ilvl w:val="0"/>
+          <w:numId w:val="74"/>
+        </w:numPr>
+      </w:pPr>
+      <w:r>
+        <w:lastRenderedPageBreak/>
+        <w:t>Analytics Insight Generation Sequence</w:t>
+      </w:r>
+    </w:p>
+    <w:p>
+      <w:pPr>
+        <w:tabs>
+          <w:tab w:val="left" w:pos="7455"/>
+        </w:tabs>
+        <w:rPr>
+          <w:b/>
+          <w:bCs/>
+        </w:rPr>
+      </w:pPr>
+      <w:r>
+        <w:rPr>
+          <w:b/>
+          <w:bCs/>
+        </w:rPr>
+        <w:t>Purpose</w:t>
+      </w:r>
+    </w:p>
+    <w:p>
+      <w:pPr>
+        <w:tabs>
+          <w:tab w:val="left" w:pos="7455"/>
+        </w:tabs>
+      </w:pPr>
+      <w:r>
+        <w:t>Analytics Insight Generation Sequence Diagram illustrates the interaction between the system administrator and the analytics subsystem that is responsible for creating the operational insights in the KriGo system. This diagram describes the process of collecting the data from various repositories, analyzing the data, creating useful insights out of them, and displaying the output through the analytics dashboard.</w:t>
+      </w:r>
+    </w:p>
+    <w:p>
+      <w:pPr>
+        <w:tabs>
+          <w:tab w:val="left" w:pos="7455"/>
+        </w:tabs>
+        <w:rPr>
+          <w:b/>
+          <w:bCs/>
+        </w:rPr>
+      </w:pPr>
+      <w:r>
+        <w:rPr>
+          <w:b/>
+          <w:bCs/>
+        </w:rPr>
+        <w:t>Participating Objects</w:t>
+      </w:r>
+    </w:p>
+    <w:p>
+      <w:pPr>
+        <w:tabs>
+          <w:tab w:val="left" w:pos="7455"/>
+        </w:tabs>
+      </w:pPr>
+      <w:r>
+        <w:t>The sequence diagram includes the following participants:</w:t>
+      </w:r>
+    </w:p>
+    <w:p>
+      <w:pPr>
+        <w:pStyle w:val="ListParagraph"/>
+        <w:numPr>
+          <w:ilvl w:val="0"/>
+          <w:numId w:val="107"/>
+        </w:numPr>
+        <w:tabs>
+          <w:tab w:val="left" w:pos="7455"/>
+        </w:tabs>
+      </w:pPr>
+      <w:r>
+        <w:rPr>
+          <w:b/>
+          <w:bCs/>
+        </w:rPr>
+        <w:t>System Administrator (Actor):</w:t>
+      </w:r>
+      <w:r>
+        <w:t xml:space="preserve"> Requests analytical reports and reviews generated insights.</w:t>
+      </w:r>
+    </w:p>
+    <w:p>
+      <w:pPr>
+        <w:pStyle w:val="ListParagraph"/>
+        <w:numPr>
+          <w:ilvl w:val="0"/>
+          <w:numId w:val="107"/>
+        </w:numPr>
+        <w:tabs>
+          <w:tab w:val="left" w:pos="7455"/>
+        </w:tabs>
+      </w:pPr>
+      <w:r>
+        <w:rPr>
+          <w:b/>
+          <w:bCs/>
+        </w:rPr>
+        <w:t>AnalyticsUI (Boundary):</w:t>
+      </w:r>
+      <w:r>
+        <w:t xml:space="preserve"> Provides the interface for requesting reports, applying filters, and viewing dashboards.</w:t>
+      </w:r>
+    </w:p>
+    <w:p>
+      <w:pPr>
+        <w:pStyle w:val="ListParagraph"/>
+        <w:numPr>
+          <w:ilvl w:val="0"/>
+          <w:numId w:val="107"/>
+        </w:numPr>
+        <w:tabs>
+          <w:tab w:val="left" w:pos="7455"/>
+        </w:tabs>
+      </w:pPr>
+      <w:r>
+        <w:rPr>
+          <w:b/>
+          <w:bCs/>
+        </w:rPr>
+        <w:t>AnalyticsController (Control):</w:t>
+      </w:r>
+      <w:r>
+        <w:t xml:space="preserve"> Coordinates the analytics workflow and manages communication between system components.</w:t>
+      </w:r>
+    </w:p>
+    <w:p>
+      <w:pPr>
+        <w:pStyle w:val="ListParagraph"/>
+        <w:numPr>
+          <w:ilvl w:val="0"/>
+          <w:numId w:val="107"/>
+        </w:numPr>
+        <w:tabs>
+          <w:tab w:val="left" w:pos="7455"/>
+        </w:tabs>
+      </w:pPr>
+      <w:r>
+        <w:rPr>
+          <w:b/>
+          <w:bCs/>
+        </w:rPr>
+        <w:t>AnalyticsService (Control):</w:t>
+      </w:r>
+      <w:r>
+        <w:t xml:space="preserve"> Processes collected data and generates statistical analyses, reports, and performance insights.</w:t>
+      </w:r>
+    </w:p>
+    <w:p>
+      <w:pPr>
+        <w:pStyle w:val="ListParagraph"/>
+        <w:numPr>
+          <w:ilvl w:val="0"/>
+          <w:numId w:val="107"/>
+        </w:numPr>
+        <w:tabs>
+          <w:tab w:val="left" w:pos="7455"/>
+        </w:tabs>
+      </w:pPr>
+      <w:r>
+        <w:rPr>
+          <w:b/>
+          <w:bCs/>
+        </w:rPr>
+        <w:t>ReservationRepository (Entity):</w:t>
+      </w:r>
+      <w:r>
+        <w:t xml:space="preserve"> Supplies reservation-related data.</w:t>
+      </w:r>
+    </w:p>
+    <w:p>
+      <w:pPr>
+        <w:pStyle w:val="ListParagraph"/>
+        <w:numPr>
+          <w:ilvl w:val="0"/>
+          <w:numId w:val="107"/>
+        </w:numPr>
+        <w:tabs>
+          <w:tab w:val="left" w:pos="7455"/>
+        </w:tabs>
+      </w:pPr>
+      <w:r>
+        <w:rPr>
+          <w:b/>
+          <w:bCs/>
+        </w:rPr>
+        <w:t>PaymentRepository (Entity):</w:t>
+      </w:r>
+      <w:r>
+        <w:t xml:space="preserve"> Supplies payment and revenue information.</w:t>
+      </w:r>
+    </w:p>
+    <w:p>
+      <w:pPr>
+        <w:pStyle w:val="ListParagraph"/>
+        <w:numPr>
+          <w:ilvl w:val="0"/>
+          <w:numId w:val="107"/>
+        </w:numPr>
+        <w:tabs>
+          <w:tab w:val="left" w:pos="7455"/>
+        </w:tabs>
+      </w:pPr>
+      <w:r>
+        <w:rPr>
+          <w:b/>
+          <w:bCs/>
+        </w:rPr>
+        <w:t>VehicleRepository (Entity):</w:t>
+      </w:r>
+      <w:r>
+        <w:t xml:space="preserve"> Supplies fleet and vehicle utilization data.</w:t>
+      </w:r>
+    </w:p>
+    <w:p>
+      <w:pPr>
+        <w:pStyle w:val="ListParagraph"/>
+        <w:numPr>
+          <w:ilvl w:val="0"/>
+          <w:numId w:val="107"/>
+        </w:numPr>
+        <w:tabs>
+          <w:tab w:val="left" w:pos="7455"/>
+        </w:tabs>
+      </w:pPr>
+      <w:r>
+        <w:rPr>
+          <w:b/>
+          <w:bCs/>
+        </w:rPr>
+        <w:t>Database (Database):</w:t>
+      </w:r>
+      <w:r>
+        <w:t xml:space="preserve"> Stores reservation, payment, and vehicle records.</w:t>
+      </w:r>
+    </w:p>
+    <w:p>
+      <w:pPr>
+        <w:tabs>
+          <w:tab w:val="left" w:pos="7455"/>
+        </w:tabs>
+        <w:rPr>
+          <w:b/>
+          <w:bCs/>
+        </w:rPr>
+      </w:pPr>
+      <w:r>
+        <w:rPr>
+          <w:b/>
+          <w:bCs/>
+        </w:rPr>
+        <w:t>Analytics Generation Process</w:t>
+      </w:r>
+    </w:p>
+    <w:p>
+      <w:pPr>
+        <w:tabs>
+          <w:tab w:val="left" w:pos="7455"/>
+        </w:tabs>
+      </w:pPr>
+      <w:r>
+        <w:t>It all begins with a request being made for an analytics report by the system administrator using the Analytics UI. This request is managed by the Analytics Controller by gathering relevant data about operations from Reservation Repository, Payment Repository, and Vehicle Repository. These repositories then perform queries on the database to provide datasets to the controller. After this, the Analytics Controller sends the collected data to the Analytics Service, where it performs various analyses and creates insights such as reservations trends, income summaries, vehicle usage statistics, and many more. Finally, the insights are delivered to the Analytics Controller and displayed on the Analytics UI.</w:t>
+      </w:r>
+    </w:p>
+    <w:p>
+      <w:pPr>
+        <w:tabs>
+          <w:tab w:val="left" w:pos="7455"/>
+        </w:tabs>
+        <w:rPr>
+          <w:b/>
+          <w:bCs/>
+        </w:rPr>
+      </w:pPr>
+      <w:r>
+        <w:rPr>
+          <w:b/>
+          <w:bCs/>
+        </w:rPr>
+        <w:t>Data Analysis</w:t>
+      </w:r>
+    </w:p>
+    <w:p>
+      <w:pPr>
+        <w:tabs>
+          <w:tab w:val="left" w:pos="7455"/>
+        </w:tabs>
+      </w:pPr>
+      <w:r>
+        <w:t>The AnalyticsService processes data collected from multiple operational areas to produce meaningful business insights. Examples of generated analytics include:</w:t>
+      </w:r>
+    </w:p>
+    <w:p>
+      <w:pPr>
+        <w:pStyle w:val="ListParagraph"/>
+        <w:numPr>
+          <w:ilvl w:val="0"/>
+          <w:numId w:val="108"/>
+        </w:numPr>
+        <w:tabs>
+          <w:tab w:val="left" w:pos="7455"/>
+        </w:tabs>
+      </w:pPr>
+      <w:r>
+        <w:t>Reservation statistics and booking trends.</w:t>
+      </w:r>
+    </w:p>
+    <w:p>
+      <w:pPr>
+        <w:pStyle w:val="ListParagraph"/>
+        <w:numPr>
+          <w:ilvl w:val="0"/>
+          <w:numId w:val="108"/>
+        </w:numPr>
+        <w:tabs>
+          <w:tab w:val="left" w:pos="7455"/>
+        </w:tabs>
+      </w:pPr>
+      <w:r>
+        <w:t>Revenue and payment summaries.</w:t>
+      </w:r>
+    </w:p>
+    <w:p>
+      <w:pPr>
+        <w:pStyle w:val="ListParagraph"/>
+        <w:numPr>
+          <w:ilvl w:val="0"/>
+          <w:numId w:val="108"/>
+        </w:numPr>
+        <w:tabs>
+          <w:tab w:val="left" w:pos="7455"/>
+        </w:tabs>
+      </w:pPr>
+      <w:r>
+        <w:t>Vehicle utilization and availability rates.</w:t>
+      </w:r>
+    </w:p>
+    <w:p>
+      <w:pPr>
+        <w:pStyle w:val="ListParagraph"/>
+        <w:numPr>
+          <w:ilvl w:val="0"/>
+          <w:numId w:val="108"/>
+        </w:numPr>
+        <w:tabs>
+          <w:tab w:val="left" w:pos="7455"/>
+        </w:tabs>
+      </w:pPr>
+      <w:r>
+        <w:t>Fleet performance indicators.</w:t>
+      </w:r>
+    </w:p>
+    <w:p>
+      <w:pPr>
+        <w:pStyle w:val="ListParagraph"/>
+        <w:numPr>
+          <w:ilvl w:val="0"/>
+          <w:numId w:val="108"/>
+        </w:numPr>
+        <w:tabs>
+          <w:tab w:val="left" w:pos="7455"/>
+        </w:tabs>
+      </w:pPr>
+      <w:r>
+        <w:t>Overall platform activity metrics.</w:t>
+      </w:r>
+    </w:p>
+    <w:p>
+      <w:pPr>
+        <w:tabs>
+          <w:tab w:val="left" w:pos="7455"/>
+        </w:tabs>
+      </w:pPr>
+      <w:r>
+        <w:t>These insights assist administrators in monitoring system performance and supporting operational and strategic decisions.</w:t>
+      </w:r>
+    </w:p>
+    <w:p>
+      <w:pPr>
+        <w:spacing w:line="278" w:lineRule="auto"/>
+        <w:rPr>
+          <w:b/>
+          <w:bCs/>
+        </w:rPr>
+      </w:pPr>
+      <w:r>
+        <w:rPr>
+          <w:b/>
+          <w:bCs/>
+        </w:rPr>
+        <w:br w:type="page"/>
+      </w:r>
+    </w:p>
+    <w:p>
+      <w:pPr>
+        <w:tabs>
+          <w:tab w:val="left" w:pos="7455"/>
+        </w:tabs>
+        <w:rPr>
+          <w:b/>
+          <w:bCs/>
+        </w:rPr>
+      </w:pPr>
+      <w:r>
+        <w:rPr>
+          <w:b/>
+          <w:bCs/>
+        </w:rPr>
+        <w:lastRenderedPageBreak/>
+        <w:t>Filtered Analytics</w:t>
+      </w:r>
+    </w:p>
+    <w:p>
+      <w:pPr>
+        <w:tabs>
+          <w:tab w:val="left" w:pos="7455"/>
+        </w:tabs>
+      </w:pPr>
+      <w:r>
+        <w:t>Furthermore, the sequence diagram also captures the process of applying filter options on the analytics report. This is done by defining criteria, such as date range, vehicle types, branches, or any other reporting criteria. This request is then forwarded by the AnalyticsController to the AnalyticsService, and the new insights related to the selected criteria are returned.</w:t>
+      </w:r>
+    </w:p>
+    <w:p>
+      <w:pPr>
+        <w:tabs>
+          <w:tab w:val="left" w:pos="7455"/>
+        </w:tabs>
+        <w:rPr>
+          <w:b/>
+          <w:bCs/>
+        </w:rPr>
+      </w:pPr>
+      <w:r>
+        <w:rPr>
+          <w:b/>
+          <w:bCs/>
+        </w:rPr>
+        <w:t>No Data Available</w:t>
+      </w:r>
+    </w:p>
+    <w:p>
+      <w:pPr>
+        <w:tabs>
+          <w:tab w:val="left" w:pos="7455"/>
+        </w:tabs>
+      </w:pPr>
+      <w:r>
+        <w:t>The diagram includes an alternative scenario in which insufficient data exists to generate meaningful analytics. In this case, the AnalyticsService returns an empty dataset, and the system informs the administrator that no analytics are available for the selected criteria.</w:t>
+      </w:r>
+    </w:p>
+    <w:p>
+      <w:pPr>
+        <w:tabs>
+          <w:tab w:val="left" w:pos="7455"/>
+        </w:tabs>
+        <w:rPr>
+          <w:b/>
+          <w:bCs/>
+        </w:rPr>
+      </w:pPr>
+      <w:r>
+        <w:rPr>
+          <w:b/>
+          <w:bCs/>
+        </w:rPr>
+        <w:t>Alternative and Exceptional Flows</w:t>
+      </w:r>
+    </w:p>
+    <w:p>
+      <w:pPr>
+        <w:tabs>
+          <w:tab w:val="left" w:pos="7455"/>
+        </w:tabs>
+      </w:pPr>
+      <w:r>
+        <w:t>The Analytics Insight Generation Sequence Diagram incorporates several alternative execution paths:</w:t>
+      </w:r>
+    </w:p>
+    <w:p>
+      <w:pPr>
+        <w:pStyle w:val="ListParagraph"/>
+        <w:numPr>
+          <w:ilvl w:val="0"/>
+          <w:numId w:val="109"/>
+        </w:numPr>
+        <w:tabs>
+          <w:tab w:val="left" w:pos="7455"/>
+        </w:tabs>
+      </w:pPr>
+      <w:r>
+        <w:t>Successful generation of analytics insights.</w:t>
+      </w:r>
+    </w:p>
+    <w:p>
+      <w:pPr>
+        <w:pStyle w:val="ListParagraph"/>
+        <w:numPr>
+          <w:ilvl w:val="0"/>
+          <w:numId w:val="109"/>
+        </w:numPr>
+        <w:tabs>
+          <w:tab w:val="left" w:pos="7455"/>
+        </w:tabs>
+      </w:pPr>
+      <w:r>
+        <w:t>Generation of filtered reports based on administrator-selected criteria.</w:t>
+      </w:r>
+    </w:p>
+    <w:p>
+      <w:pPr>
+        <w:pStyle w:val="ListParagraph"/>
+        <w:numPr>
+          <w:ilvl w:val="0"/>
+          <w:numId w:val="109"/>
+        </w:numPr>
+        <w:tabs>
+          <w:tab w:val="left" w:pos="7455"/>
+        </w:tabs>
+      </w:pPr>
+      <w:r>
+        <w:t>No available data for the requested reporting period or filters.</w:t>
+      </w:r>
+    </w:p>
+    <w:p>
+      <w:pPr>
+        <w:tabs>
+          <w:tab w:val="left" w:pos="7455"/>
+        </w:tabs>
+      </w:pPr>
+      <w:r>
+        <w:t>These alternative scenarios ensure that the analytics subsystem remains reliable while providing informative feedback under varying data conditions.</w:t>
+      </w:r>
+    </w:p>
+    <w:p>
+      <w:pPr>
+        <w:spacing w:line="278" w:lineRule="auto"/>
+        <w:rPr>
+          <w:b/>
+          <w:bCs/>
+        </w:rPr>
+      </w:pPr>
+      <w:r>
+        <w:rPr>
+          <w:b/>
+          <w:bCs/>
+        </w:rPr>
+        <w:br w:type="page"/>
+      </w:r>
+    </w:p>
+    <w:p>
+      <w:pPr>
+        <w:tabs>
+          <w:tab w:val="left" w:pos="7455"/>
+        </w:tabs>
+        <w:rPr>
+          <w:b/>
+          <w:bCs/>
+        </w:rPr>
+      </w:pPr>
+      <w:r>
+        <w:rPr>
+          <w:b/>
+          <w:bCs/>
+        </w:rPr>
+        <w:lastRenderedPageBreak/>
+        <w:t>Conclusion</w:t>
+      </w:r>
+    </w:p>
+    <w:p>
+      <w:pPr>
+        <w:tabs>
+          <w:tab w:val="left" w:pos="7455"/>
+        </w:tabs>
+      </w:pPr>
+      <w:r>
+        <w:t>The Analytics Insight Generation Sequence Diagram provides a detailed overview of the process of analytics generation within the KriGo system. The diagram demonstrates the manner in which the operational data is gathered, processed, and transformed into insights using the collaborative effort of the presentation layer, business logic layer, and data repositories. The provided diagram represents an important design document for the understanding of the analytics subsystem of the platform.</w:t>
+      </w:r>
+    </w:p>
+    <w:p>
+      <w:pPr>
+        <w:spacing w:line="278" w:lineRule="auto"/>
+      </w:pPr>
+    </w:p>
+    <w:p>
+      <w:pPr>
+        <w:keepNext/>
+        <w:spacing w:line="278" w:lineRule="auto"/>
+      </w:pPr>
+      <w:r>
+        <w:rPr>
+          <w:noProof/>
+        </w:rPr>
+        <w:drawing>
+          <wp:inline distT="0" distB="0" distL="0" distR="0" wp14:anchorId="51928503" wp14:editId="1CBF4091">
+            <wp:extent cx="5941695" cy="4161155"/>
+            <wp:effectExtent l="0" t="0" r="1905" b="0"/>
+            <wp:docPr id="1611130519" name="Picture 11"/>
+            <wp:cNvGraphicFramePr>
+              <a:graphicFrameLocks xmlns:a="http://schemas.openxmlformats.org/drawingml/2006/main" noChangeAspect="1"/>
+            </wp:cNvGraphicFramePr>
+            <a:graphic xmlns:a="http://schemas.openxmlformats.org/drawingml/2006/main">
+              <a:graphicData uri="http://schemas.openxmlformats.org/drawingml/2006/picture">
+                <pic:pic xmlns:pic="http://schemas.openxmlformats.org/drawingml/2006/picture">
+                  <pic:nvPicPr>
+                    <pic:cNvPr id="0" name="Picture 15"/>
+                    <pic:cNvPicPr>
+                      <a:picLocks noChangeAspect="1" noChangeArrowheads="1"/>
+                    </pic:cNvPicPr>
+                  </pic:nvPicPr>
+                  <pic:blipFill>
+                    <a:blip r:embed="rId18" cstate="print">
+                      <a:extLst>
+                        <a:ext uri="{28A0092B-C50C-407E-A947-70E740481C1C}">
+                          <a14:useLocalDpi xmlns:a14="http://schemas.microsoft.com/office/drawing/2010/main" val="0"/>
+                        </a:ext>
+                      </a:extLst>
+                    </a:blip>
+                    <a:srcRect/>
+                    <a:stretch>
+                      <a:fillRect/>
+                    </a:stretch>
+                  </pic:blipFill>
+                  <pic:spPr bwMode="auto">
+                    <a:xfrm>
+                      <a:off x="0" y="0"/>
+                      <a:ext cx="5941695" cy="4161155"/>
+                    </a:xfrm>
+                    <a:prstGeom prst="rect">
+                      <a:avLst/>
+                    </a:prstGeom>
+                    <a:noFill/>
+                    <a:ln>
+                      <a:noFill/>
+                    </a:ln>
+                  </pic:spPr>
+                </pic:pic>
+              </a:graphicData>
+            </a:graphic>
+          </wp:inline>
+        </w:drawing>
+      </w:r>
+    </w:p>
+    <w:p>
+      <w:pPr>
+        <w:pStyle w:val="Caption"/>
+      </w:pPr>
+      <w:r>
+        <w:t xml:space="preserve">Figure </w:t>
+      </w:r>
+      <w:r>
+        <w:fldChar w:fldCharType="begin"/>
+      </w:r>
+      <w:r>
+        <w:instrText xml:space="preserve"> SEQ Figure \* ARABIC </w:instrText>
+      </w:r>
+      <w:r>
+        <w:fldChar w:fldCharType="separate"/>
+      </w:r>
+      <w:r>
+        <w:rPr>
+          <w:noProof/>
+        </w:rPr>
+        <w:t>11</w:t>
+      </w:r>
+      <w:r>
+        <w:fldChar w:fldCharType="end"/>
+      </w:r>
+      <w:r>
+        <w:t xml:space="preserve"> - </w:t>
+      </w:r>
+      <w:r>
+        <w:t>Analytics Insight Generation Sequence Diagram</w:t>
+      </w:r>
+    </w:p>
+    <w:p>
+      <w:pPr>
+        <w:spacing w:line="278" w:lineRule="auto"/>
+      </w:pPr>
+      <w:r>
+        <w:br w:type="page"/>
+      </w:r>
+    </w:p>
+    <w:p/>
+    <w:p/>
+    <w:p/>
+    <w:p/>
+    <w:p/>
+    <w:p/>
+    <w:p/>
+    <w:p/>
+    <w:p/>
+    <w:p/>
+    <w:p/>
+    <w:p/>
+    <w:p/>
     <w:sectPr>
       <w:pgSz w:w="11906" w:h="16838" w:code="9"/>
       <w:pgMar w:top="1411" w:right="850" w:bottom="1411" w:left="1699" w:header="720" w:footer="720" w:gutter="0"/>
@@ -11884,6 +12606,155 @@
     </w:lvl>
   </w:abstractNum>
   <w:abstractNum w:abstractNumId="41" w15:restartNumberingAfterBreak="0">
+    <w:nsid w:val="34182771"/>
+    <w:multiLevelType w:val="multilevel"/>
+    <w:tmpl w:val="2AA67CDA"/>
+    <w:lvl w:ilvl="0">
+      <w:start w:val="1"/>
+      <w:numFmt w:val="bullet"/>
+      <w:lvlText w:val=""/>
+      <w:lvlJc w:val="left"/>
+      <w:pPr>
+        <w:tabs>
+          <w:tab w:val="num" w:pos="720"/>
+        </w:tabs>
+        <w:ind w:left="720" w:hanging="360"/>
+      </w:pPr>
+      <w:rPr>
+        <w:rFonts w:ascii="Wingdings" w:hAnsi="Wingdings" w:hint="default"/>
+        <w:sz w:val="20"/>
+      </w:rPr>
+    </w:lvl>
+    <w:lvl w:ilvl="1" w:tentative="1">
+      <w:start w:val="1"/>
+      <w:numFmt w:val="bullet"/>
+      <w:lvlText w:val="o"/>
+      <w:lvlJc w:val="left"/>
+      <w:pPr>
+        <w:tabs>
+          <w:tab w:val="num" w:pos="1440"/>
+        </w:tabs>
+        <w:ind w:left="1440" w:hanging="360"/>
+      </w:pPr>
+      <w:rPr>
+        <w:rFonts w:ascii="Courier New" w:hAnsi="Courier New" w:hint="default"/>
+        <w:sz w:val="20"/>
+      </w:rPr>
+    </w:lvl>
+    <w:lvl w:ilvl="2" w:tentative="1">
+      <w:start w:val="1"/>
+      <w:numFmt w:val="bullet"/>
+      <w:lvlText w:val=""/>
+      <w:lvlJc w:val="left"/>
+      <w:pPr>
+        <w:tabs>
+          <w:tab w:val="num" w:pos="2160"/>
+        </w:tabs>
+        <w:ind w:left="2160" w:hanging="360"/>
+      </w:pPr>
+      <w:rPr>
+        <w:rFonts w:ascii="Wingdings" w:hAnsi="Wingdings" w:hint="default"/>
+        <w:sz w:val="20"/>
+      </w:rPr>
+    </w:lvl>
+    <w:lvl w:ilvl="3" w:tentative="1">
+      <w:start w:val="1"/>
+      <w:numFmt w:val="bullet"/>
+      <w:lvlText w:val=""/>
+      <w:lvlJc w:val="left"/>
+      <w:pPr>
+        <w:tabs>
+          <w:tab w:val="num" w:pos="2880"/>
+        </w:tabs>
+        <w:ind w:left="2880" w:hanging="360"/>
+      </w:pPr>
+      <w:rPr>
+        <w:rFonts w:ascii="Wingdings" w:hAnsi="Wingdings" w:hint="default"/>
+        <w:sz w:val="20"/>
+      </w:rPr>
+    </w:lvl>
+    <w:lvl w:ilvl="4" w:tentative="1">
+      <w:start w:val="1"/>
+      <w:numFmt w:val="bullet"/>
+      <w:lvlText w:val=""/>
+      <w:lvlJc w:val="left"/>
+      <w:pPr>
+        <w:tabs>
+          <w:tab w:val="num" w:pos="3600"/>
+        </w:tabs>
+        <w:ind w:left="3600" w:hanging="360"/>
+      </w:pPr>
+      <w:rPr>
+        <w:rFonts w:ascii="Wingdings" w:hAnsi="Wingdings" w:hint="default"/>
+        <w:sz w:val="20"/>
+      </w:rPr>
+    </w:lvl>
+    <w:lvl w:ilvl="5" w:tentative="1">
+      <w:start w:val="1"/>
+      <w:numFmt w:val="bullet"/>
+      <w:lvlText w:val=""/>
+      <w:lvlJc w:val="left"/>
+      <w:pPr>
+        <w:tabs>
+          <w:tab w:val="num" w:pos="4320"/>
+        </w:tabs>
+        <w:ind w:left="4320" w:hanging="360"/>
+      </w:pPr>
+      <w:rPr>
+        <w:rFonts w:ascii="Wingdings" w:hAnsi="Wingdings" w:hint="default"/>
+        <w:sz w:val="20"/>
+      </w:rPr>
+    </w:lvl>
+    <w:lvl w:ilvl="6" w:tentative="1">
+      <w:start w:val="1"/>
+      <w:numFmt w:val="bullet"/>
+      <w:lvlText w:val=""/>
+      <w:lvlJc w:val="left"/>
+      <w:pPr>
+        <w:tabs>
+          <w:tab w:val="num" w:pos="5040"/>
+        </w:tabs>
+        <w:ind w:left="5040" w:hanging="360"/>
+      </w:pPr>
+      <w:rPr>
+        <w:rFonts w:ascii="Wingdings" w:hAnsi="Wingdings" w:hint="default"/>
+        <w:sz w:val="20"/>
+      </w:rPr>
+    </w:lvl>
+    <w:lvl w:ilvl="7" w:tentative="1">
+      <w:start w:val="1"/>
+      <w:numFmt w:val="bullet"/>
+      <w:lvlText w:val=""/>
+      <w:lvlJc w:val="left"/>
+      <w:pPr>
+        <w:tabs>
+          <w:tab w:val="num" w:pos="5760"/>
+        </w:tabs>
+        <w:ind w:left="5760" w:hanging="360"/>
+      </w:pPr>
+      <w:rPr>
+        <w:rFonts w:ascii="Wingdings" w:hAnsi="Wingdings" w:hint="default"/>
+        <w:sz w:val="20"/>
+      </w:rPr>
+    </w:lvl>
+    <w:lvl w:ilvl="8" w:tentative="1">
+      <w:start w:val="1"/>
+      <w:numFmt w:val="bullet"/>
+      <w:lvlText w:val=""/>
+      <w:lvlJc w:val="left"/>
+      <w:pPr>
+        <w:tabs>
+          <w:tab w:val="num" w:pos="6480"/>
+        </w:tabs>
+        <w:ind w:left="6480" w:hanging="360"/>
+      </w:pPr>
+      <w:rPr>
+        <w:rFonts w:ascii="Wingdings" w:hAnsi="Wingdings" w:hint="default"/>
+        <w:sz w:val="20"/>
+      </w:rPr>
+    </w:lvl>
+  </w:abstractNum>
+  <w:abstractNum w:abstractNumId="42" w15:restartNumberingAfterBreak="0">
     <w:nsid w:val="35413E58"/>
     <w:multiLevelType w:val="hybridMultilevel"/>
     <w:tmpl w:val="03C64164"/>
@@ -11996,7 +12867,7 @@
       </w:rPr>
     </w:lvl>
   </w:abstractNum>
-  <w:abstractNum w:abstractNumId="42" w15:restartNumberingAfterBreak="0">
+  <w:abstractNum w:abstractNumId="43" w15:restartNumberingAfterBreak="0">
     <w:nsid w:val="35C86AF0"/>
     <w:multiLevelType w:val="multilevel"/>
     <w:tmpl w:val="8202FCD6"/>
@@ -12145,7 +13016,7 @@
       </w:rPr>
     </w:lvl>
   </w:abstractNum>
-  <w:abstractNum w:abstractNumId="43" w15:restartNumberingAfterBreak="0">
+  <w:abstractNum w:abstractNumId="44" w15:restartNumberingAfterBreak="0">
     <w:nsid w:val="3623194A"/>
     <w:multiLevelType w:val="multilevel"/>
     <w:tmpl w:val="63F4E6F0"/>
@@ -12294,7 +13165,156 @@
       </w:rPr>
     </w:lvl>
   </w:abstractNum>
-  <w:abstractNum w:abstractNumId="44" w15:restartNumberingAfterBreak="0">
+  <w:abstractNum w:abstractNumId="45" w15:restartNumberingAfterBreak="0">
+    <w:nsid w:val="36E36979"/>
+    <w:multiLevelType w:val="multilevel"/>
+    <w:tmpl w:val="3D58C93A"/>
+    <w:lvl w:ilvl="0">
+      <w:start w:val="1"/>
+      <w:numFmt w:val="bullet"/>
+      <w:lvlText w:val=""/>
+      <w:lvlJc w:val="left"/>
+      <w:pPr>
+        <w:tabs>
+          <w:tab w:val="num" w:pos="720"/>
+        </w:tabs>
+        <w:ind w:left="720" w:hanging="360"/>
+      </w:pPr>
+      <w:rPr>
+        <w:rFonts w:ascii="Symbol" w:hAnsi="Symbol" w:hint="default"/>
+        <w:sz w:val="20"/>
+      </w:rPr>
+    </w:lvl>
+    <w:lvl w:ilvl="1" w:tentative="1">
+      <w:start w:val="1"/>
+      <w:numFmt w:val="bullet"/>
+      <w:lvlText w:val="o"/>
+      <w:lvlJc w:val="left"/>
+      <w:pPr>
+        <w:tabs>
+          <w:tab w:val="num" w:pos="1440"/>
+        </w:tabs>
+        <w:ind w:left="1440" w:hanging="360"/>
+      </w:pPr>
+      <w:rPr>
+        <w:rFonts w:ascii="Courier New" w:hAnsi="Courier New" w:hint="default"/>
+        <w:sz w:val="20"/>
+      </w:rPr>
+    </w:lvl>
+    <w:lvl w:ilvl="2" w:tentative="1">
+      <w:start w:val="1"/>
+      <w:numFmt w:val="bullet"/>
+      <w:lvlText w:val=""/>
+      <w:lvlJc w:val="left"/>
+      <w:pPr>
+        <w:tabs>
+          <w:tab w:val="num" w:pos="2160"/>
+        </w:tabs>
+        <w:ind w:left="2160" w:hanging="360"/>
+      </w:pPr>
+      <w:rPr>
+        <w:rFonts w:ascii="Wingdings" w:hAnsi="Wingdings" w:hint="default"/>
+        <w:sz w:val="20"/>
+      </w:rPr>
+    </w:lvl>
+    <w:lvl w:ilvl="3" w:tentative="1">
+      <w:start w:val="1"/>
+      <w:numFmt w:val="bullet"/>
+      <w:lvlText w:val=""/>
+      <w:lvlJc w:val="left"/>
+      <w:pPr>
+        <w:tabs>
+          <w:tab w:val="num" w:pos="2880"/>
+        </w:tabs>
+        <w:ind w:left="2880" w:hanging="360"/>
+      </w:pPr>
+      <w:rPr>
+        <w:rFonts w:ascii="Wingdings" w:hAnsi="Wingdings" w:hint="default"/>
+        <w:sz w:val="20"/>
+      </w:rPr>
+    </w:lvl>
+    <w:lvl w:ilvl="4" w:tentative="1">
+      <w:start w:val="1"/>
+      <w:numFmt w:val="bullet"/>
+      <w:lvlText w:val=""/>
+      <w:lvlJc w:val="left"/>
+      <w:pPr>
+        <w:tabs>
+          <w:tab w:val="num" w:pos="3600"/>
+        </w:tabs>
+        <w:ind w:left="3600" w:hanging="360"/>
+      </w:pPr>
+      <w:rPr>
+        <w:rFonts w:ascii="Wingdings" w:hAnsi="Wingdings" w:hint="default"/>
+        <w:sz w:val="20"/>
+      </w:rPr>
+    </w:lvl>
+    <w:lvl w:ilvl="5" w:tentative="1">
+      <w:start w:val="1"/>
+      <w:numFmt w:val="bullet"/>
+      <w:lvlText w:val=""/>
+      <w:lvlJc w:val="left"/>
+      <w:pPr>
+        <w:tabs>
+          <w:tab w:val="num" w:pos="4320"/>
+        </w:tabs>
+        <w:ind w:left="4320" w:hanging="360"/>
+      </w:pPr>
+      <w:rPr>
+        <w:rFonts w:ascii="Wingdings" w:hAnsi="Wingdings" w:hint="default"/>
+        <w:sz w:val="20"/>
+      </w:rPr>
+    </w:lvl>
+    <w:lvl w:ilvl="6" w:tentative="1">
+      <w:start w:val="1"/>
+      <w:numFmt w:val="bullet"/>
+      <w:lvlText w:val=""/>
+      <w:lvlJc w:val="left"/>
+      <w:pPr>
+        <w:tabs>
+          <w:tab w:val="num" w:pos="5040"/>
+        </w:tabs>
+        <w:ind w:left="5040" w:hanging="360"/>
+      </w:pPr>
+      <w:rPr>
+        <w:rFonts w:ascii="Wingdings" w:hAnsi="Wingdings" w:hint="default"/>
+        <w:sz w:val="20"/>
+      </w:rPr>
+    </w:lvl>
+    <w:lvl w:ilvl="7" w:tentative="1">
+      <w:start w:val="1"/>
+      <w:numFmt w:val="bullet"/>
+      <w:lvlText w:val=""/>
+      <w:lvlJc w:val="left"/>
+      <w:pPr>
+        <w:tabs>
+          <w:tab w:val="num" w:pos="5760"/>
+        </w:tabs>
+        <w:ind w:left="5760" w:hanging="360"/>
+      </w:pPr>
+      <w:rPr>
+        <w:rFonts w:ascii="Wingdings" w:hAnsi="Wingdings" w:hint="default"/>
+        <w:sz w:val="20"/>
+      </w:rPr>
+    </w:lvl>
+    <w:lvl w:ilvl="8" w:tentative="1">
+      <w:start w:val="1"/>
+      <w:numFmt w:val="bullet"/>
+      <w:lvlText w:val=""/>
+      <w:lvlJc w:val="left"/>
+      <w:pPr>
+        <w:tabs>
+          <w:tab w:val="num" w:pos="6480"/>
+        </w:tabs>
+        <w:ind w:left="6480" w:hanging="360"/>
+      </w:pPr>
+      <w:rPr>
+        <w:rFonts w:ascii="Wingdings" w:hAnsi="Wingdings" w:hint="default"/>
+        <w:sz w:val="20"/>
+      </w:rPr>
+    </w:lvl>
+  </w:abstractNum>
+  <w:abstractNum w:abstractNumId="46" w15:restartNumberingAfterBreak="0">
     <w:nsid w:val="37B424C3"/>
     <w:multiLevelType w:val="hybridMultilevel"/>
     <w:tmpl w:val="18F030D4"/>
@@ -12407,7 +13427,7 @@
       </w:rPr>
     </w:lvl>
   </w:abstractNum>
-  <w:abstractNum w:abstractNumId="45" w15:restartNumberingAfterBreak="0">
+  <w:abstractNum w:abstractNumId="47" w15:restartNumberingAfterBreak="0">
     <w:nsid w:val="3BC10D30"/>
     <w:multiLevelType w:val="multilevel"/>
     <w:tmpl w:val="502AD78C"/>
@@ -12556,7 +13576,7 @@
       </w:rPr>
     </w:lvl>
   </w:abstractNum>
-  <w:abstractNum w:abstractNumId="46" w15:restartNumberingAfterBreak="0">
+  <w:abstractNum w:abstractNumId="48" w15:restartNumberingAfterBreak="0">
     <w:nsid w:val="3C596808"/>
     <w:multiLevelType w:val="multilevel"/>
     <w:tmpl w:val="2AA67CDA"/>
@@ -12705,7 +13725,7 @@
       </w:rPr>
     </w:lvl>
   </w:abstractNum>
-  <w:abstractNum w:abstractNumId="47" w15:restartNumberingAfterBreak="0">
+  <w:abstractNum w:abstractNumId="49" w15:restartNumberingAfterBreak="0">
     <w:nsid w:val="3CBF280A"/>
     <w:multiLevelType w:val="multilevel"/>
     <w:tmpl w:val="A13E4362"/>
@@ -12854,7 +13874,7 @@
       </w:rPr>
     </w:lvl>
   </w:abstractNum>
-  <w:abstractNum w:abstractNumId="48" w15:restartNumberingAfterBreak="0">
+  <w:abstractNum w:abstractNumId="50" w15:restartNumberingAfterBreak="0">
     <w:nsid w:val="3CC7541B"/>
     <w:multiLevelType w:val="multilevel"/>
     <w:tmpl w:val="2AA67CDA"/>
@@ -13003,7 +14023,305 @@
       </w:rPr>
     </w:lvl>
   </w:abstractNum>
-  <w:abstractNum w:abstractNumId="49" w15:restartNumberingAfterBreak="0">
+  <w:abstractNum w:abstractNumId="51" w15:restartNumberingAfterBreak="0">
+    <w:nsid w:val="3F5E3BA1"/>
+    <w:multiLevelType w:val="multilevel"/>
+    <w:tmpl w:val="2AA67CDA"/>
+    <w:lvl w:ilvl="0">
+      <w:start w:val="1"/>
+      <w:numFmt w:val="bullet"/>
+      <w:lvlText w:val=""/>
+      <w:lvlJc w:val="left"/>
+      <w:pPr>
+        <w:tabs>
+          <w:tab w:val="num" w:pos="720"/>
+        </w:tabs>
+        <w:ind w:left="720" w:hanging="360"/>
+      </w:pPr>
+      <w:rPr>
+        <w:rFonts w:ascii="Wingdings" w:hAnsi="Wingdings" w:hint="default"/>
+        <w:sz w:val="20"/>
+      </w:rPr>
+    </w:lvl>
+    <w:lvl w:ilvl="1" w:tentative="1">
+      <w:start w:val="1"/>
+      <w:numFmt w:val="bullet"/>
+      <w:lvlText w:val="o"/>
+      <w:lvlJc w:val="left"/>
+      <w:pPr>
+        <w:tabs>
+          <w:tab w:val="num" w:pos="1440"/>
+        </w:tabs>
+        <w:ind w:left="1440" w:hanging="360"/>
+      </w:pPr>
+      <w:rPr>
+        <w:rFonts w:ascii="Courier New" w:hAnsi="Courier New" w:hint="default"/>
+        <w:sz w:val="20"/>
+      </w:rPr>
+    </w:lvl>
+    <w:lvl w:ilvl="2" w:tentative="1">
+      <w:start w:val="1"/>
+      <w:numFmt w:val="bullet"/>
+      <w:lvlText w:val=""/>
+      <w:lvlJc w:val="left"/>
+      <w:pPr>
+        <w:tabs>
+          <w:tab w:val="num" w:pos="2160"/>
+        </w:tabs>
+        <w:ind w:left="2160" w:hanging="360"/>
+      </w:pPr>
+      <w:rPr>
+        <w:rFonts w:ascii="Wingdings" w:hAnsi="Wingdings" w:hint="default"/>
+        <w:sz w:val="20"/>
+      </w:rPr>
+    </w:lvl>
+    <w:lvl w:ilvl="3" w:tentative="1">
+      <w:start w:val="1"/>
+      <w:numFmt w:val="bullet"/>
+      <w:lvlText w:val=""/>
+      <w:lvlJc w:val="left"/>
+      <w:pPr>
+        <w:tabs>
+          <w:tab w:val="num" w:pos="2880"/>
+        </w:tabs>
+        <w:ind w:left="2880" w:hanging="360"/>
+      </w:pPr>
+      <w:rPr>
+        <w:rFonts w:ascii="Wingdings" w:hAnsi="Wingdings" w:hint="default"/>
+        <w:sz w:val="20"/>
+      </w:rPr>
+    </w:lvl>
+    <w:lvl w:ilvl="4" w:tentative="1">
+      <w:start w:val="1"/>
+      <w:numFmt w:val="bullet"/>
+      <w:lvlText w:val=""/>
+      <w:lvlJc w:val="left"/>
+      <w:pPr>
+        <w:tabs>
+          <w:tab w:val="num" w:pos="3600"/>
+        </w:tabs>
+        <w:ind w:left="3600" w:hanging="360"/>
+      </w:pPr>
+      <w:rPr>
+        <w:rFonts w:ascii="Wingdings" w:hAnsi="Wingdings" w:hint="default"/>
+        <w:sz w:val="20"/>
+      </w:rPr>
+    </w:lvl>
+    <w:lvl w:ilvl="5" w:tentative="1">
+      <w:start w:val="1"/>
+      <w:numFmt w:val="bullet"/>
+      <w:lvlText w:val=""/>
+      <w:lvlJc w:val="left"/>
+      <w:pPr>
+        <w:tabs>
+          <w:tab w:val="num" w:pos="4320"/>
+        </w:tabs>
+        <w:ind w:left="4320" w:hanging="360"/>
+      </w:pPr>
+      <w:rPr>
+        <w:rFonts w:ascii="Wingdings" w:hAnsi="Wingdings" w:hint="default"/>
+        <w:sz w:val="20"/>
+      </w:rPr>
+    </w:lvl>
+    <w:lvl w:ilvl="6" w:tentative="1">
+      <w:start w:val="1"/>
+      <w:numFmt w:val="bullet"/>
+      <w:lvlText w:val=""/>
+      <w:lvlJc w:val="left"/>
+      <w:pPr>
+        <w:tabs>
+          <w:tab w:val="num" w:pos="5040"/>
+        </w:tabs>
+        <w:ind w:left="5040" w:hanging="360"/>
+      </w:pPr>
+      <w:rPr>
+        <w:rFonts w:ascii="Wingdings" w:hAnsi="Wingdings" w:hint="default"/>
+        <w:sz w:val="20"/>
+      </w:rPr>
+    </w:lvl>
+    <w:lvl w:ilvl="7" w:tentative="1">
+      <w:start w:val="1"/>
+      <w:numFmt w:val="bullet"/>
+      <w:lvlText w:val=""/>
+      <w:lvlJc w:val="left"/>
+      <w:pPr>
+        <w:tabs>
+          <w:tab w:val="num" w:pos="5760"/>
+        </w:tabs>
+        <w:ind w:left="5760" w:hanging="360"/>
+      </w:pPr>
+      <w:rPr>
+        <w:rFonts w:ascii="Wingdings" w:hAnsi="Wingdings" w:hint="default"/>
+        <w:sz w:val="20"/>
+      </w:rPr>
+    </w:lvl>
+    <w:lvl w:ilvl="8" w:tentative="1">
+      <w:start w:val="1"/>
+      <w:numFmt w:val="bullet"/>
+      <w:lvlText w:val=""/>
+      <w:lvlJc w:val="left"/>
+      <w:pPr>
+        <w:tabs>
+          <w:tab w:val="num" w:pos="6480"/>
+        </w:tabs>
+        <w:ind w:left="6480" w:hanging="360"/>
+      </w:pPr>
+      <w:rPr>
+        <w:rFonts w:ascii="Wingdings" w:hAnsi="Wingdings" w:hint="default"/>
+        <w:sz w:val="20"/>
+      </w:rPr>
+    </w:lvl>
+  </w:abstractNum>
+  <w:abstractNum w:abstractNumId="52" w15:restartNumberingAfterBreak="0">
+    <w:nsid w:val="40431B1C"/>
+    <w:multiLevelType w:val="multilevel"/>
+    <w:tmpl w:val="5D8E77D0"/>
+    <w:lvl w:ilvl="0">
+      <w:start w:val="1"/>
+      <w:numFmt w:val="bullet"/>
+      <w:lvlText w:val=""/>
+      <w:lvlJc w:val="left"/>
+      <w:pPr>
+        <w:tabs>
+          <w:tab w:val="num" w:pos="720"/>
+        </w:tabs>
+        <w:ind w:left="720" w:hanging="360"/>
+      </w:pPr>
+      <w:rPr>
+        <w:rFonts w:ascii="Symbol" w:hAnsi="Symbol" w:hint="default"/>
+        <w:sz w:val="20"/>
+      </w:rPr>
+    </w:lvl>
+    <w:lvl w:ilvl="1" w:tentative="1">
+      <w:start w:val="1"/>
+      <w:numFmt w:val="bullet"/>
+      <w:lvlText w:val="o"/>
+      <w:lvlJc w:val="left"/>
+      <w:pPr>
+        <w:tabs>
+          <w:tab w:val="num" w:pos="1440"/>
+        </w:tabs>
+        <w:ind w:left="1440" w:hanging="360"/>
+      </w:pPr>
+      <w:rPr>
+        <w:rFonts w:ascii="Courier New" w:hAnsi="Courier New" w:hint="default"/>
+        <w:sz w:val="20"/>
+      </w:rPr>
+    </w:lvl>
+    <w:lvl w:ilvl="2" w:tentative="1">
+      <w:start w:val="1"/>
+      <w:numFmt w:val="bullet"/>
+      <w:lvlText w:val=""/>
+      <w:lvlJc w:val="left"/>
+      <w:pPr>
+        <w:tabs>
+          <w:tab w:val="num" w:pos="2160"/>
+        </w:tabs>
+        <w:ind w:left="2160" w:hanging="360"/>
+      </w:pPr>
+      <w:rPr>
+        <w:rFonts w:ascii="Wingdings" w:hAnsi="Wingdings" w:hint="default"/>
+        <w:sz w:val="20"/>
+      </w:rPr>
+    </w:lvl>
+    <w:lvl w:ilvl="3" w:tentative="1">
+      <w:start w:val="1"/>
+      <w:numFmt w:val="bullet"/>
+      <w:lvlText w:val=""/>
+      <w:lvlJc w:val="left"/>
+      <w:pPr>
+        <w:tabs>
+          <w:tab w:val="num" w:pos="2880"/>
+        </w:tabs>
+        <w:ind w:left="2880" w:hanging="360"/>
+      </w:pPr>
+      <w:rPr>
+        <w:rFonts w:ascii="Wingdings" w:hAnsi="Wingdings" w:hint="default"/>
+        <w:sz w:val="20"/>
+      </w:rPr>
+    </w:lvl>
+    <w:lvl w:ilvl="4" w:tentative="1">
+      <w:start w:val="1"/>
+      <w:numFmt w:val="bullet"/>
+      <w:lvlText w:val=""/>
+      <w:lvlJc w:val="left"/>
+      <w:pPr>
+        <w:tabs>
+          <w:tab w:val="num" w:pos="3600"/>
+        </w:tabs>
+        <w:ind w:left="3600" w:hanging="360"/>
+      </w:pPr>
+      <w:rPr>
+        <w:rFonts w:ascii="Wingdings" w:hAnsi="Wingdings" w:hint="default"/>
+        <w:sz w:val="20"/>
+      </w:rPr>
+    </w:lvl>
+    <w:lvl w:ilvl="5" w:tentative="1">
+      <w:start w:val="1"/>
+      <w:numFmt w:val="bullet"/>
+      <w:lvlText w:val=""/>
+      <w:lvlJc w:val="left"/>
+      <w:pPr>
+        <w:tabs>
+          <w:tab w:val="num" w:pos="4320"/>
+        </w:tabs>
+        <w:ind w:left="4320" w:hanging="360"/>
+      </w:pPr>
+      <w:rPr>
+        <w:rFonts w:ascii="Wingdings" w:hAnsi="Wingdings" w:hint="default"/>
+        <w:sz w:val="20"/>
+      </w:rPr>
+    </w:lvl>
+    <w:lvl w:ilvl="6" w:tentative="1">
+      <w:start w:val="1"/>
+      <w:numFmt w:val="bullet"/>
+      <w:lvlText w:val=""/>
+      <w:lvlJc w:val="left"/>
+      <w:pPr>
+        <w:tabs>
+          <w:tab w:val="num" w:pos="5040"/>
+        </w:tabs>
+        <w:ind w:left="5040" w:hanging="360"/>
+      </w:pPr>
+      <w:rPr>
+        <w:rFonts w:ascii="Wingdings" w:hAnsi="Wingdings" w:hint="default"/>
+        <w:sz w:val="20"/>
+      </w:rPr>
+    </w:lvl>
+    <w:lvl w:ilvl="7" w:tentative="1">
+      <w:start w:val="1"/>
+      <w:numFmt w:val="bullet"/>
+      <w:lvlText w:val=""/>
+      <w:lvlJc w:val="left"/>
+      <w:pPr>
+        <w:tabs>
+          <w:tab w:val="num" w:pos="5760"/>
+        </w:tabs>
+        <w:ind w:left="5760" w:hanging="360"/>
+      </w:pPr>
+      <w:rPr>
+        <w:rFonts w:ascii="Wingdings" w:hAnsi="Wingdings" w:hint="default"/>
+        <w:sz w:val="20"/>
+      </w:rPr>
+    </w:lvl>
+    <w:lvl w:ilvl="8" w:tentative="1">
+      <w:start w:val="1"/>
+      <w:numFmt w:val="bullet"/>
+      <w:lvlText w:val=""/>
+      <w:lvlJc w:val="left"/>
+      <w:pPr>
+        <w:tabs>
+          <w:tab w:val="num" w:pos="6480"/>
+        </w:tabs>
+        <w:ind w:left="6480" w:hanging="360"/>
+      </w:pPr>
+      <w:rPr>
+        <w:rFonts w:ascii="Wingdings" w:hAnsi="Wingdings" w:hint="default"/>
+        <w:sz w:val="20"/>
+      </w:rPr>
+    </w:lvl>
+  </w:abstractNum>
+  <w:abstractNum w:abstractNumId="53" w15:restartNumberingAfterBreak="0">
     <w:nsid w:val="452F60FB"/>
     <w:multiLevelType w:val="hybridMultilevel"/>
     <w:tmpl w:val="892A990A"/>
@@ -13116,7 +14434,7 @@
       </w:rPr>
     </w:lvl>
   </w:abstractNum>
-  <w:abstractNum w:abstractNumId="50" w15:restartNumberingAfterBreak="0">
+  <w:abstractNum w:abstractNumId="54" w15:restartNumberingAfterBreak="0">
     <w:nsid w:val="47BF2170"/>
     <w:multiLevelType w:val="multilevel"/>
     <w:tmpl w:val="D9681266"/>
@@ -13265,7 +14583,7 @@
       </w:rPr>
     </w:lvl>
   </w:abstractNum>
-  <w:abstractNum w:abstractNumId="51" w15:restartNumberingAfterBreak="0">
+  <w:abstractNum w:abstractNumId="55" w15:restartNumberingAfterBreak="0">
     <w:nsid w:val="47E5592F"/>
     <w:multiLevelType w:val="hybridMultilevel"/>
     <w:tmpl w:val="719AB9FA"/>
@@ -13378,7 +14696,7 @@
       </w:rPr>
     </w:lvl>
   </w:abstractNum>
-  <w:abstractNum w:abstractNumId="52" w15:restartNumberingAfterBreak="0">
+  <w:abstractNum w:abstractNumId="56" w15:restartNumberingAfterBreak="0">
     <w:nsid w:val="48C041A9"/>
     <w:multiLevelType w:val="multilevel"/>
     <w:tmpl w:val="59A694BC"/>
@@ -13527,7 +14845,7 @@
       </w:rPr>
     </w:lvl>
   </w:abstractNum>
-  <w:abstractNum w:abstractNumId="53" w15:restartNumberingAfterBreak="0">
+  <w:abstractNum w:abstractNumId="57" w15:restartNumberingAfterBreak="0">
     <w:nsid w:val="4AF73293"/>
     <w:multiLevelType w:val="hybridMultilevel"/>
     <w:tmpl w:val="F2962738"/>
@@ -13640,7 +14958,7 @@
       </w:rPr>
     </w:lvl>
   </w:abstractNum>
-  <w:abstractNum w:abstractNumId="54" w15:restartNumberingAfterBreak="0">
+  <w:abstractNum w:abstractNumId="58" w15:restartNumberingAfterBreak="0">
     <w:nsid w:val="4B375248"/>
     <w:multiLevelType w:val="multilevel"/>
     <w:tmpl w:val="B574C1C6"/>
@@ -13789,7 +15107,7 @@
       </w:rPr>
     </w:lvl>
   </w:abstractNum>
-  <w:abstractNum w:abstractNumId="55" w15:restartNumberingAfterBreak="0">
+  <w:abstractNum w:abstractNumId="59" w15:restartNumberingAfterBreak="0">
     <w:nsid w:val="4BA13766"/>
     <w:multiLevelType w:val="multilevel"/>
     <w:tmpl w:val="63F4E6F0"/>
@@ -13938,7 +15256,7 @@
       </w:rPr>
     </w:lvl>
   </w:abstractNum>
-  <w:abstractNum w:abstractNumId="56" w15:restartNumberingAfterBreak="0">
+  <w:abstractNum w:abstractNumId="60" w15:restartNumberingAfterBreak="0">
     <w:nsid w:val="4BA25441"/>
     <w:multiLevelType w:val="hybridMultilevel"/>
     <w:tmpl w:val="217E2E96"/>
@@ -14051,7 +15369,7 @@
       </w:rPr>
     </w:lvl>
   </w:abstractNum>
-  <w:abstractNum w:abstractNumId="57" w15:restartNumberingAfterBreak="0">
+  <w:abstractNum w:abstractNumId="61" w15:restartNumberingAfterBreak="0">
     <w:nsid w:val="4E276DCB"/>
     <w:multiLevelType w:val="hybridMultilevel"/>
     <w:tmpl w:val="B7C469B4"/>
@@ -14164,7 +15482,7 @@
       </w:rPr>
     </w:lvl>
   </w:abstractNum>
-  <w:abstractNum w:abstractNumId="58" w15:restartNumberingAfterBreak="0">
+  <w:abstractNum w:abstractNumId="62" w15:restartNumberingAfterBreak="0">
     <w:nsid w:val="4F053929"/>
     <w:multiLevelType w:val="hybridMultilevel"/>
     <w:tmpl w:val="2A78C678"/>
@@ -14277,7 +15595,7 @@
       </w:rPr>
     </w:lvl>
   </w:abstractNum>
-  <w:abstractNum w:abstractNumId="59" w15:restartNumberingAfterBreak="0">
+  <w:abstractNum w:abstractNumId="63" w15:restartNumberingAfterBreak="0">
     <w:nsid w:val="4FFB237E"/>
     <w:multiLevelType w:val="multilevel"/>
     <w:tmpl w:val="2AA67CDA"/>
@@ -14426,7 +15744,7 @@
       </w:rPr>
     </w:lvl>
   </w:abstractNum>
-  <w:abstractNum w:abstractNumId="60" w15:restartNumberingAfterBreak="0">
+  <w:abstractNum w:abstractNumId="64" w15:restartNumberingAfterBreak="0">
     <w:nsid w:val="51737FE0"/>
     <w:multiLevelType w:val="hybridMultilevel"/>
     <w:tmpl w:val="2B0604E6"/>
@@ -14539,7 +15857,7 @@
       </w:rPr>
     </w:lvl>
   </w:abstractNum>
-  <w:abstractNum w:abstractNumId="61" w15:restartNumberingAfterBreak="0">
+  <w:abstractNum w:abstractNumId="65" w15:restartNumberingAfterBreak="0">
     <w:nsid w:val="51A86EF8"/>
     <w:multiLevelType w:val="multilevel"/>
     <w:tmpl w:val="FF2841D4"/>
@@ -14688,7 +16006,7 @@
       </w:rPr>
     </w:lvl>
   </w:abstractNum>
-  <w:abstractNum w:abstractNumId="62" w15:restartNumberingAfterBreak="0">
+  <w:abstractNum w:abstractNumId="66" w15:restartNumberingAfterBreak="0">
     <w:nsid w:val="521378FF"/>
     <w:multiLevelType w:val="multilevel"/>
     <w:tmpl w:val="7B002268"/>
@@ -14837,7 +16155,7 @@
       </w:rPr>
     </w:lvl>
   </w:abstractNum>
-  <w:abstractNum w:abstractNumId="63" w15:restartNumberingAfterBreak="0">
+  <w:abstractNum w:abstractNumId="67" w15:restartNumberingAfterBreak="0">
     <w:nsid w:val="521F2792"/>
     <w:multiLevelType w:val="multilevel"/>
     <w:tmpl w:val="9FB45386"/>
@@ -14986,7 +16304,7 @@
       </w:rPr>
     </w:lvl>
   </w:abstractNum>
-  <w:abstractNum w:abstractNumId="64" w15:restartNumberingAfterBreak="0">
+  <w:abstractNum w:abstractNumId="68" w15:restartNumberingAfterBreak="0">
     <w:nsid w:val="53390911"/>
     <w:multiLevelType w:val="multilevel"/>
     <w:tmpl w:val="1C380F12"/>
@@ -15135,7 +16453,7 @@
       </w:rPr>
     </w:lvl>
   </w:abstractNum>
-  <w:abstractNum w:abstractNumId="65" w15:restartNumberingAfterBreak="0">
+  <w:abstractNum w:abstractNumId="69" w15:restartNumberingAfterBreak="0">
     <w:nsid w:val="53CD23AC"/>
     <w:multiLevelType w:val="multilevel"/>
     <w:tmpl w:val="57BAE8F0"/>
@@ -15284,7 +16602,7 @@
       </w:rPr>
     </w:lvl>
   </w:abstractNum>
-  <w:abstractNum w:abstractNumId="66" w15:restartNumberingAfterBreak="0">
+  <w:abstractNum w:abstractNumId="70" w15:restartNumberingAfterBreak="0">
     <w:nsid w:val="5462791F"/>
     <w:multiLevelType w:val="hybridMultilevel"/>
     <w:tmpl w:val="FDE24C26"/>
@@ -15397,7 +16715,7 @@
       </w:rPr>
     </w:lvl>
   </w:abstractNum>
-  <w:abstractNum w:abstractNumId="67" w15:restartNumberingAfterBreak="0">
+  <w:abstractNum w:abstractNumId="71" w15:restartNumberingAfterBreak="0">
     <w:nsid w:val="547005EB"/>
     <w:multiLevelType w:val="multilevel"/>
     <w:tmpl w:val="F260CC5C"/>
@@ -15546,7 +16864,7 @@
       </w:rPr>
     </w:lvl>
   </w:abstractNum>
-  <w:abstractNum w:abstractNumId="68" w15:restartNumberingAfterBreak="0">
+  <w:abstractNum w:abstractNumId="72" w15:restartNumberingAfterBreak="0">
     <w:nsid w:val="58034221"/>
     <w:multiLevelType w:val="hybridMultilevel"/>
     <w:tmpl w:val="65D0619C"/>
@@ -15659,7 +16977,7 @@
       </w:rPr>
     </w:lvl>
   </w:abstractNum>
-  <w:abstractNum w:abstractNumId="69" w15:restartNumberingAfterBreak="0">
+  <w:abstractNum w:abstractNumId="73" w15:restartNumberingAfterBreak="0">
     <w:nsid w:val="5A460390"/>
     <w:multiLevelType w:val="hybridMultilevel"/>
     <w:tmpl w:val="BD8E939C"/>
@@ -15772,7 +17090,7 @@
       </w:rPr>
     </w:lvl>
   </w:abstractNum>
-  <w:abstractNum w:abstractNumId="70" w15:restartNumberingAfterBreak="0">
+  <w:abstractNum w:abstractNumId="74" w15:restartNumberingAfterBreak="0">
     <w:nsid w:val="5CEE630B"/>
     <w:multiLevelType w:val="hybridMultilevel"/>
     <w:tmpl w:val="DE8E8DBA"/>
@@ -15885,7 +17203,7 @@
       </w:rPr>
     </w:lvl>
   </w:abstractNum>
-  <w:abstractNum w:abstractNumId="71" w15:restartNumberingAfterBreak="0">
+  <w:abstractNum w:abstractNumId="75" w15:restartNumberingAfterBreak="0">
     <w:nsid w:val="5D5A183C"/>
     <w:multiLevelType w:val="multilevel"/>
     <w:tmpl w:val="C804C34A"/>
@@ -16034,7 +17352,7 @@
       </w:rPr>
     </w:lvl>
   </w:abstractNum>
-  <w:abstractNum w:abstractNumId="72" w15:restartNumberingAfterBreak="0">
+  <w:abstractNum w:abstractNumId="76" w15:restartNumberingAfterBreak="0">
     <w:nsid w:val="5DF95194"/>
     <w:multiLevelType w:val="multilevel"/>
     <w:tmpl w:val="CC127E54"/>
@@ -16183,7 +17501,7 @@
       </w:rPr>
     </w:lvl>
   </w:abstractNum>
-  <w:abstractNum w:abstractNumId="73" w15:restartNumberingAfterBreak="0">
+  <w:abstractNum w:abstractNumId="77" w15:restartNumberingAfterBreak="0">
     <w:nsid w:val="5E9C452C"/>
     <w:multiLevelType w:val="multilevel"/>
     <w:tmpl w:val="B8727936"/>
@@ -16332,7 +17650,7 @@
       </w:rPr>
     </w:lvl>
   </w:abstractNum>
-  <w:abstractNum w:abstractNumId="74" w15:restartNumberingAfterBreak="0">
+  <w:abstractNum w:abstractNumId="78" w15:restartNumberingAfterBreak="0">
     <w:nsid w:val="62385AA6"/>
     <w:multiLevelType w:val="multilevel"/>
     <w:tmpl w:val="B9EAECD4"/>
@@ -16481,7 +17799,7 @@
       </w:rPr>
     </w:lvl>
   </w:abstractNum>
-  <w:abstractNum w:abstractNumId="75" w15:restartNumberingAfterBreak="0">
+  <w:abstractNum w:abstractNumId="79" w15:restartNumberingAfterBreak="0">
     <w:nsid w:val="625D686D"/>
     <w:multiLevelType w:val="multilevel"/>
     <w:tmpl w:val="BC1C2048"/>
@@ -16630,7 +17948,7 @@
       </w:rPr>
     </w:lvl>
   </w:abstractNum>
-  <w:abstractNum w:abstractNumId="76" w15:restartNumberingAfterBreak="0">
+  <w:abstractNum w:abstractNumId="80" w15:restartNumberingAfterBreak="0">
     <w:nsid w:val="62B46951"/>
     <w:multiLevelType w:val="hybridMultilevel"/>
     <w:tmpl w:val="0FEAFEC6"/>
@@ -16743,7 +18061,7 @@
       </w:rPr>
     </w:lvl>
   </w:abstractNum>
-  <w:abstractNum w:abstractNumId="77" w15:restartNumberingAfterBreak="0">
+  <w:abstractNum w:abstractNumId="81" w15:restartNumberingAfterBreak="0">
     <w:nsid w:val="647819E3"/>
     <w:multiLevelType w:val="multilevel"/>
     <w:tmpl w:val="ABB278BC"/>
@@ -16892,7 +18210,7 @@
       </w:rPr>
     </w:lvl>
   </w:abstractNum>
-  <w:abstractNum w:abstractNumId="78" w15:restartNumberingAfterBreak="0">
+  <w:abstractNum w:abstractNumId="82" w15:restartNumberingAfterBreak="0">
     <w:nsid w:val="64F30198"/>
     <w:multiLevelType w:val="multilevel"/>
     <w:tmpl w:val="63F4E6F0"/>
@@ -17041,7 +18359,7 @@
       </w:rPr>
     </w:lvl>
   </w:abstractNum>
-  <w:abstractNum w:abstractNumId="79" w15:restartNumberingAfterBreak="0">
+  <w:abstractNum w:abstractNumId="83" w15:restartNumberingAfterBreak="0">
     <w:nsid w:val="65314293"/>
     <w:multiLevelType w:val="hybridMultilevel"/>
     <w:tmpl w:val="6688DFAC"/>
@@ -17154,7 +18472,7 @@
       </w:rPr>
     </w:lvl>
   </w:abstractNum>
-  <w:abstractNum w:abstractNumId="80" w15:restartNumberingAfterBreak="0">
+  <w:abstractNum w:abstractNumId="84" w15:restartNumberingAfterBreak="0">
     <w:nsid w:val="65CE4D0F"/>
     <w:multiLevelType w:val="hybridMultilevel"/>
     <w:tmpl w:val="DB668538"/>
@@ -17267,7 +18585,7 @@
       </w:rPr>
     </w:lvl>
   </w:abstractNum>
-  <w:abstractNum w:abstractNumId="81" w15:restartNumberingAfterBreak="0">
+  <w:abstractNum w:abstractNumId="85" w15:restartNumberingAfterBreak="0">
     <w:nsid w:val="661C7D73"/>
     <w:multiLevelType w:val="multilevel"/>
     <w:tmpl w:val="D9681266"/>
@@ -17416,7 +18734,7 @@
       </w:rPr>
     </w:lvl>
   </w:abstractNum>
-  <w:abstractNum w:abstractNumId="82" w15:restartNumberingAfterBreak="0">
+  <w:abstractNum w:abstractNumId="86" w15:restartNumberingAfterBreak="0">
     <w:nsid w:val="68B94344"/>
     <w:multiLevelType w:val="multilevel"/>
     <w:tmpl w:val="9BA812D8"/>
@@ -17565,7 +18883,7 @@
       </w:rPr>
     </w:lvl>
   </w:abstractNum>
-  <w:abstractNum w:abstractNumId="83" w15:restartNumberingAfterBreak="0">
+  <w:abstractNum w:abstractNumId="87" w15:restartNumberingAfterBreak="0">
     <w:nsid w:val="69DE2C87"/>
     <w:multiLevelType w:val="hybridMultilevel"/>
     <w:tmpl w:val="F530F20A"/>
@@ -17678,7 +18996,7 @@
       </w:rPr>
     </w:lvl>
   </w:abstractNum>
-  <w:abstractNum w:abstractNumId="84" w15:restartNumberingAfterBreak="0">
+  <w:abstractNum w:abstractNumId="88" w15:restartNumberingAfterBreak="0">
     <w:nsid w:val="69ED672D"/>
     <w:multiLevelType w:val="multilevel"/>
     <w:tmpl w:val="CC08E300"/>
@@ -17827,7 +19145,7 @@
       </w:rPr>
     </w:lvl>
   </w:abstractNum>
-  <w:abstractNum w:abstractNumId="85" w15:restartNumberingAfterBreak="0">
+  <w:abstractNum w:abstractNumId="89" w15:restartNumberingAfterBreak="0">
     <w:nsid w:val="6A063EFD"/>
     <w:multiLevelType w:val="hybridMultilevel"/>
     <w:tmpl w:val="48703FBA"/>
@@ -17940,7 +19258,7 @@
       </w:rPr>
     </w:lvl>
   </w:abstractNum>
-  <w:abstractNum w:abstractNumId="86" w15:restartNumberingAfterBreak="0">
+  <w:abstractNum w:abstractNumId="90" w15:restartNumberingAfterBreak="0">
     <w:nsid w:val="6A825ABE"/>
     <w:multiLevelType w:val="multilevel"/>
     <w:tmpl w:val="0CD6F30E"/>
@@ -18089,7 +19407,7 @@
       </w:rPr>
     </w:lvl>
   </w:abstractNum>
-  <w:abstractNum w:abstractNumId="87" w15:restartNumberingAfterBreak="0">
+  <w:abstractNum w:abstractNumId="91" w15:restartNumberingAfterBreak="0">
     <w:nsid w:val="6B1D7832"/>
     <w:multiLevelType w:val="multilevel"/>
     <w:tmpl w:val="DD4646B2"/>
@@ -18238,7 +19556,7 @@
       </w:rPr>
     </w:lvl>
   </w:abstractNum>
-  <w:abstractNum w:abstractNumId="88" w15:restartNumberingAfterBreak="0">
+  <w:abstractNum w:abstractNumId="92" w15:restartNumberingAfterBreak="0">
     <w:nsid w:val="6C6D6667"/>
     <w:multiLevelType w:val="hybridMultilevel"/>
     <w:tmpl w:val="A744709C"/>
@@ -18351,7 +19669,7 @@
       </w:rPr>
     </w:lvl>
   </w:abstractNum>
-  <w:abstractNum w:abstractNumId="89" w15:restartNumberingAfterBreak="0">
+  <w:abstractNum w:abstractNumId="93" w15:restartNumberingAfterBreak="0">
     <w:nsid w:val="6CAD7EA5"/>
     <w:multiLevelType w:val="multilevel"/>
     <w:tmpl w:val="C472C5B0"/>
@@ -18500,7 +19818,7 @@
       </w:rPr>
     </w:lvl>
   </w:abstractNum>
-  <w:abstractNum w:abstractNumId="90" w15:restartNumberingAfterBreak="0">
+  <w:abstractNum w:abstractNumId="94" w15:restartNumberingAfterBreak="0">
     <w:nsid w:val="6E43557B"/>
     <w:multiLevelType w:val="multilevel"/>
     <w:tmpl w:val="323C7112"/>
@@ -18649,7 +19967,7 @@
       </w:rPr>
     </w:lvl>
   </w:abstractNum>
-  <w:abstractNum w:abstractNumId="91" w15:restartNumberingAfterBreak="0">
+  <w:abstractNum w:abstractNumId="95" w15:restartNumberingAfterBreak="0">
     <w:nsid w:val="6EA27D0A"/>
     <w:multiLevelType w:val="multilevel"/>
     <w:tmpl w:val="7BF0256C"/>
@@ -18798,7 +20116,7 @@
       </w:rPr>
     </w:lvl>
   </w:abstractNum>
-  <w:abstractNum w:abstractNumId="92" w15:restartNumberingAfterBreak="0">
+  <w:abstractNum w:abstractNumId="96" w15:restartNumberingAfterBreak="0">
     <w:nsid w:val="6EF86273"/>
     <w:multiLevelType w:val="multilevel"/>
     <w:tmpl w:val="2AA67CDA"/>
@@ -18947,7 +20265,7 @@
       </w:rPr>
     </w:lvl>
   </w:abstractNum>
-  <w:abstractNum w:abstractNumId="93" w15:restartNumberingAfterBreak="0">
+  <w:abstractNum w:abstractNumId="97" w15:restartNumberingAfterBreak="0">
     <w:nsid w:val="70874300"/>
     <w:multiLevelType w:val="hybridMultilevel"/>
     <w:tmpl w:val="1B3A0518"/>
@@ -19060,7 +20378,7 @@
       </w:rPr>
     </w:lvl>
   </w:abstractNum>
-  <w:abstractNum w:abstractNumId="94" w15:restartNumberingAfterBreak="0">
+  <w:abstractNum w:abstractNumId="98" w15:restartNumberingAfterBreak="0">
     <w:nsid w:val="7090251B"/>
     <w:multiLevelType w:val="hybridMultilevel"/>
     <w:tmpl w:val="67687EFE"/>
@@ -19173,7 +20491,156 @@
       </w:rPr>
     </w:lvl>
   </w:abstractNum>
-  <w:abstractNum w:abstractNumId="95" w15:restartNumberingAfterBreak="0">
+  <w:abstractNum w:abstractNumId="99" w15:restartNumberingAfterBreak="0">
+    <w:nsid w:val="722301E0"/>
+    <w:multiLevelType w:val="multilevel"/>
+    <w:tmpl w:val="1EE82E5A"/>
+    <w:lvl w:ilvl="0">
+      <w:start w:val="1"/>
+      <w:numFmt w:val="bullet"/>
+      <w:lvlText w:val=""/>
+      <w:lvlJc w:val="left"/>
+      <w:pPr>
+        <w:tabs>
+          <w:tab w:val="num" w:pos="720"/>
+        </w:tabs>
+        <w:ind w:left="720" w:hanging="360"/>
+      </w:pPr>
+      <w:rPr>
+        <w:rFonts w:ascii="Symbol" w:hAnsi="Symbol" w:hint="default"/>
+        <w:sz w:val="20"/>
+      </w:rPr>
+    </w:lvl>
+    <w:lvl w:ilvl="1" w:tentative="1">
+      <w:start w:val="1"/>
+      <w:numFmt w:val="bullet"/>
+      <w:lvlText w:val="o"/>
+      <w:lvlJc w:val="left"/>
+      <w:pPr>
+        <w:tabs>
+          <w:tab w:val="num" w:pos="1440"/>
+        </w:tabs>
+        <w:ind w:left="1440" w:hanging="360"/>
+      </w:pPr>
+      <w:rPr>
+        <w:rFonts w:ascii="Courier New" w:hAnsi="Courier New" w:hint="default"/>
+        <w:sz w:val="20"/>
+      </w:rPr>
+    </w:lvl>
+    <w:lvl w:ilvl="2" w:tentative="1">
+      <w:start w:val="1"/>
+      <w:numFmt w:val="bullet"/>
+      <w:lvlText w:val=""/>
+      <w:lvlJc w:val="left"/>
+      <w:pPr>
+        <w:tabs>
+          <w:tab w:val="num" w:pos="2160"/>
+        </w:tabs>
+        <w:ind w:left="2160" w:hanging="360"/>
+      </w:pPr>
+      <w:rPr>
+        <w:rFonts w:ascii="Wingdings" w:hAnsi="Wingdings" w:hint="default"/>
+        <w:sz w:val="20"/>
+      </w:rPr>
+    </w:lvl>
+    <w:lvl w:ilvl="3" w:tentative="1">
+      <w:start w:val="1"/>
+      <w:numFmt w:val="bullet"/>
+      <w:lvlText w:val=""/>
+      <w:lvlJc w:val="left"/>
+      <w:pPr>
+        <w:tabs>
+          <w:tab w:val="num" w:pos="2880"/>
+        </w:tabs>
+        <w:ind w:left="2880" w:hanging="360"/>
+      </w:pPr>
+      <w:rPr>
+        <w:rFonts w:ascii="Wingdings" w:hAnsi="Wingdings" w:hint="default"/>
+        <w:sz w:val="20"/>
+      </w:rPr>
+    </w:lvl>
+    <w:lvl w:ilvl="4" w:tentative="1">
+      <w:start w:val="1"/>
+      <w:numFmt w:val="bullet"/>
+      <w:lvlText w:val=""/>
+      <w:lvlJc w:val="left"/>
+      <w:pPr>
+        <w:tabs>
+          <w:tab w:val="num" w:pos="3600"/>
+        </w:tabs>
+        <w:ind w:left="3600" w:hanging="360"/>
+      </w:pPr>
+      <w:rPr>
+        <w:rFonts w:ascii="Wingdings" w:hAnsi="Wingdings" w:hint="default"/>
+        <w:sz w:val="20"/>
+      </w:rPr>
+    </w:lvl>
+    <w:lvl w:ilvl="5" w:tentative="1">
+      <w:start w:val="1"/>
+      <w:numFmt w:val="bullet"/>
+      <w:lvlText w:val=""/>
+      <w:lvlJc w:val="left"/>
+      <w:pPr>
+        <w:tabs>
+          <w:tab w:val="num" w:pos="4320"/>
+        </w:tabs>
+        <w:ind w:left="4320" w:hanging="360"/>
+      </w:pPr>
+      <w:rPr>
+        <w:rFonts w:ascii="Wingdings" w:hAnsi="Wingdings" w:hint="default"/>
+        <w:sz w:val="20"/>
+      </w:rPr>
+    </w:lvl>
+    <w:lvl w:ilvl="6" w:tentative="1">
+      <w:start w:val="1"/>
+      <w:numFmt w:val="bullet"/>
+      <w:lvlText w:val=""/>
+      <w:lvlJc w:val="left"/>
+      <w:pPr>
+        <w:tabs>
+          <w:tab w:val="num" w:pos="5040"/>
+        </w:tabs>
+        <w:ind w:left="5040" w:hanging="360"/>
+      </w:pPr>
+      <w:rPr>
+        <w:rFonts w:ascii="Wingdings" w:hAnsi="Wingdings" w:hint="default"/>
+        <w:sz w:val="20"/>
+      </w:rPr>
+    </w:lvl>
+    <w:lvl w:ilvl="7" w:tentative="1">
+      <w:start w:val="1"/>
+      <w:numFmt w:val="bullet"/>
+      <w:lvlText w:val=""/>
+      <w:lvlJc w:val="left"/>
+      <w:pPr>
+        <w:tabs>
+          <w:tab w:val="num" w:pos="5760"/>
+        </w:tabs>
+        <w:ind w:left="5760" w:hanging="360"/>
+      </w:pPr>
+      <w:rPr>
+        <w:rFonts w:ascii="Wingdings" w:hAnsi="Wingdings" w:hint="default"/>
+        <w:sz w:val="20"/>
+      </w:rPr>
+    </w:lvl>
+    <w:lvl w:ilvl="8" w:tentative="1">
+      <w:start w:val="1"/>
+      <w:numFmt w:val="bullet"/>
+      <w:lvlText w:val=""/>
+      <w:lvlJc w:val="left"/>
+      <w:pPr>
+        <w:tabs>
+          <w:tab w:val="num" w:pos="6480"/>
+        </w:tabs>
+        <w:ind w:left="6480" w:hanging="360"/>
+      </w:pPr>
+      <w:rPr>
+        <w:rFonts w:ascii="Wingdings" w:hAnsi="Wingdings" w:hint="default"/>
+        <w:sz w:val="20"/>
+      </w:rPr>
+    </w:lvl>
+  </w:abstractNum>
+  <w:abstractNum w:abstractNumId="100" w15:restartNumberingAfterBreak="0">
     <w:nsid w:val="75144C65"/>
     <w:multiLevelType w:val="hybridMultilevel"/>
     <w:tmpl w:val="12127FAA"/>
@@ -19286,7 +20753,7 @@
       </w:rPr>
     </w:lvl>
   </w:abstractNum>
-  <w:abstractNum w:abstractNumId="96" w15:restartNumberingAfterBreak="0">
+  <w:abstractNum w:abstractNumId="101" w15:restartNumberingAfterBreak="0">
     <w:nsid w:val="75237F84"/>
     <w:multiLevelType w:val="hybridMultilevel"/>
     <w:tmpl w:val="5F0A6EF2"/>
@@ -19399,7 +20866,7 @@
       </w:rPr>
     </w:lvl>
   </w:abstractNum>
-  <w:abstractNum w:abstractNumId="97" w15:restartNumberingAfterBreak="0">
+  <w:abstractNum w:abstractNumId="102" w15:restartNumberingAfterBreak="0">
     <w:nsid w:val="75FF09B0"/>
     <w:multiLevelType w:val="multilevel"/>
     <w:tmpl w:val="C34A7734"/>
@@ -19548,7 +21015,7 @@
       </w:rPr>
     </w:lvl>
   </w:abstractNum>
-  <w:abstractNum w:abstractNumId="98" w15:restartNumberingAfterBreak="0">
+  <w:abstractNum w:abstractNumId="103" w15:restartNumberingAfterBreak="0">
     <w:nsid w:val="77960362"/>
     <w:multiLevelType w:val="multilevel"/>
     <w:tmpl w:val="FEA0022E"/>
@@ -19697,7 +21164,7 @@
       </w:rPr>
     </w:lvl>
   </w:abstractNum>
-  <w:abstractNum w:abstractNumId="99" w15:restartNumberingAfterBreak="0">
+  <w:abstractNum w:abstractNumId="104" w15:restartNumberingAfterBreak="0">
     <w:nsid w:val="785A644F"/>
     <w:multiLevelType w:val="multilevel"/>
     <w:tmpl w:val="D1DC60FE"/>
@@ -19846,7 +21313,7 @@
       </w:rPr>
     </w:lvl>
   </w:abstractNum>
-  <w:abstractNum w:abstractNumId="100" w15:restartNumberingAfterBreak="0">
+  <w:abstractNum w:abstractNumId="105" w15:restartNumberingAfterBreak="0">
     <w:nsid w:val="7BFA03DF"/>
     <w:multiLevelType w:val="hybridMultilevel"/>
     <w:tmpl w:val="536A979E"/>
@@ -19959,7 +21426,7 @@
       </w:rPr>
     </w:lvl>
   </w:abstractNum>
-  <w:abstractNum w:abstractNumId="101" w15:restartNumberingAfterBreak="0">
+  <w:abstractNum w:abstractNumId="106" w15:restartNumberingAfterBreak="0">
     <w:nsid w:val="7CA524B4"/>
     <w:multiLevelType w:val="hybridMultilevel"/>
     <w:tmpl w:val="957C4F4A"/>
@@ -20072,7 +21539,156 @@
       </w:rPr>
     </w:lvl>
   </w:abstractNum>
-  <w:abstractNum w:abstractNumId="102" w15:restartNumberingAfterBreak="0">
+  <w:abstractNum w:abstractNumId="107" w15:restartNumberingAfterBreak="0">
+    <w:nsid w:val="7E1C597E"/>
+    <w:multiLevelType w:val="multilevel"/>
+    <w:tmpl w:val="2AA67CDA"/>
+    <w:lvl w:ilvl="0">
+      <w:start w:val="1"/>
+      <w:numFmt w:val="bullet"/>
+      <w:lvlText w:val=""/>
+      <w:lvlJc w:val="left"/>
+      <w:pPr>
+        <w:tabs>
+          <w:tab w:val="num" w:pos="720"/>
+        </w:tabs>
+        <w:ind w:left="720" w:hanging="360"/>
+      </w:pPr>
+      <w:rPr>
+        <w:rFonts w:ascii="Wingdings" w:hAnsi="Wingdings" w:hint="default"/>
+        <w:sz w:val="20"/>
+      </w:rPr>
+    </w:lvl>
+    <w:lvl w:ilvl="1" w:tentative="1">
+      <w:start w:val="1"/>
+      <w:numFmt w:val="bullet"/>
+      <w:lvlText w:val="o"/>
+      <w:lvlJc w:val="left"/>
+      <w:pPr>
+        <w:tabs>
+          <w:tab w:val="num" w:pos="1440"/>
+        </w:tabs>
+        <w:ind w:left="1440" w:hanging="360"/>
+      </w:pPr>
+      <w:rPr>
+        <w:rFonts w:ascii="Courier New" w:hAnsi="Courier New" w:hint="default"/>
+        <w:sz w:val="20"/>
+      </w:rPr>
+    </w:lvl>
+    <w:lvl w:ilvl="2" w:tentative="1">
+      <w:start w:val="1"/>
+      <w:numFmt w:val="bullet"/>
+      <w:lvlText w:val=""/>
+      <w:lvlJc w:val="left"/>
+      <w:pPr>
+        <w:tabs>
+          <w:tab w:val="num" w:pos="2160"/>
+        </w:tabs>
+        <w:ind w:left="2160" w:hanging="360"/>
+      </w:pPr>
+      <w:rPr>
+        <w:rFonts w:ascii="Wingdings" w:hAnsi="Wingdings" w:hint="default"/>
+        <w:sz w:val="20"/>
+      </w:rPr>
+    </w:lvl>
+    <w:lvl w:ilvl="3" w:tentative="1">
+      <w:start w:val="1"/>
+      <w:numFmt w:val="bullet"/>
+      <w:lvlText w:val=""/>
+      <w:lvlJc w:val="left"/>
+      <w:pPr>
+        <w:tabs>
+          <w:tab w:val="num" w:pos="2880"/>
+        </w:tabs>
+        <w:ind w:left="2880" w:hanging="360"/>
+      </w:pPr>
+      <w:rPr>
+        <w:rFonts w:ascii="Wingdings" w:hAnsi="Wingdings" w:hint="default"/>
+        <w:sz w:val="20"/>
+      </w:rPr>
+    </w:lvl>
+    <w:lvl w:ilvl="4" w:tentative="1">
+      <w:start w:val="1"/>
+      <w:numFmt w:val="bullet"/>
+      <w:lvlText w:val=""/>
+      <w:lvlJc w:val="left"/>
+      <w:pPr>
+        <w:tabs>
+          <w:tab w:val="num" w:pos="3600"/>
+        </w:tabs>
+        <w:ind w:left="3600" w:hanging="360"/>
+      </w:pPr>
+      <w:rPr>
+        <w:rFonts w:ascii="Wingdings" w:hAnsi="Wingdings" w:hint="default"/>
+        <w:sz w:val="20"/>
+      </w:rPr>
+    </w:lvl>
+    <w:lvl w:ilvl="5" w:tentative="1">
+      <w:start w:val="1"/>
+      <w:numFmt w:val="bullet"/>
+      <w:lvlText w:val=""/>
+      <w:lvlJc w:val="left"/>
+      <w:pPr>
+        <w:tabs>
+          <w:tab w:val="num" w:pos="4320"/>
+        </w:tabs>
+        <w:ind w:left="4320" w:hanging="360"/>
+      </w:pPr>
+      <w:rPr>
+        <w:rFonts w:ascii="Wingdings" w:hAnsi="Wingdings" w:hint="default"/>
+        <w:sz w:val="20"/>
+      </w:rPr>
+    </w:lvl>
+    <w:lvl w:ilvl="6" w:tentative="1">
+      <w:start w:val="1"/>
+      <w:numFmt w:val="bullet"/>
+      <w:lvlText w:val=""/>
+      <w:lvlJc w:val="left"/>
+      <w:pPr>
+        <w:tabs>
+          <w:tab w:val="num" w:pos="5040"/>
+        </w:tabs>
+        <w:ind w:left="5040" w:hanging="360"/>
+      </w:pPr>
+      <w:rPr>
+        <w:rFonts w:ascii="Wingdings" w:hAnsi="Wingdings" w:hint="default"/>
+        <w:sz w:val="20"/>
+      </w:rPr>
+    </w:lvl>
+    <w:lvl w:ilvl="7" w:tentative="1">
+      <w:start w:val="1"/>
+      <w:numFmt w:val="bullet"/>
+      <w:lvlText w:val=""/>
+      <w:lvlJc w:val="left"/>
+      <w:pPr>
+        <w:tabs>
+          <w:tab w:val="num" w:pos="5760"/>
+        </w:tabs>
+        <w:ind w:left="5760" w:hanging="360"/>
+      </w:pPr>
+      <w:rPr>
+        <w:rFonts w:ascii="Wingdings" w:hAnsi="Wingdings" w:hint="default"/>
+        <w:sz w:val="20"/>
+      </w:rPr>
+    </w:lvl>
+    <w:lvl w:ilvl="8" w:tentative="1">
+      <w:start w:val="1"/>
+      <w:numFmt w:val="bullet"/>
+      <w:lvlText w:val=""/>
+      <w:lvlJc w:val="left"/>
+      <w:pPr>
+        <w:tabs>
+          <w:tab w:val="num" w:pos="6480"/>
+        </w:tabs>
+        <w:ind w:left="6480" w:hanging="360"/>
+      </w:pPr>
+      <w:rPr>
+        <w:rFonts w:ascii="Wingdings" w:hAnsi="Wingdings" w:hint="default"/>
+        <w:sz w:val="20"/>
+      </w:rPr>
+    </w:lvl>
+  </w:abstractNum>
+  <w:abstractNum w:abstractNumId="108" w15:restartNumberingAfterBreak="0">
     <w:nsid w:val="7EBD7710"/>
     <w:multiLevelType w:val="hybridMultilevel"/>
     <w:tmpl w:val="C8C6F7A0"/>
@@ -20186,37 +21802,37 @@
     </w:lvl>
   </w:abstractNum>
   <w:num w:numId="1" w16cid:durableId="425157302">
-    <w:abstractNumId w:val="43"/>
+    <w:abstractNumId w:val="44"/>
   </w:num>
   <w:num w:numId="2" w16cid:durableId="967664612">
-    <w:abstractNumId w:val="78"/>
+    <w:abstractNumId w:val="82"/>
   </w:num>
   <w:num w:numId="3" w16cid:durableId="361631616">
-    <w:abstractNumId w:val="55"/>
+    <w:abstractNumId w:val="59"/>
   </w:num>
   <w:num w:numId="4" w16cid:durableId="1409575397">
-    <w:abstractNumId w:val="66"/>
+    <w:abstractNumId w:val="70"/>
   </w:num>
   <w:num w:numId="5" w16cid:durableId="1647204897">
-    <w:abstractNumId w:val="101"/>
+    <w:abstractNumId w:val="106"/>
   </w:num>
   <w:num w:numId="6" w16cid:durableId="682589869">
     <w:abstractNumId w:val="18"/>
   </w:num>
   <w:num w:numId="7" w16cid:durableId="679703478">
-    <w:abstractNumId w:val="83"/>
+    <w:abstractNumId w:val="87"/>
   </w:num>
   <w:num w:numId="8" w16cid:durableId="496455128">
     <w:abstractNumId w:val="38"/>
   </w:num>
   <w:num w:numId="9" w16cid:durableId="1184633094">
-    <w:abstractNumId w:val="49"/>
+    <w:abstractNumId w:val="53"/>
   </w:num>
   <w:num w:numId="10" w16cid:durableId="71507387">
-    <w:abstractNumId w:val="53"/>
+    <w:abstractNumId w:val="57"/>
   </w:num>
   <w:num w:numId="11" w16cid:durableId="1412503779">
-    <w:abstractNumId w:val="85"/>
+    <w:abstractNumId w:val="89"/>
   </w:num>
   <w:num w:numId="12" w16cid:durableId="1107113995">
     <w:abstractNumId w:val="39"/>
@@ -20225,40 +21841,40 @@
     <w:abstractNumId w:val="19"/>
   </w:num>
   <w:num w:numId="14" w16cid:durableId="1529222885">
-    <w:abstractNumId w:val="100"/>
+    <w:abstractNumId w:val="105"/>
   </w:num>
   <w:num w:numId="15" w16cid:durableId="836580755">
     <w:abstractNumId w:val="13"/>
   </w:num>
   <w:num w:numId="16" w16cid:durableId="1344674502">
-    <w:abstractNumId w:val="69"/>
+    <w:abstractNumId w:val="73"/>
   </w:num>
   <w:num w:numId="17" w16cid:durableId="1320882603">
-    <w:abstractNumId w:val="93"/>
+    <w:abstractNumId w:val="97"/>
   </w:num>
   <w:num w:numId="18" w16cid:durableId="1139028372">
     <w:abstractNumId w:val="40"/>
   </w:num>
   <w:num w:numId="19" w16cid:durableId="1525635473">
-    <w:abstractNumId w:val="76"/>
+    <w:abstractNumId w:val="80"/>
   </w:num>
   <w:num w:numId="20" w16cid:durableId="609623515">
-    <w:abstractNumId w:val="102"/>
+    <w:abstractNumId w:val="108"/>
   </w:num>
   <w:num w:numId="21" w16cid:durableId="165170997">
-    <w:abstractNumId w:val="88"/>
+    <w:abstractNumId w:val="92"/>
   </w:num>
   <w:num w:numId="22" w16cid:durableId="1620525290">
     <w:abstractNumId w:val="25"/>
   </w:num>
   <w:num w:numId="23" w16cid:durableId="400753109">
-    <w:abstractNumId w:val="95"/>
+    <w:abstractNumId w:val="100"/>
   </w:num>
   <w:num w:numId="24" w16cid:durableId="193882219">
     <w:abstractNumId w:val="4"/>
   </w:num>
   <w:num w:numId="25" w16cid:durableId="311981628">
-    <w:abstractNumId w:val="44"/>
+    <w:abstractNumId w:val="46"/>
   </w:num>
   <w:num w:numId="26" w16cid:durableId="2009166045">
     <w:abstractNumId w:val="12"/>
@@ -20270,13 +21886,13 @@
     <w:abstractNumId w:val="14"/>
   </w:num>
   <w:num w:numId="29" w16cid:durableId="2124693280">
-    <w:abstractNumId w:val="80"/>
+    <w:abstractNumId w:val="84"/>
   </w:num>
   <w:num w:numId="30" w16cid:durableId="1367099744">
     <w:abstractNumId w:val="30"/>
   </w:num>
   <w:num w:numId="31" w16cid:durableId="2011105642">
-    <w:abstractNumId w:val="70"/>
+    <w:abstractNumId w:val="74"/>
   </w:num>
   <w:num w:numId="32" w16cid:durableId="831995364">
     <w:abstractNumId w:val="22"/>
@@ -20294,7 +21910,7 @@
     <w:abstractNumId w:val="2"/>
   </w:num>
   <w:num w:numId="37" w16cid:durableId="1849755457">
-    <w:abstractNumId w:val="96"/>
+    <w:abstractNumId w:val="101"/>
   </w:num>
   <w:num w:numId="38" w16cid:durableId="516505904">
     <w:abstractNumId w:val="11"/>
@@ -20303,85 +21919,85 @@
     <w:abstractNumId w:val="15"/>
   </w:num>
   <w:num w:numId="40" w16cid:durableId="905338697">
-    <w:abstractNumId w:val="57"/>
+    <w:abstractNumId w:val="61"/>
   </w:num>
   <w:num w:numId="41" w16cid:durableId="501896635">
-    <w:abstractNumId w:val="41"/>
+    <w:abstractNumId w:val="42"/>
   </w:num>
   <w:num w:numId="42" w16cid:durableId="1953435156">
-    <w:abstractNumId w:val="58"/>
+    <w:abstractNumId w:val="62"/>
   </w:num>
   <w:num w:numId="43" w16cid:durableId="1060447452">
-    <w:abstractNumId w:val="68"/>
+    <w:abstractNumId w:val="72"/>
   </w:num>
   <w:num w:numId="44" w16cid:durableId="1772503672">
-    <w:abstractNumId w:val="51"/>
+    <w:abstractNumId w:val="55"/>
   </w:num>
   <w:num w:numId="45" w16cid:durableId="1650330222">
-    <w:abstractNumId w:val="56"/>
+    <w:abstractNumId w:val="60"/>
   </w:num>
   <w:num w:numId="46" w16cid:durableId="2102337934">
     <w:abstractNumId w:val="24"/>
   </w:num>
   <w:num w:numId="47" w16cid:durableId="68767822">
-    <w:abstractNumId w:val="86"/>
+    <w:abstractNumId w:val="90"/>
   </w:num>
   <w:num w:numId="48" w16cid:durableId="1992058265">
     <w:abstractNumId w:val="5"/>
   </w:num>
   <w:num w:numId="49" w16cid:durableId="788475134">
-    <w:abstractNumId w:val="99"/>
+    <w:abstractNumId w:val="104"/>
   </w:num>
   <w:num w:numId="50" w16cid:durableId="224419455">
-    <w:abstractNumId w:val="91"/>
+    <w:abstractNumId w:val="95"/>
   </w:num>
   <w:num w:numId="51" w16cid:durableId="1699575947">
-    <w:abstractNumId w:val="75"/>
+    <w:abstractNumId w:val="79"/>
   </w:num>
   <w:num w:numId="52" w16cid:durableId="1048916239">
+    <w:abstractNumId w:val="49"/>
+  </w:num>
+  <w:num w:numId="53" w16cid:durableId="1188711211">
+    <w:abstractNumId w:val="102"/>
+  </w:num>
+  <w:num w:numId="54" w16cid:durableId="447555614">
+    <w:abstractNumId w:val="81"/>
+  </w:num>
+  <w:num w:numId="55" w16cid:durableId="1679307268">
     <w:abstractNumId w:val="47"/>
   </w:num>
-  <w:num w:numId="53" w16cid:durableId="1188711211">
-    <w:abstractNumId w:val="97"/>
-  </w:num>
-  <w:num w:numId="54" w16cid:durableId="447555614">
-    <w:abstractNumId w:val="77"/>
-  </w:num>
-  <w:num w:numId="55" w16cid:durableId="1679307268">
-    <w:abstractNumId w:val="45"/>
-  </w:num>
   <w:num w:numId="56" w16cid:durableId="693773591">
-    <w:abstractNumId w:val="90"/>
+    <w:abstractNumId w:val="94"/>
   </w:num>
   <w:num w:numId="57" w16cid:durableId="1110473324">
     <w:abstractNumId w:val="32"/>
   </w:num>
   <w:num w:numId="58" w16cid:durableId="842937968">
-    <w:abstractNumId w:val="54"/>
+    <w:abstractNumId w:val="58"/>
   </w:num>
   <w:num w:numId="59" w16cid:durableId="821121315">
     <w:abstractNumId w:val="37"/>
   </w:num>
   <w:num w:numId="60" w16cid:durableId="2095394549">
-    <w:abstractNumId w:val="98"/>
+    <w:abstractNumId w:val="103"/>
   </w:num>
   <w:num w:numId="61" w16cid:durableId="1299921011">
     <w:abstractNumId w:val="36"/>
   </w:num>
   <w:num w:numId="62" w16cid:durableId="1927420240">
-    <w:abstractNumId w:val="61"/>
+    <w:abstractNumId w:val="65"/>
   </w:num>
   <w:num w:numId="63" w16cid:durableId="41290043">
-    <w:abstractNumId w:val="65"/>
+    <w:abstractNumId w:val="69"/>
   </w:num>
   <w:num w:numId="64" w16cid:durableId="999846909">
-    <w:abstractNumId w:val="52"/>
+    <w:abstractNumId w:val="56"/>
   </w:num>
   <w:num w:numId="65" w16cid:durableId="1250969563">
-    <w:abstractNumId w:val="60"/>
+    <w:abstractNumId w:val="64"/>
   </w:num>
   <w:num w:numId="66" w16cid:durableId="484011382">
-    <w:abstractNumId w:val="84"/>
+    <w:abstractNumId w:val="88"/>
   </w:num>
   <w:num w:numId="67" w16cid:durableId="2008289242">
     <w:abstractNumId w:val="9"/>
@@ -20390,13 +22006,13 @@
     <w:abstractNumId w:val="16"/>
   </w:num>
   <w:num w:numId="69" w16cid:durableId="1296839887">
-    <w:abstractNumId w:val="64"/>
+    <w:abstractNumId w:val="68"/>
   </w:num>
   <w:num w:numId="70" w16cid:durableId="336662050">
-    <w:abstractNumId w:val="74"/>
+    <w:abstractNumId w:val="78"/>
   </w:num>
   <w:num w:numId="71" w16cid:durableId="1460032333">
-    <w:abstractNumId w:val="89"/>
+    <w:abstractNumId w:val="93"/>
   </w:num>
   <w:num w:numId="72" w16cid:durableId="592400615">
     <w:abstractNumId w:val="7"/>
@@ -20414,13 +22030,13 @@
     <w:abstractNumId w:val="27"/>
   </w:num>
   <w:num w:numId="77" w16cid:durableId="763109604">
-    <w:abstractNumId w:val="67"/>
+    <w:abstractNumId w:val="71"/>
   </w:num>
   <w:num w:numId="78" w16cid:durableId="2138137265">
-    <w:abstractNumId w:val="79"/>
+    <w:abstractNumId w:val="83"/>
   </w:num>
   <w:num w:numId="79" w16cid:durableId="343675924">
-    <w:abstractNumId w:val="94"/>
+    <w:abstractNumId w:val="98"/>
   </w:num>
   <w:num w:numId="80" w16cid:durableId="1823277442">
     <w:abstractNumId w:val="35"/>
@@ -20429,25 +22045,25 @@
     <w:abstractNumId w:val="0"/>
   </w:num>
   <w:num w:numId="82" w16cid:durableId="1113326280">
-    <w:abstractNumId w:val="63"/>
+    <w:abstractNumId w:val="67"/>
   </w:num>
   <w:num w:numId="83" w16cid:durableId="1253051103">
-    <w:abstractNumId w:val="87"/>
+    <w:abstractNumId w:val="91"/>
   </w:num>
   <w:num w:numId="84" w16cid:durableId="444888444">
-    <w:abstractNumId w:val="42"/>
+    <w:abstractNumId w:val="43"/>
   </w:num>
   <w:num w:numId="85" w16cid:durableId="64299649">
-    <w:abstractNumId w:val="81"/>
+    <w:abstractNumId w:val="85"/>
   </w:num>
   <w:num w:numId="86" w16cid:durableId="868182992">
-    <w:abstractNumId w:val="50"/>
+    <w:abstractNumId w:val="54"/>
   </w:num>
   <w:num w:numId="87" w16cid:durableId="896863331">
     <w:abstractNumId w:val="20"/>
   </w:num>
   <w:num w:numId="88" w16cid:durableId="505442826">
-    <w:abstractNumId w:val="82"/>
+    <w:abstractNumId w:val="86"/>
   </w:num>
   <w:num w:numId="89" w16cid:durableId="1858763908">
     <w:abstractNumId w:val="31"/>
@@ -20456,43 +22072,61 @@
     <w:abstractNumId w:val="10"/>
   </w:num>
   <w:num w:numId="91" w16cid:durableId="1284576603">
-    <w:abstractNumId w:val="71"/>
+    <w:abstractNumId w:val="75"/>
   </w:num>
   <w:num w:numId="92" w16cid:durableId="1963075542">
     <w:abstractNumId w:val="6"/>
   </w:num>
   <w:num w:numId="93" w16cid:durableId="787627596">
-    <w:abstractNumId w:val="62"/>
+    <w:abstractNumId w:val="66"/>
   </w:num>
   <w:num w:numId="94" w16cid:durableId="2003925799">
     <w:abstractNumId w:val="8"/>
   </w:num>
   <w:num w:numId="95" w16cid:durableId="1169102579">
-    <w:abstractNumId w:val="73"/>
+    <w:abstractNumId w:val="77"/>
   </w:num>
   <w:num w:numId="96" w16cid:durableId="1216501564">
     <w:abstractNumId w:val="28"/>
   </w:num>
   <w:num w:numId="97" w16cid:durableId="261768216">
-    <w:abstractNumId w:val="92"/>
+    <w:abstractNumId w:val="96"/>
   </w:num>
   <w:num w:numId="98" w16cid:durableId="2141918721">
-    <w:abstractNumId w:val="59"/>
+    <w:abstractNumId w:val="63"/>
   </w:num>
   <w:num w:numId="99" w16cid:durableId="905841544">
     <w:abstractNumId w:val="34"/>
   </w:num>
   <w:num w:numId="100" w16cid:durableId="1753887223">
-    <w:abstractNumId w:val="72"/>
+    <w:abstractNumId w:val="76"/>
   </w:num>
   <w:num w:numId="101" w16cid:durableId="1320184766">
     <w:abstractNumId w:val="23"/>
   </w:num>
   <w:num w:numId="102" w16cid:durableId="465127606">
+    <w:abstractNumId w:val="50"/>
+  </w:num>
+  <w:num w:numId="103" w16cid:durableId="1640451435">
     <w:abstractNumId w:val="48"/>
   </w:num>
-  <w:num w:numId="103" w16cid:durableId="1640451435">
-    <w:abstractNumId w:val="46"/>
+  <w:num w:numId="104" w16cid:durableId="942029608">
+    <w:abstractNumId w:val="45"/>
+  </w:num>
+  <w:num w:numId="105" w16cid:durableId="70857193">
+    <w:abstractNumId w:val="52"/>
+  </w:num>
+  <w:num w:numId="106" w16cid:durableId="1617908629">
+    <w:abstractNumId w:val="99"/>
+  </w:num>
+  <w:num w:numId="107" w16cid:durableId="970137111">
+    <w:abstractNumId w:val="107"/>
+  </w:num>
+  <w:num w:numId="108" w16cid:durableId="383797013">
+    <w:abstractNumId w:val="41"/>
+  </w:num>
+  <w:num w:numId="109" w16cid:durableId="1459567304">
+    <w:abstractNumId w:val="51"/>
   </w:num>
   <w:numIdMacAtCleanup w:val="45"/>
 </w:numbering>

</xml_diff>

<commit_message>
Quick Booking Sequence Diagram (#244)
</commit_message>
<xml_diff>
--- a/Sequence Specification Document.docx
+++ b/Sequence Specification Document.docx
@@ -4797,21 +4797,12 @@
         </w:numPr>
         <w:spacing w:line="278" w:lineRule="auto"/>
       </w:pPr>
-      <w:proofErr w:type="spellStart"/>
-      <w:r>
-        <w:rPr>
-          <w:b/>
-          <w:bCs/>
-        </w:rPr>
-        <w:t>DisputeUI</w:t>
-      </w:r>
-      <w:proofErr w:type="spellEnd"/>
-      <w:r>
-        <w:rPr>
-          <w:b/>
-          <w:bCs/>
-        </w:rPr>
-        <w:t xml:space="preserve"> (Boundary):</w:t>
+      <w:r>
+        <w:rPr>
+          <w:b/>
+          <w:bCs/>
+        </w:rPr>
+        <w:t>DisputeUI (Boundary):</w:t>
       </w:r>
       <w:r>
         <w:t xml:space="preserve"> Provides the interface for submitting, reviewing, and managing disputes.</w:t>
@@ -7285,10 +7276,768 @@
         <w:br w:type="page"/>
       </w:r>
     </w:p>
+    <w:p>
+      <w:pPr>
+        <w:pStyle w:val="Heading3"/>
+        <w:numPr>
+          <w:ilvl w:val="0"/>
+          <w:numId w:val="74"/>
+        </w:numPr>
+      </w:pPr>
+      <w:r>
+        <w:lastRenderedPageBreak/>
+        <w:t>Quick Booking Sequence</w:t>
+      </w:r>
+    </w:p>
+    <w:p>
+      <w:pPr>
+        <w:rPr>
+          <w:b/>
+          <w:bCs/>
+        </w:rPr>
+      </w:pPr>
+      <w:r>
+        <w:rPr>
+          <w:b/>
+          <w:bCs/>
+        </w:rPr>
+        <w:t>Purpose</w:t>
+      </w:r>
+    </w:p>
+    <w:p>
+      <w:r>
+        <w:t>The Quick Booking Sequence Diagram shows the communication process involved in making a car booking using the mobile application through its quick booking process. The quick booking process allows users to make a booking for an available car in less user interaction time, hence shorter booking time overall.</w:t>
+      </w:r>
+    </w:p>
+    <w:p>
+      <w:pPr>
+        <w:rPr>
+          <w:b/>
+          <w:bCs/>
+        </w:rPr>
+      </w:pPr>
+      <w:r>
+        <w:rPr>
+          <w:b/>
+          <w:bCs/>
+        </w:rPr>
+        <w:t>Participating Objects</w:t>
+      </w:r>
+    </w:p>
+    <w:p>
+      <w:pPr>
+        <w:pStyle w:val="ListParagraph"/>
+        <w:numPr>
+          <w:ilvl w:val="0"/>
+          <w:numId w:val="111"/>
+        </w:numPr>
+      </w:pPr>
+      <w:r>
+        <w:t>Customer (Actor)</w:t>
+      </w:r>
+    </w:p>
+    <w:p>
+      <w:pPr>
+        <w:pStyle w:val="ListParagraph"/>
+        <w:numPr>
+          <w:ilvl w:val="0"/>
+          <w:numId w:val="111"/>
+        </w:numPr>
+      </w:pPr>
+      <w:r>
+        <w:t>MobileAppUI (Boundary)</w:t>
+      </w:r>
+    </w:p>
+    <w:p>
+      <w:pPr>
+        <w:pStyle w:val="ListParagraph"/>
+        <w:numPr>
+          <w:ilvl w:val="0"/>
+          <w:numId w:val="111"/>
+        </w:numPr>
+      </w:pPr>
+      <w:r>
+        <w:t>BookingController (Control)</w:t>
+      </w:r>
+    </w:p>
+    <w:p>
+      <w:pPr>
+        <w:pStyle w:val="ListParagraph"/>
+        <w:numPr>
+          <w:ilvl w:val="0"/>
+          <w:numId w:val="111"/>
+        </w:numPr>
+      </w:pPr>
+      <w:r>
+        <w:t>AvailabilityService (Control)</w:t>
+      </w:r>
+    </w:p>
+    <w:p>
+      <w:pPr>
+        <w:pStyle w:val="ListParagraph"/>
+        <w:numPr>
+          <w:ilvl w:val="0"/>
+          <w:numId w:val="111"/>
+        </w:numPr>
+      </w:pPr>
+      <w:r>
+        <w:t>ReservationRepository (Entity)</w:t>
+      </w:r>
+    </w:p>
+    <w:p>
+      <w:pPr>
+        <w:pStyle w:val="ListParagraph"/>
+        <w:numPr>
+          <w:ilvl w:val="0"/>
+          <w:numId w:val="111"/>
+        </w:numPr>
+      </w:pPr>
+      <w:r>
+        <w:t>Database (Database)</w:t>
+      </w:r>
+    </w:p>
+    <w:p>
+      <w:pPr>
+        <w:rPr>
+          <w:b/>
+          <w:bCs/>
+        </w:rPr>
+      </w:pPr>
+      <w:r>
+        <w:rPr>
+          <w:b/>
+          <w:bCs/>
+        </w:rPr>
+        <w:t>Process Description</w:t>
+      </w:r>
+    </w:p>
+    <w:p>
+      <w:r>
+        <w:t>A choice is made from the list of vehicles and Quick Booking function activated using the mobile app. This Booking Controller makes an inquiry to the Availability Service about whether the selected car is available in the given rental period. Once it turns out that it is available, then it becomes possible to create a reservation of the vehicle through Reservation Repository. Afterward, the customer gets a notification of his/her booking. On the contrary, if the vehicle is not available, the customer is notified about it.</w:t>
+      </w:r>
+    </w:p>
+    <w:p>
+      <w:pPr>
+        <w:rPr>
+          <w:b/>
+          <w:bCs/>
+        </w:rPr>
+      </w:pPr>
+      <w:r>
+        <w:rPr>
+          <w:b/>
+          <w:bCs/>
+        </w:rPr>
+        <w:t>Conclusion</w:t>
+      </w:r>
+    </w:p>
+    <w:p>
+      <w:r>
+        <w:t>The Quick Booking Sequence Diagram below shows how the mobile app makes the process of booking easy and secure for the client through availability checking and managing bookings.</w:t>
+      </w:r>
+    </w:p>
+    <w:p>
+      <w:pPr>
+        <w:keepNext/>
+      </w:pPr>
+      <w:r>
+        <w:rPr>
+          <w:noProof/>
+        </w:rPr>
+        <w:drawing>
+          <wp:inline distT="0" distB="0" distL="0" distR="0" wp14:anchorId="02736A18" wp14:editId="316C9E1D">
+            <wp:extent cx="5941695" cy="3075940"/>
+            <wp:effectExtent l="0" t="0" r="1905" b="0"/>
+            <wp:docPr id="110910629" name="Picture 12"/>
+            <wp:cNvGraphicFramePr>
+              <a:graphicFrameLocks xmlns:a="http://schemas.openxmlformats.org/drawingml/2006/main" noChangeAspect="1"/>
+            </wp:cNvGraphicFramePr>
+            <a:graphic xmlns:a="http://schemas.openxmlformats.org/drawingml/2006/main">
+              <a:graphicData uri="http://schemas.openxmlformats.org/drawingml/2006/picture">
+                <pic:pic xmlns:pic="http://schemas.openxmlformats.org/drawingml/2006/picture">
+                  <pic:nvPicPr>
+                    <pic:cNvPr id="0" name="Picture 17"/>
+                    <pic:cNvPicPr>
+                      <a:picLocks noChangeAspect="1" noChangeArrowheads="1"/>
+                    </pic:cNvPicPr>
+                  </pic:nvPicPr>
+                  <pic:blipFill>
+                    <a:blip r:embed="rId19">
+                      <a:extLst>
+                        <a:ext uri="{28A0092B-C50C-407E-A947-70E740481C1C}">
+                          <a14:useLocalDpi xmlns:a14="http://schemas.microsoft.com/office/drawing/2010/main" val="0"/>
+                        </a:ext>
+                      </a:extLst>
+                    </a:blip>
+                    <a:srcRect/>
+                    <a:stretch>
+                      <a:fillRect/>
+                    </a:stretch>
+                  </pic:blipFill>
+                  <pic:spPr bwMode="auto">
+                    <a:xfrm>
+                      <a:off x="0" y="0"/>
+                      <a:ext cx="5941695" cy="3075940"/>
+                    </a:xfrm>
+                    <a:prstGeom prst="rect">
+                      <a:avLst/>
+                    </a:prstGeom>
+                    <a:noFill/>
+                    <a:ln>
+                      <a:noFill/>
+                    </a:ln>
+                  </pic:spPr>
+                </pic:pic>
+              </a:graphicData>
+            </a:graphic>
+          </wp:inline>
+        </w:drawing>
+      </w:r>
+    </w:p>
+    <w:p>
+      <w:pPr>
+        <w:pStyle w:val="Caption"/>
+      </w:pPr>
+      <w:r>
+        <w:t xml:space="preserve">Figure </w:t>
+      </w:r>
+      <w:r>
+        <w:fldChar w:fldCharType="begin"/>
+      </w:r>
+      <w:r>
+        <w:instrText xml:space="preserve"> SEQ Figure \* ARABIC </w:instrText>
+      </w:r>
+      <w:r>
+        <w:fldChar w:fldCharType="separate"/>
+      </w:r>
+      <w:r>
+        <w:rPr>
+          <w:noProof/>
+        </w:rPr>
+        <w:t>12</w:t>
+      </w:r>
+      <w:r>
+        <w:fldChar w:fldCharType="end"/>
+      </w:r>
+      <w:r>
+        <w:t xml:space="preserve"> - </w:t>
+      </w:r>
+      <w:r>
+        <w:t>Quick Booking Sequence Diagram</w:t>
+      </w:r>
+    </w:p>
     <w:p/>
-    <w:p/>
-    <w:p/>
-    <w:p/>
+    <w:p>
+      <w:pPr>
+        <w:spacing w:line="278" w:lineRule="auto"/>
+      </w:pPr>
+      <w:r>
+        <w:br w:type="page"/>
+      </w:r>
+    </w:p>
+    <w:p>
+      <w:pPr>
+        <w:pStyle w:val="Heading3"/>
+        <w:numPr>
+          <w:ilvl w:val="0"/>
+          <w:numId w:val="74"/>
+        </w:numPr>
+      </w:pPr>
+      <w:r>
+        <w:lastRenderedPageBreak/>
+        <w:t xml:space="preserve">Location Services Sequence </w:t>
+      </w:r>
+    </w:p>
+    <w:p>
+      <w:pPr>
+        <w:rPr>
+          <w:b/>
+          <w:bCs/>
+        </w:rPr>
+      </w:pPr>
+      <w:r>
+        <w:rPr>
+          <w:b/>
+          <w:bCs/>
+        </w:rPr>
+        <w:t>Purpose</w:t>
+      </w:r>
+    </w:p>
+    <w:p>
+      <w:r>
+        <w:t>The Location Services Sequence Diagram illustrates how the mobile application retrieves the customer's location and displays nearby rental vehicles using GPS and mapping services.</w:t>
+      </w:r>
+    </w:p>
+    <w:p>
+      <w:pPr>
+        <w:rPr>
+          <w:b/>
+          <w:bCs/>
+        </w:rPr>
+      </w:pPr>
+      <w:r>
+        <w:rPr>
+          <w:b/>
+          <w:bCs/>
+        </w:rPr>
+        <w:t>Participating Objects</w:t>
+      </w:r>
+    </w:p>
+    <w:p>
+      <w:pPr>
+        <w:pStyle w:val="ListParagraph"/>
+        <w:numPr>
+          <w:ilvl w:val="0"/>
+          <w:numId w:val="115"/>
+        </w:numPr>
+      </w:pPr>
+      <w:r>
+        <w:t>Customer</w:t>
+      </w:r>
+    </w:p>
+    <w:p>
+      <w:pPr>
+        <w:pStyle w:val="ListParagraph"/>
+        <w:numPr>
+          <w:ilvl w:val="0"/>
+          <w:numId w:val="115"/>
+        </w:numPr>
+      </w:pPr>
+      <w:r>
+        <w:t>MobileAppUI</w:t>
+      </w:r>
+    </w:p>
+    <w:p>
+      <w:pPr>
+        <w:pStyle w:val="ListParagraph"/>
+        <w:numPr>
+          <w:ilvl w:val="0"/>
+          <w:numId w:val="115"/>
+        </w:numPr>
+      </w:pPr>
+      <w:r>
+        <w:t>LocationController</w:t>
+      </w:r>
+    </w:p>
+    <w:p>
+      <w:pPr>
+        <w:pStyle w:val="ListParagraph"/>
+        <w:numPr>
+          <w:ilvl w:val="0"/>
+          <w:numId w:val="115"/>
+        </w:numPr>
+      </w:pPr>
+      <w:r>
+        <w:t>GPS Service</w:t>
+      </w:r>
+    </w:p>
+    <w:p>
+      <w:pPr>
+        <w:pStyle w:val="ListParagraph"/>
+        <w:numPr>
+          <w:ilvl w:val="0"/>
+          <w:numId w:val="115"/>
+        </w:numPr>
+      </w:pPr>
+      <w:r>
+        <w:t>Map Service</w:t>
+      </w:r>
+    </w:p>
+    <w:p>
+      <w:pPr>
+        <w:pStyle w:val="ListParagraph"/>
+        <w:numPr>
+          <w:ilvl w:val="0"/>
+          <w:numId w:val="115"/>
+        </w:numPr>
+      </w:pPr>
+      <w:r>
+        <w:t>VehicleRepository</w:t>
+      </w:r>
+    </w:p>
+    <w:p>
+      <w:pPr>
+        <w:pStyle w:val="ListParagraph"/>
+        <w:numPr>
+          <w:ilvl w:val="0"/>
+          <w:numId w:val="115"/>
+        </w:numPr>
+      </w:pPr>
+      <w:r>
+        <w:t>Database</w:t>
+      </w:r>
+    </w:p>
+    <w:p>
+      <w:pPr>
+        <w:spacing w:line="278" w:lineRule="auto"/>
+        <w:rPr>
+          <w:b/>
+          <w:bCs/>
+        </w:rPr>
+      </w:pPr>
+      <w:r>
+        <w:rPr>
+          <w:b/>
+          <w:bCs/>
+        </w:rPr>
+        <w:t>Process Description</w:t>
+      </w:r>
+    </w:p>
+    <w:p>
+      <w:pPr>
+        <w:spacing w:line="278" w:lineRule="auto"/>
+      </w:pPr>
+      <w:r>
+        <w:t>The customer requests nearby vehicles via the mobile application. The system identifies the location of the customer with the help of GPS services provided by the device and accesses nearby vehicles in the database. Map Service provides the locations of the vehicle on a map, which helps the customer to find the nearby rental vehicles easily.</w:t>
+      </w:r>
+    </w:p>
+    <w:p>
+      <w:pPr>
+        <w:spacing w:line="278" w:lineRule="auto"/>
+        <w:rPr>
+          <w:b/>
+          <w:bCs/>
+        </w:rPr>
+      </w:pPr>
+      <w:r>
+        <w:rPr>
+          <w:b/>
+          <w:bCs/>
+        </w:rPr>
+        <w:t>Conclusion</w:t>
+      </w:r>
+    </w:p>
+    <w:p>
+      <w:pPr>
+        <w:spacing w:line="278" w:lineRule="auto"/>
+      </w:pPr>
+      <w:r>
+        <w:t>Location Services Sequence Diagram shows how location technologies improve the experience of the customer by providing nearby available vehicles.</w:t>
+      </w:r>
+      <w:r>
+        <w:br w:type="page"/>
+      </w:r>
+    </w:p>
+    <w:p>
+      <w:pPr>
+        <w:pStyle w:val="Heading3"/>
+        <w:numPr>
+          <w:ilvl w:val="0"/>
+          <w:numId w:val="74"/>
+        </w:numPr>
+      </w:pPr>
+      <w:r>
+        <w:lastRenderedPageBreak/>
+        <w:t>Push Notification Sequence</w:t>
+      </w:r>
+    </w:p>
+    <w:p>
+      <w:pPr>
+        <w:rPr>
+          <w:b/>
+          <w:bCs/>
+        </w:rPr>
+      </w:pPr>
+      <w:r>
+        <w:rPr>
+          <w:b/>
+          <w:bCs/>
+        </w:rPr>
+        <w:t>Purpose</w:t>
+      </w:r>
+    </w:p>
+    <w:p>
+      <w:r>
+        <w:t>The sequence diagram of push notifications depicts the process through which the KriGo platform pushes notifications to its customers in case of any changes related to reservations and payments.</w:t>
+      </w:r>
+    </w:p>
+    <w:p>
+      <w:pPr>
+        <w:rPr>
+          <w:b/>
+          <w:bCs/>
+        </w:rPr>
+      </w:pPr>
+      <w:r>
+        <w:rPr>
+          <w:b/>
+          <w:bCs/>
+        </w:rPr>
+        <w:t>Participating Objects</w:t>
+      </w:r>
+    </w:p>
+    <w:p>
+      <w:pPr>
+        <w:pStyle w:val="ListParagraph"/>
+        <w:numPr>
+          <w:ilvl w:val="0"/>
+          <w:numId w:val="116"/>
+        </w:numPr>
+      </w:pPr>
+      <w:r>
+        <w:t>Customer</w:t>
+      </w:r>
+    </w:p>
+    <w:p>
+      <w:pPr>
+        <w:pStyle w:val="ListParagraph"/>
+        <w:numPr>
+          <w:ilvl w:val="0"/>
+          <w:numId w:val="116"/>
+        </w:numPr>
+      </w:pPr>
+      <w:r>
+        <w:t>MobileApp</w:t>
+      </w:r>
+    </w:p>
+    <w:p>
+      <w:pPr>
+        <w:pStyle w:val="ListParagraph"/>
+        <w:numPr>
+          <w:ilvl w:val="0"/>
+          <w:numId w:val="116"/>
+        </w:numPr>
+      </w:pPr>
+      <w:r>
+        <w:t>NotificationService</w:t>
+      </w:r>
+    </w:p>
+    <w:p>
+      <w:pPr>
+        <w:pStyle w:val="ListParagraph"/>
+        <w:numPr>
+          <w:ilvl w:val="0"/>
+          <w:numId w:val="116"/>
+        </w:numPr>
+      </w:pPr>
+      <w:r>
+        <w:t>Firebase Cloud Messaging</w:t>
+      </w:r>
+    </w:p>
+    <w:p>
+      <w:pPr>
+        <w:pStyle w:val="ListParagraph"/>
+        <w:numPr>
+          <w:ilvl w:val="0"/>
+          <w:numId w:val="116"/>
+        </w:numPr>
+      </w:pPr>
+      <w:r>
+        <w:t>System</w:t>
+      </w:r>
+    </w:p>
+    <w:p>
+      <w:pPr>
+        <w:rPr>
+          <w:b/>
+          <w:bCs/>
+        </w:rPr>
+      </w:pPr>
+      <w:r>
+        <w:rPr>
+          <w:b/>
+          <w:bCs/>
+        </w:rPr>
+        <w:t>Process Description</w:t>
+      </w:r>
+    </w:p>
+    <w:p>
+      <w:r>
+        <w:t>Upon an event that needs to be notified to the user, the system triggers a notification to the Notification Service, which passes it on to the Firebase Cloud Messaging, which in turn pushes it to the customer’s mobile phone. The mobile app notifies the customer of the message.</w:t>
+      </w:r>
+    </w:p>
+    <w:p>
+      <w:pPr>
+        <w:rPr>
+          <w:b/>
+          <w:bCs/>
+        </w:rPr>
+      </w:pPr>
+      <w:r>
+        <w:rPr>
+          <w:b/>
+          <w:bCs/>
+        </w:rPr>
+        <w:t>Conclusion</w:t>
+      </w:r>
+    </w:p>
+    <w:p>
+      <w:pPr>
+        <w:spacing w:line="278" w:lineRule="auto"/>
+      </w:pPr>
+      <w:r>
+        <w:t>Push Notification Sequence Diagram is a depiction of real-time messaging that ensures the customer is updated on any event.</w:t>
+      </w:r>
+      <w:r>
+        <w:br w:type="page"/>
+      </w:r>
+    </w:p>
+    <w:p>
+      <w:pPr>
+        <w:pStyle w:val="Heading3"/>
+        <w:numPr>
+          <w:ilvl w:val="0"/>
+          <w:numId w:val="74"/>
+        </w:numPr>
+      </w:pPr>
+      <w:r>
+        <w:lastRenderedPageBreak/>
+        <w:t>Offline Synchronization Sequence</w:t>
+      </w:r>
+    </w:p>
+    <w:p>
+      <w:pPr>
+        <w:rPr>
+          <w:b/>
+          <w:bCs/>
+        </w:rPr>
+      </w:pPr>
+      <w:r>
+        <w:rPr>
+          <w:b/>
+          <w:bCs/>
+        </w:rPr>
+        <w:t>Purpose</w:t>
+      </w:r>
+    </w:p>
+    <w:p>
+      <w:r>
+        <w:t>Offline Synchronization Sequence Diagram is created to show how the mobile app makes it possible for the user to use specific features despite lack of connection and how the app makes sure that the data is synchronized in case the connection appears</w:t>
+      </w:r>
+      <w:r>
+        <w:t>.</w:t>
+      </w:r>
+    </w:p>
+    <w:p>
+      <w:pPr>
+        <w:rPr>
+          <w:b/>
+          <w:bCs/>
+        </w:rPr>
+      </w:pPr>
+      <w:r>
+        <w:rPr>
+          <w:b/>
+          <w:bCs/>
+        </w:rPr>
+        <w:t>Participating Objects</w:t>
+      </w:r>
+    </w:p>
+    <w:p>
+      <w:pPr>
+        <w:pStyle w:val="ListParagraph"/>
+        <w:numPr>
+          <w:ilvl w:val="0"/>
+          <w:numId w:val="117"/>
+        </w:numPr>
+      </w:pPr>
+      <w:r>
+        <w:t>Customer</w:t>
+      </w:r>
+    </w:p>
+    <w:p>
+      <w:pPr>
+        <w:pStyle w:val="ListParagraph"/>
+        <w:numPr>
+          <w:ilvl w:val="0"/>
+          <w:numId w:val="117"/>
+        </w:numPr>
+      </w:pPr>
+      <w:r>
+        <w:t>MobileApp</w:t>
+      </w:r>
+    </w:p>
+    <w:p>
+      <w:pPr>
+        <w:pStyle w:val="ListParagraph"/>
+        <w:numPr>
+          <w:ilvl w:val="0"/>
+          <w:numId w:val="117"/>
+        </w:numPr>
+      </w:pPr>
+      <w:r>
+        <w:t>SyncController</w:t>
+      </w:r>
+    </w:p>
+    <w:p>
+      <w:pPr>
+        <w:pStyle w:val="ListParagraph"/>
+        <w:numPr>
+          <w:ilvl w:val="0"/>
+          <w:numId w:val="117"/>
+        </w:numPr>
+      </w:pPr>
+      <w:r>
+        <w:t>Local Storage</w:t>
+      </w:r>
+    </w:p>
+    <w:p>
+      <w:pPr>
+        <w:pStyle w:val="ListParagraph"/>
+        <w:numPr>
+          <w:ilvl w:val="0"/>
+          <w:numId w:val="117"/>
+        </w:numPr>
+      </w:pPr>
+      <w:r>
+        <w:t>SynchronizationService</w:t>
+      </w:r>
+    </w:p>
+    <w:p>
+      <w:pPr>
+        <w:pStyle w:val="ListParagraph"/>
+        <w:numPr>
+          <w:ilvl w:val="0"/>
+          <w:numId w:val="117"/>
+        </w:numPr>
+      </w:pPr>
+      <w:r>
+        <w:t>Database</w:t>
+      </w:r>
+    </w:p>
+    <w:p>
+      <w:pPr>
+        <w:rPr>
+          <w:b/>
+          <w:bCs/>
+        </w:rPr>
+      </w:pPr>
+      <w:r>
+        <w:rPr>
+          <w:b/>
+          <w:bCs/>
+        </w:rPr>
+        <w:t>Process Description</w:t>
+      </w:r>
+    </w:p>
+    <w:p>
+      <w:r>
+        <w:t>In case of using supported operations by the customer offline, the mobile app stores all the data locally. Then, when the connection appears, the SyncController gets all the changes from the device and passes them to the SynchronizationService. The service synchronizes the data with the central database and confirms its synchronization. Local data is synchronized too</w:t>
+      </w:r>
+      <w:r>
+        <w:t>.</w:t>
+      </w:r>
+    </w:p>
+    <w:p>
+      <w:pPr>
+        <w:rPr>
+          <w:b/>
+          <w:bCs/>
+        </w:rPr>
+      </w:pPr>
+      <w:r>
+        <w:rPr>
+          <w:b/>
+          <w:bCs/>
+        </w:rPr>
+        <w:t>Conclusion</w:t>
+      </w:r>
+    </w:p>
+    <w:p>
+      <w:r>
+        <w:t>Offline Synchronization Sequence Diagram shows how the mobile application stays usable during network outages, and ensures synchronization of data kept locally to the main system once there is network connection again.</w:t>
+      </w:r>
+    </w:p>
     <w:p/>
     <w:p/>
     <w:p/>
@@ -9570,6 +10319,155 @@
     </w:lvl>
   </w:abstractNum>
   <w:abstractNum w:abstractNumId="17" w15:restartNumberingAfterBreak="0">
+    <w:nsid w:val="13A13D09"/>
+    <w:multiLevelType w:val="multilevel"/>
+    <w:tmpl w:val="92067DCC"/>
+    <w:lvl w:ilvl="0">
+      <w:start w:val="1"/>
+      <w:numFmt w:val="bullet"/>
+      <w:lvlText w:val=""/>
+      <w:lvlJc w:val="left"/>
+      <w:pPr>
+        <w:tabs>
+          <w:tab w:val="num" w:pos="720"/>
+        </w:tabs>
+        <w:ind w:left="720" w:hanging="360"/>
+      </w:pPr>
+      <w:rPr>
+        <w:rFonts w:ascii="Symbol" w:hAnsi="Symbol" w:hint="default"/>
+        <w:sz w:val="20"/>
+      </w:rPr>
+    </w:lvl>
+    <w:lvl w:ilvl="1" w:tentative="1">
+      <w:start w:val="1"/>
+      <w:numFmt w:val="bullet"/>
+      <w:lvlText w:val="o"/>
+      <w:lvlJc w:val="left"/>
+      <w:pPr>
+        <w:tabs>
+          <w:tab w:val="num" w:pos="1440"/>
+        </w:tabs>
+        <w:ind w:left="1440" w:hanging="360"/>
+      </w:pPr>
+      <w:rPr>
+        <w:rFonts w:ascii="Courier New" w:hAnsi="Courier New" w:hint="default"/>
+        <w:sz w:val="20"/>
+      </w:rPr>
+    </w:lvl>
+    <w:lvl w:ilvl="2" w:tentative="1">
+      <w:start w:val="1"/>
+      <w:numFmt w:val="bullet"/>
+      <w:lvlText w:val=""/>
+      <w:lvlJc w:val="left"/>
+      <w:pPr>
+        <w:tabs>
+          <w:tab w:val="num" w:pos="2160"/>
+        </w:tabs>
+        <w:ind w:left="2160" w:hanging="360"/>
+      </w:pPr>
+      <w:rPr>
+        <w:rFonts w:ascii="Wingdings" w:hAnsi="Wingdings" w:hint="default"/>
+        <w:sz w:val="20"/>
+      </w:rPr>
+    </w:lvl>
+    <w:lvl w:ilvl="3" w:tentative="1">
+      <w:start w:val="1"/>
+      <w:numFmt w:val="bullet"/>
+      <w:lvlText w:val=""/>
+      <w:lvlJc w:val="left"/>
+      <w:pPr>
+        <w:tabs>
+          <w:tab w:val="num" w:pos="2880"/>
+        </w:tabs>
+        <w:ind w:left="2880" w:hanging="360"/>
+      </w:pPr>
+      <w:rPr>
+        <w:rFonts w:ascii="Wingdings" w:hAnsi="Wingdings" w:hint="default"/>
+        <w:sz w:val="20"/>
+      </w:rPr>
+    </w:lvl>
+    <w:lvl w:ilvl="4" w:tentative="1">
+      <w:start w:val="1"/>
+      <w:numFmt w:val="bullet"/>
+      <w:lvlText w:val=""/>
+      <w:lvlJc w:val="left"/>
+      <w:pPr>
+        <w:tabs>
+          <w:tab w:val="num" w:pos="3600"/>
+        </w:tabs>
+        <w:ind w:left="3600" w:hanging="360"/>
+      </w:pPr>
+      <w:rPr>
+        <w:rFonts w:ascii="Wingdings" w:hAnsi="Wingdings" w:hint="default"/>
+        <w:sz w:val="20"/>
+      </w:rPr>
+    </w:lvl>
+    <w:lvl w:ilvl="5" w:tentative="1">
+      <w:start w:val="1"/>
+      <w:numFmt w:val="bullet"/>
+      <w:lvlText w:val=""/>
+      <w:lvlJc w:val="left"/>
+      <w:pPr>
+        <w:tabs>
+          <w:tab w:val="num" w:pos="4320"/>
+        </w:tabs>
+        <w:ind w:left="4320" w:hanging="360"/>
+      </w:pPr>
+      <w:rPr>
+        <w:rFonts w:ascii="Wingdings" w:hAnsi="Wingdings" w:hint="default"/>
+        <w:sz w:val="20"/>
+      </w:rPr>
+    </w:lvl>
+    <w:lvl w:ilvl="6" w:tentative="1">
+      <w:start w:val="1"/>
+      <w:numFmt w:val="bullet"/>
+      <w:lvlText w:val=""/>
+      <w:lvlJc w:val="left"/>
+      <w:pPr>
+        <w:tabs>
+          <w:tab w:val="num" w:pos="5040"/>
+        </w:tabs>
+        <w:ind w:left="5040" w:hanging="360"/>
+      </w:pPr>
+      <w:rPr>
+        <w:rFonts w:ascii="Wingdings" w:hAnsi="Wingdings" w:hint="default"/>
+        <w:sz w:val="20"/>
+      </w:rPr>
+    </w:lvl>
+    <w:lvl w:ilvl="7" w:tentative="1">
+      <w:start w:val="1"/>
+      <w:numFmt w:val="bullet"/>
+      <w:lvlText w:val=""/>
+      <w:lvlJc w:val="left"/>
+      <w:pPr>
+        <w:tabs>
+          <w:tab w:val="num" w:pos="5760"/>
+        </w:tabs>
+        <w:ind w:left="5760" w:hanging="360"/>
+      </w:pPr>
+      <w:rPr>
+        <w:rFonts w:ascii="Wingdings" w:hAnsi="Wingdings" w:hint="default"/>
+        <w:sz w:val="20"/>
+      </w:rPr>
+    </w:lvl>
+    <w:lvl w:ilvl="8" w:tentative="1">
+      <w:start w:val="1"/>
+      <w:numFmt w:val="bullet"/>
+      <w:lvlText w:val=""/>
+      <w:lvlJc w:val="left"/>
+      <w:pPr>
+        <w:tabs>
+          <w:tab w:val="num" w:pos="6480"/>
+        </w:tabs>
+        <w:ind w:left="6480" w:hanging="360"/>
+      </w:pPr>
+      <w:rPr>
+        <w:rFonts w:ascii="Wingdings" w:hAnsi="Wingdings" w:hint="default"/>
+        <w:sz w:val="20"/>
+      </w:rPr>
+    </w:lvl>
+  </w:abstractNum>
+  <w:abstractNum w:abstractNumId="18" w15:restartNumberingAfterBreak="0">
     <w:nsid w:val="16D400B4"/>
     <w:multiLevelType w:val="hybridMultilevel"/>
     <w:tmpl w:val="58E6DFBE"/>
@@ -9682,7 +10580,7 @@
       </w:rPr>
     </w:lvl>
   </w:abstractNum>
-  <w:abstractNum w:abstractNumId="18" w15:restartNumberingAfterBreak="0">
+  <w:abstractNum w:abstractNumId="19" w15:restartNumberingAfterBreak="0">
     <w:nsid w:val="17236012"/>
     <w:multiLevelType w:val="hybridMultilevel"/>
     <w:tmpl w:val="DAFA46C8"/>
@@ -9795,7 +10693,7 @@
       </w:rPr>
     </w:lvl>
   </w:abstractNum>
-  <w:abstractNum w:abstractNumId="19" w15:restartNumberingAfterBreak="0">
+  <w:abstractNum w:abstractNumId="20" w15:restartNumberingAfterBreak="0">
     <w:nsid w:val="172B04C0"/>
     <w:multiLevelType w:val="hybridMultilevel"/>
     <w:tmpl w:val="B6C41D5E"/>
@@ -9908,7 +10806,7 @@
       </w:rPr>
     </w:lvl>
   </w:abstractNum>
-  <w:abstractNum w:abstractNumId="20" w15:restartNumberingAfterBreak="0">
+  <w:abstractNum w:abstractNumId="21" w15:restartNumberingAfterBreak="0">
     <w:nsid w:val="17485CCB"/>
     <w:multiLevelType w:val="multilevel"/>
     <w:tmpl w:val="397E1AE0"/>
@@ -10057,7 +10955,7 @@
       </w:rPr>
     </w:lvl>
   </w:abstractNum>
-  <w:abstractNum w:abstractNumId="21" w15:restartNumberingAfterBreak="0">
+  <w:abstractNum w:abstractNumId="22" w15:restartNumberingAfterBreak="0">
     <w:nsid w:val="17763D31"/>
     <w:multiLevelType w:val="hybridMultilevel"/>
     <w:tmpl w:val="6CE63304"/>
@@ -10170,7 +11068,7 @@
       </w:rPr>
     </w:lvl>
   </w:abstractNum>
-  <w:abstractNum w:abstractNumId="22" w15:restartNumberingAfterBreak="0">
+  <w:abstractNum w:abstractNumId="23" w15:restartNumberingAfterBreak="0">
     <w:nsid w:val="17B06937"/>
     <w:multiLevelType w:val="hybridMultilevel"/>
     <w:tmpl w:val="71089CF2"/>
@@ -10283,7 +11181,7 @@
       </w:rPr>
     </w:lvl>
   </w:abstractNum>
-  <w:abstractNum w:abstractNumId="23" w15:restartNumberingAfterBreak="0">
+  <w:abstractNum w:abstractNumId="24" w15:restartNumberingAfterBreak="0">
     <w:nsid w:val="190F0390"/>
     <w:multiLevelType w:val="multilevel"/>
     <w:tmpl w:val="CBE4A4A4"/>
@@ -10432,7 +11330,7 @@
       </w:rPr>
     </w:lvl>
   </w:abstractNum>
-  <w:abstractNum w:abstractNumId="24" w15:restartNumberingAfterBreak="0">
+  <w:abstractNum w:abstractNumId="25" w15:restartNumberingAfterBreak="0">
     <w:nsid w:val="195875B0"/>
     <w:multiLevelType w:val="multilevel"/>
     <w:tmpl w:val="615444D4"/>
@@ -10545,7 +11443,7 @@
       </w:pPr>
     </w:lvl>
   </w:abstractNum>
-  <w:abstractNum w:abstractNumId="25" w15:restartNumberingAfterBreak="0">
+  <w:abstractNum w:abstractNumId="26" w15:restartNumberingAfterBreak="0">
     <w:nsid w:val="197C6FD7"/>
     <w:multiLevelType w:val="hybridMultilevel"/>
     <w:tmpl w:val="D97CEAA8"/>
@@ -10658,7 +11556,7 @@
       </w:rPr>
     </w:lvl>
   </w:abstractNum>
-  <w:abstractNum w:abstractNumId="26" w15:restartNumberingAfterBreak="0">
+  <w:abstractNum w:abstractNumId="27" w15:restartNumberingAfterBreak="0">
     <w:nsid w:val="1CC60A94"/>
     <w:multiLevelType w:val="multilevel"/>
     <w:tmpl w:val="EB74741C"/>
@@ -10807,7 +11705,7 @@
       </w:rPr>
     </w:lvl>
   </w:abstractNum>
-  <w:abstractNum w:abstractNumId="27" w15:restartNumberingAfterBreak="0">
+  <w:abstractNum w:abstractNumId="28" w15:restartNumberingAfterBreak="0">
     <w:nsid w:val="1E6658CF"/>
     <w:multiLevelType w:val="multilevel"/>
     <w:tmpl w:val="762ABC5E"/>
@@ -10956,7 +11854,7 @@
       </w:rPr>
     </w:lvl>
   </w:abstractNum>
-  <w:abstractNum w:abstractNumId="28" w15:restartNumberingAfterBreak="0">
+  <w:abstractNum w:abstractNumId="29" w15:restartNumberingAfterBreak="0">
     <w:nsid w:val="1FA532B0"/>
     <w:multiLevelType w:val="multilevel"/>
     <w:tmpl w:val="8718294C"/>
@@ -11105,7 +12003,7 @@
       </w:rPr>
     </w:lvl>
   </w:abstractNum>
-  <w:abstractNum w:abstractNumId="29" w15:restartNumberingAfterBreak="0">
+  <w:abstractNum w:abstractNumId="30" w15:restartNumberingAfterBreak="0">
     <w:nsid w:val="215C77FD"/>
     <w:multiLevelType w:val="hybridMultilevel"/>
     <w:tmpl w:val="58F41D10"/>
@@ -11194,7 +12092,7 @@
       </w:pPr>
     </w:lvl>
   </w:abstractNum>
-  <w:abstractNum w:abstractNumId="30" w15:restartNumberingAfterBreak="0">
+  <w:abstractNum w:abstractNumId="31" w15:restartNumberingAfterBreak="0">
     <w:nsid w:val="218D5909"/>
     <w:multiLevelType w:val="hybridMultilevel"/>
     <w:tmpl w:val="CC989EE4"/>
@@ -11307,7 +12205,7 @@
       </w:rPr>
     </w:lvl>
   </w:abstractNum>
-  <w:abstractNum w:abstractNumId="31" w15:restartNumberingAfterBreak="0">
+  <w:abstractNum w:abstractNumId="32" w15:restartNumberingAfterBreak="0">
     <w:nsid w:val="23E010BA"/>
     <w:multiLevelType w:val="multilevel"/>
     <w:tmpl w:val="4A16907E"/>
@@ -11456,7 +12354,7 @@
       </w:rPr>
     </w:lvl>
   </w:abstractNum>
-  <w:abstractNum w:abstractNumId="32" w15:restartNumberingAfterBreak="0">
+  <w:abstractNum w:abstractNumId="33" w15:restartNumberingAfterBreak="0">
     <w:nsid w:val="2470127A"/>
     <w:multiLevelType w:val="multilevel"/>
     <w:tmpl w:val="309E9618"/>
@@ -11605,7 +12503,7 @@
       </w:rPr>
     </w:lvl>
   </w:abstractNum>
-  <w:abstractNum w:abstractNumId="33" w15:restartNumberingAfterBreak="0">
+  <w:abstractNum w:abstractNumId="34" w15:restartNumberingAfterBreak="0">
     <w:nsid w:val="24796798"/>
     <w:multiLevelType w:val="hybridMultilevel"/>
     <w:tmpl w:val="6622BEDC"/>
@@ -11694,7 +12592,7 @@
       </w:pPr>
     </w:lvl>
   </w:abstractNum>
-  <w:abstractNum w:abstractNumId="34" w15:restartNumberingAfterBreak="0">
+  <w:abstractNum w:abstractNumId="35" w15:restartNumberingAfterBreak="0">
     <w:nsid w:val="253B76EC"/>
     <w:multiLevelType w:val="multilevel"/>
     <w:tmpl w:val="2AA67CDA"/>
@@ -11843,7 +12741,7 @@
       </w:rPr>
     </w:lvl>
   </w:abstractNum>
-  <w:abstractNum w:abstractNumId="35" w15:restartNumberingAfterBreak="0">
+  <w:abstractNum w:abstractNumId="36" w15:restartNumberingAfterBreak="0">
     <w:nsid w:val="2E4D738C"/>
     <w:multiLevelType w:val="multilevel"/>
     <w:tmpl w:val="1540BBA2"/>
@@ -11992,7 +12890,7 @@
       </w:rPr>
     </w:lvl>
   </w:abstractNum>
-  <w:abstractNum w:abstractNumId="36" w15:restartNumberingAfterBreak="0">
+  <w:abstractNum w:abstractNumId="37" w15:restartNumberingAfterBreak="0">
     <w:nsid w:val="2F0041C7"/>
     <w:multiLevelType w:val="multilevel"/>
     <w:tmpl w:val="656414FE"/>
@@ -12141,7 +13039,7 @@
       </w:rPr>
     </w:lvl>
   </w:abstractNum>
-  <w:abstractNum w:abstractNumId="37" w15:restartNumberingAfterBreak="0">
+  <w:abstractNum w:abstractNumId="38" w15:restartNumberingAfterBreak="0">
     <w:nsid w:val="304F01FA"/>
     <w:multiLevelType w:val="multilevel"/>
     <w:tmpl w:val="151C4EC6"/>
@@ -12290,7 +13188,7 @@
       </w:rPr>
     </w:lvl>
   </w:abstractNum>
-  <w:abstractNum w:abstractNumId="38" w15:restartNumberingAfterBreak="0">
+  <w:abstractNum w:abstractNumId="39" w15:restartNumberingAfterBreak="0">
     <w:nsid w:val="30BD025D"/>
     <w:multiLevelType w:val="hybridMultilevel"/>
     <w:tmpl w:val="04381C82"/>
@@ -12379,7 +13277,7 @@
       </w:pPr>
     </w:lvl>
   </w:abstractNum>
-  <w:abstractNum w:abstractNumId="39" w15:restartNumberingAfterBreak="0">
+  <w:abstractNum w:abstractNumId="40" w15:restartNumberingAfterBreak="0">
     <w:nsid w:val="327C0BA6"/>
     <w:multiLevelType w:val="hybridMultilevel"/>
     <w:tmpl w:val="2A9047EE"/>
@@ -12492,7 +13390,7 @@
       </w:rPr>
     </w:lvl>
   </w:abstractNum>
-  <w:abstractNum w:abstractNumId="40" w15:restartNumberingAfterBreak="0">
+  <w:abstractNum w:abstractNumId="41" w15:restartNumberingAfterBreak="0">
     <w:nsid w:val="338D63E8"/>
     <w:multiLevelType w:val="hybridMultilevel"/>
     <w:tmpl w:val="28D0FB50"/>
@@ -12605,7 +13503,7 @@
       </w:rPr>
     </w:lvl>
   </w:abstractNum>
-  <w:abstractNum w:abstractNumId="41" w15:restartNumberingAfterBreak="0">
+  <w:abstractNum w:abstractNumId="42" w15:restartNumberingAfterBreak="0">
     <w:nsid w:val="34182771"/>
     <w:multiLevelType w:val="multilevel"/>
     <w:tmpl w:val="2AA67CDA"/>
@@ -12754,7 +13652,7 @@
       </w:rPr>
     </w:lvl>
   </w:abstractNum>
-  <w:abstractNum w:abstractNumId="42" w15:restartNumberingAfterBreak="0">
+  <w:abstractNum w:abstractNumId="43" w15:restartNumberingAfterBreak="0">
     <w:nsid w:val="35413E58"/>
     <w:multiLevelType w:val="hybridMultilevel"/>
     <w:tmpl w:val="03C64164"/>
@@ -12867,7 +13765,7 @@
       </w:rPr>
     </w:lvl>
   </w:abstractNum>
-  <w:abstractNum w:abstractNumId="43" w15:restartNumberingAfterBreak="0">
+  <w:abstractNum w:abstractNumId="44" w15:restartNumberingAfterBreak="0">
     <w:nsid w:val="35C86AF0"/>
     <w:multiLevelType w:val="multilevel"/>
     <w:tmpl w:val="8202FCD6"/>
@@ -13016,7 +13914,7 @@
       </w:rPr>
     </w:lvl>
   </w:abstractNum>
-  <w:abstractNum w:abstractNumId="44" w15:restartNumberingAfterBreak="0">
+  <w:abstractNum w:abstractNumId="45" w15:restartNumberingAfterBreak="0">
     <w:nsid w:val="3623194A"/>
     <w:multiLevelType w:val="multilevel"/>
     <w:tmpl w:val="63F4E6F0"/>
@@ -13165,7 +14063,7 @@
       </w:rPr>
     </w:lvl>
   </w:abstractNum>
-  <w:abstractNum w:abstractNumId="45" w15:restartNumberingAfterBreak="0">
+  <w:abstractNum w:abstractNumId="46" w15:restartNumberingAfterBreak="0">
     <w:nsid w:val="36E36979"/>
     <w:multiLevelType w:val="multilevel"/>
     <w:tmpl w:val="3D58C93A"/>
@@ -13314,7 +14212,7 @@
       </w:rPr>
     </w:lvl>
   </w:abstractNum>
-  <w:abstractNum w:abstractNumId="46" w15:restartNumberingAfterBreak="0">
+  <w:abstractNum w:abstractNumId="47" w15:restartNumberingAfterBreak="0">
     <w:nsid w:val="37B424C3"/>
     <w:multiLevelType w:val="hybridMultilevel"/>
     <w:tmpl w:val="18F030D4"/>
@@ -13427,7 +14325,7 @@
       </w:rPr>
     </w:lvl>
   </w:abstractNum>
-  <w:abstractNum w:abstractNumId="47" w15:restartNumberingAfterBreak="0">
+  <w:abstractNum w:abstractNumId="48" w15:restartNumberingAfterBreak="0">
     <w:nsid w:val="3BC10D30"/>
     <w:multiLevelType w:val="multilevel"/>
     <w:tmpl w:val="502AD78C"/>
@@ -13576,7 +14474,156 @@
       </w:rPr>
     </w:lvl>
   </w:abstractNum>
-  <w:abstractNum w:abstractNumId="48" w15:restartNumberingAfterBreak="0">
+  <w:abstractNum w:abstractNumId="49" w15:restartNumberingAfterBreak="0">
+    <w:nsid w:val="3C276BB8"/>
+    <w:multiLevelType w:val="multilevel"/>
+    <w:tmpl w:val="2AA67CDA"/>
+    <w:lvl w:ilvl="0">
+      <w:start w:val="1"/>
+      <w:numFmt w:val="bullet"/>
+      <w:lvlText w:val=""/>
+      <w:lvlJc w:val="left"/>
+      <w:pPr>
+        <w:tabs>
+          <w:tab w:val="num" w:pos="720"/>
+        </w:tabs>
+        <w:ind w:left="720" w:hanging="360"/>
+      </w:pPr>
+      <w:rPr>
+        <w:rFonts w:ascii="Wingdings" w:hAnsi="Wingdings" w:hint="default"/>
+        <w:sz w:val="20"/>
+      </w:rPr>
+    </w:lvl>
+    <w:lvl w:ilvl="1" w:tentative="1">
+      <w:start w:val="1"/>
+      <w:numFmt w:val="bullet"/>
+      <w:lvlText w:val="o"/>
+      <w:lvlJc w:val="left"/>
+      <w:pPr>
+        <w:tabs>
+          <w:tab w:val="num" w:pos="1440"/>
+        </w:tabs>
+        <w:ind w:left="1440" w:hanging="360"/>
+      </w:pPr>
+      <w:rPr>
+        <w:rFonts w:ascii="Courier New" w:hAnsi="Courier New" w:hint="default"/>
+        <w:sz w:val="20"/>
+      </w:rPr>
+    </w:lvl>
+    <w:lvl w:ilvl="2" w:tentative="1">
+      <w:start w:val="1"/>
+      <w:numFmt w:val="bullet"/>
+      <w:lvlText w:val=""/>
+      <w:lvlJc w:val="left"/>
+      <w:pPr>
+        <w:tabs>
+          <w:tab w:val="num" w:pos="2160"/>
+        </w:tabs>
+        <w:ind w:left="2160" w:hanging="360"/>
+      </w:pPr>
+      <w:rPr>
+        <w:rFonts w:ascii="Wingdings" w:hAnsi="Wingdings" w:hint="default"/>
+        <w:sz w:val="20"/>
+      </w:rPr>
+    </w:lvl>
+    <w:lvl w:ilvl="3" w:tentative="1">
+      <w:start w:val="1"/>
+      <w:numFmt w:val="bullet"/>
+      <w:lvlText w:val=""/>
+      <w:lvlJc w:val="left"/>
+      <w:pPr>
+        <w:tabs>
+          <w:tab w:val="num" w:pos="2880"/>
+        </w:tabs>
+        <w:ind w:left="2880" w:hanging="360"/>
+      </w:pPr>
+      <w:rPr>
+        <w:rFonts w:ascii="Wingdings" w:hAnsi="Wingdings" w:hint="default"/>
+        <w:sz w:val="20"/>
+      </w:rPr>
+    </w:lvl>
+    <w:lvl w:ilvl="4" w:tentative="1">
+      <w:start w:val="1"/>
+      <w:numFmt w:val="bullet"/>
+      <w:lvlText w:val=""/>
+      <w:lvlJc w:val="left"/>
+      <w:pPr>
+        <w:tabs>
+          <w:tab w:val="num" w:pos="3600"/>
+        </w:tabs>
+        <w:ind w:left="3600" w:hanging="360"/>
+      </w:pPr>
+      <w:rPr>
+        <w:rFonts w:ascii="Wingdings" w:hAnsi="Wingdings" w:hint="default"/>
+        <w:sz w:val="20"/>
+      </w:rPr>
+    </w:lvl>
+    <w:lvl w:ilvl="5" w:tentative="1">
+      <w:start w:val="1"/>
+      <w:numFmt w:val="bullet"/>
+      <w:lvlText w:val=""/>
+      <w:lvlJc w:val="left"/>
+      <w:pPr>
+        <w:tabs>
+          <w:tab w:val="num" w:pos="4320"/>
+        </w:tabs>
+        <w:ind w:left="4320" w:hanging="360"/>
+      </w:pPr>
+      <w:rPr>
+        <w:rFonts w:ascii="Wingdings" w:hAnsi="Wingdings" w:hint="default"/>
+        <w:sz w:val="20"/>
+      </w:rPr>
+    </w:lvl>
+    <w:lvl w:ilvl="6" w:tentative="1">
+      <w:start w:val="1"/>
+      <w:numFmt w:val="bullet"/>
+      <w:lvlText w:val=""/>
+      <w:lvlJc w:val="left"/>
+      <w:pPr>
+        <w:tabs>
+          <w:tab w:val="num" w:pos="5040"/>
+        </w:tabs>
+        <w:ind w:left="5040" w:hanging="360"/>
+      </w:pPr>
+      <w:rPr>
+        <w:rFonts w:ascii="Wingdings" w:hAnsi="Wingdings" w:hint="default"/>
+        <w:sz w:val="20"/>
+      </w:rPr>
+    </w:lvl>
+    <w:lvl w:ilvl="7" w:tentative="1">
+      <w:start w:val="1"/>
+      <w:numFmt w:val="bullet"/>
+      <w:lvlText w:val=""/>
+      <w:lvlJc w:val="left"/>
+      <w:pPr>
+        <w:tabs>
+          <w:tab w:val="num" w:pos="5760"/>
+        </w:tabs>
+        <w:ind w:left="5760" w:hanging="360"/>
+      </w:pPr>
+      <w:rPr>
+        <w:rFonts w:ascii="Wingdings" w:hAnsi="Wingdings" w:hint="default"/>
+        <w:sz w:val="20"/>
+      </w:rPr>
+    </w:lvl>
+    <w:lvl w:ilvl="8" w:tentative="1">
+      <w:start w:val="1"/>
+      <w:numFmt w:val="bullet"/>
+      <w:lvlText w:val=""/>
+      <w:lvlJc w:val="left"/>
+      <w:pPr>
+        <w:tabs>
+          <w:tab w:val="num" w:pos="6480"/>
+        </w:tabs>
+        <w:ind w:left="6480" w:hanging="360"/>
+      </w:pPr>
+      <w:rPr>
+        <w:rFonts w:ascii="Wingdings" w:hAnsi="Wingdings" w:hint="default"/>
+        <w:sz w:val="20"/>
+      </w:rPr>
+    </w:lvl>
+  </w:abstractNum>
+  <w:abstractNum w:abstractNumId="50" w15:restartNumberingAfterBreak="0">
     <w:nsid w:val="3C596808"/>
     <w:multiLevelType w:val="multilevel"/>
     <w:tmpl w:val="2AA67CDA"/>
@@ -13725,7 +14772,7 @@
       </w:rPr>
     </w:lvl>
   </w:abstractNum>
-  <w:abstractNum w:abstractNumId="49" w15:restartNumberingAfterBreak="0">
+  <w:abstractNum w:abstractNumId="51" w15:restartNumberingAfterBreak="0">
     <w:nsid w:val="3CBF280A"/>
     <w:multiLevelType w:val="multilevel"/>
     <w:tmpl w:val="A13E4362"/>
@@ -13874,7 +14921,7 @@
       </w:rPr>
     </w:lvl>
   </w:abstractNum>
-  <w:abstractNum w:abstractNumId="50" w15:restartNumberingAfterBreak="0">
+  <w:abstractNum w:abstractNumId="52" w15:restartNumberingAfterBreak="0">
     <w:nsid w:val="3CC7541B"/>
     <w:multiLevelType w:val="multilevel"/>
     <w:tmpl w:val="2AA67CDA"/>
@@ -14023,7 +15070,7 @@
       </w:rPr>
     </w:lvl>
   </w:abstractNum>
-  <w:abstractNum w:abstractNumId="51" w15:restartNumberingAfterBreak="0">
+  <w:abstractNum w:abstractNumId="53" w15:restartNumberingAfterBreak="0">
     <w:nsid w:val="3F5E3BA1"/>
     <w:multiLevelType w:val="multilevel"/>
     <w:tmpl w:val="2AA67CDA"/>
@@ -14172,7 +15219,7 @@
       </w:rPr>
     </w:lvl>
   </w:abstractNum>
-  <w:abstractNum w:abstractNumId="52" w15:restartNumberingAfterBreak="0">
+  <w:abstractNum w:abstractNumId="54" w15:restartNumberingAfterBreak="0">
     <w:nsid w:val="40431B1C"/>
     <w:multiLevelType w:val="multilevel"/>
     <w:tmpl w:val="5D8E77D0"/>
@@ -14321,7 +15368,7 @@
       </w:rPr>
     </w:lvl>
   </w:abstractNum>
-  <w:abstractNum w:abstractNumId="53" w15:restartNumberingAfterBreak="0">
+  <w:abstractNum w:abstractNumId="55" w15:restartNumberingAfterBreak="0">
     <w:nsid w:val="452F60FB"/>
     <w:multiLevelType w:val="hybridMultilevel"/>
     <w:tmpl w:val="892A990A"/>
@@ -14434,7 +15481,156 @@
       </w:rPr>
     </w:lvl>
   </w:abstractNum>
-  <w:abstractNum w:abstractNumId="54" w15:restartNumberingAfterBreak="0">
+  <w:abstractNum w:abstractNumId="56" w15:restartNumberingAfterBreak="0">
+    <w:nsid w:val="47B65409"/>
+    <w:multiLevelType w:val="multilevel"/>
+    <w:tmpl w:val="2AA67CDA"/>
+    <w:lvl w:ilvl="0">
+      <w:start w:val="1"/>
+      <w:numFmt w:val="bullet"/>
+      <w:lvlText w:val=""/>
+      <w:lvlJc w:val="left"/>
+      <w:pPr>
+        <w:tabs>
+          <w:tab w:val="num" w:pos="720"/>
+        </w:tabs>
+        <w:ind w:left="720" w:hanging="360"/>
+      </w:pPr>
+      <w:rPr>
+        <w:rFonts w:ascii="Wingdings" w:hAnsi="Wingdings" w:hint="default"/>
+        <w:sz w:val="20"/>
+      </w:rPr>
+    </w:lvl>
+    <w:lvl w:ilvl="1" w:tentative="1">
+      <w:start w:val="1"/>
+      <w:numFmt w:val="bullet"/>
+      <w:lvlText w:val="o"/>
+      <w:lvlJc w:val="left"/>
+      <w:pPr>
+        <w:tabs>
+          <w:tab w:val="num" w:pos="1440"/>
+        </w:tabs>
+        <w:ind w:left="1440" w:hanging="360"/>
+      </w:pPr>
+      <w:rPr>
+        <w:rFonts w:ascii="Courier New" w:hAnsi="Courier New" w:hint="default"/>
+        <w:sz w:val="20"/>
+      </w:rPr>
+    </w:lvl>
+    <w:lvl w:ilvl="2" w:tentative="1">
+      <w:start w:val="1"/>
+      <w:numFmt w:val="bullet"/>
+      <w:lvlText w:val=""/>
+      <w:lvlJc w:val="left"/>
+      <w:pPr>
+        <w:tabs>
+          <w:tab w:val="num" w:pos="2160"/>
+        </w:tabs>
+        <w:ind w:left="2160" w:hanging="360"/>
+      </w:pPr>
+      <w:rPr>
+        <w:rFonts w:ascii="Wingdings" w:hAnsi="Wingdings" w:hint="default"/>
+        <w:sz w:val="20"/>
+      </w:rPr>
+    </w:lvl>
+    <w:lvl w:ilvl="3" w:tentative="1">
+      <w:start w:val="1"/>
+      <w:numFmt w:val="bullet"/>
+      <w:lvlText w:val=""/>
+      <w:lvlJc w:val="left"/>
+      <w:pPr>
+        <w:tabs>
+          <w:tab w:val="num" w:pos="2880"/>
+        </w:tabs>
+        <w:ind w:left="2880" w:hanging="360"/>
+      </w:pPr>
+      <w:rPr>
+        <w:rFonts w:ascii="Wingdings" w:hAnsi="Wingdings" w:hint="default"/>
+        <w:sz w:val="20"/>
+      </w:rPr>
+    </w:lvl>
+    <w:lvl w:ilvl="4" w:tentative="1">
+      <w:start w:val="1"/>
+      <w:numFmt w:val="bullet"/>
+      <w:lvlText w:val=""/>
+      <w:lvlJc w:val="left"/>
+      <w:pPr>
+        <w:tabs>
+          <w:tab w:val="num" w:pos="3600"/>
+        </w:tabs>
+        <w:ind w:left="3600" w:hanging="360"/>
+      </w:pPr>
+      <w:rPr>
+        <w:rFonts w:ascii="Wingdings" w:hAnsi="Wingdings" w:hint="default"/>
+        <w:sz w:val="20"/>
+      </w:rPr>
+    </w:lvl>
+    <w:lvl w:ilvl="5" w:tentative="1">
+      <w:start w:val="1"/>
+      <w:numFmt w:val="bullet"/>
+      <w:lvlText w:val=""/>
+      <w:lvlJc w:val="left"/>
+      <w:pPr>
+        <w:tabs>
+          <w:tab w:val="num" w:pos="4320"/>
+        </w:tabs>
+        <w:ind w:left="4320" w:hanging="360"/>
+      </w:pPr>
+      <w:rPr>
+        <w:rFonts w:ascii="Wingdings" w:hAnsi="Wingdings" w:hint="default"/>
+        <w:sz w:val="20"/>
+      </w:rPr>
+    </w:lvl>
+    <w:lvl w:ilvl="6" w:tentative="1">
+      <w:start w:val="1"/>
+      <w:numFmt w:val="bullet"/>
+      <w:lvlText w:val=""/>
+      <w:lvlJc w:val="left"/>
+      <w:pPr>
+        <w:tabs>
+          <w:tab w:val="num" w:pos="5040"/>
+        </w:tabs>
+        <w:ind w:left="5040" w:hanging="360"/>
+      </w:pPr>
+      <w:rPr>
+        <w:rFonts w:ascii="Wingdings" w:hAnsi="Wingdings" w:hint="default"/>
+        <w:sz w:val="20"/>
+      </w:rPr>
+    </w:lvl>
+    <w:lvl w:ilvl="7" w:tentative="1">
+      <w:start w:val="1"/>
+      <w:numFmt w:val="bullet"/>
+      <w:lvlText w:val=""/>
+      <w:lvlJc w:val="left"/>
+      <w:pPr>
+        <w:tabs>
+          <w:tab w:val="num" w:pos="5760"/>
+        </w:tabs>
+        <w:ind w:left="5760" w:hanging="360"/>
+      </w:pPr>
+      <w:rPr>
+        <w:rFonts w:ascii="Wingdings" w:hAnsi="Wingdings" w:hint="default"/>
+        <w:sz w:val="20"/>
+      </w:rPr>
+    </w:lvl>
+    <w:lvl w:ilvl="8" w:tentative="1">
+      <w:start w:val="1"/>
+      <w:numFmt w:val="bullet"/>
+      <w:lvlText w:val=""/>
+      <w:lvlJc w:val="left"/>
+      <w:pPr>
+        <w:tabs>
+          <w:tab w:val="num" w:pos="6480"/>
+        </w:tabs>
+        <w:ind w:left="6480" w:hanging="360"/>
+      </w:pPr>
+      <w:rPr>
+        <w:rFonts w:ascii="Wingdings" w:hAnsi="Wingdings" w:hint="default"/>
+        <w:sz w:val="20"/>
+      </w:rPr>
+    </w:lvl>
+  </w:abstractNum>
+  <w:abstractNum w:abstractNumId="57" w15:restartNumberingAfterBreak="0">
     <w:nsid w:val="47BF2170"/>
     <w:multiLevelType w:val="multilevel"/>
     <w:tmpl w:val="D9681266"/>
@@ -14583,7 +15779,7 @@
       </w:rPr>
     </w:lvl>
   </w:abstractNum>
-  <w:abstractNum w:abstractNumId="55" w15:restartNumberingAfterBreak="0">
+  <w:abstractNum w:abstractNumId="58" w15:restartNumberingAfterBreak="0">
     <w:nsid w:val="47E5592F"/>
     <w:multiLevelType w:val="hybridMultilevel"/>
     <w:tmpl w:val="719AB9FA"/>
@@ -14696,7 +15892,7 @@
       </w:rPr>
     </w:lvl>
   </w:abstractNum>
-  <w:abstractNum w:abstractNumId="56" w15:restartNumberingAfterBreak="0">
+  <w:abstractNum w:abstractNumId="59" w15:restartNumberingAfterBreak="0">
     <w:nsid w:val="48C041A9"/>
     <w:multiLevelType w:val="multilevel"/>
     <w:tmpl w:val="59A694BC"/>
@@ -14845,7 +16041,156 @@
       </w:rPr>
     </w:lvl>
   </w:abstractNum>
-  <w:abstractNum w:abstractNumId="57" w15:restartNumberingAfterBreak="0">
+  <w:abstractNum w:abstractNumId="60" w15:restartNumberingAfterBreak="0">
+    <w:nsid w:val="49D6568A"/>
+    <w:multiLevelType w:val="multilevel"/>
+    <w:tmpl w:val="559E29EC"/>
+    <w:lvl w:ilvl="0">
+      <w:start w:val="1"/>
+      <w:numFmt w:val="bullet"/>
+      <w:lvlText w:val=""/>
+      <w:lvlJc w:val="left"/>
+      <w:pPr>
+        <w:tabs>
+          <w:tab w:val="num" w:pos="720"/>
+        </w:tabs>
+        <w:ind w:left="720" w:hanging="360"/>
+      </w:pPr>
+      <w:rPr>
+        <w:rFonts w:ascii="Symbol" w:hAnsi="Symbol" w:hint="default"/>
+        <w:sz w:val="20"/>
+      </w:rPr>
+    </w:lvl>
+    <w:lvl w:ilvl="1" w:tentative="1">
+      <w:start w:val="1"/>
+      <w:numFmt w:val="bullet"/>
+      <w:lvlText w:val="o"/>
+      <w:lvlJc w:val="left"/>
+      <w:pPr>
+        <w:tabs>
+          <w:tab w:val="num" w:pos="1440"/>
+        </w:tabs>
+        <w:ind w:left="1440" w:hanging="360"/>
+      </w:pPr>
+      <w:rPr>
+        <w:rFonts w:ascii="Courier New" w:hAnsi="Courier New" w:hint="default"/>
+        <w:sz w:val="20"/>
+      </w:rPr>
+    </w:lvl>
+    <w:lvl w:ilvl="2" w:tentative="1">
+      <w:start w:val="1"/>
+      <w:numFmt w:val="bullet"/>
+      <w:lvlText w:val=""/>
+      <w:lvlJc w:val="left"/>
+      <w:pPr>
+        <w:tabs>
+          <w:tab w:val="num" w:pos="2160"/>
+        </w:tabs>
+        <w:ind w:left="2160" w:hanging="360"/>
+      </w:pPr>
+      <w:rPr>
+        <w:rFonts w:ascii="Wingdings" w:hAnsi="Wingdings" w:hint="default"/>
+        <w:sz w:val="20"/>
+      </w:rPr>
+    </w:lvl>
+    <w:lvl w:ilvl="3" w:tentative="1">
+      <w:start w:val="1"/>
+      <w:numFmt w:val="bullet"/>
+      <w:lvlText w:val=""/>
+      <w:lvlJc w:val="left"/>
+      <w:pPr>
+        <w:tabs>
+          <w:tab w:val="num" w:pos="2880"/>
+        </w:tabs>
+        <w:ind w:left="2880" w:hanging="360"/>
+      </w:pPr>
+      <w:rPr>
+        <w:rFonts w:ascii="Wingdings" w:hAnsi="Wingdings" w:hint="default"/>
+        <w:sz w:val="20"/>
+      </w:rPr>
+    </w:lvl>
+    <w:lvl w:ilvl="4" w:tentative="1">
+      <w:start w:val="1"/>
+      <w:numFmt w:val="bullet"/>
+      <w:lvlText w:val=""/>
+      <w:lvlJc w:val="left"/>
+      <w:pPr>
+        <w:tabs>
+          <w:tab w:val="num" w:pos="3600"/>
+        </w:tabs>
+        <w:ind w:left="3600" w:hanging="360"/>
+      </w:pPr>
+      <w:rPr>
+        <w:rFonts w:ascii="Wingdings" w:hAnsi="Wingdings" w:hint="default"/>
+        <w:sz w:val="20"/>
+      </w:rPr>
+    </w:lvl>
+    <w:lvl w:ilvl="5" w:tentative="1">
+      <w:start w:val="1"/>
+      <w:numFmt w:val="bullet"/>
+      <w:lvlText w:val=""/>
+      <w:lvlJc w:val="left"/>
+      <w:pPr>
+        <w:tabs>
+          <w:tab w:val="num" w:pos="4320"/>
+        </w:tabs>
+        <w:ind w:left="4320" w:hanging="360"/>
+      </w:pPr>
+      <w:rPr>
+        <w:rFonts w:ascii="Wingdings" w:hAnsi="Wingdings" w:hint="default"/>
+        <w:sz w:val="20"/>
+      </w:rPr>
+    </w:lvl>
+    <w:lvl w:ilvl="6" w:tentative="1">
+      <w:start w:val="1"/>
+      <w:numFmt w:val="bullet"/>
+      <w:lvlText w:val=""/>
+      <w:lvlJc w:val="left"/>
+      <w:pPr>
+        <w:tabs>
+          <w:tab w:val="num" w:pos="5040"/>
+        </w:tabs>
+        <w:ind w:left="5040" w:hanging="360"/>
+      </w:pPr>
+      <w:rPr>
+        <w:rFonts w:ascii="Wingdings" w:hAnsi="Wingdings" w:hint="default"/>
+        <w:sz w:val="20"/>
+      </w:rPr>
+    </w:lvl>
+    <w:lvl w:ilvl="7" w:tentative="1">
+      <w:start w:val="1"/>
+      <w:numFmt w:val="bullet"/>
+      <w:lvlText w:val=""/>
+      <w:lvlJc w:val="left"/>
+      <w:pPr>
+        <w:tabs>
+          <w:tab w:val="num" w:pos="5760"/>
+        </w:tabs>
+        <w:ind w:left="5760" w:hanging="360"/>
+      </w:pPr>
+      <w:rPr>
+        <w:rFonts w:ascii="Wingdings" w:hAnsi="Wingdings" w:hint="default"/>
+        <w:sz w:val="20"/>
+      </w:rPr>
+    </w:lvl>
+    <w:lvl w:ilvl="8" w:tentative="1">
+      <w:start w:val="1"/>
+      <w:numFmt w:val="bullet"/>
+      <w:lvlText w:val=""/>
+      <w:lvlJc w:val="left"/>
+      <w:pPr>
+        <w:tabs>
+          <w:tab w:val="num" w:pos="6480"/>
+        </w:tabs>
+        <w:ind w:left="6480" w:hanging="360"/>
+      </w:pPr>
+      <w:rPr>
+        <w:rFonts w:ascii="Wingdings" w:hAnsi="Wingdings" w:hint="default"/>
+        <w:sz w:val="20"/>
+      </w:rPr>
+    </w:lvl>
+  </w:abstractNum>
+  <w:abstractNum w:abstractNumId="61" w15:restartNumberingAfterBreak="0">
     <w:nsid w:val="4AF73293"/>
     <w:multiLevelType w:val="hybridMultilevel"/>
     <w:tmpl w:val="F2962738"/>
@@ -14958,7 +16303,7 @@
       </w:rPr>
     </w:lvl>
   </w:abstractNum>
-  <w:abstractNum w:abstractNumId="58" w15:restartNumberingAfterBreak="0">
+  <w:abstractNum w:abstractNumId="62" w15:restartNumberingAfterBreak="0">
     <w:nsid w:val="4B375248"/>
     <w:multiLevelType w:val="multilevel"/>
     <w:tmpl w:val="B574C1C6"/>
@@ -15107,7 +16452,7 @@
       </w:rPr>
     </w:lvl>
   </w:abstractNum>
-  <w:abstractNum w:abstractNumId="59" w15:restartNumberingAfterBreak="0">
+  <w:abstractNum w:abstractNumId="63" w15:restartNumberingAfterBreak="0">
     <w:nsid w:val="4BA13766"/>
     <w:multiLevelType w:val="multilevel"/>
     <w:tmpl w:val="63F4E6F0"/>
@@ -15256,7 +16601,7 @@
       </w:rPr>
     </w:lvl>
   </w:abstractNum>
-  <w:abstractNum w:abstractNumId="60" w15:restartNumberingAfterBreak="0">
+  <w:abstractNum w:abstractNumId="64" w15:restartNumberingAfterBreak="0">
     <w:nsid w:val="4BA25441"/>
     <w:multiLevelType w:val="hybridMultilevel"/>
     <w:tmpl w:val="217E2E96"/>
@@ -15369,7 +16714,7 @@
       </w:rPr>
     </w:lvl>
   </w:abstractNum>
-  <w:abstractNum w:abstractNumId="61" w15:restartNumberingAfterBreak="0">
+  <w:abstractNum w:abstractNumId="65" w15:restartNumberingAfterBreak="0">
     <w:nsid w:val="4E276DCB"/>
     <w:multiLevelType w:val="hybridMultilevel"/>
     <w:tmpl w:val="B7C469B4"/>
@@ -15482,7 +16827,7 @@
       </w:rPr>
     </w:lvl>
   </w:abstractNum>
-  <w:abstractNum w:abstractNumId="62" w15:restartNumberingAfterBreak="0">
+  <w:abstractNum w:abstractNumId="66" w15:restartNumberingAfterBreak="0">
     <w:nsid w:val="4F053929"/>
     <w:multiLevelType w:val="hybridMultilevel"/>
     <w:tmpl w:val="2A78C678"/>
@@ -15595,7 +16940,7 @@
       </w:rPr>
     </w:lvl>
   </w:abstractNum>
-  <w:abstractNum w:abstractNumId="63" w15:restartNumberingAfterBreak="0">
+  <w:abstractNum w:abstractNumId="67" w15:restartNumberingAfterBreak="0">
     <w:nsid w:val="4FFB237E"/>
     <w:multiLevelType w:val="multilevel"/>
     <w:tmpl w:val="2AA67CDA"/>
@@ -15744,7 +17089,7 @@
       </w:rPr>
     </w:lvl>
   </w:abstractNum>
-  <w:abstractNum w:abstractNumId="64" w15:restartNumberingAfterBreak="0">
+  <w:abstractNum w:abstractNumId="68" w15:restartNumberingAfterBreak="0">
     <w:nsid w:val="51737FE0"/>
     <w:multiLevelType w:val="hybridMultilevel"/>
     <w:tmpl w:val="2B0604E6"/>
@@ -15857,7 +17202,156 @@
       </w:rPr>
     </w:lvl>
   </w:abstractNum>
-  <w:abstractNum w:abstractNumId="65" w15:restartNumberingAfterBreak="0">
+  <w:abstractNum w:abstractNumId="69" w15:restartNumberingAfterBreak="0">
+    <w:nsid w:val="518B1885"/>
+    <w:multiLevelType w:val="multilevel"/>
+    <w:tmpl w:val="AE1AAC28"/>
+    <w:lvl w:ilvl="0">
+      <w:start w:val="1"/>
+      <w:numFmt w:val="bullet"/>
+      <w:lvlText w:val=""/>
+      <w:lvlJc w:val="left"/>
+      <w:pPr>
+        <w:tabs>
+          <w:tab w:val="num" w:pos="720"/>
+        </w:tabs>
+        <w:ind w:left="720" w:hanging="360"/>
+      </w:pPr>
+      <w:rPr>
+        <w:rFonts w:ascii="Symbol" w:hAnsi="Symbol" w:hint="default"/>
+        <w:sz w:val="20"/>
+      </w:rPr>
+    </w:lvl>
+    <w:lvl w:ilvl="1" w:tentative="1">
+      <w:start w:val="1"/>
+      <w:numFmt w:val="bullet"/>
+      <w:lvlText w:val="o"/>
+      <w:lvlJc w:val="left"/>
+      <w:pPr>
+        <w:tabs>
+          <w:tab w:val="num" w:pos="1440"/>
+        </w:tabs>
+        <w:ind w:left="1440" w:hanging="360"/>
+      </w:pPr>
+      <w:rPr>
+        <w:rFonts w:ascii="Courier New" w:hAnsi="Courier New" w:hint="default"/>
+        <w:sz w:val="20"/>
+      </w:rPr>
+    </w:lvl>
+    <w:lvl w:ilvl="2" w:tentative="1">
+      <w:start w:val="1"/>
+      <w:numFmt w:val="bullet"/>
+      <w:lvlText w:val=""/>
+      <w:lvlJc w:val="left"/>
+      <w:pPr>
+        <w:tabs>
+          <w:tab w:val="num" w:pos="2160"/>
+        </w:tabs>
+        <w:ind w:left="2160" w:hanging="360"/>
+      </w:pPr>
+      <w:rPr>
+        <w:rFonts w:ascii="Wingdings" w:hAnsi="Wingdings" w:hint="default"/>
+        <w:sz w:val="20"/>
+      </w:rPr>
+    </w:lvl>
+    <w:lvl w:ilvl="3" w:tentative="1">
+      <w:start w:val="1"/>
+      <w:numFmt w:val="bullet"/>
+      <w:lvlText w:val=""/>
+      <w:lvlJc w:val="left"/>
+      <w:pPr>
+        <w:tabs>
+          <w:tab w:val="num" w:pos="2880"/>
+        </w:tabs>
+        <w:ind w:left="2880" w:hanging="360"/>
+      </w:pPr>
+      <w:rPr>
+        <w:rFonts w:ascii="Wingdings" w:hAnsi="Wingdings" w:hint="default"/>
+        <w:sz w:val="20"/>
+      </w:rPr>
+    </w:lvl>
+    <w:lvl w:ilvl="4" w:tentative="1">
+      <w:start w:val="1"/>
+      <w:numFmt w:val="bullet"/>
+      <w:lvlText w:val=""/>
+      <w:lvlJc w:val="left"/>
+      <w:pPr>
+        <w:tabs>
+          <w:tab w:val="num" w:pos="3600"/>
+        </w:tabs>
+        <w:ind w:left="3600" w:hanging="360"/>
+      </w:pPr>
+      <w:rPr>
+        <w:rFonts w:ascii="Wingdings" w:hAnsi="Wingdings" w:hint="default"/>
+        <w:sz w:val="20"/>
+      </w:rPr>
+    </w:lvl>
+    <w:lvl w:ilvl="5" w:tentative="1">
+      <w:start w:val="1"/>
+      <w:numFmt w:val="bullet"/>
+      <w:lvlText w:val=""/>
+      <w:lvlJc w:val="left"/>
+      <w:pPr>
+        <w:tabs>
+          <w:tab w:val="num" w:pos="4320"/>
+        </w:tabs>
+        <w:ind w:left="4320" w:hanging="360"/>
+      </w:pPr>
+      <w:rPr>
+        <w:rFonts w:ascii="Wingdings" w:hAnsi="Wingdings" w:hint="default"/>
+        <w:sz w:val="20"/>
+      </w:rPr>
+    </w:lvl>
+    <w:lvl w:ilvl="6" w:tentative="1">
+      <w:start w:val="1"/>
+      <w:numFmt w:val="bullet"/>
+      <w:lvlText w:val=""/>
+      <w:lvlJc w:val="left"/>
+      <w:pPr>
+        <w:tabs>
+          <w:tab w:val="num" w:pos="5040"/>
+        </w:tabs>
+        <w:ind w:left="5040" w:hanging="360"/>
+      </w:pPr>
+      <w:rPr>
+        <w:rFonts w:ascii="Wingdings" w:hAnsi="Wingdings" w:hint="default"/>
+        <w:sz w:val="20"/>
+      </w:rPr>
+    </w:lvl>
+    <w:lvl w:ilvl="7" w:tentative="1">
+      <w:start w:val="1"/>
+      <w:numFmt w:val="bullet"/>
+      <w:lvlText w:val=""/>
+      <w:lvlJc w:val="left"/>
+      <w:pPr>
+        <w:tabs>
+          <w:tab w:val="num" w:pos="5760"/>
+        </w:tabs>
+        <w:ind w:left="5760" w:hanging="360"/>
+      </w:pPr>
+      <w:rPr>
+        <w:rFonts w:ascii="Wingdings" w:hAnsi="Wingdings" w:hint="default"/>
+        <w:sz w:val="20"/>
+      </w:rPr>
+    </w:lvl>
+    <w:lvl w:ilvl="8" w:tentative="1">
+      <w:start w:val="1"/>
+      <w:numFmt w:val="bullet"/>
+      <w:lvlText w:val=""/>
+      <w:lvlJc w:val="left"/>
+      <w:pPr>
+        <w:tabs>
+          <w:tab w:val="num" w:pos="6480"/>
+        </w:tabs>
+        <w:ind w:left="6480" w:hanging="360"/>
+      </w:pPr>
+      <w:rPr>
+        <w:rFonts w:ascii="Wingdings" w:hAnsi="Wingdings" w:hint="default"/>
+        <w:sz w:val="20"/>
+      </w:rPr>
+    </w:lvl>
+  </w:abstractNum>
+  <w:abstractNum w:abstractNumId="70" w15:restartNumberingAfterBreak="0">
     <w:nsid w:val="51A86EF8"/>
     <w:multiLevelType w:val="multilevel"/>
     <w:tmpl w:val="FF2841D4"/>
@@ -16006,7 +17500,7 @@
       </w:rPr>
     </w:lvl>
   </w:abstractNum>
-  <w:abstractNum w:abstractNumId="66" w15:restartNumberingAfterBreak="0">
+  <w:abstractNum w:abstractNumId="71" w15:restartNumberingAfterBreak="0">
     <w:nsid w:val="521378FF"/>
     <w:multiLevelType w:val="multilevel"/>
     <w:tmpl w:val="7B002268"/>
@@ -16155,7 +17649,7 @@
       </w:rPr>
     </w:lvl>
   </w:abstractNum>
-  <w:abstractNum w:abstractNumId="67" w15:restartNumberingAfterBreak="0">
+  <w:abstractNum w:abstractNumId="72" w15:restartNumberingAfterBreak="0">
     <w:nsid w:val="521F2792"/>
     <w:multiLevelType w:val="multilevel"/>
     <w:tmpl w:val="9FB45386"/>
@@ -16304,7 +17798,7 @@
       </w:rPr>
     </w:lvl>
   </w:abstractNum>
-  <w:abstractNum w:abstractNumId="68" w15:restartNumberingAfterBreak="0">
+  <w:abstractNum w:abstractNumId="73" w15:restartNumberingAfterBreak="0">
     <w:nsid w:val="53390911"/>
     <w:multiLevelType w:val="multilevel"/>
     <w:tmpl w:val="1C380F12"/>
@@ -16453,7 +17947,7 @@
       </w:rPr>
     </w:lvl>
   </w:abstractNum>
-  <w:abstractNum w:abstractNumId="69" w15:restartNumberingAfterBreak="0">
+  <w:abstractNum w:abstractNumId="74" w15:restartNumberingAfterBreak="0">
     <w:nsid w:val="53CD23AC"/>
     <w:multiLevelType w:val="multilevel"/>
     <w:tmpl w:val="57BAE8F0"/>
@@ -16602,7 +18096,7 @@
       </w:rPr>
     </w:lvl>
   </w:abstractNum>
-  <w:abstractNum w:abstractNumId="70" w15:restartNumberingAfterBreak="0">
+  <w:abstractNum w:abstractNumId="75" w15:restartNumberingAfterBreak="0">
     <w:nsid w:val="5462791F"/>
     <w:multiLevelType w:val="hybridMultilevel"/>
     <w:tmpl w:val="FDE24C26"/>
@@ -16715,7 +18209,7 @@
       </w:rPr>
     </w:lvl>
   </w:abstractNum>
-  <w:abstractNum w:abstractNumId="71" w15:restartNumberingAfterBreak="0">
+  <w:abstractNum w:abstractNumId="76" w15:restartNumberingAfterBreak="0">
     <w:nsid w:val="547005EB"/>
     <w:multiLevelType w:val="multilevel"/>
     <w:tmpl w:val="F260CC5C"/>
@@ -16864,7 +18358,7 @@
       </w:rPr>
     </w:lvl>
   </w:abstractNum>
-  <w:abstractNum w:abstractNumId="72" w15:restartNumberingAfterBreak="0">
+  <w:abstractNum w:abstractNumId="77" w15:restartNumberingAfterBreak="0">
     <w:nsid w:val="58034221"/>
     <w:multiLevelType w:val="hybridMultilevel"/>
     <w:tmpl w:val="65D0619C"/>
@@ -16977,7 +18471,7 @@
       </w:rPr>
     </w:lvl>
   </w:abstractNum>
-  <w:abstractNum w:abstractNumId="73" w15:restartNumberingAfterBreak="0">
+  <w:abstractNum w:abstractNumId="78" w15:restartNumberingAfterBreak="0">
     <w:nsid w:val="5A460390"/>
     <w:multiLevelType w:val="hybridMultilevel"/>
     <w:tmpl w:val="BD8E939C"/>
@@ -17090,7 +18584,7 @@
       </w:rPr>
     </w:lvl>
   </w:abstractNum>
-  <w:abstractNum w:abstractNumId="74" w15:restartNumberingAfterBreak="0">
+  <w:abstractNum w:abstractNumId="79" w15:restartNumberingAfterBreak="0">
     <w:nsid w:val="5CEE630B"/>
     <w:multiLevelType w:val="hybridMultilevel"/>
     <w:tmpl w:val="DE8E8DBA"/>
@@ -17203,7 +18697,7 @@
       </w:rPr>
     </w:lvl>
   </w:abstractNum>
-  <w:abstractNum w:abstractNumId="75" w15:restartNumberingAfterBreak="0">
+  <w:abstractNum w:abstractNumId="80" w15:restartNumberingAfterBreak="0">
     <w:nsid w:val="5D5A183C"/>
     <w:multiLevelType w:val="multilevel"/>
     <w:tmpl w:val="C804C34A"/>
@@ -17352,7 +18846,7 @@
       </w:rPr>
     </w:lvl>
   </w:abstractNum>
-  <w:abstractNum w:abstractNumId="76" w15:restartNumberingAfterBreak="0">
+  <w:abstractNum w:abstractNumId="81" w15:restartNumberingAfterBreak="0">
     <w:nsid w:val="5DF95194"/>
     <w:multiLevelType w:val="multilevel"/>
     <w:tmpl w:val="CC127E54"/>
@@ -17501,7 +18995,7 @@
       </w:rPr>
     </w:lvl>
   </w:abstractNum>
-  <w:abstractNum w:abstractNumId="77" w15:restartNumberingAfterBreak="0">
+  <w:abstractNum w:abstractNumId="82" w15:restartNumberingAfterBreak="0">
     <w:nsid w:val="5E9C452C"/>
     <w:multiLevelType w:val="multilevel"/>
     <w:tmpl w:val="B8727936"/>
@@ -17650,7 +19144,7 @@
       </w:rPr>
     </w:lvl>
   </w:abstractNum>
-  <w:abstractNum w:abstractNumId="78" w15:restartNumberingAfterBreak="0">
+  <w:abstractNum w:abstractNumId="83" w15:restartNumberingAfterBreak="0">
     <w:nsid w:val="62385AA6"/>
     <w:multiLevelType w:val="multilevel"/>
     <w:tmpl w:val="B9EAECD4"/>
@@ -17799,7 +19293,7 @@
       </w:rPr>
     </w:lvl>
   </w:abstractNum>
-  <w:abstractNum w:abstractNumId="79" w15:restartNumberingAfterBreak="0">
+  <w:abstractNum w:abstractNumId="84" w15:restartNumberingAfterBreak="0">
     <w:nsid w:val="625D686D"/>
     <w:multiLevelType w:val="multilevel"/>
     <w:tmpl w:val="BC1C2048"/>
@@ -17948,7 +19442,7 @@
       </w:rPr>
     </w:lvl>
   </w:abstractNum>
-  <w:abstractNum w:abstractNumId="80" w15:restartNumberingAfterBreak="0">
+  <w:abstractNum w:abstractNumId="85" w15:restartNumberingAfterBreak="0">
     <w:nsid w:val="62B46951"/>
     <w:multiLevelType w:val="hybridMultilevel"/>
     <w:tmpl w:val="0FEAFEC6"/>
@@ -18061,7 +19555,7 @@
       </w:rPr>
     </w:lvl>
   </w:abstractNum>
-  <w:abstractNum w:abstractNumId="81" w15:restartNumberingAfterBreak="0">
+  <w:abstractNum w:abstractNumId="86" w15:restartNumberingAfterBreak="0">
     <w:nsid w:val="647819E3"/>
     <w:multiLevelType w:val="multilevel"/>
     <w:tmpl w:val="ABB278BC"/>
@@ -18210,7 +19704,7 @@
       </w:rPr>
     </w:lvl>
   </w:abstractNum>
-  <w:abstractNum w:abstractNumId="82" w15:restartNumberingAfterBreak="0">
+  <w:abstractNum w:abstractNumId="87" w15:restartNumberingAfterBreak="0">
     <w:nsid w:val="64F30198"/>
     <w:multiLevelType w:val="multilevel"/>
     <w:tmpl w:val="63F4E6F0"/>
@@ -18359,7 +19853,7 @@
       </w:rPr>
     </w:lvl>
   </w:abstractNum>
-  <w:abstractNum w:abstractNumId="83" w15:restartNumberingAfterBreak="0">
+  <w:abstractNum w:abstractNumId="88" w15:restartNumberingAfterBreak="0">
     <w:nsid w:val="65314293"/>
     <w:multiLevelType w:val="hybridMultilevel"/>
     <w:tmpl w:val="6688DFAC"/>
@@ -18472,7 +19966,7 @@
       </w:rPr>
     </w:lvl>
   </w:abstractNum>
-  <w:abstractNum w:abstractNumId="84" w15:restartNumberingAfterBreak="0">
+  <w:abstractNum w:abstractNumId="89" w15:restartNumberingAfterBreak="0">
     <w:nsid w:val="65CE4D0F"/>
     <w:multiLevelType w:val="hybridMultilevel"/>
     <w:tmpl w:val="DB668538"/>
@@ -18585,7 +20079,7 @@
       </w:rPr>
     </w:lvl>
   </w:abstractNum>
-  <w:abstractNum w:abstractNumId="85" w15:restartNumberingAfterBreak="0">
+  <w:abstractNum w:abstractNumId="90" w15:restartNumberingAfterBreak="0">
     <w:nsid w:val="661C7D73"/>
     <w:multiLevelType w:val="multilevel"/>
     <w:tmpl w:val="D9681266"/>
@@ -18734,7 +20228,156 @@
       </w:rPr>
     </w:lvl>
   </w:abstractNum>
-  <w:abstractNum w:abstractNumId="86" w15:restartNumberingAfterBreak="0">
+  <w:abstractNum w:abstractNumId="91" w15:restartNumberingAfterBreak="0">
+    <w:nsid w:val="66E36FE0"/>
+    <w:multiLevelType w:val="multilevel"/>
+    <w:tmpl w:val="2AA67CDA"/>
+    <w:lvl w:ilvl="0">
+      <w:start w:val="1"/>
+      <w:numFmt w:val="bullet"/>
+      <w:lvlText w:val=""/>
+      <w:lvlJc w:val="left"/>
+      <w:pPr>
+        <w:tabs>
+          <w:tab w:val="num" w:pos="720"/>
+        </w:tabs>
+        <w:ind w:left="720" w:hanging="360"/>
+      </w:pPr>
+      <w:rPr>
+        <w:rFonts w:ascii="Wingdings" w:hAnsi="Wingdings" w:hint="default"/>
+        <w:sz w:val="20"/>
+      </w:rPr>
+    </w:lvl>
+    <w:lvl w:ilvl="1" w:tentative="1">
+      <w:start w:val="1"/>
+      <w:numFmt w:val="bullet"/>
+      <w:lvlText w:val="o"/>
+      <w:lvlJc w:val="left"/>
+      <w:pPr>
+        <w:tabs>
+          <w:tab w:val="num" w:pos="1440"/>
+        </w:tabs>
+        <w:ind w:left="1440" w:hanging="360"/>
+      </w:pPr>
+      <w:rPr>
+        <w:rFonts w:ascii="Courier New" w:hAnsi="Courier New" w:hint="default"/>
+        <w:sz w:val="20"/>
+      </w:rPr>
+    </w:lvl>
+    <w:lvl w:ilvl="2" w:tentative="1">
+      <w:start w:val="1"/>
+      <w:numFmt w:val="bullet"/>
+      <w:lvlText w:val=""/>
+      <w:lvlJc w:val="left"/>
+      <w:pPr>
+        <w:tabs>
+          <w:tab w:val="num" w:pos="2160"/>
+        </w:tabs>
+        <w:ind w:left="2160" w:hanging="360"/>
+      </w:pPr>
+      <w:rPr>
+        <w:rFonts w:ascii="Wingdings" w:hAnsi="Wingdings" w:hint="default"/>
+        <w:sz w:val="20"/>
+      </w:rPr>
+    </w:lvl>
+    <w:lvl w:ilvl="3" w:tentative="1">
+      <w:start w:val="1"/>
+      <w:numFmt w:val="bullet"/>
+      <w:lvlText w:val=""/>
+      <w:lvlJc w:val="left"/>
+      <w:pPr>
+        <w:tabs>
+          <w:tab w:val="num" w:pos="2880"/>
+        </w:tabs>
+        <w:ind w:left="2880" w:hanging="360"/>
+      </w:pPr>
+      <w:rPr>
+        <w:rFonts w:ascii="Wingdings" w:hAnsi="Wingdings" w:hint="default"/>
+        <w:sz w:val="20"/>
+      </w:rPr>
+    </w:lvl>
+    <w:lvl w:ilvl="4" w:tentative="1">
+      <w:start w:val="1"/>
+      <w:numFmt w:val="bullet"/>
+      <w:lvlText w:val=""/>
+      <w:lvlJc w:val="left"/>
+      <w:pPr>
+        <w:tabs>
+          <w:tab w:val="num" w:pos="3600"/>
+        </w:tabs>
+        <w:ind w:left="3600" w:hanging="360"/>
+      </w:pPr>
+      <w:rPr>
+        <w:rFonts w:ascii="Wingdings" w:hAnsi="Wingdings" w:hint="default"/>
+        <w:sz w:val="20"/>
+      </w:rPr>
+    </w:lvl>
+    <w:lvl w:ilvl="5" w:tentative="1">
+      <w:start w:val="1"/>
+      <w:numFmt w:val="bullet"/>
+      <w:lvlText w:val=""/>
+      <w:lvlJc w:val="left"/>
+      <w:pPr>
+        <w:tabs>
+          <w:tab w:val="num" w:pos="4320"/>
+        </w:tabs>
+        <w:ind w:left="4320" w:hanging="360"/>
+      </w:pPr>
+      <w:rPr>
+        <w:rFonts w:ascii="Wingdings" w:hAnsi="Wingdings" w:hint="default"/>
+        <w:sz w:val="20"/>
+      </w:rPr>
+    </w:lvl>
+    <w:lvl w:ilvl="6" w:tentative="1">
+      <w:start w:val="1"/>
+      <w:numFmt w:val="bullet"/>
+      <w:lvlText w:val=""/>
+      <w:lvlJc w:val="left"/>
+      <w:pPr>
+        <w:tabs>
+          <w:tab w:val="num" w:pos="5040"/>
+        </w:tabs>
+        <w:ind w:left="5040" w:hanging="360"/>
+      </w:pPr>
+      <w:rPr>
+        <w:rFonts w:ascii="Wingdings" w:hAnsi="Wingdings" w:hint="default"/>
+        <w:sz w:val="20"/>
+      </w:rPr>
+    </w:lvl>
+    <w:lvl w:ilvl="7" w:tentative="1">
+      <w:start w:val="1"/>
+      <w:numFmt w:val="bullet"/>
+      <w:lvlText w:val=""/>
+      <w:lvlJc w:val="left"/>
+      <w:pPr>
+        <w:tabs>
+          <w:tab w:val="num" w:pos="5760"/>
+        </w:tabs>
+        <w:ind w:left="5760" w:hanging="360"/>
+      </w:pPr>
+      <w:rPr>
+        <w:rFonts w:ascii="Wingdings" w:hAnsi="Wingdings" w:hint="default"/>
+        <w:sz w:val="20"/>
+      </w:rPr>
+    </w:lvl>
+    <w:lvl w:ilvl="8" w:tentative="1">
+      <w:start w:val="1"/>
+      <w:numFmt w:val="bullet"/>
+      <w:lvlText w:val=""/>
+      <w:lvlJc w:val="left"/>
+      <w:pPr>
+        <w:tabs>
+          <w:tab w:val="num" w:pos="6480"/>
+        </w:tabs>
+        <w:ind w:left="6480" w:hanging="360"/>
+      </w:pPr>
+      <w:rPr>
+        <w:rFonts w:ascii="Wingdings" w:hAnsi="Wingdings" w:hint="default"/>
+        <w:sz w:val="20"/>
+      </w:rPr>
+    </w:lvl>
+  </w:abstractNum>
+  <w:abstractNum w:abstractNumId="92" w15:restartNumberingAfterBreak="0">
     <w:nsid w:val="68B94344"/>
     <w:multiLevelType w:val="multilevel"/>
     <w:tmpl w:val="9BA812D8"/>
@@ -18883,7 +20526,7 @@
       </w:rPr>
     </w:lvl>
   </w:abstractNum>
-  <w:abstractNum w:abstractNumId="87" w15:restartNumberingAfterBreak="0">
+  <w:abstractNum w:abstractNumId="93" w15:restartNumberingAfterBreak="0">
     <w:nsid w:val="69DE2C87"/>
     <w:multiLevelType w:val="hybridMultilevel"/>
     <w:tmpl w:val="F530F20A"/>
@@ -18996,7 +20639,7 @@
       </w:rPr>
     </w:lvl>
   </w:abstractNum>
-  <w:abstractNum w:abstractNumId="88" w15:restartNumberingAfterBreak="0">
+  <w:abstractNum w:abstractNumId="94" w15:restartNumberingAfterBreak="0">
     <w:nsid w:val="69ED672D"/>
     <w:multiLevelType w:val="multilevel"/>
     <w:tmpl w:val="CC08E300"/>
@@ -19145,7 +20788,7 @@
       </w:rPr>
     </w:lvl>
   </w:abstractNum>
-  <w:abstractNum w:abstractNumId="89" w15:restartNumberingAfterBreak="0">
+  <w:abstractNum w:abstractNumId="95" w15:restartNumberingAfterBreak="0">
     <w:nsid w:val="6A063EFD"/>
     <w:multiLevelType w:val="hybridMultilevel"/>
     <w:tmpl w:val="48703FBA"/>
@@ -19258,7 +20901,7 @@
       </w:rPr>
     </w:lvl>
   </w:abstractNum>
-  <w:abstractNum w:abstractNumId="90" w15:restartNumberingAfterBreak="0">
+  <w:abstractNum w:abstractNumId="96" w15:restartNumberingAfterBreak="0">
     <w:nsid w:val="6A825ABE"/>
     <w:multiLevelType w:val="multilevel"/>
     <w:tmpl w:val="0CD6F30E"/>
@@ -19407,7 +21050,7 @@
       </w:rPr>
     </w:lvl>
   </w:abstractNum>
-  <w:abstractNum w:abstractNumId="91" w15:restartNumberingAfterBreak="0">
+  <w:abstractNum w:abstractNumId="97" w15:restartNumberingAfterBreak="0">
     <w:nsid w:val="6B1D7832"/>
     <w:multiLevelType w:val="multilevel"/>
     <w:tmpl w:val="DD4646B2"/>
@@ -19556,7 +21199,7 @@
       </w:rPr>
     </w:lvl>
   </w:abstractNum>
-  <w:abstractNum w:abstractNumId="92" w15:restartNumberingAfterBreak="0">
+  <w:abstractNum w:abstractNumId="98" w15:restartNumberingAfterBreak="0">
     <w:nsid w:val="6C6D6667"/>
     <w:multiLevelType w:val="hybridMultilevel"/>
     <w:tmpl w:val="A744709C"/>
@@ -19669,7 +21312,7 @@
       </w:rPr>
     </w:lvl>
   </w:abstractNum>
-  <w:abstractNum w:abstractNumId="93" w15:restartNumberingAfterBreak="0">
+  <w:abstractNum w:abstractNumId="99" w15:restartNumberingAfterBreak="0">
     <w:nsid w:val="6CAD7EA5"/>
     <w:multiLevelType w:val="multilevel"/>
     <w:tmpl w:val="C472C5B0"/>
@@ -19818,7 +21461,7 @@
       </w:rPr>
     </w:lvl>
   </w:abstractNum>
-  <w:abstractNum w:abstractNumId="94" w15:restartNumberingAfterBreak="0">
+  <w:abstractNum w:abstractNumId="100" w15:restartNumberingAfterBreak="0">
     <w:nsid w:val="6E43557B"/>
     <w:multiLevelType w:val="multilevel"/>
     <w:tmpl w:val="323C7112"/>
@@ -19967,7 +21610,7 @@
       </w:rPr>
     </w:lvl>
   </w:abstractNum>
-  <w:abstractNum w:abstractNumId="95" w15:restartNumberingAfterBreak="0">
+  <w:abstractNum w:abstractNumId="101" w15:restartNumberingAfterBreak="0">
     <w:nsid w:val="6EA27D0A"/>
     <w:multiLevelType w:val="multilevel"/>
     <w:tmpl w:val="7BF0256C"/>
@@ -20116,7 +21759,7 @@
       </w:rPr>
     </w:lvl>
   </w:abstractNum>
-  <w:abstractNum w:abstractNumId="96" w15:restartNumberingAfterBreak="0">
+  <w:abstractNum w:abstractNumId="102" w15:restartNumberingAfterBreak="0">
     <w:nsid w:val="6EF86273"/>
     <w:multiLevelType w:val="multilevel"/>
     <w:tmpl w:val="2AA67CDA"/>
@@ -20265,7 +21908,7 @@
       </w:rPr>
     </w:lvl>
   </w:abstractNum>
-  <w:abstractNum w:abstractNumId="97" w15:restartNumberingAfterBreak="0">
+  <w:abstractNum w:abstractNumId="103" w15:restartNumberingAfterBreak="0">
     <w:nsid w:val="70874300"/>
     <w:multiLevelType w:val="hybridMultilevel"/>
     <w:tmpl w:val="1B3A0518"/>
@@ -20378,7 +22021,7 @@
       </w:rPr>
     </w:lvl>
   </w:abstractNum>
-  <w:abstractNum w:abstractNumId="98" w15:restartNumberingAfterBreak="0">
+  <w:abstractNum w:abstractNumId="104" w15:restartNumberingAfterBreak="0">
     <w:nsid w:val="7090251B"/>
     <w:multiLevelType w:val="hybridMultilevel"/>
     <w:tmpl w:val="67687EFE"/>
@@ -20491,7 +22134,156 @@
       </w:rPr>
     </w:lvl>
   </w:abstractNum>
-  <w:abstractNum w:abstractNumId="99" w15:restartNumberingAfterBreak="0">
+  <w:abstractNum w:abstractNumId="105" w15:restartNumberingAfterBreak="0">
+    <w:nsid w:val="72031F81"/>
+    <w:multiLevelType w:val="multilevel"/>
+    <w:tmpl w:val="84400090"/>
+    <w:lvl w:ilvl="0">
+      <w:start w:val="1"/>
+      <w:numFmt w:val="bullet"/>
+      <w:lvlText w:val=""/>
+      <w:lvlJc w:val="left"/>
+      <w:pPr>
+        <w:tabs>
+          <w:tab w:val="num" w:pos="720"/>
+        </w:tabs>
+        <w:ind w:left="720" w:hanging="360"/>
+      </w:pPr>
+      <w:rPr>
+        <w:rFonts w:ascii="Symbol" w:hAnsi="Symbol" w:hint="default"/>
+        <w:sz w:val="20"/>
+      </w:rPr>
+    </w:lvl>
+    <w:lvl w:ilvl="1" w:tentative="1">
+      <w:start w:val="1"/>
+      <w:numFmt w:val="bullet"/>
+      <w:lvlText w:val="o"/>
+      <w:lvlJc w:val="left"/>
+      <w:pPr>
+        <w:tabs>
+          <w:tab w:val="num" w:pos="1440"/>
+        </w:tabs>
+        <w:ind w:left="1440" w:hanging="360"/>
+      </w:pPr>
+      <w:rPr>
+        <w:rFonts w:ascii="Courier New" w:hAnsi="Courier New" w:hint="default"/>
+        <w:sz w:val="20"/>
+      </w:rPr>
+    </w:lvl>
+    <w:lvl w:ilvl="2" w:tentative="1">
+      <w:start w:val="1"/>
+      <w:numFmt w:val="bullet"/>
+      <w:lvlText w:val=""/>
+      <w:lvlJc w:val="left"/>
+      <w:pPr>
+        <w:tabs>
+          <w:tab w:val="num" w:pos="2160"/>
+        </w:tabs>
+        <w:ind w:left="2160" w:hanging="360"/>
+      </w:pPr>
+      <w:rPr>
+        <w:rFonts w:ascii="Wingdings" w:hAnsi="Wingdings" w:hint="default"/>
+        <w:sz w:val="20"/>
+      </w:rPr>
+    </w:lvl>
+    <w:lvl w:ilvl="3" w:tentative="1">
+      <w:start w:val="1"/>
+      <w:numFmt w:val="bullet"/>
+      <w:lvlText w:val=""/>
+      <w:lvlJc w:val="left"/>
+      <w:pPr>
+        <w:tabs>
+          <w:tab w:val="num" w:pos="2880"/>
+        </w:tabs>
+        <w:ind w:left="2880" w:hanging="360"/>
+      </w:pPr>
+      <w:rPr>
+        <w:rFonts w:ascii="Wingdings" w:hAnsi="Wingdings" w:hint="default"/>
+        <w:sz w:val="20"/>
+      </w:rPr>
+    </w:lvl>
+    <w:lvl w:ilvl="4" w:tentative="1">
+      <w:start w:val="1"/>
+      <w:numFmt w:val="bullet"/>
+      <w:lvlText w:val=""/>
+      <w:lvlJc w:val="left"/>
+      <w:pPr>
+        <w:tabs>
+          <w:tab w:val="num" w:pos="3600"/>
+        </w:tabs>
+        <w:ind w:left="3600" w:hanging="360"/>
+      </w:pPr>
+      <w:rPr>
+        <w:rFonts w:ascii="Wingdings" w:hAnsi="Wingdings" w:hint="default"/>
+        <w:sz w:val="20"/>
+      </w:rPr>
+    </w:lvl>
+    <w:lvl w:ilvl="5" w:tentative="1">
+      <w:start w:val="1"/>
+      <w:numFmt w:val="bullet"/>
+      <w:lvlText w:val=""/>
+      <w:lvlJc w:val="left"/>
+      <w:pPr>
+        <w:tabs>
+          <w:tab w:val="num" w:pos="4320"/>
+        </w:tabs>
+        <w:ind w:left="4320" w:hanging="360"/>
+      </w:pPr>
+      <w:rPr>
+        <w:rFonts w:ascii="Wingdings" w:hAnsi="Wingdings" w:hint="default"/>
+        <w:sz w:val="20"/>
+      </w:rPr>
+    </w:lvl>
+    <w:lvl w:ilvl="6" w:tentative="1">
+      <w:start w:val="1"/>
+      <w:numFmt w:val="bullet"/>
+      <w:lvlText w:val=""/>
+      <w:lvlJc w:val="left"/>
+      <w:pPr>
+        <w:tabs>
+          <w:tab w:val="num" w:pos="5040"/>
+        </w:tabs>
+        <w:ind w:left="5040" w:hanging="360"/>
+      </w:pPr>
+      <w:rPr>
+        <w:rFonts w:ascii="Wingdings" w:hAnsi="Wingdings" w:hint="default"/>
+        <w:sz w:val="20"/>
+      </w:rPr>
+    </w:lvl>
+    <w:lvl w:ilvl="7" w:tentative="1">
+      <w:start w:val="1"/>
+      <w:numFmt w:val="bullet"/>
+      <w:lvlText w:val=""/>
+      <w:lvlJc w:val="left"/>
+      <w:pPr>
+        <w:tabs>
+          <w:tab w:val="num" w:pos="5760"/>
+        </w:tabs>
+        <w:ind w:left="5760" w:hanging="360"/>
+      </w:pPr>
+      <w:rPr>
+        <w:rFonts w:ascii="Wingdings" w:hAnsi="Wingdings" w:hint="default"/>
+        <w:sz w:val="20"/>
+      </w:rPr>
+    </w:lvl>
+    <w:lvl w:ilvl="8" w:tentative="1">
+      <w:start w:val="1"/>
+      <w:numFmt w:val="bullet"/>
+      <w:lvlText w:val=""/>
+      <w:lvlJc w:val="left"/>
+      <w:pPr>
+        <w:tabs>
+          <w:tab w:val="num" w:pos="6480"/>
+        </w:tabs>
+        <w:ind w:left="6480" w:hanging="360"/>
+      </w:pPr>
+      <w:rPr>
+        <w:rFonts w:ascii="Wingdings" w:hAnsi="Wingdings" w:hint="default"/>
+        <w:sz w:val="20"/>
+      </w:rPr>
+    </w:lvl>
+  </w:abstractNum>
+  <w:abstractNum w:abstractNumId="106" w15:restartNumberingAfterBreak="0">
     <w:nsid w:val="722301E0"/>
     <w:multiLevelType w:val="multilevel"/>
     <w:tmpl w:val="1EE82E5A"/>
@@ -20640,7 +22432,7 @@
       </w:rPr>
     </w:lvl>
   </w:abstractNum>
-  <w:abstractNum w:abstractNumId="100" w15:restartNumberingAfterBreak="0">
+  <w:abstractNum w:abstractNumId="107" w15:restartNumberingAfterBreak="0">
     <w:nsid w:val="75144C65"/>
     <w:multiLevelType w:val="hybridMultilevel"/>
     <w:tmpl w:val="12127FAA"/>
@@ -20753,7 +22545,7 @@
       </w:rPr>
     </w:lvl>
   </w:abstractNum>
-  <w:abstractNum w:abstractNumId="101" w15:restartNumberingAfterBreak="0">
+  <w:abstractNum w:abstractNumId="108" w15:restartNumberingAfterBreak="0">
     <w:nsid w:val="75237F84"/>
     <w:multiLevelType w:val="hybridMultilevel"/>
     <w:tmpl w:val="5F0A6EF2"/>
@@ -20866,7 +22658,7 @@
       </w:rPr>
     </w:lvl>
   </w:abstractNum>
-  <w:abstractNum w:abstractNumId="102" w15:restartNumberingAfterBreak="0">
+  <w:abstractNum w:abstractNumId="109" w15:restartNumberingAfterBreak="0">
     <w:nsid w:val="75FF09B0"/>
     <w:multiLevelType w:val="multilevel"/>
     <w:tmpl w:val="C34A7734"/>
@@ -21015,7 +22807,7 @@
       </w:rPr>
     </w:lvl>
   </w:abstractNum>
-  <w:abstractNum w:abstractNumId="103" w15:restartNumberingAfterBreak="0">
+  <w:abstractNum w:abstractNumId="110" w15:restartNumberingAfterBreak="0">
     <w:nsid w:val="77960362"/>
     <w:multiLevelType w:val="multilevel"/>
     <w:tmpl w:val="FEA0022E"/>
@@ -21164,7 +22956,7 @@
       </w:rPr>
     </w:lvl>
   </w:abstractNum>
-  <w:abstractNum w:abstractNumId="104" w15:restartNumberingAfterBreak="0">
+  <w:abstractNum w:abstractNumId="111" w15:restartNumberingAfterBreak="0">
     <w:nsid w:val="785A644F"/>
     <w:multiLevelType w:val="multilevel"/>
     <w:tmpl w:val="D1DC60FE"/>
@@ -21313,7 +23105,156 @@
       </w:rPr>
     </w:lvl>
   </w:abstractNum>
-  <w:abstractNum w:abstractNumId="105" w15:restartNumberingAfterBreak="0">
+  <w:abstractNum w:abstractNumId="112" w15:restartNumberingAfterBreak="0">
+    <w:nsid w:val="78B62297"/>
+    <w:multiLevelType w:val="multilevel"/>
+    <w:tmpl w:val="2AA67CDA"/>
+    <w:lvl w:ilvl="0">
+      <w:start w:val="1"/>
+      <w:numFmt w:val="bullet"/>
+      <w:lvlText w:val=""/>
+      <w:lvlJc w:val="left"/>
+      <w:pPr>
+        <w:tabs>
+          <w:tab w:val="num" w:pos="720"/>
+        </w:tabs>
+        <w:ind w:left="720" w:hanging="360"/>
+      </w:pPr>
+      <w:rPr>
+        <w:rFonts w:ascii="Wingdings" w:hAnsi="Wingdings" w:hint="default"/>
+        <w:sz w:val="20"/>
+      </w:rPr>
+    </w:lvl>
+    <w:lvl w:ilvl="1" w:tentative="1">
+      <w:start w:val="1"/>
+      <w:numFmt w:val="bullet"/>
+      <w:lvlText w:val="o"/>
+      <w:lvlJc w:val="left"/>
+      <w:pPr>
+        <w:tabs>
+          <w:tab w:val="num" w:pos="1440"/>
+        </w:tabs>
+        <w:ind w:left="1440" w:hanging="360"/>
+      </w:pPr>
+      <w:rPr>
+        <w:rFonts w:ascii="Courier New" w:hAnsi="Courier New" w:hint="default"/>
+        <w:sz w:val="20"/>
+      </w:rPr>
+    </w:lvl>
+    <w:lvl w:ilvl="2" w:tentative="1">
+      <w:start w:val="1"/>
+      <w:numFmt w:val="bullet"/>
+      <w:lvlText w:val=""/>
+      <w:lvlJc w:val="left"/>
+      <w:pPr>
+        <w:tabs>
+          <w:tab w:val="num" w:pos="2160"/>
+        </w:tabs>
+        <w:ind w:left="2160" w:hanging="360"/>
+      </w:pPr>
+      <w:rPr>
+        <w:rFonts w:ascii="Wingdings" w:hAnsi="Wingdings" w:hint="default"/>
+        <w:sz w:val="20"/>
+      </w:rPr>
+    </w:lvl>
+    <w:lvl w:ilvl="3" w:tentative="1">
+      <w:start w:val="1"/>
+      <w:numFmt w:val="bullet"/>
+      <w:lvlText w:val=""/>
+      <w:lvlJc w:val="left"/>
+      <w:pPr>
+        <w:tabs>
+          <w:tab w:val="num" w:pos="2880"/>
+        </w:tabs>
+        <w:ind w:left="2880" w:hanging="360"/>
+      </w:pPr>
+      <w:rPr>
+        <w:rFonts w:ascii="Wingdings" w:hAnsi="Wingdings" w:hint="default"/>
+        <w:sz w:val="20"/>
+      </w:rPr>
+    </w:lvl>
+    <w:lvl w:ilvl="4" w:tentative="1">
+      <w:start w:val="1"/>
+      <w:numFmt w:val="bullet"/>
+      <w:lvlText w:val=""/>
+      <w:lvlJc w:val="left"/>
+      <w:pPr>
+        <w:tabs>
+          <w:tab w:val="num" w:pos="3600"/>
+        </w:tabs>
+        <w:ind w:left="3600" w:hanging="360"/>
+      </w:pPr>
+      <w:rPr>
+        <w:rFonts w:ascii="Wingdings" w:hAnsi="Wingdings" w:hint="default"/>
+        <w:sz w:val="20"/>
+      </w:rPr>
+    </w:lvl>
+    <w:lvl w:ilvl="5" w:tentative="1">
+      <w:start w:val="1"/>
+      <w:numFmt w:val="bullet"/>
+      <w:lvlText w:val=""/>
+      <w:lvlJc w:val="left"/>
+      <w:pPr>
+        <w:tabs>
+          <w:tab w:val="num" w:pos="4320"/>
+        </w:tabs>
+        <w:ind w:left="4320" w:hanging="360"/>
+      </w:pPr>
+      <w:rPr>
+        <w:rFonts w:ascii="Wingdings" w:hAnsi="Wingdings" w:hint="default"/>
+        <w:sz w:val="20"/>
+      </w:rPr>
+    </w:lvl>
+    <w:lvl w:ilvl="6" w:tentative="1">
+      <w:start w:val="1"/>
+      <w:numFmt w:val="bullet"/>
+      <w:lvlText w:val=""/>
+      <w:lvlJc w:val="left"/>
+      <w:pPr>
+        <w:tabs>
+          <w:tab w:val="num" w:pos="5040"/>
+        </w:tabs>
+        <w:ind w:left="5040" w:hanging="360"/>
+      </w:pPr>
+      <w:rPr>
+        <w:rFonts w:ascii="Wingdings" w:hAnsi="Wingdings" w:hint="default"/>
+        <w:sz w:val="20"/>
+      </w:rPr>
+    </w:lvl>
+    <w:lvl w:ilvl="7" w:tentative="1">
+      <w:start w:val="1"/>
+      <w:numFmt w:val="bullet"/>
+      <w:lvlText w:val=""/>
+      <w:lvlJc w:val="left"/>
+      <w:pPr>
+        <w:tabs>
+          <w:tab w:val="num" w:pos="5760"/>
+        </w:tabs>
+        <w:ind w:left="5760" w:hanging="360"/>
+      </w:pPr>
+      <w:rPr>
+        <w:rFonts w:ascii="Wingdings" w:hAnsi="Wingdings" w:hint="default"/>
+        <w:sz w:val="20"/>
+      </w:rPr>
+    </w:lvl>
+    <w:lvl w:ilvl="8" w:tentative="1">
+      <w:start w:val="1"/>
+      <w:numFmt w:val="bullet"/>
+      <w:lvlText w:val=""/>
+      <w:lvlJc w:val="left"/>
+      <w:pPr>
+        <w:tabs>
+          <w:tab w:val="num" w:pos="6480"/>
+        </w:tabs>
+        <w:ind w:left="6480" w:hanging="360"/>
+      </w:pPr>
+      <w:rPr>
+        <w:rFonts w:ascii="Wingdings" w:hAnsi="Wingdings" w:hint="default"/>
+        <w:sz w:val="20"/>
+      </w:rPr>
+    </w:lvl>
+  </w:abstractNum>
+  <w:abstractNum w:abstractNumId="113" w15:restartNumberingAfterBreak="0">
     <w:nsid w:val="7BFA03DF"/>
     <w:multiLevelType w:val="hybridMultilevel"/>
     <w:tmpl w:val="536A979E"/>
@@ -21426,7 +23367,7 @@
       </w:rPr>
     </w:lvl>
   </w:abstractNum>
-  <w:abstractNum w:abstractNumId="106" w15:restartNumberingAfterBreak="0">
+  <w:abstractNum w:abstractNumId="114" w15:restartNumberingAfterBreak="0">
     <w:nsid w:val="7CA524B4"/>
     <w:multiLevelType w:val="hybridMultilevel"/>
     <w:tmpl w:val="957C4F4A"/>
@@ -21539,7 +23480,7 @@
       </w:rPr>
     </w:lvl>
   </w:abstractNum>
-  <w:abstractNum w:abstractNumId="107" w15:restartNumberingAfterBreak="0">
+  <w:abstractNum w:abstractNumId="115" w15:restartNumberingAfterBreak="0">
     <w:nsid w:val="7E1C597E"/>
     <w:multiLevelType w:val="multilevel"/>
     <w:tmpl w:val="2AA67CDA"/>
@@ -21688,7 +23629,7 @@
       </w:rPr>
     </w:lvl>
   </w:abstractNum>
-  <w:abstractNum w:abstractNumId="108" w15:restartNumberingAfterBreak="0">
+  <w:abstractNum w:abstractNumId="116" w15:restartNumberingAfterBreak="0">
     <w:nsid w:val="7EBD7710"/>
     <w:multiLevelType w:val="hybridMultilevel"/>
     <w:tmpl w:val="C8C6F7A0"/>
@@ -21802,106 +23743,106 @@
     </w:lvl>
   </w:abstractNum>
   <w:num w:numId="1" w16cid:durableId="425157302">
-    <w:abstractNumId w:val="44"/>
+    <w:abstractNumId w:val="45"/>
   </w:num>
   <w:num w:numId="2" w16cid:durableId="967664612">
-    <w:abstractNumId w:val="82"/>
+    <w:abstractNumId w:val="87"/>
   </w:num>
   <w:num w:numId="3" w16cid:durableId="361631616">
-    <w:abstractNumId w:val="59"/>
+    <w:abstractNumId w:val="63"/>
   </w:num>
   <w:num w:numId="4" w16cid:durableId="1409575397">
-    <w:abstractNumId w:val="70"/>
+    <w:abstractNumId w:val="75"/>
   </w:num>
   <w:num w:numId="5" w16cid:durableId="1647204897">
-    <w:abstractNumId w:val="106"/>
+    <w:abstractNumId w:val="114"/>
   </w:num>
   <w:num w:numId="6" w16cid:durableId="682589869">
-    <w:abstractNumId w:val="18"/>
+    <w:abstractNumId w:val="19"/>
   </w:num>
   <w:num w:numId="7" w16cid:durableId="679703478">
-    <w:abstractNumId w:val="87"/>
+    <w:abstractNumId w:val="93"/>
   </w:num>
   <w:num w:numId="8" w16cid:durableId="496455128">
-    <w:abstractNumId w:val="38"/>
+    <w:abstractNumId w:val="39"/>
   </w:num>
   <w:num w:numId="9" w16cid:durableId="1184633094">
-    <w:abstractNumId w:val="53"/>
+    <w:abstractNumId w:val="55"/>
   </w:num>
   <w:num w:numId="10" w16cid:durableId="71507387">
-    <w:abstractNumId w:val="57"/>
+    <w:abstractNumId w:val="61"/>
   </w:num>
   <w:num w:numId="11" w16cid:durableId="1412503779">
-    <w:abstractNumId w:val="89"/>
+    <w:abstractNumId w:val="95"/>
   </w:num>
   <w:num w:numId="12" w16cid:durableId="1107113995">
-    <w:abstractNumId w:val="39"/>
+    <w:abstractNumId w:val="40"/>
   </w:num>
   <w:num w:numId="13" w16cid:durableId="2011055922">
-    <w:abstractNumId w:val="19"/>
+    <w:abstractNumId w:val="20"/>
   </w:num>
   <w:num w:numId="14" w16cid:durableId="1529222885">
-    <w:abstractNumId w:val="105"/>
+    <w:abstractNumId w:val="113"/>
   </w:num>
   <w:num w:numId="15" w16cid:durableId="836580755">
     <w:abstractNumId w:val="13"/>
   </w:num>
   <w:num w:numId="16" w16cid:durableId="1344674502">
-    <w:abstractNumId w:val="73"/>
+    <w:abstractNumId w:val="78"/>
   </w:num>
   <w:num w:numId="17" w16cid:durableId="1320882603">
-    <w:abstractNumId w:val="97"/>
+    <w:abstractNumId w:val="103"/>
   </w:num>
   <w:num w:numId="18" w16cid:durableId="1139028372">
-    <w:abstractNumId w:val="40"/>
+    <w:abstractNumId w:val="41"/>
   </w:num>
   <w:num w:numId="19" w16cid:durableId="1525635473">
-    <w:abstractNumId w:val="80"/>
+    <w:abstractNumId w:val="85"/>
   </w:num>
   <w:num w:numId="20" w16cid:durableId="609623515">
-    <w:abstractNumId w:val="108"/>
+    <w:abstractNumId w:val="116"/>
   </w:num>
   <w:num w:numId="21" w16cid:durableId="165170997">
-    <w:abstractNumId w:val="92"/>
+    <w:abstractNumId w:val="98"/>
   </w:num>
   <w:num w:numId="22" w16cid:durableId="1620525290">
-    <w:abstractNumId w:val="25"/>
+    <w:abstractNumId w:val="26"/>
   </w:num>
   <w:num w:numId="23" w16cid:durableId="400753109">
-    <w:abstractNumId w:val="100"/>
+    <w:abstractNumId w:val="107"/>
   </w:num>
   <w:num w:numId="24" w16cid:durableId="193882219">
     <w:abstractNumId w:val="4"/>
   </w:num>
   <w:num w:numId="25" w16cid:durableId="311981628">
-    <w:abstractNumId w:val="46"/>
+    <w:abstractNumId w:val="47"/>
   </w:num>
   <w:num w:numId="26" w16cid:durableId="2009166045">
     <w:abstractNumId w:val="12"/>
   </w:num>
   <w:num w:numId="27" w16cid:durableId="2135174697">
-    <w:abstractNumId w:val="17"/>
+    <w:abstractNumId w:val="18"/>
   </w:num>
   <w:num w:numId="28" w16cid:durableId="353504740">
     <w:abstractNumId w:val="14"/>
   </w:num>
   <w:num w:numId="29" w16cid:durableId="2124693280">
-    <w:abstractNumId w:val="84"/>
+    <w:abstractNumId w:val="89"/>
   </w:num>
   <w:num w:numId="30" w16cid:durableId="1367099744">
-    <w:abstractNumId w:val="30"/>
+    <w:abstractNumId w:val="31"/>
   </w:num>
   <w:num w:numId="31" w16cid:durableId="2011105642">
-    <w:abstractNumId w:val="74"/>
+    <w:abstractNumId w:val="79"/>
   </w:num>
   <w:num w:numId="32" w16cid:durableId="831995364">
-    <w:abstractNumId w:val="22"/>
+    <w:abstractNumId w:val="23"/>
   </w:num>
   <w:num w:numId="33" w16cid:durableId="851073403">
     <w:abstractNumId w:val="3"/>
   </w:num>
   <w:num w:numId="34" w16cid:durableId="1183666391">
-    <w:abstractNumId w:val="21"/>
+    <w:abstractNumId w:val="22"/>
   </w:num>
   <w:num w:numId="35" w16cid:durableId="697268929">
     <w:abstractNumId w:val="1"/>
@@ -21910,7 +23851,7 @@
     <w:abstractNumId w:val="2"/>
   </w:num>
   <w:num w:numId="37" w16cid:durableId="1849755457">
-    <w:abstractNumId w:val="101"/>
+    <w:abstractNumId w:val="108"/>
   </w:num>
   <w:num w:numId="38" w16cid:durableId="516505904">
     <w:abstractNumId w:val="11"/>
@@ -21919,85 +23860,85 @@
     <w:abstractNumId w:val="15"/>
   </w:num>
   <w:num w:numId="40" w16cid:durableId="905338697">
-    <w:abstractNumId w:val="61"/>
+    <w:abstractNumId w:val="65"/>
   </w:num>
   <w:num w:numId="41" w16cid:durableId="501896635">
-    <w:abstractNumId w:val="42"/>
+    <w:abstractNumId w:val="43"/>
   </w:num>
   <w:num w:numId="42" w16cid:durableId="1953435156">
-    <w:abstractNumId w:val="62"/>
+    <w:abstractNumId w:val="66"/>
   </w:num>
   <w:num w:numId="43" w16cid:durableId="1060447452">
-    <w:abstractNumId w:val="72"/>
+    <w:abstractNumId w:val="77"/>
   </w:num>
   <w:num w:numId="44" w16cid:durableId="1772503672">
-    <w:abstractNumId w:val="55"/>
+    <w:abstractNumId w:val="58"/>
   </w:num>
   <w:num w:numId="45" w16cid:durableId="1650330222">
-    <w:abstractNumId w:val="60"/>
+    <w:abstractNumId w:val="64"/>
   </w:num>
   <w:num w:numId="46" w16cid:durableId="2102337934">
-    <w:abstractNumId w:val="24"/>
+    <w:abstractNumId w:val="25"/>
   </w:num>
   <w:num w:numId="47" w16cid:durableId="68767822">
-    <w:abstractNumId w:val="90"/>
+    <w:abstractNumId w:val="96"/>
   </w:num>
   <w:num w:numId="48" w16cid:durableId="1992058265">
     <w:abstractNumId w:val="5"/>
   </w:num>
   <w:num w:numId="49" w16cid:durableId="788475134">
-    <w:abstractNumId w:val="104"/>
+    <w:abstractNumId w:val="111"/>
   </w:num>
   <w:num w:numId="50" w16cid:durableId="224419455">
-    <w:abstractNumId w:val="95"/>
+    <w:abstractNumId w:val="101"/>
   </w:num>
   <w:num w:numId="51" w16cid:durableId="1699575947">
-    <w:abstractNumId w:val="79"/>
+    <w:abstractNumId w:val="84"/>
   </w:num>
   <w:num w:numId="52" w16cid:durableId="1048916239">
-    <w:abstractNumId w:val="49"/>
+    <w:abstractNumId w:val="51"/>
   </w:num>
   <w:num w:numId="53" w16cid:durableId="1188711211">
-    <w:abstractNumId w:val="102"/>
+    <w:abstractNumId w:val="109"/>
   </w:num>
   <w:num w:numId="54" w16cid:durableId="447555614">
-    <w:abstractNumId w:val="81"/>
+    <w:abstractNumId w:val="86"/>
   </w:num>
   <w:num w:numId="55" w16cid:durableId="1679307268">
-    <w:abstractNumId w:val="47"/>
+    <w:abstractNumId w:val="48"/>
   </w:num>
   <w:num w:numId="56" w16cid:durableId="693773591">
-    <w:abstractNumId w:val="94"/>
+    <w:abstractNumId w:val="100"/>
   </w:num>
   <w:num w:numId="57" w16cid:durableId="1110473324">
-    <w:abstractNumId w:val="32"/>
+    <w:abstractNumId w:val="33"/>
   </w:num>
   <w:num w:numId="58" w16cid:durableId="842937968">
-    <w:abstractNumId w:val="58"/>
+    <w:abstractNumId w:val="62"/>
   </w:num>
   <w:num w:numId="59" w16cid:durableId="821121315">
+    <w:abstractNumId w:val="38"/>
+  </w:num>
+  <w:num w:numId="60" w16cid:durableId="2095394549">
+    <w:abstractNumId w:val="110"/>
+  </w:num>
+  <w:num w:numId="61" w16cid:durableId="1299921011">
     <w:abstractNumId w:val="37"/>
   </w:num>
-  <w:num w:numId="60" w16cid:durableId="2095394549">
-    <w:abstractNumId w:val="103"/>
-  </w:num>
-  <w:num w:numId="61" w16cid:durableId="1299921011">
-    <w:abstractNumId w:val="36"/>
-  </w:num>
   <w:num w:numId="62" w16cid:durableId="1927420240">
-    <w:abstractNumId w:val="65"/>
+    <w:abstractNumId w:val="70"/>
   </w:num>
   <w:num w:numId="63" w16cid:durableId="41290043">
-    <w:abstractNumId w:val="69"/>
+    <w:abstractNumId w:val="74"/>
   </w:num>
   <w:num w:numId="64" w16cid:durableId="999846909">
-    <w:abstractNumId w:val="56"/>
+    <w:abstractNumId w:val="59"/>
   </w:num>
   <w:num w:numId="65" w16cid:durableId="1250969563">
-    <w:abstractNumId w:val="64"/>
+    <w:abstractNumId w:val="68"/>
   </w:num>
   <w:num w:numId="66" w16cid:durableId="484011382">
-    <w:abstractNumId w:val="88"/>
+    <w:abstractNumId w:val="94"/>
   </w:num>
   <w:num w:numId="67" w16cid:durableId="2008289242">
     <w:abstractNumId w:val="9"/>
@@ -22006,127 +23947,151 @@
     <w:abstractNumId w:val="16"/>
   </w:num>
   <w:num w:numId="69" w16cid:durableId="1296839887">
-    <w:abstractNumId w:val="68"/>
+    <w:abstractNumId w:val="73"/>
   </w:num>
   <w:num w:numId="70" w16cid:durableId="336662050">
-    <w:abstractNumId w:val="78"/>
+    <w:abstractNumId w:val="83"/>
   </w:num>
   <w:num w:numId="71" w16cid:durableId="1460032333">
-    <w:abstractNumId w:val="93"/>
+    <w:abstractNumId w:val="99"/>
   </w:num>
   <w:num w:numId="72" w16cid:durableId="592400615">
     <w:abstractNumId w:val="7"/>
   </w:num>
   <w:num w:numId="73" w16cid:durableId="1879049234">
-    <w:abstractNumId w:val="29"/>
+    <w:abstractNumId w:val="30"/>
   </w:num>
   <w:num w:numId="74" w16cid:durableId="1747679558">
-    <w:abstractNumId w:val="33"/>
+    <w:abstractNumId w:val="34"/>
   </w:num>
   <w:num w:numId="75" w16cid:durableId="55278029">
-    <w:abstractNumId w:val="26"/>
+    <w:abstractNumId w:val="27"/>
   </w:num>
   <w:num w:numId="76" w16cid:durableId="1032193382">
-    <w:abstractNumId w:val="27"/>
+    <w:abstractNumId w:val="28"/>
   </w:num>
   <w:num w:numId="77" w16cid:durableId="763109604">
-    <w:abstractNumId w:val="71"/>
+    <w:abstractNumId w:val="76"/>
   </w:num>
   <w:num w:numId="78" w16cid:durableId="2138137265">
-    <w:abstractNumId w:val="83"/>
+    <w:abstractNumId w:val="88"/>
   </w:num>
   <w:num w:numId="79" w16cid:durableId="343675924">
-    <w:abstractNumId w:val="98"/>
+    <w:abstractNumId w:val="104"/>
   </w:num>
   <w:num w:numId="80" w16cid:durableId="1823277442">
-    <w:abstractNumId w:val="35"/>
+    <w:abstractNumId w:val="36"/>
   </w:num>
   <w:num w:numId="81" w16cid:durableId="1686900155">
     <w:abstractNumId w:val="0"/>
   </w:num>
   <w:num w:numId="82" w16cid:durableId="1113326280">
-    <w:abstractNumId w:val="67"/>
+    <w:abstractNumId w:val="72"/>
   </w:num>
   <w:num w:numId="83" w16cid:durableId="1253051103">
-    <w:abstractNumId w:val="91"/>
+    <w:abstractNumId w:val="97"/>
   </w:num>
   <w:num w:numId="84" w16cid:durableId="444888444">
-    <w:abstractNumId w:val="43"/>
+    <w:abstractNumId w:val="44"/>
   </w:num>
   <w:num w:numId="85" w16cid:durableId="64299649">
-    <w:abstractNumId w:val="85"/>
+    <w:abstractNumId w:val="90"/>
   </w:num>
   <w:num w:numId="86" w16cid:durableId="868182992">
-    <w:abstractNumId w:val="54"/>
+    <w:abstractNumId w:val="57"/>
   </w:num>
   <w:num w:numId="87" w16cid:durableId="896863331">
-    <w:abstractNumId w:val="20"/>
+    <w:abstractNumId w:val="21"/>
   </w:num>
   <w:num w:numId="88" w16cid:durableId="505442826">
-    <w:abstractNumId w:val="86"/>
+    <w:abstractNumId w:val="92"/>
   </w:num>
   <w:num w:numId="89" w16cid:durableId="1858763908">
-    <w:abstractNumId w:val="31"/>
+    <w:abstractNumId w:val="32"/>
   </w:num>
   <w:num w:numId="90" w16cid:durableId="1896088176">
     <w:abstractNumId w:val="10"/>
   </w:num>
   <w:num w:numId="91" w16cid:durableId="1284576603">
-    <w:abstractNumId w:val="75"/>
+    <w:abstractNumId w:val="80"/>
   </w:num>
   <w:num w:numId="92" w16cid:durableId="1963075542">
     <w:abstractNumId w:val="6"/>
   </w:num>
   <w:num w:numId="93" w16cid:durableId="787627596">
-    <w:abstractNumId w:val="66"/>
+    <w:abstractNumId w:val="71"/>
   </w:num>
   <w:num w:numId="94" w16cid:durableId="2003925799">
     <w:abstractNumId w:val="8"/>
   </w:num>
   <w:num w:numId="95" w16cid:durableId="1169102579">
-    <w:abstractNumId w:val="77"/>
+    <w:abstractNumId w:val="82"/>
   </w:num>
   <w:num w:numId="96" w16cid:durableId="1216501564">
-    <w:abstractNumId w:val="28"/>
+    <w:abstractNumId w:val="29"/>
   </w:num>
   <w:num w:numId="97" w16cid:durableId="261768216">
-    <w:abstractNumId w:val="96"/>
+    <w:abstractNumId w:val="102"/>
   </w:num>
   <w:num w:numId="98" w16cid:durableId="2141918721">
-    <w:abstractNumId w:val="63"/>
+    <w:abstractNumId w:val="67"/>
   </w:num>
   <w:num w:numId="99" w16cid:durableId="905841544">
-    <w:abstractNumId w:val="34"/>
+    <w:abstractNumId w:val="35"/>
   </w:num>
   <w:num w:numId="100" w16cid:durableId="1753887223">
-    <w:abstractNumId w:val="76"/>
+    <w:abstractNumId w:val="81"/>
   </w:num>
   <w:num w:numId="101" w16cid:durableId="1320184766">
-    <w:abstractNumId w:val="23"/>
+    <w:abstractNumId w:val="24"/>
   </w:num>
   <w:num w:numId="102" w16cid:durableId="465127606">
+    <w:abstractNumId w:val="52"/>
+  </w:num>
+  <w:num w:numId="103" w16cid:durableId="1640451435">
     <w:abstractNumId w:val="50"/>
   </w:num>
-  <w:num w:numId="103" w16cid:durableId="1640451435">
-    <w:abstractNumId w:val="48"/>
-  </w:num>
   <w:num w:numId="104" w16cid:durableId="942029608">
-    <w:abstractNumId w:val="45"/>
+    <w:abstractNumId w:val="46"/>
   </w:num>
   <w:num w:numId="105" w16cid:durableId="70857193">
-    <w:abstractNumId w:val="52"/>
+    <w:abstractNumId w:val="54"/>
   </w:num>
   <w:num w:numId="106" w16cid:durableId="1617908629">
-    <w:abstractNumId w:val="99"/>
+    <w:abstractNumId w:val="106"/>
   </w:num>
   <w:num w:numId="107" w16cid:durableId="970137111">
-    <w:abstractNumId w:val="107"/>
+    <w:abstractNumId w:val="115"/>
   </w:num>
   <w:num w:numId="108" w16cid:durableId="383797013">
-    <w:abstractNumId w:val="41"/>
+    <w:abstractNumId w:val="42"/>
   </w:num>
   <w:num w:numId="109" w16cid:durableId="1459567304">
-    <w:abstractNumId w:val="51"/>
+    <w:abstractNumId w:val="53"/>
+  </w:num>
+  <w:num w:numId="110" w16cid:durableId="862745862">
+    <w:abstractNumId w:val="17"/>
+  </w:num>
+  <w:num w:numId="111" w16cid:durableId="1859536331">
+    <w:abstractNumId w:val="56"/>
+  </w:num>
+  <w:num w:numId="112" w16cid:durableId="2092697678">
+    <w:abstractNumId w:val="69"/>
+  </w:num>
+  <w:num w:numId="113" w16cid:durableId="1418403813">
+    <w:abstractNumId w:val="60"/>
+  </w:num>
+  <w:num w:numId="114" w16cid:durableId="1965042317">
+    <w:abstractNumId w:val="105"/>
+  </w:num>
+  <w:num w:numId="115" w16cid:durableId="670569040">
+    <w:abstractNumId w:val="49"/>
+  </w:num>
+  <w:num w:numId="116" w16cid:durableId="413823113">
+    <w:abstractNumId w:val="112"/>
+  </w:num>
+  <w:num w:numId="117" w16cid:durableId="1293747982">
+    <w:abstractNumId w:val="91"/>
   </w:num>
   <w:numIdMacAtCleanup w:val="45"/>
 </w:numbering>

</xml_diff>

<commit_message>
Location Services Sequence Diagram (#245)
</commit_message>
<xml_diff>
--- a/Sequence Specification Document.docx
+++ b/Sequence Specification Document.docx
@@ -4797,12 +4797,21 @@
         </w:numPr>
         <w:spacing w:line="278" w:lineRule="auto"/>
       </w:pPr>
-      <w:r>
-        <w:rPr>
-          <w:b/>
-          <w:bCs/>
-        </w:rPr>
-        <w:t>DisputeUI (Boundary):</w:t>
+      <w:proofErr w:type="spellStart"/>
+      <w:r>
+        <w:rPr>
+          <w:b/>
+          <w:bCs/>
+        </w:rPr>
+        <w:t>DisputeUI</w:t>
+      </w:r>
+      <w:proofErr w:type="spellEnd"/>
+      <w:r>
+        <w:rPr>
+          <w:b/>
+          <w:bCs/>
+        </w:rPr>
+        <w:t xml:space="preserve"> (Boundary):</w:t>
       </w:r>
       <w:r>
         <w:t xml:space="preserve"> Provides the interface for submitting, reviewing, and managing disputes.</w:t>
@@ -7714,6 +7723,102 @@
       <w:r>
         <w:t>Location Services Sequence Diagram shows how location technologies improve the experience of the customer by providing nearby available vehicles.</w:t>
       </w:r>
+    </w:p>
+    <w:p>
+      <w:pPr>
+        <w:keepNext/>
+        <w:spacing w:line="278" w:lineRule="auto"/>
+      </w:pPr>
+      <w:r>
+        <w:rPr>
+          <w:noProof/>
+        </w:rPr>
+        <w:drawing>
+          <wp:inline distT="0" distB="0" distL="0" distR="0" wp14:anchorId="388D8FD5" wp14:editId="707AC7F5">
+            <wp:extent cx="5941695" cy="3089910"/>
+            <wp:effectExtent l="0" t="0" r="1905" b="0"/>
+            <wp:docPr id="1024234780" name="Picture 13"/>
+            <wp:cNvGraphicFramePr>
+              <a:graphicFrameLocks xmlns:a="http://schemas.openxmlformats.org/drawingml/2006/main" noChangeAspect="1"/>
+            </wp:cNvGraphicFramePr>
+            <a:graphic xmlns:a="http://schemas.openxmlformats.org/drawingml/2006/main">
+              <a:graphicData uri="http://schemas.openxmlformats.org/drawingml/2006/picture">
+                <pic:pic xmlns:pic="http://schemas.openxmlformats.org/drawingml/2006/picture">
+                  <pic:nvPicPr>
+                    <pic:cNvPr id="0" name="Picture 19"/>
+                    <pic:cNvPicPr>
+                      <a:picLocks noChangeAspect="1" noChangeArrowheads="1"/>
+                    </pic:cNvPicPr>
+                  </pic:nvPicPr>
+                  <pic:blipFill>
+                    <a:blip r:embed="rId20">
+                      <a:extLst>
+                        <a:ext uri="{28A0092B-C50C-407E-A947-70E740481C1C}">
+                          <a14:useLocalDpi xmlns:a14="http://schemas.microsoft.com/office/drawing/2010/main" val="0"/>
+                        </a:ext>
+                      </a:extLst>
+                    </a:blip>
+                    <a:srcRect/>
+                    <a:stretch>
+                      <a:fillRect/>
+                    </a:stretch>
+                  </pic:blipFill>
+                  <pic:spPr bwMode="auto">
+                    <a:xfrm>
+                      <a:off x="0" y="0"/>
+                      <a:ext cx="5941695" cy="3089910"/>
+                    </a:xfrm>
+                    <a:prstGeom prst="rect">
+                      <a:avLst/>
+                    </a:prstGeom>
+                    <a:noFill/>
+                    <a:ln>
+                      <a:noFill/>
+                    </a:ln>
+                  </pic:spPr>
+                </pic:pic>
+              </a:graphicData>
+            </a:graphic>
+          </wp:inline>
+        </w:drawing>
+      </w:r>
+    </w:p>
+    <w:p>
+      <w:pPr>
+        <w:pStyle w:val="Caption"/>
+      </w:pPr>
+      <w:r>
+        <w:t xml:space="preserve">Figure </w:t>
+      </w:r>
+      <w:r>
+        <w:fldChar w:fldCharType="begin"/>
+      </w:r>
+      <w:r>
+        <w:instrText xml:space="preserve"> SEQ Figure \* ARABIC </w:instrText>
+      </w:r>
+      <w:r>
+        <w:fldChar w:fldCharType="separate"/>
+      </w:r>
+      <w:r>
+        <w:rPr>
+          <w:noProof/>
+        </w:rPr>
+        <w:t>13</w:t>
+      </w:r>
+      <w:r>
+        <w:fldChar w:fldCharType="end"/>
+      </w:r>
+      <w:r>
+        <w:t xml:space="preserve"> - </w:t>
+      </w:r>
+      <w:r>
+        <w:t>Location Services Sequence Diagram</w:t>
+      </w:r>
+    </w:p>
+    <w:p>
+      <w:pPr>
+        <w:spacing w:line="278" w:lineRule="auto"/>
+      </w:pPr>
       <w:r>
         <w:br w:type="page"/>
       </w:r>

</xml_diff>

<commit_message>
Push Notification Sequence Diagram (#246)
</commit_message>
<xml_diff>
--- a/Sequence Specification Document.docx
+++ b/Sequence Specification Document.docx
@@ -4797,21 +4797,12 @@
         </w:numPr>
         <w:spacing w:line="278" w:lineRule="auto"/>
       </w:pPr>
-      <w:proofErr w:type="spellStart"/>
-      <w:r>
-        <w:rPr>
-          <w:b/>
-          <w:bCs/>
-        </w:rPr>
-        <w:t>DisputeUI</w:t>
-      </w:r>
-      <w:proofErr w:type="spellEnd"/>
-      <w:r>
-        <w:rPr>
-          <w:b/>
-          <w:bCs/>
-        </w:rPr>
-        <w:t xml:space="preserve"> (Boundary):</w:t>
+      <w:r>
+        <w:rPr>
+          <w:b/>
+          <w:bCs/>
+        </w:rPr>
+        <w:t>DisputeUI (Boundary):</w:t>
       </w:r>
       <w:r>
         <w:t xml:space="preserve"> Provides the interface for submitting, reviewing, and managing disputes.</w:t>
@@ -7973,6 +7964,99 @@
       <w:r>
         <w:t>Push Notification Sequence Diagram is a depiction of real-time messaging that ensures the customer is updated on any event.</w:t>
       </w:r>
+    </w:p>
+    <w:p>
+      <w:pPr>
+        <w:keepNext/>
+        <w:spacing w:line="278" w:lineRule="auto"/>
+      </w:pPr>
+      <w:r>
+        <w:rPr>
+          <w:noProof/>
+        </w:rPr>
+        <w:drawing>
+          <wp:inline distT="0" distB="0" distL="0" distR="0" wp14:anchorId="3D9E3E0E" wp14:editId="44F9AE79">
+            <wp:extent cx="5941695" cy="2278380"/>
+            <wp:effectExtent l="0" t="0" r="1905" b="7620"/>
+            <wp:docPr id="1732564248" name="Picture 14"/>
+            <wp:cNvGraphicFramePr>
+              <a:graphicFrameLocks xmlns:a="http://schemas.openxmlformats.org/drawingml/2006/main" noChangeAspect="1"/>
+            </wp:cNvGraphicFramePr>
+            <a:graphic xmlns:a="http://schemas.openxmlformats.org/drawingml/2006/main">
+              <a:graphicData uri="http://schemas.openxmlformats.org/drawingml/2006/picture">
+                <pic:pic xmlns:pic="http://schemas.openxmlformats.org/drawingml/2006/picture">
+                  <pic:nvPicPr>
+                    <pic:cNvPr id="0" name="Picture 21"/>
+                    <pic:cNvPicPr>
+                      <a:picLocks noChangeAspect="1" noChangeArrowheads="1"/>
+                    </pic:cNvPicPr>
+                  </pic:nvPicPr>
+                  <pic:blipFill>
+                    <a:blip r:embed="rId21">
+                      <a:extLst>
+                        <a:ext uri="{28A0092B-C50C-407E-A947-70E740481C1C}">
+                          <a14:useLocalDpi xmlns:a14="http://schemas.microsoft.com/office/drawing/2010/main" val="0"/>
+                        </a:ext>
+                      </a:extLst>
+                    </a:blip>
+                    <a:srcRect/>
+                    <a:stretch>
+                      <a:fillRect/>
+                    </a:stretch>
+                  </pic:blipFill>
+                  <pic:spPr bwMode="auto">
+                    <a:xfrm>
+                      <a:off x="0" y="0"/>
+                      <a:ext cx="5941695" cy="2278380"/>
+                    </a:xfrm>
+                    <a:prstGeom prst="rect">
+                      <a:avLst/>
+                    </a:prstGeom>
+                    <a:noFill/>
+                    <a:ln>
+                      <a:noFill/>
+                    </a:ln>
+                  </pic:spPr>
+                </pic:pic>
+              </a:graphicData>
+            </a:graphic>
+          </wp:inline>
+        </w:drawing>
+      </w:r>
+    </w:p>
+    <w:p>
+      <w:pPr>
+        <w:pStyle w:val="Caption"/>
+      </w:pPr>
+      <w:r>
+        <w:t xml:space="preserve">Figure </w:t>
+      </w:r>
+      <w:r>
+        <w:fldChar w:fldCharType="begin"/>
+      </w:r>
+      <w:r>
+        <w:instrText xml:space="preserve"> SEQ Figure \* ARABIC </w:instrText>
+      </w:r>
+      <w:r>
+        <w:fldChar w:fldCharType="separate"/>
+      </w:r>
+      <w:r>
+        <w:rPr>
+          <w:noProof/>
+        </w:rPr>
+        <w:t>14</w:t>
+      </w:r>
+      <w:r>
+        <w:fldChar w:fldCharType="end"/>
+      </w:r>
+      <w:r>
+        <w:t xml:space="preserve"> - Push Notification Sequence Diagram</w:t>
+      </w:r>
+    </w:p>
+    <w:p>
+      <w:pPr>
+        <w:spacing w:line="278" w:lineRule="auto"/>
+      </w:pPr>
       <w:r>
         <w:br w:type="page"/>
       </w:r>

</xml_diff>

<commit_message>
Offline Synchronization Sequence Diagram (#247)
</commit_message>
<xml_diff>
--- a/Sequence Specification Document.docx
+++ b/Sequence Specification Document.docx
@@ -8225,6 +8225,93 @@
     <w:p>
       <w:r>
         <w:t>Offline Synchronization Sequence Diagram shows how the mobile application stays usable during network outages, and ensures synchronization of data kept locally to the main system once there is network connection again.</w:t>
+      </w:r>
+    </w:p>
+    <w:p>
+      <w:pPr>
+        <w:keepNext/>
+      </w:pPr>
+      <w:r>
+        <w:rPr>
+          <w:noProof/>
+        </w:rPr>
+        <w:drawing>
+          <wp:inline distT="0" distB="0" distL="0" distR="0" wp14:anchorId="49CF3289" wp14:editId="410A01C4">
+            <wp:extent cx="5941695" cy="2723515"/>
+            <wp:effectExtent l="0" t="0" r="1905" b="635"/>
+            <wp:docPr id="2138125180" name="Picture 15"/>
+            <wp:cNvGraphicFramePr>
+              <a:graphicFrameLocks xmlns:a="http://schemas.openxmlformats.org/drawingml/2006/main" noChangeAspect="1"/>
+            </wp:cNvGraphicFramePr>
+            <a:graphic xmlns:a="http://schemas.openxmlformats.org/drawingml/2006/main">
+              <a:graphicData uri="http://schemas.openxmlformats.org/drawingml/2006/picture">
+                <pic:pic xmlns:pic="http://schemas.openxmlformats.org/drawingml/2006/picture">
+                  <pic:nvPicPr>
+                    <pic:cNvPr id="0" name="Picture 23"/>
+                    <pic:cNvPicPr>
+                      <a:picLocks noChangeAspect="1" noChangeArrowheads="1"/>
+                    </pic:cNvPicPr>
+                  </pic:nvPicPr>
+                  <pic:blipFill>
+                    <a:blip r:embed="rId22">
+                      <a:extLst>
+                        <a:ext uri="{28A0092B-C50C-407E-A947-70E740481C1C}">
+                          <a14:useLocalDpi xmlns:a14="http://schemas.microsoft.com/office/drawing/2010/main" val="0"/>
+                        </a:ext>
+                      </a:extLst>
+                    </a:blip>
+                    <a:srcRect/>
+                    <a:stretch>
+                      <a:fillRect/>
+                    </a:stretch>
+                  </pic:blipFill>
+                  <pic:spPr bwMode="auto">
+                    <a:xfrm>
+                      <a:off x="0" y="0"/>
+                      <a:ext cx="5941695" cy="2723515"/>
+                    </a:xfrm>
+                    <a:prstGeom prst="rect">
+                      <a:avLst/>
+                    </a:prstGeom>
+                    <a:noFill/>
+                    <a:ln>
+                      <a:noFill/>
+                    </a:ln>
+                  </pic:spPr>
+                </pic:pic>
+              </a:graphicData>
+            </a:graphic>
+          </wp:inline>
+        </w:drawing>
+      </w:r>
+    </w:p>
+    <w:p>
+      <w:pPr>
+        <w:pStyle w:val="Caption"/>
+      </w:pPr>
+      <w:r>
+        <w:t xml:space="preserve">Figure </w:t>
+      </w:r>
+      <w:r>
+        <w:fldChar w:fldCharType="begin"/>
+      </w:r>
+      <w:r>
+        <w:instrText xml:space="preserve"> SEQ Figure \* ARABIC </w:instrText>
+      </w:r>
+      <w:r>
+        <w:fldChar w:fldCharType="separate"/>
+      </w:r>
+      <w:r>
+        <w:rPr>
+          <w:noProof/>
+        </w:rPr>
+        <w:t>15</w:t>
+      </w:r>
+      <w:r>
+        <w:fldChar w:fldCharType="end"/>
+      </w:r>
+      <w:r>
+        <w:t xml:space="preserve"> - Offline Synchronization Sequence Diagram</w:t>
       </w:r>
     </w:p>
     <w:p/>

</xml_diff>

<commit_message>
Customer Registration Process Activity Diagram (#258)
</commit_message>
<xml_diff>
--- a/Sequence Specification Document.docx
+++ b/Sequence Specification Document.docx
@@ -33,6 +33,38 @@
       <w:pPr>
         <w:spacing w:line="278" w:lineRule="auto"/>
       </w:pPr>
+    </w:p>
+    <w:p>
+      <w:pPr>
+        <w:spacing w:line="278" w:lineRule="auto"/>
+      </w:pPr>
+      <w:r>
+        <w:t>This chapter contains the specifications for the sequence diagrams of the KriGo vehicle rental platform. Sequence diagrams are the basic elements of the Unified Modeling Language (UML) and represent a modeling technique that shows how objects and components of the system collaborate over time in order to achieve certain functionalities.</w:t>
+      </w:r>
+    </w:p>
+    <w:p>
+      <w:pPr>
+        <w:spacing w:line="278" w:lineRule="auto"/>
+      </w:pPr>
+      <w:r>
+        <w:t>Unlike use case diagrams which show the functional requirements of the system from the user side, sequence diagrams illustrate the step-by-step process of exchange of messages between actors and components of the system. The sequence diagrams shown in this chapter reveal the processes by which messages go through the presentation layer, business logic layer, data access layer, and even external services and thus explain the internal work flow necessary to perform each of the use cases.</w:t>
+      </w:r>
+    </w:p>
+    <w:p>
+      <w:pPr>
+        <w:spacing w:line="278" w:lineRule="auto"/>
+      </w:pPr>
+      <w:r>
+        <w:t>Each sequence diagram in this chapter reflects a particular business process carried out using the KriGo vehicle rental platform and covers the processes of customer registration, searching and discovering of vehicles, handling reservations, payments, fleet management, branches and employees administration, agency verification, disputes handling, generating recommendations by means of artificial intelligence, interacting with the artificial intelligence assistant, generating analytics insights, working with mobile applications and external payment gateways. For each diagram, a detailed specification is provided describing its purpose, involved objects, typical process, alternative paths, validation and overall system behavior.</w:t>
+      </w:r>
+    </w:p>
+    <w:p>
+      <w:pPr>
+        <w:spacing w:line="278" w:lineRule="auto"/>
+      </w:pPr>
+      <w:r>
+        <w:t>Sequence diagrams are one of the important links between the requirements of the system and its implementation. They allow developers and other stakeholders to understand how objects interact, in what sequence and what operations are performed at the same time.</w:t>
+      </w:r>
     </w:p>
     <w:p>
       <w:pPr>
@@ -4797,12 +4829,21 @@
         </w:numPr>
         <w:spacing w:line="278" w:lineRule="auto"/>
       </w:pPr>
-      <w:r>
-        <w:rPr>
-          <w:b/>
-          <w:bCs/>
-        </w:rPr>
-        <w:t>DisputeUI (Boundary):</w:t>
+      <w:proofErr w:type="spellStart"/>
+      <w:r>
+        <w:rPr>
+          <w:b/>
+          <w:bCs/>
+        </w:rPr>
+        <w:t>DisputeUI</w:t>
+      </w:r>
+      <w:proofErr w:type="spellEnd"/>
+      <w:r>
+        <w:rPr>
+          <w:b/>
+          <w:bCs/>
+        </w:rPr>
+        <w:t xml:space="preserve"> (Boundary):</w:t>
       </w:r>
       <w:r>
         <w:t xml:space="preserve"> Provides the interface for submitting, reviewing, and managing disputes.</w:t>
@@ -8314,11 +8355,6 @@
         <w:t xml:space="preserve"> - Offline Synchronization Sequence Diagram</w:t>
       </w:r>
     </w:p>
-    <w:p/>
-    <w:p/>
-    <w:p/>
-    <w:p/>
-    <w:p/>
     <w:p/>
     <w:p/>
     <w:p/>

</xml_diff>

<commit_message>
Payment State Modeling (#287) Payment Lifecycle Analysis (#288) Payment State Machine Diagram (#289)
</commit_message>
<xml_diff>
--- a/Sequence Specification Document.docx
+++ b/Sequence Specification Document.docx
@@ -608,6 +608,560 @@
         <w:br w:type="page"/>
       </w:r>
     </w:p>
+    <w:p>
+      <w:pPr>
+        <w:pStyle w:val="Heading2"/>
+        <w:numPr>
+          <w:ilvl w:val="0"/>
+          <w:numId w:val="119"/>
+        </w:numPr>
+      </w:pPr>
+      <w:r>
+        <w:lastRenderedPageBreak/>
+        <w:t>Payment Lifecycle Analysis</w:t>
+      </w:r>
+    </w:p>
+    <w:p>
+      <w:r>
+        <w:t>Payment Entity is responsible for the financial transaction related to the reservation in KriGo software. The lifecycle of this entity starts at the moment when customer wants to make a payment for the reservation and ends with the successful completion, cancellation, or refunding of the payment transaction.</w:t>
+      </w:r>
+    </w:p>
+    <w:p>
+      <w:r>
+        <w:t>In the course of its life cycle, the payment goes through several clearly defined states that guarantee secure financial transaction processing and accurate record keeping.</w:t>
+      </w:r>
+    </w:p>
+    <w:p>
+      <w:r>
+        <w:t>The payment lifecycle starts when customer makes a payment for a reservation using the services of external Edahabia payment gateway. In this case, the payment gets the Pending state while the system verifies the payment data and sends transaction request to the payment gateway.</w:t>
+      </w:r>
+    </w:p>
+    <w:p>
+      <w:r>
+        <w:t>If the transaction authorization is successfully performed by the payment gateway, the payment moves to the Authorized state which means that the payment was authorized but not completed inside the system. In this case, the system registers the transaction and changes the status of the corresponding reservation, moving the payment to the Completed state.</w:t>
+      </w:r>
+    </w:p>
+    <w:p>
+      <w:r>
+        <w:t>If the transaction authorization is refused because of the lack of money on the account, invalid card number, or some other problem, the payment moves to the Failed state. Customer can repeat the operation making another payment.</w:t>
+      </w:r>
+    </w:p>
+    <w:p>
+      <w:r>
+        <w:t>Sometimes, due to the cancellation of the reservation or approved dispute, the payment that was completed previously can move to the Refunded state.</w:t>
+      </w:r>
+    </w:p>
+    <w:p>
+      <w:r>
+        <w:t>Or, in case when customer leaves the payment procedure without completing the authorization or intentionally cancels the transaction, the payment gets the Cancelled state, ending its life cycle without changing any records about reservation payments.</w:t>
+      </w:r>
+    </w:p>
+    <w:p>
+      <w:r>
+        <w:t>This payment lifecycle guarantees the consistent state of every transaction and accurate transaction and reservation management together with secure connection with external payment service.</w:t>
+      </w:r>
+    </w:p>
+    <w:p>
+      <w:pPr>
+        <w:spacing w:line="278" w:lineRule="auto"/>
+      </w:pPr>
+      <w:r>
+        <w:br w:type="page"/>
+      </w:r>
+    </w:p>
+    <w:p>
+      <w:pPr>
+        <w:pStyle w:val="Heading3"/>
+      </w:pPr>
+      <w:r>
+        <w:lastRenderedPageBreak/>
+        <w:t>Payment State Machine</w:t>
+      </w:r>
+    </w:p>
+    <w:p>
+      <w:pPr>
+        <w:rPr>
+          <w:b/>
+          <w:bCs/>
+        </w:rPr>
+      </w:pPr>
+      <w:r>
+        <w:rPr>
+          <w:b/>
+          <w:bCs/>
+        </w:rPr>
+        <w:t>Purpose</w:t>
+      </w:r>
+    </w:p>
+    <w:p>
+      <w:r>
+        <w:t>The Payment State Machine Diagram shows the life cycle of a payment transaction in the KriGo system. The state machine describes various states that a payment goes through, depending on whether the payment is successfully made, cancelled, fails, or is refunded. Contrary to workflow diagrams, the state machine is purely concerned with the behavior of the Payment object based on payment events.</w:t>
+      </w:r>
+    </w:p>
+    <w:p>
+      <w:pPr>
+        <w:rPr>
+          <w:b/>
+          <w:bCs/>
+        </w:rPr>
+      </w:pPr>
+      <w:r>
+        <w:rPr>
+          <w:b/>
+          <w:bCs/>
+        </w:rPr>
+        <w:t>Payment States</w:t>
+      </w:r>
+    </w:p>
+    <w:p>
+      <w:r>
+        <w:t>The payment lifecycle consists of the following states:</w:t>
+      </w:r>
+    </w:p>
+    <w:p>
+      <w:pPr>
+        <w:pStyle w:val="ListParagraph"/>
+        <w:numPr>
+          <w:ilvl w:val="0"/>
+          <w:numId w:val="126"/>
+        </w:numPr>
+      </w:pPr>
+      <w:r>
+        <w:rPr>
+          <w:b/>
+          <w:bCs/>
+        </w:rPr>
+        <w:t>Pending:</w:t>
+      </w:r>
+      <w:r>
+        <w:t xml:space="preserve"> The payment has been initiated and is awaiting authorization from the Edahabia payment service.</w:t>
+      </w:r>
+    </w:p>
+    <w:p>
+      <w:pPr>
+        <w:pStyle w:val="ListParagraph"/>
+        <w:numPr>
+          <w:ilvl w:val="0"/>
+          <w:numId w:val="126"/>
+        </w:numPr>
+      </w:pPr>
+      <w:r>
+        <w:rPr>
+          <w:b/>
+          <w:bCs/>
+        </w:rPr>
+        <w:t>Authorized:</w:t>
+      </w:r>
+      <w:r>
+        <w:t xml:space="preserve"> The payment has been successfully approved by the payment gateway and is ready to be finalized by the system.</w:t>
+      </w:r>
+    </w:p>
+    <w:p>
+      <w:pPr>
+        <w:pStyle w:val="ListParagraph"/>
+        <w:numPr>
+          <w:ilvl w:val="0"/>
+          <w:numId w:val="126"/>
+        </w:numPr>
+      </w:pPr>
+      <w:r>
+        <w:rPr>
+          <w:b/>
+          <w:bCs/>
+        </w:rPr>
+        <w:t>Completed:</w:t>
+      </w:r>
+      <w:r>
+        <w:t xml:space="preserve"> The transaction has been successfully recorded, and the associated reservation has been marked as paid.</w:t>
+      </w:r>
+    </w:p>
+    <w:p>
+      <w:pPr>
+        <w:pStyle w:val="ListParagraph"/>
+        <w:numPr>
+          <w:ilvl w:val="0"/>
+          <w:numId w:val="126"/>
+        </w:numPr>
+      </w:pPr>
+      <w:r>
+        <w:rPr>
+          <w:b/>
+          <w:bCs/>
+        </w:rPr>
+        <w:t>Failed:</w:t>
+      </w:r>
+      <w:r>
+        <w:t xml:space="preserve"> The payment authorization was unsuccessful due to invalid payment information, insufficient funds, or another processing error.</w:t>
+      </w:r>
+    </w:p>
+    <w:p>
+      <w:pPr>
+        <w:pStyle w:val="ListParagraph"/>
+        <w:numPr>
+          <w:ilvl w:val="0"/>
+          <w:numId w:val="126"/>
+        </w:numPr>
+      </w:pPr>
+      <w:r>
+        <w:rPr>
+          <w:b/>
+          <w:bCs/>
+        </w:rPr>
+        <w:t>Refunded:</w:t>
+      </w:r>
+      <w:r>
+        <w:t xml:space="preserve"> The completed payment has been refunded following a reservation cancellation or an approved dispute.</w:t>
+      </w:r>
+    </w:p>
+    <w:p>
+      <w:pPr>
+        <w:pStyle w:val="ListParagraph"/>
+        <w:numPr>
+          <w:ilvl w:val="0"/>
+          <w:numId w:val="126"/>
+        </w:numPr>
+      </w:pPr>
+      <w:r>
+        <w:rPr>
+          <w:b/>
+          <w:bCs/>
+        </w:rPr>
+        <w:t>Cancelled:</w:t>
+      </w:r>
+      <w:r>
+        <w:t xml:space="preserve"> The payment process was canceled before successful authorization.</w:t>
+      </w:r>
+    </w:p>
+    <w:p>
+      <w:pPr>
+        <w:rPr>
+          <w:b/>
+          <w:bCs/>
+        </w:rPr>
+      </w:pPr>
+      <w:r>
+        <w:rPr>
+          <w:b/>
+          <w:bCs/>
+        </w:rPr>
+        <w:t>State Transitions</w:t>
+      </w:r>
+    </w:p>
+    <w:p>
+      <w:r>
+        <w:t xml:space="preserve">The process starts with the payment in </w:t>
+      </w:r>
+      <w:r>
+        <w:rPr>
+          <w:b/>
+          <w:bCs/>
+        </w:rPr>
+        <w:t>Pending</w:t>
+      </w:r>
+      <w:r>
+        <w:t xml:space="preserve"> status when the customer makes a payment on the online portal. The transaction request is made by the system for the Edahabia payment gateway to authorize the payment.</w:t>
+      </w:r>
+    </w:p>
+    <w:p>
+      <w:r>
+        <w:t xml:space="preserve">If the payment gets authorized, the payment process is set into the Authorized status. Upon successful recording of the transaction and updating of the reservation payment status, the payment goes to the </w:t>
+      </w:r>
+      <w:r>
+        <w:rPr>
+          <w:b/>
+          <w:bCs/>
+        </w:rPr>
+        <w:t>Completed</w:t>
+      </w:r>
+      <w:r>
+        <w:t xml:space="preserve"> status.</w:t>
+      </w:r>
+    </w:p>
+    <w:p>
+      <w:r>
+        <w:t xml:space="preserve">On rejection of the payment by the payment gateway, the payment moves from </w:t>
+      </w:r>
+      <w:r>
+        <w:rPr>
+          <w:b/>
+          <w:bCs/>
+        </w:rPr>
+        <w:t>Pending</w:t>
+      </w:r>
+      <w:r>
+        <w:t xml:space="preserve"> to </w:t>
+      </w:r>
+      <w:r>
+        <w:rPr>
+          <w:b/>
+          <w:bCs/>
+        </w:rPr>
+        <w:t>Failed</w:t>
+      </w:r>
+      <w:r>
+        <w:t xml:space="preserve"> status, marking the end of the transaction process. The customer can make another payment request if he wishes.</w:t>
+      </w:r>
+    </w:p>
+    <w:p>
+      <w:r>
+        <w:t xml:space="preserve">There could be a case whereby the customer may want to cancel his payment before completing authorization process, which leads the payment to </w:t>
+      </w:r>
+      <w:r>
+        <w:rPr>
+          <w:b/>
+          <w:bCs/>
+        </w:rPr>
+        <w:t>Cancelled</w:t>
+      </w:r>
+      <w:r>
+        <w:t xml:space="preserve"> status.</w:t>
+      </w:r>
+    </w:p>
+    <w:p>
+      <w:r>
+        <w:t xml:space="preserve">A payment may move to </w:t>
+      </w:r>
+      <w:r>
+        <w:rPr>
+          <w:b/>
+          <w:bCs/>
+        </w:rPr>
+        <w:t>Refunded</w:t>
+      </w:r>
+      <w:r>
+        <w:t xml:space="preserve"> status from the </w:t>
+      </w:r>
+      <w:r>
+        <w:rPr>
+          <w:b/>
+          <w:bCs/>
+        </w:rPr>
+        <w:t>Completed</w:t>
+      </w:r>
+      <w:r>
+        <w:t xml:space="preserve"> status depending on scenarios like cancellation of the reservation and successful resolution of dispute.</w:t>
+      </w:r>
+    </w:p>
+    <w:p>
+      <w:pPr>
+        <w:rPr>
+          <w:b/>
+          <w:bCs/>
+        </w:rPr>
+      </w:pPr>
+      <w:r>
+        <w:rPr>
+          <w:b/>
+          <w:bCs/>
+        </w:rPr>
+        <w:t>Terminal States</w:t>
+      </w:r>
+    </w:p>
+    <w:p>
+      <w:r>
+        <w:t>The Payment State Machine Diagram contains the following terminal states:</w:t>
+      </w:r>
+    </w:p>
+    <w:p>
+      <w:pPr>
+        <w:pStyle w:val="ListParagraph"/>
+        <w:numPr>
+          <w:ilvl w:val="0"/>
+          <w:numId w:val="127"/>
+        </w:numPr>
+      </w:pPr>
+      <w:r>
+        <w:rPr>
+          <w:b/>
+          <w:bCs/>
+        </w:rPr>
+        <w:t>Completed</w:t>
+      </w:r>
+      <w:r>
+        <w:t>, representing a successfully finalized payment.</w:t>
+      </w:r>
+    </w:p>
+    <w:p>
+      <w:pPr>
+        <w:pStyle w:val="ListParagraph"/>
+        <w:numPr>
+          <w:ilvl w:val="0"/>
+          <w:numId w:val="127"/>
+        </w:numPr>
+      </w:pPr>
+      <w:r>
+        <w:rPr>
+          <w:b/>
+          <w:bCs/>
+        </w:rPr>
+        <w:t>Failed</w:t>
+      </w:r>
+      <w:r>
+        <w:t>, representing an unsuccessful payment transaction.</w:t>
+      </w:r>
+    </w:p>
+    <w:p>
+      <w:pPr>
+        <w:pStyle w:val="ListParagraph"/>
+        <w:numPr>
+          <w:ilvl w:val="0"/>
+          <w:numId w:val="127"/>
+        </w:numPr>
+      </w:pPr>
+      <w:r>
+        <w:rPr>
+          <w:b/>
+          <w:bCs/>
+        </w:rPr>
+        <w:t>Refunded</w:t>
+      </w:r>
+      <w:r>
+        <w:t>, representing a completed payment that has been reimbursed.</w:t>
+      </w:r>
+    </w:p>
+    <w:p>
+      <w:pPr>
+        <w:pStyle w:val="ListParagraph"/>
+        <w:numPr>
+          <w:ilvl w:val="0"/>
+          <w:numId w:val="127"/>
+        </w:numPr>
+      </w:pPr>
+      <w:r>
+        <w:rPr>
+          <w:b/>
+          <w:bCs/>
+        </w:rPr>
+        <w:t>Cancelled</w:t>
+      </w:r>
+      <w:r>
+        <w:t>, representing a payment process that was terminated before authorization.</w:t>
+      </w:r>
+    </w:p>
+    <w:p>
+      <w:r>
+        <w:lastRenderedPageBreak/>
+        <w:t>These terminal states indicate that no additional transitions occur unless a new payment transaction is initiated.</w:t>
+      </w:r>
+    </w:p>
+    <w:p>
+      <w:pPr>
+        <w:rPr>
+          <w:b/>
+          <w:bCs/>
+        </w:rPr>
+      </w:pPr>
+      <w:r>
+        <w:rPr>
+          <w:b/>
+          <w:bCs/>
+        </w:rPr>
+        <w:t>Conclusion</w:t>
+      </w:r>
+    </w:p>
+    <w:p>
+      <w:r>
+        <w:t>The Payment State Machine Diagram is a detailed depiction of the entire process cycle of payments on the KriGo platform. The diagram shows how the payment objects go through various stages such as authorization, confirmation, cancellation, failure, and refunds during their interactions with the Edahabia payments service. Through this diagram, security and proper management of payments, finances, and reservations can be achieved.</w:t>
+      </w:r>
+    </w:p>
+    <w:p>
+      <w:pPr>
+        <w:keepNext/>
+      </w:pPr>
+      <w:r>
+        <w:rPr>
+          <w:noProof/>
+        </w:rPr>
+        <w:drawing>
+          <wp:inline distT="0" distB="0" distL="0" distR="0" wp14:anchorId="665C4F1D" wp14:editId="0C43634A">
+            <wp:extent cx="5941695" cy="6226175"/>
+            <wp:effectExtent l="0" t="0" r="1905" b="3175"/>
+            <wp:docPr id="1020030085" name="Picture 9"/>
+            <wp:cNvGraphicFramePr>
+              <a:graphicFrameLocks xmlns:a="http://schemas.openxmlformats.org/drawingml/2006/main" noChangeAspect="1"/>
+            </wp:cNvGraphicFramePr>
+            <a:graphic xmlns:a="http://schemas.openxmlformats.org/drawingml/2006/main">
+              <a:graphicData uri="http://schemas.openxmlformats.org/drawingml/2006/picture">
+                <pic:pic xmlns:pic="http://schemas.openxmlformats.org/drawingml/2006/picture">
+                  <pic:nvPicPr>
+                    <pic:cNvPr id="0" name="Picture 3"/>
+                    <pic:cNvPicPr>
+                      <a:picLocks noChangeAspect="1" noChangeArrowheads="1"/>
+                    </pic:cNvPicPr>
+                  </pic:nvPicPr>
+                  <pic:blipFill>
+                    <a:blip r:embed="rId9">
+                      <a:extLst>
+                        <a:ext uri="{28A0092B-C50C-407E-A947-70E740481C1C}">
+                          <a14:useLocalDpi xmlns:a14="http://schemas.microsoft.com/office/drawing/2010/main" val="0"/>
+                        </a:ext>
+                      </a:extLst>
+                    </a:blip>
+                    <a:srcRect/>
+                    <a:stretch>
+                      <a:fillRect/>
+                    </a:stretch>
+                  </pic:blipFill>
+                  <pic:spPr bwMode="auto">
+                    <a:xfrm>
+                      <a:off x="0" y="0"/>
+                      <a:ext cx="5941695" cy="6226175"/>
+                    </a:xfrm>
+                    <a:prstGeom prst="rect">
+                      <a:avLst/>
+                    </a:prstGeom>
+                    <a:noFill/>
+                    <a:ln>
+                      <a:noFill/>
+                    </a:ln>
+                  </pic:spPr>
+                </pic:pic>
+              </a:graphicData>
+            </a:graphic>
+          </wp:inline>
+        </w:drawing>
+      </w:r>
+    </w:p>
+    <w:p>
+      <w:pPr>
+        <w:pStyle w:val="Caption"/>
+      </w:pPr>
+      <w:r>
+        <w:t xml:space="preserve">Figure </w:t>
+      </w:r>
+      <w:r>
+        <w:fldChar w:fldCharType="begin"/>
+      </w:r>
+      <w:r>
+        <w:instrText xml:space="preserve"> SEQ Figure \* ARABIC </w:instrText>
+      </w:r>
+      <w:r>
+        <w:fldChar w:fldCharType="separate"/>
+      </w:r>
+      <w:r>
+        <w:rPr>
+          <w:noProof/>
+        </w:rPr>
+        <w:t>2</w:t>
+      </w:r>
+      <w:r>
+        <w:fldChar w:fldCharType="end"/>
+      </w:r>
+      <w:r>
+        <w:t xml:space="preserve"> - </w:t>
+      </w:r>
+      <w:r>
+        <w:t>Payment State Machine Diagram</w:t>
+      </w:r>
+    </w:p>
+    <w:p>
+      <w:pPr>
+        <w:spacing w:line="278" w:lineRule="auto"/>
+      </w:pPr>
+      <w:r>
+        <w:br w:type="page"/>
+      </w:r>
+    </w:p>
     <w:p/>
     <w:sectPr>
       <w:pgSz w:w="11906" w:h="16838" w:code="9"/>
@@ -11498,6 +12052,155 @@
     </w:lvl>
   </w:abstractNum>
   <w:abstractNum w:abstractNumId="82" w15:restartNumberingAfterBreak="0">
+    <w:nsid w:val="588F256D"/>
+    <w:multiLevelType w:val="multilevel"/>
+    <w:tmpl w:val="E8F493CA"/>
+    <w:lvl w:ilvl="0">
+      <w:start w:val="1"/>
+      <w:numFmt w:val="bullet"/>
+      <w:lvlText w:val=""/>
+      <w:lvlJc w:val="left"/>
+      <w:pPr>
+        <w:tabs>
+          <w:tab w:val="num" w:pos="720"/>
+        </w:tabs>
+        <w:ind w:left="720" w:hanging="360"/>
+      </w:pPr>
+      <w:rPr>
+        <w:rFonts w:ascii="Symbol" w:hAnsi="Symbol" w:hint="default"/>
+        <w:sz w:val="20"/>
+      </w:rPr>
+    </w:lvl>
+    <w:lvl w:ilvl="1" w:tentative="1">
+      <w:start w:val="1"/>
+      <w:numFmt w:val="bullet"/>
+      <w:lvlText w:val="o"/>
+      <w:lvlJc w:val="left"/>
+      <w:pPr>
+        <w:tabs>
+          <w:tab w:val="num" w:pos="1440"/>
+        </w:tabs>
+        <w:ind w:left="1440" w:hanging="360"/>
+      </w:pPr>
+      <w:rPr>
+        <w:rFonts w:ascii="Courier New" w:hAnsi="Courier New" w:hint="default"/>
+        <w:sz w:val="20"/>
+      </w:rPr>
+    </w:lvl>
+    <w:lvl w:ilvl="2" w:tentative="1">
+      <w:start w:val="1"/>
+      <w:numFmt w:val="bullet"/>
+      <w:lvlText w:val=""/>
+      <w:lvlJc w:val="left"/>
+      <w:pPr>
+        <w:tabs>
+          <w:tab w:val="num" w:pos="2160"/>
+        </w:tabs>
+        <w:ind w:left="2160" w:hanging="360"/>
+      </w:pPr>
+      <w:rPr>
+        <w:rFonts w:ascii="Wingdings" w:hAnsi="Wingdings" w:hint="default"/>
+        <w:sz w:val="20"/>
+      </w:rPr>
+    </w:lvl>
+    <w:lvl w:ilvl="3" w:tentative="1">
+      <w:start w:val="1"/>
+      <w:numFmt w:val="bullet"/>
+      <w:lvlText w:val=""/>
+      <w:lvlJc w:val="left"/>
+      <w:pPr>
+        <w:tabs>
+          <w:tab w:val="num" w:pos="2880"/>
+        </w:tabs>
+        <w:ind w:left="2880" w:hanging="360"/>
+      </w:pPr>
+      <w:rPr>
+        <w:rFonts w:ascii="Wingdings" w:hAnsi="Wingdings" w:hint="default"/>
+        <w:sz w:val="20"/>
+      </w:rPr>
+    </w:lvl>
+    <w:lvl w:ilvl="4" w:tentative="1">
+      <w:start w:val="1"/>
+      <w:numFmt w:val="bullet"/>
+      <w:lvlText w:val=""/>
+      <w:lvlJc w:val="left"/>
+      <w:pPr>
+        <w:tabs>
+          <w:tab w:val="num" w:pos="3600"/>
+        </w:tabs>
+        <w:ind w:left="3600" w:hanging="360"/>
+      </w:pPr>
+      <w:rPr>
+        <w:rFonts w:ascii="Wingdings" w:hAnsi="Wingdings" w:hint="default"/>
+        <w:sz w:val="20"/>
+      </w:rPr>
+    </w:lvl>
+    <w:lvl w:ilvl="5" w:tentative="1">
+      <w:start w:val="1"/>
+      <w:numFmt w:val="bullet"/>
+      <w:lvlText w:val=""/>
+      <w:lvlJc w:val="left"/>
+      <w:pPr>
+        <w:tabs>
+          <w:tab w:val="num" w:pos="4320"/>
+        </w:tabs>
+        <w:ind w:left="4320" w:hanging="360"/>
+      </w:pPr>
+      <w:rPr>
+        <w:rFonts w:ascii="Wingdings" w:hAnsi="Wingdings" w:hint="default"/>
+        <w:sz w:val="20"/>
+      </w:rPr>
+    </w:lvl>
+    <w:lvl w:ilvl="6" w:tentative="1">
+      <w:start w:val="1"/>
+      <w:numFmt w:val="bullet"/>
+      <w:lvlText w:val=""/>
+      <w:lvlJc w:val="left"/>
+      <w:pPr>
+        <w:tabs>
+          <w:tab w:val="num" w:pos="5040"/>
+        </w:tabs>
+        <w:ind w:left="5040" w:hanging="360"/>
+      </w:pPr>
+      <w:rPr>
+        <w:rFonts w:ascii="Wingdings" w:hAnsi="Wingdings" w:hint="default"/>
+        <w:sz w:val="20"/>
+      </w:rPr>
+    </w:lvl>
+    <w:lvl w:ilvl="7" w:tentative="1">
+      <w:start w:val="1"/>
+      <w:numFmt w:val="bullet"/>
+      <w:lvlText w:val=""/>
+      <w:lvlJc w:val="left"/>
+      <w:pPr>
+        <w:tabs>
+          <w:tab w:val="num" w:pos="5760"/>
+        </w:tabs>
+        <w:ind w:left="5760" w:hanging="360"/>
+      </w:pPr>
+      <w:rPr>
+        <w:rFonts w:ascii="Wingdings" w:hAnsi="Wingdings" w:hint="default"/>
+        <w:sz w:val="20"/>
+      </w:rPr>
+    </w:lvl>
+    <w:lvl w:ilvl="8" w:tentative="1">
+      <w:start w:val="1"/>
+      <w:numFmt w:val="bullet"/>
+      <w:lvlText w:val=""/>
+      <w:lvlJc w:val="left"/>
+      <w:pPr>
+        <w:tabs>
+          <w:tab w:val="num" w:pos="6480"/>
+        </w:tabs>
+        <w:ind w:left="6480" w:hanging="360"/>
+      </w:pPr>
+      <w:rPr>
+        <w:rFonts w:ascii="Wingdings" w:hAnsi="Wingdings" w:hint="default"/>
+        <w:sz w:val="20"/>
+      </w:rPr>
+    </w:lvl>
+  </w:abstractNum>
+  <w:abstractNum w:abstractNumId="83" w15:restartNumberingAfterBreak="0">
     <w:nsid w:val="5A460390"/>
     <w:multiLevelType w:val="hybridMultilevel"/>
     <w:tmpl w:val="BD8E939C"/>
@@ -11610,7 +12313,7 @@
       </w:rPr>
     </w:lvl>
   </w:abstractNum>
-  <w:abstractNum w:abstractNumId="83" w15:restartNumberingAfterBreak="0">
+  <w:abstractNum w:abstractNumId="84" w15:restartNumberingAfterBreak="0">
     <w:nsid w:val="5CEE630B"/>
     <w:multiLevelType w:val="hybridMultilevel"/>
     <w:tmpl w:val="DE8E8DBA"/>
@@ -11723,7 +12426,7 @@
       </w:rPr>
     </w:lvl>
   </w:abstractNum>
-  <w:abstractNum w:abstractNumId="84" w15:restartNumberingAfterBreak="0">
+  <w:abstractNum w:abstractNumId="85" w15:restartNumberingAfterBreak="0">
     <w:nsid w:val="5D5A183C"/>
     <w:multiLevelType w:val="multilevel"/>
     <w:tmpl w:val="C804C34A"/>
@@ -11872,7 +12575,7 @@
       </w:rPr>
     </w:lvl>
   </w:abstractNum>
-  <w:abstractNum w:abstractNumId="85" w15:restartNumberingAfterBreak="0">
+  <w:abstractNum w:abstractNumId="86" w15:restartNumberingAfterBreak="0">
     <w:nsid w:val="5DF95194"/>
     <w:multiLevelType w:val="multilevel"/>
     <w:tmpl w:val="CC127E54"/>
@@ -12021,7 +12724,7 @@
       </w:rPr>
     </w:lvl>
   </w:abstractNum>
-  <w:abstractNum w:abstractNumId="86" w15:restartNumberingAfterBreak="0">
+  <w:abstractNum w:abstractNumId="87" w15:restartNumberingAfterBreak="0">
     <w:nsid w:val="5E9C452C"/>
     <w:multiLevelType w:val="multilevel"/>
     <w:tmpl w:val="B8727936"/>
@@ -12170,7 +12873,7 @@
       </w:rPr>
     </w:lvl>
   </w:abstractNum>
-  <w:abstractNum w:abstractNumId="87" w15:restartNumberingAfterBreak="0">
+  <w:abstractNum w:abstractNumId="88" w15:restartNumberingAfterBreak="0">
     <w:nsid w:val="62385AA6"/>
     <w:multiLevelType w:val="multilevel"/>
     <w:tmpl w:val="B9EAECD4"/>
@@ -12319,7 +13022,7 @@
       </w:rPr>
     </w:lvl>
   </w:abstractNum>
-  <w:abstractNum w:abstractNumId="88" w15:restartNumberingAfterBreak="0">
+  <w:abstractNum w:abstractNumId="89" w15:restartNumberingAfterBreak="0">
     <w:nsid w:val="625D686D"/>
     <w:multiLevelType w:val="multilevel"/>
     <w:tmpl w:val="BC1C2048"/>
@@ -12468,7 +13171,7 @@
       </w:rPr>
     </w:lvl>
   </w:abstractNum>
-  <w:abstractNum w:abstractNumId="89" w15:restartNumberingAfterBreak="0">
+  <w:abstractNum w:abstractNumId="90" w15:restartNumberingAfterBreak="0">
     <w:nsid w:val="62B46951"/>
     <w:multiLevelType w:val="hybridMultilevel"/>
     <w:tmpl w:val="0FEAFEC6"/>
@@ -12581,7 +13284,7 @@
       </w:rPr>
     </w:lvl>
   </w:abstractNum>
-  <w:abstractNum w:abstractNumId="90" w15:restartNumberingAfterBreak="0">
+  <w:abstractNum w:abstractNumId="91" w15:restartNumberingAfterBreak="0">
     <w:nsid w:val="647819E3"/>
     <w:multiLevelType w:val="multilevel"/>
     <w:tmpl w:val="ABB278BC"/>
@@ -12730,7 +13433,7 @@
       </w:rPr>
     </w:lvl>
   </w:abstractNum>
-  <w:abstractNum w:abstractNumId="91" w15:restartNumberingAfterBreak="0">
+  <w:abstractNum w:abstractNumId="92" w15:restartNumberingAfterBreak="0">
     <w:nsid w:val="64F30198"/>
     <w:multiLevelType w:val="multilevel"/>
     <w:tmpl w:val="63F4E6F0"/>
@@ -12879,7 +13582,7 @@
       </w:rPr>
     </w:lvl>
   </w:abstractNum>
-  <w:abstractNum w:abstractNumId="92" w15:restartNumberingAfterBreak="0">
+  <w:abstractNum w:abstractNumId="93" w15:restartNumberingAfterBreak="0">
     <w:nsid w:val="65314293"/>
     <w:multiLevelType w:val="hybridMultilevel"/>
     <w:tmpl w:val="6688DFAC"/>
@@ -12992,7 +13695,7 @@
       </w:rPr>
     </w:lvl>
   </w:abstractNum>
-  <w:abstractNum w:abstractNumId="93" w15:restartNumberingAfterBreak="0">
+  <w:abstractNum w:abstractNumId="94" w15:restartNumberingAfterBreak="0">
     <w:nsid w:val="65CE4D0F"/>
     <w:multiLevelType w:val="hybridMultilevel"/>
     <w:tmpl w:val="DB668538"/>
@@ -13105,7 +13808,7 @@
       </w:rPr>
     </w:lvl>
   </w:abstractNum>
-  <w:abstractNum w:abstractNumId="94" w15:restartNumberingAfterBreak="0">
+  <w:abstractNum w:abstractNumId="95" w15:restartNumberingAfterBreak="0">
     <w:nsid w:val="661C7D73"/>
     <w:multiLevelType w:val="multilevel"/>
     <w:tmpl w:val="D9681266"/>
@@ -13254,7 +13957,7 @@
       </w:rPr>
     </w:lvl>
   </w:abstractNum>
-  <w:abstractNum w:abstractNumId="95" w15:restartNumberingAfterBreak="0">
+  <w:abstractNum w:abstractNumId="96" w15:restartNumberingAfterBreak="0">
     <w:nsid w:val="66E36FE0"/>
     <w:multiLevelType w:val="multilevel"/>
     <w:tmpl w:val="2AA67CDA"/>
@@ -13403,7 +14106,7 @@
       </w:rPr>
     </w:lvl>
   </w:abstractNum>
-  <w:abstractNum w:abstractNumId="96" w15:restartNumberingAfterBreak="0">
+  <w:abstractNum w:abstractNumId="97" w15:restartNumberingAfterBreak="0">
     <w:nsid w:val="671F5935"/>
     <w:multiLevelType w:val="multilevel"/>
     <w:tmpl w:val="1E86702A"/>
@@ -13552,7 +14255,7 @@
       </w:rPr>
     </w:lvl>
   </w:abstractNum>
-  <w:abstractNum w:abstractNumId="97" w15:restartNumberingAfterBreak="0">
+  <w:abstractNum w:abstractNumId="98" w15:restartNumberingAfterBreak="0">
     <w:nsid w:val="68B94344"/>
     <w:multiLevelType w:val="multilevel"/>
     <w:tmpl w:val="9BA812D8"/>
@@ -13701,7 +14404,7 @@
       </w:rPr>
     </w:lvl>
   </w:abstractNum>
-  <w:abstractNum w:abstractNumId="98" w15:restartNumberingAfterBreak="0">
+  <w:abstractNum w:abstractNumId="99" w15:restartNumberingAfterBreak="0">
     <w:nsid w:val="69DE2C87"/>
     <w:multiLevelType w:val="hybridMultilevel"/>
     <w:tmpl w:val="F530F20A"/>
@@ -13814,7 +14517,7 @@
       </w:rPr>
     </w:lvl>
   </w:abstractNum>
-  <w:abstractNum w:abstractNumId="99" w15:restartNumberingAfterBreak="0">
+  <w:abstractNum w:abstractNumId="100" w15:restartNumberingAfterBreak="0">
     <w:nsid w:val="69ED672D"/>
     <w:multiLevelType w:val="multilevel"/>
     <w:tmpl w:val="CC08E300"/>
@@ -13963,7 +14666,7 @@
       </w:rPr>
     </w:lvl>
   </w:abstractNum>
-  <w:abstractNum w:abstractNumId="100" w15:restartNumberingAfterBreak="0">
+  <w:abstractNum w:abstractNumId="101" w15:restartNumberingAfterBreak="0">
     <w:nsid w:val="6A063EFD"/>
     <w:multiLevelType w:val="hybridMultilevel"/>
     <w:tmpl w:val="48703FBA"/>
@@ -14076,7 +14779,7 @@
       </w:rPr>
     </w:lvl>
   </w:abstractNum>
-  <w:abstractNum w:abstractNumId="101" w15:restartNumberingAfterBreak="0">
+  <w:abstractNum w:abstractNumId="102" w15:restartNumberingAfterBreak="0">
     <w:nsid w:val="6A825ABE"/>
     <w:multiLevelType w:val="multilevel"/>
     <w:tmpl w:val="0CD6F30E"/>
@@ -14225,7 +14928,7 @@
       </w:rPr>
     </w:lvl>
   </w:abstractNum>
-  <w:abstractNum w:abstractNumId="102" w15:restartNumberingAfterBreak="0">
+  <w:abstractNum w:abstractNumId="103" w15:restartNumberingAfterBreak="0">
     <w:nsid w:val="6B1D7832"/>
     <w:multiLevelType w:val="multilevel"/>
     <w:tmpl w:val="DD4646B2"/>
@@ -14374,7 +15077,156 @@
       </w:rPr>
     </w:lvl>
   </w:abstractNum>
-  <w:abstractNum w:abstractNumId="103" w15:restartNumberingAfterBreak="0">
+  <w:abstractNum w:abstractNumId="104" w15:restartNumberingAfterBreak="0">
+    <w:nsid w:val="6BC8366D"/>
+    <w:multiLevelType w:val="multilevel"/>
+    <w:tmpl w:val="7C10CE5C"/>
+    <w:lvl w:ilvl="0">
+      <w:start w:val="1"/>
+      <w:numFmt w:val="bullet"/>
+      <w:lvlText w:val=""/>
+      <w:lvlJc w:val="left"/>
+      <w:pPr>
+        <w:tabs>
+          <w:tab w:val="num" w:pos="720"/>
+        </w:tabs>
+        <w:ind w:left="720" w:hanging="360"/>
+      </w:pPr>
+      <w:rPr>
+        <w:rFonts w:ascii="Symbol" w:hAnsi="Symbol" w:hint="default"/>
+        <w:sz w:val="20"/>
+      </w:rPr>
+    </w:lvl>
+    <w:lvl w:ilvl="1" w:tentative="1">
+      <w:start w:val="1"/>
+      <w:numFmt w:val="bullet"/>
+      <w:lvlText w:val="o"/>
+      <w:lvlJc w:val="left"/>
+      <w:pPr>
+        <w:tabs>
+          <w:tab w:val="num" w:pos="1440"/>
+        </w:tabs>
+        <w:ind w:left="1440" w:hanging="360"/>
+      </w:pPr>
+      <w:rPr>
+        <w:rFonts w:ascii="Courier New" w:hAnsi="Courier New" w:hint="default"/>
+        <w:sz w:val="20"/>
+      </w:rPr>
+    </w:lvl>
+    <w:lvl w:ilvl="2" w:tentative="1">
+      <w:start w:val="1"/>
+      <w:numFmt w:val="bullet"/>
+      <w:lvlText w:val=""/>
+      <w:lvlJc w:val="left"/>
+      <w:pPr>
+        <w:tabs>
+          <w:tab w:val="num" w:pos="2160"/>
+        </w:tabs>
+        <w:ind w:left="2160" w:hanging="360"/>
+      </w:pPr>
+      <w:rPr>
+        <w:rFonts w:ascii="Wingdings" w:hAnsi="Wingdings" w:hint="default"/>
+        <w:sz w:val="20"/>
+      </w:rPr>
+    </w:lvl>
+    <w:lvl w:ilvl="3" w:tentative="1">
+      <w:start w:val="1"/>
+      <w:numFmt w:val="bullet"/>
+      <w:lvlText w:val=""/>
+      <w:lvlJc w:val="left"/>
+      <w:pPr>
+        <w:tabs>
+          <w:tab w:val="num" w:pos="2880"/>
+        </w:tabs>
+        <w:ind w:left="2880" w:hanging="360"/>
+      </w:pPr>
+      <w:rPr>
+        <w:rFonts w:ascii="Wingdings" w:hAnsi="Wingdings" w:hint="default"/>
+        <w:sz w:val="20"/>
+      </w:rPr>
+    </w:lvl>
+    <w:lvl w:ilvl="4" w:tentative="1">
+      <w:start w:val="1"/>
+      <w:numFmt w:val="bullet"/>
+      <w:lvlText w:val=""/>
+      <w:lvlJc w:val="left"/>
+      <w:pPr>
+        <w:tabs>
+          <w:tab w:val="num" w:pos="3600"/>
+        </w:tabs>
+        <w:ind w:left="3600" w:hanging="360"/>
+      </w:pPr>
+      <w:rPr>
+        <w:rFonts w:ascii="Wingdings" w:hAnsi="Wingdings" w:hint="default"/>
+        <w:sz w:val="20"/>
+      </w:rPr>
+    </w:lvl>
+    <w:lvl w:ilvl="5" w:tentative="1">
+      <w:start w:val="1"/>
+      <w:numFmt w:val="bullet"/>
+      <w:lvlText w:val=""/>
+      <w:lvlJc w:val="left"/>
+      <w:pPr>
+        <w:tabs>
+          <w:tab w:val="num" w:pos="4320"/>
+        </w:tabs>
+        <w:ind w:left="4320" w:hanging="360"/>
+      </w:pPr>
+      <w:rPr>
+        <w:rFonts w:ascii="Wingdings" w:hAnsi="Wingdings" w:hint="default"/>
+        <w:sz w:val="20"/>
+      </w:rPr>
+    </w:lvl>
+    <w:lvl w:ilvl="6" w:tentative="1">
+      <w:start w:val="1"/>
+      <w:numFmt w:val="bullet"/>
+      <w:lvlText w:val=""/>
+      <w:lvlJc w:val="left"/>
+      <w:pPr>
+        <w:tabs>
+          <w:tab w:val="num" w:pos="5040"/>
+        </w:tabs>
+        <w:ind w:left="5040" w:hanging="360"/>
+      </w:pPr>
+      <w:rPr>
+        <w:rFonts w:ascii="Wingdings" w:hAnsi="Wingdings" w:hint="default"/>
+        <w:sz w:val="20"/>
+      </w:rPr>
+    </w:lvl>
+    <w:lvl w:ilvl="7" w:tentative="1">
+      <w:start w:val="1"/>
+      <w:numFmt w:val="bullet"/>
+      <w:lvlText w:val=""/>
+      <w:lvlJc w:val="left"/>
+      <w:pPr>
+        <w:tabs>
+          <w:tab w:val="num" w:pos="5760"/>
+        </w:tabs>
+        <w:ind w:left="5760" w:hanging="360"/>
+      </w:pPr>
+      <w:rPr>
+        <w:rFonts w:ascii="Wingdings" w:hAnsi="Wingdings" w:hint="default"/>
+        <w:sz w:val="20"/>
+      </w:rPr>
+    </w:lvl>
+    <w:lvl w:ilvl="8" w:tentative="1">
+      <w:start w:val="1"/>
+      <w:numFmt w:val="bullet"/>
+      <w:lvlText w:val=""/>
+      <w:lvlJc w:val="left"/>
+      <w:pPr>
+        <w:tabs>
+          <w:tab w:val="num" w:pos="6480"/>
+        </w:tabs>
+        <w:ind w:left="6480" w:hanging="360"/>
+      </w:pPr>
+      <w:rPr>
+        <w:rFonts w:ascii="Wingdings" w:hAnsi="Wingdings" w:hint="default"/>
+        <w:sz w:val="20"/>
+      </w:rPr>
+    </w:lvl>
+  </w:abstractNum>
+  <w:abstractNum w:abstractNumId="105" w15:restartNumberingAfterBreak="0">
     <w:nsid w:val="6C6D6667"/>
     <w:multiLevelType w:val="hybridMultilevel"/>
     <w:tmpl w:val="A744709C"/>
@@ -14487,7 +15339,7 @@
       </w:rPr>
     </w:lvl>
   </w:abstractNum>
-  <w:abstractNum w:abstractNumId="104" w15:restartNumberingAfterBreak="0">
+  <w:abstractNum w:abstractNumId="106" w15:restartNumberingAfterBreak="0">
     <w:nsid w:val="6CAD7EA5"/>
     <w:multiLevelType w:val="multilevel"/>
     <w:tmpl w:val="C472C5B0"/>
@@ -14636,7 +15488,233 @@
       </w:rPr>
     </w:lvl>
   </w:abstractNum>
-  <w:abstractNum w:abstractNumId="105" w15:restartNumberingAfterBreak="0">
+  <w:abstractNum w:abstractNumId="107" w15:restartNumberingAfterBreak="0">
+    <w:nsid w:val="6D7A28DE"/>
+    <w:multiLevelType w:val="hybridMultilevel"/>
+    <w:tmpl w:val="1B5875AA"/>
+    <w:lvl w:ilvl="0" w:tplc="04090005">
+      <w:start w:val="1"/>
+      <w:numFmt w:val="bullet"/>
+      <w:lvlText w:val=""/>
+      <w:lvlJc w:val="left"/>
+      <w:pPr>
+        <w:ind w:left="1080" w:hanging="360"/>
+      </w:pPr>
+      <w:rPr>
+        <w:rFonts w:ascii="Wingdings" w:hAnsi="Wingdings" w:hint="default"/>
+      </w:rPr>
+    </w:lvl>
+    <w:lvl w:ilvl="1" w:tplc="04090003" w:tentative="1">
+      <w:start w:val="1"/>
+      <w:numFmt w:val="bullet"/>
+      <w:lvlText w:val="o"/>
+      <w:lvlJc w:val="left"/>
+      <w:pPr>
+        <w:ind w:left="1800" w:hanging="360"/>
+      </w:pPr>
+      <w:rPr>
+        <w:rFonts w:ascii="Courier New" w:hAnsi="Courier New" w:cs="Courier New" w:hint="default"/>
+      </w:rPr>
+    </w:lvl>
+    <w:lvl w:ilvl="2" w:tplc="04090005" w:tentative="1">
+      <w:start w:val="1"/>
+      <w:numFmt w:val="bullet"/>
+      <w:lvlText w:val=""/>
+      <w:lvlJc w:val="left"/>
+      <w:pPr>
+        <w:ind w:left="2520" w:hanging="360"/>
+      </w:pPr>
+      <w:rPr>
+        <w:rFonts w:ascii="Wingdings" w:hAnsi="Wingdings" w:hint="default"/>
+      </w:rPr>
+    </w:lvl>
+    <w:lvl w:ilvl="3" w:tplc="04090001" w:tentative="1">
+      <w:start w:val="1"/>
+      <w:numFmt w:val="bullet"/>
+      <w:lvlText w:val=""/>
+      <w:lvlJc w:val="left"/>
+      <w:pPr>
+        <w:ind w:left="3240" w:hanging="360"/>
+      </w:pPr>
+      <w:rPr>
+        <w:rFonts w:ascii="Symbol" w:hAnsi="Symbol" w:hint="default"/>
+      </w:rPr>
+    </w:lvl>
+    <w:lvl w:ilvl="4" w:tplc="04090003" w:tentative="1">
+      <w:start w:val="1"/>
+      <w:numFmt w:val="bullet"/>
+      <w:lvlText w:val="o"/>
+      <w:lvlJc w:val="left"/>
+      <w:pPr>
+        <w:ind w:left="3960" w:hanging="360"/>
+      </w:pPr>
+      <w:rPr>
+        <w:rFonts w:ascii="Courier New" w:hAnsi="Courier New" w:cs="Courier New" w:hint="default"/>
+      </w:rPr>
+    </w:lvl>
+    <w:lvl w:ilvl="5" w:tplc="04090005" w:tentative="1">
+      <w:start w:val="1"/>
+      <w:numFmt w:val="bullet"/>
+      <w:lvlText w:val=""/>
+      <w:lvlJc w:val="left"/>
+      <w:pPr>
+        <w:ind w:left="4680" w:hanging="360"/>
+      </w:pPr>
+      <w:rPr>
+        <w:rFonts w:ascii="Wingdings" w:hAnsi="Wingdings" w:hint="default"/>
+      </w:rPr>
+    </w:lvl>
+    <w:lvl w:ilvl="6" w:tplc="04090001" w:tentative="1">
+      <w:start w:val="1"/>
+      <w:numFmt w:val="bullet"/>
+      <w:lvlText w:val=""/>
+      <w:lvlJc w:val="left"/>
+      <w:pPr>
+        <w:ind w:left="5400" w:hanging="360"/>
+      </w:pPr>
+      <w:rPr>
+        <w:rFonts w:ascii="Symbol" w:hAnsi="Symbol" w:hint="default"/>
+      </w:rPr>
+    </w:lvl>
+    <w:lvl w:ilvl="7" w:tplc="04090003" w:tentative="1">
+      <w:start w:val="1"/>
+      <w:numFmt w:val="bullet"/>
+      <w:lvlText w:val="o"/>
+      <w:lvlJc w:val="left"/>
+      <w:pPr>
+        <w:ind w:left="6120" w:hanging="360"/>
+      </w:pPr>
+      <w:rPr>
+        <w:rFonts w:ascii="Courier New" w:hAnsi="Courier New" w:cs="Courier New" w:hint="default"/>
+      </w:rPr>
+    </w:lvl>
+    <w:lvl w:ilvl="8" w:tplc="04090005" w:tentative="1">
+      <w:start w:val="1"/>
+      <w:numFmt w:val="bullet"/>
+      <w:lvlText w:val=""/>
+      <w:lvlJc w:val="left"/>
+      <w:pPr>
+        <w:ind w:left="6840" w:hanging="360"/>
+      </w:pPr>
+      <w:rPr>
+        <w:rFonts w:ascii="Wingdings" w:hAnsi="Wingdings" w:hint="default"/>
+      </w:rPr>
+    </w:lvl>
+  </w:abstractNum>
+  <w:abstractNum w:abstractNumId="108" w15:restartNumberingAfterBreak="0">
+    <w:nsid w:val="6E2C576F"/>
+    <w:multiLevelType w:val="hybridMultilevel"/>
+    <w:tmpl w:val="251C1C42"/>
+    <w:lvl w:ilvl="0" w:tplc="04090005">
+      <w:start w:val="1"/>
+      <w:numFmt w:val="bullet"/>
+      <w:lvlText w:val=""/>
+      <w:lvlJc w:val="left"/>
+      <w:pPr>
+        <w:ind w:left="1080" w:hanging="360"/>
+      </w:pPr>
+      <w:rPr>
+        <w:rFonts w:ascii="Wingdings" w:hAnsi="Wingdings" w:hint="default"/>
+      </w:rPr>
+    </w:lvl>
+    <w:lvl w:ilvl="1" w:tplc="04090003" w:tentative="1">
+      <w:start w:val="1"/>
+      <w:numFmt w:val="bullet"/>
+      <w:lvlText w:val="o"/>
+      <w:lvlJc w:val="left"/>
+      <w:pPr>
+        <w:ind w:left="1800" w:hanging="360"/>
+      </w:pPr>
+      <w:rPr>
+        <w:rFonts w:ascii="Courier New" w:hAnsi="Courier New" w:cs="Courier New" w:hint="default"/>
+      </w:rPr>
+    </w:lvl>
+    <w:lvl w:ilvl="2" w:tplc="04090005" w:tentative="1">
+      <w:start w:val="1"/>
+      <w:numFmt w:val="bullet"/>
+      <w:lvlText w:val=""/>
+      <w:lvlJc w:val="left"/>
+      <w:pPr>
+        <w:ind w:left="2520" w:hanging="360"/>
+      </w:pPr>
+      <w:rPr>
+        <w:rFonts w:ascii="Wingdings" w:hAnsi="Wingdings" w:hint="default"/>
+      </w:rPr>
+    </w:lvl>
+    <w:lvl w:ilvl="3" w:tplc="04090001" w:tentative="1">
+      <w:start w:val="1"/>
+      <w:numFmt w:val="bullet"/>
+      <w:lvlText w:val=""/>
+      <w:lvlJc w:val="left"/>
+      <w:pPr>
+        <w:ind w:left="3240" w:hanging="360"/>
+      </w:pPr>
+      <w:rPr>
+        <w:rFonts w:ascii="Symbol" w:hAnsi="Symbol" w:hint="default"/>
+      </w:rPr>
+    </w:lvl>
+    <w:lvl w:ilvl="4" w:tplc="04090003" w:tentative="1">
+      <w:start w:val="1"/>
+      <w:numFmt w:val="bullet"/>
+      <w:lvlText w:val="o"/>
+      <w:lvlJc w:val="left"/>
+      <w:pPr>
+        <w:ind w:left="3960" w:hanging="360"/>
+      </w:pPr>
+      <w:rPr>
+        <w:rFonts w:ascii="Courier New" w:hAnsi="Courier New" w:cs="Courier New" w:hint="default"/>
+      </w:rPr>
+    </w:lvl>
+    <w:lvl w:ilvl="5" w:tplc="04090005" w:tentative="1">
+      <w:start w:val="1"/>
+      <w:numFmt w:val="bullet"/>
+      <w:lvlText w:val=""/>
+      <w:lvlJc w:val="left"/>
+      <w:pPr>
+        <w:ind w:left="4680" w:hanging="360"/>
+      </w:pPr>
+      <w:rPr>
+        <w:rFonts w:ascii="Wingdings" w:hAnsi="Wingdings" w:hint="default"/>
+      </w:rPr>
+    </w:lvl>
+    <w:lvl w:ilvl="6" w:tplc="04090001" w:tentative="1">
+      <w:start w:val="1"/>
+      <w:numFmt w:val="bullet"/>
+      <w:lvlText w:val=""/>
+      <w:lvlJc w:val="left"/>
+      <w:pPr>
+        <w:ind w:left="5400" w:hanging="360"/>
+      </w:pPr>
+      <w:rPr>
+        <w:rFonts w:ascii="Symbol" w:hAnsi="Symbol" w:hint="default"/>
+      </w:rPr>
+    </w:lvl>
+    <w:lvl w:ilvl="7" w:tplc="04090003" w:tentative="1">
+      <w:start w:val="1"/>
+      <w:numFmt w:val="bullet"/>
+      <w:lvlText w:val="o"/>
+      <w:lvlJc w:val="left"/>
+      <w:pPr>
+        <w:ind w:left="6120" w:hanging="360"/>
+      </w:pPr>
+      <w:rPr>
+        <w:rFonts w:ascii="Courier New" w:hAnsi="Courier New" w:cs="Courier New" w:hint="default"/>
+      </w:rPr>
+    </w:lvl>
+    <w:lvl w:ilvl="8" w:tplc="04090005" w:tentative="1">
+      <w:start w:val="1"/>
+      <w:numFmt w:val="bullet"/>
+      <w:lvlText w:val=""/>
+      <w:lvlJc w:val="left"/>
+      <w:pPr>
+        <w:ind w:left="6840" w:hanging="360"/>
+      </w:pPr>
+      <w:rPr>
+        <w:rFonts w:ascii="Wingdings" w:hAnsi="Wingdings" w:hint="default"/>
+      </w:rPr>
+    </w:lvl>
+  </w:abstractNum>
+  <w:abstractNum w:abstractNumId="109" w15:restartNumberingAfterBreak="0">
     <w:nsid w:val="6E43557B"/>
     <w:multiLevelType w:val="multilevel"/>
     <w:tmpl w:val="323C7112"/>
@@ -14785,7 +15863,7 @@
       </w:rPr>
     </w:lvl>
   </w:abstractNum>
-  <w:abstractNum w:abstractNumId="106" w15:restartNumberingAfterBreak="0">
+  <w:abstractNum w:abstractNumId="110" w15:restartNumberingAfterBreak="0">
     <w:nsid w:val="6EA27D0A"/>
     <w:multiLevelType w:val="multilevel"/>
     <w:tmpl w:val="7BF0256C"/>
@@ -14934,7 +16012,7 @@
       </w:rPr>
     </w:lvl>
   </w:abstractNum>
-  <w:abstractNum w:abstractNumId="107" w15:restartNumberingAfterBreak="0">
+  <w:abstractNum w:abstractNumId="111" w15:restartNumberingAfterBreak="0">
     <w:nsid w:val="6EF86273"/>
     <w:multiLevelType w:val="multilevel"/>
     <w:tmpl w:val="2AA67CDA"/>
@@ -15083,7 +16161,7 @@
       </w:rPr>
     </w:lvl>
   </w:abstractNum>
-  <w:abstractNum w:abstractNumId="108" w15:restartNumberingAfterBreak="0">
+  <w:abstractNum w:abstractNumId="112" w15:restartNumberingAfterBreak="0">
     <w:nsid w:val="70874300"/>
     <w:multiLevelType w:val="hybridMultilevel"/>
     <w:tmpl w:val="1B3A0518"/>
@@ -15196,7 +16274,7 @@
       </w:rPr>
     </w:lvl>
   </w:abstractNum>
-  <w:abstractNum w:abstractNumId="109" w15:restartNumberingAfterBreak="0">
+  <w:abstractNum w:abstractNumId="113" w15:restartNumberingAfterBreak="0">
     <w:nsid w:val="7090251B"/>
     <w:multiLevelType w:val="hybridMultilevel"/>
     <w:tmpl w:val="67687EFE"/>
@@ -15309,7 +16387,7 @@
       </w:rPr>
     </w:lvl>
   </w:abstractNum>
-  <w:abstractNum w:abstractNumId="110" w15:restartNumberingAfterBreak="0">
+  <w:abstractNum w:abstractNumId="114" w15:restartNumberingAfterBreak="0">
     <w:nsid w:val="72031F81"/>
     <w:multiLevelType w:val="multilevel"/>
     <w:tmpl w:val="84400090"/>
@@ -15458,7 +16536,7 @@
       </w:rPr>
     </w:lvl>
   </w:abstractNum>
-  <w:abstractNum w:abstractNumId="111" w15:restartNumberingAfterBreak="0">
+  <w:abstractNum w:abstractNumId="115" w15:restartNumberingAfterBreak="0">
     <w:nsid w:val="722301E0"/>
     <w:multiLevelType w:val="multilevel"/>
     <w:tmpl w:val="1EE82E5A"/>
@@ -15607,7 +16685,7 @@
       </w:rPr>
     </w:lvl>
   </w:abstractNum>
-  <w:abstractNum w:abstractNumId="112" w15:restartNumberingAfterBreak="0">
+  <w:abstractNum w:abstractNumId="116" w15:restartNumberingAfterBreak="0">
     <w:nsid w:val="74B80775"/>
     <w:multiLevelType w:val="hybridMultilevel"/>
     <w:tmpl w:val="D3C275CE"/>
@@ -15696,7 +16774,7 @@
       </w:pPr>
     </w:lvl>
   </w:abstractNum>
-  <w:abstractNum w:abstractNumId="113" w15:restartNumberingAfterBreak="0">
+  <w:abstractNum w:abstractNumId="117" w15:restartNumberingAfterBreak="0">
     <w:nsid w:val="75144C65"/>
     <w:multiLevelType w:val="hybridMultilevel"/>
     <w:tmpl w:val="12127FAA"/>
@@ -15809,7 +16887,7 @@
       </w:rPr>
     </w:lvl>
   </w:abstractNum>
-  <w:abstractNum w:abstractNumId="114" w15:restartNumberingAfterBreak="0">
+  <w:abstractNum w:abstractNumId="118" w15:restartNumberingAfterBreak="0">
     <w:nsid w:val="75237F84"/>
     <w:multiLevelType w:val="hybridMultilevel"/>
     <w:tmpl w:val="5F0A6EF2"/>
@@ -15922,7 +17000,7 @@
       </w:rPr>
     </w:lvl>
   </w:abstractNum>
-  <w:abstractNum w:abstractNumId="115" w15:restartNumberingAfterBreak="0">
+  <w:abstractNum w:abstractNumId="119" w15:restartNumberingAfterBreak="0">
     <w:nsid w:val="75FF09B0"/>
     <w:multiLevelType w:val="multilevel"/>
     <w:tmpl w:val="C34A7734"/>
@@ -16071,7 +17149,7 @@
       </w:rPr>
     </w:lvl>
   </w:abstractNum>
-  <w:abstractNum w:abstractNumId="116" w15:restartNumberingAfterBreak="0">
+  <w:abstractNum w:abstractNumId="120" w15:restartNumberingAfterBreak="0">
     <w:nsid w:val="77960362"/>
     <w:multiLevelType w:val="multilevel"/>
     <w:tmpl w:val="FEA0022E"/>
@@ -16220,7 +17298,7 @@
       </w:rPr>
     </w:lvl>
   </w:abstractNum>
-  <w:abstractNum w:abstractNumId="117" w15:restartNumberingAfterBreak="0">
+  <w:abstractNum w:abstractNumId="121" w15:restartNumberingAfterBreak="0">
     <w:nsid w:val="785A644F"/>
     <w:multiLevelType w:val="multilevel"/>
     <w:tmpl w:val="D1DC60FE"/>
@@ -16369,7 +17447,7 @@
       </w:rPr>
     </w:lvl>
   </w:abstractNum>
-  <w:abstractNum w:abstractNumId="118" w15:restartNumberingAfterBreak="0">
+  <w:abstractNum w:abstractNumId="122" w15:restartNumberingAfterBreak="0">
     <w:nsid w:val="78B62297"/>
     <w:multiLevelType w:val="multilevel"/>
     <w:tmpl w:val="2AA67CDA"/>
@@ -16518,7 +17596,7 @@
       </w:rPr>
     </w:lvl>
   </w:abstractNum>
-  <w:abstractNum w:abstractNumId="119" w15:restartNumberingAfterBreak="0">
+  <w:abstractNum w:abstractNumId="123" w15:restartNumberingAfterBreak="0">
     <w:nsid w:val="7BFA03DF"/>
     <w:multiLevelType w:val="hybridMultilevel"/>
     <w:tmpl w:val="536A979E"/>
@@ -16631,7 +17709,7 @@
       </w:rPr>
     </w:lvl>
   </w:abstractNum>
-  <w:abstractNum w:abstractNumId="120" w15:restartNumberingAfterBreak="0">
+  <w:abstractNum w:abstractNumId="124" w15:restartNumberingAfterBreak="0">
     <w:nsid w:val="7CA524B4"/>
     <w:multiLevelType w:val="hybridMultilevel"/>
     <w:tmpl w:val="957C4F4A"/>
@@ -16744,7 +17822,7 @@
       </w:rPr>
     </w:lvl>
   </w:abstractNum>
-  <w:abstractNum w:abstractNumId="121" w15:restartNumberingAfterBreak="0">
+  <w:abstractNum w:abstractNumId="125" w15:restartNumberingAfterBreak="0">
     <w:nsid w:val="7E1C597E"/>
     <w:multiLevelType w:val="multilevel"/>
     <w:tmpl w:val="2AA67CDA"/>
@@ -16893,7 +17971,7 @@
       </w:rPr>
     </w:lvl>
   </w:abstractNum>
-  <w:abstractNum w:abstractNumId="122" w15:restartNumberingAfterBreak="0">
+  <w:abstractNum w:abstractNumId="126" w15:restartNumberingAfterBreak="0">
     <w:nsid w:val="7EBD7710"/>
     <w:multiLevelType w:val="hybridMultilevel"/>
     <w:tmpl w:val="C8C6F7A0"/>
@@ -17010,7 +18088,7 @@
     <w:abstractNumId w:val="47"/>
   </w:num>
   <w:num w:numId="2" w16cid:durableId="967664612">
-    <w:abstractNumId w:val="91"/>
+    <w:abstractNumId w:val="92"/>
   </w:num>
   <w:num w:numId="3" w16cid:durableId="361631616">
     <w:abstractNumId w:val="65"/>
@@ -17019,13 +18097,13 @@
     <w:abstractNumId w:val="79"/>
   </w:num>
   <w:num w:numId="5" w16cid:durableId="1647204897">
-    <w:abstractNumId w:val="120"/>
+    <w:abstractNumId w:val="124"/>
   </w:num>
   <w:num w:numId="6" w16cid:durableId="682589869">
     <w:abstractNumId w:val="20"/>
   </w:num>
   <w:num w:numId="7" w16cid:durableId="679703478">
-    <w:abstractNumId w:val="98"/>
+    <w:abstractNumId w:val="99"/>
   </w:num>
   <w:num w:numId="8" w16cid:durableId="496455128">
     <w:abstractNumId w:val="41"/>
@@ -17037,7 +18115,7 @@
     <w:abstractNumId w:val="63"/>
   </w:num>
   <w:num w:numId="11" w16cid:durableId="1412503779">
-    <w:abstractNumId w:val="100"/>
+    <w:abstractNumId w:val="101"/>
   </w:num>
   <w:num w:numId="12" w16cid:durableId="1107113995">
     <w:abstractNumId w:val="42"/>
@@ -17046,34 +18124,34 @@
     <w:abstractNumId w:val="21"/>
   </w:num>
   <w:num w:numId="14" w16cid:durableId="1529222885">
-    <w:abstractNumId w:val="119"/>
+    <w:abstractNumId w:val="123"/>
   </w:num>
   <w:num w:numId="15" w16cid:durableId="836580755">
     <w:abstractNumId w:val="14"/>
   </w:num>
   <w:num w:numId="16" w16cid:durableId="1344674502">
-    <w:abstractNumId w:val="82"/>
+    <w:abstractNumId w:val="83"/>
   </w:num>
   <w:num w:numId="17" w16cid:durableId="1320882603">
-    <w:abstractNumId w:val="108"/>
+    <w:abstractNumId w:val="112"/>
   </w:num>
   <w:num w:numId="18" w16cid:durableId="1139028372">
     <w:abstractNumId w:val="43"/>
   </w:num>
   <w:num w:numId="19" w16cid:durableId="1525635473">
-    <w:abstractNumId w:val="89"/>
+    <w:abstractNumId w:val="90"/>
   </w:num>
   <w:num w:numId="20" w16cid:durableId="609623515">
-    <w:abstractNumId w:val="122"/>
+    <w:abstractNumId w:val="126"/>
   </w:num>
   <w:num w:numId="21" w16cid:durableId="165170997">
-    <w:abstractNumId w:val="103"/>
+    <w:abstractNumId w:val="105"/>
   </w:num>
   <w:num w:numId="22" w16cid:durableId="1620525290">
     <w:abstractNumId w:val="28"/>
   </w:num>
   <w:num w:numId="23" w16cid:durableId="400753109">
-    <w:abstractNumId w:val="113"/>
+    <w:abstractNumId w:val="117"/>
   </w:num>
   <w:num w:numId="24" w16cid:durableId="193882219">
     <w:abstractNumId w:val="4"/>
@@ -17091,13 +18169,13 @@
     <w:abstractNumId w:val="15"/>
   </w:num>
   <w:num w:numId="29" w16cid:durableId="2124693280">
-    <w:abstractNumId w:val="93"/>
+    <w:abstractNumId w:val="94"/>
   </w:num>
   <w:num w:numId="30" w16cid:durableId="1367099744">
     <w:abstractNumId w:val="33"/>
   </w:num>
   <w:num w:numId="31" w16cid:durableId="2011105642">
-    <w:abstractNumId w:val="83"/>
+    <w:abstractNumId w:val="84"/>
   </w:num>
   <w:num w:numId="32" w16cid:durableId="831995364">
     <w:abstractNumId w:val="25"/>
@@ -17115,7 +18193,7 @@
     <w:abstractNumId w:val="2"/>
   </w:num>
   <w:num w:numId="37" w16cid:durableId="1849755457">
-    <w:abstractNumId w:val="114"/>
+    <w:abstractNumId w:val="118"/>
   </w:num>
   <w:num w:numId="38" w16cid:durableId="516505904">
     <w:abstractNumId w:val="12"/>
@@ -17145,34 +18223,34 @@
     <w:abstractNumId w:val="27"/>
   </w:num>
   <w:num w:numId="47" w16cid:durableId="68767822">
-    <w:abstractNumId w:val="101"/>
+    <w:abstractNumId w:val="102"/>
   </w:num>
   <w:num w:numId="48" w16cid:durableId="1992058265">
     <w:abstractNumId w:val="5"/>
   </w:num>
   <w:num w:numId="49" w16cid:durableId="788475134">
-    <w:abstractNumId w:val="117"/>
+    <w:abstractNumId w:val="121"/>
   </w:num>
   <w:num w:numId="50" w16cid:durableId="224419455">
-    <w:abstractNumId w:val="106"/>
+    <w:abstractNumId w:val="110"/>
   </w:num>
   <w:num w:numId="51" w16cid:durableId="1699575947">
-    <w:abstractNumId w:val="88"/>
+    <w:abstractNumId w:val="89"/>
   </w:num>
   <w:num w:numId="52" w16cid:durableId="1048916239">
     <w:abstractNumId w:val="53"/>
   </w:num>
   <w:num w:numId="53" w16cid:durableId="1188711211">
-    <w:abstractNumId w:val="115"/>
+    <w:abstractNumId w:val="119"/>
   </w:num>
   <w:num w:numId="54" w16cid:durableId="447555614">
-    <w:abstractNumId w:val="90"/>
+    <w:abstractNumId w:val="91"/>
   </w:num>
   <w:num w:numId="55" w16cid:durableId="1679307268">
     <w:abstractNumId w:val="50"/>
   </w:num>
   <w:num w:numId="56" w16cid:durableId="693773591">
-    <w:abstractNumId w:val="105"/>
+    <w:abstractNumId w:val="109"/>
   </w:num>
   <w:num w:numId="57" w16cid:durableId="1110473324">
     <w:abstractNumId w:val="35"/>
@@ -17184,7 +18262,7 @@
     <w:abstractNumId w:val="40"/>
   </w:num>
   <w:num w:numId="60" w16cid:durableId="2095394549">
-    <w:abstractNumId w:val="116"/>
+    <w:abstractNumId w:val="120"/>
   </w:num>
   <w:num w:numId="61" w16cid:durableId="1299921011">
     <w:abstractNumId w:val="39"/>
@@ -17202,7 +18280,7 @@
     <w:abstractNumId w:val="71"/>
   </w:num>
   <w:num w:numId="66" w16cid:durableId="484011382">
-    <w:abstractNumId w:val="99"/>
+    <w:abstractNumId w:val="100"/>
   </w:num>
   <w:num w:numId="67" w16cid:durableId="2008289242">
     <w:abstractNumId w:val="10"/>
@@ -17214,10 +18292,10 @@
     <w:abstractNumId w:val="77"/>
   </w:num>
   <w:num w:numId="70" w16cid:durableId="336662050">
-    <w:abstractNumId w:val="87"/>
+    <w:abstractNumId w:val="88"/>
   </w:num>
   <w:num w:numId="71" w16cid:durableId="1460032333">
-    <w:abstractNumId w:val="104"/>
+    <w:abstractNumId w:val="106"/>
   </w:num>
   <w:num w:numId="72" w16cid:durableId="592400615">
     <w:abstractNumId w:val="7"/>
@@ -17238,10 +18316,10 @@
     <w:abstractNumId w:val="80"/>
   </w:num>
   <w:num w:numId="78" w16cid:durableId="2138137265">
-    <w:abstractNumId w:val="92"/>
+    <w:abstractNumId w:val="93"/>
   </w:num>
   <w:num w:numId="79" w16cid:durableId="343675924">
-    <w:abstractNumId w:val="109"/>
+    <w:abstractNumId w:val="113"/>
   </w:num>
   <w:num w:numId="80" w16cid:durableId="1823277442">
     <w:abstractNumId w:val="38"/>
@@ -17253,13 +18331,13 @@
     <w:abstractNumId w:val="75"/>
   </w:num>
   <w:num w:numId="83" w16cid:durableId="1253051103">
-    <w:abstractNumId w:val="102"/>
+    <w:abstractNumId w:val="103"/>
   </w:num>
   <w:num w:numId="84" w16cid:durableId="444888444">
     <w:abstractNumId w:val="46"/>
   </w:num>
   <w:num w:numId="85" w16cid:durableId="64299649">
-    <w:abstractNumId w:val="94"/>
+    <w:abstractNumId w:val="95"/>
   </w:num>
   <w:num w:numId="86" w16cid:durableId="868182992">
     <w:abstractNumId w:val="59"/>
@@ -17268,7 +18346,7 @@
     <w:abstractNumId w:val="22"/>
   </w:num>
   <w:num w:numId="88" w16cid:durableId="505442826">
-    <w:abstractNumId w:val="97"/>
+    <w:abstractNumId w:val="98"/>
   </w:num>
   <w:num w:numId="89" w16cid:durableId="1858763908">
     <w:abstractNumId w:val="34"/>
@@ -17277,7 +18355,7 @@
     <w:abstractNumId w:val="11"/>
   </w:num>
   <w:num w:numId="91" w16cid:durableId="1284576603">
-    <w:abstractNumId w:val="84"/>
+    <w:abstractNumId w:val="85"/>
   </w:num>
   <w:num w:numId="92" w16cid:durableId="1963075542">
     <w:abstractNumId w:val="6"/>
@@ -17289,13 +18367,13 @@
     <w:abstractNumId w:val="8"/>
   </w:num>
   <w:num w:numId="95" w16cid:durableId="1169102579">
-    <w:abstractNumId w:val="86"/>
+    <w:abstractNumId w:val="87"/>
   </w:num>
   <w:num w:numId="96" w16cid:durableId="1216501564">
     <w:abstractNumId w:val="31"/>
   </w:num>
   <w:num w:numId="97" w16cid:durableId="261768216">
-    <w:abstractNumId w:val="107"/>
+    <w:abstractNumId w:val="111"/>
   </w:num>
   <w:num w:numId="98" w16cid:durableId="2141918721">
     <w:abstractNumId w:val="69"/>
@@ -17304,7 +18382,7 @@
     <w:abstractNumId w:val="37"/>
   </w:num>
   <w:num w:numId="100" w16cid:durableId="1753887223">
-    <w:abstractNumId w:val="85"/>
+    <w:abstractNumId w:val="86"/>
   </w:num>
   <w:num w:numId="101" w16cid:durableId="1320184766">
     <w:abstractNumId w:val="26"/>
@@ -17322,10 +18400,10 @@
     <w:abstractNumId w:val="56"/>
   </w:num>
   <w:num w:numId="106" w16cid:durableId="1617908629">
-    <w:abstractNumId w:val="111"/>
+    <w:abstractNumId w:val="115"/>
   </w:num>
   <w:num w:numId="107" w16cid:durableId="970137111">
-    <w:abstractNumId w:val="121"/>
+    <w:abstractNumId w:val="125"/>
   </w:num>
   <w:num w:numId="108" w16cid:durableId="383797013">
     <w:abstractNumId w:val="44"/>
@@ -17346,25 +18424,25 @@
     <w:abstractNumId w:val="62"/>
   </w:num>
   <w:num w:numId="114" w16cid:durableId="1965042317">
-    <w:abstractNumId w:val="110"/>
+    <w:abstractNumId w:val="114"/>
   </w:num>
   <w:num w:numId="115" w16cid:durableId="670569040">
     <w:abstractNumId w:val="51"/>
   </w:num>
   <w:num w:numId="116" w16cid:durableId="413823113">
-    <w:abstractNumId w:val="118"/>
+    <w:abstractNumId w:val="122"/>
   </w:num>
   <w:num w:numId="117" w16cid:durableId="1293747982">
-    <w:abstractNumId w:val="95"/>
+    <w:abstractNumId w:val="96"/>
   </w:num>
   <w:num w:numId="118" w16cid:durableId="1016734110">
     <w:abstractNumId w:val="70"/>
   </w:num>
   <w:num w:numId="119" w16cid:durableId="583337306">
-    <w:abstractNumId w:val="112"/>
+    <w:abstractNumId w:val="116"/>
   </w:num>
   <w:num w:numId="120" w16cid:durableId="721096429">
-    <w:abstractNumId w:val="96"/>
+    <w:abstractNumId w:val="97"/>
   </w:num>
   <w:num w:numId="121" w16cid:durableId="299461688">
     <w:abstractNumId w:val="76"/>
@@ -17374,6 +18452,18 @@
   </w:num>
   <w:num w:numId="123" w16cid:durableId="964241540">
     <w:abstractNumId w:val="23"/>
+  </w:num>
+  <w:num w:numId="124" w16cid:durableId="603391478">
+    <w:abstractNumId w:val="82"/>
+  </w:num>
+  <w:num w:numId="125" w16cid:durableId="560529547">
+    <w:abstractNumId w:val="104"/>
+  </w:num>
+  <w:num w:numId="126" w16cid:durableId="1488327713">
+    <w:abstractNumId w:val="107"/>
+  </w:num>
+  <w:num w:numId="127" w16cid:durableId="1327660713">
+    <w:abstractNumId w:val="108"/>
   </w:num>
   <w:numIdMacAtCleanup w:val="45"/>
 </w:numbering>

</xml_diff>

<commit_message>
Vehicle Availability State Modeling (#291) Vehicle Status Analysis (#292) Vehicle State Machine Diagram (#293)
</commit_message>
<xml_diff>
--- a/Sequence Specification Document.docx
+++ b/Sequence Specification Document.docx
@@ -1162,6 +1162,743 @@
         <w:br w:type="page"/>
       </w:r>
     </w:p>
+    <w:p>
+      <w:pPr>
+        <w:pStyle w:val="Heading2"/>
+        <w:numPr>
+          <w:ilvl w:val="0"/>
+          <w:numId w:val="119"/>
+        </w:numPr>
+      </w:pPr>
+      <w:r>
+        <w:lastRenderedPageBreak/>
+        <w:t>Vehicle Availability Lifecycle Analysis</w:t>
+      </w:r>
+    </w:p>
+    <w:p>
+      <w:pPr>
+        <w:spacing w:line="278" w:lineRule="auto"/>
+      </w:pPr>
+      <w:r>
+        <w:t>The Vehicle is a main resource, which is being managed using the KriGo platform. Availability of the resource will define if the resource can be rented by the customers. Throughout the whole life cycle, the vehicle will change its states depending on the reservations, rentals, maintenance, etc.</w:t>
+      </w:r>
+    </w:p>
+    <w:p>
+      <w:pPr>
+        <w:spacing w:line="278" w:lineRule="auto"/>
+      </w:pPr>
+      <w:r>
+        <w:t xml:space="preserve">Firstly, the lifecycle of the vehicle starts after registration of the vehicle at the rental agency. After the vehicle is verified, and allowed to be used for rental, it goes into the </w:t>
+      </w:r>
+      <w:r>
+        <w:rPr>
+          <w:b/>
+          <w:bCs/>
+        </w:rPr>
+        <w:t>Available</w:t>
+      </w:r>
+      <w:r>
+        <w:t xml:space="preserve"> state, which means that it will appear in the results of search and will be able to be reserved by the customers.</w:t>
+      </w:r>
+    </w:p>
+    <w:p>
+      <w:pPr>
+        <w:spacing w:line="278" w:lineRule="auto"/>
+      </w:pPr>
+      <w:r>
+        <w:t xml:space="preserve">After the confirmation of the reservation made by the customer, the vehicle will go into the </w:t>
+      </w:r>
+      <w:r>
+        <w:rPr>
+          <w:b/>
+          <w:bCs/>
+        </w:rPr>
+        <w:t>Reserved</w:t>
+      </w:r>
+      <w:r>
+        <w:t xml:space="preserve"> state. In this state, the vehicle will not be available for renting by other customers since it has already been booked for the future rent.</w:t>
+      </w:r>
+    </w:p>
+    <w:p>
+      <w:pPr>
+        <w:spacing w:line="278" w:lineRule="auto"/>
+      </w:pPr>
+      <w:r>
+        <w:t xml:space="preserve">After the pick-up date, when the rental agency provides the vehicle to the client, the vehicle goes into the </w:t>
+      </w:r>
+      <w:r>
+        <w:rPr>
+          <w:b/>
+          <w:bCs/>
+        </w:rPr>
+        <w:t>Rented</w:t>
+      </w:r>
+      <w:r>
+        <w:t xml:space="preserve"> state. It means that the vehicle will be rented and it will not be available for reservation and rental by other customers.</w:t>
+      </w:r>
+    </w:p>
+    <w:p>
+      <w:pPr>
+        <w:spacing w:line="278" w:lineRule="auto"/>
+      </w:pPr>
+      <w:r>
+        <w:t xml:space="preserve">Then, when the client returns the vehicle back to the rental agency, the agency inspects the vehicle in order to check its condition. At this stage, the vehicle will enter the Inspection state. In case there were no problems found, the vehicle will return to the </w:t>
+      </w:r>
+      <w:r>
+        <w:rPr>
+          <w:b/>
+          <w:bCs/>
+        </w:rPr>
+        <w:t>Available</w:t>
+      </w:r>
+      <w:r>
+        <w:t xml:space="preserve"> state and will be ready to make another reservation.</w:t>
+      </w:r>
+    </w:p>
+    <w:p>
+      <w:pPr>
+        <w:spacing w:line="278" w:lineRule="auto"/>
+      </w:pPr>
+      <w:r>
+        <w:t xml:space="preserve">When maintenance is needed, either scheduled or due to some problems, the vehicle enters the </w:t>
+      </w:r>
+      <w:r>
+        <w:rPr>
+          <w:b/>
+          <w:bCs/>
+        </w:rPr>
+        <w:t>Maintenance</w:t>
+      </w:r>
+      <w:r>
+        <w:t xml:space="preserve"> state. During this period of time, it cannot be chosen by other clients. When it completes successfully, the vehicle returns to the </w:t>
+      </w:r>
+      <w:r>
+        <w:rPr>
+          <w:b/>
+          <w:bCs/>
+        </w:rPr>
+        <w:t>Available</w:t>
+      </w:r>
+      <w:r>
+        <w:t xml:space="preserve"> state.</w:t>
+      </w:r>
+    </w:p>
+    <w:p>
+      <w:pPr>
+        <w:spacing w:line="278" w:lineRule="auto"/>
+      </w:pPr>
+      <w:r>
+        <w:t>In case the vehicle will not be used anymore due to sale, damage or other reasons, it enters the Inactive state. This means that the lifecycle of the vehicle in the platform ends.</w:t>
+      </w:r>
+      <w:r>
+        <w:br w:type="page"/>
+      </w:r>
+    </w:p>
+    <w:p>
+      <w:pPr>
+        <w:pStyle w:val="Heading3"/>
+      </w:pPr>
+      <w:r>
+        <w:lastRenderedPageBreak/>
+        <w:t xml:space="preserve">Vehicle Availability State Machine </w:t>
+      </w:r>
+    </w:p>
+    <w:p>
+      <w:pPr>
+        <w:rPr>
+          <w:b/>
+          <w:bCs/>
+        </w:rPr>
+      </w:pPr>
+      <w:r>
+        <w:rPr>
+          <w:b/>
+          <w:bCs/>
+        </w:rPr>
+        <w:t>Purpose</w:t>
+      </w:r>
+    </w:p>
+    <w:p>
+      <w:r>
+        <w:t>The Vehicle Availability State Machine Diagram illustrates the journey of the life cycle of a vehicle in the KriGo framework, keeping in mind the availability of the vehicle. The diagram represents the different states through which a vehicle passes while registering, reserving, renting, inspecting, maintaining, and retiring. Thus, the availability of the vehicle can be managed effectively to avoid any reservation conflicts.</w:t>
+      </w:r>
+    </w:p>
+    <w:p>
+      <w:pPr>
+        <w:rPr>
+          <w:b/>
+          <w:bCs/>
+        </w:rPr>
+      </w:pPr>
+      <w:r>
+        <w:rPr>
+          <w:b/>
+          <w:bCs/>
+        </w:rPr>
+        <w:t>Vehicle States</w:t>
+      </w:r>
+    </w:p>
+    <w:p>
+      <w:r>
+        <w:t>The vehicle lifecycle consists of the following states:</w:t>
+      </w:r>
+    </w:p>
+    <w:p>
+      <w:pPr>
+        <w:pStyle w:val="ListParagraph"/>
+        <w:numPr>
+          <w:ilvl w:val="0"/>
+          <w:numId w:val="130"/>
+        </w:numPr>
+      </w:pPr>
+      <w:r>
+        <w:rPr>
+          <w:b/>
+          <w:bCs/>
+        </w:rPr>
+        <w:t>Available:</w:t>
+      </w:r>
+      <w:r>
+        <w:t xml:space="preserve"> The vehicle is ready to be rented and can appear in customer search results.</w:t>
+      </w:r>
+    </w:p>
+    <w:p>
+      <w:pPr>
+        <w:pStyle w:val="ListParagraph"/>
+        <w:numPr>
+          <w:ilvl w:val="0"/>
+          <w:numId w:val="130"/>
+        </w:numPr>
+      </w:pPr>
+      <w:r>
+        <w:rPr>
+          <w:b/>
+          <w:bCs/>
+        </w:rPr>
+        <w:t>Reserved:</w:t>
+      </w:r>
+      <w:r>
+        <w:t xml:space="preserve"> The vehicle has been booked by a customer for a future rental period and is temporarily unavailable for additional reservations.</w:t>
+      </w:r>
+    </w:p>
+    <w:p>
+      <w:pPr>
+        <w:pStyle w:val="ListParagraph"/>
+        <w:numPr>
+          <w:ilvl w:val="0"/>
+          <w:numId w:val="130"/>
+        </w:numPr>
+      </w:pPr>
+      <w:r>
+        <w:rPr>
+          <w:b/>
+          <w:bCs/>
+        </w:rPr>
+        <w:t>Rented:</w:t>
+      </w:r>
+      <w:r>
+        <w:t xml:space="preserve"> The vehicle has been collected by the customer and is currently in use.</w:t>
+      </w:r>
+    </w:p>
+    <w:p>
+      <w:pPr>
+        <w:pStyle w:val="ListParagraph"/>
+        <w:numPr>
+          <w:ilvl w:val="0"/>
+          <w:numId w:val="130"/>
+        </w:numPr>
+      </w:pPr>
+      <w:r>
+        <w:rPr>
+          <w:b/>
+          <w:bCs/>
+        </w:rPr>
+        <w:t>Inspection:</w:t>
+      </w:r>
+      <w:r>
+        <w:t xml:space="preserve"> The vehicle has been returned and is undergoing inspection by the rental agency.</w:t>
+      </w:r>
+    </w:p>
+    <w:p>
+      <w:pPr>
+        <w:pStyle w:val="ListParagraph"/>
+        <w:numPr>
+          <w:ilvl w:val="0"/>
+          <w:numId w:val="130"/>
+        </w:numPr>
+      </w:pPr>
+      <w:r>
+        <w:rPr>
+          <w:b/>
+          <w:bCs/>
+        </w:rPr>
+        <w:t>Maintenance:</w:t>
+      </w:r>
+      <w:r>
+        <w:t xml:space="preserve"> The vehicle is undergoing scheduled servicing or repairs and cannot be rented.</w:t>
+      </w:r>
+    </w:p>
+    <w:p>
+      <w:pPr>
+        <w:pStyle w:val="ListParagraph"/>
+        <w:numPr>
+          <w:ilvl w:val="0"/>
+          <w:numId w:val="130"/>
+        </w:numPr>
+      </w:pPr>
+      <w:r>
+        <w:rPr>
+          <w:b/>
+          <w:bCs/>
+        </w:rPr>
+        <w:t>Inactive:</w:t>
+      </w:r>
+      <w:r>
+        <w:t xml:space="preserve"> The vehicle has been permanently removed from the fleet and is no longer available for rental.</w:t>
+      </w:r>
+    </w:p>
+    <w:p>
+      <w:pPr>
+        <w:rPr>
+          <w:b/>
+          <w:bCs/>
+        </w:rPr>
+      </w:pPr>
+      <w:r>
+        <w:rPr>
+          <w:b/>
+          <w:bCs/>
+        </w:rPr>
+        <w:t>State Transitions</w:t>
+      </w:r>
+    </w:p>
+    <w:p>
+      <w:r>
+        <w:t xml:space="preserve">The lifecycle of the car begins in the </w:t>
+      </w:r>
+      <w:r>
+        <w:rPr>
+          <w:b/>
+          <w:bCs/>
+        </w:rPr>
+        <w:t>Available</w:t>
+      </w:r>
+      <w:r>
+        <w:t xml:space="preserve"> state after the rental company makes the car available for rental. In case of a successful confirmation of the reservation, the state changes from </w:t>
+      </w:r>
+      <w:r>
+        <w:rPr>
+          <w:b/>
+          <w:bCs/>
+        </w:rPr>
+        <w:t>Available</w:t>
+      </w:r>
+      <w:r>
+        <w:t xml:space="preserve"> to </w:t>
+      </w:r>
+      <w:r>
+        <w:rPr>
+          <w:b/>
+          <w:bCs/>
+        </w:rPr>
+        <w:t>Reserved</w:t>
+      </w:r>
+      <w:r>
+        <w:t xml:space="preserve">. In case of cancellation of the reservation before the pickup of the car, the state changes back to </w:t>
+      </w:r>
+      <w:r>
+        <w:rPr>
+          <w:b/>
+          <w:bCs/>
+        </w:rPr>
+        <w:t>Available</w:t>
+      </w:r>
+      <w:r>
+        <w:t xml:space="preserve">. </w:t>
+      </w:r>
+    </w:p>
+    <w:p>
+      <w:r>
+        <w:t xml:space="preserve">Once the customer goes on to rent the car, the state changes from </w:t>
+      </w:r>
+      <w:r>
+        <w:rPr>
+          <w:b/>
+          <w:bCs/>
+        </w:rPr>
+        <w:t>Reserved</w:t>
+      </w:r>
+      <w:r>
+        <w:t xml:space="preserve"> to </w:t>
+      </w:r>
+      <w:r>
+        <w:rPr>
+          <w:b/>
+          <w:bCs/>
+        </w:rPr>
+        <w:t>Rented</w:t>
+      </w:r>
+      <w:r>
+        <w:t xml:space="preserve">, indicating that the process of renting begins. Post returning the vehicle, the car gets into the Inspection state. If there are no problems found in the car after inspection, then the state goes back to </w:t>
+      </w:r>
+      <w:r>
+        <w:rPr>
+          <w:b/>
+          <w:bCs/>
+        </w:rPr>
+        <w:t>Available</w:t>
+      </w:r>
+      <w:r>
+        <w:t xml:space="preserve">; else, if the car needs servicing and repair, then the state becomes </w:t>
+      </w:r>
+      <w:r>
+        <w:rPr>
+          <w:b/>
+          <w:bCs/>
+        </w:rPr>
+        <w:t>Maintenance</w:t>
+      </w:r>
+      <w:r>
+        <w:t xml:space="preserve">. </w:t>
+      </w:r>
+    </w:p>
+    <w:p>
+      <w:r>
+        <w:t xml:space="preserve">After the car gets serviced successfully, the state becomes </w:t>
+      </w:r>
+      <w:r>
+        <w:rPr>
+          <w:b/>
+          <w:bCs/>
+        </w:rPr>
+        <w:t>Available</w:t>
+      </w:r>
+      <w:r>
+        <w:t xml:space="preserve"> again, making the car ready for another reservation. In case of permanent removal of the car from service, either due to retirement, selling off or being damaged beyond repair, then the state of the car changes from Available to Inactive.</w:t>
+      </w:r>
+    </w:p>
+    <w:p>
+      <w:pPr>
+        <w:rPr>
+          <w:b/>
+          <w:bCs/>
+        </w:rPr>
+      </w:pPr>
+      <w:r>
+        <w:rPr>
+          <w:b/>
+          <w:bCs/>
+        </w:rPr>
+        <w:t>Terminal State</w:t>
+      </w:r>
+    </w:p>
+    <w:p>
+      <w:r>
+        <w:t>The Vehicle Availability State Machine Diagram contains one terminal state:</w:t>
+      </w:r>
+    </w:p>
+    <w:p>
+      <w:pPr>
+        <w:numPr>
+          <w:ilvl w:val="0"/>
+          <w:numId w:val="129"/>
+        </w:numPr>
+      </w:pPr>
+      <w:r>
+        <w:rPr>
+          <w:b/>
+          <w:bCs/>
+        </w:rPr>
+        <w:t>Inactive</w:t>
+      </w:r>
+      <w:r>
+        <w:t>, representing a vehicle that has been permanently removed from the fleet.</w:t>
+      </w:r>
+    </w:p>
+    <w:p>
+      <w:r>
+        <w:t>This terminal state indicates that the vehicle will no longer participate in rental operations or state transitions.</w:t>
+      </w:r>
+    </w:p>
+    <w:p>
+      <w:pPr>
+        <w:spacing w:line="278" w:lineRule="auto"/>
+        <w:rPr>
+          <w:b/>
+          <w:bCs/>
+        </w:rPr>
+      </w:pPr>
+      <w:r>
+        <w:rPr>
+          <w:b/>
+          <w:bCs/>
+        </w:rPr>
+        <w:br w:type="page"/>
+      </w:r>
+    </w:p>
+    <w:p>
+      <w:pPr>
+        <w:rPr>
+          <w:b/>
+          <w:bCs/>
+        </w:rPr>
+      </w:pPr>
+      <w:r>
+        <w:rPr>
+          <w:b/>
+          <w:bCs/>
+        </w:rPr>
+        <w:lastRenderedPageBreak/>
+        <w:t>Conclusion</w:t>
+      </w:r>
+    </w:p>
+    <w:p>
+      <w:r>
+        <w:t>The Vehicle Availability State Machine Diagram is a complete representation of the operational life cycle of the vehicle in the KriGo system. This diagram depicts the different ways by which vehicles can move from one state to another through availability, booking, hiring, inspection, maintenance, and disposal. In doing so, the system is able to prevent any conflicts that may arise due to incorrect management of the fleet and ensure accurate booking processes.</w:t>
+      </w:r>
+    </w:p>
+    <w:p>
+      <w:r>
+        <w:rPr>
+          <w:noProof/>
+        </w:rPr>
+        <mc:AlternateContent>
+          <mc:Choice Requires="wps">
+            <w:drawing>
+              <wp:anchor distT="0" distB="0" distL="114300" distR="114300" simplePos="0" relativeHeight="251660288" behindDoc="0" locked="0" layoutInCell="1" allowOverlap="1" wp14:anchorId="5BFA6B22" wp14:editId="67245729">
+                <wp:simplePos x="0" y="0"/>
+                <wp:positionH relativeFrom="column">
+                  <wp:posOffset>-2540</wp:posOffset>
+                </wp:positionH>
+                <wp:positionV relativeFrom="paragraph">
+                  <wp:posOffset>3463925</wp:posOffset>
+                </wp:positionV>
+                <wp:extent cx="5941695" cy="635"/>
+                <wp:effectExtent l="0" t="0" r="0" b="0"/>
+                <wp:wrapSquare wrapText="bothSides"/>
+                <wp:docPr id="1709456127" name="Text Box 1"/>
+                <wp:cNvGraphicFramePr/>
+                <a:graphic xmlns:a="http://schemas.openxmlformats.org/drawingml/2006/main">
+                  <a:graphicData uri="http://schemas.microsoft.com/office/word/2010/wordprocessingShape">
+                    <wps:wsp>
+                      <wps:cNvSpPr txBox="1"/>
+                      <wps:spPr>
+                        <a:xfrm>
+                          <a:off x="0" y="0"/>
+                          <a:ext cx="5941695" cy="635"/>
+                        </a:xfrm>
+                        <a:prstGeom prst="rect">
+                          <a:avLst/>
+                        </a:prstGeom>
+                        <a:solidFill>
+                          <a:prstClr val="white"/>
+                        </a:solidFill>
+                        <a:ln>
+                          <a:noFill/>
+                        </a:ln>
+                      </wps:spPr>
+                      <wps:txbx>
+                        <w:txbxContent>
+                          <w:p>
+                            <w:pPr>
+                              <w:pStyle w:val="Caption"/>
+                              <w:rPr>
+                                <w:noProof/>
+                              </w:rPr>
+                            </w:pPr>
+                            <w:r>
+                              <w:t xml:space="preserve">Figure </w:t>
+                            </w:r>
+                            <w:r>
+                              <w:fldChar w:fldCharType="begin"/>
+                            </w:r>
+                            <w:r>
+                              <w:instrText xml:space="preserve"> SEQ Figure \* ARABIC </w:instrText>
+                            </w:r>
+                            <w:r>
+                              <w:fldChar w:fldCharType="separate"/>
+                            </w:r>
+                            <w:r>
+                              <w:rPr>
+                                <w:noProof/>
+                              </w:rPr>
+                              <w:t>3</w:t>
+                            </w:r>
+                            <w:r>
+                              <w:fldChar w:fldCharType="end"/>
+                            </w:r>
+                            <w:r>
+                              <w:t xml:space="preserve"> - </w:t>
+                            </w:r>
+                            <w:r>
+                              <w:t>Vehicle State Machine Diagram</w:t>
+                            </w:r>
+                          </w:p>
+                        </w:txbxContent>
+                      </wps:txbx>
+                      <wps:bodyPr rot="0" spcFirstLastPara="0" vertOverflow="overflow" horzOverflow="overflow" vert="horz" wrap="square" lIns="0" tIns="0" rIns="0" bIns="0" numCol="1" spcCol="0" rtlCol="0" fromWordArt="0" anchor="t" anchorCtr="0" forceAA="0" compatLnSpc="1">
+                        <a:prstTxWarp prst="textNoShape">
+                          <a:avLst/>
+                        </a:prstTxWarp>
+                        <a:spAutoFit/>
+                      </wps:bodyPr>
+                    </wps:wsp>
+                  </a:graphicData>
+                </a:graphic>
+              </wp:anchor>
+            </w:drawing>
+          </mc:Choice>
+          <mc:Fallback>
+            <w:pict>
+              <v:shapetype w14:anchorId="5BFA6B22" id="_x0000_t202" coordsize="21600,21600" o:spt="202" path="m,l,21600r21600,l21600,xe">
+                <v:stroke joinstyle="miter"/>
+                <v:path gradientshapeok="t" o:connecttype="rect"/>
+              </v:shapetype>
+              <v:shape id="Text Box 1" o:spid="_x0000_s1026" type="#_x0000_t202" style="position:absolute;margin-left:-.2pt;margin-top:272.75pt;width:467.85pt;height:.05pt;z-index:251660288;visibility:visible;mso-wrap-style:square;mso-wrap-distance-left:9pt;mso-wrap-distance-top:0;mso-wrap-distance-right:9pt;mso-wrap-distance-bottom:0;mso-position-horizontal:absolute;mso-position-horizontal-relative:text;mso-position-vertical:absolute;mso-position-vertical-relative:text;v-text-anchor:top" o:gfxdata="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" stroked="f">
+                <v:textbox style="mso-fit-shape-to-text:t" inset="0,0,0,0">
+                  <w:txbxContent>
+                    <w:p>
+                      <w:pPr>
+                        <w:pStyle w:val="Caption"/>
+                        <w:rPr>
+                          <w:noProof/>
+                        </w:rPr>
+                      </w:pPr>
+                      <w:r>
+                        <w:t xml:space="preserve">Figure </w:t>
+                      </w:r>
+                      <w:r>
+                        <w:fldChar w:fldCharType="begin"/>
+                      </w:r>
+                      <w:r>
+                        <w:instrText xml:space="preserve"> SEQ Figure \* ARABIC </w:instrText>
+                      </w:r>
+                      <w:r>
+                        <w:fldChar w:fldCharType="separate"/>
+                      </w:r>
+                      <w:r>
+                        <w:rPr>
+                          <w:noProof/>
+                        </w:rPr>
+                        <w:t>3</w:t>
+                      </w:r>
+                      <w:r>
+                        <w:fldChar w:fldCharType="end"/>
+                      </w:r>
+                      <w:r>
+                        <w:t xml:space="preserve"> - </w:t>
+                      </w:r>
+                      <w:r>
+                        <w:t>Vehicle State Machine Diagram</w:t>
+                      </w:r>
+                    </w:p>
+                  </w:txbxContent>
+                </v:textbox>
+                <w10:wrap type="square"/>
+              </v:shape>
+            </w:pict>
+          </mc:Fallback>
+        </mc:AlternateContent>
+      </w:r>
+      <w:r>
+        <w:rPr>
+          <w:noProof/>
+        </w:rPr>
+        <w:drawing>
+          <wp:anchor distT="0" distB="0" distL="114300" distR="114300" simplePos="0" relativeHeight="251658240" behindDoc="0" locked="0" layoutInCell="1" allowOverlap="1" wp14:anchorId="1B026BEF" wp14:editId="33F175AD">
+            <wp:simplePos x="0" y="0"/>
+            <wp:positionH relativeFrom="column">
+              <wp:posOffset>-2540</wp:posOffset>
+            </wp:positionH>
+            <wp:positionV relativeFrom="paragraph">
+              <wp:posOffset>287655</wp:posOffset>
+            </wp:positionV>
+            <wp:extent cx="5941695" cy="3119120"/>
+            <wp:effectExtent l="0" t="0" r="1905" b="5080"/>
+            <wp:wrapSquare wrapText="bothSides"/>
+            <wp:docPr id="600241666" name="Picture 10"/>
+            <wp:cNvGraphicFramePr>
+              <a:graphicFrameLocks xmlns:a="http://schemas.openxmlformats.org/drawingml/2006/main" noChangeAspect="1"/>
+            </wp:cNvGraphicFramePr>
+            <a:graphic xmlns:a="http://schemas.openxmlformats.org/drawingml/2006/main">
+              <a:graphicData uri="http://schemas.openxmlformats.org/drawingml/2006/picture">
+                <pic:pic xmlns:pic="http://schemas.openxmlformats.org/drawingml/2006/picture">
+                  <pic:nvPicPr>
+                    <pic:cNvPr id="0" name="Picture 5"/>
+                    <pic:cNvPicPr>
+                      <a:picLocks noChangeAspect="1" noChangeArrowheads="1"/>
+                    </pic:cNvPicPr>
+                  </pic:nvPicPr>
+                  <pic:blipFill>
+                    <a:blip r:embed="rId10">
+                      <a:extLst>
+                        <a:ext uri="{28A0092B-C50C-407E-A947-70E740481C1C}">
+                          <a14:useLocalDpi xmlns:a14="http://schemas.microsoft.com/office/drawing/2010/main" val="0"/>
+                        </a:ext>
+                      </a:extLst>
+                    </a:blip>
+                    <a:srcRect/>
+                    <a:stretch>
+                      <a:fillRect/>
+                    </a:stretch>
+                  </pic:blipFill>
+                  <pic:spPr bwMode="auto">
+                    <a:xfrm>
+                      <a:off x="0" y="0"/>
+                      <a:ext cx="5941695" cy="3119120"/>
+                    </a:xfrm>
+                    <a:prstGeom prst="rect">
+                      <a:avLst/>
+                    </a:prstGeom>
+                    <a:noFill/>
+                    <a:ln>
+                      <a:noFill/>
+                    </a:ln>
+                  </pic:spPr>
+                </pic:pic>
+              </a:graphicData>
+            </a:graphic>
+          </wp:anchor>
+        </w:drawing>
+      </w:r>
+    </w:p>
+    <w:p/>
+    <w:p/>
+    <w:p/>
+    <w:p>
+      <w:pPr>
+        <w:tabs>
+          <w:tab w:val="left" w:pos="1275"/>
+        </w:tabs>
+      </w:pPr>
+      <w:r>
+        <w:tab/>
+      </w:r>
+    </w:p>
+    <w:p>
+      <w:pPr>
+        <w:spacing w:line="278" w:lineRule="auto"/>
+      </w:pPr>
+      <w:r>
+        <w:br w:type="page"/>
+      </w:r>
+    </w:p>
+    <w:p>
+      <w:pPr>
+        <w:tabs>
+          <w:tab w:val="left" w:pos="1275"/>
+        </w:tabs>
+      </w:pPr>
+    </w:p>
+    <w:p/>
+    <w:p/>
+    <w:p/>
+    <w:p/>
+    <w:p/>
+    <w:p/>
+    <w:p/>
+    <w:p/>
+    <w:p/>
     <w:p/>
     <w:sectPr>
       <w:pgSz w:w="11906" w:h="16838" w:code="9"/>
@@ -1976,6 +2713,155 @@
     </w:lvl>
   </w:abstractNum>
   <w:abstractNum w:abstractNumId="6" w15:restartNumberingAfterBreak="0">
+    <w:nsid w:val="05496536"/>
+    <w:multiLevelType w:val="multilevel"/>
+    <w:tmpl w:val="04A8F094"/>
+    <w:lvl w:ilvl="0">
+      <w:start w:val="1"/>
+      <w:numFmt w:val="bullet"/>
+      <w:lvlText w:val=""/>
+      <w:lvlJc w:val="left"/>
+      <w:pPr>
+        <w:tabs>
+          <w:tab w:val="num" w:pos="720"/>
+        </w:tabs>
+        <w:ind w:left="720" w:hanging="360"/>
+      </w:pPr>
+      <w:rPr>
+        <w:rFonts w:ascii="Symbol" w:hAnsi="Symbol" w:hint="default"/>
+        <w:sz w:val="20"/>
+      </w:rPr>
+    </w:lvl>
+    <w:lvl w:ilvl="1" w:tentative="1">
+      <w:start w:val="1"/>
+      <w:numFmt w:val="bullet"/>
+      <w:lvlText w:val="o"/>
+      <w:lvlJc w:val="left"/>
+      <w:pPr>
+        <w:tabs>
+          <w:tab w:val="num" w:pos="1440"/>
+        </w:tabs>
+        <w:ind w:left="1440" w:hanging="360"/>
+      </w:pPr>
+      <w:rPr>
+        <w:rFonts w:ascii="Courier New" w:hAnsi="Courier New" w:hint="default"/>
+        <w:sz w:val="20"/>
+      </w:rPr>
+    </w:lvl>
+    <w:lvl w:ilvl="2" w:tentative="1">
+      <w:start w:val="1"/>
+      <w:numFmt w:val="bullet"/>
+      <w:lvlText w:val=""/>
+      <w:lvlJc w:val="left"/>
+      <w:pPr>
+        <w:tabs>
+          <w:tab w:val="num" w:pos="2160"/>
+        </w:tabs>
+        <w:ind w:left="2160" w:hanging="360"/>
+      </w:pPr>
+      <w:rPr>
+        <w:rFonts w:ascii="Wingdings" w:hAnsi="Wingdings" w:hint="default"/>
+        <w:sz w:val="20"/>
+      </w:rPr>
+    </w:lvl>
+    <w:lvl w:ilvl="3" w:tentative="1">
+      <w:start w:val="1"/>
+      <w:numFmt w:val="bullet"/>
+      <w:lvlText w:val=""/>
+      <w:lvlJc w:val="left"/>
+      <w:pPr>
+        <w:tabs>
+          <w:tab w:val="num" w:pos="2880"/>
+        </w:tabs>
+        <w:ind w:left="2880" w:hanging="360"/>
+      </w:pPr>
+      <w:rPr>
+        <w:rFonts w:ascii="Wingdings" w:hAnsi="Wingdings" w:hint="default"/>
+        <w:sz w:val="20"/>
+      </w:rPr>
+    </w:lvl>
+    <w:lvl w:ilvl="4" w:tentative="1">
+      <w:start w:val="1"/>
+      <w:numFmt w:val="bullet"/>
+      <w:lvlText w:val=""/>
+      <w:lvlJc w:val="left"/>
+      <w:pPr>
+        <w:tabs>
+          <w:tab w:val="num" w:pos="3600"/>
+        </w:tabs>
+        <w:ind w:left="3600" w:hanging="360"/>
+      </w:pPr>
+      <w:rPr>
+        <w:rFonts w:ascii="Wingdings" w:hAnsi="Wingdings" w:hint="default"/>
+        <w:sz w:val="20"/>
+      </w:rPr>
+    </w:lvl>
+    <w:lvl w:ilvl="5" w:tentative="1">
+      <w:start w:val="1"/>
+      <w:numFmt w:val="bullet"/>
+      <w:lvlText w:val=""/>
+      <w:lvlJc w:val="left"/>
+      <w:pPr>
+        <w:tabs>
+          <w:tab w:val="num" w:pos="4320"/>
+        </w:tabs>
+        <w:ind w:left="4320" w:hanging="360"/>
+      </w:pPr>
+      <w:rPr>
+        <w:rFonts w:ascii="Wingdings" w:hAnsi="Wingdings" w:hint="default"/>
+        <w:sz w:val="20"/>
+      </w:rPr>
+    </w:lvl>
+    <w:lvl w:ilvl="6" w:tentative="1">
+      <w:start w:val="1"/>
+      <w:numFmt w:val="bullet"/>
+      <w:lvlText w:val=""/>
+      <w:lvlJc w:val="left"/>
+      <w:pPr>
+        <w:tabs>
+          <w:tab w:val="num" w:pos="5040"/>
+        </w:tabs>
+        <w:ind w:left="5040" w:hanging="360"/>
+      </w:pPr>
+      <w:rPr>
+        <w:rFonts w:ascii="Wingdings" w:hAnsi="Wingdings" w:hint="default"/>
+        <w:sz w:val="20"/>
+      </w:rPr>
+    </w:lvl>
+    <w:lvl w:ilvl="7" w:tentative="1">
+      <w:start w:val="1"/>
+      <w:numFmt w:val="bullet"/>
+      <w:lvlText w:val=""/>
+      <w:lvlJc w:val="left"/>
+      <w:pPr>
+        <w:tabs>
+          <w:tab w:val="num" w:pos="5760"/>
+        </w:tabs>
+        <w:ind w:left="5760" w:hanging="360"/>
+      </w:pPr>
+      <w:rPr>
+        <w:rFonts w:ascii="Wingdings" w:hAnsi="Wingdings" w:hint="default"/>
+        <w:sz w:val="20"/>
+      </w:rPr>
+    </w:lvl>
+    <w:lvl w:ilvl="8" w:tentative="1">
+      <w:start w:val="1"/>
+      <w:numFmt w:val="bullet"/>
+      <w:lvlText w:val=""/>
+      <w:lvlJc w:val="left"/>
+      <w:pPr>
+        <w:tabs>
+          <w:tab w:val="num" w:pos="6480"/>
+        </w:tabs>
+        <w:ind w:left="6480" w:hanging="360"/>
+      </w:pPr>
+      <w:rPr>
+        <w:rFonts w:ascii="Wingdings" w:hAnsi="Wingdings" w:hint="default"/>
+        <w:sz w:val="20"/>
+      </w:rPr>
+    </w:lvl>
+  </w:abstractNum>
+  <w:abstractNum w:abstractNumId="7" w15:restartNumberingAfterBreak="0">
     <w:nsid w:val="08BB19BF"/>
     <w:multiLevelType w:val="multilevel"/>
     <w:tmpl w:val="C5807BB2"/>
@@ -2124,7 +3010,7 @@
       </w:rPr>
     </w:lvl>
   </w:abstractNum>
-  <w:abstractNum w:abstractNumId="7" w15:restartNumberingAfterBreak="0">
+  <w:abstractNum w:abstractNumId="8" w15:restartNumberingAfterBreak="0">
     <w:nsid w:val="08D32D08"/>
     <w:multiLevelType w:val="multilevel"/>
     <w:tmpl w:val="A32449CA"/>
@@ -2273,7 +3159,120 @@
       </w:rPr>
     </w:lvl>
   </w:abstractNum>
-  <w:abstractNum w:abstractNumId="8" w15:restartNumberingAfterBreak="0">
+  <w:abstractNum w:abstractNumId="9" w15:restartNumberingAfterBreak="0">
+    <w:nsid w:val="09BC184C"/>
+    <w:multiLevelType w:val="hybridMultilevel"/>
+    <w:tmpl w:val="7E564B8A"/>
+    <w:lvl w:ilvl="0" w:tplc="04090005">
+      <w:start w:val="1"/>
+      <w:numFmt w:val="bullet"/>
+      <w:lvlText w:val=""/>
+      <w:lvlJc w:val="left"/>
+      <w:pPr>
+        <w:ind w:left="1080" w:hanging="360"/>
+      </w:pPr>
+      <w:rPr>
+        <w:rFonts w:ascii="Wingdings" w:hAnsi="Wingdings" w:hint="default"/>
+      </w:rPr>
+    </w:lvl>
+    <w:lvl w:ilvl="1" w:tplc="04090003" w:tentative="1">
+      <w:start w:val="1"/>
+      <w:numFmt w:val="bullet"/>
+      <w:lvlText w:val="o"/>
+      <w:lvlJc w:val="left"/>
+      <w:pPr>
+        <w:ind w:left="1800" w:hanging="360"/>
+      </w:pPr>
+      <w:rPr>
+        <w:rFonts w:ascii="Courier New" w:hAnsi="Courier New" w:cs="Courier New" w:hint="default"/>
+      </w:rPr>
+    </w:lvl>
+    <w:lvl w:ilvl="2" w:tplc="04090005" w:tentative="1">
+      <w:start w:val="1"/>
+      <w:numFmt w:val="bullet"/>
+      <w:lvlText w:val=""/>
+      <w:lvlJc w:val="left"/>
+      <w:pPr>
+        <w:ind w:left="2520" w:hanging="360"/>
+      </w:pPr>
+      <w:rPr>
+        <w:rFonts w:ascii="Wingdings" w:hAnsi="Wingdings" w:hint="default"/>
+      </w:rPr>
+    </w:lvl>
+    <w:lvl w:ilvl="3" w:tplc="04090001" w:tentative="1">
+      <w:start w:val="1"/>
+      <w:numFmt w:val="bullet"/>
+      <w:lvlText w:val=""/>
+      <w:lvlJc w:val="left"/>
+      <w:pPr>
+        <w:ind w:left="3240" w:hanging="360"/>
+      </w:pPr>
+      <w:rPr>
+        <w:rFonts w:ascii="Symbol" w:hAnsi="Symbol" w:hint="default"/>
+      </w:rPr>
+    </w:lvl>
+    <w:lvl w:ilvl="4" w:tplc="04090003" w:tentative="1">
+      <w:start w:val="1"/>
+      <w:numFmt w:val="bullet"/>
+      <w:lvlText w:val="o"/>
+      <w:lvlJc w:val="left"/>
+      <w:pPr>
+        <w:ind w:left="3960" w:hanging="360"/>
+      </w:pPr>
+      <w:rPr>
+        <w:rFonts w:ascii="Courier New" w:hAnsi="Courier New" w:cs="Courier New" w:hint="default"/>
+      </w:rPr>
+    </w:lvl>
+    <w:lvl w:ilvl="5" w:tplc="04090005" w:tentative="1">
+      <w:start w:val="1"/>
+      <w:numFmt w:val="bullet"/>
+      <w:lvlText w:val=""/>
+      <w:lvlJc w:val="left"/>
+      <w:pPr>
+        <w:ind w:left="4680" w:hanging="360"/>
+      </w:pPr>
+      <w:rPr>
+        <w:rFonts w:ascii="Wingdings" w:hAnsi="Wingdings" w:hint="default"/>
+      </w:rPr>
+    </w:lvl>
+    <w:lvl w:ilvl="6" w:tplc="04090001" w:tentative="1">
+      <w:start w:val="1"/>
+      <w:numFmt w:val="bullet"/>
+      <w:lvlText w:val=""/>
+      <w:lvlJc w:val="left"/>
+      <w:pPr>
+        <w:ind w:left="5400" w:hanging="360"/>
+      </w:pPr>
+      <w:rPr>
+        <w:rFonts w:ascii="Symbol" w:hAnsi="Symbol" w:hint="default"/>
+      </w:rPr>
+    </w:lvl>
+    <w:lvl w:ilvl="7" w:tplc="04090003" w:tentative="1">
+      <w:start w:val="1"/>
+      <w:numFmt w:val="bullet"/>
+      <w:lvlText w:val="o"/>
+      <w:lvlJc w:val="left"/>
+      <w:pPr>
+        <w:ind w:left="6120" w:hanging="360"/>
+      </w:pPr>
+      <w:rPr>
+        <w:rFonts w:ascii="Courier New" w:hAnsi="Courier New" w:cs="Courier New" w:hint="default"/>
+      </w:rPr>
+    </w:lvl>
+    <w:lvl w:ilvl="8" w:tplc="04090005" w:tentative="1">
+      <w:start w:val="1"/>
+      <w:numFmt w:val="bullet"/>
+      <w:lvlText w:val=""/>
+      <w:lvlJc w:val="left"/>
+      <w:pPr>
+        <w:ind w:left="6840" w:hanging="360"/>
+      </w:pPr>
+      <w:rPr>
+        <w:rFonts w:ascii="Wingdings" w:hAnsi="Wingdings" w:hint="default"/>
+      </w:rPr>
+    </w:lvl>
+  </w:abstractNum>
+  <w:abstractNum w:abstractNumId="10" w15:restartNumberingAfterBreak="0">
     <w:nsid w:val="0AE82489"/>
     <w:multiLevelType w:val="multilevel"/>
     <w:tmpl w:val="B82C10D4"/>
@@ -2422,7 +3421,7 @@
       </w:rPr>
     </w:lvl>
   </w:abstractNum>
-  <w:abstractNum w:abstractNumId="9" w15:restartNumberingAfterBreak="0">
+  <w:abstractNum w:abstractNumId="11" w15:restartNumberingAfterBreak="0">
     <w:nsid w:val="0AED48F6"/>
     <w:multiLevelType w:val="hybridMultilevel"/>
     <w:tmpl w:val="990A8EDA"/>
@@ -2535,7 +3534,7 @@
       </w:rPr>
     </w:lvl>
   </w:abstractNum>
-  <w:abstractNum w:abstractNumId="10" w15:restartNumberingAfterBreak="0">
+  <w:abstractNum w:abstractNumId="12" w15:restartNumberingAfterBreak="0">
     <w:nsid w:val="0CC17936"/>
     <w:multiLevelType w:val="multilevel"/>
     <w:tmpl w:val="B5E0C4F8"/>
@@ -2684,7 +3683,7 @@
       </w:rPr>
     </w:lvl>
   </w:abstractNum>
-  <w:abstractNum w:abstractNumId="11" w15:restartNumberingAfterBreak="0">
+  <w:abstractNum w:abstractNumId="13" w15:restartNumberingAfterBreak="0">
     <w:nsid w:val="0E1040E2"/>
     <w:multiLevelType w:val="multilevel"/>
     <w:tmpl w:val="607CCC88"/>
@@ -2833,7 +3832,7 @@
       </w:rPr>
     </w:lvl>
   </w:abstractNum>
-  <w:abstractNum w:abstractNumId="12" w15:restartNumberingAfterBreak="0">
+  <w:abstractNum w:abstractNumId="14" w15:restartNumberingAfterBreak="0">
     <w:nsid w:val="0E2561E7"/>
     <w:multiLevelType w:val="hybridMultilevel"/>
     <w:tmpl w:val="2A6E4870"/>
@@ -2946,7 +3945,7 @@
       </w:rPr>
     </w:lvl>
   </w:abstractNum>
-  <w:abstractNum w:abstractNumId="13" w15:restartNumberingAfterBreak="0">
+  <w:abstractNum w:abstractNumId="15" w15:restartNumberingAfterBreak="0">
     <w:nsid w:val="0E841C27"/>
     <w:multiLevelType w:val="hybridMultilevel"/>
     <w:tmpl w:val="789C7F32"/>
@@ -3059,7 +4058,7 @@
       </w:rPr>
     </w:lvl>
   </w:abstractNum>
-  <w:abstractNum w:abstractNumId="14" w15:restartNumberingAfterBreak="0">
+  <w:abstractNum w:abstractNumId="16" w15:restartNumberingAfterBreak="0">
     <w:nsid w:val="0FAA2602"/>
     <w:multiLevelType w:val="hybridMultilevel"/>
     <w:tmpl w:val="C6C63128"/>
@@ -3172,7 +4171,7 @@
       </w:rPr>
     </w:lvl>
   </w:abstractNum>
-  <w:abstractNum w:abstractNumId="15" w15:restartNumberingAfterBreak="0">
+  <w:abstractNum w:abstractNumId="17" w15:restartNumberingAfterBreak="0">
     <w:nsid w:val="122550ED"/>
     <w:multiLevelType w:val="hybridMultilevel"/>
     <w:tmpl w:val="91ACE480"/>
@@ -3285,7 +4284,7 @@
       </w:rPr>
     </w:lvl>
   </w:abstractNum>
-  <w:abstractNum w:abstractNumId="16" w15:restartNumberingAfterBreak="0">
+  <w:abstractNum w:abstractNumId="18" w15:restartNumberingAfterBreak="0">
     <w:nsid w:val="124C1BAE"/>
     <w:multiLevelType w:val="hybridMultilevel"/>
     <w:tmpl w:val="04988FC0"/>
@@ -3398,7 +4397,7 @@
       </w:rPr>
     </w:lvl>
   </w:abstractNum>
-  <w:abstractNum w:abstractNumId="17" w15:restartNumberingAfterBreak="0">
+  <w:abstractNum w:abstractNumId="19" w15:restartNumberingAfterBreak="0">
     <w:nsid w:val="139F7557"/>
     <w:multiLevelType w:val="multilevel"/>
     <w:tmpl w:val="A984C1D4"/>
@@ -3547,7 +4546,7 @@
       </w:rPr>
     </w:lvl>
   </w:abstractNum>
-  <w:abstractNum w:abstractNumId="18" w15:restartNumberingAfterBreak="0">
+  <w:abstractNum w:abstractNumId="20" w15:restartNumberingAfterBreak="0">
     <w:nsid w:val="13A13D09"/>
     <w:multiLevelType w:val="multilevel"/>
     <w:tmpl w:val="92067DCC"/>
@@ -3696,7 +4695,7 @@
       </w:rPr>
     </w:lvl>
   </w:abstractNum>
-  <w:abstractNum w:abstractNumId="19" w15:restartNumberingAfterBreak="0">
+  <w:abstractNum w:abstractNumId="21" w15:restartNumberingAfterBreak="0">
     <w:nsid w:val="16D400B4"/>
     <w:multiLevelType w:val="hybridMultilevel"/>
     <w:tmpl w:val="58E6DFBE"/>
@@ -3809,7 +4808,7 @@
       </w:rPr>
     </w:lvl>
   </w:abstractNum>
-  <w:abstractNum w:abstractNumId="20" w15:restartNumberingAfterBreak="0">
+  <w:abstractNum w:abstractNumId="22" w15:restartNumberingAfterBreak="0">
     <w:nsid w:val="17236012"/>
     <w:multiLevelType w:val="hybridMultilevel"/>
     <w:tmpl w:val="DAFA46C8"/>
@@ -3922,7 +4921,7 @@
       </w:rPr>
     </w:lvl>
   </w:abstractNum>
-  <w:abstractNum w:abstractNumId="21" w15:restartNumberingAfterBreak="0">
+  <w:abstractNum w:abstractNumId="23" w15:restartNumberingAfterBreak="0">
     <w:nsid w:val="172B04C0"/>
     <w:multiLevelType w:val="hybridMultilevel"/>
     <w:tmpl w:val="B6C41D5E"/>
@@ -4035,7 +5034,7 @@
       </w:rPr>
     </w:lvl>
   </w:abstractNum>
-  <w:abstractNum w:abstractNumId="22" w15:restartNumberingAfterBreak="0">
+  <w:abstractNum w:abstractNumId="24" w15:restartNumberingAfterBreak="0">
     <w:nsid w:val="17485CCB"/>
     <w:multiLevelType w:val="multilevel"/>
     <w:tmpl w:val="397E1AE0"/>
@@ -4184,7 +5183,7 @@
       </w:rPr>
     </w:lvl>
   </w:abstractNum>
-  <w:abstractNum w:abstractNumId="23" w15:restartNumberingAfterBreak="0">
+  <w:abstractNum w:abstractNumId="25" w15:restartNumberingAfterBreak="0">
     <w:nsid w:val="17641BB2"/>
     <w:multiLevelType w:val="hybridMultilevel"/>
     <w:tmpl w:val="7206D07C"/>
@@ -4297,7 +5296,7 @@
       </w:rPr>
     </w:lvl>
   </w:abstractNum>
-  <w:abstractNum w:abstractNumId="24" w15:restartNumberingAfterBreak="0">
+  <w:abstractNum w:abstractNumId="26" w15:restartNumberingAfterBreak="0">
     <w:nsid w:val="17763D31"/>
     <w:multiLevelType w:val="hybridMultilevel"/>
     <w:tmpl w:val="6CE63304"/>
@@ -4410,7 +5409,7 @@
       </w:rPr>
     </w:lvl>
   </w:abstractNum>
-  <w:abstractNum w:abstractNumId="25" w15:restartNumberingAfterBreak="0">
+  <w:abstractNum w:abstractNumId="27" w15:restartNumberingAfterBreak="0">
     <w:nsid w:val="17B06937"/>
     <w:multiLevelType w:val="hybridMultilevel"/>
     <w:tmpl w:val="71089CF2"/>
@@ -4523,7 +5522,7 @@
       </w:rPr>
     </w:lvl>
   </w:abstractNum>
-  <w:abstractNum w:abstractNumId="26" w15:restartNumberingAfterBreak="0">
+  <w:abstractNum w:abstractNumId="28" w15:restartNumberingAfterBreak="0">
     <w:nsid w:val="190F0390"/>
     <w:multiLevelType w:val="multilevel"/>
     <w:tmpl w:val="CBE4A4A4"/>
@@ -4672,7 +5671,7 @@
       </w:rPr>
     </w:lvl>
   </w:abstractNum>
-  <w:abstractNum w:abstractNumId="27" w15:restartNumberingAfterBreak="0">
+  <w:abstractNum w:abstractNumId="29" w15:restartNumberingAfterBreak="0">
     <w:nsid w:val="195875B0"/>
     <w:multiLevelType w:val="multilevel"/>
     <w:tmpl w:val="615444D4"/>
@@ -4785,7 +5784,7 @@
       </w:pPr>
     </w:lvl>
   </w:abstractNum>
-  <w:abstractNum w:abstractNumId="28" w15:restartNumberingAfterBreak="0">
+  <w:abstractNum w:abstractNumId="30" w15:restartNumberingAfterBreak="0">
     <w:nsid w:val="197C6FD7"/>
     <w:multiLevelType w:val="hybridMultilevel"/>
     <w:tmpl w:val="D97CEAA8"/>
@@ -4898,7 +5897,7 @@
       </w:rPr>
     </w:lvl>
   </w:abstractNum>
-  <w:abstractNum w:abstractNumId="29" w15:restartNumberingAfterBreak="0">
+  <w:abstractNum w:abstractNumId="31" w15:restartNumberingAfterBreak="0">
     <w:nsid w:val="1CC60A94"/>
     <w:multiLevelType w:val="multilevel"/>
     <w:tmpl w:val="EB74741C"/>
@@ -5047,7 +6046,7 @@
       </w:rPr>
     </w:lvl>
   </w:abstractNum>
-  <w:abstractNum w:abstractNumId="30" w15:restartNumberingAfterBreak="0">
+  <w:abstractNum w:abstractNumId="32" w15:restartNumberingAfterBreak="0">
     <w:nsid w:val="1E6658CF"/>
     <w:multiLevelType w:val="multilevel"/>
     <w:tmpl w:val="762ABC5E"/>
@@ -5196,7 +6195,7 @@
       </w:rPr>
     </w:lvl>
   </w:abstractNum>
-  <w:abstractNum w:abstractNumId="31" w15:restartNumberingAfterBreak="0">
+  <w:abstractNum w:abstractNumId="33" w15:restartNumberingAfterBreak="0">
     <w:nsid w:val="1FA532B0"/>
     <w:multiLevelType w:val="multilevel"/>
     <w:tmpl w:val="8718294C"/>
@@ -5345,7 +6344,7 @@
       </w:rPr>
     </w:lvl>
   </w:abstractNum>
-  <w:abstractNum w:abstractNumId="32" w15:restartNumberingAfterBreak="0">
+  <w:abstractNum w:abstractNumId="34" w15:restartNumberingAfterBreak="0">
     <w:nsid w:val="215C77FD"/>
     <w:multiLevelType w:val="hybridMultilevel"/>
     <w:tmpl w:val="58F41D10"/>
@@ -5434,7 +6433,7 @@
       </w:pPr>
     </w:lvl>
   </w:abstractNum>
-  <w:abstractNum w:abstractNumId="33" w15:restartNumberingAfterBreak="0">
+  <w:abstractNum w:abstractNumId="35" w15:restartNumberingAfterBreak="0">
     <w:nsid w:val="218D5909"/>
     <w:multiLevelType w:val="hybridMultilevel"/>
     <w:tmpl w:val="CC989EE4"/>
@@ -5547,7 +6546,7 @@
       </w:rPr>
     </w:lvl>
   </w:abstractNum>
-  <w:abstractNum w:abstractNumId="34" w15:restartNumberingAfterBreak="0">
+  <w:abstractNum w:abstractNumId="36" w15:restartNumberingAfterBreak="0">
     <w:nsid w:val="23E010BA"/>
     <w:multiLevelType w:val="multilevel"/>
     <w:tmpl w:val="4A16907E"/>
@@ -5696,7 +6695,7 @@
       </w:rPr>
     </w:lvl>
   </w:abstractNum>
-  <w:abstractNum w:abstractNumId="35" w15:restartNumberingAfterBreak="0">
+  <w:abstractNum w:abstractNumId="37" w15:restartNumberingAfterBreak="0">
     <w:nsid w:val="2470127A"/>
     <w:multiLevelType w:val="multilevel"/>
     <w:tmpl w:val="309E9618"/>
@@ -5845,7 +6844,7 @@
       </w:rPr>
     </w:lvl>
   </w:abstractNum>
-  <w:abstractNum w:abstractNumId="36" w15:restartNumberingAfterBreak="0">
+  <w:abstractNum w:abstractNumId="38" w15:restartNumberingAfterBreak="0">
     <w:nsid w:val="24796798"/>
     <w:multiLevelType w:val="hybridMultilevel"/>
     <w:tmpl w:val="6622BEDC"/>
@@ -5934,7 +6933,7 @@
       </w:pPr>
     </w:lvl>
   </w:abstractNum>
-  <w:abstractNum w:abstractNumId="37" w15:restartNumberingAfterBreak="0">
+  <w:abstractNum w:abstractNumId="39" w15:restartNumberingAfterBreak="0">
     <w:nsid w:val="253B76EC"/>
     <w:multiLevelType w:val="multilevel"/>
     <w:tmpl w:val="2AA67CDA"/>
@@ -6083,7 +7082,7 @@
       </w:rPr>
     </w:lvl>
   </w:abstractNum>
-  <w:abstractNum w:abstractNumId="38" w15:restartNumberingAfterBreak="0">
+  <w:abstractNum w:abstractNumId="40" w15:restartNumberingAfterBreak="0">
     <w:nsid w:val="2E4D738C"/>
     <w:multiLevelType w:val="multilevel"/>
     <w:tmpl w:val="1540BBA2"/>
@@ -6232,7 +7231,7 @@
       </w:rPr>
     </w:lvl>
   </w:abstractNum>
-  <w:abstractNum w:abstractNumId="39" w15:restartNumberingAfterBreak="0">
+  <w:abstractNum w:abstractNumId="41" w15:restartNumberingAfterBreak="0">
     <w:nsid w:val="2F0041C7"/>
     <w:multiLevelType w:val="multilevel"/>
     <w:tmpl w:val="656414FE"/>
@@ -6381,7 +7380,7 @@
       </w:rPr>
     </w:lvl>
   </w:abstractNum>
-  <w:abstractNum w:abstractNumId="40" w15:restartNumberingAfterBreak="0">
+  <w:abstractNum w:abstractNumId="42" w15:restartNumberingAfterBreak="0">
     <w:nsid w:val="304F01FA"/>
     <w:multiLevelType w:val="multilevel"/>
     <w:tmpl w:val="151C4EC6"/>
@@ -6530,7 +7529,7 @@
       </w:rPr>
     </w:lvl>
   </w:abstractNum>
-  <w:abstractNum w:abstractNumId="41" w15:restartNumberingAfterBreak="0">
+  <w:abstractNum w:abstractNumId="43" w15:restartNumberingAfterBreak="0">
     <w:nsid w:val="30BD025D"/>
     <w:multiLevelType w:val="hybridMultilevel"/>
     <w:tmpl w:val="04381C82"/>
@@ -6619,7 +7618,7 @@
       </w:pPr>
     </w:lvl>
   </w:abstractNum>
-  <w:abstractNum w:abstractNumId="42" w15:restartNumberingAfterBreak="0">
+  <w:abstractNum w:abstractNumId="44" w15:restartNumberingAfterBreak="0">
     <w:nsid w:val="327C0BA6"/>
     <w:multiLevelType w:val="hybridMultilevel"/>
     <w:tmpl w:val="2A9047EE"/>
@@ -6732,7 +7731,7 @@
       </w:rPr>
     </w:lvl>
   </w:abstractNum>
-  <w:abstractNum w:abstractNumId="43" w15:restartNumberingAfterBreak="0">
+  <w:abstractNum w:abstractNumId="45" w15:restartNumberingAfterBreak="0">
     <w:nsid w:val="338D63E8"/>
     <w:multiLevelType w:val="hybridMultilevel"/>
     <w:tmpl w:val="28D0FB50"/>
@@ -6845,7 +7844,7 @@
       </w:rPr>
     </w:lvl>
   </w:abstractNum>
-  <w:abstractNum w:abstractNumId="44" w15:restartNumberingAfterBreak="0">
+  <w:abstractNum w:abstractNumId="46" w15:restartNumberingAfterBreak="0">
     <w:nsid w:val="34182771"/>
     <w:multiLevelType w:val="multilevel"/>
     <w:tmpl w:val="2AA67CDA"/>
@@ -6994,7 +7993,7 @@
       </w:rPr>
     </w:lvl>
   </w:abstractNum>
-  <w:abstractNum w:abstractNumId="45" w15:restartNumberingAfterBreak="0">
+  <w:abstractNum w:abstractNumId="47" w15:restartNumberingAfterBreak="0">
     <w:nsid w:val="35413E58"/>
     <w:multiLevelType w:val="hybridMultilevel"/>
     <w:tmpl w:val="03C64164"/>
@@ -7107,7 +8106,7 @@
       </w:rPr>
     </w:lvl>
   </w:abstractNum>
-  <w:abstractNum w:abstractNumId="46" w15:restartNumberingAfterBreak="0">
+  <w:abstractNum w:abstractNumId="48" w15:restartNumberingAfterBreak="0">
     <w:nsid w:val="35C86AF0"/>
     <w:multiLevelType w:val="multilevel"/>
     <w:tmpl w:val="8202FCD6"/>
@@ -7256,7 +8255,7 @@
       </w:rPr>
     </w:lvl>
   </w:abstractNum>
-  <w:abstractNum w:abstractNumId="47" w15:restartNumberingAfterBreak="0">
+  <w:abstractNum w:abstractNumId="49" w15:restartNumberingAfterBreak="0">
     <w:nsid w:val="3623194A"/>
     <w:multiLevelType w:val="multilevel"/>
     <w:tmpl w:val="63F4E6F0"/>
@@ -7405,7 +8404,7 @@
       </w:rPr>
     </w:lvl>
   </w:abstractNum>
-  <w:abstractNum w:abstractNumId="48" w15:restartNumberingAfterBreak="0">
+  <w:abstractNum w:abstractNumId="50" w15:restartNumberingAfterBreak="0">
     <w:nsid w:val="36E36979"/>
     <w:multiLevelType w:val="multilevel"/>
     <w:tmpl w:val="3D58C93A"/>
@@ -7554,7 +8553,7 @@
       </w:rPr>
     </w:lvl>
   </w:abstractNum>
-  <w:abstractNum w:abstractNumId="49" w15:restartNumberingAfterBreak="0">
+  <w:abstractNum w:abstractNumId="51" w15:restartNumberingAfterBreak="0">
     <w:nsid w:val="37B424C3"/>
     <w:multiLevelType w:val="hybridMultilevel"/>
     <w:tmpl w:val="18F030D4"/>
@@ -7667,7 +8666,7 @@
       </w:rPr>
     </w:lvl>
   </w:abstractNum>
-  <w:abstractNum w:abstractNumId="50" w15:restartNumberingAfterBreak="0">
+  <w:abstractNum w:abstractNumId="52" w15:restartNumberingAfterBreak="0">
     <w:nsid w:val="3BC10D30"/>
     <w:multiLevelType w:val="multilevel"/>
     <w:tmpl w:val="502AD78C"/>
@@ -7816,7 +8815,7 @@
       </w:rPr>
     </w:lvl>
   </w:abstractNum>
-  <w:abstractNum w:abstractNumId="51" w15:restartNumberingAfterBreak="0">
+  <w:abstractNum w:abstractNumId="53" w15:restartNumberingAfterBreak="0">
     <w:nsid w:val="3C276BB8"/>
     <w:multiLevelType w:val="multilevel"/>
     <w:tmpl w:val="2AA67CDA"/>
@@ -7965,7 +8964,7 @@
       </w:rPr>
     </w:lvl>
   </w:abstractNum>
-  <w:abstractNum w:abstractNumId="52" w15:restartNumberingAfterBreak="0">
+  <w:abstractNum w:abstractNumId="54" w15:restartNumberingAfterBreak="0">
     <w:nsid w:val="3C596808"/>
     <w:multiLevelType w:val="multilevel"/>
     <w:tmpl w:val="2AA67CDA"/>
@@ -8114,7 +9113,7 @@
       </w:rPr>
     </w:lvl>
   </w:abstractNum>
-  <w:abstractNum w:abstractNumId="53" w15:restartNumberingAfterBreak="0">
+  <w:abstractNum w:abstractNumId="55" w15:restartNumberingAfterBreak="0">
     <w:nsid w:val="3CBF280A"/>
     <w:multiLevelType w:val="multilevel"/>
     <w:tmpl w:val="A13E4362"/>
@@ -8263,7 +9262,7 @@
       </w:rPr>
     </w:lvl>
   </w:abstractNum>
-  <w:abstractNum w:abstractNumId="54" w15:restartNumberingAfterBreak="0">
+  <w:abstractNum w:abstractNumId="56" w15:restartNumberingAfterBreak="0">
     <w:nsid w:val="3CC7541B"/>
     <w:multiLevelType w:val="multilevel"/>
     <w:tmpl w:val="2AA67CDA"/>
@@ -8412,7 +9411,7 @@
       </w:rPr>
     </w:lvl>
   </w:abstractNum>
-  <w:abstractNum w:abstractNumId="55" w15:restartNumberingAfterBreak="0">
+  <w:abstractNum w:abstractNumId="57" w15:restartNumberingAfterBreak="0">
     <w:nsid w:val="3F5E3BA1"/>
     <w:multiLevelType w:val="multilevel"/>
     <w:tmpl w:val="2AA67CDA"/>
@@ -8561,7 +9560,7 @@
       </w:rPr>
     </w:lvl>
   </w:abstractNum>
-  <w:abstractNum w:abstractNumId="56" w15:restartNumberingAfterBreak="0">
+  <w:abstractNum w:abstractNumId="58" w15:restartNumberingAfterBreak="0">
     <w:nsid w:val="40431B1C"/>
     <w:multiLevelType w:val="multilevel"/>
     <w:tmpl w:val="5D8E77D0"/>
@@ -8710,7 +9709,7 @@
       </w:rPr>
     </w:lvl>
   </w:abstractNum>
-  <w:abstractNum w:abstractNumId="57" w15:restartNumberingAfterBreak="0">
+  <w:abstractNum w:abstractNumId="59" w15:restartNumberingAfterBreak="0">
     <w:nsid w:val="452F60FB"/>
     <w:multiLevelType w:val="hybridMultilevel"/>
     <w:tmpl w:val="892A990A"/>
@@ -8823,7 +9822,7 @@
       </w:rPr>
     </w:lvl>
   </w:abstractNum>
-  <w:abstractNum w:abstractNumId="58" w15:restartNumberingAfterBreak="0">
+  <w:abstractNum w:abstractNumId="60" w15:restartNumberingAfterBreak="0">
     <w:nsid w:val="47B65409"/>
     <w:multiLevelType w:val="multilevel"/>
     <w:tmpl w:val="2AA67CDA"/>
@@ -8972,7 +9971,7 @@
       </w:rPr>
     </w:lvl>
   </w:abstractNum>
-  <w:abstractNum w:abstractNumId="59" w15:restartNumberingAfterBreak="0">
+  <w:abstractNum w:abstractNumId="61" w15:restartNumberingAfterBreak="0">
     <w:nsid w:val="47BF2170"/>
     <w:multiLevelType w:val="multilevel"/>
     <w:tmpl w:val="D9681266"/>
@@ -9121,7 +10120,7 @@
       </w:rPr>
     </w:lvl>
   </w:abstractNum>
-  <w:abstractNum w:abstractNumId="60" w15:restartNumberingAfterBreak="0">
+  <w:abstractNum w:abstractNumId="62" w15:restartNumberingAfterBreak="0">
     <w:nsid w:val="47E5592F"/>
     <w:multiLevelType w:val="hybridMultilevel"/>
     <w:tmpl w:val="719AB9FA"/>
@@ -9234,7 +10233,156 @@
       </w:rPr>
     </w:lvl>
   </w:abstractNum>
-  <w:abstractNum w:abstractNumId="61" w15:restartNumberingAfterBreak="0">
+  <w:abstractNum w:abstractNumId="63" w15:restartNumberingAfterBreak="0">
+    <w:nsid w:val="48204158"/>
+    <w:multiLevelType w:val="multilevel"/>
+    <w:tmpl w:val="1F9C21B4"/>
+    <w:lvl w:ilvl="0">
+      <w:start w:val="1"/>
+      <w:numFmt w:val="bullet"/>
+      <w:lvlText w:val=""/>
+      <w:lvlJc w:val="left"/>
+      <w:pPr>
+        <w:tabs>
+          <w:tab w:val="num" w:pos="720"/>
+        </w:tabs>
+        <w:ind w:left="720" w:hanging="360"/>
+      </w:pPr>
+      <w:rPr>
+        <w:rFonts w:ascii="Symbol" w:hAnsi="Symbol" w:hint="default"/>
+        <w:sz w:val="20"/>
+      </w:rPr>
+    </w:lvl>
+    <w:lvl w:ilvl="1" w:tentative="1">
+      <w:start w:val="1"/>
+      <w:numFmt w:val="bullet"/>
+      <w:lvlText w:val="o"/>
+      <w:lvlJc w:val="left"/>
+      <w:pPr>
+        <w:tabs>
+          <w:tab w:val="num" w:pos="1440"/>
+        </w:tabs>
+        <w:ind w:left="1440" w:hanging="360"/>
+      </w:pPr>
+      <w:rPr>
+        <w:rFonts w:ascii="Courier New" w:hAnsi="Courier New" w:hint="default"/>
+        <w:sz w:val="20"/>
+      </w:rPr>
+    </w:lvl>
+    <w:lvl w:ilvl="2" w:tentative="1">
+      <w:start w:val="1"/>
+      <w:numFmt w:val="bullet"/>
+      <w:lvlText w:val=""/>
+      <w:lvlJc w:val="left"/>
+      <w:pPr>
+        <w:tabs>
+          <w:tab w:val="num" w:pos="2160"/>
+        </w:tabs>
+        <w:ind w:left="2160" w:hanging="360"/>
+      </w:pPr>
+      <w:rPr>
+        <w:rFonts w:ascii="Wingdings" w:hAnsi="Wingdings" w:hint="default"/>
+        <w:sz w:val="20"/>
+      </w:rPr>
+    </w:lvl>
+    <w:lvl w:ilvl="3" w:tentative="1">
+      <w:start w:val="1"/>
+      <w:numFmt w:val="bullet"/>
+      <w:lvlText w:val=""/>
+      <w:lvlJc w:val="left"/>
+      <w:pPr>
+        <w:tabs>
+          <w:tab w:val="num" w:pos="2880"/>
+        </w:tabs>
+        <w:ind w:left="2880" w:hanging="360"/>
+      </w:pPr>
+      <w:rPr>
+        <w:rFonts w:ascii="Wingdings" w:hAnsi="Wingdings" w:hint="default"/>
+        <w:sz w:val="20"/>
+      </w:rPr>
+    </w:lvl>
+    <w:lvl w:ilvl="4" w:tentative="1">
+      <w:start w:val="1"/>
+      <w:numFmt w:val="bullet"/>
+      <w:lvlText w:val=""/>
+      <w:lvlJc w:val="left"/>
+      <w:pPr>
+        <w:tabs>
+          <w:tab w:val="num" w:pos="3600"/>
+        </w:tabs>
+        <w:ind w:left="3600" w:hanging="360"/>
+      </w:pPr>
+      <w:rPr>
+        <w:rFonts w:ascii="Wingdings" w:hAnsi="Wingdings" w:hint="default"/>
+        <w:sz w:val="20"/>
+      </w:rPr>
+    </w:lvl>
+    <w:lvl w:ilvl="5" w:tentative="1">
+      <w:start w:val="1"/>
+      <w:numFmt w:val="bullet"/>
+      <w:lvlText w:val=""/>
+      <w:lvlJc w:val="left"/>
+      <w:pPr>
+        <w:tabs>
+          <w:tab w:val="num" w:pos="4320"/>
+        </w:tabs>
+        <w:ind w:left="4320" w:hanging="360"/>
+      </w:pPr>
+      <w:rPr>
+        <w:rFonts w:ascii="Wingdings" w:hAnsi="Wingdings" w:hint="default"/>
+        <w:sz w:val="20"/>
+      </w:rPr>
+    </w:lvl>
+    <w:lvl w:ilvl="6" w:tentative="1">
+      <w:start w:val="1"/>
+      <w:numFmt w:val="bullet"/>
+      <w:lvlText w:val=""/>
+      <w:lvlJc w:val="left"/>
+      <w:pPr>
+        <w:tabs>
+          <w:tab w:val="num" w:pos="5040"/>
+        </w:tabs>
+        <w:ind w:left="5040" w:hanging="360"/>
+      </w:pPr>
+      <w:rPr>
+        <w:rFonts w:ascii="Wingdings" w:hAnsi="Wingdings" w:hint="default"/>
+        <w:sz w:val="20"/>
+      </w:rPr>
+    </w:lvl>
+    <w:lvl w:ilvl="7" w:tentative="1">
+      <w:start w:val="1"/>
+      <w:numFmt w:val="bullet"/>
+      <w:lvlText w:val=""/>
+      <w:lvlJc w:val="left"/>
+      <w:pPr>
+        <w:tabs>
+          <w:tab w:val="num" w:pos="5760"/>
+        </w:tabs>
+        <w:ind w:left="5760" w:hanging="360"/>
+      </w:pPr>
+      <w:rPr>
+        <w:rFonts w:ascii="Wingdings" w:hAnsi="Wingdings" w:hint="default"/>
+        <w:sz w:val="20"/>
+      </w:rPr>
+    </w:lvl>
+    <w:lvl w:ilvl="8" w:tentative="1">
+      <w:start w:val="1"/>
+      <w:numFmt w:val="bullet"/>
+      <w:lvlText w:val=""/>
+      <w:lvlJc w:val="left"/>
+      <w:pPr>
+        <w:tabs>
+          <w:tab w:val="num" w:pos="6480"/>
+        </w:tabs>
+        <w:ind w:left="6480" w:hanging="360"/>
+      </w:pPr>
+      <w:rPr>
+        <w:rFonts w:ascii="Wingdings" w:hAnsi="Wingdings" w:hint="default"/>
+        <w:sz w:val="20"/>
+      </w:rPr>
+    </w:lvl>
+  </w:abstractNum>
+  <w:abstractNum w:abstractNumId="64" w15:restartNumberingAfterBreak="0">
     <w:nsid w:val="48C041A9"/>
     <w:multiLevelType w:val="multilevel"/>
     <w:tmpl w:val="59A694BC"/>
@@ -9383,7 +10531,7 @@
       </w:rPr>
     </w:lvl>
   </w:abstractNum>
-  <w:abstractNum w:abstractNumId="62" w15:restartNumberingAfterBreak="0">
+  <w:abstractNum w:abstractNumId="65" w15:restartNumberingAfterBreak="0">
     <w:nsid w:val="49D6568A"/>
     <w:multiLevelType w:val="multilevel"/>
     <w:tmpl w:val="559E29EC"/>
@@ -9532,7 +10680,7 @@
       </w:rPr>
     </w:lvl>
   </w:abstractNum>
-  <w:abstractNum w:abstractNumId="63" w15:restartNumberingAfterBreak="0">
+  <w:abstractNum w:abstractNumId="66" w15:restartNumberingAfterBreak="0">
     <w:nsid w:val="4AF73293"/>
     <w:multiLevelType w:val="hybridMultilevel"/>
     <w:tmpl w:val="F2962738"/>
@@ -9645,7 +10793,7 @@
       </w:rPr>
     </w:lvl>
   </w:abstractNum>
-  <w:abstractNum w:abstractNumId="64" w15:restartNumberingAfterBreak="0">
+  <w:abstractNum w:abstractNumId="67" w15:restartNumberingAfterBreak="0">
     <w:nsid w:val="4B375248"/>
     <w:multiLevelType w:val="multilevel"/>
     <w:tmpl w:val="B574C1C6"/>
@@ -9794,7 +10942,7 @@
       </w:rPr>
     </w:lvl>
   </w:abstractNum>
-  <w:abstractNum w:abstractNumId="65" w15:restartNumberingAfterBreak="0">
+  <w:abstractNum w:abstractNumId="68" w15:restartNumberingAfterBreak="0">
     <w:nsid w:val="4BA13766"/>
     <w:multiLevelType w:val="multilevel"/>
     <w:tmpl w:val="63F4E6F0"/>
@@ -9943,7 +11091,7 @@
       </w:rPr>
     </w:lvl>
   </w:abstractNum>
-  <w:abstractNum w:abstractNumId="66" w15:restartNumberingAfterBreak="0">
+  <w:abstractNum w:abstractNumId="69" w15:restartNumberingAfterBreak="0">
     <w:nsid w:val="4BA25441"/>
     <w:multiLevelType w:val="hybridMultilevel"/>
     <w:tmpl w:val="217E2E96"/>
@@ -10056,7 +11204,7 @@
       </w:rPr>
     </w:lvl>
   </w:abstractNum>
-  <w:abstractNum w:abstractNumId="67" w15:restartNumberingAfterBreak="0">
+  <w:abstractNum w:abstractNumId="70" w15:restartNumberingAfterBreak="0">
     <w:nsid w:val="4E276DCB"/>
     <w:multiLevelType w:val="hybridMultilevel"/>
     <w:tmpl w:val="B7C469B4"/>
@@ -10169,7 +11317,7 @@
       </w:rPr>
     </w:lvl>
   </w:abstractNum>
-  <w:abstractNum w:abstractNumId="68" w15:restartNumberingAfterBreak="0">
+  <w:abstractNum w:abstractNumId="71" w15:restartNumberingAfterBreak="0">
     <w:nsid w:val="4F053929"/>
     <w:multiLevelType w:val="hybridMultilevel"/>
     <w:tmpl w:val="2A78C678"/>
@@ -10282,7 +11430,7 @@
       </w:rPr>
     </w:lvl>
   </w:abstractNum>
-  <w:abstractNum w:abstractNumId="69" w15:restartNumberingAfterBreak="0">
+  <w:abstractNum w:abstractNumId="72" w15:restartNumberingAfterBreak="0">
     <w:nsid w:val="4FFB237E"/>
     <w:multiLevelType w:val="multilevel"/>
     <w:tmpl w:val="2AA67CDA"/>
@@ -10431,7 +11579,7 @@
       </w:rPr>
     </w:lvl>
   </w:abstractNum>
-  <w:abstractNum w:abstractNumId="70" w15:restartNumberingAfterBreak="0">
+  <w:abstractNum w:abstractNumId="73" w15:restartNumberingAfterBreak="0">
     <w:nsid w:val="50476F20"/>
     <w:multiLevelType w:val="hybridMultilevel"/>
     <w:tmpl w:val="85B03D5E"/>
@@ -10520,7 +11668,7 @@
       </w:pPr>
     </w:lvl>
   </w:abstractNum>
-  <w:abstractNum w:abstractNumId="71" w15:restartNumberingAfterBreak="0">
+  <w:abstractNum w:abstractNumId="74" w15:restartNumberingAfterBreak="0">
     <w:nsid w:val="51737FE0"/>
     <w:multiLevelType w:val="hybridMultilevel"/>
     <w:tmpl w:val="2B0604E6"/>
@@ -10633,7 +11781,7 @@
       </w:rPr>
     </w:lvl>
   </w:abstractNum>
-  <w:abstractNum w:abstractNumId="72" w15:restartNumberingAfterBreak="0">
+  <w:abstractNum w:abstractNumId="75" w15:restartNumberingAfterBreak="0">
     <w:nsid w:val="518B1885"/>
     <w:multiLevelType w:val="multilevel"/>
     <w:tmpl w:val="AE1AAC28"/>
@@ -10782,7 +11930,7 @@
       </w:rPr>
     </w:lvl>
   </w:abstractNum>
-  <w:abstractNum w:abstractNumId="73" w15:restartNumberingAfterBreak="0">
+  <w:abstractNum w:abstractNumId="76" w15:restartNumberingAfterBreak="0">
     <w:nsid w:val="51A86EF8"/>
     <w:multiLevelType w:val="multilevel"/>
     <w:tmpl w:val="FF2841D4"/>
@@ -10931,7 +12079,7 @@
       </w:rPr>
     </w:lvl>
   </w:abstractNum>
-  <w:abstractNum w:abstractNumId="74" w15:restartNumberingAfterBreak="0">
+  <w:abstractNum w:abstractNumId="77" w15:restartNumberingAfterBreak="0">
     <w:nsid w:val="521378FF"/>
     <w:multiLevelType w:val="multilevel"/>
     <w:tmpl w:val="7B002268"/>
@@ -11080,7 +12228,7 @@
       </w:rPr>
     </w:lvl>
   </w:abstractNum>
-  <w:abstractNum w:abstractNumId="75" w15:restartNumberingAfterBreak="0">
+  <w:abstractNum w:abstractNumId="78" w15:restartNumberingAfterBreak="0">
     <w:nsid w:val="521F2792"/>
     <w:multiLevelType w:val="multilevel"/>
     <w:tmpl w:val="9FB45386"/>
@@ -11229,7 +12377,7 @@
       </w:rPr>
     </w:lvl>
   </w:abstractNum>
-  <w:abstractNum w:abstractNumId="76" w15:restartNumberingAfterBreak="0">
+  <w:abstractNum w:abstractNumId="79" w15:restartNumberingAfterBreak="0">
     <w:nsid w:val="52A37FDE"/>
     <w:multiLevelType w:val="multilevel"/>
     <w:tmpl w:val="5D6EAA1A"/>
@@ -11378,7 +12526,7 @@
       </w:rPr>
     </w:lvl>
   </w:abstractNum>
-  <w:abstractNum w:abstractNumId="77" w15:restartNumberingAfterBreak="0">
+  <w:abstractNum w:abstractNumId="80" w15:restartNumberingAfterBreak="0">
     <w:nsid w:val="53390911"/>
     <w:multiLevelType w:val="multilevel"/>
     <w:tmpl w:val="1C380F12"/>
@@ -11527,7 +12675,7 @@
       </w:rPr>
     </w:lvl>
   </w:abstractNum>
-  <w:abstractNum w:abstractNumId="78" w15:restartNumberingAfterBreak="0">
+  <w:abstractNum w:abstractNumId="81" w15:restartNumberingAfterBreak="0">
     <w:nsid w:val="53CD23AC"/>
     <w:multiLevelType w:val="multilevel"/>
     <w:tmpl w:val="57BAE8F0"/>
@@ -11676,7 +12824,7 @@
       </w:rPr>
     </w:lvl>
   </w:abstractNum>
-  <w:abstractNum w:abstractNumId="79" w15:restartNumberingAfterBreak="0">
+  <w:abstractNum w:abstractNumId="82" w15:restartNumberingAfterBreak="0">
     <w:nsid w:val="5462791F"/>
     <w:multiLevelType w:val="hybridMultilevel"/>
     <w:tmpl w:val="FDE24C26"/>
@@ -11789,7 +12937,7 @@
       </w:rPr>
     </w:lvl>
   </w:abstractNum>
-  <w:abstractNum w:abstractNumId="80" w15:restartNumberingAfterBreak="0">
+  <w:abstractNum w:abstractNumId="83" w15:restartNumberingAfterBreak="0">
     <w:nsid w:val="547005EB"/>
     <w:multiLevelType w:val="multilevel"/>
     <w:tmpl w:val="F260CC5C"/>
@@ -11938,7 +13086,7 @@
       </w:rPr>
     </w:lvl>
   </w:abstractNum>
-  <w:abstractNum w:abstractNumId="81" w15:restartNumberingAfterBreak="0">
+  <w:abstractNum w:abstractNumId="84" w15:restartNumberingAfterBreak="0">
     <w:nsid w:val="58034221"/>
     <w:multiLevelType w:val="hybridMultilevel"/>
     <w:tmpl w:val="65D0619C"/>
@@ -12051,7 +13199,7 @@
       </w:rPr>
     </w:lvl>
   </w:abstractNum>
-  <w:abstractNum w:abstractNumId="82" w15:restartNumberingAfterBreak="0">
+  <w:abstractNum w:abstractNumId="85" w15:restartNumberingAfterBreak="0">
     <w:nsid w:val="588F256D"/>
     <w:multiLevelType w:val="multilevel"/>
     <w:tmpl w:val="E8F493CA"/>
@@ -12200,7 +13348,7 @@
       </w:rPr>
     </w:lvl>
   </w:abstractNum>
-  <w:abstractNum w:abstractNumId="83" w15:restartNumberingAfterBreak="0">
+  <w:abstractNum w:abstractNumId="86" w15:restartNumberingAfterBreak="0">
     <w:nsid w:val="5A460390"/>
     <w:multiLevelType w:val="hybridMultilevel"/>
     <w:tmpl w:val="BD8E939C"/>
@@ -12313,7 +13461,7 @@
       </w:rPr>
     </w:lvl>
   </w:abstractNum>
-  <w:abstractNum w:abstractNumId="84" w15:restartNumberingAfterBreak="0">
+  <w:abstractNum w:abstractNumId="87" w15:restartNumberingAfterBreak="0">
     <w:nsid w:val="5CEE630B"/>
     <w:multiLevelType w:val="hybridMultilevel"/>
     <w:tmpl w:val="DE8E8DBA"/>
@@ -12426,7 +13574,7 @@
       </w:rPr>
     </w:lvl>
   </w:abstractNum>
-  <w:abstractNum w:abstractNumId="85" w15:restartNumberingAfterBreak="0">
+  <w:abstractNum w:abstractNumId="88" w15:restartNumberingAfterBreak="0">
     <w:nsid w:val="5D5A183C"/>
     <w:multiLevelType w:val="multilevel"/>
     <w:tmpl w:val="C804C34A"/>
@@ -12575,7 +13723,7 @@
       </w:rPr>
     </w:lvl>
   </w:abstractNum>
-  <w:abstractNum w:abstractNumId="86" w15:restartNumberingAfterBreak="0">
+  <w:abstractNum w:abstractNumId="89" w15:restartNumberingAfterBreak="0">
     <w:nsid w:val="5DF95194"/>
     <w:multiLevelType w:val="multilevel"/>
     <w:tmpl w:val="CC127E54"/>
@@ -12724,7 +13872,7 @@
       </w:rPr>
     </w:lvl>
   </w:abstractNum>
-  <w:abstractNum w:abstractNumId="87" w15:restartNumberingAfterBreak="0">
+  <w:abstractNum w:abstractNumId="90" w15:restartNumberingAfterBreak="0">
     <w:nsid w:val="5E9C452C"/>
     <w:multiLevelType w:val="multilevel"/>
     <w:tmpl w:val="B8727936"/>
@@ -12873,7 +14021,7 @@
       </w:rPr>
     </w:lvl>
   </w:abstractNum>
-  <w:abstractNum w:abstractNumId="88" w15:restartNumberingAfterBreak="0">
+  <w:abstractNum w:abstractNumId="91" w15:restartNumberingAfterBreak="0">
     <w:nsid w:val="62385AA6"/>
     <w:multiLevelType w:val="multilevel"/>
     <w:tmpl w:val="B9EAECD4"/>
@@ -13022,7 +14170,7 @@
       </w:rPr>
     </w:lvl>
   </w:abstractNum>
-  <w:abstractNum w:abstractNumId="89" w15:restartNumberingAfterBreak="0">
+  <w:abstractNum w:abstractNumId="92" w15:restartNumberingAfterBreak="0">
     <w:nsid w:val="625D686D"/>
     <w:multiLevelType w:val="multilevel"/>
     <w:tmpl w:val="BC1C2048"/>
@@ -13171,7 +14319,7 @@
       </w:rPr>
     </w:lvl>
   </w:abstractNum>
-  <w:abstractNum w:abstractNumId="90" w15:restartNumberingAfterBreak="0">
+  <w:abstractNum w:abstractNumId="93" w15:restartNumberingAfterBreak="0">
     <w:nsid w:val="62B46951"/>
     <w:multiLevelType w:val="hybridMultilevel"/>
     <w:tmpl w:val="0FEAFEC6"/>
@@ -13284,7 +14432,7 @@
       </w:rPr>
     </w:lvl>
   </w:abstractNum>
-  <w:abstractNum w:abstractNumId="91" w15:restartNumberingAfterBreak="0">
+  <w:abstractNum w:abstractNumId="94" w15:restartNumberingAfterBreak="0">
     <w:nsid w:val="647819E3"/>
     <w:multiLevelType w:val="multilevel"/>
     <w:tmpl w:val="ABB278BC"/>
@@ -13433,7 +14581,7 @@
       </w:rPr>
     </w:lvl>
   </w:abstractNum>
-  <w:abstractNum w:abstractNumId="92" w15:restartNumberingAfterBreak="0">
+  <w:abstractNum w:abstractNumId="95" w15:restartNumberingAfterBreak="0">
     <w:nsid w:val="64F30198"/>
     <w:multiLevelType w:val="multilevel"/>
     <w:tmpl w:val="63F4E6F0"/>
@@ -13582,7 +14730,7 @@
       </w:rPr>
     </w:lvl>
   </w:abstractNum>
-  <w:abstractNum w:abstractNumId="93" w15:restartNumberingAfterBreak="0">
+  <w:abstractNum w:abstractNumId="96" w15:restartNumberingAfterBreak="0">
     <w:nsid w:val="65314293"/>
     <w:multiLevelType w:val="hybridMultilevel"/>
     <w:tmpl w:val="6688DFAC"/>
@@ -13695,7 +14843,7 @@
       </w:rPr>
     </w:lvl>
   </w:abstractNum>
-  <w:abstractNum w:abstractNumId="94" w15:restartNumberingAfterBreak="0">
+  <w:abstractNum w:abstractNumId="97" w15:restartNumberingAfterBreak="0">
     <w:nsid w:val="65CE4D0F"/>
     <w:multiLevelType w:val="hybridMultilevel"/>
     <w:tmpl w:val="DB668538"/>
@@ -13808,7 +14956,7 @@
       </w:rPr>
     </w:lvl>
   </w:abstractNum>
-  <w:abstractNum w:abstractNumId="95" w15:restartNumberingAfterBreak="0">
+  <w:abstractNum w:abstractNumId="98" w15:restartNumberingAfterBreak="0">
     <w:nsid w:val="661C7D73"/>
     <w:multiLevelType w:val="multilevel"/>
     <w:tmpl w:val="D9681266"/>
@@ -13957,7 +15105,7 @@
       </w:rPr>
     </w:lvl>
   </w:abstractNum>
-  <w:abstractNum w:abstractNumId="96" w15:restartNumberingAfterBreak="0">
+  <w:abstractNum w:abstractNumId="99" w15:restartNumberingAfterBreak="0">
     <w:nsid w:val="66E36FE0"/>
     <w:multiLevelType w:val="multilevel"/>
     <w:tmpl w:val="2AA67CDA"/>
@@ -14106,7 +15254,7 @@
       </w:rPr>
     </w:lvl>
   </w:abstractNum>
-  <w:abstractNum w:abstractNumId="97" w15:restartNumberingAfterBreak="0">
+  <w:abstractNum w:abstractNumId="100" w15:restartNumberingAfterBreak="0">
     <w:nsid w:val="671F5935"/>
     <w:multiLevelType w:val="multilevel"/>
     <w:tmpl w:val="1E86702A"/>
@@ -14255,7 +15403,7 @@
       </w:rPr>
     </w:lvl>
   </w:abstractNum>
-  <w:abstractNum w:abstractNumId="98" w15:restartNumberingAfterBreak="0">
+  <w:abstractNum w:abstractNumId="101" w15:restartNumberingAfterBreak="0">
     <w:nsid w:val="68B94344"/>
     <w:multiLevelType w:val="multilevel"/>
     <w:tmpl w:val="9BA812D8"/>
@@ -14404,7 +15552,7 @@
       </w:rPr>
     </w:lvl>
   </w:abstractNum>
-  <w:abstractNum w:abstractNumId="99" w15:restartNumberingAfterBreak="0">
+  <w:abstractNum w:abstractNumId="102" w15:restartNumberingAfterBreak="0">
     <w:nsid w:val="69DE2C87"/>
     <w:multiLevelType w:val="hybridMultilevel"/>
     <w:tmpl w:val="F530F20A"/>
@@ -14517,7 +15665,7 @@
       </w:rPr>
     </w:lvl>
   </w:abstractNum>
-  <w:abstractNum w:abstractNumId="100" w15:restartNumberingAfterBreak="0">
+  <w:abstractNum w:abstractNumId="103" w15:restartNumberingAfterBreak="0">
     <w:nsid w:val="69ED672D"/>
     <w:multiLevelType w:val="multilevel"/>
     <w:tmpl w:val="CC08E300"/>
@@ -14666,7 +15814,7 @@
       </w:rPr>
     </w:lvl>
   </w:abstractNum>
-  <w:abstractNum w:abstractNumId="101" w15:restartNumberingAfterBreak="0">
+  <w:abstractNum w:abstractNumId="104" w15:restartNumberingAfterBreak="0">
     <w:nsid w:val="6A063EFD"/>
     <w:multiLevelType w:val="hybridMultilevel"/>
     <w:tmpl w:val="48703FBA"/>
@@ -14779,7 +15927,7 @@
       </w:rPr>
     </w:lvl>
   </w:abstractNum>
-  <w:abstractNum w:abstractNumId="102" w15:restartNumberingAfterBreak="0">
+  <w:abstractNum w:abstractNumId="105" w15:restartNumberingAfterBreak="0">
     <w:nsid w:val="6A825ABE"/>
     <w:multiLevelType w:val="multilevel"/>
     <w:tmpl w:val="0CD6F30E"/>
@@ -14928,7 +16076,7 @@
       </w:rPr>
     </w:lvl>
   </w:abstractNum>
-  <w:abstractNum w:abstractNumId="103" w15:restartNumberingAfterBreak="0">
+  <w:abstractNum w:abstractNumId="106" w15:restartNumberingAfterBreak="0">
     <w:nsid w:val="6B1D7832"/>
     <w:multiLevelType w:val="multilevel"/>
     <w:tmpl w:val="DD4646B2"/>
@@ -15077,7 +16225,7 @@
       </w:rPr>
     </w:lvl>
   </w:abstractNum>
-  <w:abstractNum w:abstractNumId="104" w15:restartNumberingAfterBreak="0">
+  <w:abstractNum w:abstractNumId="107" w15:restartNumberingAfterBreak="0">
     <w:nsid w:val="6BC8366D"/>
     <w:multiLevelType w:val="multilevel"/>
     <w:tmpl w:val="7C10CE5C"/>
@@ -15226,7 +16374,7 @@
       </w:rPr>
     </w:lvl>
   </w:abstractNum>
-  <w:abstractNum w:abstractNumId="105" w15:restartNumberingAfterBreak="0">
+  <w:abstractNum w:abstractNumId="108" w15:restartNumberingAfterBreak="0">
     <w:nsid w:val="6C6D6667"/>
     <w:multiLevelType w:val="hybridMultilevel"/>
     <w:tmpl w:val="A744709C"/>
@@ -15339,7 +16487,7 @@
       </w:rPr>
     </w:lvl>
   </w:abstractNum>
-  <w:abstractNum w:abstractNumId="106" w15:restartNumberingAfterBreak="0">
+  <w:abstractNum w:abstractNumId="109" w15:restartNumberingAfterBreak="0">
     <w:nsid w:val="6CAD7EA5"/>
     <w:multiLevelType w:val="multilevel"/>
     <w:tmpl w:val="C472C5B0"/>
@@ -15488,7 +16636,7 @@
       </w:rPr>
     </w:lvl>
   </w:abstractNum>
-  <w:abstractNum w:abstractNumId="107" w15:restartNumberingAfterBreak="0">
+  <w:abstractNum w:abstractNumId="110" w15:restartNumberingAfterBreak="0">
     <w:nsid w:val="6D7A28DE"/>
     <w:multiLevelType w:val="hybridMultilevel"/>
     <w:tmpl w:val="1B5875AA"/>
@@ -15601,7 +16749,7 @@
       </w:rPr>
     </w:lvl>
   </w:abstractNum>
-  <w:abstractNum w:abstractNumId="108" w15:restartNumberingAfterBreak="0">
+  <w:abstractNum w:abstractNumId="111" w15:restartNumberingAfterBreak="0">
     <w:nsid w:val="6E2C576F"/>
     <w:multiLevelType w:val="hybridMultilevel"/>
     <w:tmpl w:val="251C1C42"/>
@@ -15714,7 +16862,7 @@
       </w:rPr>
     </w:lvl>
   </w:abstractNum>
-  <w:abstractNum w:abstractNumId="109" w15:restartNumberingAfterBreak="0">
+  <w:abstractNum w:abstractNumId="112" w15:restartNumberingAfterBreak="0">
     <w:nsid w:val="6E43557B"/>
     <w:multiLevelType w:val="multilevel"/>
     <w:tmpl w:val="323C7112"/>
@@ -15863,7 +17011,7 @@
       </w:rPr>
     </w:lvl>
   </w:abstractNum>
-  <w:abstractNum w:abstractNumId="110" w15:restartNumberingAfterBreak="0">
+  <w:abstractNum w:abstractNumId="113" w15:restartNumberingAfterBreak="0">
     <w:nsid w:val="6EA27D0A"/>
     <w:multiLevelType w:val="multilevel"/>
     <w:tmpl w:val="7BF0256C"/>
@@ -16012,7 +17160,7 @@
       </w:rPr>
     </w:lvl>
   </w:abstractNum>
-  <w:abstractNum w:abstractNumId="111" w15:restartNumberingAfterBreak="0">
+  <w:abstractNum w:abstractNumId="114" w15:restartNumberingAfterBreak="0">
     <w:nsid w:val="6EF86273"/>
     <w:multiLevelType w:val="multilevel"/>
     <w:tmpl w:val="2AA67CDA"/>
@@ -16161,7 +17309,7 @@
       </w:rPr>
     </w:lvl>
   </w:abstractNum>
-  <w:abstractNum w:abstractNumId="112" w15:restartNumberingAfterBreak="0">
+  <w:abstractNum w:abstractNumId="115" w15:restartNumberingAfterBreak="0">
     <w:nsid w:val="70874300"/>
     <w:multiLevelType w:val="hybridMultilevel"/>
     <w:tmpl w:val="1B3A0518"/>
@@ -16274,7 +17422,7 @@
       </w:rPr>
     </w:lvl>
   </w:abstractNum>
-  <w:abstractNum w:abstractNumId="113" w15:restartNumberingAfterBreak="0">
+  <w:abstractNum w:abstractNumId="116" w15:restartNumberingAfterBreak="0">
     <w:nsid w:val="7090251B"/>
     <w:multiLevelType w:val="hybridMultilevel"/>
     <w:tmpl w:val="67687EFE"/>
@@ -16387,7 +17535,7 @@
       </w:rPr>
     </w:lvl>
   </w:abstractNum>
-  <w:abstractNum w:abstractNumId="114" w15:restartNumberingAfterBreak="0">
+  <w:abstractNum w:abstractNumId="117" w15:restartNumberingAfterBreak="0">
     <w:nsid w:val="72031F81"/>
     <w:multiLevelType w:val="multilevel"/>
     <w:tmpl w:val="84400090"/>
@@ -16536,7 +17684,7 @@
       </w:rPr>
     </w:lvl>
   </w:abstractNum>
-  <w:abstractNum w:abstractNumId="115" w15:restartNumberingAfterBreak="0">
+  <w:abstractNum w:abstractNumId="118" w15:restartNumberingAfterBreak="0">
     <w:nsid w:val="722301E0"/>
     <w:multiLevelType w:val="multilevel"/>
     <w:tmpl w:val="1EE82E5A"/>
@@ -16685,7 +17833,7 @@
       </w:rPr>
     </w:lvl>
   </w:abstractNum>
-  <w:abstractNum w:abstractNumId="116" w15:restartNumberingAfterBreak="0">
+  <w:abstractNum w:abstractNumId="119" w15:restartNumberingAfterBreak="0">
     <w:nsid w:val="74B80775"/>
     <w:multiLevelType w:val="hybridMultilevel"/>
     <w:tmpl w:val="D3C275CE"/>
@@ -16774,7 +17922,7 @@
       </w:pPr>
     </w:lvl>
   </w:abstractNum>
-  <w:abstractNum w:abstractNumId="117" w15:restartNumberingAfterBreak="0">
+  <w:abstractNum w:abstractNumId="120" w15:restartNumberingAfterBreak="0">
     <w:nsid w:val="75144C65"/>
     <w:multiLevelType w:val="hybridMultilevel"/>
     <w:tmpl w:val="12127FAA"/>
@@ -16887,7 +18035,7 @@
       </w:rPr>
     </w:lvl>
   </w:abstractNum>
-  <w:abstractNum w:abstractNumId="118" w15:restartNumberingAfterBreak="0">
+  <w:abstractNum w:abstractNumId="121" w15:restartNumberingAfterBreak="0">
     <w:nsid w:val="75237F84"/>
     <w:multiLevelType w:val="hybridMultilevel"/>
     <w:tmpl w:val="5F0A6EF2"/>
@@ -17000,7 +18148,7 @@
       </w:rPr>
     </w:lvl>
   </w:abstractNum>
-  <w:abstractNum w:abstractNumId="119" w15:restartNumberingAfterBreak="0">
+  <w:abstractNum w:abstractNumId="122" w15:restartNumberingAfterBreak="0">
     <w:nsid w:val="75FF09B0"/>
     <w:multiLevelType w:val="multilevel"/>
     <w:tmpl w:val="C34A7734"/>
@@ -17149,7 +18297,7 @@
       </w:rPr>
     </w:lvl>
   </w:abstractNum>
-  <w:abstractNum w:abstractNumId="120" w15:restartNumberingAfterBreak="0">
+  <w:abstractNum w:abstractNumId="123" w15:restartNumberingAfterBreak="0">
     <w:nsid w:val="77960362"/>
     <w:multiLevelType w:val="multilevel"/>
     <w:tmpl w:val="FEA0022E"/>
@@ -17298,7 +18446,7 @@
       </w:rPr>
     </w:lvl>
   </w:abstractNum>
-  <w:abstractNum w:abstractNumId="121" w15:restartNumberingAfterBreak="0">
+  <w:abstractNum w:abstractNumId="124" w15:restartNumberingAfterBreak="0">
     <w:nsid w:val="785A644F"/>
     <w:multiLevelType w:val="multilevel"/>
     <w:tmpl w:val="D1DC60FE"/>
@@ -17447,7 +18595,7 @@
       </w:rPr>
     </w:lvl>
   </w:abstractNum>
-  <w:abstractNum w:abstractNumId="122" w15:restartNumberingAfterBreak="0">
+  <w:abstractNum w:abstractNumId="125" w15:restartNumberingAfterBreak="0">
     <w:nsid w:val="78B62297"/>
     <w:multiLevelType w:val="multilevel"/>
     <w:tmpl w:val="2AA67CDA"/>
@@ -17596,7 +18744,7 @@
       </w:rPr>
     </w:lvl>
   </w:abstractNum>
-  <w:abstractNum w:abstractNumId="123" w15:restartNumberingAfterBreak="0">
+  <w:abstractNum w:abstractNumId="126" w15:restartNumberingAfterBreak="0">
     <w:nsid w:val="7BFA03DF"/>
     <w:multiLevelType w:val="hybridMultilevel"/>
     <w:tmpl w:val="536A979E"/>
@@ -17709,7 +18857,7 @@
       </w:rPr>
     </w:lvl>
   </w:abstractNum>
-  <w:abstractNum w:abstractNumId="124" w15:restartNumberingAfterBreak="0">
+  <w:abstractNum w:abstractNumId="127" w15:restartNumberingAfterBreak="0">
     <w:nsid w:val="7CA524B4"/>
     <w:multiLevelType w:val="hybridMultilevel"/>
     <w:tmpl w:val="957C4F4A"/>
@@ -17822,7 +18970,7 @@
       </w:rPr>
     </w:lvl>
   </w:abstractNum>
-  <w:abstractNum w:abstractNumId="125" w15:restartNumberingAfterBreak="0">
+  <w:abstractNum w:abstractNumId="128" w15:restartNumberingAfterBreak="0">
     <w:nsid w:val="7E1C597E"/>
     <w:multiLevelType w:val="multilevel"/>
     <w:tmpl w:val="2AA67CDA"/>
@@ -17971,7 +19119,7 @@
       </w:rPr>
     </w:lvl>
   </w:abstractNum>
-  <w:abstractNum w:abstractNumId="126" w15:restartNumberingAfterBreak="0">
+  <w:abstractNum w:abstractNumId="129" w15:restartNumberingAfterBreak="0">
     <w:nsid w:val="7EBD7710"/>
     <w:multiLevelType w:val="hybridMultilevel"/>
     <w:tmpl w:val="C8C6F7A0"/>
@@ -18085,106 +19233,106 @@
     </w:lvl>
   </w:abstractNum>
   <w:num w:numId="1" w16cid:durableId="425157302">
-    <w:abstractNumId w:val="47"/>
+    <w:abstractNumId w:val="49"/>
   </w:num>
   <w:num w:numId="2" w16cid:durableId="967664612">
-    <w:abstractNumId w:val="92"/>
+    <w:abstractNumId w:val="95"/>
   </w:num>
   <w:num w:numId="3" w16cid:durableId="361631616">
-    <w:abstractNumId w:val="65"/>
+    <w:abstractNumId w:val="68"/>
   </w:num>
   <w:num w:numId="4" w16cid:durableId="1409575397">
-    <w:abstractNumId w:val="79"/>
+    <w:abstractNumId w:val="82"/>
   </w:num>
   <w:num w:numId="5" w16cid:durableId="1647204897">
-    <w:abstractNumId w:val="124"/>
+    <w:abstractNumId w:val="127"/>
   </w:num>
   <w:num w:numId="6" w16cid:durableId="682589869">
-    <w:abstractNumId w:val="20"/>
+    <w:abstractNumId w:val="22"/>
   </w:num>
   <w:num w:numId="7" w16cid:durableId="679703478">
-    <w:abstractNumId w:val="99"/>
+    <w:abstractNumId w:val="102"/>
   </w:num>
   <w:num w:numId="8" w16cid:durableId="496455128">
-    <w:abstractNumId w:val="41"/>
+    <w:abstractNumId w:val="43"/>
   </w:num>
   <w:num w:numId="9" w16cid:durableId="1184633094">
-    <w:abstractNumId w:val="57"/>
+    <w:abstractNumId w:val="59"/>
   </w:num>
   <w:num w:numId="10" w16cid:durableId="71507387">
-    <w:abstractNumId w:val="63"/>
+    <w:abstractNumId w:val="66"/>
   </w:num>
   <w:num w:numId="11" w16cid:durableId="1412503779">
-    <w:abstractNumId w:val="101"/>
+    <w:abstractNumId w:val="104"/>
   </w:num>
   <w:num w:numId="12" w16cid:durableId="1107113995">
-    <w:abstractNumId w:val="42"/>
+    <w:abstractNumId w:val="44"/>
   </w:num>
   <w:num w:numId="13" w16cid:durableId="2011055922">
-    <w:abstractNumId w:val="21"/>
+    <w:abstractNumId w:val="23"/>
   </w:num>
   <w:num w:numId="14" w16cid:durableId="1529222885">
-    <w:abstractNumId w:val="123"/>
+    <w:abstractNumId w:val="126"/>
   </w:num>
   <w:num w:numId="15" w16cid:durableId="836580755">
-    <w:abstractNumId w:val="14"/>
+    <w:abstractNumId w:val="16"/>
   </w:num>
   <w:num w:numId="16" w16cid:durableId="1344674502">
-    <w:abstractNumId w:val="83"/>
+    <w:abstractNumId w:val="86"/>
   </w:num>
   <w:num w:numId="17" w16cid:durableId="1320882603">
-    <w:abstractNumId w:val="112"/>
+    <w:abstractNumId w:val="115"/>
   </w:num>
   <w:num w:numId="18" w16cid:durableId="1139028372">
-    <w:abstractNumId w:val="43"/>
+    <w:abstractNumId w:val="45"/>
   </w:num>
   <w:num w:numId="19" w16cid:durableId="1525635473">
-    <w:abstractNumId w:val="90"/>
+    <w:abstractNumId w:val="93"/>
   </w:num>
   <w:num w:numId="20" w16cid:durableId="609623515">
-    <w:abstractNumId w:val="126"/>
+    <w:abstractNumId w:val="129"/>
   </w:num>
   <w:num w:numId="21" w16cid:durableId="165170997">
-    <w:abstractNumId w:val="105"/>
+    <w:abstractNumId w:val="108"/>
   </w:num>
   <w:num w:numId="22" w16cid:durableId="1620525290">
-    <w:abstractNumId w:val="28"/>
+    <w:abstractNumId w:val="30"/>
   </w:num>
   <w:num w:numId="23" w16cid:durableId="400753109">
-    <w:abstractNumId w:val="117"/>
+    <w:abstractNumId w:val="120"/>
   </w:num>
   <w:num w:numId="24" w16cid:durableId="193882219">
     <w:abstractNumId w:val="4"/>
   </w:num>
   <w:num w:numId="25" w16cid:durableId="311981628">
-    <w:abstractNumId w:val="49"/>
+    <w:abstractNumId w:val="51"/>
   </w:num>
   <w:num w:numId="26" w16cid:durableId="2009166045">
-    <w:abstractNumId w:val="13"/>
+    <w:abstractNumId w:val="15"/>
   </w:num>
   <w:num w:numId="27" w16cid:durableId="2135174697">
-    <w:abstractNumId w:val="19"/>
+    <w:abstractNumId w:val="21"/>
   </w:num>
   <w:num w:numId="28" w16cid:durableId="353504740">
-    <w:abstractNumId w:val="15"/>
+    <w:abstractNumId w:val="17"/>
   </w:num>
   <w:num w:numId="29" w16cid:durableId="2124693280">
-    <w:abstractNumId w:val="94"/>
+    <w:abstractNumId w:val="97"/>
   </w:num>
   <w:num w:numId="30" w16cid:durableId="1367099744">
-    <w:abstractNumId w:val="33"/>
+    <w:abstractNumId w:val="35"/>
   </w:num>
   <w:num w:numId="31" w16cid:durableId="2011105642">
-    <w:abstractNumId w:val="84"/>
+    <w:abstractNumId w:val="87"/>
   </w:num>
   <w:num w:numId="32" w16cid:durableId="831995364">
-    <w:abstractNumId w:val="25"/>
+    <w:abstractNumId w:val="27"/>
   </w:num>
   <w:num w:numId="33" w16cid:durableId="851073403">
     <w:abstractNumId w:val="3"/>
   </w:num>
   <w:num w:numId="34" w16cid:durableId="1183666391">
-    <w:abstractNumId w:val="24"/>
+    <w:abstractNumId w:val="26"/>
   </w:num>
   <w:num w:numId="35" w16cid:durableId="697268929">
     <w:abstractNumId w:val="1"/>
@@ -18193,277 +19341,286 @@
     <w:abstractNumId w:val="2"/>
   </w:num>
   <w:num w:numId="37" w16cid:durableId="1849755457">
-    <w:abstractNumId w:val="118"/>
+    <w:abstractNumId w:val="121"/>
   </w:num>
   <w:num w:numId="38" w16cid:durableId="516505904">
-    <w:abstractNumId w:val="12"/>
+    <w:abstractNumId w:val="14"/>
   </w:num>
   <w:num w:numId="39" w16cid:durableId="906300072">
-    <w:abstractNumId w:val="16"/>
+    <w:abstractNumId w:val="18"/>
   </w:num>
   <w:num w:numId="40" w16cid:durableId="905338697">
-    <w:abstractNumId w:val="67"/>
+    <w:abstractNumId w:val="70"/>
   </w:num>
   <w:num w:numId="41" w16cid:durableId="501896635">
-    <w:abstractNumId w:val="45"/>
+    <w:abstractNumId w:val="47"/>
   </w:num>
   <w:num w:numId="42" w16cid:durableId="1953435156">
-    <w:abstractNumId w:val="68"/>
+    <w:abstractNumId w:val="71"/>
   </w:num>
   <w:num w:numId="43" w16cid:durableId="1060447452">
-    <w:abstractNumId w:val="81"/>
+    <w:abstractNumId w:val="84"/>
   </w:num>
   <w:num w:numId="44" w16cid:durableId="1772503672">
-    <w:abstractNumId w:val="60"/>
+    <w:abstractNumId w:val="62"/>
   </w:num>
   <w:num w:numId="45" w16cid:durableId="1650330222">
-    <w:abstractNumId w:val="66"/>
+    <w:abstractNumId w:val="69"/>
   </w:num>
   <w:num w:numId="46" w16cid:durableId="2102337934">
-    <w:abstractNumId w:val="27"/>
+    <w:abstractNumId w:val="29"/>
   </w:num>
   <w:num w:numId="47" w16cid:durableId="68767822">
-    <w:abstractNumId w:val="102"/>
+    <w:abstractNumId w:val="105"/>
   </w:num>
   <w:num w:numId="48" w16cid:durableId="1992058265">
     <w:abstractNumId w:val="5"/>
   </w:num>
   <w:num w:numId="49" w16cid:durableId="788475134">
-    <w:abstractNumId w:val="121"/>
+    <w:abstractNumId w:val="124"/>
   </w:num>
   <w:num w:numId="50" w16cid:durableId="224419455">
-    <w:abstractNumId w:val="110"/>
+    <w:abstractNumId w:val="113"/>
   </w:num>
   <w:num w:numId="51" w16cid:durableId="1699575947">
-    <w:abstractNumId w:val="89"/>
+    <w:abstractNumId w:val="92"/>
   </w:num>
   <w:num w:numId="52" w16cid:durableId="1048916239">
-    <w:abstractNumId w:val="53"/>
+    <w:abstractNumId w:val="55"/>
   </w:num>
   <w:num w:numId="53" w16cid:durableId="1188711211">
-    <w:abstractNumId w:val="119"/>
+    <w:abstractNumId w:val="122"/>
   </w:num>
   <w:num w:numId="54" w16cid:durableId="447555614">
+    <w:abstractNumId w:val="94"/>
+  </w:num>
+  <w:num w:numId="55" w16cid:durableId="1679307268">
+    <w:abstractNumId w:val="52"/>
+  </w:num>
+  <w:num w:numId="56" w16cid:durableId="693773591">
+    <w:abstractNumId w:val="112"/>
+  </w:num>
+  <w:num w:numId="57" w16cid:durableId="1110473324">
+    <w:abstractNumId w:val="37"/>
+  </w:num>
+  <w:num w:numId="58" w16cid:durableId="842937968">
+    <w:abstractNumId w:val="67"/>
+  </w:num>
+  <w:num w:numId="59" w16cid:durableId="821121315">
+    <w:abstractNumId w:val="42"/>
+  </w:num>
+  <w:num w:numId="60" w16cid:durableId="2095394549">
+    <w:abstractNumId w:val="123"/>
+  </w:num>
+  <w:num w:numId="61" w16cid:durableId="1299921011">
+    <w:abstractNumId w:val="41"/>
+  </w:num>
+  <w:num w:numId="62" w16cid:durableId="1927420240">
+    <w:abstractNumId w:val="76"/>
+  </w:num>
+  <w:num w:numId="63" w16cid:durableId="41290043">
+    <w:abstractNumId w:val="81"/>
+  </w:num>
+  <w:num w:numId="64" w16cid:durableId="999846909">
+    <w:abstractNumId w:val="64"/>
+  </w:num>
+  <w:num w:numId="65" w16cid:durableId="1250969563">
+    <w:abstractNumId w:val="74"/>
+  </w:num>
+  <w:num w:numId="66" w16cid:durableId="484011382">
+    <w:abstractNumId w:val="103"/>
+  </w:num>
+  <w:num w:numId="67" w16cid:durableId="2008289242">
+    <w:abstractNumId w:val="12"/>
+  </w:num>
+  <w:num w:numId="68" w16cid:durableId="1041637222">
+    <w:abstractNumId w:val="19"/>
+  </w:num>
+  <w:num w:numId="69" w16cid:durableId="1296839887">
+    <w:abstractNumId w:val="80"/>
+  </w:num>
+  <w:num w:numId="70" w16cid:durableId="336662050">
     <w:abstractNumId w:val="91"/>
   </w:num>
-  <w:num w:numId="55" w16cid:durableId="1679307268">
-    <w:abstractNumId w:val="50"/>
-  </w:num>
-  <w:num w:numId="56" w16cid:durableId="693773591">
+  <w:num w:numId="71" w16cid:durableId="1460032333">
     <w:abstractNumId w:val="109"/>
   </w:num>
-  <w:num w:numId="57" w16cid:durableId="1110473324">
-    <w:abstractNumId w:val="35"/>
-  </w:num>
-  <w:num w:numId="58" w16cid:durableId="842937968">
-    <w:abstractNumId w:val="64"/>
-  </w:num>
-  <w:num w:numId="59" w16cid:durableId="821121315">
-    <w:abstractNumId w:val="40"/>
-  </w:num>
-  <w:num w:numId="60" w16cid:durableId="2095394549">
-    <w:abstractNumId w:val="120"/>
-  </w:num>
-  <w:num w:numId="61" w16cid:durableId="1299921011">
-    <w:abstractNumId w:val="39"/>
-  </w:num>
-  <w:num w:numId="62" w16cid:durableId="1927420240">
-    <w:abstractNumId w:val="73"/>
-  </w:num>
-  <w:num w:numId="63" w16cid:durableId="41290043">
-    <w:abstractNumId w:val="78"/>
-  </w:num>
-  <w:num w:numId="64" w16cid:durableId="999846909">
-    <w:abstractNumId w:val="61"/>
-  </w:num>
-  <w:num w:numId="65" w16cid:durableId="1250969563">
-    <w:abstractNumId w:val="71"/>
-  </w:num>
-  <w:num w:numId="66" w16cid:durableId="484011382">
-    <w:abstractNumId w:val="100"/>
-  </w:num>
-  <w:num w:numId="67" w16cid:durableId="2008289242">
-    <w:abstractNumId w:val="10"/>
-  </w:num>
-  <w:num w:numId="68" w16cid:durableId="1041637222">
-    <w:abstractNumId w:val="17"/>
-  </w:num>
-  <w:num w:numId="69" w16cid:durableId="1296839887">
-    <w:abstractNumId w:val="77"/>
-  </w:num>
-  <w:num w:numId="70" w16cid:durableId="336662050">
-    <w:abstractNumId w:val="88"/>
-  </w:num>
-  <w:num w:numId="71" w16cid:durableId="1460032333">
-    <w:abstractNumId w:val="106"/>
-  </w:num>
   <w:num w:numId="72" w16cid:durableId="592400615">
-    <w:abstractNumId w:val="7"/>
+    <w:abstractNumId w:val="8"/>
   </w:num>
   <w:num w:numId="73" w16cid:durableId="1879049234">
+    <w:abstractNumId w:val="34"/>
+  </w:num>
+  <w:num w:numId="74" w16cid:durableId="1747679558">
+    <w:abstractNumId w:val="38"/>
+  </w:num>
+  <w:num w:numId="75" w16cid:durableId="55278029">
+    <w:abstractNumId w:val="31"/>
+  </w:num>
+  <w:num w:numId="76" w16cid:durableId="1032193382">
     <w:abstractNumId w:val="32"/>
   </w:num>
-  <w:num w:numId="74" w16cid:durableId="1747679558">
-    <w:abstractNumId w:val="36"/>
-  </w:num>
-  <w:num w:numId="75" w16cid:durableId="55278029">
-    <w:abstractNumId w:val="29"/>
-  </w:num>
-  <w:num w:numId="76" w16cid:durableId="1032193382">
-    <w:abstractNumId w:val="30"/>
-  </w:num>
   <w:num w:numId="77" w16cid:durableId="763109604">
-    <w:abstractNumId w:val="80"/>
+    <w:abstractNumId w:val="83"/>
   </w:num>
   <w:num w:numId="78" w16cid:durableId="2138137265">
-    <w:abstractNumId w:val="93"/>
+    <w:abstractNumId w:val="96"/>
   </w:num>
   <w:num w:numId="79" w16cid:durableId="343675924">
-    <w:abstractNumId w:val="113"/>
+    <w:abstractNumId w:val="116"/>
   </w:num>
   <w:num w:numId="80" w16cid:durableId="1823277442">
-    <w:abstractNumId w:val="38"/>
+    <w:abstractNumId w:val="40"/>
   </w:num>
   <w:num w:numId="81" w16cid:durableId="1686900155">
     <w:abstractNumId w:val="0"/>
   </w:num>
   <w:num w:numId="82" w16cid:durableId="1113326280">
+    <w:abstractNumId w:val="78"/>
+  </w:num>
+  <w:num w:numId="83" w16cid:durableId="1253051103">
+    <w:abstractNumId w:val="106"/>
+  </w:num>
+  <w:num w:numId="84" w16cid:durableId="444888444">
+    <w:abstractNumId w:val="48"/>
+  </w:num>
+  <w:num w:numId="85" w16cid:durableId="64299649">
+    <w:abstractNumId w:val="98"/>
+  </w:num>
+  <w:num w:numId="86" w16cid:durableId="868182992">
+    <w:abstractNumId w:val="61"/>
+  </w:num>
+  <w:num w:numId="87" w16cid:durableId="896863331">
+    <w:abstractNumId w:val="24"/>
+  </w:num>
+  <w:num w:numId="88" w16cid:durableId="505442826">
+    <w:abstractNumId w:val="101"/>
+  </w:num>
+  <w:num w:numId="89" w16cid:durableId="1858763908">
+    <w:abstractNumId w:val="36"/>
+  </w:num>
+  <w:num w:numId="90" w16cid:durableId="1896088176">
+    <w:abstractNumId w:val="13"/>
+  </w:num>
+  <w:num w:numId="91" w16cid:durableId="1284576603">
+    <w:abstractNumId w:val="88"/>
+  </w:num>
+  <w:num w:numId="92" w16cid:durableId="1963075542">
+    <w:abstractNumId w:val="7"/>
+  </w:num>
+  <w:num w:numId="93" w16cid:durableId="787627596">
+    <w:abstractNumId w:val="77"/>
+  </w:num>
+  <w:num w:numId="94" w16cid:durableId="2003925799">
+    <w:abstractNumId w:val="10"/>
+  </w:num>
+  <w:num w:numId="95" w16cid:durableId="1169102579">
+    <w:abstractNumId w:val="90"/>
+  </w:num>
+  <w:num w:numId="96" w16cid:durableId="1216501564">
+    <w:abstractNumId w:val="33"/>
+  </w:num>
+  <w:num w:numId="97" w16cid:durableId="261768216">
+    <w:abstractNumId w:val="114"/>
+  </w:num>
+  <w:num w:numId="98" w16cid:durableId="2141918721">
+    <w:abstractNumId w:val="72"/>
+  </w:num>
+  <w:num w:numId="99" w16cid:durableId="905841544">
+    <w:abstractNumId w:val="39"/>
+  </w:num>
+  <w:num w:numId="100" w16cid:durableId="1753887223">
+    <w:abstractNumId w:val="89"/>
+  </w:num>
+  <w:num w:numId="101" w16cid:durableId="1320184766">
+    <w:abstractNumId w:val="28"/>
+  </w:num>
+  <w:num w:numId="102" w16cid:durableId="465127606">
+    <w:abstractNumId w:val="56"/>
+  </w:num>
+  <w:num w:numId="103" w16cid:durableId="1640451435">
+    <w:abstractNumId w:val="54"/>
+  </w:num>
+  <w:num w:numId="104" w16cid:durableId="942029608">
+    <w:abstractNumId w:val="50"/>
+  </w:num>
+  <w:num w:numId="105" w16cid:durableId="70857193">
+    <w:abstractNumId w:val="58"/>
+  </w:num>
+  <w:num w:numId="106" w16cid:durableId="1617908629">
+    <w:abstractNumId w:val="118"/>
+  </w:num>
+  <w:num w:numId="107" w16cid:durableId="970137111">
+    <w:abstractNumId w:val="128"/>
+  </w:num>
+  <w:num w:numId="108" w16cid:durableId="383797013">
+    <w:abstractNumId w:val="46"/>
+  </w:num>
+  <w:num w:numId="109" w16cid:durableId="1459567304">
+    <w:abstractNumId w:val="57"/>
+  </w:num>
+  <w:num w:numId="110" w16cid:durableId="862745862">
+    <w:abstractNumId w:val="20"/>
+  </w:num>
+  <w:num w:numId="111" w16cid:durableId="1859536331">
+    <w:abstractNumId w:val="60"/>
+  </w:num>
+  <w:num w:numId="112" w16cid:durableId="2092697678">
     <w:abstractNumId w:val="75"/>
   </w:num>
-  <w:num w:numId="83" w16cid:durableId="1253051103">
-    <w:abstractNumId w:val="103"/>
+  <w:num w:numId="113" w16cid:durableId="1418403813">
+    <w:abstractNumId w:val="65"/>
   </w:num>
-  <w:num w:numId="84" w16cid:durableId="444888444">
-    <w:abstractNumId w:val="46"/>
+  <w:num w:numId="114" w16cid:durableId="1965042317">
+    <w:abstractNumId w:val="117"/>
   </w:num>
-  <w:num w:numId="85" w16cid:durableId="64299649">
-    <w:abstractNumId w:val="95"/>
+  <w:num w:numId="115" w16cid:durableId="670569040">
+    <w:abstractNumId w:val="53"/>
   </w:num>
-  <w:num w:numId="86" w16cid:durableId="868182992">
-    <w:abstractNumId w:val="59"/>
+  <w:num w:numId="116" w16cid:durableId="413823113">
+    <w:abstractNumId w:val="125"/>
   </w:num>
-  <w:num w:numId="87" w16cid:durableId="896863331">
-    <w:abstractNumId w:val="22"/>
+  <w:num w:numId="117" w16cid:durableId="1293747982">
+    <w:abstractNumId w:val="99"/>
   </w:num>
-  <w:num w:numId="88" w16cid:durableId="505442826">
-    <w:abstractNumId w:val="98"/>
+  <w:num w:numId="118" w16cid:durableId="1016734110">
+    <w:abstractNumId w:val="73"/>
   </w:num>
-  <w:num w:numId="89" w16cid:durableId="1858763908">
-    <w:abstractNumId w:val="34"/>
+  <w:num w:numId="119" w16cid:durableId="583337306">
+    <w:abstractNumId w:val="119"/>
   </w:num>
-  <w:num w:numId="90" w16cid:durableId="1896088176">
+  <w:num w:numId="120" w16cid:durableId="721096429">
+    <w:abstractNumId w:val="100"/>
+  </w:num>
+  <w:num w:numId="121" w16cid:durableId="299461688">
+    <w:abstractNumId w:val="79"/>
+  </w:num>
+  <w:num w:numId="122" w16cid:durableId="703558456">
     <w:abstractNumId w:val="11"/>
   </w:num>
-  <w:num w:numId="91" w16cid:durableId="1284576603">
+  <w:num w:numId="123" w16cid:durableId="964241540">
+    <w:abstractNumId w:val="25"/>
+  </w:num>
+  <w:num w:numId="124" w16cid:durableId="603391478">
     <w:abstractNumId w:val="85"/>
   </w:num>
-  <w:num w:numId="92" w16cid:durableId="1963075542">
+  <w:num w:numId="125" w16cid:durableId="560529547">
+    <w:abstractNumId w:val="107"/>
+  </w:num>
+  <w:num w:numId="126" w16cid:durableId="1488327713">
+    <w:abstractNumId w:val="110"/>
+  </w:num>
+  <w:num w:numId="127" w16cid:durableId="1327660713">
+    <w:abstractNumId w:val="111"/>
+  </w:num>
+  <w:num w:numId="128" w16cid:durableId="2095084062">
     <w:abstractNumId w:val="6"/>
   </w:num>
-  <w:num w:numId="93" w16cid:durableId="787627596">
-    <w:abstractNumId w:val="74"/>
+  <w:num w:numId="129" w16cid:durableId="603266177">
+    <w:abstractNumId w:val="63"/>
   </w:num>
-  <w:num w:numId="94" w16cid:durableId="2003925799">
-    <w:abstractNumId w:val="8"/>
-  </w:num>
-  <w:num w:numId="95" w16cid:durableId="1169102579">
-    <w:abstractNumId w:val="87"/>
-  </w:num>
-  <w:num w:numId="96" w16cid:durableId="1216501564">
-    <w:abstractNumId w:val="31"/>
-  </w:num>
-  <w:num w:numId="97" w16cid:durableId="261768216">
-    <w:abstractNumId w:val="111"/>
-  </w:num>
-  <w:num w:numId="98" w16cid:durableId="2141918721">
-    <w:abstractNumId w:val="69"/>
-  </w:num>
-  <w:num w:numId="99" w16cid:durableId="905841544">
-    <w:abstractNumId w:val="37"/>
-  </w:num>
-  <w:num w:numId="100" w16cid:durableId="1753887223">
-    <w:abstractNumId w:val="86"/>
-  </w:num>
-  <w:num w:numId="101" w16cid:durableId="1320184766">
-    <w:abstractNumId w:val="26"/>
-  </w:num>
-  <w:num w:numId="102" w16cid:durableId="465127606">
-    <w:abstractNumId w:val="54"/>
-  </w:num>
-  <w:num w:numId="103" w16cid:durableId="1640451435">
-    <w:abstractNumId w:val="52"/>
-  </w:num>
-  <w:num w:numId="104" w16cid:durableId="942029608">
-    <w:abstractNumId w:val="48"/>
-  </w:num>
-  <w:num w:numId="105" w16cid:durableId="70857193">
-    <w:abstractNumId w:val="56"/>
-  </w:num>
-  <w:num w:numId="106" w16cid:durableId="1617908629">
-    <w:abstractNumId w:val="115"/>
-  </w:num>
-  <w:num w:numId="107" w16cid:durableId="970137111">
-    <w:abstractNumId w:val="125"/>
-  </w:num>
-  <w:num w:numId="108" w16cid:durableId="383797013">
-    <w:abstractNumId w:val="44"/>
-  </w:num>
-  <w:num w:numId="109" w16cid:durableId="1459567304">
-    <w:abstractNumId w:val="55"/>
-  </w:num>
-  <w:num w:numId="110" w16cid:durableId="862745862">
-    <w:abstractNumId w:val="18"/>
-  </w:num>
-  <w:num w:numId="111" w16cid:durableId="1859536331">
-    <w:abstractNumId w:val="58"/>
-  </w:num>
-  <w:num w:numId="112" w16cid:durableId="2092697678">
-    <w:abstractNumId w:val="72"/>
-  </w:num>
-  <w:num w:numId="113" w16cid:durableId="1418403813">
-    <w:abstractNumId w:val="62"/>
-  </w:num>
-  <w:num w:numId="114" w16cid:durableId="1965042317">
-    <w:abstractNumId w:val="114"/>
-  </w:num>
-  <w:num w:numId="115" w16cid:durableId="670569040">
-    <w:abstractNumId w:val="51"/>
-  </w:num>
-  <w:num w:numId="116" w16cid:durableId="413823113">
-    <w:abstractNumId w:val="122"/>
-  </w:num>
-  <w:num w:numId="117" w16cid:durableId="1293747982">
-    <w:abstractNumId w:val="96"/>
-  </w:num>
-  <w:num w:numId="118" w16cid:durableId="1016734110">
-    <w:abstractNumId w:val="70"/>
-  </w:num>
-  <w:num w:numId="119" w16cid:durableId="583337306">
-    <w:abstractNumId w:val="116"/>
-  </w:num>
-  <w:num w:numId="120" w16cid:durableId="721096429">
-    <w:abstractNumId w:val="97"/>
-  </w:num>
-  <w:num w:numId="121" w16cid:durableId="299461688">
-    <w:abstractNumId w:val="76"/>
-  </w:num>
-  <w:num w:numId="122" w16cid:durableId="703558456">
+  <w:num w:numId="130" w16cid:durableId="426855422">
     <w:abstractNumId w:val="9"/>
-  </w:num>
-  <w:num w:numId="123" w16cid:durableId="964241540">
-    <w:abstractNumId w:val="23"/>
-  </w:num>
-  <w:num w:numId="124" w16cid:durableId="603391478">
-    <w:abstractNumId w:val="82"/>
-  </w:num>
-  <w:num w:numId="125" w16cid:durableId="560529547">
-    <w:abstractNumId w:val="104"/>
-  </w:num>
-  <w:num w:numId="126" w16cid:durableId="1488327713">
-    <w:abstractNumId w:val="107"/>
-  </w:num>
-  <w:num w:numId="127" w16cid:durableId="1327660713">
-    <w:abstractNumId w:val="108"/>
   </w:num>
   <w:numIdMacAtCleanup w:val="45"/>
 </w:numbering>

</xml_diff>

<commit_message>
Agency Verification State Modeling (#295) Verification Lifecycle Analysis (#296) Verification State Machine Diagram (#297)
</commit_message>
<xml_diff>
--- a/Sequence Specification Document.docx
+++ b/Sequence Specification Document.docx
@@ -1885,13 +1885,492 @@
     </w:p>
     <w:p>
       <w:pPr>
+        <w:pStyle w:val="Heading2"/>
+        <w:numPr>
+          <w:ilvl w:val="0"/>
+          <w:numId w:val="119"/>
+        </w:numPr>
+      </w:pPr>
+      <w:r>
+        <w:lastRenderedPageBreak/>
+        <w:t>Agency Verification Lifecycle Analysis</w:t>
+      </w:r>
+    </w:p>
+    <w:p>
+      <w:pPr>
         <w:tabs>
           <w:tab w:val="left" w:pos="1275"/>
         </w:tabs>
       </w:pPr>
+      <w:r>
+        <w:t>Agency Verification represents the process that each rental agency has to undergo in order to be able to start working within the framework of the KriGo platform. This entity's lifecycle guarantees that the rental agencies which will provide vehicle rental services within the KriGo framework will be legitimate and comply with all the regulations, ensuring platform's security and reliability.</w:t>
+      </w:r>
     </w:p>
-    <w:p/>
-    <w:p/>
+    <w:p>
+      <w:pPr>
+        <w:tabs>
+          <w:tab w:val="left" w:pos="1275"/>
+        </w:tabs>
+      </w:pPr>
+      <w:r>
+        <w:t xml:space="preserve">The process starts with the rental agency submission of its registration data along with required supporting documents (business license, certificate of identity). In this case, the request enters into the state of </w:t>
+      </w:r>
+      <w:r>
+        <w:rPr>
+          <w:b/>
+          <w:bCs/>
+        </w:rPr>
+        <w:t>Pending</w:t>
+      </w:r>
+      <w:r>
+        <w:t xml:space="preserve"> </w:t>
+      </w:r>
+      <w:r>
+        <w:rPr>
+          <w:b/>
+          <w:bCs/>
+        </w:rPr>
+        <w:t>Review</w:t>
+      </w:r>
+      <w:r>
+        <w:t xml:space="preserve"> until the time the administrative review takes place.</w:t>
+      </w:r>
+    </w:p>
+    <w:p>
+      <w:pPr>
+        <w:tabs>
+          <w:tab w:val="left" w:pos="1275"/>
+        </w:tabs>
+      </w:pPr>
+      <w:r>
+        <w:t xml:space="preserve">The system administrator conducts a check of the provided data and verifies the correctness and validity of the documents submitted. The request for verification goes into the state of Under </w:t>
+      </w:r>
+      <w:r>
+        <w:rPr>
+          <w:b/>
+          <w:bCs/>
+        </w:rPr>
+        <w:t>Review</w:t>
+      </w:r>
+      <w:r>
+        <w:t>.</w:t>
+      </w:r>
+    </w:p>
+    <w:p>
+      <w:pPr>
+        <w:tabs>
+          <w:tab w:val="left" w:pos="1275"/>
+        </w:tabs>
+      </w:pPr>
+      <w:r>
+        <w:t xml:space="preserve">In case additional data needs to be provided, the verification request goes into the state of </w:t>
+      </w:r>
+      <w:r>
+        <w:rPr>
+          <w:b/>
+          <w:bCs/>
+        </w:rPr>
+        <w:t>Additional Information Required</w:t>
+      </w:r>
+      <w:r>
+        <w:t xml:space="preserve"> and waits for uploading additional data by the agency.</w:t>
+      </w:r>
+    </w:p>
+    <w:p>
+      <w:pPr>
+        <w:tabs>
+          <w:tab w:val="left" w:pos="1275"/>
+        </w:tabs>
+      </w:pPr>
+      <w:r>
+        <w:t xml:space="preserve">As a result of the review, the request gets either verified or rejected. In the first case, the verification goes into the state of </w:t>
+      </w:r>
+      <w:r>
+        <w:rPr>
+          <w:b/>
+          <w:bCs/>
+        </w:rPr>
+        <w:t>Verified</w:t>
+      </w:r>
+      <w:r>
+        <w:t xml:space="preserve"> and the account of the agency becomes active allowing the agency to provide vehicle rental services. In case the documents provided by the rental agency were not valid or were fraudulent in some way, the request goes to the state of </w:t>
+      </w:r>
+      <w:r>
+        <w:rPr>
+          <w:b/>
+          <w:bCs/>
+        </w:rPr>
+        <w:t>Rejected</w:t>
+      </w:r>
+      <w:r>
+        <w:t xml:space="preserve"> and the agency gets notified about it.</w:t>
+      </w:r>
+    </w:p>
+    <w:p>
+      <w:pPr>
+        <w:pStyle w:val="Heading2"/>
+      </w:pPr>
+      <w:r>
+        <w:t xml:space="preserve">Agency Verification State Machine </w:t>
+      </w:r>
+    </w:p>
+    <w:p>
+      <w:pPr>
+        <w:rPr>
+          <w:b/>
+          <w:bCs/>
+        </w:rPr>
+      </w:pPr>
+      <w:r>
+        <w:rPr>
+          <w:b/>
+          <w:bCs/>
+        </w:rPr>
+        <w:t>Purpose</w:t>
+      </w:r>
+    </w:p>
+    <w:p>
+      <w:r>
+        <w:t>The Agency Verification State Machine Diagram is the diagram illustrating the life cycle of the agency verification request for the KriGo system. It demonstrates the states that an agency verification request passes through, beginning with its submission to either being approved or rejected. Unlike the activity diagram, which shows the process of verification, the state machine diagram highlights the life of the Agency Verification object itself.</w:t>
+      </w:r>
+    </w:p>
+    <w:p>
+      <w:pPr>
+        <w:rPr>
+          <w:b/>
+          <w:bCs/>
+        </w:rPr>
+      </w:pPr>
+      <w:r>
+        <w:rPr>
+          <w:b/>
+          <w:bCs/>
+        </w:rPr>
+        <w:t>Verification States</w:t>
+      </w:r>
+    </w:p>
+    <w:p>
+      <w:r>
+        <w:t>The agency verification lifecycle consists of the following states:</w:t>
+      </w:r>
+    </w:p>
+    <w:p>
+      <w:pPr>
+        <w:pStyle w:val="ListParagraph"/>
+        <w:numPr>
+          <w:ilvl w:val="0"/>
+          <w:numId w:val="133"/>
+        </w:numPr>
+        <w:spacing w:line="360" w:lineRule="auto"/>
+      </w:pPr>
+      <w:r>
+        <w:rPr>
+          <w:b/>
+          <w:bCs/>
+        </w:rPr>
+        <w:t>Pending Review:</w:t>
+      </w:r>
+      <w:r>
+        <w:t xml:space="preserve"> The agency has submitted its registration information and supporting documents, and the verification request is awaiting administrative review.</w:t>
+      </w:r>
+    </w:p>
+    <w:p>
+      <w:pPr>
+        <w:pStyle w:val="ListParagraph"/>
+        <w:numPr>
+          <w:ilvl w:val="0"/>
+          <w:numId w:val="133"/>
+        </w:numPr>
+        <w:spacing w:line="360" w:lineRule="auto"/>
+      </w:pPr>
+      <w:r>
+        <w:rPr>
+          <w:b/>
+          <w:bCs/>
+        </w:rPr>
+        <w:t>Under Review:</w:t>
+      </w:r>
+      <w:r>
+        <w:t xml:space="preserve"> A system administrator is actively evaluating the submitted documents and verifying the agency's information.</w:t>
+      </w:r>
+    </w:p>
+    <w:p>
+      <w:pPr>
+        <w:pStyle w:val="ListParagraph"/>
+        <w:numPr>
+          <w:ilvl w:val="0"/>
+          <w:numId w:val="133"/>
+        </w:numPr>
+        <w:spacing w:line="360" w:lineRule="auto"/>
+      </w:pPr>
+      <w:r>
+        <w:rPr>
+          <w:b/>
+          <w:bCs/>
+        </w:rPr>
+        <w:t>Additional Information Required:</w:t>
+      </w:r>
+      <w:r>
+        <w:t xml:space="preserve"> The administrator has requested additional documents or corrections before the verification process can continue.</w:t>
+      </w:r>
+    </w:p>
+    <w:p>
+      <w:pPr>
+        <w:pStyle w:val="ListParagraph"/>
+        <w:numPr>
+          <w:ilvl w:val="0"/>
+          <w:numId w:val="133"/>
+        </w:numPr>
+        <w:spacing w:line="360" w:lineRule="auto"/>
+      </w:pPr>
+      <w:r>
+        <w:rPr>
+          <w:b/>
+          <w:bCs/>
+        </w:rPr>
+        <w:t>Verified:</w:t>
+      </w:r>
+      <w:r>
+        <w:t xml:space="preserve"> The agency has successfully satisfied all verification requirements, and its account is approved and activated.</w:t>
+      </w:r>
+    </w:p>
+    <w:p>
+      <w:pPr>
+        <w:pStyle w:val="ListParagraph"/>
+        <w:numPr>
+          <w:ilvl w:val="0"/>
+          <w:numId w:val="133"/>
+        </w:numPr>
+        <w:spacing w:line="278" w:lineRule="auto"/>
+        <w:rPr>
+          <w:b/>
+          <w:bCs/>
+        </w:rPr>
+      </w:pPr>
+      <w:r>
+        <w:rPr>
+          <w:b/>
+          <w:bCs/>
+        </w:rPr>
+        <w:t>Rejected:</w:t>
+      </w:r>
+      <w:r>
+        <w:t xml:space="preserve"> The verification request has been denied because the submitted information does not meet the platform's verification criteria.</w:t>
+      </w:r>
+    </w:p>
+    <w:p>
+      <w:pPr>
+        <w:pStyle w:val="ListParagraph"/>
+        <w:spacing w:line="278" w:lineRule="auto"/>
+        <w:ind w:left="1080" w:firstLine="0"/>
+        <w:rPr>
+          <w:b/>
+          <w:bCs/>
+        </w:rPr>
+      </w:pPr>
+    </w:p>
+    <w:p>
+      <w:pPr>
+        <w:rPr>
+          <w:b/>
+          <w:bCs/>
+        </w:rPr>
+      </w:pPr>
+      <w:r>
+        <w:rPr>
+          <w:b/>
+          <w:bCs/>
+        </w:rPr>
+        <w:lastRenderedPageBreak/>
+        <w:t>State Transitions</w:t>
+      </w:r>
+    </w:p>
+    <w:p>
+      <w:r>
+        <w:t>The lifecycle starts with the status of Pending Review when a verification request is made by an agency. The moment the administrator starts reviewing the request, the status changes to Under Review. In case the verification request needs to be reviewed due to the lack of some important documents, then the status changes to Additional Information Required. After the agency supplies the additional information, the status will revert back to Under Review to continue the review process. When the administrator finds out that the verification requirements have been met, the status will change to Verified. This results in the activation of the agency’s account. On the other hand, when the supplied information is not enough, not valid, fraudulently acquired, or does not comply with the policies of the platform, the verification request will move on to the Rejected status.</w:t>
+      </w:r>
+    </w:p>
+    <w:p>
+      <w:pPr>
+        <w:rPr>
+          <w:b/>
+          <w:bCs/>
+        </w:rPr>
+      </w:pPr>
+      <w:r>
+        <w:rPr>
+          <w:b/>
+          <w:bCs/>
+        </w:rPr>
+        <w:t>Terminal States</w:t>
+      </w:r>
+    </w:p>
+    <w:p>
+      <w:r>
+        <w:t>The Agency Verification State Machine Diagram contains two terminal states:</w:t>
+      </w:r>
+    </w:p>
+    <w:p>
+      <w:pPr>
+        <w:pStyle w:val="ListParagraph"/>
+        <w:numPr>
+          <w:ilvl w:val="0"/>
+          <w:numId w:val="134"/>
+        </w:numPr>
+      </w:pPr>
+      <w:r>
+        <w:rPr>
+          <w:b/>
+          <w:bCs/>
+        </w:rPr>
+        <w:t>Verified</w:t>
+      </w:r>
+      <w:r>
+        <w:t>, representing a successfully approved verification request.</w:t>
+      </w:r>
+    </w:p>
+    <w:p>
+      <w:pPr>
+        <w:pStyle w:val="ListParagraph"/>
+        <w:numPr>
+          <w:ilvl w:val="0"/>
+          <w:numId w:val="134"/>
+        </w:numPr>
+      </w:pPr>
+      <w:r>
+        <w:rPr>
+          <w:b/>
+          <w:bCs/>
+        </w:rPr>
+        <w:t>Rejected</w:t>
+      </w:r>
+      <w:r>
+        <w:t>, representing a verification request that has been denied.</w:t>
+      </w:r>
+    </w:p>
+    <w:p>
+      <w:r>
+        <w:t>These terminal states indicate the completion of the verification process for the current request. If a rejected agency wishes to apply again, a new verification request begins a new lifecycle.</w:t>
+      </w:r>
+    </w:p>
+    <w:p>
+      <w:pPr>
+        <w:rPr>
+          <w:b/>
+          <w:bCs/>
+        </w:rPr>
+      </w:pPr>
+      <w:r>
+        <w:rPr>
+          <w:b/>
+          <w:bCs/>
+        </w:rPr>
+        <w:t>Conclusion</w:t>
+      </w:r>
+    </w:p>
+    <w:p>
+      <w:r>
+        <w:t>The State Machine Diagram of Agency Verification represents a complete description of the life cycle of an agency verification request at KriGo. It illustrates how verification requests progress through states of being submitted, reviewed, asked for additional information, approved, or rejected. Through its defined states and state transitions, it provides a consistent and secure process of verification that ensures regulatory compliance and helps maintain the integrity of the platform by allowing it to operate only for the verified rental agencies.</w:t>
+      </w:r>
+    </w:p>
+    <w:p>
+      <w:pPr>
+        <w:keepNext/>
+      </w:pPr>
+      <w:r>
+        <w:rPr>
+          <w:noProof/>
+        </w:rPr>
+        <w:drawing>
+          <wp:inline distT="0" distB="0" distL="0" distR="0" wp14:anchorId="6CF1A73A" wp14:editId="69C33AFB">
+            <wp:extent cx="5941695" cy="2888615"/>
+            <wp:effectExtent l="0" t="0" r="1905" b="6985"/>
+            <wp:docPr id="180806642" name="Picture 11"/>
+            <wp:cNvGraphicFramePr>
+              <a:graphicFrameLocks xmlns:a="http://schemas.openxmlformats.org/drawingml/2006/main" noChangeAspect="1"/>
+            </wp:cNvGraphicFramePr>
+            <a:graphic xmlns:a="http://schemas.openxmlformats.org/drawingml/2006/main">
+              <a:graphicData uri="http://schemas.openxmlformats.org/drawingml/2006/picture">
+                <pic:pic xmlns:pic="http://schemas.openxmlformats.org/drawingml/2006/picture">
+                  <pic:nvPicPr>
+                    <pic:cNvPr id="0" name="Picture 7"/>
+                    <pic:cNvPicPr>
+                      <a:picLocks noChangeAspect="1" noChangeArrowheads="1"/>
+                    </pic:cNvPicPr>
+                  </pic:nvPicPr>
+                  <pic:blipFill>
+                    <a:blip r:embed="rId11">
+                      <a:extLst>
+                        <a:ext uri="{28A0092B-C50C-407E-A947-70E740481C1C}">
+                          <a14:useLocalDpi xmlns:a14="http://schemas.microsoft.com/office/drawing/2010/main" val="0"/>
+                        </a:ext>
+                      </a:extLst>
+                    </a:blip>
+                    <a:srcRect/>
+                    <a:stretch>
+                      <a:fillRect/>
+                    </a:stretch>
+                  </pic:blipFill>
+                  <pic:spPr bwMode="auto">
+                    <a:xfrm>
+                      <a:off x="0" y="0"/>
+                      <a:ext cx="5941695" cy="2888615"/>
+                    </a:xfrm>
+                    <a:prstGeom prst="rect">
+                      <a:avLst/>
+                    </a:prstGeom>
+                    <a:noFill/>
+                    <a:ln>
+                      <a:noFill/>
+                    </a:ln>
+                  </pic:spPr>
+                </pic:pic>
+              </a:graphicData>
+            </a:graphic>
+          </wp:inline>
+        </w:drawing>
+      </w:r>
+    </w:p>
+    <w:p>
+      <w:pPr>
+        <w:pStyle w:val="Caption"/>
+      </w:pPr>
+      <w:r>
+        <w:t xml:space="preserve">Figure </w:t>
+      </w:r>
+      <w:r>
+        <w:fldChar w:fldCharType="begin"/>
+      </w:r>
+      <w:r>
+        <w:instrText xml:space="preserve"> SEQ Figure \* ARABIC </w:instrText>
+      </w:r>
+      <w:r>
+        <w:fldChar w:fldCharType="separate"/>
+      </w:r>
+      <w:r>
+        <w:rPr>
+          <w:noProof/>
+        </w:rPr>
+        <w:t>4</w:t>
+      </w:r>
+      <w:r>
+        <w:fldChar w:fldCharType="end"/>
+      </w:r>
+      <w:r>
+        <w:t xml:space="preserve"> - </w:t>
+      </w:r>
+      <w:r>
+        <w:t>Agency Verification State Machine Diagram</w:t>
+      </w:r>
+    </w:p>
+    <w:p>
+      <w:pPr>
+        <w:spacing w:line="278" w:lineRule="auto"/>
+      </w:pPr>
+      <w:r>
+        <w:br w:type="page"/>
+      </w:r>
+    </w:p>
     <w:p/>
     <w:p/>
     <w:p/>
@@ -5898,6 +6377,268 @@
     </w:lvl>
   </w:abstractNum>
   <w:abstractNum w:abstractNumId="31" w15:restartNumberingAfterBreak="0">
+    <w:nsid w:val="19921EC0"/>
+    <w:multiLevelType w:val="multilevel"/>
+    <w:tmpl w:val="AB545FB8"/>
+    <w:lvl w:ilvl="0">
+      <w:start w:val="1"/>
+      <w:numFmt w:val="bullet"/>
+      <w:lvlText w:val=""/>
+      <w:lvlJc w:val="left"/>
+      <w:pPr>
+        <w:tabs>
+          <w:tab w:val="num" w:pos="720"/>
+        </w:tabs>
+        <w:ind w:left="720" w:hanging="360"/>
+      </w:pPr>
+      <w:rPr>
+        <w:rFonts w:ascii="Symbol" w:hAnsi="Symbol" w:hint="default"/>
+        <w:sz w:val="20"/>
+      </w:rPr>
+    </w:lvl>
+    <w:lvl w:ilvl="1" w:tentative="1">
+      <w:start w:val="1"/>
+      <w:numFmt w:val="bullet"/>
+      <w:lvlText w:val="o"/>
+      <w:lvlJc w:val="left"/>
+      <w:pPr>
+        <w:tabs>
+          <w:tab w:val="num" w:pos="1440"/>
+        </w:tabs>
+        <w:ind w:left="1440" w:hanging="360"/>
+      </w:pPr>
+      <w:rPr>
+        <w:rFonts w:ascii="Courier New" w:hAnsi="Courier New" w:hint="default"/>
+        <w:sz w:val="20"/>
+      </w:rPr>
+    </w:lvl>
+    <w:lvl w:ilvl="2" w:tentative="1">
+      <w:start w:val="1"/>
+      <w:numFmt w:val="bullet"/>
+      <w:lvlText w:val=""/>
+      <w:lvlJc w:val="left"/>
+      <w:pPr>
+        <w:tabs>
+          <w:tab w:val="num" w:pos="2160"/>
+        </w:tabs>
+        <w:ind w:left="2160" w:hanging="360"/>
+      </w:pPr>
+      <w:rPr>
+        <w:rFonts w:ascii="Wingdings" w:hAnsi="Wingdings" w:hint="default"/>
+        <w:sz w:val="20"/>
+      </w:rPr>
+    </w:lvl>
+    <w:lvl w:ilvl="3" w:tentative="1">
+      <w:start w:val="1"/>
+      <w:numFmt w:val="bullet"/>
+      <w:lvlText w:val=""/>
+      <w:lvlJc w:val="left"/>
+      <w:pPr>
+        <w:tabs>
+          <w:tab w:val="num" w:pos="2880"/>
+        </w:tabs>
+        <w:ind w:left="2880" w:hanging="360"/>
+      </w:pPr>
+      <w:rPr>
+        <w:rFonts w:ascii="Wingdings" w:hAnsi="Wingdings" w:hint="default"/>
+        <w:sz w:val="20"/>
+      </w:rPr>
+    </w:lvl>
+    <w:lvl w:ilvl="4" w:tentative="1">
+      <w:start w:val="1"/>
+      <w:numFmt w:val="bullet"/>
+      <w:lvlText w:val=""/>
+      <w:lvlJc w:val="left"/>
+      <w:pPr>
+        <w:tabs>
+          <w:tab w:val="num" w:pos="3600"/>
+        </w:tabs>
+        <w:ind w:left="3600" w:hanging="360"/>
+      </w:pPr>
+      <w:rPr>
+        <w:rFonts w:ascii="Wingdings" w:hAnsi="Wingdings" w:hint="default"/>
+        <w:sz w:val="20"/>
+      </w:rPr>
+    </w:lvl>
+    <w:lvl w:ilvl="5" w:tentative="1">
+      <w:start w:val="1"/>
+      <w:numFmt w:val="bullet"/>
+      <w:lvlText w:val=""/>
+      <w:lvlJc w:val="left"/>
+      <w:pPr>
+        <w:tabs>
+          <w:tab w:val="num" w:pos="4320"/>
+        </w:tabs>
+        <w:ind w:left="4320" w:hanging="360"/>
+      </w:pPr>
+      <w:rPr>
+        <w:rFonts w:ascii="Wingdings" w:hAnsi="Wingdings" w:hint="default"/>
+        <w:sz w:val="20"/>
+      </w:rPr>
+    </w:lvl>
+    <w:lvl w:ilvl="6" w:tentative="1">
+      <w:start w:val="1"/>
+      <w:numFmt w:val="bullet"/>
+      <w:lvlText w:val=""/>
+      <w:lvlJc w:val="left"/>
+      <w:pPr>
+        <w:tabs>
+          <w:tab w:val="num" w:pos="5040"/>
+        </w:tabs>
+        <w:ind w:left="5040" w:hanging="360"/>
+      </w:pPr>
+      <w:rPr>
+        <w:rFonts w:ascii="Wingdings" w:hAnsi="Wingdings" w:hint="default"/>
+        <w:sz w:val="20"/>
+      </w:rPr>
+    </w:lvl>
+    <w:lvl w:ilvl="7" w:tentative="1">
+      <w:start w:val="1"/>
+      <w:numFmt w:val="bullet"/>
+      <w:lvlText w:val=""/>
+      <w:lvlJc w:val="left"/>
+      <w:pPr>
+        <w:tabs>
+          <w:tab w:val="num" w:pos="5760"/>
+        </w:tabs>
+        <w:ind w:left="5760" w:hanging="360"/>
+      </w:pPr>
+      <w:rPr>
+        <w:rFonts w:ascii="Wingdings" w:hAnsi="Wingdings" w:hint="default"/>
+        <w:sz w:val="20"/>
+      </w:rPr>
+    </w:lvl>
+    <w:lvl w:ilvl="8" w:tentative="1">
+      <w:start w:val="1"/>
+      <w:numFmt w:val="bullet"/>
+      <w:lvlText w:val=""/>
+      <w:lvlJc w:val="left"/>
+      <w:pPr>
+        <w:tabs>
+          <w:tab w:val="num" w:pos="6480"/>
+        </w:tabs>
+        <w:ind w:left="6480" w:hanging="360"/>
+      </w:pPr>
+      <w:rPr>
+        <w:rFonts w:ascii="Wingdings" w:hAnsi="Wingdings" w:hint="default"/>
+        <w:sz w:val="20"/>
+      </w:rPr>
+    </w:lvl>
+  </w:abstractNum>
+  <w:abstractNum w:abstractNumId="32" w15:restartNumberingAfterBreak="0">
+    <w:nsid w:val="1A0C7ACA"/>
+    <w:multiLevelType w:val="hybridMultilevel"/>
+    <w:tmpl w:val="C640FF02"/>
+    <w:lvl w:ilvl="0" w:tplc="04090005">
+      <w:start w:val="1"/>
+      <w:numFmt w:val="bullet"/>
+      <w:lvlText w:val=""/>
+      <w:lvlJc w:val="left"/>
+      <w:pPr>
+        <w:ind w:left="1080" w:hanging="360"/>
+      </w:pPr>
+      <w:rPr>
+        <w:rFonts w:ascii="Wingdings" w:hAnsi="Wingdings" w:hint="default"/>
+      </w:rPr>
+    </w:lvl>
+    <w:lvl w:ilvl="1" w:tplc="04090003" w:tentative="1">
+      <w:start w:val="1"/>
+      <w:numFmt w:val="bullet"/>
+      <w:lvlText w:val="o"/>
+      <w:lvlJc w:val="left"/>
+      <w:pPr>
+        <w:ind w:left="1800" w:hanging="360"/>
+      </w:pPr>
+      <w:rPr>
+        <w:rFonts w:ascii="Courier New" w:hAnsi="Courier New" w:cs="Courier New" w:hint="default"/>
+      </w:rPr>
+    </w:lvl>
+    <w:lvl w:ilvl="2" w:tplc="04090005" w:tentative="1">
+      <w:start w:val="1"/>
+      <w:numFmt w:val="bullet"/>
+      <w:lvlText w:val=""/>
+      <w:lvlJc w:val="left"/>
+      <w:pPr>
+        <w:ind w:left="2520" w:hanging="360"/>
+      </w:pPr>
+      <w:rPr>
+        <w:rFonts w:ascii="Wingdings" w:hAnsi="Wingdings" w:hint="default"/>
+      </w:rPr>
+    </w:lvl>
+    <w:lvl w:ilvl="3" w:tplc="04090001" w:tentative="1">
+      <w:start w:val="1"/>
+      <w:numFmt w:val="bullet"/>
+      <w:lvlText w:val=""/>
+      <w:lvlJc w:val="left"/>
+      <w:pPr>
+        <w:ind w:left="3240" w:hanging="360"/>
+      </w:pPr>
+      <w:rPr>
+        <w:rFonts w:ascii="Symbol" w:hAnsi="Symbol" w:hint="default"/>
+      </w:rPr>
+    </w:lvl>
+    <w:lvl w:ilvl="4" w:tplc="04090003" w:tentative="1">
+      <w:start w:val="1"/>
+      <w:numFmt w:val="bullet"/>
+      <w:lvlText w:val="o"/>
+      <w:lvlJc w:val="left"/>
+      <w:pPr>
+        <w:ind w:left="3960" w:hanging="360"/>
+      </w:pPr>
+      <w:rPr>
+        <w:rFonts w:ascii="Courier New" w:hAnsi="Courier New" w:cs="Courier New" w:hint="default"/>
+      </w:rPr>
+    </w:lvl>
+    <w:lvl w:ilvl="5" w:tplc="04090005" w:tentative="1">
+      <w:start w:val="1"/>
+      <w:numFmt w:val="bullet"/>
+      <w:lvlText w:val=""/>
+      <w:lvlJc w:val="left"/>
+      <w:pPr>
+        <w:ind w:left="4680" w:hanging="360"/>
+      </w:pPr>
+      <w:rPr>
+        <w:rFonts w:ascii="Wingdings" w:hAnsi="Wingdings" w:hint="default"/>
+      </w:rPr>
+    </w:lvl>
+    <w:lvl w:ilvl="6" w:tplc="04090001" w:tentative="1">
+      <w:start w:val="1"/>
+      <w:numFmt w:val="bullet"/>
+      <w:lvlText w:val=""/>
+      <w:lvlJc w:val="left"/>
+      <w:pPr>
+        <w:ind w:left="5400" w:hanging="360"/>
+      </w:pPr>
+      <w:rPr>
+        <w:rFonts w:ascii="Symbol" w:hAnsi="Symbol" w:hint="default"/>
+      </w:rPr>
+    </w:lvl>
+    <w:lvl w:ilvl="7" w:tplc="04090003" w:tentative="1">
+      <w:start w:val="1"/>
+      <w:numFmt w:val="bullet"/>
+      <w:lvlText w:val="o"/>
+      <w:lvlJc w:val="left"/>
+      <w:pPr>
+        <w:ind w:left="6120" w:hanging="360"/>
+      </w:pPr>
+      <w:rPr>
+        <w:rFonts w:ascii="Courier New" w:hAnsi="Courier New" w:cs="Courier New" w:hint="default"/>
+      </w:rPr>
+    </w:lvl>
+    <w:lvl w:ilvl="8" w:tplc="04090005" w:tentative="1">
+      <w:start w:val="1"/>
+      <w:numFmt w:val="bullet"/>
+      <w:lvlText w:val=""/>
+      <w:lvlJc w:val="left"/>
+      <w:pPr>
+        <w:ind w:left="6840" w:hanging="360"/>
+      </w:pPr>
+      <w:rPr>
+        <w:rFonts w:ascii="Wingdings" w:hAnsi="Wingdings" w:hint="default"/>
+      </w:rPr>
+    </w:lvl>
+  </w:abstractNum>
+  <w:abstractNum w:abstractNumId="33" w15:restartNumberingAfterBreak="0">
     <w:nsid w:val="1CC60A94"/>
     <w:multiLevelType w:val="multilevel"/>
     <w:tmpl w:val="EB74741C"/>
@@ -6046,7 +6787,7 @@
       </w:rPr>
     </w:lvl>
   </w:abstractNum>
-  <w:abstractNum w:abstractNumId="32" w15:restartNumberingAfterBreak="0">
+  <w:abstractNum w:abstractNumId="34" w15:restartNumberingAfterBreak="0">
     <w:nsid w:val="1E6658CF"/>
     <w:multiLevelType w:val="multilevel"/>
     <w:tmpl w:val="762ABC5E"/>
@@ -6195,7 +6936,7 @@
       </w:rPr>
     </w:lvl>
   </w:abstractNum>
-  <w:abstractNum w:abstractNumId="33" w15:restartNumberingAfterBreak="0">
+  <w:abstractNum w:abstractNumId="35" w15:restartNumberingAfterBreak="0">
     <w:nsid w:val="1FA532B0"/>
     <w:multiLevelType w:val="multilevel"/>
     <w:tmpl w:val="8718294C"/>
@@ -6344,7 +7085,156 @@
       </w:rPr>
     </w:lvl>
   </w:abstractNum>
-  <w:abstractNum w:abstractNumId="34" w15:restartNumberingAfterBreak="0">
+  <w:abstractNum w:abstractNumId="36" w15:restartNumberingAfterBreak="0">
+    <w:nsid w:val="20CE3DE5"/>
+    <w:multiLevelType w:val="multilevel"/>
+    <w:tmpl w:val="5596E1A2"/>
+    <w:lvl w:ilvl="0">
+      <w:start w:val="1"/>
+      <w:numFmt w:val="bullet"/>
+      <w:lvlText w:val=""/>
+      <w:lvlJc w:val="left"/>
+      <w:pPr>
+        <w:tabs>
+          <w:tab w:val="num" w:pos="720"/>
+        </w:tabs>
+        <w:ind w:left="720" w:hanging="360"/>
+      </w:pPr>
+      <w:rPr>
+        <w:rFonts w:ascii="Symbol" w:hAnsi="Symbol" w:hint="default"/>
+        <w:sz w:val="20"/>
+      </w:rPr>
+    </w:lvl>
+    <w:lvl w:ilvl="1" w:tentative="1">
+      <w:start w:val="1"/>
+      <w:numFmt w:val="bullet"/>
+      <w:lvlText w:val="o"/>
+      <w:lvlJc w:val="left"/>
+      <w:pPr>
+        <w:tabs>
+          <w:tab w:val="num" w:pos="1440"/>
+        </w:tabs>
+        <w:ind w:left="1440" w:hanging="360"/>
+      </w:pPr>
+      <w:rPr>
+        <w:rFonts w:ascii="Courier New" w:hAnsi="Courier New" w:hint="default"/>
+        <w:sz w:val="20"/>
+      </w:rPr>
+    </w:lvl>
+    <w:lvl w:ilvl="2" w:tentative="1">
+      <w:start w:val="1"/>
+      <w:numFmt w:val="bullet"/>
+      <w:lvlText w:val=""/>
+      <w:lvlJc w:val="left"/>
+      <w:pPr>
+        <w:tabs>
+          <w:tab w:val="num" w:pos="2160"/>
+        </w:tabs>
+        <w:ind w:left="2160" w:hanging="360"/>
+      </w:pPr>
+      <w:rPr>
+        <w:rFonts w:ascii="Wingdings" w:hAnsi="Wingdings" w:hint="default"/>
+        <w:sz w:val="20"/>
+      </w:rPr>
+    </w:lvl>
+    <w:lvl w:ilvl="3" w:tentative="1">
+      <w:start w:val="1"/>
+      <w:numFmt w:val="bullet"/>
+      <w:lvlText w:val=""/>
+      <w:lvlJc w:val="left"/>
+      <w:pPr>
+        <w:tabs>
+          <w:tab w:val="num" w:pos="2880"/>
+        </w:tabs>
+        <w:ind w:left="2880" w:hanging="360"/>
+      </w:pPr>
+      <w:rPr>
+        <w:rFonts w:ascii="Wingdings" w:hAnsi="Wingdings" w:hint="default"/>
+        <w:sz w:val="20"/>
+      </w:rPr>
+    </w:lvl>
+    <w:lvl w:ilvl="4" w:tentative="1">
+      <w:start w:val="1"/>
+      <w:numFmt w:val="bullet"/>
+      <w:lvlText w:val=""/>
+      <w:lvlJc w:val="left"/>
+      <w:pPr>
+        <w:tabs>
+          <w:tab w:val="num" w:pos="3600"/>
+        </w:tabs>
+        <w:ind w:left="3600" w:hanging="360"/>
+      </w:pPr>
+      <w:rPr>
+        <w:rFonts w:ascii="Wingdings" w:hAnsi="Wingdings" w:hint="default"/>
+        <w:sz w:val="20"/>
+      </w:rPr>
+    </w:lvl>
+    <w:lvl w:ilvl="5" w:tentative="1">
+      <w:start w:val="1"/>
+      <w:numFmt w:val="bullet"/>
+      <w:lvlText w:val=""/>
+      <w:lvlJc w:val="left"/>
+      <w:pPr>
+        <w:tabs>
+          <w:tab w:val="num" w:pos="4320"/>
+        </w:tabs>
+        <w:ind w:left="4320" w:hanging="360"/>
+      </w:pPr>
+      <w:rPr>
+        <w:rFonts w:ascii="Wingdings" w:hAnsi="Wingdings" w:hint="default"/>
+        <w:sz w:val="20"/>
+      </w:rPr>
+    </w:lvl>
+    <w:lvl w:ilvl="6" w:tentative="1">
+      <w:start w:val="1"/>
+      <w:numFmt w:val="bullet"/>
+      <w:lvlText w:val=""/>
+      <w:lvlJc w:val="left"/>
+      <w:pPr>
+        <w:tabs>
+          <w:tab w:val="num" w:pos="5040"/>
+        </w:tabs>
+        <w:ind w:left="5040" w:hanging="360"/>
+      </w:pPr>
+      <w:rPr>
+        <w:rFonts w:ascii="Wingdings" w:hAnsi="Wingdings" w:hint="default"/>
+        <w:sz w:val="20"/>
+      </w:rPr>
+    </w:lvl>
+    <w:lvl w:ilvl="7" w:tentative="1">
+      <w:start w:val="1"/>
+      <w:numFmt w:val="bullet"/>
+      <w:lvlText w:val=""/>
+      <w:lvlJc w:val="left"/>
+      <w:pPr>
+        <w:tabs>
+          <w:tab w:val="num" w:pos="5760"/>
+        </w:tabs>
+        <w:ind w:left="5760" w:hanging="360"/>
+      </w:pPr>
+      <w:rPr>
+        <w:rFonts w:ascii="Wingdings" w:hAnsi="Wingdings" w:hint="default"/>
+        <w:sz w:val="20"/>
+      </w:rPr>
+    </w:lvl>
+    <w:lvl w:ilvl="8" w:tentative="1">
+      <w:start w:val="1"/>
+      <w:numFmt w:val="bullet"/>
+      <w:lvlText w:val=""/>
+      <w:lvlJc w:val="left"/>
+      <w:pPr>
+        <w:tabs>
+          <w:tab w:val="num" w:pos="6480"/>
+        </w:tabs>
+        <w:ind w:left="6480" w:hanging="360"/>
+      </w:pPr>
+      <w:rPr>
+        <w:rFonts w:ascii="Wingdings" w:hAnsi="Wingdings" w:hint="default"/>
+        <w:sz w:val="20"/>
+      </w:rPr>
+    </w:lvl>
+  </w:abstractNum>
+  <w:abstractNum w:abstractNumId="37" w15:restartNumberingAfterBreak="0">
     <w:nsid w:val="215C77FD"/>
     <w:multiLevelType w:val="hybridMultilevel"/>
     <w:tmpl w:val="58F41D10"/>
@@ -6433,7 +7323,7 @@
       </w:pPr>
     </w:lvl>
   </w:abstractNum>
-  <w:abstractNum w:abstractNumId="35" w15:restartNumberingAfterBreak="0">
+  <w:abstractNum w:abstractNumId="38" w15:restartNumberingAfterBreak="0">
     <w:nsid w:val="218D5909"/>
     <w:multiLevelType w:val="hybridMultilevel"/>
     <w:tmpl w:val="CC989EE4"/>
@@ -6546,7 +7436,7 @@
       </w:rPr>
     </w:lvl>
   </w:abstractNum>
-  <w:abstractNum w:abstractNumId="36" w15:restartNumberingAfterBreak="0">
+  <w:abstractNum w:abstractNumId="39" w15:restartNumberingAfterBreak="0">
     <w:nsid w:val="23E010BA"/>
     <w:multiLevelType w:val="multilevel"/>
     <w:tmpl w:val="4A16907E"/>
@@ -6695,7 +7585,7 @@
       </w:rPr>
     </w:lvl>
   </w:abstractNum>
-  <w:abstractNum w:abstractNumId="37" w15:restartNumberingAfterBreak="0">
+  <w:abstractNum w:abstractNumId="40" w15:restartNumberingAfterBreak="0">
     <w:nsid w:val="2470127A"/>
     <w:multiLevelType w:val="multilevel"/>
     <w:tmpl w:val="309E9618"/>
@@ -6844,7 +7734,7 @@
       </w:rPr>
     </w:lvl>
   </w:abstractNum>
-  <w:abstractNum w:abstractNumId="38" w15:restartNumberingAfterBreak="0">
+  <w:abstractNum w:abstractNumId="41" w15:restartNumberingAfterBreak="0">
     <w:nsid w:val="24796798"/>
     <w:multiLevelType w:val="hybridMultilevel"/>
     <w:tmpl w:val="6622BEDC"/>
@@ -6933,7 +7823,7 @@
       </w:pPr>
     </w:lvl>
   </w:abstractNum>
-  <w:abstractNum w:abstractNumId="39" w15:restartNumberingAfterBreak="0">
+  <w:abstractNum w:abstractNumId="42" w15:restartNumberingAfterBreak="0">
     <w:nsid w:val="253B76EC"/>
     <w:multiLevelType w:val="multilevel"/>
     <w:tmpl w:val="2AA67CDA"/>
@@ -7082,7 +7972,7 @@
       </w:rPr>
     </w:lvl>
   </w:abstractNum>
-  <w:abstractNum w:abstractNumId="40" w15:restartNumberingAfterBreak="0">
+  <w:abstractNum w:abstractNumId="43" w15:restartNumberingAfterBreak="0">
     <w:nsid w:val="2E4D738C"/>
     <w:multiLevelType w:val="multilevel"/>
     <w:tmpl w:val="1540BBA2"/>
@@ -7231,7 +8121,7 @@
       </w:rPr>
     </w:lvl>
   </w:abstractNum>
-  <w:abstractNum w:abstractNumId="41" w15:restartNumberingAfterBreak="0">
+  <w:abstractNum w:abstractNumId="44" w15:restartNumberingAfterBreak="0">
     <w:nsid w:val="2F0041C7"/>
     <w:multiLevelType w:val="multilevel"/>
     <w:tmpl w:val="656414FE"/>
@@ -7380,7 +8270,7 @@
       </w:rPr>
     </w:lvl>
   </w:abstractNum>
-  <w:abstractNum w:abstractNumId="42" w15:restartNumberingAfterBreak="0">
+  <w:abstractNum w:abstractNumId="45" w15:restartNumberingAfterBreak="0">
     <w:nsid w:val="304F01FA"/>
     <w:multiLevelType w:val="multilevel"/>
     <w:tmpl w:val="151C4EC6"/>
@@ -7529,7 +8419,7 @@
       </w:rPr>
     </w:lvl>
   </w:abstractNum>
-  <w:abstractNum w:abstractNumId="43" w15:restartNumberingAfterBreak="0">
+  <w:abstractNum w:abstractNumId="46" w15:restartNumberingAfterBreak="0">
     <w:nsid w:val="30BD025D"/>
     <w:multiLevelType w:val="hybridMultilevel"/>
     <w:tmpl w:val="04381C82"/>
@@ -7618,7 +8508,7 @@
       </w:pPr>
     </w:lvl>
   </w:abstractNum>
-  <w:abstractNum w:abstractNumId="44" w15:restartNumberingAfterBreak="0">
+  <w:abstractNum w:abstractNumId="47" w15:restartNumberingAfterBreak="0">
     <w:nsid w:val="327C0BA6"/>
     <w:multiLevelType w:val="hybridMultilevel"/>
     <w:tmpl w:val="2A9047EE"/>
@@ -7731,7 +8621,7 @@
       </w:rPr>
     </w:lvl>
   </w:abstractNum>
-  <w:abstractNum w:abstractNumId="45" w15:restartNumberingAfterBreak="0">
+  <w:abstractNum w:abstractNumId="48" w15:restartNumberingAfterBreak="0">
     <w:nsid w:val="338D63E8"/>
     <w:multiLevelType w:val="hybridMultilevel"/>
     <w:tmpl w:val="28D0FB50"/>
@@ -7844,7 +8734,7 @@
       </w:rPr>
     </w:lvl>
   </w:abstractNum>
-  <w:abstractNum w:abstractNumId="46" w15:restartNumberingAfterBreak="0">
+  <w:abstractNum w:abstractNumId="49" w15:restartNumberingAfterBreak="0">
     <w:nsid w:val="34182771"/>
     <w:multiLevelType w:val="multilevel"/>
     <w:tmpl w:val="2AA67CDA"/>
@@ -7993,7 +8883,7 @@
       </w:rPr>
     </w:lvl>
   </w:abstractNum>
-  <w:abstractNum w:abstractNumId="47" w15:restartNumberingAfterBreak="0">
+  <w:abstractNum w:abstractNumId="50" w15:restartNumberingAfterBreak="0">
     <w:nsid w:val="35413E58"/>
     <w:multiLevelType w:val="hybridMultilevel"/>
     <w:tmpl w:val="03C64164"/>
@@ -8106,7 +8996,7 @@
       </w:rPr>
     </w:lvl>
   </w:abstractNum>
-  <w:abstractNum w:abstractNumId="48" w15:restartNumberingAfterBreak="0">
+  <w:abstractNum w:abstractNumId="51" w15:restartNumberingAfterBreak="0">
     <w:nsid w:val="35C86AF0"/>
     <w:multiLevelType w:val="multilevel"/>
     <w:tmpl w:val="8202FCD6"/>
@@ -8255,7 +9145,7 @@
       </w:rPr>
     </w:lvl>
   </w:abstractNum>
-  <w:abstractNum w:abstractNumId="49" w15:restartNumberingAfterBreak="0">
+  <w:abstractNum w:abstractNumId="52" w15:restartNumberingAfterBreak="0">
     <w:nsid w:val="3623194A"/>
     <w:multiLevelType w:val="multilevel"/>
     <w:tmpl w:val="63F4E6F0"/>
@@ -8404,7 +9294,7 @@
       </w:rPr>
     </w:lvl>
   </w:abstractNum>
-  <w:abstractNum w:abstractNumId="50" w15:restartNumberingAfterBreak="0">
+  <w:abstractNum w:abstractNumId="53" w15:restartNumberingAfterBreak="0">
     <w:nsid w:val="36E36979"/>
     <w:multiLevelType w:val="multilevel"/>
     <w:tmpl w:val="3D58C93A"/>
@@ -8553,7 +9443,7 @@
       </w:rPr>
     </w:lvl>
   </w:abstractNum>
-  <w:abstractNum w:abstractNumId="51" w15:restartNumberingAfterBreak="0">
+  <w:abstractNum w:abstractNumId="54" w15:restartNumberingAfterBreak="0">
     <w:nsid w:val="37B424C3"/>
     <w:multiLevelType w:val="hybridMultilevel"/>
     <w:tmpl w:val="18F030D4"/>
@@ -8666,7 +9556,7 @@
       </w:rPr>
     </w:lvl>
   </w:abstractNum>
-  <w:abstractNum w:abstractNumId="52" w15:restartNumberingAfterBreak="0">
+  <w:abstractNum w:abstractNumId="55" w15:restartNumberingAfterBreak="0">
     <w:nsid w:val="3BC10D30"/>
     <w:multiLevelType w:val="multilevel"/>
     <w:tmpl w:val="502AD78C"/>
@@ -8815,7 +9705,7 @@
       </w:rPr>
     </w:lvl>
   </w:abstractNum>
-  <w:abstractNum w:abstractNumId="53" w15:restartNumberingAfterBreak="0">
+  <w:abstractNum w:abstractNumId="56" w15:restartNumberingAfterBreak="0">
     <w:nsid w:val="3C276BB8"/>
     <w:multiLevelType w:val="multilevel"/>
     <w:tmpl w:val="2AA67CDA"/>
@@ -8964,7 +9854,7 @@
       </w:rPr>
     </w:lvl>
   </w:abstractNum>
-  <w:abstractNum w:abstractNumId="54" w15:restartNumberingAfterBreak="0">
+  <w:abstractNum w:abstractNumId="57" w15:restartNumberingAfterBreak="0">
     <w:nsid w:val="3C596808"/>
     <w:multiLevelType w:val="multilevel"/>
     <w:tmpl w:val="2AA67CDA"/>
@@ -9113,7 +10003,7 @@
       </w:rPr>
     </w:lvl>
   </w:abstractNum>
-  <w:abstractNum w:abstractNumId="55" w15:restartNumberingAfterBreak="0">
+  <w:abstractNum w:abstractNumId="58" w15:restartNumberingAfterBreak="0">
     <w:nsid w:val="3CBF280A"/>
     <w:multiLevelType w:val="multilevel"/>
     <w:tmpl w:val="A13E4362"/>
@@ -9262,7 +10152,7 @@
       </w:rPr>
     </w:lvl>
   </w:abstractNum>
-  <w:abstractNum w:abstractNumId="56" w15:restartNumberingAfterBreak="0">
+  <w:abstractNum w:abstractNumId="59" w15:restartNumberingAfterBreak="0">
     <w:nsid w:val="3CC7541B"/>
     <w:multiLevelType w:val="multilevel"/>
     <w:tmpl w:val="2AA67CDA"/>
@@ -9411,7 +10301,7 @@
       </w:rPr>
     </w:lvl>
   </w:abstractNum>
-  <w:abstractNum w:abstractNumId="57" w15:restartNumberingAfterBreak="0">
+  <w:abstractNum w:abstractNumId="60" w15:restartNumberingAfterBreak="0">
     <w:nsid w:val="3F5E3BA1"/>
     <w:multiLevelType w:val="multilevel"/>
     <w:tmpl w:val="2AA67CDA"/>
@@ -9560,7 +10450,7 @@
       </w:rPr>
     </w:lvl>
   </w:abstractNum>
-  <w:abstractNum w:abstractNumId="58" w15:restartNumberingAfterBreak="0">
+  <w:abstractNum w:abstractNumId="61" w15:restartNumberingAfterBreak="0">
     <w:nsid w:val="40431B1C"/>
     <w:multiLevelType w:val="multilevel"/>
     <w:tmpl w:val="5D8E77D0"/>
@@ -9709,7 +10599,7 @@
       </w:rPr>
     </w:lvl>
   </w:abstractNum>
-  <w:abstractNum w:abstractNumId="59" w15:restartNumberingAfterBreak="0">
+  <w:abstractNum w:abstractNumId="62" w15:restartNumberingAfterBreak="0">
     <w:nsid w:val="452F60FB"/>
     <w:multiLevelType w:val="hybridMultilevel"/>
     <w:tmpl w:val="892A990A"/>
@@ -9822,7 +10712,7 @@
       </w:rPr>
     </w:lvl>
   </w:abstractNum>
-  <w:abstractNum w:abstractNumId="60" w15:restartNumberingAfterBreak="0">
+  <w:abstractNum w:abstractNumId="63" w15:restartNumberingAfterBreak="0">
     <w:nsid w:val="47B65409"/>
     <w:multiLevelType w:val="multilevel"/>
     <w:tmpl w:val="2AA67CDA"/>
@@ -9971,7 +10861,7 @@
       </w:rPr>
     </w:lvl>
   </w:abstractNum>
-  <w:abstractNum w:abstractNumId="61" w15:restartNumberingAfterBreak="0">
+  <w:abstractNum w:abstractNumId="64" w15:restartNumberingAfterBreak="0">
     <w:nsid w:val="47BF2170"/>
     <w:multiLevelType w:val="multilevel"/>
     <w:tmpl w:val="D9681266"/>
@@ -10120,7 +11010,7 @@
       </w:rPr>
     </w:lvl>
   </w:abstractNum>
-  <w:abstractNum w:abstractNumId="62" w15:restartNumberingAfterBreak="0">
+  <w:abstractNum w:abstractNumId="65" w15:restartNumberingAfterBreak="0">
     <w:nsid w:val="47E5592F"/>
     <w:multiLevelType w:val="hybridMultilevel"/>
     <w:tmpl w:val="719AB9FA"/>
@@ -10233,7 +11123,7 @@
       </w:rPr>
     </w:lvl>
   </w:abstractNum>
-  <w:abstractNum w:abstractNumId="63" w15:restartNumberingAfterBreak="0">
+  <w:abstractNum w:abstractNumId="66" w15:restartNumberingAfterBreak="0">
     <w:nsid w:val="48204158"/>
     <w:multiLevelType w:val="multilevel"/>
     <w:tmpl w:val="1F9C21B4"/>
@@ -10382,7 +11272,7 @@
       </w:rPr>
     </w:lvl>
   </w:abstractNum>
-  <w:abstractNum w:abstractNumId="64" w15:restartNumberingAfterBreak="0">
+  <w:abstractNum w:abstractNumId="67" w15:restartNumberingAfterBreak="0">
     <w:nsid w:val="48C041A9"/>
     <w:multiLevelType w:val="multilevel"/>
     <w:tmpl w:val="59A694BC"/>
@@ -10531,7 +11421,7 @@
       </w:rPr>
     </w:lvl>
   </w:abstractNum>
-  <w:abstractNum w:abstractNumId="65" w15:restartNumberingAfterBreak="0">
+  <w:abstractNum w:abstractNumId="68" w15:restartNumberingAfterBreak="0">
     <w:nsid w:val="49D6568A"/>
     <w:multiLevelType w:val="multilevel"/>
     <w:tmpl w:val="559E29EC"/>
@@ -10680,7 +11570,7 @@
       </w:rPr>
     </w:lvl>
   </w:abstractNum>
-  <w:abstractNum w:abstractNumId="66" w15:restartNumberingAfterBreak="0">
+  <w:abstractNum w:abstractNumId="69" w15:restartNumberingAfterBreak="0">
     <w:nsid w:val="4AF73293"/>
     <w:multiLevelType w:val="hybridMultilevel"/>
     <w:tmpl w:val="F2962738"/>
@@ -10793,7 +11683,7 @@
       </w:rPr>
     </w:lvl>
   </w:abstractNum>
-  <w:abstractNum w:abstractNumId="67" w15:restartNumberingAfterBreak="0">
+  <w:abstractNum w:abstractNumId="70" w15:restartNumberingAfterBreak="0">
     <w:nsid w:val="4B375248"/>
     <w:multiLevelType w:val="multilevel"/>
     <w:tmpl w:val="B574C1C6"/>
@@ -10942,7 +11832,7 @@
       </w:rPr>
     </w:lvl>
   </w:abstractNum>
-  <w:abstractNum w:abstractNumId="68" w15:restartNumberingAfterBreak="0">
+  <w:abstractNum w:abstractNumId="71" w15:restartNumberingAfterBreak="0">
     <w:nsid w:val="4BA13766"/>
     <w:multiLevelType w:val="multilevel"/>
     <w:tmpl w:val="63F4E6F0"/>
@@ -11091,7 +11981,7 @@
       </w:rPr>
     </w:lvl>
   </w:abstractNum>
-  <w:abstractNum w:abstractNumId="69" w15:restartNumberingAfterBreak="0">
+  <w:abstractNum w:abstractNumId="72" w15:restartNumberingAfterBreak="0">
     <w:nsid w:val="4BA25441"/>
     <w:multiLevelType w:val="hybridMultilevel"/>
     <w:tmpl w:val="217E2E96"/>
@@ -11204,7 +12094,7 @@
       </w:rPr>
     </w:lvl>
   </w:abstractNum>
-  <w:abstractNum w:abstractNumId="70" w15:restartNumberingAfterBreak="0">
+  <w:abstractNum w:abstractNumId="73" w15:restartNumberingAfterBreak="0">
     <w:nsid w:val="4E276DCB"/>
     <w:multiLevelType w:val="hybridMultilevel"/>
     <w:tmpl w:val="B7C469B4"/>
@@ -11317,7 +12207,7 @@
       </w:rPr>
     </w:lvl>
   </w:abstractNum>
-  <w:abstractNum w:abstractNumId="71" w15:restartNumberingAfterBreak="0">
+  <w:abstractNum w:abstractNumId="74" w15:restartNumberingAfterBreak="0">
     <w:nsid w:val="4F053929"/>
     <w:multiLevelType w:val="hybridMultilevel"/>
     <w:tmpl w:val="2A78C678"/>
@@ -11430,7 +12320,7 @@
       </w:rPr>
     </w:lvl>
   </w:abstractNum>
-  <w:abstractNum w:abstractNumId="72" w15:restartNumberingAfterBreak="0">
+  <w:abstractNum w:abstractNumId="75" w15:restartNumberingAfterBreak="0">
     <w:nsid w:val="4FFB237E"/>
     <w:multiLevelType w:val="multilevel"/>
     <w:tmpl w:val="2AA67CDA"/>
@@ -11579,7 +12469,7 @@
       </w:rPr>
     </w:lvl>
   </w:abstractNum>
-  <w:abstractNum w:abstractNumId="73" w15:restartNumberingAfterBreak="0">
+  <w:abstractNum w:abstractNumId="76" w15:restartNumberingAfterBreak="0">
     <w:nsid w:val="50476F20"/>
     <w:multiLevelType w:val="hybridMultilevel"/>
     <w:tmpl w:val="85B03D5E"/>
@@ -11668,7 +12558,7 @@
       </w:pPr>
     </w:lvl>
   </w:abstractNum>
-  <w:abstractNum w:abstractNumId="74" w15:restartNumberingAfterBreak="0">
+  <w:abstractNum w:abstractNumId="77" w15:restartNumberingAfterBreak="0">
     <w:nsid w:val="51737FE0"/>
     <w:multiLevelType w:val="hybridMultilevel"/>
     <w:tmpl w:val="2B0604E6"/>
@@ -11781,7 +12671,7 @@
       </w:rPr>
     </w:lvl>
   </w:abstractNum>
-  <w:abstractNum w:abstractNumId="75" w15:restartNumberingAfterBreak="0">
+  <w:abstractNum w:abstractNumId="78" w15:restartNumberingAfterBreak="0">
     <w:nsid w:val="518B1885"/>
     <w:multiLevelType w:val="multilevel"/>
     <w:tmpl w:val="AE1AAC28"/>
@@ -11930,7 +12820,7 @@
       </w:rPr>
     </w:lvl>
   </w:abstractNum>
-  <w:abstractNum w:abstractNumId="76" w15:restartNumberingAfterBreak="0">
+  <w:abstractNum w:abstractNumId="79" w15:restartNumberingAfterBreak="0">
     <w:nsid w:val="51A86EF8"/>
     <w:multiLevelType w:val="multilevel"/>
     <w:tmpl w:val="FF2841D4"/>
@@ -12079,7 +12969,7 @@
       </w:rPr>
     </w:lvl>
   </w:abstractNum>
-  <w:abstractNum w:abstractNumId="77" w15:restartNumberingAfterBreak="0">
+  <w:abstractNum w:abstractNumId="80" w15:restartNumberingAfterBreak="0">
     <w:nsid w:val="521378FF"/>
     <w:multiLevelType w:val="multilevel"/>
     <w:tmpl w:val="7B002268"/>
@@ -12228,7 +13118,7 @@
       </w:rPr>
     </w:lvl>
   </w:abstractNum>
-  <w:abstractNum w:abstractNumId="78" w15:restartNumberingAfterBreak="0">
+  <w:abstractNum w:abstractNumId="81" w15:restartNumberingAfterBreak="0">
     <w:nsid w:val="521F2792"/>
     <w:multiLevelType w:val="multilevel"/>
     <w:tmpl w:val="9FB45386"/>
@@ -12377,7 +13267,7 @@
       </w:rPr>
     </w:lvl>
   </w:abstractNum>
-  <w:abstractNum w:abstractNumId="79" w15:restartNumberingAfterBreak="0">
+  <w:abstractNum w:abstractNumId="82" w15:restartNumberingAfterBreak="0">
     <w:nsid w:val="52A37FDE"/>
     <w:multiLevelType w:val="multilevel"/>
     <w:tmpl w:val="5D6EAA1A"/>
@@ -12526,7 +13416,7 @@
       </w:rPr>
     </w:lvl>
   </w:abstractNum>
-  <w:abstractNum w:abstractNumId="80" w15:restartNumberingAfterBreak="0">
+  <w:abstractNum w:abstractNumId="83" w15:restartNumberingAfterBreak="0">
     <w:nsid w:val="53390911"/>
     <w:multiLevelType w:val="multilevel"/>
     <w:tmpl w:val="1C380F12"/>
@@ -12675,7 +13565,7 @@
       </w:rPr>
     </w:lvl>
   </w:abstractNum>
-  <w:abstractNum w:abstractNumId="81" w15:restartNumberingAfterBreak="0">
+  <w:abstractNum w:abstractNumId="84" w15:restartNumberingAfterBreak="0">
     <w:nsid w:val="53CD23AC"/>
     <w:multiLevelType w:val="multilevel"/>
     <w:tmpl w:val="57BAE8F0"/>
@@ -12824,7 +13714,7 @@
       </w:rPr>
     </w:lvl>
   </w:abstractNum>
-  <w:abstractNum w:abstractNumId="82" w15:restartNumberingAfterBreak="0">
+  <w:abstractNum w:abstractNumId="85" w15:restartNumberingAfterBreak="0">
     <w:nsid w:val="5462791F"/>
     <w:multiLevelType w:val="hybridMultilevel"/>
     <w:tmpl w:val="FDE24C26"/>
@@ -12937,7 +13827,7 @@
       </w:rPr>
     </w:lvl>
   </w:abstractNum>
-  <w:abstractNum w:abstractNumId="83" w15:restartNumberingAfterBreak="0">
+  <w:abstractNum w:abstractNumId="86" w15:restartNumberingAfterBreak="0">
     <w:nsid w:val="547005EB"/>
     <w:multiLevelType w:val="multilevel"/>
     <w:tmpl w:val="F260CC5C"/>
@@ -13086,7 +13976,7 @@
       </w:rPr>
     </w:lvl>
   </w:abstractNum>
-  <w:abstractNum w:abstractNumId="84" w15:restartNumberingAfterBreak="0">
+  <w:abstractNum w:abstractNumId="87" w15:restartNumberingAfterBreak="0">
     <w:nsid w:val="58034221"/>
     <w:multiLevelType w:val="hybridMultilevel"/>
     <w:tmpl w:val="65D0619C"/>
@@ -13199,7 +14089,7 @@
       </w:rPr>
     </w:lvl>
   </w:abstractNum>
-  <w:abstractNum w:abstractNumId="85" w15:restartNumberingAfterBreak="0">
+  <w:abstractNum w:abstractNumId="88" w15:restartNumberingAfterBreak="0">
     <w:nsid w:val="588F256D"/>
     <w:multiLevelType w:val="multilevel"/>
     <w:tmpl w:val="E8F493CA"/>
@@ -13348,7 +14238,7 @@
       </w:rPr>
     </w:lvl>
   </w:abstractNum>
-  <w:abstractNum w:abstractNumId="86" w15:restartNumberingAfterBreak="0">
+  <w:abstractNum w:abstractNumId="89" w15:restartNumberingAfterBreak="0">
     <w:nsid w:val="5A460390"/>
     <w:multiLevelType w:val="hybridMultilevel"/>
     <w:tmpl w:val="BD8E939C"/>
@@ -13461,7 +14351,7 @@
       </w:rPr>
     </w:lvl>
   </w:abstractNum>
-  <w:abstractNum w:abstractNumId="87" w15:restartNumberingAfterBreak="0">
+  <w:abstractNum w:abstractNumId="90" w15:restartNumberingAfterBreak="0">
     <w:nsid w:val="5CEE630B"/>
     <w:multiLevelType w:val="hybridMultilevel"/>
     <w:tmpl w:val="DE8E8DBA"/>
@@ -13574,7 +14464,7 @@
       </w:rPr>
     </w:lvl>
   </w:abstractNum>
-  <w:abstractNum w:abstractNumId="88" w15:restartNumberingAfterBreak="0">
+  <w:abstractNum w:abstractNumId="91" w15:restartNumberingAfterBreak="0">
     <w:nsid w:val="5D5A183C"/>
     <w:multiLevelType w:val="multilevel"/>
     <w:tmpl w:val="C804C34A"/>
@@ -13723,7 +14613,7 @@
       </w:rPr>
     </w:lvl>
   </w:abstractNum>
-  <w:abstractNum w:abstractNumId="89" w15:restartNumberingAfterBreak="0">
+  <w:abstractNum w:abstractNumId="92" w15:restartNumberingAfterBreak="0">
     <w:nsid w:val="5DF95194"/>
     <w:multiLevelType w:val="multilevel"/>
     <w:tmpl w:val="CC127E54"/>
@@ -13872,7 +14762,7 @@
       </w:rPr>
     </w:lvl>
   </w:abstractNum>
-  <w:abstractNum w:abstractNumId="90" w15:restartNumberingAfterBreak="0">
+  <w:abstractNum w:abstractNumId="93" w15:restartNumberingAfterBreak="0">
     <w:nsid w:val="5E9C452C"/>
     <w:multiLevelType w:val="multilevel"/>
     <w:tmpl w:val="B8727936"/>
@@ -14021,7 +14911,7 @@
       </w:rPr>
     </w:lvl>
   </w:abstractNum>
-  <w:abstractNum w:abstractNumId="91" w15:restartNumberingAfterBreak="0">
+  <w:abstractNum w:abstractNumId="94" w15:restartNumberingAfterBreak="0">
     <w:nsid w:val="62385AA6"/>
     <w:multiLevelType w:val="multilevel"/>
     <w:tmpl w:val="B9EAECD4"/>
@@ -14170,7 +15060,7 @@
       </w:rPr>
     </w:lvl>
   </w:abstractNum>
-  <w:abstractNum w:abstractNumId="92" w15:restartNumberingAfterBreak="0">
+  <w:abstractNum w:abstractNumId="95" w15:restartNumberingAfterBreak="0">
     <w:nsid w:val="625D686D"/>
     <w:multiLevelType w:val="multilevel"/>
     <w:tmpl w:val="BC1C2048"/>
@@ -14319,7 +15209,7 @@
       </w:rPr>
     </w:lvl>
   </w:abstractNum>
-  <w:abstractNum w:abstractNumId="93" w15:restartNumberingAfterBreak="0">
+  <w:abstractNum w:abstractNumId="96" w15:restartNumberingAfterBreak="0">
     <w:nsid w:val="62B46951"/>
     <w:multiLevelType w:val="hybridMultilevel"/>
     <w:tmpl w:val="0FEAFEC6"/>
@@ -14432,7 +15322,7 @@
       </w:rPr>
     </w:lvl>
   </w:abstractNum>
-  <w:abstractNum w:abstractNumId="94" w15:restartNumberingAfterBreak="0">
+  <w:abstractNum w:abstractNumId="97" w15:restartNumberingAfterBreak="0">
     <w:nsid w:val="647819E3"/>
     <w:multiLevelType w:val="multilevel"/>
     <w:tmpl w:val="ABB278BC"/>
@@ -14581,7 +15471,7 @@
       </w:rPr>
     </w:lvl>
   </w:abstractNum>
-  <w:abstractNum w:abstractNumId="95" w15:restartNumberingAfterBreak="0">
+  <w:abstractNum w:abstractNumId="98" w15:restartNumberingAfterBreak="0">
     <w:nsid w:val="64F30198"/>
     <w:multiLevelType w:val="multilevel"/>
     <w:tmpl w:val="63F4E6F0"/>
@@ -14730,7 +15620,7 @@
       </w:rPr>
     </w:lvl>
   </w:abstractNum>
-  <w:abstractNum w:abstractNumId="96" w15:restartNumberingAfterBreak="0">
+  <w:abstractNum w:abstractNumId="99" w15:restartNumberingAfterBreak="0">
     <w:nsid w:val="65314293"/>
     <w:multiLevelType w:val="hybridMultilevel"/>
     <w:tmpl w:val="6688DFAC"/>
@@ -14843,7 +15733,7 @@
       </w:rPr>
     </w:lvl>
   </w:abstractNum>
-  <w:abstractNum w:abstractNumId="97" w15:restartNumberingAfterBreak="0">
+  <w:abstractNum w:abstractNumId="100" w15:restartNumberingAfterBreak="0">
     <w:nsid w:val="65CE4D0F"/>
     <w:multiLevelType w:val="hybridMultilevel"/>
     <w:tmpl w:val="DB668538"/>
@@ -14956,7 +15846,7 @@
       </w:rPr>
     </w:lvl>
   </w:abstractNum>
-  <w:abstractNum w:abstractNumId="98" w15:restartNumberingAfterBreak="0">
+  <w:abstractNum w:abstractNumId="101" w15:restartNumberingAfterBreak="0">
     <w:nsid w:val="661C7D73"/>
     <w:multiLevelType w:val="multilevel"/>
     <w:tmpl w:val="D9681266"/>
@@ -15105,7 +15995,7 @@
       </w:rPr>
     </w:lvl>
   </w:abstractNum>
-  <w:abstractNum w:abstractNumId="99" w15:restartNumberingAfterBreak="0">
+  <w:abstractNum w:abstractNumId="102" w15:restartNumberingAfterBreak="0">
     <w:nsid w:val="66E36FE0"/>
     <w:multiLevelType w:val="multilevel"/>
     <w:tmpl w:val="2AA67CDA"/>
@@ -15254,7 +16144,7 @@
       </w:rPr>
     </w:lvl>
   </w:abstractNum>
-  <w:abstractNum w:abstractNumId="100" w15:restartNumberingAfterBreak="0">
+  <w:abstractNum w:abstractNumId="103" w15:restartNumberingAfterBreak="0">
     <w:nsid w:val="671F5935"/>
     <w:multiLevelType w:val="multilevel"/>
     <w:tmpl w:val="1E86702A"/>
@@ -15403,7 +16293,7 @@
       </w:rPr>
     </w:lvl>
   </w:abstractNum>
-  <w:abstractNum w:abstractNumId="101" w15:restartNumberingAfterBreak="0">
+  <w:abstractNum w:abstractNumId="104" w15:restartNumberingAfterBreak="0">
     <w:nsid w:val="68B94344"/>
     <w:multiLevelType w:val="multilevel"/>
     <w:tmpl w:val="9BA812D8"/>
@@ -15552,7 +16442,7 @@
       </w:rPr>
     </w:lvl>
   </w:abstractNum>
-  <w:abstractNum w:abstractNumId="102" w15:restartNumberingAfterBreak="0">
+  <w:abstractNum w:abstractNumId="105" w15:restartNumberingAfterBreak="0">
     <w:nsid w:val="69DE2C87"/>
     <w:multiLevelType w:val="hybridMultilevel"/>
     <w:tmpl w:val="F530F20A"/>
@@ -15665,7 +16555,7 @@
       </w:rPr>
     </w:lvl>
   </w:abstractNum>
-  <w:abstractNum w:abstractNumId="103" w15:restartNumberingAfterBreak="0">
+  <w:abstractNum w:abstractNumId="106" w15:restartNumberingAfterBreak="0">
     <w:nsid w:val="69ED672D"/>
     <w:multiLevelType w:val="multilevel"/>
     <w:tmpl w:val="CC08E300"/>
@@ -15814,7 +16704,7 @@
       </w:rPr>
     </w:lvl>
   </w:abstractNum>
-  <w:abstractNum w:abstractNumId="104" w15:restartNumberingAfterBreak="0">
+  <w:abstractNum w:abstractNumId="107" w15:restartNumberingAfterBreak="0">
     <w:nsid w:val="6A063EFD"/>
     <w:multiLevelType w:val="hybridMultilevel"/>
     <w:tmpl w:val="48703FBA"/>
@@ -15927,7 +16817,7 @@
       </w:rPr>
     </w:lvl>
   </w:abstractNum>
-  <w:abstractNum w:abstractNumId="105" w15:restartNumberingAfterBreak="0">
+  <w:abstractNum w:abstractNumId="108" w15:restartNumberingAfterBreak="0">
     <w:nsid w:val="6A825ABE"/>
     <w:multiLevelType w:val="multilevel"/>
     <w:tmpl w:val="0CD6F30E"/>
@@ -16076,7 +16966,7 @@
       </w:rPr>
     </w:lvl>
   </w:abstractNum>
-  <w:abstractNum w:abstractNumId="106" w15:restartNumberingAfterBreak="0">
+  <w:abstractNum w:abstractNumId="109" w15:restartNumberingAfterBreak="0">
     <w:nsid w:val="6B1D7832"/>
     <w:multiLevelType w:val="multilevel"/>
     <w:tmpl w:val="DD4646B2"/>
@@ -16225,7 +17115,7 @@
       </w:rPr>
     </w:lvl>
   </w:abstractNum>
-  <w:abstractNum w:abstractNumId="107" w15:restartNumberingAfterBreak="0">
+  <w:abstractNum w:abstractNumId="110" w15:restartNumberingAfterBreak="0">
     <w:nsid w:val="6BC8366D"/>
     <w:multiLevelType w:val="multilevel"/>
     <w:tmpl w:val="7C10CE5C"/>
@@ -16374,7 +17264,7 @@
       </w:rPr>
     </w:lvl>
   </w:abstractNum>
-  <w:abstractNum w:abstractNumId="108" w15:restartNumberingAfterBreak="0">
+  <w:abstractNum w:abstractNumId="111" w15:restartNumberingAfterBreak="0">
     <w:nsid w:val="6C6D6667"/>
     <w:multiLevelType w:val="hybridMultilevel"/>
     <w:tmpl w:val="A744709C"/>
@@ -16487,7 +17377,7 @@
       </w:rPr>
     </w:lvl>
   </w:abstractNum>
-  <w:abstractNum w:abstractNumId="109" w15:restartNumberingAfterBreak="0">
+  <w:abstractNum w:abstractNumId="112" w15:restartNumberingAfterBreak="0">
     <w:nsid w:val="6CAD7EA5"/>
     <w:multiLevelType w:val="multilevel"/>
     <w:tmpl w:val="C472C5B0"/>
@@ -16636,7 +17526,7 @@
       </w:rPr>
     </w:lvl>
   </w:abstractNum>
-  <w:abstractNum w:abstractNumId="110" w15:restartNumberingAfterBreak="0">
+  <w:abstractNum w:abstractNumId="113" w15:restartNumberingAfterBreak="0">
     <w:nsid w:val="6D7A28DE"/>
     <w:multiLevelType w:val="hybridMultilevel"/>
     <w:tmpl w:val="1B5875AA"/>
@@ -16749,7 +17639,120 @@
       </w:rPr>
     </w:lvl>
   </w:abstractNum>
-  <w:abstractNum w:abstractNumId="111" w15:restartNumberingAfterBreak="0">
+  <w:abstractNum w:abstractNumId="114" w15:restartNumberingAfterBreak="0">
+    <w:nsid w:val="6DC443D9"/>
+    <w:multiLevelType w:val="hybridMultilevel"/>
+    <w:tmpl w:val="61CE7B6C"/>
+    <w:lvl w:ilvl="0" w:tplc="04090005">
+      <w:start w:val="1"/>
+      <w:numFmt w:val="bullet"/>
+      <w:lvlText w:val=""/>
+      <w:lvlJc w:val="left"/>
+      <w:pPr>
+        <w:ind w:left="1080" w:hanging="360"/>
+      </w:pPr>
+      <w:rPr>
+        <w:rFonts w:ascii="Wingdings" w:hAnsi="Wingdings" w:hint="default"/>
+      </w:rPr>
+    </w:lvl>
+    <w:lvl w:ilvl="1" w:tplc="04090003" w:tentative="1">
+      <w:start w:val="1"/>
+      <w:numFmt w:val="bullet"/>
+      <w:lvlText w:val="o"/>
+      <w:lvlJc w:val="left"/>
+      <w:pPr>
+        <w:ind w:left="1800" w:hanging="360"/>
+      </w:pPr>
+      <w:rPr>
+        <w:rFonts w:ascii="Courier New" w:hAnsi="Courier New" w:cs="Courier New" w:hint="default"/>
+      </w:rPr>
+    </w:lvl>
+    <w:lvl w:ilvl="2" w:tplc="04090005" w:tentative="1">
+      <w:start w:val="1"/>
+      <w:numFmt w:val="bullet"/>
+      <w:lvlText w:val=""/>
+      <w:lvlJc w:val="left"/>
+      <w:pPr>
+        <w:ind w:left="2520" w:hanging="360"/>
+      </w:pPr>
+      <w:rPr>
+        <w:rFonts w:ascii="Wingdings" w:hAnsi="Wingdings" w:hint="default"/>
+      </w:rPr>
+    </w:lvl>
+    <w:lvl w:ilvl="3" w:tplc="04090001" w:tentative="1">
+      <w:start w:val="1"/>
+      <w:numFmt w:val="bullet"/>
+      <w:lvlText w:val=""/>
+      <w:lvlJc w:val="left"/>
+      <w:pPr>
+        <w:ind w:left="3240" w:hanging="360"/>
+      </w:pPr>
+      <w:rPr>
+        <w:rFonts w:ascii="Symbol" w:hAnsi="Symbol" w:hint="default"/>
+      </w:rPr>
+    </w:lvl>
+    <w:lvl w:ilvl="4" w:tplc="04090003" w:tentative="1">
+      <w:start w:val="1"/>
+      <w:numFmt w:val="bullet"/>
+      <w:lvlText w:val="o"/>
+      <w:lvlJc w:val="left"/>
+      <w:pPr>
+        <w:ind w:left="3960" w:hanging="360"/>
+      </w:pPr>
+      <w:rPr>
+        <w:rFonts w:ascii="Courier New" w:hAnsi="Courier New" w:cs="Courier New" w:hint="default"/>
+      </w:rPr>
+    </w:lvl>
+    <w:lvl w:ilvl="5" w:tplc="04090005" w:tentative="1">
+      <w:start w:val="1"/>
+      <w:numFmt w:val="bullet"/>
+      <w:lvlText w:val=""/>
+      <w:lvlJc w:val="left"/>
+      <w:pPr>
+        <w:ind w:left="4680" w:hanging="360"/>
+      </w:pPr>
+      <w:rPr>
+        <w:rFonts w:ascii="Wingdings" w:hAnsi="Wingdings" w:hint="default"/>
+      </w:rPr>
+    </w:lvl>
+    <w:lvl w:ilvl="6" w:tplc="04090001" w:tentative="1">
+      <w:start w:val="1"/>
+      <w:numFmt w:val="bullet"/>
+      <w:lvlText w:val=""/>
+      <w:lvlJc w:val="left"/>
+      <w:pPr>
+        <w:ind w:left="5400" w:hanging="360"/>
+      </w:pPr>
+      <w:rPr>
+        <w:rFonts w:ascii="Symbol" w:hAnsi="Symbol" w:hint="default"/>
+      </w:rPr>
+    </w:lvl>
+    <w:lvl w:ilvl="7" w:tplc="04090003" w:tentative="1">
+      <w:start w:val="1"/>
+      <w:numFmt w:val="bullet"/>
+      <w:lvlText w:val="o"/>
+      <w:lvlJc w:val="left"/>
+      <w:pPr>
+        <w:ind w:left="6120" w:hanging="360"/>
+      </w:pPr>
+      <w:rPr>
+        <w:rFonts w:ascii="Courier New" w:hAnsi="Courier New" w:cs="Courier New" w:hint="default"/>
+      </w:rPr>
+    </w:lvl>
+    <w:lvl w:ilvl="8" w:tplc="04090005" w:tentative="1">
+      <w:start w:val="1"/>
+      <w:numFmt w:val="bullet"/>
+      <w:lvlText w:val=""/>
+      <w:lvlJc w:val="left"/>
+      <w:pPr>
+        <w:ind w:left="6840" w:hanging="360"/>
+      </w:pPr>
+      <w:rPr>
+        <w:rFonts w:ascii="Wingdings" w:hAnsi="Wingdings" w:hint="default"/>
+      </w:rPr>
+    </w:lvl>
+  </w:abstractNum>
+  <w:abstractNum w:abstractNumId="115" w15:restartNumberingAfterBreak="0">
     <w:nsid w:val="6E2C576F"/>
     <w:multiLevelType w:val="hybridMultilevel"/>
     <w:tmpl w:val="251C1C42"/>
@@ -16862,7 +17865,7 @@
       </w:rPr>
     </w:lvl>
   </w:abstractNum>
-  <w:abstractNum w:abstractNumId="112" w15:restartNumberingAfterBreak="0">
+  <w:abstractNum w:abstractNumId="116" w15:restartNumberingAfterBreak="0">
     <w:nsid w:val="6E43557B"/>
     <w:multiLevelType w:val="multilevel"/>
     <w:tmpl w:val="323C7112"/>
@@ -17011,7 +18014,7 @@
       </w:rPr>
     </w:lvl>
   </w:abstractNum>
-  <w:abstractNum w:abstractNumId="113" w15:restartNumberingAfterBreak="0">
+  <w:abstractNum w:abstractNumId="117" w15:restartNumberingAfterBreak="0">
     <w:nsid w:val="6EA27D0A"/>
     <w:multiLevelType w:val="multilevel"/>
     <w:tmpl w:val="7BF0256C"/>
@@ -17160,7 +18163,7 @@
       </w:rPr>
     </w:lvl>
   </w:abstractNum>
-  <w:abstractNum w:abstractNumId="114" w15:restartNumberingAfterBreak="0">
+  <w:abstractNum w:abstractNumId="118" w15:restartNumberingAfterBreak="0">
     <w:nsid w:val="6EF86273"/>
     <w:multiLevelType w:val="multilevel"/>
     <w:tmpl w:val="2AA67CDA"/>
@@ -17309,7 +18312,7 @@
       </w:rPr>
     </w:lvl>
   </w:abstractNum>
-  <w:abstractNum w:abstractNumId="115" w15:restartNumberingAfterBreak="0">
+  <w:abstractNum w:abstractNumId="119" w15:restartNumberingAfterBreak="0">
     <w:nsid w:val="70874300"/>
     <w:multiLevelType w:val="hybridMultilevel"/>
     <w:tmpl w:val="1B3A0518"/>
@@ -17422,7 +18425,7 @@
       </w:rPr>
     </w:lvl>
   </w:abstractNum>
-  <w:abstractNum w:abstractNumId="116" w15:restartNumberingAfterBreak="0">
+  <w:abstractNum w:abstractNumId="120" w15:restartNumberingAfterBreak="0">
     <w:nsid w:val="7090251B"/>
     <w:multiLevelType w:val="hybridMultilevel"/>
     <w:tmpl w:val="67687EFE"/>
@@ -17535,7 +18538,7 @@
       </w:rPr>
     </w:lvl>
   </w:abstractNum>
-  <w:abstractNum w:abstractNumId="117" w15:restartNumberingAfterBreak="0">
+  <w:abstractNum w:abstractNumId="121" w15:restartNumberingAfterBreak="0">
     <w:nsid w:val="72031F81"/>
     <w:multiLevelType w:val="multilevel"/>
     <w:tmpl w:val="84400090"/>
@@ -17684,7 +18687,7 @@
       </w:rPr>
     </w:lvl>
   </w:abstractNum>
-  <w:abstractNum w:abstractNumId="118" w15:restartNumberingAfterBreak="0">
+  <w:abstractNum w:abstractNumId="122" w15:restartNumberingAfterBreak="0">
     <w:nsid w:val="722301E0"/>
     <w:multiLevelType w:val="multilevel"/>
     <w:tmpl w:val="1EE82E5A"/>
@@ -17833,7 +18836,7 @@
       </w:rPr>
     </w:lvl>
   </w:abstractNum>
-  <w:abstractNum w:abstractNumId="119" w15:restartNumberingAfterBreak="0">
+  <w:abstractNum w:abstractNumId="123" w15:restartNumberingAfterBreak="0">
     <w:nsid w:val="74B80775"/>
     <w:multiLevelType w:val="hybridMultilevel"/>
     <w:tmpl w:val="D3C275CE"/>
@@ -17922,7 +18925,7 @@
       </w:pPr>
     </w:lvl>
   </w:abstractNum>
-  <w:abstractNum w:abstractNumId="120" w15:restartNumberingAfterBreak="0">
+  <w:abstractNum w:abstractNumId="124" w15:restartNumberingAfterBreak="0">
     <w:nsid w:val="75144C65"/>
     <w:multiLevelType w:val="hybridMultilevel"/>
     <w:tmpl w:val="12127FAA"/>
@@ -18035,7 +19038,7 @@
       </w:rPr>
     </w:lvl>
   </w:abstractNum>
-  <w:abstractNum w:abstractNumId="121" w15:restartNumberingAfterBreak="0">
+  <w:abstractNum w:abstractNumId="125" w15:restartNumberingAfterBreak="0">
     <w:nsid w:val="75237F84"/>
     <w:multiLevelType w:val="hybridMultilevel"/>
     <w:tmpl w:val="5F0A6EF2"/>
@@ -18148,7 +19151,7 @@
       </w:rPr>
     </w:lvl>
   </w:abstractNum>
-  <w:abstractNum w:abstractNumId="122" w15:restartNumberingAfterBreak="0">
+  <w:abstractNum w:abstractNumId="126" w15:restartNumberingAfterBreak="0">
     <w:nsid w:val="75FF09B0"/>
     <w:multiLevelType w:val="multilevel"/>
     <w:tmpl w:val="C34A7734"/>
@@ -18297,7 +19300,7 @@
       </w:rPr>
     </w:lvl>
   </w:abstractNum>
-  <w:abstractNum w:abstractNumId="123" w15:restartNumberingAfterBreak="0">
+  <w:abstractNum w:abstractNumId="127" w15:restartNumberingAfterBreak="0">
     <w:nsid w:val="77960362"/>
     <w:multiLevelType w:val="multilevel"/>
     <w:tmpl w:val="FEA0022E"/>
@@ -18446,7 +19449,7 @@
       </w:rPr>
     </w:lvl>
   </w:abstractNum>
-  <w:abstractNum w:abstractNumId="124" w15:restartNumberingAfterBreak="0">
+  <w:abstractNum w:abstractNumId="128" w15:restartNumberingAfterBreak="0">
     <w:nsid w:val="785A644F"/>
     <w:multiLevelType w:val="multilevel"/>
     <w:tmpl w:val="D1DC60FE"/>
@@ -18595,7 +19598,7 @@
       </w:rPr>
     </w:lvl>
   </w:abstractNum>
-  <w:abstractNum w:abstractNumId="125" w15:restartNumberingAfterBreak="0">
+  <w:abstractNum w:abstractNumId="129" w15:restartNumberingAfterBreak="0">
     <w:nsid w:val="78B62297"/>
     <w:multiLevelType w:val="multilevel"/>
     <w:tmpl w:val="2AA67CDA"/>
@@ -18744,7 +19747,7 @@
       </w:rPr>
     </w:lvl>
   </w:abstractNum>
-  <w:abstractNum w:abstractNumId="126" w15:restartNumberingAfterBreak="0">
+  <w:abstractNum w:abstractNumId="130" w15:restartNumberingAfterBreak="0">
     <w:nsid w:val="7BFA03DF"/>
     <w:multiLevelType w:val="hybridMultilevel"/>
     <w:tmpl w:val="536A979E"/>
@@ -18857,7 +19860,7 @@
       </w:rPr>
     </w:lvl>
   </w:abstractNum>
-  <w:abstractNum w:abstractNumId="127" w15:restartNumberingAfterBreak="0">
+  <w:abstractNum w:abstractNumId="131" w15:restartNumberingAfterBreak="0">
     <w:nsid w:val="7CA524B4"/>
     <w:multiLevelType w:val="hybridMultilevel"/>
     <w:tmpl w:val="957C4F4A"/>
@@ -18970,7 +19973,7 @@
       </w:rPr>
     </w:lvl>
   </w:abstractNum>
-  <w:abstractNum w:abstractNumId="128" w15:restartNumberingAfterBreak="0">
+  <w:abstractNum w:abstractNumId="132" w15:restartNumberingAfterBreak="0">
     <w:nsid w:val="7E1C597E"/>
     <w:multiLevelType w:val="multilevel"/>
     <w:tmpl w:val="2AA67CDA"/>
@@ -19119,7 +20122,7 @@
       </w:rPr>
     </w:lvl>
   </w:abstractNum>
-  <w:abstractNum w:abstractNumId="129" w15:restartNumberingAfterBreak="0">
+  <w:abstractNum w:abstractNumId="133" w15:restartNumberingAfterBreak="0">
     <w:nsid w:val="7EBD7710"/>
     <w:multiLevelType w:val="hybridMultilevel"/>
     <w:tmpl w:val="C8C6F7A0"/>
@@ -19233,79 +20236,79 @@
     </w:lvl>
   </w:abstractNum>
   <w:num w:numId="1" w16cid:durableId="425157302">
-    <w:abstractNumId w:val="49"/>
+    <w:abstractNumId w:val="52"/>
   </w:num>
   <w:num w:numId="2" w16cid:durableId="967664612">
-    <w:abstractNumId w:val="95"/>
+    <w:abstractNumId w:val="98"/>
   </w:num>
   <w:num w:numId="3" w16cid:durableId="361631616">
-    <w:abstractNumId w:val="68"/>
+    <w:abstractNumId w:val="71"/>
   </w:num>
   <w:num w:numId="4" w16cid:durableId="1409575397">
-    <w:abstractNumId w:val="82"/>
+    <w:abstractNumId w:val="85"/>
   </w:num>
   <w:num w:numId="5" w16cid:durableId="1647204897">
-    <w:abstractNumId w:val="127"/>
+    <w:abstractNumId w:val="131"/>
   </w:num>
   <w:num w:numId="6" w16cid:durableId="682589869">
     <w:abstractNumId w:val="22"/>
   </w:num>
   <w:num w:numId="7" w16cid:durableId="679703478">
-    <w:abstractNumId w:val="102"/>
+    <w:abstractNumId w:val="105"/>
   </w:num>
   <w:num w:numId="8" w16cid:durableId="496455128">
-    <w:abstractNumId w:val="43"/>
+    <w:abstractNumId w:val="46"/>
   </w:num>
   <w:num w:numId="9" w16cid:durableId="1184633094">
-    <w:abstractNumId w:val="59"/>
+    <w:abstractNumId w:val="62"/>
   </w:num>
   <w:num w:numId="10" w16cid:durableId="71507387">
-    <w:abstractNumId w:val="66"/>
+    <w:abstractNumId w:val="69"/>
   </w:num>
   <w:num w:numId="11" w16cid:durableId="1412503779">
-    <w:abstractNumId w:val="104"/>
+    <w:abstractNumId w:val="107"/>
   </w:num>
   <w:num w:numId="12" w16cid:durableId="1107113995">
-    <w:abstractNumId w:val="44"/>
+    <w:abstractNumId w:val="47"/>
   </w:num>
   <w:num w:numId="13" w16cid:durableId="2011055922">
     <w:abstractNumId w:val="23"/>
   </w:num>
   <w:num w:numId="14" w16cid:durableId="1529222885">
-    <w:abstractNumId w:val="126"/>
+    <w:abstractNumId w:val="130"/>
   </w:num>
   <w:num w:numId="15" w16cid:durableId="836580755">
     <w:abstractNumId w:val="16"/>
   </w:num>
   <w:num w:numId="16" w16cid:durableId="1344674502">
-    <w:abstractNumId w:val="86"/>
+    <w:abstractNumId w:val="89"/>
   </w:num>
   <w:num w:numId="17" w16cid:durableId="1320882603">
-    <w:abstractNumId w:val="115"/>
+    <w:abstractNumId w:val="119"/>
   </w:num>
   <w:num w:numId="18" w16cid:durableId="1139028372">
-    <w:abstractNumId w:val="45"/>
+    <w:abstractNumId w:val="48"/>
   </w:num>
   <w:num w:numId="19" w16cid:durableId="1525635473">
-    <w:abstractNumId w:val="93"/>
+    <w:abstractNumId w:val="96"/>
   </w:num>
   <w:num w:numId="20" w16cid:durableId="609623515">
-    <w:abstractNumId w:val="129"/>
+    <w:abstractNumId w:val="133"/>
   </w:num>
   <w:num w:numId="21" w16cid:durableId="165170997">
-    <w:abstractNumId w:val="108"/>
+    <w:abstractNumId w:val="111"/>
   </w:num>
   <w:num w:numId="22" w16cid:durableId="1620525290">
     <w:abstractNumId w:val="30"/>
   </w:num>
   <w:num w:numId="23" w16cid:durableId="400753109">
-    <w:abstractNumId w:val="120"/>
+    <w:abstractNumId w:val="124"/>
   </w:num>
   <w:num w:numId="24" w16cid:durableId="193882219">
     <w:abstractNumId w:val="4"/>
   </w:num>
   <w:num w:numId="25" w16cid:durableId="311981628">
-    <w:abstractNumId w:val="51"/>
+    <w:abstractNumId w:val="54"/>
   </w:num>
   <w:num w:numId="26" w16cid:durableId="2009166045">
     <w:abstractNumId w:val="15"/>
@@ -19317,13 +20320,13 @@
     <w:abstractNumId w:val="17"/>
   </w:num>
   <w:num w:numId="29" w16cid:durableId="2124693280">
-    <w:abstractNumId w:val="97"/>
+    <w:abstractNumId w:val="100"/>
   </w:num>
   <w:num w:numId="30" w16cid:durableId="1367099744">
-    <w:abstractNumId w:val="35"/>
+    <w:abstractNumId w:val="38"/>
   </w:num>
   <w:num w:numId="31" w16cid:durableId="2011105642">
-    <w:abstractNumId w:val="87"/>
+    <w:abstractNumId w:val="90"/>
   </w:num>
   <w:num w:numId="32" w16cid:durableId="831995364">
     <w:abstractNumId w:val="27"/>
@@ -19341,7 +20344,7 @@
     <w:abstractNumId w:val="2"/>
   </w:num>
   <w:num w:numId="37" w16cid:durableId="1849755457">
-    <w:abstractNumId w:val="121"/>
+    <w:abstractNumId w:val="125"/>
   </w:num>
   <w:num w:numId="38" w16cid:durableId="516505904">
     <w:abstractNumId w:val="14"/>
@@ -19350,85 +20353,85 @@
     <w:abstractNumId w:val="18"/>
   </w:num>
   <w:num w:numId="40" w16cid:durableId="905338697">
-    <w:abstractNumId w:val="70"/>
+    <w:abstractNumId w:val="73"/>
   </w:num>
   <w:num w:numId="41" w16cid:durableId="501896635">
-    <w:abstractNumId w:val="47"/>
+    <w:abstractNumId w:val="50"/>
   </w:num>
   <w:num w:numId="42" w16cid:durableId="1953435156">
-    <w:abstractNumId w:val="71"/>
+    <w:abstractNumId w:val="74"/>
   </w:num>
   <w:num w:numId="43" w16cid:durableId="1060447452">
-    <w:abstractNumId w:val="84"/>
+    <w:abstractNumId w:val="87"/>
   </w:num>
   <w:num w:numId="44" w16cid:durableId="1772503672">
-    <w:abstractNumId w:val="62"/>
+    <w:abstractNumId w:val="65"/>
   </w:num>
   <w:num w:numId="45" w16cid:durableId="1650330222">
-    <w:abstractNumId w:val="69"/>
+    <w:abstractNumId w:val="72"/>
   </w:num>
   <w:num w:numId="46" w16cid:durableId="2102337934">
     <w:abstractNumId w:val="29"/>
   </w:num>
   <w:num w:numId="47" w16cid:durableId="68767822">
-    <w:abstractNumId w:val="105"/>
+    <w:abstractNumId w:val="108"/>
   </w:num>
   <w:num w:numId="48" w16cid:durableId="1992058265">
     <w:abstractNumId w:val="5"/>
   </w:num>
   <w:num w:numId="49" w16cid:durableId="788475134">
-    <w:abstractNumId w:val="124"/>
+    <w:abstractNumId w:val="128"/>
   </w:num>
   <w:num w:numId="50" w16cid:durableId="224419455">
-    <w:abstractNumId w:val="113"/>
+    <w:abstractNumId w:val="117"/>
   </w:num>
   <w:num w:numId="51" w16cid:durableId="1699575947">
-    <w:abstractNumId w:val="92"/>
+    <w:abstractNumId w:val="95"/>
   </w:num>
   <w:num w:numId="52" w16cid:durableId="1048916239">
+    <w:abstractNumId w:val="58"/>
+  </w:num>
+  <w:num w:numId="53" w16cid:durableId="1188711211">
+    <w:abstractNumId w:val="126"/>
+  </w:num>
+  <w:num w:numId="54" w16cid:durableId="447555614">
+    <w:abstractNumId w:val="97"/>
+  </w:num>
+  <w:num w:numId="55" w16cid:durableId="1679307268">
     <w:abstractNumId w:val="55"/>
   </w:num>
-  <w:num w:numId="53" w16cid:durableId="1188711211">
-    <w:abstractNumId w:val="122"/>
-  </w:num>
-  <w:num w:numId="54" w16cid:durableId="447555614">
-    <w:abstractNumId w:val="94"/>
-  </w:num>
-  <w:num w:numId="55" w16cid:durableId="1679307268">
-    <w:abstractNumId w:val="52"/>
-  </w:num>
   <w:num w:numId="56" w16cid:durableId="693773591">
-    <w:abstractNumId w:val="112"/>
+    <w:abstractNumId w:val="116"/>
   </w:num>
   <w:num w:numId="57" w16cid:durableId="1110473324">
-    <w:abstractNumId w:val="37"/>
+    <w:abstractNumId w:val="40"/>
   </w:num>
   <w:num w:numId="58" w16cid:durableId="842937968">
+    <w:abstractNumId w:val="70"/>
+  </w:num>
+  <w:num w:numId="59" w16cid:durableId="821121315">
+    <w:abstractNumId w:val="45"/>
+  </w:num>
+  <w:num w:numId="60" w16cid:durableId="2095394549">
+    <w:abstractNumId w:val="127"/>
+  </w:num>
+  <w:num w:numId="61" w16cid:durableId="1299921011">
+    <w:abstractNumId w:val="44"/>
+  </w:num>
+  <w:num w:numId="62" w16cid:durableId="1927420240">
+    <w:abstractNumId w:val="79"/>
+  </w:num>
+  <w:num w:numId="63" w16cid:durableId="41290043">
+    <w:abstractNumId w:val="84"/>
+  </w:num>
+  <w:num w:numId="64" w16cid:durableId="999846909">
     <w:abstractNumId w:val="67"/>
   </w:num>
-  <w:num w:numId="59" w16cid:durableId="821121315">
-    <w:abstractNumId w:val="42"/>
-  </w:num>
-  <w:num w:numId="60" w16cid:durableId="2095394549">
-    <w:abstractNumId w:val="123"/>
-  </w:num>
-  <w:num w:numId="61" w16cid:durableId="1299921011">
-    <w:abstractNumId w:val="41"/>
-  </w:num>
-  <w:num w:numId="62" w16cid:durableId="1927420240">
-    <w:abstractNumId w:val="76"/>
-  </w:num>
-  <w:num w:numId="63" w16cid:durableId="41290043">
-    <w:abstractNumId w:val="81"/>
-  </w:num>
-  <w:num w:numId="64" w16cid:durableId="999846909">
-    <w:abstractNumId w:val="64"/>
-  </w:num>
   <w:num w:numId="65" w16cid:durableId="1250969563">
-    <w:abstractNumId w:val="74"/>
+    <w:abstractNumId w:val="77"/>
   </w:num>
   <w:num w:numId="66" w16cid:durableId="484011382">
-    <w:abstractNumId w:val="103"/>
+    <w:abstractNumId w:val="106"/>
   </w:num>
   <w:num w:numId="67" w16cid:durableId="2008289242">
     <w:abstractNumId w:val="12"/>
@@ -19437,163 +20440,163 @@
     <w:abstractNumId w:val="19"/>
   </w:num>
   <w:num w:numId="69" w16cid:durableId="1296839887">
-    <w:abstractNumId w:val="80"/>
+    <w:abstractNumId w:val="83"/>
   </w:num>
   <w:num w:numId="70" w16cid:durableId="336662050">
-    <w:abstractNumId w:val="91"/>
+    <w:abstractNumId w:val="94"/>
   </w:num>
   <w:num w:numId="71" w16cid:durableId="1460032333">
-    <w:abstractNumId w:val="109"/>
+    <w:abstractNumId w:val="112"/>
   </w:num>
   <w:num w:numId="72" w16cid:durableId="592400615">
     <w:abstractNumId w:val="8"/>
   </w:num>
   <w:num w:numId="73" w16cid:durableId="1879049234">
+    <w:abstractNumId w:val="37"/>
+  </w:num>
+  <w:num w:numId="74" w16cid:durableId="1747679558">
+    <w:abstractNumId w:val="41"/>
+  </w:num>
+  <w:num w:numId="75" w16cid:durableId="55278029">
+    <w:abstractNumId w:val="33"/>
+  </w:num>
+  <w:num w:numId="76" w16cid:durableId="1032193382">
     <w:abstractNumId w:val="34"/>
   </w:num>
-  <w:num w:numId="74" w16cid:durableId="1747679558">
-    <w:abstractNumId w:val="38"/>
-  </w:num>
-  <w:num w:numId="75" w16cid:durableId="55278029">
-    <w:abstractNumId w:val="31"/>
-  </w:num>
-  <w:num w:numId="76" w16cid:durableId="1032193382">
-    <w:abstractNumId w:val="32"/>
-  </w:num>
   <w:num w:numId="77" w16cid:durableId="763109604">
-    <w:abstractNumId w:val="83"/>
+    <w:abstractNumId w:val="86"/>
   </w:num>
   <w:num w:numId="78" w16cid:durableId="2138137265">
-    <w:abstractNumId w:val="96"/>
+    <w:abstractNumId w:val="99"/>
   </w:num>
   <w:num w:numId="79" w16cid:durableId="343675924">
-    <w:abstractNumId w:val="116"/>
+    <w:abstractNumId w:val="120"/>
   </w:num>
   <w:num w:numId="80" w16cid:durableId="1823277442">
-    <w:abstractNumId w:val="40"/>
+    <w:abstractNumId w:val="43"/>
   </w:num>
   <w:num w:numId="81" w16cid:durableId="1686900155">
     <w:abstractNumId w:val="0"/>
   </w:num>
   <w:num w:numId="82" w16cid:durableId="1113326280">
-    <w:abstractNumId w:val="78"/>
+    <w:abstractNumId w:val="81"/>
   </w:num>
   <w:num w:numId="83" w16cid:durableId="1253051103">
-    <w:abstractNumId w:val="106"/>
+    <w:abstractNumId w:val="109"/>
   </w:num>
   <w:num w:numId="84" w16cid:durableId="444888444">
-    <w:abstractNumId w:val="48"/>
+    <w:abstractNumId w:val="51"/>
   </w:num>
   <w:num w:numId="85" w16cid:durableId="64299649">
-    <w:abstractNumId w:val="98"/>
+    <w:abstractNumId w:val="101"/>
   </w:num>
   <w:num w:numId="86" w16cid:durableId="868182992">
-    <w:abstractNumId w:val="61"/>
+    <w:abstractNumId w:val="64"/>
   </w:num>
   <w:num w:numId="87" w16cid:durableId="896863331">
     <w:abstractNumId w:val="24"/>
   </w:num>
   <w:num w:numId="88" w16cid:durableId="505442826">
-    <w:abstractNumId w:val="101"/>
+    <w:abstractNumId w:val="104"/>
   </w:num>
   <w:num w:numId="89" w16cid:durableId="1858763908">
-    <w:abstractNumId w:val="36"/>
+    <w:abstractNumId w:val="39"/>
   </w:num>
   <w:num w:numId="90" w16cid:durableId="1896088176">
     <w:abstractNumId w:val="13"/>
   </w:num>
   <w:num w:numId="91" w16cid:durableId="1284576603">
-    <w:abstractNumId w:val="88"/>
+    <w:abstractNumId w:val="91"/>
   </w:num>
   <w:num w:numId="92" w16cid:durableId="1963075542">
     <w:abstractNumId w:val="7"/>
   </w:num>
   <w:num w:numId="93" w16cid:durableId="787627596">
-    <w:abstractNumId w:val="77"/>
+    <w:abstractNumId w:val="80"/>
   </w:num>
   <w:num w:numId="94" w16cid:durableId="2003925799">
     <w:abstractNumId w:val="10"/>
   </w:num>
   <w:num w:numId="95" w16cid:durableId="1169102579">
-    <w:abstractNumId w:val="90"/>
+    <w:abstractNumId w:val="93"/>
   </w:num>
   <w:num w:numId="96" w16cid:durableId="1216501564">
-    <w:abstractNumId w:val="33"/>
+    <w:abstractNumId w:val="35"/>
   </w:num>
   <w:num w:numId="97" w16cid:durableId="261768216">
-    <w:abstractNumId w:val="114"/>
+    <w:abstractNumId w:val="118"/>
   </w:num>
   <w:num w:numId="98" w16cid:durableId="2141918721">
-    <w:abstractNumId w:val="72"/>
+    <w:abstractNumId w:val="75"/>
   </w:num>
   <w:num w:numId="99" w16cid:durableId="905841544">
-    <w:abstractNumId w:val="39"/>
+    <w:abstractNumId w:val="42"/>
   </w:num>
   <w:num w:numId="100" w16cid:durableId="1753887223">
-    <w:abstractNumId w:val="89"/>
+    <w:abstractNumId w:val="92"/>
   </w:num>
   <w:num w:numId="101" w16cid:durableId="1320184766">
     <w:abstractNumId w:val="28"/>
   </w:num>
   <w:num w:numId="102" w16cid:durableId="465127606">
-    <w:abstractNumId w:val="56"/>
+    <w:abstractNumId w:val="59"/>
   </w:num>
   <w:num w:numId="103" w16cid:durableId="1640451435">
-    <w:abstractNumId w:val="54"/>
+    <w:abstractNumId w:val="57"/>
   </w:num>
   <w:num w:numId="104" w16cid:durableId="942029608">
-    <w:abstractNumId w:val="50"/>
+    <w:abstractNumId w:val="53"/>
   </w:num>
   <w:num w:numId="105" w16cid:durableId="70857193">
-    <w:abstractNumId w:val="58"/>
+    <w:abstractNumId w:val="61"/>
   </w:num>
   <w:num w:numId="106" w16cid:durableId="1617908629">
-    <w:abstractNumId w:val="118"/>
+    <w:abstractNumId w:val="122"/>
   </w:num>
   <w:num w:numId="107" w16cid:durableId="970137111">
-    <w:abstractNumId w:val="128"/>
+    <w:abstractNumId w:val="132"/>
   </w:num>
   <w:num w:numId="108" w16cid:durableId="383797013">
-    <w:abstractNumId w:val="46"/>
+    <w:abstractNumId w:val="49"/>
   </w:num>
   <w:num w:numId="109" w16cid:durableId="1459567304">
-    <w:abstractNumId w:val="57"/>
+    <w:abstractNumId w:val="60"/>
   </w:num>
   <w:num w:numId="110" w16cid:durableId="862745862">
     <w:abstractNumId w:val="20"/>
   </w:num>
   <w:num w:numId="111" w16cid:durableId="1859536331">
-    <w:abstractNumId w:val="60"/>
+    <w:abstractNumId w:val="63"/>
   </w:num>
   <w:num w:numId="112" w16cid:durableId="2092697678">
-    <w:abstractNumId w:val="75"/>
+    <w:abstractNumId w:val="78"/>
   </w:num>
   <w:num w:numId="113" w16cid:durableId="1418403813">
-    <w:abstractNumId w:val="65"/>
+    <w:abstractNumId w:val="68"/>
   </w:num>
   <w:num w:numId="114" w16cid:durableId="1965042317">
-    <w:abstractNumId w:val="117"/>
+    <w:abstractNumId w:val="121"/>
   </w:num>
   <w:num w:numId="115" w16cid:durableId="670569040">
-    <w:abstractNumId w:val="53"/>
+    <w:abstractNumId w:val="56"/>
   </w:num>
   <w:num w:numId="116" w16cid:durableId="413823113">
-    <w:abstractNumId w:val="125"/>
+    <w:abstractNumId w:val="129"/>
   </w:num>
   <w:num w:numId="117" w16cid:durableId="1293747982">
-    <w:abstractNumId w:val="99"/>
+    <w:abstractNumId w:val="102"/>
   </w:num>
   <w:num w:numId="118" w16cid:durableId="1016734110">
-    <w:abstractNumId w:val="73"/>
+    <w:abstractNumId w:val="76"/>
   </w:num>
   <w:num w:numId="119" w16cid:durableId="583337306">
-    <w:abstractNumId w:val="119"/>
+    <w:abstractNumId w:val="123"/>
   </w:num>
   <w:num w:numId="120" w16cid:durableId="721096429">
-    <w:abstractNumId w:val="100"/>
+    <w:abstractNumId w:val="103"/>
   </w:num>
   <w:num w:numId="121" w16cid:durableId="299461688">
-    <w:abstractNumId w:val="79"/>
+    <w:abstractNumId w:val="82"/>
   </w:num>
   <w:num w:numId="122" w16cid:durableId="703558456">
     <w:abstractNumId w:val="11"/>
@@ -19602,25 +20605,37 @@
     <w:abstractNumId w:val="25"/>
   </w:num>
   <w:num w:numId="124" w16cid:durableId="603391478">
-    <w:abstractNumId w:val="85"/>
+    <w:abstractNumId w:val="88"/>
   </w:num>
   <w:num w:numId="125" w16cid:durableId="560529547">
-    <w:abstractNumId w:val="107"/>
+    <w:abstractNumId w:val="110"/>
   </w:num>
   <w:num w:numId="126" w16cid:durableId="1488327713">
-    <w:abstractNumId w:val="110"/>
+    <w:abstractNumId w:val="113"/>
   </w:num>
   <w:num w:numId="127" w16cid:durableId="1327660713">
-    <w:abstractNumId w:val="111"/>
+    <w:abstractNumId w:val="115"/>
   </w:num>
   <w:num w:numId="128" w16cid:durableId="2095084062">
     <w:abstractNumId w:val="6"/>
   </w:num>
   <w:num w:numId="129" w16cid:durableId="603266177">
-    <w:abstractNumId w:val="63"/>
+    <w:abstractNumId w:val="66"/>
   </w:num>
   <w:num w:numId="130" w16cid:durableId="426855422">
     <w:abstractNumId w:val="9"/>
+  </w:num>
+  <w:num w:numId="131" w16cid:durableId="1337803013">
+    <w:abstractNumId w:val="31"/>
+  </w:num>
+  <w:num w:numId="132" w16cid:durableId="1288047086">
+    <w:abstractNumId w:val="36"/>
+  </w:num>
+  <w:num w:numId="133" w16cid:durableId="208273981">
+    <w:abstractNumId w:val="32"/>
+  </w:num>
+  <w:num w:numId="134" w16cid:durableId="1601765564">
+    <w:abstractNumId w:val="114"/>
   </w:num>
   <w:numIdMacAtCleanup w:val="45"/>
 </w:numbering>

</xml_diff>

<commit_message>
Dispute State Modeling (#299) Dispute Lifecycle Analysis (#300) Dispute State Machine Diagram (#301)
</commit_message>
<xml_diff>
--- a/Sequence Specification Document.docx
+++ b/Sequence Specification Document.docx
@@ -29,18 +29,17 @@
         <w:t xml:space="preserve"> </w:t>
       </w:r>
     </w:p>
-    <w:p>
-      <w:pPr>
-        <w:spacing w:line="278" w:lineRule="auto"/>
-      </w:pPr>
-    </w:p>
+    <w:p/>
     <w:p>
       <w:pPr>
         <w:pStyle w:val="Heading2"/>
         <w:numPr>
           <w:ilvl w:val="0"/>
-          <w:numId w:val="119"/>
+          <w:numId w:val="138"/>
         </w:numPr>
+        <w:rPr>
+          <w:rFonts w:eastAsiaTheme="minorHAnsi"/>
+        </w:rPr>
       </w:pPr>
       <w:r>
         <w:br w:type="page"/>
@@ -613,7 +612,7 @@
         <w:pStyle w:val="Heading2"/>
         <w:numPr>
           <w:ilvl w:val="0"/>
-          <w:numId w:val="119"/>
+          <w:numId w:val="138"/>
         </w:numPr>
       </w:pPr>
       <w:r>
@@ -1167,7 +1166,7 @@
         <w:pStyle w:val="Heading2"/>
         <w:numPr>
           <w:ilvl w:val="0"/>
-          <w:numId w:val="119"/>
+          <w:numId w:val="138"/>
         </w:numPr>
       </w:pPr>
       <w:r>
@@ -1888,7 +1887,7 @@
         <w:pStyle w:val="Heading2"/>
         <w:numPr>
           <w:ilvl w:val="0"/>
-          <w:numId w:val="119"/>
+          <w:numId w:val="138"/>
         </w:numPr>
       </w:pPr>
       <w:r>
@@ -2371,7 +2370,501 @@
         <w:br w:type="page"/>
       </w:r>
     </w:p>
-    <w:p/>
+    <w:p>
+      <w:pPr>
+        <w:pStyle w:val="Heading2"/>
+        <w:numPr>
+          <w:ilvl w:val="0"/>
+          <w:numId w:val="138"/>
+        </w:numPr>
+      </w:pPr>
+      <w:r>
+        <w:lastRenderedPageBreak/>
+        <w:t>Disputes Lifecycle Analysis</w:t>
+      </w:r>
+    </w:p>
+    <w:p>
+      <w:r>
+        <w:t>The Dispute concept represents a problem or an issue reported by a customer or a rental agency regarding a reservation, payment, condition of a car, or other issues related to the rental. The lifecycle of such entities guarantees a consistent investigation and handling of disputes to provide fair decisions. The progress of any dispute takes place in a set of well-defined states that allow administrators to track the progress and maintain transparency for all stakeholders.</w:t>
+      </w:r>
+    </w:p>
+    <w:p>
+      <w:r>
+        <w:t>The dispute lifecycle starts when a customer or a rental agency reports a dispute on the KriGo platform. At this point, the dispute becomes Submitted, which means that the complaint has been received by the system.</w:t>
+      </w:r>
+    </w:p>
+    <w:p>
+      <w:r>
+        <w:t>Once the dispute becomes under examination of a system administrator, it changes its state to Under Investigation. This means that the administrator examines all details of the dispute, evaluates provided evidence and may contact involved parties to ask more information about the dispute.</w:t>
+      </w:r>
+    </w:p>
+    <w:p>
+      <w:r>
+        <w:t>In case there is not enough evidence to make a decision, the dispute changes its state to Awaiting Additional Information. In this situation, customers or rental agencies are asked to provide additional evidence such as documentation, photos, receipts or any other information. After this information is provided, the dispute returns back to the Under Investigation state.</w:t>
+      </w:r>
+    </w:p>
+    <w:p>
+      <w:r>
+        <w:t>After all necessary investigations, the administrator decides on how to solve the dispute. In case the complaint is valid and necessary actions have been taken (refund issued, reservation updated), the dispute changes its state to Resolved.</w:t>
+      </w:r>
+    </w:p>
+    <w:p>
+      <w:r>
+        <w:t>If the administrator finds out that the complaint is invalid or does not meet platform dispute resolution policy, the dispute becomes Rejected.</w:t>
+      </w:r>
+    </w:p>
+    <w:p>
+      <w:r>
+        <w:t>Thus, the lifecycle of a dispute provides consistent processing of all disputes on the platform.</w:t>
+      </w:r>
+    </w:p>
+    <w:p>
+      <w:pPr>
+        <w:spacing w:line="278" w:lineRule="auto"/>
+      </w:pPr>
+      <w:r>
+        <w:br w:type="page"/>
+      </w:r>
+    </w:p>
+    <w:p>
+      <w:pPr>
+        <w:rPr>
+          <w:b/>
+          <w:bCs/>
+        </w:rPr>
+      </w:pPr>
+      <w:r>
+        <w:rPr>
+          <w:b/>
+          <w:bCs/>
+        </w:rPr>
+        <w:lastRenderedPageBreak/>
+        <w:t>Dispute State Machine Diagram Documentation</w:t>
+      </w:r>
+    </w:p>
+    <w:p>
+      <w:pPr>
+        <w:rPr>
+          <w:b/>
+          <w:bCs/>
+        </w:rPr>
+      </w:pPr>
+      <w:r>
+        <w:rPr>
+          <w:b/>
+          <w:bCs/>
+        </w:rPr>
+        <w:t>Purpose</w:t>
+      </w:r>
+    </w:p>
+    <w:p>
+      <w:r>
+        <w:t>The Dispute State Machine Diagram captures the entire life cycle of a dispute in KriGo. The diagram captures the distinct states that a dispute goes through as it progresses from being raised up until the dispute is either solved or rejected. Unlike the activity diagrams, which capture the process of dispute resolution, this state machine diagram captures the changes that happen to the Dispute class as a result of administration and resolutions.</w:t>
+      </w:r>
+    </w:p>
+    <w:p>
+      <w:pPr>
+        <w:rPr>
+          <w:b/>
+          <w:bCs/>
+        </w:rPr>
+      </w:pPr>
+      <w:r>
+        <w:rPr>
+          <w:b/>
+          <w:bCs/>
+        </w:rPr>
+        <w:t>Dispute States</w:t>
+      </w:r>
+    </w:p>
+    <w:p>
+      <w:r>
+        <w:t>The dispute lifecycle consists of the following states:</w:t>
+      </w:r>
+    </w:p>
+    <w:p>
+      <w:pPr>
+        <w:pStyle w:val="ListParagraph"/>
+        <w:numPr>
+          <w:ilvl w:val="0"/>
+          <w:numId w:val="137"/>
+        </w:numPr>
+        <w:spacing w:line="360" w:lineRule="auto"/>
+      </w:pPr>
+      <w:r>
+        <w:rPr>
+          <w:b/>
+          <w:bCs/>
+        </w:rPr>
+        <w:t>Submitted:</w:t>
+      </w:r>
+      <w:r>
+        <w:t xml:space="preserve"> A customer or rental agency has created a dispute, and it is awaiting administrative review.</w:t>
+      </w:r>
+    </w:p>
+    <w:p>
+      <w:pPr>
+        <w:pStyle w:val="ListParagraph"/>
+        <w:numPr>
+          <w:ilvl w:val="0"/>
+          <w:numId w:val="137"/>
+        </w:numPr>
+        <w:spacing w:line="360" w:lineRule="auto"/>
+      </w:pPr>
+      <w:r>
+        <w:rPr>
+          <w:b/>
+          <w:bCs/>
+        </w:rPr>
+        <w:t>Under Investigation:</w:t>
+      </w:r>
+      <w:r>
+        <w:t xml:space="preserve"> A system administrator is reviewing the dispute, examining the submitted evidence, and evaluating the facts.</w:t>
+      </w:r>
+    </w:p>
+    <w:p>
+      <w:pPr>
+        <w:pStyle w:val="ListParagraph"/>
+        <w:numPr>
+          <w:ilvl w:val="0"/>
+          <w:numId w:val="137"/>
+        </w:numPr>
+        <w:spacing w:line="360" w:lineRule="auto"/>
+      </w:pPr>
+      <w:r>
+        <w:rPr>
+          <w:b/>
+          <w:bCs/>
+        </w:rPr>
+        <w:t>Awaiting Additional Information:</w:t>
+      </w:r>
+      <w:r>
+        <w:t xml:space="preserve"> Additional documentation or evidence is required before the investigation can continue.</w:t>
+      </w:r>
+    </w:p>
+    <w:p>
+      <w:pPr>
+        <w:pStyle w:val="ListParagraph"/>
+        <w:numPr>
+          <w:ilvl w:val="0"/>
+          <w:numId w:val="137"/>
+        </w:numPr>
+        <w:spacing w:line="360" w:lineRule="auto"/>
+      </w:pPr>
+      <w:r>
+        <w:rPr>
+          <w:b/>
+          <w:bCs/>
+        </w:rPr>
+        <w:t>Resolved:</w:t>
+      </w:r>
+      <w:r>
+        <w:t xml:space="preserve"> The dispute has been successfully resolved, and any necessary corrective actions, such as refunds or reservation updates, have been completed.</w:t>
+      </w:r>
+    </w:p>
+    <w:p>
+      <w:pPr>
+        <w:pStyle w:val="ListParagraph"/>
+        <w:numPr>
+          <w:ilvl w:val="0"/>
+          <w:numId w:val="137"/>
+        </w:numPr>
+        <w:spacing w:line="360" w:lineRule="auto"/>
+      </w:pPr>
+      <w:r>
+        <w:rPr>
+          <w:b/>
+          <w:bCs/>
+        </w:rPr>
+        <w:t>Rejected:</w:t>
+      </w:r>
+      <w:r>
+        <w:t xml:space="preserve"> The dispute has been investigated and rejected because it does not satisfy the platform's dispute resolution policies or lacks sufficient justification.</w:t>
+      </w:r>
+    </w:p>
+    <w:p>
+      <w:pPr>
+        <w:rPr>
+          <w:b/>
+          <w:bCs/>
+        </w:rPr>
+      </w:pPr>
+      <w:r>
+        <w:rPr>
+          <w:b/>
+          <w:bCs/>
+        </w:rPr>
+        <w:t>State Transitions</w:t>
+      </w:r>
+    </w:p>
+    <w:p>
+      <w:r>
+        <w:t xml:space="preserve">The life cycle of disputes begins with the creation of the </w:t>
+      </w:r>
+      <w:r>
+        <w:rPr>
+          <w:b/>
+          <w:bCs/>
+        </w:rPr>
+        <w:t>Submitted</w:t>
+      </w:r>
+      <w:r>
+        <w:t xml:space="preserve"> stage, which occurs once the client or rental company opens a dispute on the website. Once the administrator starts reviewing the dispute, it gets transferred to the Under Investigation stage. In case the administrator feels the need for further evidence, the dispute goes to the </w:t>
+      </w:r>
+      <w:r>
+        <w:rPr>
+          <w:b/>
+          <w:bCs/>
+        </w:rPr>
+        <w:t>Awaiting</w:t>
+      </w:r>
+      <w:r>
+        <w:t xml:space="preserve"> </w:t>
+      </w:r>
+      <w:r>
+        <w:rPr>
+          <w:b/>
+          <w:bCs/>
+        </w:rPr>
+        <w:t>Additional</w:t>
+      </w:r>
+      <w:r>
+        <w:t xml:space="preserve"> Information stage. After the documents or evidence has been received, the dispute reverts back to the </w:t>
+      </w:r>
+      <w:r>
+        <w:rPr>
+          <w:b/>
+          <w:bCs/>
+        </w:rPr>
+        <w:t>Under</w:t>
+      </w:r>
+      <w:r>
+        <w:t xml:space="preserve"> </w:t>
+      </w:r>
+      <w:r>
+        <w:rPr>
+          <w:b/>
+          <w:bCs/>
+        </w:rPr>
+        <w:t>Investigation</w:t>
+      </w:r>
+      <w:r>
+        <w:t xml:space="preserve"> stage for further evaluation. </w:t>
+      </w:r>
+    </w:p>
+    <w:p>
+      <w:r>
+        <w:t xml:space="preserve">Once the investigation has been completed, there are two possible outcomes: either the administrator finds the dispute valid and that proper actions have been taken, or the dispute moves to the </w:t>
+      </w:r>
+      <w:r>
+        <w:rPr>
+          <w:b/>
+          <w:bCs/>
+        </w:rPr>
+        <w:t>Resolved</w:t>
+      </w:r>
+      <w:r>
+        <w:t xml:space="preserve"> stage; otherwise, it gets into the </w:t>
+      </w:r>
+      <w:r>
+        <w:rPr>
+          <w:b/>
+          <w:bCs/>
+        </w:rPr>
+        <w:t>Rejected</w:t>
+      </w:r>
+      <w:r>
+        <w:t xml:space="preserve"> stage.</w:t>
+      </w:r>
+    </w:p>
+    <w:p>
+      <w:pPr>
+        <w:rPr>
+          <w:b/>
+          <w:bCs/>
+        </w:rPr>
+      </w:pPr>
+      <w:r>
+        <w:rPr>
+          <w:b/>
+          <w:bCs/>
+        </w:rPr>
+        <w:t>Terminal States</w:t>
+      </w:r>
+    </w:p>
+    <w:p>
+      <w:r>
+        <w:t>The Dispute State Machine Diagram contains two terminal states:</w:t>
+      </w:r>
+    </w:p>
+    <w:p>
+      <w:pPr>
+        <w:numPr>
+          <w:ilvl w:val="0"/>
+          <w:numId w:val="136"/>
+        </w:numPr>
+      </w:pPr>
+      <w:r>
+        <w:rPr>
+          <w:b/>
+          <w:bCs/>
+        </w:rPr>
+        <w:t>Resolved</w:t>
+      </w:r>
+      <w:r>
+        <w:t>, representing a dispute that has been successfully investigated and concluded.</w:t>
+      </w:r>
+    </w:p>
+    <w:p>
+      <w:pPr>
+        <w:numPr>
+          <w:ilvl w:val="0"/>
+          <w:numId w:val="136"/>
+        </w:numPr>
+      </w:pPr>
+      <w:r>
+        <w:rPr>
+          <w:b/>
+          <w:bCs/>
+        </w:rPr>
+        <w:t>Rejected</w:t>
+      </w:r>
+      <w:r>
+        <w:t>, representing a dispute that has been closed without corrective action.</w:t>
+      </w:r>
+    </w:p>
+    <w:p>
+      <w:r>
+        <w:t>These terminal states indicate the completion of the dispute lifecycle. Once a dispute reaches either of these states, no further transitions occur unless a new dispute is submitted.</w:t>
+      </w:r>
+    </w:p>
+    <w:p>
+      <w:pPr>
+        <w:spacing w:line="278" w:lineRule="auto"/>
+        <w:rPr>
+          <w:b/>
+          <w:bCs/>
+        </w:rPr>
+      </w:pPr>
+      <w:r>
+        <w:rPr>
+          <w:b/>
+          <w:bCs/>
+        </w:rPr>
+        <w:br w:type="page"/>
+      </w:r>
+    </w:p>
+    <w:p>
+      <w:pPr>
+        <w:rPr>
+          <w:b/>
+          <w:bCs/>
+        </w:rPr>
+      </w:pPr>
+      <w:r>
+        <w:rPr>
+          <w:b/>
+          <w:bCs/>
+        </w:rPr>
+        <w:lastRenderedPageBreak/>
+        <w:t>Conclusion</w:t>
+      </w:r>
+    </w:p>
+    <w:p>
+      <w:r>
+        <w:t>Disputes State Machine Diagram is the one that provides the complete illustration of the lifecycle of a dispute in the KriGo system. The states machine describes the process of disputes resolution in terms of stages such as disputes initiation, investigation, evidence gathering, and decision making. With the help of such a state machine, it becomes possible to ensure the structured process of dispute resolution.</w:t>
+      </w:r>
+    </w:p>
+    <w:p>
+      <w:pPr>
+        <w:keepNext/>
+      </w:pPr>
+      <w:r>
+        <w:rPr>
+          <w:noProof/>
+        </w:rPr>
+        <w:drawing>
+          <wp:inline distT="0" distB="0" distL="0" distR="0" wp14:anchorId="588EC447" wp14:editId="41767C74">
+            <wp:extent cx="5941695" cy="3027680"/>
+            <wp:effectExtent l="0" t="0" r="1905" b="1270"/>
+            <wp:docPr id="355529090" name="Picture 12"/>
+            <wp:cNvGraphicFramePr>
+              <a:graphicFrameLocks xmlns:a="http://schemas.openxmlformats.org/drawingml/2006/main" noChangeAspect="1"/>
+            </wp:cNvGraphicFramePr>
+            <a:graphic xmlns:a="http://schemas.openxmlformats.org/drawingml/2006/main">
+              <a:graphicData uri="http://schemas.openxmlformats.org/drawingml/2006/picture">
+                <pic:pic xmlns:pic="http://schemas.openxmlformats.org/drawingml/2006/picture">
+                  <pic:nvPicPr>
+                    <pic:cNvPr id="0" name="Picture 9"/>
+                    <pic:cNvPicPr>
+                      <a:picLocks noChangeAspect="1" noChangeArrowheads="1"/>
+                    </pic:cNvPicPr>
+                  </pic:nvPicPr>
+                  <pic:blipFill>
+                    <a:blip r:embed="rId12">
+                      <a:extLst>
+                        <a:ext uri="{28A0092B-C50C-407E-A947-70E740481C1C}">
+                          <a14:useLocalDpi xmlns:a14="http://schemas.microsoft.com/office/drawing/2010/main" val="0"/>
+                        </a:ext>
+                      </a:extLst>
+                    </a:blip>
+                    <a:srcRect/>
+                    <a:stretch>
+                      <a:fillRect/>
+                    </a:stretch>
+                  </pic:blipFill>
+                  <pic:spPr bwMode="auto">
+                    <a:xfrm>
+                      <a:off x="0" y="0"/>
+                      <a:ext cx="5941695" cy="3027680"/>
+                    </a:xfrm>
+                    <a:prstGeom prst="rect">
+                      <a:avLst/>
+                    </a:prstGeom>
+                    <a:noFill/>
+                    <a:ln>
+                      <a:noFill/>
+                    </a:ln>
+                  </pic:spPr>
+                </pic:pic>
+              </a:graphicData>
+            </a:graphic>
+          </wp:inline>
+        </w:drawing>
+      </w:r>
+    </w:p>
+    <w:p>
+      <w:pPr>
+        <w:pStyle w:val="Caption"/>
+      </w:pPr>
+      <w:r>
+        <w:t xml:space="preserve">Figure </w:t>
+      </w:r>
+      <w:r>
+        <w:fldChar w:fldCharType="begin"/>
+      </w:r>
+      <w:r>
+        <w:instrText xml:space="preserve"> SEQ Figure \* ARABIC </w:instrText>
+      </w:r>
+      <w:r>
+        <w:fldChar w:fldCharType="separate"/>
+      </w:r>
+      <w:r>
+        <w:rPr>
+          <w:noProof/>
+        </w:rPr>
+        <w:t>5</w:t>
+      </w:r>
+      <w:r>
+        <w:fldChar w:fldCharType="end"/>
+      </w:r>
+      <w:r>
+        <w:t xml:space="preserve"> - </w:t>
+      </w:r>
+      <w:r>
+        <w:t>Dispute State Machine Diagram</w:t>
+      </w:r>
+    </w:p>
     <w:p/>
     <w:p/>
     <w:p/>
@@ -3341,6 +3834,155 @@
     </w:lvl>
   </w:abstractNum>
   <w:abstractNum w:abstractNumId="7" w15:restartNumberingAfterBreak="0">
+    <w:nsid w:val="05B404C3"/>
+    <w:multiLevelType w:val="multilevel"/>
+    <w:tmpl w:val="B84E3E9C"/>
+    <w:lvl w:ilvl="0">
+      <w:start w:val="1"/>
+      <w:numFmt w:val="bullet"/>
+      <w:lvlText w:val=""/>
+      <w:lvlJc w:val="left"/>
+      <w:pPr>
+        <w:tabs>
+          <w:tab w:val="num" w:pos="720"/>
+        </w:tabs>
+        <w:ind w:left="720" w:hanging="360"/>
+      </w:pPr>
+      <w:rPr>
+        <w:rFonts w:ascii="Symbol" w:hAnsi="Symbol" w:hint="default"/>
+        <w:sz w:val="20"/>
+      </w:rPr>
+    </w:lvl>
+    <w:lvl w:ilvl="1" w:tentative="1">
+      <w:start w:val="1"/>
+      <w:numFmt w:val="bullet"/>
+      <w:lvlText w:val="o"/>
+      <w:lvlJc w:val="left"/>
+      <w:pPr>
+        <w:tabs>
+          <w:tab w:val="num" w:pos="1440"/>
+        </w:tabs>
+        <w:ind w:left="1440" w:hanging="360"/>
+      </w:pPr>
+      <w:rPr>
+        <w:rFonts w:ascii="Courier New" w:hAnsi="Courier New" w:hint="default"/>
+        <w:sz w:val="20"/>
+      </w:rPr>
+    </w:lvl>
+    <w:lvl w:ilvl="2" w:tentative="1">
+      <w:start w:val="1"/>
+      <w:numFmt w:val="bullet"/>
+      <w:lvlText w:val=""/>
+      <w:lvlJc w:val="left"/>
+      <w:pPr>
+        <w:tabs>
+          <w:tab w:val="num" w:pos="2160"/>
+        </w:tabs>
+        <w:ind w:left="2160" w:hanging="360"/>
+      </w:pPr>
+      <w:rPr>
+        <w:rFonts w:ascii="Wingdings" w:hAnsi="Wingdings" w:hint="default"/>
+        <w:sz w:val="20"/>
+      </w:rPr>
+    </w:lvl>
+    <w:lvl w:ilvl="3" w:tentative="1">
+      <w:start w:val="1"/>
+      <w:numFmt w:val="bullet"/>
+      <w:lvlText w:val=""/>
+      <w:lvlJc w:val="left"/>
+      <w:pPr>
+        <w:tabs>
+          <w:tab w:val="num" w:pos="2880"/>
+        </w:tabs>
+        <w:ind w:left="2880" w:hanging="360"/>
+      </w:pPr>
+      <w:rPr>
+        <w:rFonts w:ascii="Wingdings" w:hAnsi="Wingdings" w:hint="default"/>
+        <w:sz w:val="20"/>
+      </w:rPr>
+    </w:lvl>
+    <w:lvl w:ilvl="4" w:tentative="1">
+      <w:start w:val="1"/>
+      <w:numFmt w:val="bullet"/>
+      <w:lvlText w:val=""/>
+      <w:lvlJc w:val="left"/>
+      <w:pPr>
+        <w:tabs>
+          <w:tab w:val="num" w:pos="3600"/>
+        </w:tabs>
+        <w:ind w:left="3600" w:hanging="360"/>
+      </w:pPr>
+      <w:rPr>
+        <w:rFonts w:ascii="Wingdings" w:hAnsi="Wingdings" w:hint="default"/>
+        <w:sz w:val="20"/>
+      </w:rPr>
+    </w:lvl>
+    <w:lvl w:ilvl="5" w:tentative="1">
+      <w:start w:val="1"/>
+      <w:numFmt w:val="bullet"/>
+      <w:lvlText w:val=""/>
+      <w:lvlJc w:val="left"/>
+      <w:pPr>
+        <w:tabs>
+          <w:tab w:val="num" w:pos="4320"/>
+        </w:tabs>
+        <w:ind w:left="4320" w:hanging="360"/>
+      </w:pPr>
+      <w:rPr>
+        <w:rFonts w:ascii="Wingdings" w:hAnsi="Wingdings" w:hint="default"/>
+        <w:sz w:val="20"/>
+      </w:rPr>
+    </w:lvl>
+    <w:lvl w:ilvl="6" w:tentative="1">
+      <w:start w:val="1"/>
+      <w:numFmt w:val="bullet"/>
+      <w:lvlText w:val=""/>
+      <w:lvlJc w:val="left"/>
+      <w:pPr>
+        <w:tabs>
+          <w:tab w:val="num" w:pos="5040"/>
+        </w:tabs>
+        <w:ind w:left="5040" w:hanging="360"/>
+      </w:pPr>
+      <w:rPr>
+        <w:rFonts w:ascii="Wingdings" w:hAnsi="Wingdings" w:hint="default"/>
+        <w:sz w:val="20"/>
+      </w:rPr>
+    </w:lvl>
+    <w:lvl w:ilvl="7" w:tentative="1">
+      <w:start w:val="1"/>
+      <w:numFmt w:val="bullet"/>
+      <w:lvlText w:val=""/>
+      <w:lvlJc w:val="left"/>
+      <w:pPr>
+        <w:tabs>
+          <w:tab w:val="num" w:pos="5760"/>
+        </w:tabs>
+        <w:ind w:left="5760" w:hanging="360"/>
+      </w:pPr>
+      <w:rPr>
+        <w:rFonts w:ascii="Wingdings" w:hAnsi="Wingdings" w:hint="default"/>
+        <w:sz w:val="20"/>
+      </w:rPr>
+    </w:lvl>
+    <w:lvl w:ilvl="8" w:tentative="1">
+      <w:start w:val="1"/>
+      <w:numFmt w:val="bullet"/>
+      <w:lvlText w:val=""/>
+      <w:lvlJc w:val="left"/>
+      <w:pPr>
+        <w:tabs>
+          <w:tab w:val="num" w:pos="6480"/>
+        </w:tabs>
+        <w:ind w:left="6480" w:hanging="360"/>
+      </w:pPr>
+      <w:rPr>
+        <w:rFonts w:ascii="Wingdings" w:hAnsi="Wingdings" w:hint="default"/>
+        <w:sz w:val="20"/>
+      </w:rPr>
+    </w:lvl>
+  </w:abstractNum>
+  <w:abstractNum w:abstractNumId="8" w15:restartNumberingAfterBreak="0">
     <w:nsid w:val="08BB19BF"/>
     <w:multiLevelType w:val="multilevel"/>
     <w:tmpl w:val="C5807BB2"/>
@@ -3489,7 +4131,7 @@
       </w:rPr>
     </w:lvl>
   </w:abstractNum>
-  <w:abstractNum w:abstractNumId="8" w15:restartNumberingAfterBreak="0">
+  <w:abstractNum w:abstractNumId="9" w15:restartNumberingAfterBreak="0">
     <w:nsid w:val="08D32D08"/>
     <w:multiLevelType w:val="multilevel"/>
     <w:tmpl w:val="A32449CA"/>
@@ -3638,7 +4280,7 @@
       </w:rPr>
     </w:lvl>
   </w:abstractNum>
-  <w:abstractNum w:abstractNumId="9" w15:restartNumberingAfterBreak="0">
+  <w:abstractNum w:abstractNumId="10" w15:restartNumberingAfterBreak="0">
     <w:nsid w:val="09BC184C"/>
     <w:multiLevelType w:val="hybridMultilevel"/>
     <w:tmpl w:val="7E564B8A"/>
@@ -3751,7 +4393,7 @@
       </w:rPr>
     </w:lvl>
   </w:abstractNum>
-  <w:abstractNum w:abstractNumId="10" w15:restartNumberingAfterBreak="0">
+  <w:abstractNum w:abstractNumId="11" w15:restartNumberingAfterBreak="0">
     <w:nsid w:val="0AE82489"/>
     <w:multiLevelType w:val="multilevel"/>
     <w:tmpl w:val="B82C10D4"/>
@@ -3900,7 +4542,7 @@
       </w:rPr>
     </w:lvl>
   </w:abstractNum>
-  <w:abstractNum w:abstractNumId="11" w15:restartNumberingAfterBreak="0">
+  <w:abstractNum w:abstractNumId="12" w15:restartNumberingAfterBreak="0">
     <w:nsid w:val="0AED48F6"/>
     <w:multiLevelType w:val="hybridMultilevel"/>
     <w:tmpl w:val="990A8EDA"/>
@@ -4013,7 +4655,7 @@
       </w:rPr>
     </w:lvl>
   </w:abstractNum>
-  <w:abstractNum w:abstractNumId="12" w15:restartNumberingAfterBreak="0">
+  <w:abstractNum w:abstractNumId="13" w15:restartNumberingAfterBreak="0">
     <w:nsid w:val="0CC17936"/>
     <w:multiLevelType w:val="multilevel"/>
     <w:tmpl w:val="B5E0C4F8"/>
@@ -4162,7 +4804,7 @@
       </w:rPr>
     </w:lvl>
   </w:abstractNum>
-  <w:abstractNum w:abstractNumId="13" w15:restartNumberingAfterBreak="0">
+  <w:abstractNum w:abstractNumId="14" w15:restartNumberingAfterBreak="0">
     <w:nsid w:val="0E1040E2"/>
     <w:multiLevelType w:val="multilevel"/>
     <w:tmpl w:val="607CCC88"/>
@@ -4311,7 +4953,7 @@
       </w:rPr>
     </w:lvl>
   </w:abstractNum>
-  <w:abstractNum w:abstractNumId="14" w15:restartNumberingAfterBreak="0">
+  <w:abstractNum w:abstractNumId="15" w15:restartNumberingAfterBreak="0">
     <w:nsid w:val="0E2561E7"/>
     <w:multiLevelType w:val="hybridMultilevel"/>
     <w:tmpl w:val="2A6E4870"/>
@@ -4424,7 +5066,7 @@
       </w:rPr>
     </w:lvl>
   </w:abstractNum>
-  <w:abstractNum w:abstractNumId="15" w15:restartNumberingAfterBreak="0">
+  <w:abstractNum w:abstractNumId="16" w15:restartNumberingAfterBreak="0">
     <w:nsid w:val="0E841C27"/>
     <w:multiLevelType w:val="hybridMultilevel"/>
     <w:tmpl w:val="789C7F32"/>
@@ -4537,7 +5179,7 @@
       </w:rPr>
     </w:lvl>
   </w:abstractNum>
-  <w:abstractNum w:abstractNumId="16" w15:restartNumberingAfterBreak="0">
+  <w:abstractNum w:abstractNumId="17" w15:restartNumberingAfterBreak="0">
     <w:nsid w:val="0FAA2602"/>
     <w:multiLevelType w:val="hybridMultilevel"/>
     <w:tmpl w:val="C6C63128"/>
@@ -4650,7 +5292,7 @@
       </w:rPr>
     </w:lvl>
   </w:abstractNum>
-  <w:abstractNum w:abstractNumId="17" w15:restartNumberingAfterBreak="0">
+  <w:abstractNum w:abstractNumId="18" w15:restartNumberingAfterBreak="0">
     <w:nsid w:val="122550ED"/>
     <w:multiLevelType w:val="hybridMultilevel"/>
     <w:tmpl w:val="91ACE480"/>
@@ -4763,7 +5405,7 @@
       </w:rPr>
     </w:lvl>
   </w:abstractNum>
-  <w:abstractNum w:abstractNumId="18" w15:restartNumberingAfterBreak="0">
+  <w:abstractNum w:abstractNumId="19" w15:restartNumberingAfterBreak="0">
     <w:nsid w:val="124C1BAE"/>
     <w:multiLevelType w:val="hybridMultilevel"/>
     <w:tmpl w:val="04988FC0"/>
@@ -4876,7 +5518,7 @@
       </w:rPr>
     </w:lvl>
   </w:abstractNum>
-  <w:abstractNum w:abstractNumId="19" w15:restartNumberingAfterBreak="0">
+  <w:abstractNum w:abstractNumId="20" w15:restartNumberingAfterBreak="0">
     <w:nsid w:val="139F7557"/>
     <w:multiLevelType w:val="multilevel"/>
     <w:tmpl w:val="A984C1D4"/>
@@ -5025,7 +5667,7 @@
       </w:rPr>
     </w:lvl>
   </w:abstractNum>
-  <w:abstractNum w:abstractNumId="20" w15:restartNumberingAfterBreak="0">
+  <w:abstractNum w:abstractNumId="21" w15:restartNumberingAfterBreak="0">
     <w:nsid w:val="13A13D09"/>
     <w:multiLevelType w:val="multilevel"/>
     <w:tmpl w:val="92067DCC"/>
@@ -5174,7 +5816,7 @@
       </w:rPr>
     </w:lvl>
   </w:abstractNum>
-  <w:abstractNum w:abstractNumId="21" w15:restartNumberingAfterBreak="0">
+  <w:abstractNum w:abstractNumId="22" w15:restartNumberingAfterBreak="0">
     <w:nsid w:val="16D400B4"/>
     <w:multiLevelType w:val="hybridMultilevel"/>
     <w:tmpl w:val="58E6DFBE"/>
@@ -5287,7 +5929,7 @@
       </w:rPr>
     </w:lvl>
   </w:abstractNum>
-  <w:abstractNum w:abstractNumId="22" w15:restartNumberingAfterBreak="0">
+  <w:abstractNum w:abstractNumId="23" w15:restartNumberingAfterBreak="0">
     <w:nsid w:val="17236012"/>
     <w:multiLevelType w:val="hybridMultilevel"/>
     <w:tmpl w:val="DAFA46C8"/>
@@ -5400,7 +6042,7 @@
       </w:rPr>
     </w:lvl>
   </w:abstractNum>
-  <w:abstractNum w:abstractNumId="23" w15:restartNumberingAfterBreak="0">
+  <w:abstractNum w:abstractNumId="24" w15:restartNumberingAfterBreak="0">
     <w:nsid w:val="172B04C0"/>
     <w:multiLevelType w:val="hybridMultilevel"/>
     <w:tmpl w:val="B6C41D5E"/>
@@ -5513,7 +6155,7 @@
       </w:rPr>
     </w:lvl>
   </w:abstractNum>
-  <w:abstractNum w:abstractNumId="24" w15:restartNumberingAfterBreak="0">
+  <w:abstractNum w:abstractNumId="25" w15:restartNumberingAfterBreak="0">
     <w:nsid w:val="17485CCB"/>
     <w:multiLevelType w:val="multilevel"/>
     <w:tmpl w:val="397E1AE0"/>
@@ -5662,7 +6304,7 @@
       </w:rPr>
     </w:lvl>
   </w:abstractNum>
-  <w:abstractNum w:abstractNumId="25" w15:restartNumberingAfterBreak="0">
+  <w:abstractNum w:abstractNumId="26" w15:restartNumberingAfterBreak="0">
     <w:nsid w:val="17641BB2"/>
     <w:multiLevelType w:val="hybridMultilevel"/>
     <w:tmpl w:val="7206D07C"/>
@@ -5775,7 +6417,7 @@
       </w:rPr>
     </w:lvl>
   </w:abstractNum>
-  <w:abstractNum w:abstractNumId="26" w15:restartNumberingAfterBreak="0">
+  <w:abstractNum w:abstractNumId="27" w15:restartNumberingAfterBreak="0">
     <w:nsid w:val="17763D31"/>
     <w:multiLevelType w:val="hybridMultilevel"/>
     <w:tmpl w:val="6CE63304"/>
@@ -5888,7 +6530,7 @@
       </w:rPr>
     </w:lvl>
   </w:abstractNum>
-  <w:abstractNum w:abstractNumId="27" w15:restartNumberingAfterBreak="0">
+  <w:abstractNum w:abstractNumId="28" w15:restartNumberingAfterBreak="0">
     <w:nsid w:val="17B06937"/>
     <w:multiLevelType w:val="hybridMultilevel"/>
     <w:tmpl w:val="71089CF2"/>
@@ -6001,7 +6643,7 @@
       </w:rPr>
     </w:lvl>
   </w:abstractNum>
-  <w:abstractNum w:abstractNumId="28" w15:restartNumberingAfterBreak="0">
+  <w:abstractNum w:abstractNumId="29" w15:restartNumberingAfterBreak="0">
     <w:nsid w:val="190F0390"/>
     <w:multiLevelType w:val="multilevel"/>
     <w:tmpl w:val="CBE4A4A4"/>
@@ -6150,7 +6792,7 @@
       </w:rPr>
     </w:lvl>
   </w:abstractNum>
-  <w:abstractNum w:abstractNumId="29" w15:restartNumberingAfterBreak="0">
+  <w:abstractNum w:abstractNumId="30" w15:restartNumberingAfterBreak="0">
     <w:nsid w:val="195875B0"/>
     <w:multiLevelType w:val="multilevel"/>
     <w:tmpl w:val="615444D4"/>
@@ -6263,7 +6905,7 @@
       </w:pPr>
     </w:lvl>
   </w:abstractNum>
-  <w:abstractNum w:abstractNumId="30" w15:restartNumberingAfterBreak="0">
+  <w:abstractNum w:abstractNumId="31" w15:restartNumberingAfterBreak="0">
     <w:nsid w:val="197C6FD7"/>
     <w:multiLevelType w:val="hybridMultilevel"/>
     <w:tmpl w:val="D97CEAA8"/>
@@ -6376,7 +7018,7 @@
       </w:rPr>
     </w:lvl>
   </w:abstractNum>
-  <w:abstractNum w:abstractNumId="31" w15:restartNumberingAfterBreak="0">
+  <w:abstractNum w:abstractNumId="32" w15:restartNumberingAfterBreak="0">
     <w:nsid w:val="19921EC0"/>
     <w:multiLevelType w:val="multilevel"/>
     <w:tmpl w:val="AB545FB8"/>
@@ -6525,7 +7167,7 @@
       </w:rPr>
     </w:lvl>
   </w:abstractNum>
-  <w:abstractNum w:abstractNumId="32" w15:restartNumberingAfterBreak="0">
+  <w:abstractNum w:abstractNumId="33" w15:restartNumberingAfterBreak="0">
     <w:nsid w:val="1A0C7ACA"/>
     <w:multiLevelType w:val="hybridMultilevel"/>
     <w:tmpl w:val="C640FF02"/>
@@ -6638,7 +7280,7 @@
       </w:rPr>
     </w:lvl>
   </w:abstractNum>
-  <w:abstractNum w:abstractNumId="33" w15:restartNumberingAfterBreak="0">
+  <w:abstractNum w:abstractNumId="34" w15:restartNumberingAfterBreak="0">
     <w:nsid w:val="1CC60A94"/>
     <w:multiLevelType w:val="multilevel"/>
     <w:tmpl w:val="EB74741C"/>
@@ -6787,7 +7429,7 @@
       </w:rPr>
     </w:lvl>
   </w:abstractNum>
-  <w:abstractNum w:abstractNumId="34" w15:restartNumberingAfterBreak="0">
+  <w:abstractNum w:abstractNumId="35" w15:restartNumberingAfterBreak="0">
     <w:nsid w:val="1E6658CF"/>
     <w:multiLevelType w:val="multilevel"/>
     <w:tmpl w:val="762ABC5E"/>
@@ -6936,7 +7578,7 @@
       </w:rPr>
     </w:lvl>
   </w:abstractNum>
-  <w:abstractNum w:abstractNumId="35" w15:restartNumberingAfterBreak="0">
+  <w:abstractNum w:abstractNumId="36" w15:restartNumberingAfterBreak="0">
     <w:nsid w:val="1FA532B0"/>
     <w:multiLevelType w:val="multilevel"/>
     <w:tmpl w:val="8718294C"/>
@@ -7085,7 +7727,7 @@
       </w:rPr>
     </w:lvl>
   </w:abstractNum>
-  <w:abstractNum w:abstractNumId="36" w15:restartNumberingAfterBreak="0">
+  <w:abstractNum w:abstractNumId="37" w15:restartNumberingAfterBreak="0">
     <w:nsid w:val="20CE3DE5"/>
     <w:multiLevelType w:val="multilevel"/>
     <w:tmpl w:val="5596E1A2"/>
@@ -7234,7 +7876,7 @@
       </w:rPr>
     </w:lvl>
   </w:abstractNum>
-  <w:abstractNum w:abstractNumId="37" w15:restartNumberingAfterBreak="0">
+  <w:abstractNum w:abstractNumId="38" w15:restartNumberingAfterBreak="0">
     <w:nsid w:val="215C77FD"/>
     <w:multiLevelType w:val="hybridMultilevel"/>
     <w:tmpl w:val="58F41D10"/>
@@ -7323,7 +7965,7 @@
       </w:pPr>
     </w:lvl>
   </w:abstractNum>
-  <w:abstractNum w:abstractNumId="38" w15:restartNumberingAfterBreak="0">
+  <w:abstractNum w:abstractNumId="39" w15:restartNumberingAfterBreak="0">
     <w:nsid w:val="218D5909"/>
     <w:multiLevelType w:val="hybridMultilevel"/>
     <w:tmpl w:val="CC989EE4"/>
@@ -7436,7 +8078,7 @@
       </w:rPr>
     </w:lvl>
   </w:abstractNum>
-  <w:abstractNum w:abstractNumId="39" w15:restartNumberingAfterBreak="0">
+  <w:abstractNum w:abstractNumId="40" w15:restartNumberingAfterBreak="0">
     <w:nsid w:val="23E010BA"/>
     <w:multiLevelType w:val="multilevel"/>
     <w:tmpl w:val="4A16907E"/>
@@ -7585,7 +8227,7 @@
       </w:rPr>
     </w:lvl>
   </w:abstractNum>
-  <w:abstractNum w:abstractNumId="40" w15:restartNumberingAfterBreak="0">
+  <w:abstractNum w:abstractNumId="41" w15:restartNumberingAfterBreak="0">
     <w:nsid w:val="2470127A"/>
     <w:multiLevelType w:val="multilevel"/>
     <w:tmpl w:val="309E9618"/>
@@ -7734,7 +8376,7 @@
       </w:rPr>
     </w:lvl>
   </w:abstractNum>
-  <w:abstractNum w:abstractNumId="41" w15:restartNumberingAfterBreak="0">
+  <w:abstractNum w:abstractNumId="42" w15:restartNumberingAfterBreak="0">
     <w:nsid w:val="24796798"/>
     <w:multiLevelType w:val="hybridMultilevel"/>
     <w:tmpl w:val="6622BEDC"/>
@@ -7823,7 +8465,7 @@
       </w:pPr>
     </w:lvl>
   </w:abstractNum>
-  <w:abstractNum w:abstractNumId="42" w15:restartNumberingAfterBreak="0">
+  <w:abstractNum w:abstractNumId="43" w15:restartNumberingAfterBreak="0">
     <w:nsid w:val="253B76EC"/>
     <w:multiLevelType w:val="multilevel"/>
     <w:tmpl w:val="2AA67CDA"/>
@@ -7972,7 +8614,7 @@
       </w:rPr>
     </w:lvl>
   </w:abstractNum>
-  <w:abstractNum w:abstractNumId="43" w15:restartNumberingAfterBreak="0">
+  <w:abstractNum w:abstractNumId="44" w15:restartNumberingAfterBreak="0">
     <w:nsid w:val="2E4D738C"/>
     <w:multiLevelType w:val="multilevel"/>
     <w:tmpl w:val="1540BBA2"/>
@@ -8121,7 +8763,7 @@
       </w:rPr>
     </w:lvl>
   </w:abstractNum>
-  <w:abstractNum w:abstractNumId="44" w15:restartNumberingAfterBreak="0">
+  <w:abstractNum w:abstractNumId="45" w15:restartNumberingAfterBreak="0">
     <w:nsid w:val="2F0041C7"/>
     <w:multiLevelType w:val="multilevel"/>
     <w:tmpl w:val="656414FE"/>
@@ -8270,7 +8912,7 @@
       </w:rPr>
     </w:lvl>
   </w:abstractNum>
-  <w:abstractNum w:abstractNumId="45" w15:restartNumberingAfterBreak="0">
+  <w:abstractNum w:abstractNumId="46" w15:restartNumberingAfterBreak="0">
     <w:nsid w:val="304F01FA"/>
     <w:multiLevelType w:val="multilevel"/>
     <w:tmpl w:val="151C4EC6"/>
@@ -8419,7 +9061,7 @@
       </w:rPr>
     </w:lvl>
   </w:abstractNum>
-  <w:abstractNum w:abstractNumId="46" w15:restartNumberingAfterBreak="0">
+  <w:abstractNum w:abstractNumId="47" w15:restartNumberingAfterBreak="0">
     <w:nsid w:val="30BD025D"/>
     <w:multiLevelType w:val="hybridMultilevel"/>
     <w:tmpl w:val="04381C82"/>
@@ -8508,7 +9150,7 @@
       </w:pPr>
     </w:lvl>
   </w:abstractNum>
-  <w:abstractNum w:abstractNumId="47" w15:restartNumberingAfterBreak="0">
+  <w:abstractNum w:abstractNumId="48" w15:restartNumberingAfterBreak="0">
     <w:nsid w:val="327C0BA6"/>
     <w:multiLevelType w:val="hybridMultilevel"/>
     <w:tmpl w:val="2A9047EE"/>
@@ -8621,7 +9263,7 @@
       </w:rPr>
     </w:lvl>
   </w:abstractNum>
-  <w:abstractNum w:abstractNumId="48" w15:restartNumberingAfterBreak="0">
+  <w:abstractNum w:abstractNumId="49" w15:restartNumberingAfterBreak="0">
     <w:nsid w:val="338D63E8"/>
     <w:multiLevelType w:val="hybridMultilevel"/>
     <w:tmpl w:val="28D0FB50"/>
@@ -8734,7 +9376,7 @@
       </w:rPr>
     </w:lvl>
   </w:abstractNum>
-  <w:abstractNum w:abstractNumId="49" w15:restartNumberingAfterBreak="0">
+  <w:abstractNum w:abstractNumId="50" w15:restartNumberingAfterBreak="0">
     <w:nsid w:val="34182771"/>
     <w:multiLevelType w:val="multilevel"/>
     <w:tmpl w:val="2AA67CDA"/>
@@ -8883,7 +9525,7 @@
       </w:rPr>
     </w:lvl>
   </w:abstractNum>
-  <w:abstractNum w:abstractNumId="50" w15:restartNumberingAfterBreak="0">
+  <w:abstractNum w:abstractNumId="51" w15:restartNumberingAfterBreak="0">
     <w:nsid w:val="35413E58"/>
     <w:multiLevelType w:val="hybridMultilevel"/>
     <w:tmpl w:val="03C64164"/>
@@ -8996,7 +9638,7 @@
       </w:rPr>
     </w:lvl>
   </w:abstractNum>
-  <w:abstractNum w:abstractNumId="51" w15:restartNumberingAfterBreak="0">
+  <w:abstractNum w:abstractNumId="52" w15:restartNumberingAfterBreak="0">
     <w:nsid w:val="35C86AF0"/>
     <w:multiLevelType w:val="multilevel"/>
     <w:tmpl w:val="8202FCD6"/>
@@ -9145,7 +9787,7 @@
       </w:rPr>
     </w:lvl>
   </w:abstractNum>
-  <w:abstractNum w:abstractNumId="52" w15:restartNumberingAfterBreak="0">
+  <w:abstractNum w:abstractNumId="53" w15:restartNumberingAfterBreak="0">
     <w:nsid w:val="3623194A"/>
     <w:multiLevelType w:val="multilevel"/>
     <w:tmpl w:val="63F4E6F0"/>
@@ -9294,7 +9936,7 @@
       </w:rPr>
     </w:lvl>
   </w:abstractNum>
-  <w:abstractNum w:abstractNumId="53" w15:restartNumberingAfterBreak="0">
+  <w:abstractNum w:abstractNumId="54" w15:restartNumberingAfterBreak="0">
     <w:nsid w:val="36E36979"/>
     <w:multiLevelType w:val="multilevel"/>
     <w:tmpl w:val="3D58C93A"/>
@@ -9443,7 +10085,7 @@
       </w:rPr>
     </w:lvl>
   </w:abstractNum>
-  <w:abstractNum w:abstractNumId="54" w15:restartNumberingAfterBreak="0">
+  <w:abstractNum w:abstractNumId="55" w15:restartNumberingAfterBreak="0">
     <w:nsid w:val="37B424C3"/>
     <w:multiLevelType w:val="hybridMultilevel"/>
     <w:tmpl w:val="18F030D4"/>
@@ -9556,7 +10198,7 @@
       </w:rPr>
     </w:lvl>
   </w:abstractNum>
-  <w:abstractNum w:abstractNumId="55" w15:restartNumberingAfterBreak="0">
+  <w:abstractNum w:abstractNumId="56" w15:restartNumberingAfterBreak="0">
     <w:nsid w:val="3BC10D30"/>
     <w:multiLevelType w:val="multilevel"/>
     <w:tmpl w:val="502AD78C"/>
@@ -9705,7 +10347,7 @@
       </w:rPr>
     </w:lvl>
   </w:abstractNum>
-  <w:abstractNum w:abstractNumId="56" w15:restartNumberingAfterBreak="0">
+  <w:abstractNum w:abstractNumId="57" w15:restartNumberingAfterBreak="0">
     <w:nsid w:val="3C276BB8"/>
     <w:multiLevelType w:val="multilevel"/>
     <w:tmpl w:val="2AA67CDA"/>
@@ -9854,7 +10496,7 @@
       </w:rPr>
     </w:lvl>
   </w:abstractNum>
-  <w:abstractNum w:abstractNumId="57" w15:restartNumberingAfterBreak="0">
+  <w:abstractNum w:abstractNumId="58" w15:restartNumberingAfterBreak="0">
     <w:nsid w:val="3C596808"/>
     <w:multiLevelType w:val="multilevel"/>
     <w:tmpl w:val="2AA67CDA"/>
@@ -10003,7 +10645,7 @@
       </w:rPr>
     </w:lvl>
   </w:abstractNum>
-  <w:abstractNum w:abstractNumId="58" w15:restartNumberingAfterBreak="0">
+  <w:abstractNum w:abstractNumId="59" w15:restartNumberingAfterBreak="0">
     <w:nsid w:val="3CBF280A"/>
     <w:multiLevelType w:val="multilevel"/>
     <w:tmpl w:val="A13E4362"/>
@@ -10152,7 +10794,7 @@
       </w:rPr>
     </w:lvl>
   </w:abstractNum>
-  <w:abstractNum w:abstractNumId="59" w15:restartNumberingAfterBreak="0">
+  <w:abstractNum w:abstractNumId="60" w15:restartNumberingAfterBreak="0">
     <w:nsid w:val="3CC7541B"/>
     <w:multiLevelType w:val="multilevel"/>
     <w:tmpl w:val="2AA67CDA"/>
@@ -10301,7 +10943,7 @@
       </w:rPr>
     </w:lvl>
   </w:abstractNum>
-  <w:abstractNum w:abstractNumId="60" w15:restartNumberingAfterBreak="0">
+  <w:abstractNum w:abstractNumId="61" w15:restartNumberingAfterBreak="0">
     <w:nsid w:val="3F5E3BA1"/>
     <w:multiLevelType w:val="multilevel"/>
     <w:tmpl w:val="2AA67CDA"/>
@@ -10450,7 +11092,7 @@
       </w:rPr>
     </w:lvl>
   </w:abstractNum>
-  <w:abstractNum w:abstractNumId="61" w15:restartNumberingAfterBreak="0">
+  <w:abstractNum w:abstractNumId="62" w15:restartNumberingAfterBreak="0">
     <w:nsid w:val="40431B1C"/>
     <w:multiLevelType w:val="multilevel"/>
     <w:tmpl w:val="5D8E77D0"/>
@@ -10599,7 +11241,7 @@
       </w:rPr>
     </w:lvl>
   </w:abstractNum>
-  <w:abstractNum w:abstractNumId="62" w15:restartNumberingAfterBreak="0">
+  <w:abstractNum w:abstractNumId="63" w15:restartNumberingAfterBreak="0">
     <w:nsid w:val="452F60FB"/>
     <w:multiLevelType w:val="hybridMultilevel"/>
     <w:tmpl w:val="892A990A"/>
@@ -10712,7 +11354,7 @@
       </w:rPr>
     </w:lvl>
   </w:abstractNum>
-  <w:abstractNum w:abstractNumId="63" w15:restartNumberingAfterBreak="0">
+  <w:abstractNum w:abstractNumId="64" w15:restartNumberingAfterBreak="0">
     <w:nsid w:val="47B65409"/>
     <w:multiLevelType w:val="multilevel"/>
     <w:tmpl w:val="2AA67CDA"/>
@@ -10861,7 +11503,7 @@
       </w:rPr>
     </w:lvl>
   </w:abstractNum>
-  <w:abstractNum w:abstractNumId="64" w15:restartNumberingAfterBreak="0">
+  <w:abstractNum w:abstractNumId="65" w15:restartNumberingAfterBreak="0">
     <w:nsid w:val="47BF2170"/>
     <w:multiLevelType w:val="multilevel"/>
     <w:tmpl w:val="D9681266"/>
@@ -11010,7 +11652,7 @@
       </w:rPr>
     </w:lvl>
   </w:abstractNum>
-  <w:abstractNum w:abstractNumId="65" w15:restartNumberingAfterBreak="0">
+  <w:abstractNum w:abstractNumId="66" w15:restartNumberingAfterBreak="0">
     <w:nsid w:val="47E5592F"/>
     <w:multiLevelType w:val="hybridMultilevel"/>
     <w:tmpl w:val="719AB9FA"/>
@@ -11123,7 +11765,7 @@
       </w:rPr>
     </w:lvl>
   </w:abstractNum>
-  <w:abstractNum w:abstractNumId="66" w15:restartNumberingAfterBreak="0">
+  <w:abstractNum w:abstractNumId="67" w15:restartNumberingAfterBreak="0">
     <w:nsid w:val="48204158"/>
     <w:multiLevelType w:val="multilevel"/>
     <w:tmpl w:val="1F9C21B4"/>
@@ -11272,7 +11914,7 @@
       </w:rPr>
     </w:lvl>
   </w:abstractNum>
-  <w:abstractNum w:abstractNumId="67" w15:restartNumberingAfterBreak="0">
+  <w:abstractNum w:abstractNumId="68" w15:restartNumberingAfterBreak="0">
     <w:nsid w:val="48C041A9"/>
     <w:multiLevelType w:val="multilevel"/>
     <w:tmpl w:val="59A694BC"/>
@@ -11421,7 +12063,7 @@
       </w:rPr>
     </w:lvl>
   </w:abstractNum>
-  <w:abstractNum w:abstractNumId="68" w15:restartNumberingAfterBreak="0">
+  <w:abstractNum w:abstractNumId="69" w15:restartNumberingAfterBreak="0">
     <w:nsid w:val="49D6568A"/>
     <w:multiLevelType w:val="multilevel"/>
     <w:tmpl w:val="559E29EC"/>
@@ -11570,7 +12212,7 @@
       </w:rPr>
     </w:lvl>
   </w:abstractNum>
-  <w:abstractNum w:abstractNumId="69" w15:restartNumberingAfterBreak="0">
+  <w:abstractNum w:abstractNumId="70" w15:restartNumberingAfterBreak="0">
     <w:nsid w:val="4AF73293"/>
     <w:multiLevelType w:val="hybridMultilevel"/>
     <w:tmpl w:val="F2962738"/>
@@ -11683,7 +12325,7 @@
       </w:rPr>
     </w:lvl>
   </w:abstractNum>
-  <w:abstractNum w:abstractNumId="70" w15:restartNumberingAfterBreak="0">
+  <w:abstractNum w:abstractNumId="71" w15:restartNumberingAfterBreak="0">
     <w:nsid w:val="4B375248"/>
     <w:multiLevelType w:val="multilevel"/>
     <w:tmpl w:val="B574C1C6"/>
@@ -11832,7 +12474,7 @@
       </w:rPr>
     </w:lvl>
   </w:abstractNum>
-  <w:abstractNum w:abstractNumId="71" w15:restartNumberingAfterBreak="0">
+  <w:abstractNum w:abstractNumId="72" w15:restartNumberingAfterBreak="0">
     <w:nsid w:val="4BA13766"/>
     <w:multiLevelType w:val="multilevel"/>
     <w:tmpl w:val="63F4E6F0"/>
@@ -11981,7 +12623,7 @@
       </w:rPr>
     </w:lvl>
   </w:abstractNum>
-  <w:abstractNum w:abstractNumId="72" w15:restartNumberingAfterBreak="0">
+  <w:abstractNum w:abstractNumId="73" w15:restartNumberingAfterBreak="0">
     <w:nsid w:val="4BA25441"/>
     <w:multiLevelType w:val="hybridMultilevel"/>
     <w:tmpl w:val="217E2E96"/>
@@ -12094,7 +12736,7 @@
       </w:rPr>
     </w:lvl>
   </w:abstractNum>
-  <w:abstractNum w:abstractNumId="73" w15:restartNumberingAfterBreak="0">
+  <w:abstractNum w:abstractNumId="74" w15:restartNumberingAfterBreak="0">
     <w:nsid w:val="4E276DCB"/>
     <w:multiLevelType w:val="hybridMultilevel"/>
     <w:tmpl w:val="B7C469B4"/>
@@ -12207,7 +12849,245 @@
       </w:rPr>
     </w:lvl>
   </w:abstractNum>
-  <w:abstractNum w:abstractNumId="74" w15:restartNumberingAfterBreak="0">
+  <w:abstractNum w:abstractNumId="75" w15:restartNumberingAfterBreak="0">
+    <w:nsid w:val="4E4A23D7"/>
+    <w:multiLevelType w:val="hybridMultilevel"/>
+    <w:tmpl w:val="D368B748"/>
+    <w:lvl w:ilvl="0" w:tplc="C31A4754">
+      <w:start w:val="1"/>
+      <w:numFmt w:val="decimal"/>
+      <w:lvlText w:val="%1-"/>
+      <w:lvlJc w:val="left"/>
+      <w:pPr>
+        <w:ind w:left="360" w:hanging="360"/>
+      </w:pPr>
+      <w:rPr>
+        <w:rFonts w:eastAsiaTheme="majorEastAsia" w:hint="default"/>
+      </w:rPr>
+    </w:lvl>
+    <w:lvl w:ilvl="1" w:tplc="04090019" w:tentative="1">
+      <w:start w:val="1"/>
+      <w:numFmt w:val="lowerLetter"/>
+      <w:lvlText w:val="%2."/>
+      <w:lvlJc w:val="left"/>
+      <w:pPr>
+        <w:ind w:left="1080" w:hanging="360"/>
+      </w:pPr>
+    </w:lvl>
+    <w:lvl w:ilvl="2" w:tplc="0409001B" w:tentative="1">
+      <w:start w:val="1"/>
+      <w:numFmt w:val="lowerRoman"/>
+      <w:lvlText w:val="%3."/>
+      <w:lvlJc w:val="right"/>
+      <w:pPr>
+        <w:ind w:left="1800" w:hanging="180"/>
+      </w:pPr>
+    </w:lvl>
+    <w:lvl w:ilvl="3" w:tplc="0409000F" w:tentative="1">
+      <w:start w:val="1"/>
+      <w:numFmt w:val="decimal"/>
+      <w:lvlText w:val="%4."/>
+      <w:lvlJc w:val="left"/>
+      <w:pPr>
+        <w:ind w:left="2520" w:hanging="360"/>
+      </w:pPr>
+    </w:lvl>
+    <w:lvl w:ilvl="4" w:tplc="04090019" w:tentative="1">
+      <w:start w:val="1"/>
+      <w:numFmt w:val="lowerLetter"/>
+      <w:lvlText w:val="%5."/>
+      <w:lvlJc w:val="left"/>
+      <w:pPr>
+        <w:ind w:left="3240" w:hanging="360"/>
+      </w:pPr>
+    </w:lvl>
+    <w:lvl w:ilvl="5" w:tplc="0409001B" w:tentative="1">
+      <w:start w:val="1"/>
+      <w:numFmt w:val="lowerRoman"/>
+      <w:lvlText w:val="%6."/>
+      <w:lvlJc w:val="right"/>
+      <w:pPr>
+        <w:ind w:left="3960" w:hanging="180"/>
+      </w:pPr>
+    </w:lvl>
+    <w:lvl w:ilvl="6" w:tplc="0409000F" w:tentative="1">
+      <w:start w:val="1"/>
+      <w:numFmt w:val="decimal"/>
+      <w:lvlText w:val="%7."/>
+      <w:lvlJc w:val="left"/>
+      <w:pPr>
+        <w:ind w:left="4680" w:hanging="360"/>
+      </w:pPr>
+    </w:lvl>
+    <w:lvl w:ilvl="7" w:tplc="04090019" w:tentative="1">
+      <w:start w:val="1"/>
+      <w:numFmt w:val="lowerLetter"/>
+      <w:lvlText w:val="%8."/>
+      <w:lvlJc w:val="left"/>
+      <w:pPr>
+        <w:ind w:left="5400" w:hanging="360"/>
+      </w:pPr>
+    </w:lvl>
+    <w:lvl w:ilvl="8" w:tplc="0409001B" w:tentative="1">
+      <w:start w:val="1"/>
+      <w:numFmt w:val="lowerRoman"/>
+      <w:lvlText w:val="%9."/>
+      <w:lvlJc w:val="right"/>
+      <w:pPr>
+        <w:ind w:left="6120" w:hanging="180"/>
+      </w:pPr>
+    </w:lvl>
+  </w:abstractNum>
+  <w:abstractNum w:abstractNumId="76" w15:restartNumberingAfterBreak="0">
+    <w:nsid w:val="4EA42E41"/>
+    <w:multiLevelType w:val="multilevel"/>
+    <w:tmpl w:val="520AA3DC"/>
+    <w:lvl w:ilvl="0">
+      <w:start w:val="1"/>
+      <w:numFmt w:val="bullet"/>
+      <w:lvlText w:val=""/>
+      <w:lvlJc w:val="left"/>
+      <w:pPr>
+        <w:tabs>
+          <w:tab w:val="num" w:pos="720"/>
+        </w:tabs>
+        <w:ind w:left="720" w:hanging="360"/>
+      </w:pPr>
+      <w:rPr>
+        <w:rFonts w:ascii="Symbol" w:hAnsi="Symbol" w:hint="default"/>
+        <w:sz w:val="20"/>
+      </w:rPr>
+    </w:lvl>
+    <w:lvl w:ilvl="1" w:tentative="1">
+      <w:start w:val="1"/>
+      <w:numFmt w:val="bullet"/>
+      <w:lvlText w:val="o"/>
+      <w:lvlJc w:val="left"/>
+      <w:pPr>
+        <w:tabs>
+          <w:tab w:val="num" w:pos="1440"/>
+        </w:tabs>
+        <w:ind w:left="1440" w:hanging="360"/>
+      </w:pPr>
+      <w:rPr>
+        <w:rFonts w:ascii="Courier New" w:hAnsi="Courier New" w:hint="default"/>
+        <w:sz w:val="20"/>
+      </w:rPr>
+    </w:lvl>
+    <w:lvl w:ilvl="2" w:tentative="1">
+      <w:start w:val="1"/>
+      <w:numFmt w:val="bullet"/>
+      <w:lvlText w:val=""/>
+      <w:lvlJc w:val="left"/>
+      <w:pPr>
+        <w:tabs>
+          <w:tab w:val="num" w:pos="2160"/>
+        </w:tabs>
+        <w:ind w:left="2160" w:hanging="360"/>
+      </w:pPr>
+      <w:rPr>
+        <w:rFonts w:ascii="Wingdings" w:hAnsi="Wingdings" w:hint="default"/>
+        <w:sz w:val="20"/>
+      </w:rPr>
+    </w:lvl>
+    <w:lvl w:ilvl="3" w:tentative="1">
+      <w:start w:val="1"/>
+      <w:numFmt w:val="bullet"/>
+      <w:lvlText w:val=""/>
+      <w:lvlJc w:val="left"/>
+      <w:pPr>
+        <w:tabs>
+          <w:tab w:val="num" w:pos="2880"/>
+        </w:tabs>
+        <w:ind w:left="2880" w:hanging="360"/>
+      </w:pPr>
+      <w:rPr>
+        <w:rFonts w:ascii="Wingdings" w:hAnsi="Wingdings" w:hint="default"/>
+        <w:sz w:val="20"/>
+      </w:rPr>
+    </w:lvl>
+    <w:lvl w:ilvl="4" w:tentative="1">
+      <w:start w:val="1"/>
+      <w:numFmt w:val="bullet"/>
+      <w:lvlText w:val=""/>
+      <w:lvlJc w:val="left"/>
+      <w:pPr>
+        <w:tabs>
+          <w:tab w:val="num" w:pos="3600"/>
+        </w:tabs>
+        <w:ind w:left="3600" w:hanging="360"/>
+      </w:pPr>
+      <w:rPr>
+        <w:rFonts w:ascii="Wingdings" w:hAnsi="Wingdings" w:hint="default"/>
+        <w:sz w:val="20"/>
+      </w:rPr>
+    </w:lvl>
+    <w:lvl w:ilvl="5" w:tentative="1">
+      <w:start w:val="1"/>
+      <w:numFmt w:val="bullet"/>
+      <w:lvlText w:val=""/>
+      <w:lvlJc w:val="left"/>
+      <w:pPr>
+        <w:tabs>
+          <w:tab w:val="num" w:pos="4320"/>
+        </w:tabs>
+        <w:ind w:left="4320" w:hanging="360"/>
+      </w:pPr>
+      <w:rPr>
+        <w:rFonts w:ascii="Wingdings" w:hAnsi="Wingdings" w:hint="default"/>
+        <w:sz w:val="20"/>
+      </w:rPr>
+    </w:lvl>
+    <w:lvl w:ilvl="6" w:tentative="1">
+      <w:start w:val="1"/>
+      <w:numFmt w:val="bullet"/>
+      <w:lvlText w:val=""/>
+      <w:lvlJc w:val="left"/>
+      <w:pPr>
+        <w:tabs>
+          <w:tab w:val="num" w:pos="5040"/>
+        </w:tabs>
+        <w:ind w:left="5040" w:hanging="360"/>
+      </w:pPr>
+      <w:rPr>
+        <w:rFonts w:ascii="Wingdings" w:hAnsi="Wingdings" w:hint="default"/>
+        <w:sz w:val="20"/>
+      </w:rPr>
+    </w:lvl>
+    <w:lvl w:ilvl="7" w:tentative="1">
+      <w:start w:val="1"/>
+      <w:numFmt w:val="bullet"/>
+      <w:lvlText w:val=""/>
+      <w:lvlJc w:val="left"/>
+      <w:pPr>
+        <w:tabs>
+          <w:tab w:val="num" w:pos="5760"/>
+        </w:tabs>
+        <w:ind w:left="5760" w:hanging="360"/>
+      </w:pPr>
+      <w:rPr>
+        <w:rFonts w:ascii="Wingdings" w:hAnsi="Wingdings" w:hint="default"/>
+        <w:sz w:val="20"/>
+      </w:rPr>
+    </w:lvl>
+    <w:lvl w:ilvl="8" w:tentative="1">
+      <w:start w:val="1"/>
+      <w:numFmt w:val="bullet"/>
+      <w:lvlText w:val=""/>
+      <w:lvlJc w:val="left"/>
+      <w:pPr>
+        <w:tabs>
+          <w:tab w:val="num" w:pos="6480"/>
+        </w:tabs>
+        <w:ind w:left="6480" w:hanging="360"/>
+      </w:pPr>
+      <w:rPr>
+        <w:rFonts w:ascii="Wingdings" w:hAnsi="Wingdings" w:hint="default"/>
+        <w:sz w:val="20"/>
+      </w:rPr>
+    </w:lvl>
+  </w:abstractNum>
+  <w:abstractNum w:abstractNumId="77" w15:restartNumberingAfterBreak="0">
     <w:nsid w:val="4F053929"/>
     <w:multiLevelType w:val="hybridMultilevel"/>
     <w:tmpl w:val="2A78C678"/>
@@ -12320,7 +13200,7 @@
       </w:rPr>
     </w:lvl>
   </w:abstractNum>
-  <w:abstractNum w:abstractNumId="75" w15:restartNumberingAfterBreak="0">
+  <w:abstractNum w:abstractNumId="78" w15:restartNumberingAfterBreak="0">
     <w:nsid w:val="4FFB237E"/>
     <w:multiLevelType w:val="multilevel"/>
     <w:tmpl w:val="2AA67CDA"/>
@@ -12469,7 +13349,7 @@
       </w:rPr>
     </w:lvl>
   </w:abstractNum>
-  <w:abstractNum w:abstractNumId="76" w15:restartNumberingAfterBreak="0">
+  <w:abstractNum w:abstractNumId="79" w15:restartNumberingAfterBreak="0">
     <w:nsid w:val="50476F20"/>
     <w:multiLevelType w:val="hybridMultilevel"/>
     <w:tmpl w:val="85B03D5E"/>
@@ -12558,7 +13438,7 @@
       </w:pPr>
     </w:lvl>
   </w:abstractNum>
-  <w:abstractNum w:abstractNumId="77" w15:restartNumberingAfterBreak="0">
+  <w:abstractNum w:abstractNumId="80" w15:restartNumberingAfterBreak="0">
     <w:nsid w:val="51737FE0"/>
     <w:multiLevelType w:val="hybridMultilevel"/>
     <w:tmpl w:val="2B0604E6"/>
@@ -12671,7 +13551,7 @@
       </w:rPr>
     </w:lvl>
   </w:abstractNum>
-  <w:abstractNum w:abstractNumId="78" w15:restartNumberingAfterBreak="0">
+  <w:abstractNum w:abstractNumId="81" w15:restartNumberingAfterBreak="0">
     <w:nsid w:val="518B1885"/>
     <w:multiLevelType w:val="multilevel"/>
     <w:tmpl w:val="AE1AAC28"/>
@@ -12820,7 +13700,7 @@
       </w:rPr>
     </w:lvl>
   </w:abstractNum>
-  <w:abstractNum w:abstractNumId="79" w15:restartNumberingAfterBreak="0">
+  <w:abstractNum w:abstractNumId="82" w15:restartNumberingAfterBreak="0">
     <w:nsid w:val="51A86EF8"/>
     <w:multiLevelType w:val="multilevel"/>
     <w:tmpl w:val="FF2841D4"/>
@@ -12969,7 +13849,7 @@
       </w:rPr>
     </w:lvl>
   </w:abstractNum>
-  <w:abstractNum w:abstractNumId="80" w15:restartNumberingAfterBreak="0">
+  <w:abstractNum w:abstractNumId="83" w15:restartNumberingAfterBreak="0">
     <w:nsid w:val="521378FF"/>
     <w:multiLevelType w:val="multilevel"/>
     <w:tmpl w:val="7B002268"/>
@@ -13118,7 +13998,7 @@
       </w:rPr>
     </w:lvl>
   </w:abstractNum>
-  <w:abstractNum w:abstractNumId="81" w15:restartNumberingAfterBreak="0">
+  <w:abstractNum w:abstractNumId="84" w15:restartNumberingAfterBreak="0">
     <w:nsid w:val="521F2792"/>
     <w:multiLevelType w:val="multilevel"/>
     <w:tmpl w:val="9FB45386"/>
@@ -13267,7 +14147,7 @@
       </w:rPr>
     </w:lvl>
   </w:abstractNum>
-  <w:abstractNum w:abstractNumId="82" w15:restartNumberingAfterBreak="0">
+  <w:abstractNum w:abstractNumId="85" w15:restartNumberingAfterBreak="0">
     <w:nsid w:val="52A37FDE"/>
     <w:multiLevelType w:val="multilevel"/>
     <w:tmpl w:val="5D6EAA1A"/>
@@ -13416,7 +14296,7 @@
       </w:rPr>
     </w:lvl>
   </w:abstractNum>
-  <w:abstractNum w:abstractNumId="83" w15:restartNumberingAfterBreak="0">
+  <w:abstractNum w:abstractNumId="86" w15:restartNumberingAfterBreak="0">
     <w:nsid w:val="53390911"/>
     <w:multiLevelType w:val="multilevel"/>
     <w:tmpl w:val="1C380F12"/>
@@ -13565,7 +14445,7 @@
       </w:rPr>
     </w:lvl>
   </w:abstractNum>
-  <w:abstractNum w:abstractNumId="84" w15:restartNumberingAfterBreak="0">
+  <w:abstractNum w:abstractNumId="87" w15:restartNumberingAfterBreak="0">
     <w:nsid w:val="53CD23AC"/>
     <w:multiLevelType w:val="multilevel"/>
     <w:tmpl w:val="57BAE8F0"/>
@@ -13714,7 +14594,7 @@
       </w:rPr>
     </w:lvl>
   </w:abstractNum>
-  <w:abstractNum w:abstractNumId="85" w15:restartNumberingAfterBreak="0">
+  <w:abstractNum w:abstractNumId="88" w15:restartNumberingAfterBreak="0">
     <w:nsid w:val="5462791F"/>
     <w:multiLevelType w:val="hybridMultilevel"/>
     <w:tmpl w:val="FDE24C26"/>
@@ -13827,7 +14707,7 @@
       </w:rPr>
     </w:lvl>
   </w:abstractNum>
-  <w:abstractNum w:abstractNumId="86" w15:restartNumberingAfterBreak="0">
+  <w:abstractNum w:abstractNumId="89" w15:restartNumberingAfterBreak="0">
     <w:nsid w:val="547005EB"/>
     <w:multiLevelType w:val="multilevel"/>
     <w:tmpl w:val="F260CC5C"/>
@@ -13976,7 +14856,7 @@
       </w:rPr>
     </w:lvl>
   </w:abstractNum>
-  <w:abstractNum w:abstractNumId="87" w15:restartNumberingAfterBreak="0">
+  <w:abstractNum w:abstractNumId="90" w15:restartNumberingAfterBreak="0">
     <w:nsid w:val="58034221"/>
     <w:multiLevelType w:val="hybridMultilevel"/>
     <w:tmpl w:val="65D0619C"/>
@@ -14089,7 +14969,7 @@
       </w:rPr>
     </w:lvl>
   </w:abstractNum>
-  <w:abstractNum w:abstractNumId="88" w15:restartNumberingAfterBreak="0">
+  <w:abstractNum w:abstractNumId="91" w15:restartNumberingAfterBreak="0">
     <w:nsid w:val="588F256D"/>
     <w:multiLevelType w:val="multilevel"/>
     <w:tmpl w:val="E8F493CA"/>
@@ -14238,7 +15118,7 @@
       </w:rPr>
     </w:lvl>
   </w:abstractNum>
-  <w:abstractNum w:abstractNumId="89" w15:restartNumberingAfterBreak="0">
+  <w:abstractNum w:abstractNumId="92" w15:restartNumberingAfterBreak="0">
     <w:nsid w:val="5A460390"/>
     <w:multiLevelType w:val="hybridMultilevel"/>
     <w:tmpl w:val="BD8E939C"/>
@@ -14351,7 +15231,7 @@
       </w:rPr>
     </w:lvl>
   </w:abstractNum>
-  <w:abstractNum w:abstractNumId="90" w15:restartNumberingAfterBreak="0">
+  <w:abstractNum w:abstractNumId="93" w15:restartNumberingAfterBreak="0">
     <w:nsid w:val="5CEE630B"/>
     <w:multiLevelType w:val="hybridMultilevel"/>
     <w:tmpl w:val="DE8E8DBA"/>
@@ -14464,7 +15344,7 @@
       </w:rPr>
     </w:lvl>
   </w:abstractNum>
-  <w:abstractNum w:abstractNumId="91" w15:restartNumberingAfterBreak="0">
+  <w:abstractNum w:abstractNumId="94" w15:restartNumberingAfterBreak="0">
     <w:nsid w:val="5D5A183C"/>
     <w:multiLevelType w:val="multilevel"/>
     <w:tmpl w:val="C804C34A"/>
@@ -14613,7 +15493,7 @@
       </w:rPr>
     </w:lvl>
   </w:abstractNum>
-  <w:abstractNum w:abstractNumId="92" w15:restartNumberingAfterBreak="0">
+  <w:abstractNum w:abstractNumId="95" w15:restartNumberingAfterBreak="0">
     <w:nsid w:val="5DF95194"/>
     <w:multiLevelType w:val="multilevel"/>
     <w:tmpl w:val="CC127E54"/>
@@ -14762,7 +15642,7 @@
       </w:rPr>
     </w:lvl>
   </w:abstractNum>
-  <w:abstractNum w:abstractNumId="93" w15:restartNumberingAfterBreak="0">
+  <w:abstractNum w:abstractNumId="96" w15:restartNumberingAfterBreak="0">
     <w:nsid w:val="5E9C452C"/>
     <w:multiLevelType w:val="multilevel"/>
     <w:tmpl w:val="B8727936"/>
@@ -14911,7 +15791,7 @@
       </w:rPr>
     </w:lvl>
   </w:abstractNum>
-  <w:abstractNum w:abstractNumId="94" w15:restartNumberingAfterBreak="0">
+  <w:abstractNum w:abstractNumId="97" w15:restartNumberingAfterBreak="0">
     <w:nsid w:val="62385AA6"/>
     <w:multiLevelType w:val="multilevel"/>
     <w:tmpl w:val="B9EAECD4"/>
@@ -15060,7 +15940,7 @@
       </w:rPr>
     </w:lvl>
   </w:abstractNum>
-  <w:abstractNum w:abstractNumId="95" w15:restartNumberingAfterBreak="0">
+  <w:abstractNum w:abstractNumId="98" w15:restartNumberingAfterBreak="0">
     <w:nsid w:val="625D686D"/>
     <w:multiLevelType w:val="multilevel"/>
     <w:tmpl w:val="BC1C2048"/>
@@ -15209,7 +16089,7 @@
       </w:rPr>
     </w:lvl>
   </w:abstractNum>
-  <w:abstractNum w:abstractNumId="96" w15:restartNumberingAfterBreak="0">
+  <w:abstractNum w:abstractNumId="99" w15:restartNumberingAfterBreak="0">
     <w:nsid w:val="62B46951"/>
     <w:multiLevelType w:val="hybridMultilevel"/>
     <w:tmpl w:val="0FEAFEC6"/>
@@ -15322,7 +16202,7 @@
       </w:rPr>
     </w:lvl>
   </w:abstractNum>
-  <w:abstractNum w:abstractNumId="97" w15:restartNumberingAfterBreak="0">
+  <w:abstractNum w:abstractNumId="100" w15:restartNumberingAfterBreak="0">
     <w:nsid w:val="647819E3"/>
     <w:multiLevelType w:val="multilevel"/>
     <w:tmpl w:val="ABB278BC"/>
@@ -15471,7 +16351,7 @@
       </w:rPr>
     </w:lvl>
   </w:abstractNum>
-  <w:abstractNum w:abstractNumId="98" w15:restartNumberingAfterBreak="0">
+  <w:abstractNum w:abstractNumId="101" w15:restartNumberingAfterBreak="0">
     <w:nsid w:val="64F30198"/>
     <w:multiLevelType w:val="multilevel"/>
     <w:tmpl w:val="63F4E6F0"/>
@@ -15620,7 +16500,7 @@
       </w:rPr>
     </w:lvl>
   </w:abstractNum>
-  <w:abstractNum w:abstractNumId="99" w15:restartNumberingAfterBreak="0">
+  <w:abstractNum w:abstractNumId="102" w15:restartNumberingAfterBreak="0">
     <w:nsid w:val="65314293"/>
     <w:multiLevelType w:val="hybridMultilevel"/>
     <w:tmpl w:val="6688DFAC"/>
@@ -15733,7 +16613,7 @@
       </w:rPr>
     </w:lvl>
   </w:abstractNum>
-  <w:abstractNum w:abstractNumId="100" w15:restartNumberingAfterBreak="0">
+  <w:abstractNum w:abstractNumId="103" w15:restartNumberingAfterBreak="0">
     <w:nsid w:val="65CE4D0F"/>
     <w:multiLevelType w:val="hybridMultilevel"/>
     <w:tmpl w:val="DB668538"/>
@@ -15846,7 +16726,7 @@
       </w:rPr>
     </w:lvl>
   </w:abstractNum>
-  <w:abstractNum w:abstractNumId="101" w15:restartNumberingAfterBreak="0">
+  <w:abstractNum w:abstractNumId="104" w15:restartNumberingAfterBreak="0">
     <w:nsid w:val="661C7D73"/>
     <w:multiLevelType w:val="multilevel"/>
     <w:tmpl w:val="D9681266"/>
@@ -15995,7 +16875,7 @@
       </w:rPr>
     </w:lvl>
   </w:abstractNum>
-  <w:abstractNum w:abstractNumId="102" w15:restartNumberingAfterBreak="0">
+  <w:abstractNum w:abstractNumId="105" w15:restartNumberingAfterBreak="0">
     <w:nsid w:val="66E36FE0"/>
     <w:multiLevelType w:val="multilevel"/>
     <w:tmpl w:val="2AA67CDA"/>
@@ -16144,7 +17024,7 @@
       </w:rPr>
     </w:lvl>
   </w:abstractNum>
-  <w:abstractNum w:abstractNumId="103" w15:restartNumberingAfterBreak="0">
+  <w:abstractNum w:abstractNumId="106" w15:restartNumberingAfterBreak="0">
     <w:nsid w:val="671F5935"/>
     <w:multiLevelType w:val="multilevel"/>
     <w:tmpl w:val="1E86702A"/>
@@ -16293,7 +17173,7 @@
       </w:rPr>
     </w:lvl>
   </w:abstractNum>
-  <w:abstractNum w:abstractNumId="104" w15:restartNumberingAfterBreak="0">
+  <w:abstractNum w:abstractNumId="107" w15:restartNumberingAfterBreak="0">
     <w:nsid w:val="68B94344"/>
     <w:multiLevelType w:val="multilevel"/>
     <w:tmpl w:val="9BA812D8"/>
@@ -16442,7 +17322,7 @@
       </w:rPr>
     </w:lvl>
   </w:abstractNum>
-  <w:abstractNum w:abstractNumId="105" w15:restartNumberingAfterBreak="0">
+  <w:abstractNum w:abstractNumId="108" w15:restartNumberingAfterBreak="0">
     <w:nsid w:val="69DE2C87"/>
     <w:multiLevelType w:val="hybridMultilevel"/>
     <w:tmpl w:val="F530F20A"/>
@@ -16555,7 +17435,7 @@
       </w:rPr>
     </w:lvl>
   </w:abstractNum>
-  <w:abstractNum w:abstractNumId="106" w15:restartNumberingAfterBreak="0">
+  <w:abstractNum w:abstractNumId="109" w15:restartNumberingAfterBreak="0">
     <w:nsid w:val="69ED672D"/>
     <w:multiLevelType w:val="multilevel"/>
     <w:tmpl w:val="CC08E300"/>
@@ -16704,7 +17584,7 @@
       </w:rPr>
     </w:lvl>
   </w:abstractNum>
-  <w:abstractNum w:abstractNumId="107" w15:restartNumberingAfterBreak="0">
+  <w:abstractNum w:abstractNumId="110" w15:restartNumberingAfterBreak="0">
     <w:nsid w:val="6A063EFD"/>
     <w:multiLevelType w:val="hybridMultilevel"/>
     <w:tmpl w:val="48703FBA"/>
@@ -16817,7 +17697,7 @@
       </w:rPr>
     </w:lvl>
   </w:abstractNum>
-  <w:abstractNum w:abstractNumId="108" w15:restartNumberingAfterBreak="0">
+  <w:abstractNum w:abstractNumId="111" w15:restartNumberingAfterBreak="0">
     <w:nsid w:val="6A825ABE"/>
     <w:multiLevelType w:val="multilevel"/>
     <w:tmpl w:val="0CD6F30E"/>
@@ -16966,7 +17846,7 @@
       </w:rPr>
     </w:lvl>
   </w:abstractNum>
-  <w:abstractNum w:abstractNumId="109" w15:restartNumberingAfterBreak="0">
+  <w:abstractNum w:abstractNumId="112" w15:restartNumberingAfterBreak="0">
     <w:nsid w:val="6B1D7832"/>
     <w:multiLevelType w:val="multilevel"/>
     <w:tmpl w:val="DD4646B2"/>
@@ -17115,7 +17995,7 @@
       </w:rPr>
     </w:lvl>
   </w:abstractNum>
-  <w:abstractNum w:abstractNumId="110" w15:restartNumberingAfterBreak="0">
+  <w:abstractNum w:abstractNumId="113" w15:restartNumberingAfterBreak="0">
     <w:nsid w:val="6BC8366D"/>
     <w:multiLevelType w:val="multilevel"/>
     <w:tmpl w:val="7C10CE5C"/>
@@ -17264,7 +18144,7 @@
       </w:rPr>
     </w:lvl>
   </w:abstractNum>
-  <w:abstractNum w:abstractNumId="111" w15:restartNumberingAfterBreak="0">
+  <w:abstractNum w:abstractNumId="114" w15:restartNumberingAfterBreak="0">
     <w:nsid w:val="6C6D6667"/>
     <w:multiLevelType w:val="hybridMultilevel"/>
     <w:tmpl w:val="A744709C"/>
@@ -17377,7 +18257,7 @@
       </w:rPr>
     </w:lvl>
   </w:abstractNum>
-  <w:abstractNum w:abstractNumId="112" w15:restartNumberingAfterBreak="0">
+  <w:abstractNum w:abstractNumId="115" w15:restartNumberingAfterBreak="0">
     <w:nsid w:val="6CAD7EA5"/>
     <w:multiLevelType w:val="multilevel"/>
     <w:tmpl w:val="C472C5B0"/>
@@ -17526,7 +18406,7 @@
       </w:rPr>
     </w:lvl>
   </w:abstractNum>
-  <w:abstractNum w:abstractNumId="113" w15:restartNumberingAfterBreak="0">
+  <w:abstractNum w:abstractNumId="116" w15:restartNumberingAfterBreak="0">
     <w:nsid w:val="6D7A28DE"/>
     <w:multiLevelType w:val="hybridMultilevel"/>
     <w:tmpl w:val="1B5875AA"/>
@@ -17639,7 +18519,7 @@
       </w:rPr>
     </w:lvl>
   </w:abstractNum>
-  <w:abstractNum w:abstractNumId="114" w15:restartNumberingAfterBreak="0">
+  <w:abstractNum w:abstractNumId="117" w15:restartNumberingAfterBreak="0">
     <w:nsid w:val="6DC443D9"/>
     <w:multiLevelType w:val="hybridMultilevel"/>
     <w:tmpl w:val="61CE7B6C"/>
@@ -17752,7 +18632,7 @@
       </w:rPr>
     </w:lvl>
   </w:abstractNum>
-  <w:abstractNum w:abstractNumId="115" w15:restartNumberingAfterBreak="0">
+  <w:abstractNum w:abstractNumId="118" w15:restartNumberingAfterBreak="0">
     <w:nsid w:val="6E2C576F"/>
     <w:multiLevelType w:val="hybridMultilevel"/>
     <w:tmpl w:val="251C1C42"/>
@@ -17865,7 +18745,7 @@
       </w:rPr>
     </w:lvl>
   </w:abstractNum>
-  <w:abstractNum w:abstractNumId="116" w15:restartNumberingAfterBreak="0">
+  <w:abstractNum w:abstractNumId="119" w15:restartNumberingAfterBreak="0">
     <w:nsid w:val="6E43557B"/>
     <w:multiLevelType w:val="multilevel"/>
     <w:tmpl w:val="323C7112"/>
@@ -18014,7 +18894,7 @@
       </w:rPr>
     </w:lvl>
   </w:abstractNum>
-  <w:abstractNum w:abstractNumId="117" w15:restartNumberingAfterBreak="0">
+  <w:abstractNum w:abstractNumId="120" w15:restartNumberingAfterBreak="0">
     <w:nsid w:val="6EA27D0A"/>
     <w:multiLevelType w:val="multilevel"/>
     <w:tmpl w:val="7BF0256C"/>
@@ -18163,7 +19043,7 @@
       </w:rPr>
     </w:lvl>
   </w:abstractNum>
-  <w:abstractNum w:abstractNumId="118" w15:restartNumberingAfterBreak="0">
+  <w:abstractNum w:abstractNumId="121" w15:restartNumberingAfterBreak="0">
     <w:nsid w:val="6EF86273"/>
     <w:multiLevelType w:val="multilevel"/>
     <w:tmpl w:val="2AA67CDA"/>
@@ -18312,7 +19192,7 @@
       </w:rPr>
     </w:lvl>
   </w:abstractNum>
-  <w:abstractNum w:abstractNumId="119" w15:restartNumberingAfterBreak="0">
+  <w:abstractNum w:abstractNumId="122" w15:restartNumberingAfterBreak="0">
     <w:nsid w:val="70874300"/>
     <w:multiLevelType w:val="hybridMultilevel"/>
     <w:tmpl w:val="1B3A0518"/>
@@ -18425,7 +19305,7 @@
       </w:rPr>
     </w:lvl>
   </w:abstractNum>
-  <w:abstractNum w:abstractNumId="120" w15:restartNumberingAfterBreak="0">
+  <w:abstractNum w:abstractNumId="123" w15:restartNumberingAfterBreak="0">
     <w:nsid w:val="7090251B"/>
     <w:multiLevelType w:val="hybridMultilevel"/>
     <w:tmpl w:val="67687EFE"/>
@@ -18538,7 +19418,7 @@
       </w:rPr>
     </w:lvl>
   </w:abstractNum>
-  <w:abstractNum w:abstractNumId="121" w15:restartNumberingAfterBreak="0">
+  <w:abstractNum w:abstractNumId="124" w15:restartNumberingAfterBreak="0">
     <w:nsid w:val="72031F81"/>
     <w:multiLevelType w:val="multilevel"/>
     <w:tmpl w:val="84400090"/>
@@ -18687,7 +19567,7 @@
       </w:rPr>
     </w:lvl>
   </w:abstractNum>
-  <w:abstractNum w:abstractNumId="122" w15:restartNumberingAfterBreak="0">
+  <w:abstractNum w:abstractNumId="125" w15:restartNumberingAfterBreak="0">
     <w:nsid w:val="722301E0"/>
     <w:multiLevelType w:val="multilevel"/>
     <w:tmpl w:val="1EE82E5A"/>
@@ -18836,7 +19716,7 @@
       </w:rPr>
     </w:lvl>
   </w:abstractNum>
-  <w:abstractNum w:abstractNumId="123" w15:restartNumberingAfterBreak="0">
+  <w:abstractNum w:abstractNumId="126" w15:restartNumberingAfterBreak="0">
     <w:nsid w:val="74B80775"/>
     <w:multiLevelType w:val="hybridMultilevel"/>
     <w:tmpl w:val="D3C275CE"/>
@@ -18925,7 +19805,7 @@
       </w:pPr>
     </w:lvl>
   </w:abstractNum>
-  <w:abstractNum w:abstractNumId="124" w15:restartNumberingAfterBreak="0">
+  <w:abstractNum w:abstractNumId="127" w15:restartNumberingAfterBreak="0">
     <w:nsid w:val="75144C65"/>
     <w:multiLevelType w:val="hybridMultilevel"/>
     <w:tmpl w:val="12127FAA"/>
@@ -19038,7 +19918,7 @@
       </w:rPr>
     </w:lvl>
   </w:abstractNum>
-  <w:abstractNum w:abstractNumId="125" w15:restartNumberingAfterBreak="0">
+  <w:abstractNum w:abstractNumId="128" w15:restartNumberingAfterBreak="0">
     <w:nsid w:val="75237F84"/>
     <w:multiLevelType w:val="hybridMultilevel"/>
     <w:tmpl w:val="5F0A6EF2"/>
@@ -19151,7 +20031,7 @@
       </w:rPr>
     </w:lvl>
   </w:abstractNum>
-  <w:abstractNum w:abstractNumId="126" w15:restartNumberingAfterBreak="0">
+  <w:abstractNum w:abstractNumId="129" w15:restartNumberingAfterBreak="0">
     <w:nsid w:val="75FF09B0"/>
     <w:multiLevelType w:val="multilevel"/>
     <w:tmpl w:val="C34A7734"/>
@@ -19300,7 +20180,7 @@
       </w:rPr>
     </w:lvl>
   </w:abstractNum>
-  <w:abstractNum w:abstractNumId="127" w15:restartNumberingAfterBreak="0">
+  <w:abstractNum w:abstractNumId="130" w15:restartNumberingAfterBreak="0">
     <w:nsid w:val="77960362"/>
     <w:multiLevelType w:val="multilevel"/>
     <w:tmpl w:val="FEA0022E"/>
@@ -19449,7 +20329,7 @@
       </w:rPr>
     </w:lvl>
   </w:abstractNum>
-  <w:abstractNum w:abstractNumId="128" w15:restartNumberingAfterBreak="0">
+  <w:abstractNum w:abstractNumId="131" w15:restartNumberingAfterBreak="0">
     <w:nsid w:val="785A644F"/>
     <w:multiLevelType w:val="multilevel"/>
     <w:tmpl w:val="D1DC60FE"/>
@@ -19598,7 +20478,7 @@
       </w:rPr>
     </w:lvl>
   </w:abstractNum>
-  <w:abstractNum w:abstractNumId="129" w15:restartNumberingAfterBreak="0">
+  <w:abstractNum w:abstractNumId="132" w15:restartNumberingAfterBreak="0">
     <w:nsid w:val="78B62297"/>
     <w:multiLevelType w:val="multilevel"/>
     <w:tmpl w:val="2AA67CDA"/>
@@ -19747,7 +20627,120 @@
       </w:rPr>
     </w:lvl>
   </w:abstractNum>
-  <w:abstractNum w:abstractNumId="130" w15:restartNumberingAfterBreak="0">
+  <w:abstractNum w:abstractNumId="133" w15:restartNumberingAfterBreak="0">
+    <w:nsid w:val="78C32E1A"/>
+    <w:multiLevelType w:val="hybridMultilevel"/>
+    <w:tmpl w:val="91A0539A"/>
+    <w:lvl w:ilvl="0" w:tplc="04090005">
+      <w:start w:val="1"/>
+      <w:numFmt w:val="bullet"/>
+      <w:lvlText w:val=""/>
+      <w:lvlJc w:val="left"/>
+      <w:pPr>
+        <w:ind w:left="1080" w:hanging="360"/>
+      </w:pPr>
+      <w:rPr>
+        <w:rFonts w:ascii="Wingdings" w:hAnsi="Wingdings" w:hint="default"/>
+      </w:rPr>
+    </w:lvl>
+    <w:lvl w:ilvl="1" w:tplc="04090003" w:tentative="1">
+      <w:start w:val="1"/>
+      <w:numFmt w:val="bullet"/>
+      <w:lvlText w:val="o"/>
+      <w:lvlJc w:val="left"/>
+      <w:pPr>
+        <w:ind w:left="1800" w:hanging="360"/>
+      </w:pPr>
+      <w:rPr>
+        <w:rFonts w:ascii="Courier New" w:hAnsi="Courier New" w:cs="Courier New" w:hint="default"/>
+      </w:rPr>
+    </w:lvl>
+    <w:lvl w:ilvl="2" w:tplc="04090005" w:tentative="1">
+      <w:start w:val="1"/>
+      <w:numFmt w:val="bullet"/>
+      <w:lvlText w:val=""/>
+      <w:lvlJc w:val="left"/>
+      <w:pPr>
+        <w:ind w:left="2520" w:hanging="360"/>
+      </w:pPr>
+      <w:rPr>
+        <w:rFonts w:ascii="Wingdings" w:hAnsi="Wingdings" w:hint="default"/>
+      </w:rPr>
+    </w:lvl>
+    <w:lvl w:ilvl="3" w:tplc="04090001" w:tentative="1">
+      <w:start w:val="1"/>
+      <w:numFmt w:val="bullet"/>
+      <w:lvlText w:val=""/>
+      <w:lvlJc w:val="left"/>
+      <w:pPr>
+        <w:ind w:left="3240" w:hanging="360"/>
+      </w:pPr>
+      <w:rPr>
+        <w:rFonts w:ascii="Symbol" w:hAnsi="Symbol" w:hint="default"/>
+      </w:rPr>
+    </w:lvl>
+    <w:lvl w:ilvl="4" w:tplc="04090003" w:tentative="1">
+      <w:start w:val="1"/>
+      <w:numFmt w:val="bullet"/>
+      <w:lvlText w:val="o"/>
+      <w:lvlJc w:val="left"/>
+      <w:pPr>
+        <w:ind w:left="3960" w:hanging="360"/>
+      </w:pPr>
+      <w:rPr>
+        <w:rFonts w:ascii="Courier New" w:hAnsi="Courier New" w:cs="Courier New" w:hint="default"/>
+      </w:rPr>
+    </w:lvl>
+    <w:lvl w:ilvl="5" w:tplc="04090005" w:tentative="1">
+      <w:start w:val="1"/>
+      <w:numFmt w:val="bullet"/>
+      <w:lvlText w:val=""/>
+      <w:lvlJc w:val="left"/>
+      <w:pPr>
+        <w:ind w:left="4680" w:hanging="360"/>
+      </w:pPr>
+      <w:rPr>
+        <w:rFonts w:ascii="Wingdings" w:hAnsi="Wingdings" w:hint="default"/>
+      </w:rPr>
+    </w:lvl>
+    <w:lvl w:ilvl="6" w:tplc="04090001" w:tentative="1">
+      <w:start w:val="1"/>
+      <w:numFmt w:val="bullet"/>
+      <w:lvlText w:val=""/>
+      <w:lvlJc w:val="left"/>
+      <w:pPr>
+        <w:ind w:left="5400" w:hanging="360"/>
+      </w:pPr>
+      <w:rPr>
+        <w:rFonts w:ascii="Symbol" w:hAnsi="Symbol" w:hint="default"/>
+      </w:rPr>
+    </w:lvl>
+    <w:lvl w:ilvl="7" w:tplc="04090003" w:tentative="1">
+      <w:start w:val="1"/>
+      <w:numFmt w:val="bullet"/>
+      <w:lvlText w:val="o"/>
+      <w:lvlJc w:val="left"/>
+      <w:pPr>
+        <w:ind w:left="6120" w:hanging="360"/>
+      </w:pPr>
+      <w:rPr>
+        <w:rFonts w:ascii="Courier New" w:hAnsi="Courier New" w:cs="Courier New" w:hint="default"/>
+      </w:rPr>
+    </w:lvl>
+    <w:lvl w:ilvl="8" w:tplc="04090005" w:tentative="1">
+      <w:start w:val="1"/>
+      <w:numFmt w:val="bullet"/>
+      <w:lvlText w:val=""/>
+      <w:lvlJc w:val="left"/>
+      <w:pPr>
+        <w:ind w:left="6840" w:hanging="360"/>
+      </w:pPr>
+      <w:rPr>
+        <w:rFonts w:ascii="Wingdings" w:hAnsi="Wingdings" w:hint="default"/>
+      </w:rPr>
+    </w:lvl>
+  </w:abstractNum>
+  <w:abstractNum w:abstractNumId="134" w15:restartNumberingAfterBreak="0">
     <w:nsid w:val="7BFA03DF"/>
     <w:multiLevelType w:val="hybridMultilevel"/>
     <w:tmpl w:val="536A979E"/>
@@ -19860,7 +20853,7 @@
       </w:rPr>
     </w:lvl>
   </w:abstractNum>
-  <w:abstractNum w:abstractNumId="131" w15:restartNumberingAfterBreak="0">
+  <w:abstractNum w:abstractNumId="135" w15:restartNumberingAfterBreak="0">
     <w:nsid w:val="7CA524B4"/>
     <w:multiLevelType w:val="hybridMultilevel"/>
     <w:tmpl w:val="957C4F4A"/>
@@ -19973,7 +20966,7 @@
       </w:rPr>
     </w:lvl>
   </w:abstractNum>
-  <w:abstractNum w:abstractNumId="132" w15:restartNumberingAfterBreak="0">
+  <w:abstractNum w:abstractNumId="136" w15:restartNumberingAfterBreak="0">
     <w:nsid w:val="7E1C597E"/>
     <w:multiLevelType w:val="multilevel"/>
     <w:tmpl w:val="2AA67CDA"/>
@@ -20122,7 +21115,7 @@
       </w:rPr>
     </w:lvl>
   </w:abstractNum>
-  <w:abstractNum w:abstractNumId="133" w15:restartNumberingAfterBreak="0">
+  <w:abstractNum w:abstractNumId="137" w15:restartNumberingAfterBreak="0">
     <w:nsid w:val="7EBD7710"/>
     <w:multiLevelType w:val="hybridMultilevel"/>
     <w:tmpl w:val="C8C6F7A0"/>
@@ -20236,106 +21229,106 @@
     </w:lvl>
   </w:abstractNum>
   <w:num w:numId="1" w16cid:durableId="425157302">
-    <w:abstractNumId w:val="52"/>
+    <w:abstractNumId w:val="53"/>
   </w:num>
   <w:num w:numId="2" w16cid:durableId="967664612">
-    <w:abstractNumId w:val="98"/>
+    <w:abstractNumId w:val="101"/>
   </w:num>
   <w:num w:numId="3" w16cid:durableId="361631616">
-    <w:abstractNumId w:val="71"/>
+    <w:abstractNumId w:val="72"/>
   </w:num>
   <w:num w:numId="4" w16cid:durableId="1409575397">
-    <w:abstractNumId w:val="85"/>
+    <w:abstractNumId w:val="88"/>
   </w:num>
   <w:num w:numId="5" w16cid:durableId="1647204897">
-    <w:abstractNumId w:val="131"/>
+    <w:abstractNumId w:val="135"/>
   </w:num>
   <w:num w:numId="6" w16cid:durableId="682589869">
-    <w:abstractNumId w:val="22"/>
+    <w:abstractNumId w:val="23"/>
   </w:num>
   <w:num w:numId="7" w16cid:durableId="679703478">
-    <w:abstractNumId w:val="105"/>
+    <w:abstractNumId w:val="108"/>
   </w:num>
   <w:num w:numId="8" w16cid:durableId="496455128">
-    <w:abstractNumId w:val="46"/>
+    <w:abstractNumId w:val="47"/>
   </w:num>
   <w:num w:numId="9" w16cid:durableId="1184633094">
-    <w:abstractNumId w:val="62"/>
+    <w:abstractNumId w:val="63"/>
   </w:num>
   <w:num w:numId="10" w16cid:durableId="71507387">
-    <w:abstractNumId w:val="69"/>
+    <w:abstractNumId w:val="70"/>
   </w:num>
   <w:num w:numId="11" w16cid:durableId="1412503779">
-    <w:abstractNumId w:val="107"/>
+    <w:abstractNumId w:val="110"/>
   </w:num>
   <w:num w:numId="12" w16cid:durableId="1107113995">
-    <w:abstractNumId w:val="47"/>
+    <w:abstractNumId w:val="48"/>
   </w:num>
   <w:num w:numId="13" w16cid:durableId="2011055922">
-    <w:abstractNumId w:val="23"/>
+    <w:abstractNumId w:val="24"/>
   </w:num>
   <w:num w:numId="14" w16cid:durableId="1529222885">
-    <w:abstractNumId w:val="130"/>
+    <w:abstractNumId w:val="134"/>
   </w:num>
   <w:num w:numId="15" w16cid:durableId="836580755">
-    <w:abstractNumId w:val="16"/>
+    <w:abstractNumId w:val="17"/>
   </w:num>
   <w:num w:numId="16" w16cid:durableId="1344674502">
-    <w:abstractNumId w:val="89"/>
+    <w:abstractNumId w:val="92"/>
   </w:num>
   <w:num w:numId="17" w16cid:durableId="1320882603">
-    <w:abstractNumId w:val="119"/>
+    <w:abstractNumId w:val="122"/>
   </w:num>
   <w:num w:numId="18" w16cid:durableId="1139028372">
-    <w:abstractNumId w:val="48"/>
+    <w:abstractNumId w:val="49"/>
   </w:num>
   <w:num w:numId="19" w16cid:durableId="1525635473">
-    <w:abstractNumId w:val="96"/>
+    <w:abstractNumId w:val="99"/>
   </w:num>
   <w:num w:numId="20" w16cid:durableId="609623515">
-    <w:abstractNumId w:val="133"/>
+    <w:abstractNumId w:val="137"/>
   </w:num>
   <w:num w:numId="21" w16cid:durableId="165170997">
-    <w:abstractNumId w:val="111"/>
+    <w:abstractNumId w:val="114"/>
   </w:num>
   <w:num w:numId="22" w16cid:durableId="1620525290">
-    <w:abstractNumId w:val="30"/>
+    <w:abstractNumId w:val="31"/>
   </w:num>
   <w:num w:numId="23" w16cid:durableId="400753109">
-    <w:abstractNumId w:val="124"/>
+    <w:abstractNumId w:val="127"/>
   </w:num>
   <w:num w:numId="24" w16cid:durableId="193882219">
     <w:abstractNumId w:val="4"/>
   </w:num>
   <w:num w:numId="25" w16cid:durableId="311981628">
-    <w:abstractNumId w:val="54"/>
+    <w:abstractNumId w:val="55"/>
   </w:num>
   <w:num w:numId="26" w16cid:durableId="2009166045">
-    <w:abstractNumId w:val="15"/>
+    <w:abstractNumId w:val="16"/>
   </w:num>
   <w:num w:numId="27" w16cid:durableId="2135174697">
-    <w:abstractNumId w:val="21"/>
+    <w:abstractNumId w:val="22"/>
   </w:num>
   <w:num w:numId="28" w16cid:durableId="353504740">
-    <w:abstractNumId w:val="17"/>
+    <w:abstractNumId w:val="18"/>
   </w:num>
   <w:num w:numId="29" w16cid:durableId="2124693280">
-    <w:abstractNumId w:val="100"/>
+    <w:abstractNumId w:val="103"/>
   </w:num>
   <w:num w:numId="30" w16cid:durableId="1367099744">
-    <w:abstractNumId w:val="38"/>
+    <w:abstractNumId w:val="39"/>
   </w:num>
   <w:num w:numId="31" w16cid:durableId="2011105642">
-    <w:abstractNumId w:val="90"/>
+    <w:abstractNumId w:val="93"/>
   </w:num>
   <w:num w:numId="32" w16cid:durableId="831995364">
-    <w:abstractNumId w:val="27"/>
+    <w:abstractNumId w:val="28"/>
   </w:num>
   <w:num w:numId="33" w16cid:durableId="851073403">
     <w:abstractNumId w:val="3"/>
   </w:num>
   <w:num w:numId="34" w16cid:durableId="1183666391">
-    <w:abstractNumId w:val="26"/>
+    <w:abstractNumId w:val="27"/>
   </w:num>
   <w:num w:numId="35" w16cid:durableId="697268929">
     <w:abstractNumId w:val="1"/>
@@ -20344,298 +21337,310 @@
     <w:abstractNumId w:val="2"/>
   </w:num>
   <w:num w:numId="37" w16cid:durableId="1849755457">
-    <w:abstractNumId w:val="125"/>
+    <w:abstractNumId w:val="128"/>
   </w:num>
   <w:num w:numId="38" w16cid:durableId="516505904">
-    <w:abstractNumId w:val="14"/>
+    <w:abstractNumId w:val="15"/>
   </w:num>
   <w:num w:numId="39" w16cid:durableId="906300072">
-    <w:abstractNumId w:val="18"/>
+    <w:abstractNumId w:val="19"/>
   </w:num>
   <w:num w:numId="40" w16cid:durableId="905338697">
+    <w:abstractNumId w:val="74"/>
+  </w:num>
+  <w:num w:numId="41" w16cid:durableId="501896635">
+    <w:abstractNumId w:val="51"/>
+  </w:num>
+  <w:num w:numId="42" w16cid:durableId="1953435156">
+    <w:abstractNumId w:val="77"/>
+  </w:num>
+  <w:num w:numId="43" w16cid:durableId="1060447452">
+    <w:abstractNumId w:val="90"/>
+  </w:num>
+  <w:num w:numId="44" w16cid:durableId="1772503672">
+    <w:abstractNumId w:val="66"/>
+  </w:num>
+  <w:num w:numId="45" w16cid:durableId="1650330222">
     <w:abstractNumId w:val="73"/>
   </w:num>
-  <w:num w:numId="41" w16cid:durableId="501896635">
-    <w:abstractNumId w:val="50"/>
-  </w:num>
-  <w:num w:numId="42" w16cid:durableId="1953435156">
-    <w:abstractNumId w:val="74"/>
-  </w:num>
-  <w:num w:numId="43" w16cid:durableId="1060447452">
-    <w:abstractNumId w:val="87"/>
-  </w:num>
-  <w:num w:numId="44" w16cid:durableId="1772503672">
-    <w:abstractNumId w:val="65"/>
-  </w:num>
-  <w:num w:numId="45" w16cid:durableId="1650330222">
-    <w:abstractNumId w:val="72"/>
-  </w:num>
   <w:num w:numId="46" w16cid:durableId="2102337934">
-    <w:abstractNumId w:val="29"/>
+    <w:abstractNumId w:val="30"/>
   </w:num>
   <w:num w:numId="47" w16cid:durableId="68767822">
-    <w:abstractNumId w:val="108"/>
+    <w:abstractNumId w:val="111"/>
   </w:num>
   <w:num w:numId="48" w16cid:durableId="1992058265">
     <w:abstractNumId w:val="5"/>
   </w:num>
   <w:num w:numId="49" w16cid:durableId="788475134">
-    <w:abstractNumId w:val="128"/>
+    <w:abstractNumId w:val="131"/>
   </w:num>
   <w:num w:numId="50" w16cid:durableId="224419455">
-    <w:abstractNumId w:val="117"/>
+    <w:abstractNumId w:val="120"/>
   </w:num>
   <w:num w:numId="51" w16cid:durableId="1699575947">
-    <w:abstractNumId w:val="95"/>
+    <w:abstractNumId w:val="98"/>
   </w:num>
   <w:num w:numId="52" w16cid:durableId="1048916239">
-    <w:abstractNumId w:val="58"/>
+    <w:abstractNumId w:val="59"/>
   </w:num>
   <w:num w:numId="53" w16cid:durableId="1188711211">
-    <w:abstractNumId w:val="126"/>
+    <w:abstractNumId w:val="129"/>
   </w:num>
   <w:num w:numId="54" w16cid:durableId="447555614">
+    <w:abstractNumId w:val="100"/>
+  </w:num>
+  <w:num w:numId="55" w16cid:durableId="1679307268">
+    <w:abstractNumId w:val="56"/>
+  </w:num>
+  <w:num w:numId="56" w16cid:durableId="693773591">
+    <w:abstractNumId w:val="119"/>
+  </w:num>
+  <w:num w:numId="57" w16cid:durableId="1110473324">
+    <w:abstractNumId w:val="41"/>
+  </w:num>
+  <w:num w:numId="58" w16cid:durableId="842937968">
+    <w:abstractNumId w:val="71"/>
+  </w:num>
+  <w:num w:numId="59" w16cid:durableId="821121315">
+    <w:abstractNumId w:val="46"/>
+  </w:num>
+  <w:num w:numId="60" w16cid:durableId="2095394549">
+    <w:abstractNumId w:val="130"/>
+  </w:num>
+  <w:num w:numId="61" w16cid:durableId="1299921011">
+    <w:abstractNumId w:val="45"/>
+  </w:num>
+  <w:num w:numId="62" w16cid:durableId="1927420240">
+    <w:abstractNumId w:val="82"/>
+  </w:num>
+  <w:num w:numId="63" w16cid:durableId="41290043">
+    <w:abstractNumId w:val="87"/>
+  </w:num>
+  <w:num w:numId="64" w16cid:durableId="999846909">
+    <w:abstractNumId w:val="68"/>
+  </w:num>
+  <w:num w:numId="65" w16cid:durableId="1250969563">
+    <w:abstractNumId w:val="80"/>
+  </w:num>
+  <w:num w:numId="66" w16cid:durableId="484011382">
+    <w:abstractNumId w:val="109"/>
+  </w:num>
+  <w:num w:numId="67" w16cid:durableId="2008289242">
+    <w:abstractNumId w:val="13"/>
+  </w:num>
+  <w:num w:numId="68" w16cid:durableId="1041637222">
+    <w:abstractNumId w:val="20"/>
+  </w:num>
+  <w:num w:numId="69" w16cid:durableId="1296839887">
+    <w:abstractNumId w:val="86"/>
+  </w:num>
+  <w:num w:numId="70" w16cid:durableId="336662050">
     <w:abstractNumId w:val="97"/>
   </w:num>
-  <w:num w:numId="55" w16cid:durableId="1679307268">
-    <w:abstractNumId w:val="55"/>
-  </w:num>
-  <w:num w:numId="56" w16cid:durableId="693773591">
-    <w:abstractNumId w:val="116"/>
-  </w:num>
-  <w:num w:numId="57" w16cid:durableId="1110473324">
-    <w:abstractNumId w:val="40"/>
-  </w:num>
-  <w:num w:numId="58" w16cid:durableId="842937968">
-    <w:abstractNumId w:val="70"/>
-  </w:num>
-  <w:num w:numId="59" w16cid:durableId="821121315">
-    <w:abstractNumId w:val="45"/>
-  </w:num>
-  <w:num w:numId="60" w16cid:durableId="2095394549">
-    <w:abstractNumId w:val="127"/>
-  </w:num>
-  <w:num w:numId="61" w16cid:durableId="1299921011">
-    <w:abstractNumId w:val="44"/>
-  </w:num>
-  <w:num w:numId="62" w16cid:durableId="1927420240">
-    <w:abstractNumId w:val="79"/>
-  </w:num>
-  <w:num w:numId="63" w16cid:durableId="41290043">
-    <w:abstractNumId w:val="84"/>
-  </w:num>
-  <w:num w:numId="64" w16cid:durableId="999846909">
-    <w:abstractNumId w:val="67"/>
-  </w:num>
-  <w:num w:numId="65" w16cid:durableId="1250969563">
-    <w:abstractNumId w:val="77"/>
-  </w:num>
-  <w:num w:numId="66" w16cid:durableId="484011382">
-    <w:abstractNumId w:val="106"/>
-  </w:num>
-  <w:num w:numId="67" w16cid:durableId="2008289242">
-    <w:abstractNumId w:val="12"/>
-  </w:num>
-  <w:num w:numId="68" w16cid:durableId="1041637222">
-    <w:abstractNumId w:val="19"/>
-  </w:num>
-  <w:num w:numId="69" w16cid:durableId="1296839887">
-    <w:abstractNumId w:val="83"/>
-  </w:num>
-  <w:num w:numId="70" w16cid:durableId="336662050">
-    <w:abstractNumId w:val="94"/>
-  </w:num>
   <w:num w:numId="71" w16cid:durableId="1460032333">
-    <w:abstractNumId w:val="112"/>
+    <w:abstractNumId w:val="115"/>
   </w:num>
   <w:num w:numId="72" w16cid:durableId="592400615">
-    <w:abstractNumId w:val="8"/>
+    <w:abstractNumId w:val="9"/>
   </w:num>
   <w:num w:numId="73" w16cid:durableId="1879049234">
-    <w:abstractNumId w:val="37"/>
+    <w:abstractNumId w:val="38"/>
   </w:num>
   <w:num w:numId="74" w16cid:durableId="1747679558">
-    <w:abstractNumId w:val="41"/>
+    <w:abstractNumId w:val="42"/>
   </w:num>
   <w:num w:numId="75" w16cid:durableId="55278029">
-    <w:abstractNumId w:val="33"/>
+    <w:abstractNumId w:val="34"/>
   </w:num>
   <w:num w:numId="76" w16cid:durableId="1032193382">
-    <w:abstractNumId w:val="34"/>
+    <w:abstractNumId w:val="35"/>
   </w:num>
   <w:num w:numId="77" w16cid:durableId="763109604">
-    <w:abstractNumId w:val="86"/>
+    <w:abstractNumId w:val="89"/>
   </w:num>
   <w:num w:numId="78" w16cid:durableId="2138137265">
-    <w:abstractNumId w:val="99"/>
+    <w:abstractNumId w:val="102"/>
   </w:num>
   <w:num w:numId="79" w16cid:durableId="343675924">
-    <w:abstractNumId w:val="120"/>
+    <w:abstractNumId w:val="123"/>
   </w:num>
   <w:num w:numId="80" w16cid:durableId="1823277442">
-    <w:abstractNumId w:val="43"/>
+    <w:abstractNumId w:val="44"/>
   </w:num>
   <w:num w:numId="81" w16cid:durableId="1686900155">
     <w:abstractNumId w:val="0"/>
   </w:num>
   <w:num w:numId="82" w16cid:durableId="1113326280">
+    <w:abstractNumId w:val="84"/>
+  </w:num>
+  <w:num w:numId="83" w16cid:durableId="1253051103">
+    <w:abstractNumId w:val="112"/>
+  </w:num>
+  <w:num w:numId="84" w16cid:durableId="444888444">
+    <w:abstractNumId w:val="52"/>
+  </w:num>
+  <w:num w:numId="85" w16cid:durableId="64299649">
+    <w:abstractNumId w:val="104"/>
+  </w:num>
+  <w:num w:numId="86" w16cid:durableId="868182992">
+    <w:abstractNumId w:val="65"/>
+  </w:num>
+  <w:num w:numId="87" w16cid:durableId="896863331">
+    <w:abstractNumId w:val="25"/>
+  </w:num>
+  <w:num w:numId="88" w16cid:durableId="505442826">
+    <w:abstractNumId w:val="107"/>
+  </w:num>
+  <w:num w:numId="89" w16cid:durableId="1858763908">
+    <w:abstractNumId w:val="40"/>
+  </w:num>
+  <w:num w:numId="90" w16cid:durableId="1896088176">
+    <w:abstractNumId w:val="14"/>
+  </w:num>
+  <w:num w:numId="91" w16cid:durableId="1284576603">
+    <w:abstractNumId w:val="94"/>
+  </w:num>
+  <w:num w:numId="92" w16cid:durableId="1963075542">
+    <w:abstractNumId w:val="8"/>
+  </w:num>
+  <w:num w:numId="93" w16cid:durableId="787627596">
+    <w:abstractNumId w:val="83"/>
+  </w:num>
+  <w:num w:numId="94" w16cid:durableId="2003925799">
+    <w:abstractNumId w:val="11"/>
+  </w:num>
+  <w:num w:numId="95" w16cid:durableId="1169102579">
+    <w:abstractNumId w:val="96"/>
+  </w:num>
+  <w:num w:numId="96" w16cid:durableId="1216501564">
+    <w:abstractNumId w:val="36"/>
+  </w:num>
+  <w:num w:numId="97" w16cid:durableId="261768216">
+    <w:abstractNumId w:val="121"/>
+  </w:num>
+  <w:num w:numId="98" w16cid:durableId="2141918721">
+    <w:abstractNumId w:val="78"/>
+  </w:num>
+  <w:num w:numId="99" w16cid:durableId="905841544">
+    <w:abstractNumId w:val="43"/>
+  </w:num>
+  <w:num w:numId="100" w16cid:durableId="1753887223">
+    <w:abstractNumId w:val="95"/>
+  </w:num>
+  <w:num w:numId="101" w16cid:durableId="1320184766">
+    <w:abstractNumId w:val="29"/>
+  </w:num>
+  <w:num w:numId="102" w16cid:durableId="465127606">
+    <w:abstractNumId w:val="60"/>
+  </w:num>
+  <w:num w:numId="103" w16cid:durableId="1640451435">
+    <w:abstractNumId w:val="58"/>
+  </w:num>
+  <w:num w:numId="104" w16cid:durableId="942029608">
+    <w:abstractNumId w:val="54"/>
+  </w:num>
+  <w:num w:numId="105" w16cid:durableId="70857193">
+    <w:abstractNumId w:val="62"/>
+  </w:num>
+  <w:num w:numId="106" w16cid:durableId="1617908629">
+    <w:abstractNumId w:val="125"/>
+  </w:num>
+  <w:num w:numId="107" w16cid:durableId="970137111">
+    <w:abstractNumId w:val="136"/>
+  </w:num>
+  <w:num w:numId="108" w16cid:durableId="383797013">
+    <w:abstractNumId w:val="50"/>
+  </w:num>
+  <w:num w:numId="109" w16cid:durableId="1459567304">
+    <w:abstractNumId w:val="61"/>
+  </w:num>
+  <w:num w:numId="110" w16cid:durableId="862745862">
+    <w:abstractNumId w:val="21"/>
+  </w:num>
+  <w:num w:numId="111" w16cid:durableId="1859536331">
+    <w:abstractNumId w:val="64"/>
+  </w:num>
+  <w:num w:numId="112" w16cid:durableId="2092697678">
     <w:abstractNumId w:val="81"/>
   </w:num>
-  <w:num w:numId="83" w16cid:durableId="1253051103">
-    <w:abstractNumId w:val="109"/>
+  <w:num w:numId="113" w16cid:durableId="1418403813">
+    <w:abstractNumId w:val="69"/>
   </w:num>
-  <w:num w:numId="84" w16cid:durableId="444888444">
-    <w:abstractNumId w:val="51"/>
+  <w:num w:numId="114" w16cid:durableId="1965042317">
+    <w:abstractNumId w:val="124"/>
   </w:num>
-  <w:num w:numId="85" w16cid:durableId="64299649">
-    <w:abstractNumId w:val="101"/>
+  <w:num w:numId="115" w16cid:durableId="670569040">
+    <w:abstractNumId w:val="57"/>
   </w:num>
-  <w:num w:numId="86" w16cid:durableId="868182992">
-    <w:abstractNumId w:val="64"/>
+  <w:num w:numId="116" w16cid:durableId="413823113">
+    <w:abstractNumId w:val="132"/>
   </w:num>
-  <w:num w:numId="87" w16cid:durableId="896863331">
-    <w:abstractNumId w:val="24"/>
+  <w:num w:numId="117" w16cid:durableId="1293747982">
+    <w:abstractNumId w:val="105"/>
   </w:num>
-  <w:num w:numId="88" w16cid:durableId="505442826">
-    <w:abstractNumId w:val="104"/>
+  <w:num w:numId="118" w16cid:durableId="1016734110">
+    <w:abstractNumId w:val="79"/>
   </w:num>
-  <w:num w:numId="89" w16cid:durableId="1858763908">
-    <w:abstractNumId w:val="39"/>
+  <w:num w:numId="119" w16cid:durableId="583337306">
+    <w:abstractNumId w:val="126"/>
   </w:num>
-  <w:num w:numId="90" w16cid:durableId="1896088176">
-    <w:abstractNumId w:val="13"/>
+  <w:num w:numId="120" w16cid:durableId="721096429">
+    <w:abstractNumId w:val="106"/>
   </w:num>
-  <w:num w:numId="91" w16cid:durableId="1284576603">
+  <w:num w:numId="121" w16cid:durableId="299461688">
+    <w:abstractNumId w:val="85"/>
+  </w:num>
+  <w:num w:numId="122" w16cid:durableId="703558456">
+    <w:abstractNumId w:val="12"/>
+  </w:num>
+  <w:num w:numId="123" w16cid:durableId="964241540">
+    <w:abstractNumId w:val="26"/>
+  </w:num>
+  <w:num w:numId="124" w16cid:durableId="603391478">
     <w:abstractNumId w:val="91"/>
   </w:num>
-  <w:num w:numId="92" w16cid:durableId="1963075542">
-    <w:abstractNumId w:val="7"/>
-  </w:num>
-  <w:num w:numId="93" w16cid:durableId="787627596">
-    <w:abstractNumId w:val="80"/>
-  </w:num>
-  <w:num w:numId="94" w16cid:durableId="2003925799">
-    <w:abstractNumId w:val="10"/>
-  </w:num>
-  <w:num w:numId="95" w16cid:durableId="1169102579">
-    <w:abstractNumId w:val="93"/>
-  </w:num>
-  <w:num w:numId="96" w16cid:durableId="1216501564">
-    <w:abstractNumId w:val="35"/>
-  </w:num>
-  <w:num w:numId="97" w16cid:durableId="261768216">
-    <w:abstractNumId w:val="118"/>
-  </w:num>
-  <w:num w:numId="98" w16cid:durableId="2141918721">
-    <w:abstractNumId w:val="75"/>
-  </w:num>
-  <w:num w:numId="99" w16cid:durableId="905841544">
-    <w:abstractNumId w:val="42"/>
-  </w:num>
-  <w:num w:numId="100" w16cid:durableId="1753887223">
-    <w:abstractNumId w:val="92"/>
-  </w:num>
-  <w:num w:numId="101" w16cid:durableId="1320184766">
-    <w:abstractNumId w:val="28"/>
-  </w:num>
-  <w:num w:numId="102" w16cid:durableId="465127606">
-    <w:abstractNumId w:val="59"/>
-  </w:num>
-  <w:num w:numId="103" w16cid:durableId="1640451435">
-    <w:abstractNumId w:val="57"/>
-  </w:num>
-  <w:num w:numId="104" w16cid:durableId="942029608">
-    <w:abstractNumId w:val="53"/>
-  </w:num>
-  <w:num w:numId="105" w16cid:durableId="70857193">
-    <w:abstractNumId w:val="61"/>
-  </w:num>
-  <w:num w:numId="106" w16cid:durableId="1617908629">
-    <w:abstractNumId w:val="122"/>
-  </w:num>
-  <w:num w:numId="107" w16cid:durableId="970137111">
-    <w:abstractNumId w:val="132"/>
-  </w:num>
-  <w:num w:numId="108" w16cid:durableId="383797013">
-    <w:abstractNumId w:val="49"/>
-  </w:num>
-  <w:num w:numId="109" w16cid:durableId="1459567304">
-    <w:abstractNumId w:val="60"/>
-  </w:num>
-  <w:num w:numId="110" w16cid:durableId="862745862">
-    <w:abstractNumId w:val="20"/>
-  </w:num>
-  <w:num w:numId="111" w16cid:durableId="1859536331">
-    <w:abstractNumId w:val="63"/>
-  </w:num>
-  <w:num w:numId="112" w16cid:durableId="2092697678">
-    <w:abstractNumId w:val="78"/>
-  </w:num>
-  <w:num w:numId="113" w16cid:durableId="1418403813">
-    <w:abstractNumId w:val="68"/>
-  </w:num>
-  <w:num w:numId="114" w16cid:durableId="1965042317">
-    <w:abstractNumId w:val="121"/>
-  </w:num>
-  <w:num w:numId="115" w16cid:durableId="670569040">
-    <w:abstractNumId w:val="56"/>
-  </w:num>
-  <w:num w:numId="116" w16cid:durableId="413823113">
-    <w:abstractNumId w:val="129"/>
-  </w:num>
-  <w:num w:numId="117" w16cid:durableId="1293747982">
-    <w:abstractNumId w:val="102"/>
-  </w:num>
-  <w:num w:numId="118" w16cid:durableId="1016734110">
-    <w:abstractNumId w:val="76"/>
-  </w:num>
-  <w:num w:numId="119" w16cid:durableId="583337306">
-    <w:abstractNumId w:val="123"/>
-  </w:num>
-  <w:num w:numId="120" w16cid:durableId="721096429">
-    <w:abstractNumId w:val="103"/>
-  </w:num>
-  <w:num w:numId="121" w16cid:durableId="299461688">
-    <w:abstractNumId w:val="82"/>
-  </w:num>
-  <w:num w:numId="122" w16cid:durableId="703558456">
-    <w:abstractNumId w:val="11"/>
-  </w:num>
-  <w:num w:numId="123" w16cid:durableId="964241540">
-    <w:abstractNumId w:val="25"/>
-  </w:num>
-  <w:num w:numId="124" w16cid:durableId="603391478">
-    <w:abstractNumId w:val="88"/>
-  </w:num>
   <w:num w:numId="125" w16cid:durableId="560529547">
-    <w:abstractNumId w:val="110"/>
+    <w:abstractNumId w:val="113"/>
   </w:num>
   <w:num w:numId="126" w16cid:durableId="1488327713">
-    <w:abstractNumId w:val="113"/>
+    <w:abstractNumId w:val="116"/>
   </w:num>
   <w:num w:numId="127" w16cid:durableId="1327660713">
-    <w:abstractNumId w:val="115"/>
+    <w:abstractNumId w:val="118"/>
   </w:num>
   <w:num w:numId="128" w16cid:durableId="2095084062">
     <w:abstractNumId w:val="6"/>
   </w:num>
   <w:num w:numId="129" w16cid:durableId="603266177">
-    <w:abstractNumId w:val="66"/>
+    <w:abstractNumId w:val="67"/>
   </w:num>
   <w:num w:numId="130" w16cid:durableId="426855422">
-    <w:abstractNumId w:val="9"/>
+    <w:abstractNumId w:val="10"/>
   </w:num>
   <w:num w:numId="131" w16cid:durableId="1337803013">
-    <w:abstractNumId w:val="31"/>
+    <w:abstractNumId w:val="32"/>
   </w:num>
   <w:num w:numId="132" w16cid:durableId="1288047086">
-    <w:abstractNumId w:val="36"/>
+    <w:abstractNumId w:val="37"/>
   </w:num>
   <w:num w:numId="133" w16cid:durableId="208273981">
-    <w:abstractNumId w:val="32"/>
+    <w:abstractNumId w:val="33"/>
   </w:num>
   <w:num w:numId="134" w16cid:durableId="1601765564">
-    <w:abstractNumId w:val="114"/>
+    <w:abstractNumId w:val="117"/>
+  </w:num>
+  <w:num w:numId="135" w16cid:durableId="638340392">
+    <w:abstractNumId w:val="7"/>
+  </w:num>
+  <w:num w:numId="136" w16cid:durableId="1738551041">
+    <w:abstractNumId w:val="76"/>
+  </w:num>
+  <w:num w:numId="137" w16cid:durableId="95903085">
+    <w:abstractNumId w:val="133"/>
+  </w:num>
+  <w:num w:numId="138" w16cid:durableId="1804738794">
+    <w:abstractNumId w:val="75"/>
   </w:num>
   <w:numIdMacAtCleanup w:val="45"/>
 </w:numbering>

</xml_diff>

<commit_message>
State Model Validation & Review (#303) Stakeholder Approval (#306)
</commit_message>
<xml_diff>
--- a/Sequence Specification Document.docx
+++ b/Sequence Specification Document.docx
@@ -29,22 +29,63 @@
         <w:t xml:space="preserve"> </w:t>
       </w:r>
     </w:p>
-    <w:p/>
+    <w:p>
+      <w:r>
+        <w:t>State machine diagrams specifications of KriGo vehicle rental platform are introduced in this chapter. According to the Unified Modeling Language (UML), state machine diagrams are one of the behavioral representation types that can be used to describe dynamic behavior of particular system entities throughout their life cycles. These diagrams show how an object moves through different states under impact of certain events, conditions and business processes, thus providing a complete description of the behavior of the object.</w:t>
+      </w:r>
+    </w:p>
+    <w:p>
+      <w:pPr>
+        <w:spacing w:before="240"/>
+      </w:pPr>
+      <w:r>
+        <w:t>Compared to other UML diagrams such as activity and sequence diagrams that focus on the process flow and interaction among system components respectively, state machine diagrams focus on the lifecycle of a single object. They specify the list of states an object is able to have, possible events that will cause state transition, and conditions that regulate transitions. Thus, this type of modeling helps achieve consistent behavior of entities and guarantee the implementation of business rules during lifecycle periods.</w:t>
+      </w:r>
+    </w:p>
+    <w:p>
+      <w:pPr>
+        <w:spacing w:before="240"/>
+      </w:pPr>
+      <w:r>
+        <w:t>In the current chapter state machine diagrams are developed for the principal entities of the KriGo vehicle rental platform such as reservations, payments, availability of vehicle, verification request from the agency, and dispute case. Each state machine diagram shows the whole life cycle of the entity starting from its creation until it reaches a terminal state. It shows the valid transitions between states thus making it possible to understand how system objects are evolving as the users interact with the system and the administrative procedures are taking place.</w:t>
+      </w:r>
+    </w:p>
+    <w:p>
+      <w:pPr>
+        <w:spacing w:before="240"/>
+      </w:pPr>
+      <w:r>
+        <w:t>Each state machine specification includes the lifecycle analysis explaining the purpose of the modeled entity, the state machine diagram that describes the permitted states and transitions, and detailed documentation describing the meaning of each state, the events that cause transitions and the terminal states. All of these specifications make it possible to provide an accurate behavioral model of the main entities of the system.</w:t>
+      </w:r>
+    </w:p>
+    <w:p>
+      <w:pPr>
+        <w:spacing w:before="240"/>
+      </w:pPr>
+      <w:r>
+        <w:t>The main role of state machine diagrams is in the support of the business rules implementation, achieving consistent behavior of system modules and helping the developers to manage complicated object behaviors. Moreover, the diagrams allow performing the software testing by identifying the valid state transitions and exceptional situations that need to be validated during testing. Combining state machine diagrams with the use case, sequence and activity diagrams described in the previous chapters makes it possible to get a full behavioral specification of the KriGo vehicle rental platform.</w:t>
+      </w:r>
+    </w:p>
+    <w:p>
+      <w:pPr>
+        <w:spacing w:line="278" w:lineRule="auto"/>
+      </w:pPr>
+      <w:r>
+        <w:br w:type="page"/>
+      </w:r>
+    </w:p>
+    <w:bookmarkEnd w:id="0"/>
     <w:p>
       <w:pPr>
         <w:pStyle w:val="Heading2"/>
         <w:numPr>
           <w:ilvl w:val="0"/>
-          <w:numId w:val="138"/>
+          <w:numId w:val="139"/>
         </w:numPr>
         <w:rPr>
           <w:rFonts w:eastAsiaTheme="minorHAnsi"/>
         </w:rPr>
       </w:pPr>
-      <w:r>
-        <w:br w:type="page"/>
-      </w:r>
-      <w:bookmarkEnd w:id="0"/>
       <w:r>
         <w:lastRenderedPageBreak/>
         <w:t xml:space="preserve">Reservation Lifecycle </w:t>
@@ -612,7 +653,7 @@
         <w:pStyle w:val="Heading2"/>
         <w:numPr>
           <w:ilvl w:val="0"/>
-          <w:numId w:val="138"/>
+          <w:numId w:val="139"/>
         </w:numPr>
       </w:pPr>
       <w:r>
@@ -1166,7 +1207,7 @@
         <w:pStyle w:val="Heading2"/>
         <w:numPr>
           <w:ilvl w:val="0"/>
-          <w:numId w:val="138"/>
+          <w:numId w:val="139"/>
         </w:numPr>
       </w:pPr>
       <w:r>
@@ -1887,7 +1928,7 @@
         <w:pStyle w:val="Heading2"/>
         <w:numPr>
           <w:ilvl w:val="0"/>
-          <w:numId w:val="138"/>
+          <w:numId w:val="139"/>
         </w:numPr>
       </w:pPr>
       <w:r>
@@ -2007,9 +2048,25 @@
     </w:p>
     <w:p>
       <w:pPr>
-        <w:pStyle w:val="Heading2"/>
-      </w:pPr>
-      <w:r>
+        <w:spacing w:line="278" w:lineRule="auto"/>
+        <w:rPr>
+          <w:rFonts w:asciiTheme="majorBidi" w:eastAsiaTheme="majorEastAsia" w:hAnsiTheme="majorBidi" w:cstheme="majorBidi"/>
+          <w:b/>
+          <w:color w:val="000000" w:themeColor="text1"/>
+          <w:sz w:val="28"/>
+          <w:szCs w:val="32"/>
+        </w:rPr>
+      </w:pPr>
+      <w:r>
+        <w:br w:type="page"/>
+      </w:r>
+    </w:p>
+    <w:p>
+      <w:pPr>
+        <w:pStyle w:val="Heading3"/>
+      </w:pPr>
+      <w:r>
+        <w:lastRenderedPageBreak/>
         <w:t xml:space="preserve">Agency Verification State Machine </w:t>
       </w:r>
     </w:p>
@@ -2180,7 +2237,6 @@
           <w:b/>
           <w:bCs/>
         </w:rPr>
-        <w:lastRenderedPageBreak/>
         <w:t>State Transitions</w:t>
       </w:r>
     </w:p>
@@ -2269,6 +2325,7 @@
     </w:p>
     <w:p>
       <w:r>
+        <w:lastRenderedPageBreak/>
         <w:t>The State Machine Diagram of Agency Verification represents a complete description of the life cycle of an agency verification request at KriGo. It illustrates how verification requests progress through states of being submitted, reviewed, asked for additional information, approved, or rejected. Through its defined states and state transitions, it provides a consistent and secure process of verification that ensures regulatory compliance and helps maintain the integrity of the platform by allowing it to operate only for the verified rental agencies.</w:t>
       </w:r>
     </w:p>
@@ -2375,7 +2432,7 @@
         <w:pStyle w:val="Heading2"/>
         <w:numPr>
           <w:ilvl w:val="0"/>
-          <w:numId w:val="138"/>
+          <w:numId w:val="139"/>
         </w:numPr>
       </w:pPr>
       <w:r>
@@ -2428,18 +2485,11 @@
     </w:p>
     <w:p>
       <w:pPr>
-        <w:rPr>
-          <w:b/>
-          <w:bCs/>
-        </w:rPr>
-      </w:pPr>
-      <w:r>
-        <w:rPr>
-          <w:b/>
-          <w:bCs/>
-        </w:rPr>
+        <w:pStyle w:val="Heading3"/>
+      </w:pPr>
+      <w:r>
         <w:lastRenderedPageBreak/>
-        <w:t>Dispute State Machine Diagram Documentation</w:t>
+        <w:t>Dispute State Machine</w:t>
       </w:r>
     </w:p>
     <w:p>
@@ -12737,6 +12787,95 @@
     </w:lvl>
   </w:abstractNum>
   <w:abstractNum w:abstractNumId="74" w15:restartNumberingAfterBreak="0">
+    <w:nsid w:val="4DA87B5B"/>
+    <w:multiLevelType w:val="hybridMultilevel"/>
+    <w:tmpl w:val="18002AF6"/>
+    <w:lvl w:ilvl="0" w:tplc="7AA0F22C">
+      <w:start w:val="1"/>
+      <w:numFmt w:val="decimal"/>
+      <w:lvlText w:val="%1-"/>
+      <w:lvlJc w:val="left"/>
+      <w:pPr>
+        <w:ind w:left="360" w:hanging="360"/>
+      </w:pPr>
+      <w:rPr>
+        <w:rFonts w:eastAsiaTheme="majorEastAsia" w:hint="default"/>
+      </w:rPr>
+    </w:lvl>
+    <w:lvl w:ilvl="1" w:tplc="04090019" w:tentative="1">
+      <w:start w:val="1"/>
+      <w:numFmt w:val="lowerLetter"/>
+      <w:lvlText w:val="%2."/>
+      <w:lvlJc w:val="left"/>
+      <w:pPr>
+        <w:ind w:left="1080" w:hanging="360"/>
+      </w:pPr>
+    </w:lvl>
+    <w:lvl w:ilvl="2" w:tplc="0409001B" w:tentative="1">
+      <w:start w:val="1"/>
+      <w:numFmt w:val="lowerRoman"/>
+      <w:lvlText w:val="%3."/>
+      <w:lvlJc w:val="right"/>
+      <w:pPr>
+        <w:ind w:left="1800" w:hanging="180"/>
+      </w:pPr>
+    </w:lvl>
+    <w:lvl w:ilvl="3" w:tplc="0409000F" w:tentative="1">
+      <w:start w:val="1"/>
+      <w:numFmt w:val="decimal"/>
+      <w:lvlText w:val="%4."/>
+      <w:lvlJc w:val="left"/>
+      <w:pPr>
+        <w:ind w:left="2520" w:hanging="360"/>
+      </w:pPr>
+    </w:lvl>
+    <w:lvl w:ilvl="4" w:tplc="04090019" w:tentative="1">
+      <w:start w:val="1"/>
+      <w:numFmt w:val="lowerLetter"/>
+      <w:lvlText w:val="%5."/>
+      <w:lvlJc w:val="left"/>
+      <w:pPr>
+        <w:ind w:left="3240" w:hanging="360"/>
+      </w:pPr>
+    </w:lvl>
+    <w:lvl w:ilvl="5" w:tplc="0409001B" w:tentative="1">
+      <w:start w:val="1"/>
+      <w:numFmt w:val="lowerRoman"/>
+      <w:lvlText w:val="%6."/>
+      <w:lvlJc w:val="right"/>
+      <w:pPr>
+        <w:ind w:left="3960" w:hanging="180"/>
+      </w:pPr>
+    </w:lvl>
+    <w:lvl w:ilvl="6" w:tplc="0409000F" w:tentative="1">
+      <w:start w:val="1"/>
+      <w:numFmt w:val="decimal"/>
+      <w:lvlText w:val="%7."/>
+      <w:lvlJc w:val="left"/>
+      <w:pPr>
+        <w:ind w:left="4680" w:hanging="360"/>
+      </w:pPr>
+    </w:lvl>
+    <w:lvl w:ilvl="7" w:tplc="04090019" w:tentative="1">
+      <w:start w:val="1"/>
+      <w:numFmt w:val="lowerLetter"/>
+      <w:lvlText w:val="%8."/>
+      <w:lvlJc w:val="left"/>
+      <w:pPr>
+        <w:ind w:left="5400" w:hanging="360"/>
+      </w:pPr>
+    </w:lvl>
+    <w:lvl w:ilvl="8" w:tplc="0409001B" w:tentative="1">
+      <w:start w:val="1"/>
+      <w:numFmt w:val="lowerRoman"/>
+      <w:lvlText w:val="%9."/>
+      <w:lvlJc w:val="right"/>
+      <w:pPr>
+        <w:ind w:left="6120" w:hanging="180"/>
+      </w:pPr>
+    </w:lvl>
+  </w:abstractNum>
+  <w:abstractNum w:abstractNumId="75" w15:restartNumberingAfterBreak="0">
     <w:nsid w:val="4E276DCB"/>
     <w:multiLevelType w:val="hybridMultilevel"/>
     <w:tmpl w:val="B7C469B4"/>
@@ -12849,7 +12988,7 @@
       </w:rPr>
     </w:lvl>
   </w:abstractNum>
-  <w:abstractNum w:abstractNumId="75" w15:restartNumberingAfterBreak="0">
+  <w:abstractNum w:abstractNumId="76" w15:restartNumberingAfterBreak="0">
     <w:nsid w:val="4E4A23D7"/>
     <w:multiLevelType w:val="hybridMultilevel"/>
     <w:tmpl w:val="D368B748"/>
@@ -12938,7 +13077,7 @@
       </w:pPr>
     </w:lvl>
   </w:abstractNum>
-  <w:abstractNum w:abstractNumId="76" w15:restartNumberingAfterBreak="0">
+  <w:abstractNum w:abstractNumId="77" w15:restartNumberingAfterBreak="0">
     <w:nsid w:val="4EA42E41"/>
     <w:multiLevelType w:val="multilevel"/>
     <w:tmpl w:val="520AA3DC"/>
@@ -13087,7 +13226,7 @@
       </w:rPr>
     </w:lvl>
   </w:abstractNum>
-  <w:abstractNum w:abstractNumId="77" w15:restartNumberingAfterBreak="0">
+  <w:abstractNum w:abstractNumId="78" w15:restartNumberingAfterBreak="0">
     <w:nsid w:val="4F053929"/>
     <w:multiLevelType w:val="hybridMultilevel"/>
     <w:tmpl w:val="2A78C678"/>
@@ -13200,7 +13339,7 @@
       </w:rPr>
     </w:lvl>
   </w:abstractNum>
-  <w:abstractNum w:abstractNumId="78" w15:restartNumberingAfterBreak="0">
+  <w:abstractNum w:abstractNumId="79" w15:restartNumberingAfterBreak="0">
     <w:nsid w:val="4FFB237E"/>
     <w:multiLevelType w:val="multilevel"/>
     <w:tmpl w:val="2AA67CDA"/>
@@ -13349,7 +13488,7 @@
       </w:rPr>
     </w:lvl>
   </w:abstractNum>
-  <w:abstractNum w:abstractNumId="79" w15:restartNumberingAfterBreak="0">
+  <w:abstractNum w:abstractNumId="80" w15:restartNumberingAfterBreak="0">
     <w:nsid w:val="50476F20"/>
     <w:multiLevelType w:val="hybridMultilevel"/>
     <w:tmpl w:val="85B03D5E"/>
@@ -13438,7 +13577,7 @@
       </w:pPr>
     </w:lvl>
   </w:abstractNum>
-  <w:abstractNum w:abstractNumId="80" w15:restartNumberingAfterBreak="0">
+  <w:abstractNum w:abstractNumId="81" w15:restartNumberingAfterBreak="0">
     <w:nsid w:val="51737FE0"/>
     <w:multiLevelType w:val="hybridMultilevel"/>
     <w:tmpl w:val="2B0604E6"/>
@@ -13551,7 +13690,7 @@
       </w:rPr>
     </w:lvl>
   </w:abstractNum>
-  <w:abstractNum w:abstractNumId="81" w15:restartNumberingAfterBreak="0">
+  <w:abstractNum w:abstractNumId="82" w15:restartNumberingAfterBreak="0">
     <w:nsid w:val="518B1885"/>
     <w:multiLevelType w:val="multilevel"/>
     <w:tmpl w:val="AE1AAC28"/>
@@ -13700,7 +13839,7 @@
       </w:rPr>
     </w:lvl>
   </w:abstractNum>
-  <w:abstractNum w:abstractNumId="82" w15:restartNumberingAfterBreak="0">
+  <w:abstractNum w:abstractNumId="83" w15:restartNumberingAfterBreak="0">
     <w:nsid w:val="51A86EF8"/>
     <w:multiLevelType w:val="multilevel"/>
     <w:tmpl w:val="FF2841D4"/>
@@ -13849,7 +13988,7 @@
       </w:rPr>
     </w:lvl>
   </w:abstractNum>
-  <w:abstractNum w:abstractNumId="83" w15:restartNumberingAfterBreak="0">
+  <w:abstractNum w:abstractNumId="84" w15:restartNumberingAfterBreak="0">
     <w:nsid w:val="521378FF"/>
     <w:multiLevelType w:val="multilevel"/>
     <w:tmpl w:val="7B002268"/>
@@ -13998,7 +14137,7 @@
       </w:rPr>
     </w:lvl>
   </w:abstractNum>
-  <w:abstractNum w:abstractNumId="84" w15:restartNumberingAfterBreak="0">
+  <w:abstractNum w:abstractNumId="85" w15:restartNumberingAfterBreak="0">
     <w:nsid w:val="521F2792"/>
     <w:multiLevelType w:val="multilevel"/>
     <w:tmpl w:val="9FB45386"/>
@@ -14147,7 +14286,7 @@
       </w:rPr>
     </w:lvl>
   </w:abstractNum>
-  <w:abstractNum w:abstractNumId="85" w15:restartNumberingAfterBreak="0">
+  <w:abstractNum w:abstractNumId="86" w15:restartNumberingAfterBreak="0">
     <w:nsid w:val="52A37FDE"/>
     <w:multiLevelType w:val="multilevel"/>
     <w:tmpl w:val="5D6EAA1A"/>
@@ -14296,7 +14435,7 @@
       </w:rPr>
     </w:lvl>
   </w:abstractNum>
-  <w:abstractNum w:abstractNumId="86" w15:restartNumberingAfterBreak="0">
+  <w:abstractNum w:abstractNumId="87" w15:restartNumberingAfterBreak="0">
     <w:nsid w:val="53390911"/>
     <w:multiLevelType w:val="multilevel"/>
     <w:tmpl w:val="1C380F12"/>
@@ -14445,7 +14584,7 @@
       </w:rPr>
     </w:lvl>
   </w:abstractNum>
-  <w:abstractNum w:abstractNumId="87" w15:restartNumberingAfterBreak="0">
+  <w:abstractNum w:abstractNumId="88" w15:restartNumberingAfterBreak="0">
     <w:nsid w:val="53CD23AC"/>
     <w:multiLevelType w:val="multilevel"/>
     <w:tmpl w:val="57BAE8F0"/>
@@ -14594,7 +14733,7 @@
       </w:rPr>
     </w:lvl>
   </w:abstractNum>
-  <w:abstractNum w:abstractNumId="88" w15:restartNumberingAfterBreak="0">
+  <w:abstractNum w:abstractNumId="89" w15:restartNumberingAfterBreak="0">
     <w:nsid w:val="5462791F"/>
     <w:multiLevelType w:val="hybridMultilevel"/>
     <w:tmpl w:val="FDE24C26"/>
@@ -14707,7 +14846,7 @@
       </w:rPr>
     </w:lvl>
   </w:abstractNum>
-  <w:abstractNum w:abstractNumId="89" w15:restartNumberingAfterBreak="0">
+  <w:abstractNum w:abstractNumId="90" w15:restartNumberingAfterBreak="0">
     <w:nsid w:val="547005EB"/>
     <w:multiLevelType w:val="multilevel"/>
     <w:tmpl w:val="F260CC5C"/>
@@ -14856,7 +14995,7 @@
       </w:rPr>
     </w:lvl>
   </w:abstractNum>
-  <w:abstractNum w:abstractNumId="90" w15:restartNumberingAfterBreak="0">
+  <w:abstractNum w:abstractNumId="91" w15:restartNumberingAfterBreak="0">
     <w:nsid w:val="58034221"/>
     <w:multiLevelType w:val="hybridMultilevel"/>
     <w:tmpl w:val="65D0619C"/>
@@ -14969,7 +15108,7 @@
       </w:rPr>
     </w:lvl>
   </w:abstractNum>
-  <w:abstractNum w:abstractNumId="91" w15:restartNumberingAfterBreak="0">
+  <w:abstractNum w:abstractNumId="92" w15:restartNumberingAfterBreak="0">
     <w:nsid w:val="588F256D"/>
     <w:multiLevelType w:val="multilevel"/>
     <w:tmpl w:val="E8F493CA"/>
@@ -15118,7 +15257,7 @@
       </w:rPr>
     </w:lvl>
   </w:abstractNum>
-  <w:abstractNum w:abstractNumId="92" w15:restartNumberingAfterBreak="0">
+  <w:abstractNum w:abstractNumId="93" w15:restartNumberingAfterBreak="0">
     <w:nsid w:val="5A460390"/>
     <w:multiLevelType w:val="hybridMultilevel"/>
     <w:tmpl w:val="BD8E939C"/>
@@ -15231,7 +15370,7 @@
       </w:rPr>
     </w:lvl>
   </w:abstractNum>
-  <w:abstractNum w:abstractNumId="93" w15:restartNumberingAfterBreak="0">
+  <w:abstractNum w:abstractNumId="94" w15:restartNumberingAfterBreak="0">
     <w:nsid w:val="5CEE630B"/>
     <w:multiLevelType w:val="hybridMultilevel"/>
     <w:tmpl w:val="DE8E8DBA"/>
@@ -15344,7 +15483,7 @@
       </w:rPr>
     </w:lvl>
   </w:abstractNum>
-  <w:abstractNum w:abstractNumId="94" w15:restartNumberingAfterBreak="0">
+  <w:abstractNum w:abstractNumId="95" w15:restartNumberingAfterBreak="0">
     <w:nsid w:val="5D5A183C"/>
     <w:multiLevelType w:val="multilevel"/>
     <w:tmpl w:val="C804C34A"/>
@@ -15493,7 +15632,7 @@
       </w:rPr>
     </w:lvl>
   </w:abstractNum>
-  <w:abstractNum w:abstractNumId="95" w15:restartNumberingAfterBreak="0">
+  <w:abstractNum w:abstractNumId="96" w15:restartNumberingAfterBreak="0">
     <w:nsid w:val="5DF95194"/>
     <w:multiLevelType w:val="multilevel"/>
     <w:tmpl w:val="CC127E54"/>
@@ -15642,7 +15781,7 @@
       </w:rPr>
     </w:lvl>
   </w:abstractNum>
-  <w:abstractNum w:abstractNumId="96" w15:restartNumberingAfterBreak="0">
+  <w:abstractNum w:abstractNumId="97" w15:restartNumberingAfterBreak="0">
     <w:nsid w:val="5E9C452C"/>
     <w:multiLevelType w:val="multilevel"/>
     <w:tmpl w:val="B8727936"/>
@@ -15791,7 +15930,7 @@
       </w:rPr>
     </w:lvl>
   </w:abstractNum>
-  <w:abstractNum w:abstractNumId="97" w15:restartNumberingAfterBreak="0">
+  <w:abstractNum w:abstractNumId="98" w15:restartNumberingAfterBreak="0">
     <w:nsid w:val="62385AA6"/>
     <w:multiLevelType w:val="multilevel"/>
     <w:tmpl w:val="B9EAECD4"/>
@@ -15940,7 +16079,7 @@
       </w:rPr>
     </w:lvl>
   </w:abstractNum>
-  <w:abstractNum w:abstractNumId="98" w15:restartNumberingAfterBreak="0">
+  <w:abstractNum w:abstractNumId="99" w15:restartNumberingAfterBreak="0">
     <w:nsid w:val="625D686D"/>
     <w:multiLevelType w:val="multilevel"/>
     <w:tmpl w:val="BC1C2048"/>
@@ -16089,7 +16228,7 @@
       </w:rPr>
     </w:lvl>
   </w:abstractNum>
-  <w:abstractNum w:abstractNumId="99" w15:restartNumberingAfterBreak="0">
+  <w:abstractNum w:abstractNumId="100" w15:restartNumberingAfterBreak="0">
     <w:nsid w:val="62B46951"/>
     <w:multiLevelType w:val="hybridMultilevel"/>
     <w:tmpl w:val="0FEAFEC6"/>
@@ -16202,7 +16341,7 @@
       </w:rPr>
     </w:lvl>
   </w:abstractNum>
-  <w:abstractNum w:abstractNumId="100" w15:restartNumberingAfterBreak="0">
+  <w:abstractNum w:abstractNumId="101" w15:restartNumberingAfterBreak="0">
     <w:nsid w:val="647819E3"/>
     <w:multiLevelType w:val="multilevel"/>
     <w:tmpl w:val="ABB278BC"/>
@@ -16351,7 +16490,7 @@
       </w:rPr>
     </w:lvl>
   </w:abstractNum>
-  <w:abstractNum w:abstractNumId="101" w15:restartNumberingAfterBreak="0">
+  <w:abstractNum w:abstractNumId="102" w15:restartNumberingAfterBreak="0">
     <w:nsid w:val="64F30198"/>
     <w:multiLevelType w:val="multilevel"/>
     <w:tmpl w:val="63F4E6F0"/>
@@ -16500,7 +16639,7 @@
       </w:rPr>
     </w:lvl>
   </w:abstractNum>
-  <w:abstractNum w:abstractNumId="102" w15:restartNumberingAfterBreak="0">
+  <w:abstractNum w:abstractNumId="103" w15:restartNumberingAfterBreak="0">
     <w:nsid w:val="65314293"/>
     <w:multiLevelType w:val="hybridMultilevel"/>
     <w:tmpl w:val="6688DFAC"/>
@@ -16613,7 +16752,7 @@
       </w:rPr>
     </w:lvl>
   </w:abstractNum>
-  <w:abstractNum w:abstractNumId="103" w15:restartNumberingAfterBreak="0">
+  <w:abstractNum w:abstractNumId="104" w15:restartNumberingAfterBreak="0">
     <w:nsid w:val="65CE4D0F"/>
     <w:multiLevelType w:val="hybridMultilevel"/>
     <w:tmpl w:val="DB668538"/>
@@ -16726,7 +16865,7 @@
       </w:rPr>
     </w:lvl>
   </w:abstractNum>
-  <w:abstractNum w:abstractNumId="104" w15:restartNumberingAfterBreak="0">
+  <w:abstractNum w:abstractNumId="105" w15:restartNumberingAfterBreak="0">
     <w:nsid w:val="661C7D73"/>
     <w:multiLevelType w:val="multilevel"/>
     <w:tmpl w:val="D9681266"/>
@@ -16875,7 +17014,7 @@
       </w:rPr>
     </w:lvl>
   </w:abstractNum>
-  <w:abstractNum w:abstractNumId="105" w15:restartNumberingAfterBreak="0">
+  <w:abstractNum w:abstractNumId="106" w15:restartNumberingAfterBreak="0">
     <w:nsid w:val="66E36FE0"/>
     <w:multiLevelType w:val="multilevel"/>
     <w:tmpl w:val="2AA67CDA"/>
@@ -17024,7 +17163,7 @@
       </w:rPr>
     </w:lvl>
   </w:abstractNum>
-  <w:abstractNum w:abstractNumId="106" w15:restartNumberingAfterBreak="0">
+  <w:abstractNum w:abstractNumId="107" w15:restartNumberingAfterBreak="0">
     <w:nsid w:val="671F5935"/>
     <w:multiLevelType w:val="multilevel"/>
     <w:tmpl w:val="1E86702A"/>
@@ -17173,7 +17312,7 @@
       </w:rPr>
     </w:lvl>
   </w:abstractNum>
-  <w:abstractNum w:abstractNumId="107" w15:restartNumberingAfterBreak="0">
+  <w:abstractNum w:abstractNumId="108" w15:restartNumberingAfterBreak="0">
     <w:nsid w:val="68B94344"/>
     <w:multiLevelType w:val="multilevel"/>
     <w:tmpl w:val="9BA812D8"/>
@@ -17322,7 +17461,7 @@
       </w:rPr>
     </w:lvl>
   </w:abstractNum>
-  <w:abstractNum w:abstractNumId="108" w15:restartNumberingAfterBreak="0">
+  <w:abstractNum w:abstractNumId="109" w15:restartNumberingAfterBreak="0">
     <w:nsid w:val="69DE2C87"/>
     <w:multiLevelType w:val="hybridMultilevel"/>
     <w:tmpl w:val="F530F20A"/>
@@ -17435,7 +17574,7 @@
       </w:rPr>
     </w:lvl>
   </w:abstractNum>
-  <w:abstractNum w:abstractNumId="109" w15:restartNumberingAfterBreak="0">
+  <w:abstractNum w:abstractNumId="110" w15:restartNumberingAfterBreak="0">
     <w:nsid w:val="69ED672D"/>
     <w:multiLevelType w:val="multilevel"/>
     <w:tmpl w:val="CC08E300"/>
@@ -17584,7 +17723,7 @@
       </w:rPr>
     </w:lvl>
   </w:abstractNum>
-  <w:abstractNum w:abstractNumId="110" w15:restartNumberingAfterBreak="0">
+  <w:abstractNum w:abstractNumId="111" w15:restartNumberingAfterBreak="0">
     <w:nsid w:val="6A063EFD"/>
     <w:multiLevelType w:val="hybridMultilevel"/>
     <w:tmpl w:val="48703FBA"/>
@@ -17697,7 +17836,7 @@
       </w:rPr>
     </w:lvl>
   </w:abstractNum>
-  <w:abstractNum w:abstractNumId="111" w15:restartNumberingAfterBreak="0">
+  <w:abstractNum w:abstractNumId="112" w15:restartNumberingAfterBreak="0">
     <w:nsid w:val="6A825ABE"/>
     <w:multiLevelType w:val="multilevel"/>
     <w:tmpl w:val="0CD6F30E"/>
@@ -17846,7 +17985,7 @@
       </w:rPr>
     </w:lvl>
   </w:abstractNum>
-  <w:abstractNum w:abstractNumId="112" w15:restartNumberingAfterBreak="0">
+  <w:abstractNum w:abstractNumId="113" w15:restartNumberingAfterBreak="0">
     <w:nsid w:val="6B1D7832"/>
     <w:multiLevelType w:val="multilevel"/>
     <w:tmpl w:val="DD4646B2"/>
@@ -17995,7 +18134,7 @@
       </w:rPr>
     </w:lvl>
   </w:abstractNum>
-  <w:abstractNum w:abstractNumId="113" w15:restartNumberingAfterBreak="0">
+  <w:abstractNum w:abstractNumId="114" w15:restartNumberingAfterBreak="0">
     <w:nsid w:val="6BC8366D"/>
     <w:multiLevelType w:val="multilevel"/>
     <w:tmpl w:val="7C10CE5C"/>
@@ -18144,7 +18283,7 @@
       </w:rPr>
     </w:lvl>
   </w:abstractNum>
-  <w:abstractNum w:abstractNumId="114" w15:restartNumberingAfterBreak="0">
+  <w:abstractNum w:abstractNumId="115" w15:restartNumberingAfterBreak="0">
     <w:nsid w:val="6C6D6667"/>
     <w:multiLevelType w:val="hybridMultilevel"/>
     <w:tmpl w:val="A744709C"/>
@@ -18257,7 +18396,7 @@
       </w:rPr>
     </w:lvl>
   </w:abstractNum>
-  <w:abstractNum w:abstractNumId="115" w15:restartNumberingAfterBreak="0">
+  <w:abstractNum w:abstractNumId="116" w15:restartNumberingAfterBreak="0">
     <w:nsid w:val="6CAD7EA5"/>
     <w:multiLevelType w:val="multilevel"/>
     <w:tmpl w:val="C472C5B0"/>
@@ -18406,7 +18545,7 @@
       </w:rPr>
     </w:lvl>
   </w:abstractNum>
-  <w:abstractNum w:abstractNumId="116" w15:restartNumberingAfterBreak="0">
+  <w:abstractNum w:abstractNumId="117" w15:restartNumberingAfterBreak="0">
     <w:nsid w:val="6D7A28DE"/>
     <w:multiLevelType w:val="hybridMultilevel"/>
     <w:tmpl w:val="1B5875AA"/>
@@ -18519,7 +18658,7 @@
       </w:rPr>
     </w:lvl>
   </w:abstractNum>
-  <w:abstractNum w:abstractNumId="117" w15:restartNumberingAfterBreak="0">
+  <w:abstractNum w:abstractNumId="118" w15:restartNumberingAfterBreak="0">
     <w:nsid w:val="6DC443D9"/>
     <w:multiLevelType w:val="hybridMultilevel"/>
     <w:tmpl w:val="61CE7B6C"/>
@@ -18632,7 +18771,7 @@
       </w:rPr>
     </w:lvl>
   </w:abstractNum>
-  <w:abstractNum w:abstractNumId="118" w15:restartNumberingAfterBreak="0">
+  <w:abstractNum w:abstractNumId="119" w15:restartNumberingAfterBreak="0">
     <w:nsid w:val="6E2C576F"/>
     <w:multiLevelType w:val="hybridMultilevel"/>
     <w:tmpl w:val="251C1C42"/>
@@ -18745,7 +18884,7 @@
       </w:rPr>
     </w:lvl>
   </w:abstractNum>
-  <w:abstractNum w:abstractNumId="119" w15:restartNumberingAfterBreak="0">
+  <w:abstractNum w:abstractNumId="120" w15:restartNumberingAfterBreak="0">
     <w:nsid w:val="6E43557B"/>
     <w:multiLevelType w:val="multilevel"/>
     <w:tmpl w:val="323C7112"/>
@@ -18894,7 +19033,7 @@
       </w:rPr>
     </w:lvl>
   </w:abstractNum>
-  <w:abstractNum w:abstractNumId="120" w15:restartNumberingAfterBreak="0">
+  <w:abstractNum w:abstractNumId="121" w15:restartNumberingAfterBreak="0">
     <w:nsid w:val="6EA27D0A"/>
     <w:multiLevelType w:val="multilevel"/>
     <w:tmpl w:val="7BF0256C"/>
@@ -19043,7 +19182,7 @@
       </w:rPr>
     </w:lvl>
   </w:abstractNum>
-  <w:abstractNum w:abstractNumId="121" w15:restartNumberingAfterBreak="0">
+  <w:abstractNum w:abstractNumId="122" w15:restartNumberingAfterBreak="0">
     <w:nsid w:val="6EF86273"/>
     <w:multiLevelType w:val="multilevel"/>
     <w:tmpl w:val="2AA67CDA"/>
@@ -19192,7 +19331,7 @@
       </w:rPr>
     </w:lvl>
   </w:abstractNum>
-  <w:abstractNum w:abstractNumId="122" w15:restartNumberingAfterBreak="0">
+  <w:abstractNum w:abstractNumId="123" w15:restartNumberingAfterBreak="0">
     <w:nsid w:val="70874300"/>
     <w:multiLevelType w:val="hybridMultilevel"/>
     <w:tmpl w:val="1B3A0518"/>
@@ -19305,7 +19444,7 @@
       </w:rPr>
     </w:lvl>
   </w:abstractNum>
-  <w:abstractNum w:abstractNumId="123" w15:restartNumberingAfterBreak="0">
+  <w:abstractNum w:abstractNumId="124" w15:restartNumberingAfterBreak="0">
     <w:nsid w:val="7090251B"/>
     <w:multiLevelType w:val="hybridMultilevel"/>
     <w:tmpl w:val="67687EFE"/>
@@ -19418,7 +19557,7 @@
       </w:rPr>
     </w:lvl>
   </w:abstractNum>
-  <w:abstractNum w:abstractNumId="124" w15:restartNumberingAfterBreak="0">
+  <w:abstractNum w:abstractNumId="125" w15:restartNumberingAfterBreak="0">
     <w:nsid w:val="72031F81"/>
     <w:multiLevelType w:val="multilevel"/>
     <w:tmpl w:val="84400090"/>
@@ -19567,7 +19706,7 @@
       </w:rPr>
     </w:lvl>
   </w:abstractNum>
-  <w:abstractNum w:abstractNumId="125" w15:restartNumberingAfterBreak="0">
+  <w:abstractNum w:abstractNumId="126" w15:restartNumberingAfterBreak="0">
     <w:nsid w:val="722301E0"/>
     <w:multiLevelType w:val="multilevel"/>
     <w:tmpl w:val="1EE82E5A"/>
@@ -19716,7 +19855,7 @@
       </w:rPr>
     </w:lvl>
   </w:abstractNum>
-  <w:abstractNum w:abstractNumId="126" w15:restartNumberingAfterBreak="0">
+  <w:abstractNum w:abstractNumId="127" w15:restartNumberingAfterBreak="0">
     <w:nsid w:val="74B80775"/>
     <w:multiLevelType w:val="hybridMultilevel"/>
     <w:tmpl w:val="D3C275CE"/>
@@ -19805,7 +19944,7 @@
       </w:pPr>
     </w:lvl>
   </w:abstractNum>
-  <w:abstractNum w:abstractNumId="127" w15:restartNumberingAfterBreak="0">
+  <w:abstractNum w:abstractNumId="128" w15:restartNumberingAfterBreak="0">
     <w:nsid w:val="75144C65"/>
     <w:multiLevelType w:val="hybridMultilevel"/>
     <w:tmpl w:val="12127FAA"/>
@@ -19918,7 +20057,7 @@
       </w:rPr>
     </w:lvl>
   </w:abstractNum>
-  <w:abstractNum w:abstractNumId="128" w15:restartNumberingAfterBreak="0">
+  <w:abstractNum w:abstractNumId="129" w15:restartNumberingAfterBreak="0">
     <w:nsid w:val="75237F84"/>
     <w:multiLevelType w:val="hybridMultilevel"/>
     <w:tmpl w:val="5F0A6EF2"/>
@@ -20031,7 +20170,7 @@
       </w:rPr>
     </w:lvl>
   </w:abstractNum>
-  <w:abstractNum w:abstractNumId="129" w15:restartNumberingAfterBreak="0">
+  <w:abstractNum w:abstractNumId="130" w15:restartNumberingAfterBreak="0">
     <w:nsid w:val="75FF09B0"/>
     <w:multiLevelType w:val="multilevel"/>
     <w:tmpl w:val="C34A7734"/>
@@ -20180,7 +20319,7 @@
       </w:rPr>
     </w:lvl>
   </w:abstractNum>
-  <w:abstractNum w:abstractNumId="130" w15:restartNumberingAfterBreak="0">
+  <w:abstractNum w:abstractNumId="131" w15:restartNumberingAfterBreak="0">
     <w:nsid w:val="77960362"/>
     <w:multiLevelType w:val="multilevel"/>
     <w:tmpl w:val="FEA0022E"/>
@@ -20329,7 +20468,7 @@
       </w:rPr>
     </w:lvl>
   </w:abstractNum>
-  <w:abstractNum w:abstractNumId="131" w15:restartNumberingAfterBreak="0">
+  <w:abstractNum w:abstractNumId="132" w15:restartNumberingAfterBreak="0">
     <w:nsid w:val="785A644F"/>
     <w:multiLevelType w:val="multilevel"/>
     <w:tmpl w:val="D1DC60FE"/>
@@ -20478,7 +20617,7 @@
       </w:rPr>
     </w:lvl>
   </w:abstractNum>
-  <w:abstractNum w:abstractNumId="132" w15:restartNumberingAfterBreak="0">
+  <w:abstractNum w:abstractNumId="133" w15:restartNumberingAfterBreak="0">
     <w:nsid w:val="78B62297"/>
     <w:multiLevelType w:val="multilevel"/>
     <w:tmpl w:val="2AA67CDA"/>
@@ -20627,7 +20766,7 @@
       </w:rPr>
     </w:lvl>
   </w:abstractNum>
-  <w:abstractNum w:abstractNumId="133" w15:restartNumberingAfterBreak="0">
+  <w:abstractNum w:abstractNumId="134" w15:restartNumberingAfterBreak="0">
     <w:nsid w:val="78C32E1A"/>
     <w:multiLevelType w:val="hybridMultilevel"/>
     <w:tmpl w:val="91A0539A"/>
@@ -20740,7 +20879,7 @@
       </w:rPr>
     </w:lvl>
   </w:abstractNum>
-  <w:abstractNum w:abstractNumId="134" w15:restartNumberingAfterBreak="0">
+  <w:abstractNum w:abstractNumId="135" w15:restartNumberingAfterBreak="0">
     <w:nsid w:val="7BFA03DF"/>
     <w:multiLevelType w:val="hybridMultilevel"/>
     <w:tmpl w:val="536A979E"/>
@@ -20853,7 +20992,7 @@
       </w:rPr>
     </w:lvl>
   </w:abstractNum>
-  <w:abstractNum w:abstractNumId="135" w15:restartNumberingAfterBreak="0">
+  <w:abstractNum w:abstractNumId="136" w15:restartNumberingAfterBreak="0">
     <w:nsid w:val="7CA524B4"/>
     <w:multiLevelType w:val="hybridMultilevel"/>
     <w:tmpl w:val="957C4F4A"/>
@@ -20966,7 +21105,7 @@
       </w:rPr>
     </w:lvl>
   </w:abstractNum>
-  <w:abstractNum w:abstractNumId="136" w15:restartNumberingAfterBreak="0">
+  <w:abstractNum w:abstractNumId="137" w15:restartNumberingAfterBreak="0">
     <w:nsid w:val="7E1C597E"/>
     <w:multiLevelType w:val="multilevel"/>
     <w:tmpl w:val="2AA67CDA"/>
@@ -21115,7 +21254,7 @@
       </w:rPr>
     </w:lvl>
   </w:abstractNum>
-  <w:abstractNum w:abstractNumId="137" w15:restartNumberingAfterBreak="0">
+  <w:abstractNum w:abstractNumId="138" w15:restartNumberingAfterBreak="0">
     <w:nsid w:val="7EBD7710"/>
     <w:multiLevelType w:val="hybridMultilevel"/>
     <w:tmpl w:val="C8C6F7A0"/>
@@ -21232,22 +21371,22 @@
     <w:abstractNumId w:val="53"/>
   </w:num>
   <w:num w:numId="2" w16cid:durableId="967664612">
-    <w:abstractNumId w:val="101"/>
+    <w:abstractNumId w:val="102"/>
   </w:num>
   <w:num w:numId="3" w16cid:durableId="361631616">
     <w:abstractNumId w:val="72"/>
   </w:num>
   <w:num w:numId="4" w16cid:durableId="1409575397">
-    <w:abstractNumId w:val="88"/>
+    <w:abstractNumId w:val="89"/>
   </w:num>
   <w:num w:numId="5" w16cid:durableId="1647204897">
-    <w:abstractNumId w:val="135"/>
+    <w:abstractNumId w:val="136"/>
   </w:num>
   <w:num w:numId="6" w16cid:durableId="682589869">
     <w:abstractNumId w:val="23"/>
   </w:num>
   <w:num w:numId="7" w16cid:durableId="679703478">
-    <w:abstractNumId w:val="108"/>
+    <w:abstractNumId w:val="109"/>
   </w:num>
   <w:num w:numId="8" w16cid:durableId="496455128">
     <w:abstractNumId w:val="47"/>
@@ -21259,7 +21398,7 @@
     <w:abstractNumId w:val="70"/>
   </w:num>
   <w:num w:numId="11" w16cid:durableId="1412503779">
-    <w:abstractNumId w:val="110"/>
+    <w:abstractNumId w:val="111"/>
   </w:num>
   <w:num w:numId="12" w16cid:durableId="1107113995">
     <w:abstractNumId w:val="48"/>
@@ -21268,34 +21407,34 @@
     <w:abstractNumId w:val="24"/>
   </w:num>
   <w:num w:numId="14" w16cid:durableId="1529222885">
-    <w:abstractNumId w:val="134"/>
+    <w:abstractNumId w:val="135"/>
   </w:num>
   <w:num w:numId="15" w16cid:durableId="836580755">
     <w:abstractNumId w:val="17"/>
   </w:num>
   <w:num w:numId="16" w16cid:durableId="1344674502">
-    <w:abstractNumId w:val="92"/>
+    <w:abstractNumId w:val="93"/>
   </w:num>
   <w:num w:numId="17" w16cid:durableId="1320882603">
-    <w:abstractNumId w:val="122"/>
+    <w:abstractNumId w:val="123"/>
   </w:num>
   <w:num w:numId="18" w16cid:durableId="1139028372">
     <w:abstractNumId w:val="49"/>
   </w:num>
   <w:num w:numId="19" w16cid:durableId="1525635473">
-    <w:abstractNumId w:val="99"/>
+    <w:abstractNumId w:val="100"/>
   </w:num>
   <w:num w:numId="20" w16cid:durableId="609623515">
-    <w:abstractNumId w:val="137"/>
+    <w:abstractNumId w:val="138"/>
   </w:num>
   <w:num w:numId="21" w16cid:durableId="165170997">
-    <w:abstractNumId w:val="114"/>
+    <w:abstractNumId w:val="115"/>
   </w:num>
   <w:num w:numId="22" w16cid:durableId="1620525290">
     <w:abstractNumId w:val="31"/>
   </w:num>
   <w:num w:numId="23" w16cid:durableId="400753109">
-    <w:abstractNumId w:val="127"/>
+    <w:abstractNumId w:val="128"/>
   </w:num>
   <w:num w:numId="24" w16cid:durableId="193882219">
     <w:abstractNumId w:val="4"/>
@@ -21313,13 +21452,13 @@
     <w:abstractNumId w:val="18"/>
   </w:num>
   <w:num w:numId="29" w16cid:durableId="2124693280">
-    <w:abstractNumId w:val="103"/>
+    <w:abstractNumId w:val="104"/>
   </w:num>
   <w:num w:numId="30" w16cid:durableId="1367099744">
     <w:abstractNumId w:val="39"/>
   </w:num>
   <w:num w:numId="31" w16cid:durableId="2011105642">
-    <w:abstractNumId w:val="93"/>
+    <w:abstractNumId w:val="94"/>
   </w:num>
   <w:num w:numId="32" w16cid:durableId="831995364">
     <w:abstractNumId w:val="28"/>
@@ -21337,7 +21476,7 @@
     <w:abstractNumId w:val="2"/>
   </w:num>
   <w:num w:numId="37" w16cid:durableId="1849755457">
-    <w:abstractNumId w:val="128"/>
+    <w:abstractNumId w:val="129"/>
   </w:num>
   <w:num w:numId="38" w16cid:durableId="516505904">
     <w:abstractNumId w:val="15"/>
@@ -21346,16 +21485,16 @@
     <w:abstractNumId w:val="19"/>
   </w:num>
   <w:num w:numId="40" w16cid:durableId="905338697">
-    <w:abstractNumId w:val="74"/>
+    <w:abstractNumId w:val="75"/>
   </w:num>
   <w:num w:numId="41" w16cid:durableId="501896635">
     <w:abstractNumId w:val="51"/>
   </w:num>
   <w:num w:numId="42" w16cid:durableId="1953435156">
-    <w:abstractNumId w:val="77"/>
+    <w:abstractNumId w:val="78"/>
   </w:num>
   <w:num w:numId="43" w16cid:durableId="1060447452">
-    <w:abstractNumId w:val="90"/>
+    <w:abstractNumId w:val="91"/>
   </w:num>
   <w:num w:numId="44" w16cid:durableId="1772503672">
     <w:abstractNumId w:val="66"/>
@@ -21367,34 +21506,34 @@
     <w:abstractNumId w:val="30"/>
   </w:num>
   <w:num w:numId="47" w16cid:durableId="68767822">
-    <w:abstractNumId w:val="111"/>
+    <w:abstractNumId w:val="112"/>
   </w:num>
   <w:num w:numId="48" w16cid:durableId="1992058265">
     <w:abstractNumId w:val="5"/>
   </w:num>
   <w:num w:numId="49" w16cid:durableId="788475134">
-    <w:abstractNumId w:val="131"/>
+    <w:abstractNumId w:val="132"/>
   </w:num>
   <w:num w:numId="50" w16cid:durableId="224419455">
-    <w:abstractNumId w:val="120"/>
+    <w:abstractNumId w:val="121"/>
   </w:num>
   <w:num w:numId="51" w16cid:durableId="1699575947">
-    <w:abstractNumId w:val="98"/>
+    <w:abstractNumId w:val="99"/>
   </w:num>
   <w:num w:numId="52" w16cid:durableId="1048916239">
     <w:abstractNumId w:val="59"/>
   </w:num>
   <w:num w:numId="53" w16cid:durableId="1188711211">
-    <w:abstractNumId w:val="129"/>
+    <w:abstractNumId w:val="130"/>
   </w:num>
   <w:num w:numId="54" w16cid:durableId="447555614">
-    <w:abstractNumId w:val="100"/>
+    <w:abstractNumId w:val="101"/>
   </w:num>
   <w:num w:numId="55" w16cid:durableId="1679307268">
     <w:abstractNumId w:val="56"/>
   </w:num>
   <w:num w:numId="56" w16cid:durableId="693773591">
-    <w:abstractNumId w:val="119"/>
+    <w:abstractNumId w:val="120"/>
   </w:num>
   <w:num w:numId="57" w16cid:durableId="1110473324">
     <w:abstractNumId w:val="41"/>
@@ -21406,25 +21545,25 @@
     <w:abstractNumId w:val="46"/>
   </w:num>
   <w:num w:numId="60" w16cid:durableId="2095394549">
-    <w:abstractNumId w:val="130"/>
+    <w:abstractNumId w:val="131"/>
   </w:num>
   <w:num w:numId="61" w16cid:durableId="1299921011">
     <w:abstractNumId w:val="45"/>
   </w:num>
   <w:num w:numId="62" w16cid:durableId="1927420240">
-    <w:abstractNumId w:val="82"/>
+    <w:abstractNumId w:val="83"/>
   </w:num>
   <w:num w:numId="63" w16cid:durableId="41290043">
-    <w:abstractNumId w:val="87"/>
+    <w:abstractNumId w:val="88"/>
   </w:num>
   <w:num w:numId="64" w16cid:durableId="999846909">
     <w:abstractNumId w:val="68"/>
   </w:num>
   <w:num w:numId="65" w16cid:durableId="1250969563">
-    <w:abstractNumId w:val="80"/>
+    <w:abstractNumId w:val="81"/>
   </w:num>
   <w:num w:numId="66" w16cid:durableId="484011382">
-    <w:abstractNumId w:val="109"/>
+    <w:abstractNumId w:val="110"/>
   </w:num>
   <w:num w:numId="67" w16cid:durableId="2008289242">
     <w:abstractNumId w:val="13"/>
@@ -21433,13 +21572,13 @@
     <w:abstractNumId w:val="20"/>
   </w:num>
   <w:num w:numId="69" w16cid:durableId="1296839887">
-    <w:abstractNumId w:val="86"/>
+    <w:abstractNumId w:val="87"/>
   </w:num>
   <w:num w:numId="70" w16cid:durableId="336662050">
-    <w:abstractNumId w:val="97"/>
+    <w:abstractNumId w:val="98"/>
   </w:num>
   <w:num w:numId="71" w16cid:durableId="1460032333">
-    <w:abstractNumId w:val="115"/>
+    <w:abstractNumId w:val="116"/>
   </w:num>
   <w:num w:numId="72" w16cid:durableId="592400615">
     <w:abstractNumId w:val="9"/>
@@ -21457,13 +21596,13 @@
     <w:abstractNumId w:val="35"/>
   </w:num>
   <w:num w:numId="77" w16cid:durableId="763109604">
-    <w:abstractNumId w:val="89"/>
+    <w:abstractNumId w:val="90"/>
   </w:num>
   <w:num w:numId="78" w16cid:durableId="2138137265">
-    <w:abstractNumId w:val="102"/>
+    <w:abstractNumId w:val="103"/>
   </w:num>
   <w:num w:numId="79" w16cid:durableId="343675924">
-    <w:abstractNumId w:val="123"/>
+    <w:abstractNumId w:val="124"/>
   </w:num>
   <w:num w:numId="80" w16cid:durableId="1823277442">
     <w:abstractNumId w:val="44"/>
@@ -21472,16 +21611,16 @@
     <w:abstractNumId w:val="0"/>
   </w:num>
   <w:num w:numId="82" w16cid:durableId="1113326280">
-    <w:abstractNumId w:val="84"/>
+    <w:abstractNumId w:val="85"/>
   </w:num>
   <w:num w:numId="83" w16cid:durableId="1253051103">
-    <w:abstractNumId w:val="112"/>
+    <w:abstractNumId w:val="113"/>
   </w:num>
   <w:num w:numId="84" w16cid:durableId="444888444">
     <w:abstractNumId w:val="52"/>
   </w:num>
   <w:num w:numId="85" w16cid:durableId="64299649">
-    <w:abstractNumId w:val="104"/>
+    <w:abstractNumId w:val="105"/>
   </w:num>
   <w:num w:numId="86" w16cid:durableId="868182992">
     <w:abstractNumId w:val="65"/>
@@ -21490,7 +21629,7 @@
     <w:abstractNumId w:val="25"/>
   </w:num>
   <w:num w:numId="88" w16cid:durableId="505442826">
-    <w:abstractNumId w:val="107"/>
+    <w:abstractNumId w:val="108"/>
   </w:num>
   <w:num w:numId="89" w16cid:durableId="1858763908">
     <w:abstractNumId w:val="40"/>
@@ -21499,34 +21638,34 @@
     <w:abstractNumId w:val="14"/>
   </w:num>
   <w:num w:numId="91" w16cid:durableId="1284576603">
-    <w:abstractNumId w:val="94"/>
+    <w:abstractNumId w:val="95"/>
   </w:num>
   <w:num w:numId="92" w16cid:durableId="1963075542">
     <w:abstractNumId w:val="8"/>
   </w:num>
   <w:num w:numId="93" w16cid:durableId="787627596">
-    <w:abstractNumId w:val="83"/>
+    <w:abstractNumId w:val="84"/>
   </w:num>
   <w:num w:numId="94" w16cid:durableId="2003925799">
     <w:abstractNumId w:val="11"/>
   </w:num>
   <w:num w:numId="95" w16cid:durableId="1169102579">
-    <w:abstractNumId w:val="96"/>
+    <w:abstractNumId w:val="97"/>
   </w:num>
   <w:num w:numId="96" w16cid:durableId="1216501564">
     <w:abstractNumId w:val="36"/>
   </w:num>
   <w:num w:numId="97" w16cid:durableId="261768216">
-    <w:abstractNumId w:val="121"/>
+    <w:abstractNumId w:val="122"/>
   </w:num>
   <w:num w:numId="98" w16cid:durableId="2141918721">
-    <w:abstractNumId w:val="78"/>
+    <w:abstractNumId w:val="79"/>
   </w:num>
   <w:num w:numId="99" w16cid:durableId="905841544">
     <w:abstractNumId w:val="43"/>
   </w:num>
   <w:num w:numId="100" w16cid:durableId="1753887223">
-    <w:abstractNumId w:val="95"/>
+    <w:abstractNumId w:val="96"/>
   </w:num>
   <w:num w:numId="101" w16cid:durableId="1320184766">
     <w:abstractNumId w:val="29"/>
@@ -21544,10 +21683,10 @@
     <w:abstractNumId w:val="62"/>
   </w:num>
   <w:num w:numId="106" w16cid:durableId="1617908629">
-    <w:abstractNumId w:val="125"/>
+    <w:abstractNumId w:val="126"/>
   </w:num>
   <w:num w:numId="107" w16cid:durableId="970137111">
-    <w:abstractNumId w:val="136"/>
+    <w:abstractNumId w:val="137"/>
   </w:num>
   <w:num w:numId="108" w16cid:durableId="383797013">
     <w:abstractNumId w:val="50"/>
@@ -21562,34 +21701,34 @@
     <w:abstractNumId w:val="64"/>
   </w:num>
   <w:num w:numId="112" w16cid:durableId="2092697678">
-    <w:abstractNumId w:val="81"/>
+    <w:abstractNumId w:val="82"/>
   </w:num>
   <w:num w:numId="113" w16cid:durableId="1418403813">
     <w:abstractNumId w:val="69"/>
   </w:num>
   <w:num w:numId="114" w16cid:durableId="1965042317">
-    <w:abstractNumId w:val="124"/>
+    <w:abstractNumId w:val="125"/>
   </w:num>
   <w:num w:numId="115" w16cid:durableId="670569040">
     <w:abstractNumId w:val="57"/>
   </w:num>
   <w:num w:numId="116" w16cid:durableId="413823113">
-    <w:abstractNumId w:val="132"/>
+    <w:abstractNumId w:val="133"/>
   </w:num>
   <w:num w:numId="117" w16cid:durableId="1293747982">
-    <w:abstractNumId w:val="105"/>
+    <w:abstractNumId w:val="106"/>
   </w:num>
   <w:num w:numId="118" w16cid:durableId="1016734110">
-    <w:abstractNumId w:val="79"/>
+    <w:abstractNumId w:val="80"/>
   </w:num>
   <w:num w:numId="119" w16cid:durableId="583337306">
-    <w:abstractNumId w:val="126"/>
+    <w:abstractNumId w:val="127"/>
   </w:num>
   <w:num w:numId="120" w16cid:durableId="721096429">
-    <w:abstractNumId w:val="106"/>
+    <w:abstractNumId w:val="107"/>
   </w:num>
   <w:num w:numId="121" w16cid:durableId="299461688">
-    <w:abstractNumId w:val="85"/>
+    <w:abstractNumId w:val="86"/>
   </w:num>
   <w:num w:numId="122" w16cid:durableId="703558456">
     <w:abstractNumId w:val="12"/>
@@ -21598,16 +21737,16 @@
     <w:abstractNumId w:val="26"/>
   </w:num>
   <w:num w:numId="124" w16cid:durableId="603391478">
-    <w:abstractNumId w:val="91"/>
+    <w:abstractNumId w:val="92"/>
   </w:num>
   <w:num w:numId="125" w16cid:durableId="560529547">
-    <w:abstractNumId w:val="113"/>
+    <w:abstractNumId w:val="114"/>
   </w:num>
   <w:num w:numId="126" w16cid:durableId="1488327713">
-    <w:abstractNumId w:val="116"/>
+    <w:abstractNumId w:val="117"/>
   </w:num>
   <w:num w:numId="127" w16cid:durableId="1327660713">
-    <w:abstractNumId w:val="118"/>
+    <w:abstractNumId w:val="119"/>
   </w:num>
   <w:num w:numId="128" w16cid:durableId="2095084062">
     <w:abstractNumId w:val="6"/>
@@ -21628,19 +21767,22 @@
     <w:abstractNumId w:val="33"/>
   </w:num>
   <w:num w:numId="134" w16cid:durableId="1601765564">
-    <w:abstractNumId w:val="117"/>
+    <w:abstractNumId w:val="118"/>
   </w:num>
   <w:num w:numId="135" w16cid:durableId="638340392">
     <w:abstractNumId w:val="7"/>
   </w:num>
   <w:num w:numId="136" w16cid:durableId="1738551041">
+    <w:abstractNumId w:val="77"/>
+  </w:num>
+  <w:num w:numId="137" w16cid:durableId="95903085">
+    <w:abstractNumId w:val="134"/>
+  </w:num>
+  <w:num w:numId="138" w16cid:durableId="1804738794">
     <w:abstractNumId w:val="76"/>
   </w:num>
-  <w:num w:numId="137" w16cid:durableId="95903085">
-    <w:abstractNumId w:val="133"/>
-  </w:num>
-  <w:num w:numId="138" w16cid:durableId="1804738794">
-    <w:abstractNumId w:val="75"/>
+  <w:num w:numId="139" w16cid:durableId="2126075307">
+    <w:abstractNumId w:val="74"/>
   </w:num>
   <w:numIdMacAtCleanup w:val="45"/>
 </w:numbering>

</xml_diff>